<commit_message>
SI: Figure S1 removed, figures renumbered (S3-S10 -> S2-S9) with cross-refs, manuscript, workbook, response; Table S2 reference mass loss
</commit_message>
<xml_diff>
--- a/deliver/Manuscript_tracked.docx
+++ b/deliver/Manuscript_tracked.docx
@@ -301,7 +301,7 @@
       <w:r>
         <w:t xml:space="preserve">Zinc (Zn) is a promising biodegradable metal for temporary implants, yet predictive computational frameworks for its degradation under physiological conditions remain limited. In this study, a three-dimensional (3D) mechanistic reaction-diffusion model is developed by coupling oxygen reduction reaction (ORR) kinetics, mass transport, corrosion-product evolution, and moving-interface tracking. Initial sensitivity analysis demonstrates that dissolved oxygen availability primarily controls Zn biodegradation. Calibrated</w:t>
       </w:r>
-      <w:del w:id="9008" w:author="Claude" w:date="2026-10-08T20:38:21Z">
+      <w:del w:id="9008" w:author="Claude" w:date="2026-10-08T22:18:30Z">
         <w:r>
           <w:delText xml:space="preserve"> using three effective kinetic parameters</w:delText>
         </w:r>
@@ -309,12 +309,12 @@
       <w:r>
         <w:t xml:space="preserve"> against literature immersion mass-loss data over 14 days, the model predicts the 28-day mass-loss evolution measured in this study, yielding a root-mean-square error (RMSE) of 0.0159%. The simulations reveal a self-limiting mechanism in which corrosion-product accumulation progressively restricts oxygen transport to the metal surface, driving a transition from reaction-controlled to diffusion-controlled degradation. When applied without geometry-specific recalibration to a six-crown Zn stent, the model predicts approximately 6% mass loss after one month, </w:t>
       </w:r>
-      <w:del w:id="9007" w:author="Claude" w:date="2026-10-08T20:38:21Z">
+      <w:del w:id="9007" w:author="Claude" w:date="2026-10-08T22:18:30Z">
         <w:r>
           <w:delText xml:space="preserve">consistent</w:delText>
         </w:r>
       </w:del>
-      <w:ins w:id="9006" w:author="Claude" w:date="2026-10-08T20:38:21Z">
+      <w:ins w:id="9006" w:author="Claude" w:date="2026-10-08T22:18:30Z">
         <w:r>
           <w:t xml:space="preserve">of</w:t>
         </w:r>
@@ -322,12 +322,12 @@
       <w:r>
         <w:t xml:space="preserve"> </w:t>
       </w:r>
-      <w:del w:id="9005" w:author="Claude" w:date="2026-10-08T20:38:21Z">
+      <w:del w:id="9005" w:author="Claude" w:date="2026-10-08T22:18:30Z">
         <w:r>
           <w:delText xml:space="preserve">in</w:delText>
         </w:r>
       </w:del>
-      <w:ins w:id="9004" w:author="Claude" w:date="2026-10-08T20:38:21Z">
+      <w:ins w:id="9004" w:author="Claude" w:date="2026-10-08T22:18:30Z">
         <w:r>
           <w:t xml:space="preserve">the same order of</w:t>
         </w:r>
@@ -335,12 +335,12 @@
       <w:r>
         <w:t xml:space="preserve"> magnitude </w:t>
       </w:r>
-      <w:del w:id="9003" w:author="Claude" w:date="2026-10-08T20:38:21Z">
+      <w:del w:id="9003" w:author="Claude" w:date="2026-10-08T22:18:30Z">
         <w:r>
           <w:delText xml:space="preserve">with</w:delText>
         </w:r>
       </w:del>
-      <w:ins w:id="9002" w:author="Claude" w:date="2026-10-08T20:38:21Z">
+      <w:ins w:id="9002" w:author="Claude" w:date="2026-10-08T22:18:30Z">
         <w:r>
           <w:t xml:space="preserve">as</w:t>
         </w:r>
@@ -360,7 +360,7 @@
       <w:r>
         <w:t xml:space="preserve"> observations, and captures crown-localized degradation driven by geometry-dependent oxygen transport. By linking implant geometry to degradation rate and spatial morphology, the framework provides a </w:t>
       </w:r>
-      <w:del w:id="9001" w:author="Claude" w:date="2026-10-08T20:38:21Z">
+      <w:del w:id="9001" w:author="Claude" w:date="2026-10-08T22:18:30Z">
         <w:r>
           <w:delText xml:space="preserve">low-dimensional, </w:delText>
         </w:r>
@@ -1288,12 +1288,12 @@
       <w:r>
         <w:t>. (a) Reaction–diffusion model coupling species transport and corrosion-</w:t>
       </w:r>
-      <w:del w:id="9010" w:author="Claude" w:date="2026-10-08T20:38:21Z">
+      <w:del w:id="9010" w:author="Claude" w:date="2026-10-08T22:18:30Z">
         <w:r>
           <w:delText xml:space="preserve">film</w:delText>
         </w:r>
       </w:del>
-      <w:ins w:id="9009" w:author="Claude" w:date="2026-10-08T20:38:21Z">
+      <w:ins w:id="9009" w:author="Claude" w:date="2026-10-08T22:18:30Z">
         <w:r>
           <w:t>product</w:t>
         </w:r>
@@ -1407,7 +1407,7 @@
         </w:rPr>
         <w:t xml:space="preserve">ultrasonically cleaned in Milli-Q water, acetone, and ethanol to remove residual surface contaminants, then dried and stored under vacuum until use. Hanks’ Balanced Salt Solution (HBSS; Gibco, calcium- and magnesium-free</w:t>
       </w:r>
-      <w:ins w:id="9011" w:author="Claude" w:date="2026-10-08T20:38:21Z">
+      <w:ins w:id="9011" w:author="Claude" w:date="2026-10-08T22:18:30Z">
         <w:r>
           <w:rPr>
             <w:rFonts w:cs="Times New Roman"/>
@@ -3019,7 +3019,7 @@
         </w:rPr>
         <w:t xml:space="preserve">therefore results from a dynamic balance between ORR-driven passivation and chloride-mediated </w:t>
       </w:r>
-      <w:del w:id="9018" w:author="Claude" w:date="2026-10-08T20:38:21Z">
+      <w:del w:id="9018" w:author="Claude" w:date="2026-10-08T22:18:30Z">
         <w:r>
           <w:rPr>
             <w:rFonts w:cs="Times New Roman"/>
@@ -3027,7 +3027,7 @@
           <w:delText xml:space="preserve">film</w:delText>
         </w:r>
       </w:del>
-      <w:ins w:id="9017" w:author="Claude" w:date="2026-10-08T20:38:21Z">
+      <w:ins w:id="9017" w:author="Claude" w:date="2026-10-08T22:18:30Z">
         <w:r>
           <w:rPr>
             <w:rFonts w:cs="Times New Roman"/>
@@ -3112,7 +3112,7 @@
         </w:rPr>
         <w:fldChar w:fldCharType="end"/>
       </w:r>
-      <w:del w:id="9016" w:author="Claude" w:date="2026-10-08T20:38:21Z">
+      <w:del w:id="9016" w:author="Claude" w:date="2026-10-08T22:18:30Z">
         <w:r>
           <w:rPr>
             <w:rFonts w:cs="Times New Roman"/>
@@ -3132,7 +3132,7 @@
         </w:rPr>
         <w:t xml:space="preserve">the corrosion </w:t>
       </w:r>
-      <w:del w:id="9015" w:author="Claude" w:date="2026-10-08T20:38:21Z">
+      <w:del w:id="9015" w:author="Claude" w:date="2026-10-08T22:18:30Z">
         <w:r>
           <w:rPr>
             <w:rFonts w:cs="Times New Roman"/>
@@ -3140,7 +3140,7 @@
           <w:delText xml:space="preserve">film</w:delText>
         </w:r>
       </w:del>
-      <w:ins w:id="9014" w:author="Claude" w:date="2026-10-08T20:38:21Z">
+      <w:ins w:id="9014" w:author="Claude" w:date="2026-10-08T22:18:30Z">
         <w:r>
           <w:rPr>
             <w:rFonts w:cs="Times New Roman"/>
@@ -3154,7 +3154,7 @@
         </w:rPr>
         <w:t xml:space="preserve"> </w:t>
       </w:r>
-      <w:del w:id="9013" w:author="Claude" w:date="2026-10-08T20:38:21Z">
+      <w:del w:id="9013" w:author="Claude" w:date="2026-10-08T22:18:30Z">
         <w:r>
           <w:rPr>
             <w:rFonts w:cs="Times New Roman"/>
@@ -3162,7 +3162,7 @@
           <w:delText xml:space="preserve">is</w:delText>
         </w:r>
       </w:del>
-      <w:ins w:id="9012" w:author="Claude" w:date="2026-10-08T20:38:21Z">
+      <w:ins w:id="9012" w:author="Claude" w:date="2026-10-08T22:18:30Z">
         <w:r>
           <w:rPr>
             <w:rFonts w:cs="Times New Roman"/>
@@ -3323,12 +3323,12 @@
       <w:r>
         <w:t xml:space="preserve">Schematic of the coupled mechanistic framework for Zn biodegradation in physiological media. (a) Electrochemical reactions governing Zn dissolution, oxygen reduction, </w:t>
       </w:r>
-      <w:del w:id="9023" w:author="Claude" w:date="2026-10-08T20:38:21Z">
+      <w:del w:id="9023" w:author="Claude" w:date="2026-10-08T22:18:30Z">
         <w:r>
           <w:delText xml:space="preserve">film</w:delText>
         </w:r>
       </w:del>
-      <w:ins w:id="9022" w:author="Claude" w:date="2026-10-08T20:38:21Z">
+      <w:ins w:id="9022" w:author="Claude" w:date="2026-10-08T22:18:30Z">
         <w:r>
           <w:t>corrosion-product</w:t>
         </w:r>
@@ -3336,12 +3336,12 @@
       <w:r>
         <w:t xml:space="preserve"> formation, and chloride-induced </w:t>
       </w:r>
-      <w:del w:id="9021" w:author="Claude" w:date="2026-10-08T20:38:21Z">
+      <w:del w:id="9021" w:author="Claude" w:date="2026-10-08T22:18:30Z">
         <w:r>
           <w:delText xml:space="preserve">film breakdown</w:delText>
         </w:r>
       </w:del>
-      <w:ins w:id="9020" w:author="Claude" w:date="2026-10-08T20:38:21Z">
+      <w:ins w:id="9020" w:author="Claude" w:date="2026-10-08T22:18:30Z">
         <w:r>
           <w:t>dissolution</w:t>
         </w:r>
@@ -3355,7 +3355,7 @@
       <w:r>
         <w:t xml:space="preserve">) porous corrosion-product</w:t>
       </w:r>
-      <w:del w:id="9019" w:author="Claude" w:date="2026-10-08T20:38:21Z">
+      <w:del w:id="9019" w:author="Claude" w:date="2026-10-08T22:18:30Z">
         <w:r>
           <w:delText xml:space="preserve"> film</w:delText>
         </w:r>
@@ -4050,7 +4050,7 @@
         </w:rPr>
         <w:t>the corrosion-</w:t>
       </w:r>
-      <w:del w:id="9026" w:author="Claude" w:date="2026-10-08T20:38:21Z">
+      <w:del w:id="9026" w:author="Claude" w:date="2026-10-08T22:18:30Z">
         <w:r>
           <w:rPr>
             <w:rFonts w:cs="Times New Roman"/>
@@ -4058,7 +4058,7 @@
           <w:delText xml:space="preserve">film</w:delText>
         </w:r>
       </w:del>
-      <w:ins w:id="9025" w:author="Claude" w:date="2026-10-08T20:38:21Z">
+      <w:ins w:id="9025" w:author="Claude" w:date="2026-10-08T22:18:30Z">
         <w:r>
           <w:rPr>
             <w:rFonts w:cs="Times New Roman"/>
@@ -4162,7 +4162,7 @@
       <w:r>
         <w:t xml:space="preserve">. The reaction term was applied exclusively at the moving Zn–electrolyte interface, such that oxygen must diffuse to the Zn surface before being consumed. </w:t>
       </w:r>
-      <w:ins w:id="9024" w:author="Claude" w:date="2026-10-08T20:38:21Z">
+      <w:ins w:id="9024" w:author="Claude" w:date="2026-10-08T22:18:30Z">
         <w:r>
           <w:t xml:space="preserve">The interface term δ_Γ is a sharp surface integral over the zero level set (FreeFEM int2d with the levelset option), with no smoothing parameter; a smoothed delta function with a width equal to the minimum mesh size is used only in post-processing averages.</w:t>
         </w:r>
@@ -4576,7 +4576,7 @@
         </w:rPr>
         <w:t xml:space="preserve">Chloride </w:t>
       </w:r>
-      <w:del w:id="9048" w:author="Claude" w:date="2026-10-08T20:38:21Z">
+      <w:del w:id="9048" w:author="Claude" w:date="2026-10-08T22:18:30Z">
         <w:r>
           <w:rPr>
             <w:rFonts w:cs="Times New Roman"/>
@@ -4584,7 +4584,7 @@
           <w:delText xml:space="preserve">acts</w:delText>
         </w:r>
       </w:del>
-      <w:ins w:id="9047" w:author="Claude" w:date="2026-10-08T20:38:21Z">
+      <w:ins w:id="9047" w:author="Claude" w:date="2026-10-08T22:18:30Z">
         <w:r>
           <w:rPr>
             <w:rFonts w:cs="Times New Roman"/>
@@ -4598,7 +4598,7 @@
         </w:rPr>
         <w:t xml:space="preserve"> as </w:t>
       </w:r>
-      <w:del w:id="9046" w:author="Claude" w:date="2026-10-08T20:38:21Z">
+      <w:del w:id="9046" w:author="Claude" w:date="2026-10-08T22:18:30Z">
         <w:r>
           <w:rPr>
             <w:rFonts w:cs="Times New Roman"/>
@@ -4606,7 +4606,7 @@
           <w:delText xml:space="preserve">a</w:delText>
         </w:r>
       </w:del>
-      <w:ins w:id="9045" w:author="Claude" w:date="2026-10-08T20:38:21Z">
+      <w:ins w:id="9045" w:author="Claude" w:date="2026-10-08T22:18:30Z">
         <w:r>
           <w:rPr>
             <w:rFonts w:cs="Times New Roman"/>
@@ -4620,7 +4620,7 @@
         </w:rPr>
         <w:t xml:space="preserve"> </w:t>
       </w:r>
-      <w:del w:id="9044" w:author="Claude" w:date="2026-10-08T20:38:21Z">
+      <w:del w:id="9044" w:author="Claude" w:date="2026-10-08T22:18:30Z">
         <w:r>
           <w:rPr>
             <w:rFonts w:cs="Times New Roman"/>
@@ -4628,7 +4628,7 @@
           <w:delText xml:space="preserve">catalytic species</w:delText>
         </w:r>
       </w:del>
-      <w:ins w:id="9043" w:author="Claude" w:date="2026-10-08T20:38:21Z">
+      <w:ins w:id="9043" w:author="Claude" w:date="2026-10-08T22:18:30Z">
         <w:r>
           <w:rPr>
             <w:rFonts w:cs="Times New Roman"/>
@@ -4642,7 +4642,7 @@
         </w:rPr>
         <w:t xml:space="preserve">, </w:t>
       </w:r>
-      <w:del w:id="9042" w:author="Claude" w:date="2026-10-08T20:38:21Z">
+      <w:del w:id="9042" w:author="Claude" w:date="2026-10-08T22:18:30Z">
         <w:r>
           <w:rPr>
             <w:rFonts w:cs="Times New Roman"/>
@@ -4650,7 +4650,7 @@
           <w:delText xml:space="preserve">being</w:delText>
         </w:r>
       </w:del>
-      <w:ins w:id="9041" w:author="Claude" w:date="2026-10-08T20:38:21Z">
+      <w:ins w:id="9041" w:author="Claude" w:date="2026-10-08T22:18:30Z">
         <w:r>
           <w:rPr>
             <w:rFonts w:cs="Times New Roman"/>
@@ -4664,7 +4664,7 @@
         </w:rPr>
         <w:t xml:space="preserve"> </w:t>
       </w:r>
-      <w:del w:id="9040" w:author="Claude" w:date="2026-10-08T20:38:21Z">
+      <w:del w:id="9040" w:author="Claude" w:date="2026-10-08T22:18:30Z">
         <w:r>
           <w:rPr>
             <w:rFonts w:cs="Times New Roman"/>
@@ -4672,7 +4672,7 @@
           <w:delText xml:space="preserve">regenerated</w:delText>
         </w:r>
       </w:del>
-      <w:ins w:id="9039" w:author="Claude" w:date="2026-10-08T20:38:21Z">
+      <w:ins w:id="9039" w:author="Claude" w:date="2026-10-08T22:18:30Z">
         <w:r>
           <w:rPr>
             <w:rFonts w:cs="Times New Roman"/>
@@ -4686,7 +4686,7 @@
         </w:rPr>
         <w:t xml:space="preserve"> </w:t>
       </w:r>
-      <w:del w:id="9038" w:author="Claude" w:date="2026-10-08T20:38:21Z">
+      <w:del w:id="9038" w:author="Claude" w:date="2026-10-08T22:18:30Z">
         <w:r>
           <w:rPr>
             <w:rFonts w:cs="Times New Roman"/>
@@ -4694,7 +4694,7 @@
           <w:delText xml:space="preserve">during</w:delText>
         </w:r>
       </w:del>
-      <w:ins w:id="9037" w:author="Claude" w:date="2026-10-08T20:38:21Z">
+      <w:ins w:id="9037" w:author="Claude" w:date="2026-10-08T22:18:30Z">
         <w:r>
           <w:rPr>
             <w:rFonts w:cs="Times New Roman"/>
@@ -4708,7 +4708,7 @@
         </w:rPr>
         <w:t xml:space="preserve"> </w:t>
       </w:r>
-      <w:del w:id="9036" w:author="Claude" w:date="2026-10-08T20:38:21Z">
+      <w:del w:id="9036" w:author="Claude" w:date="2026-10-08T22:18:30Z">
         <w:r>
           <w:rPr>
             <w:rFonts w:cs="Times New Roman"/>
@@ -4716,7 +4716,7 @@
           <w:delText xml:space="preserve">film</w:delText>
         </w:r>
       </w:del>
-      <w:ins w:id="9035" w:author="Claude" w:date="2026-10-08T20:38:21Z">
+      <w:ins w:id="9035" w:author="Claude" w:date="2026-10-08T22:18:30Z">
         <w:r>
           <w:rPr>
             <w:rFonts w:cs="Times New Roman"/>
@@ -4730,7 +4730,7 @@
         </w:rPr>
         <w:t xml:space="preserve"> </w:t>
       </w:r>
-      <w:del w:id="9034" w:author="Claude" w:date="2026-10-08T20:38:21Z">
+      <w:del w:id="9034" w:author="Claude" w:date="2026-10-08T22:18:30Z">
         <w:r>
           <w:rPr>
             <w:rFonts w:cs="Times New Roman"/>
@@ -4738,7 +4738,7 @@
           <w:delText xml:space="preserve">breakdown</w:delText>
         </w:r>
       </w:del>
-      <w:ins w:id="9033" w:author="Claude" w:date="2026-10-08T20:38:21Z">
+      <w:ins w:id="9033" w:author="Claude" w:date="2026-10-08T22:18:30Z">
         <w:r>
           <w:rPr>
             <w:rFonts w:cs="Times New Roman"/>
@@ -4752,7 +4752,7 @@
         </w:rPr>
         <w:t xml:space="preserve"> </w:t>
       </w:r>
-      <w:del w:id="9032" w:author="Claude" w:date="2026-10-08T20:38:21Z">
+      <w:del w:id="9032" w:author="Claude" w:date="2026-10-08T22:18:30Z">
         <w:r>
           <w:rPr>
             <w:rFonts w:cs="Times New Roman"/>
@@ -4760,7 +4760,7 @@
           <w:delText xml:space="preserve">rather</w:delText>
         </w:r>
       </w:del>
-      <w:ins w:id="9031" w:author="Claude" w:date="2026-10-08T20:38:21Z">
+      <w:ins w:id="9031" w:author="Claude" w:date="2026-10-08T22:18:30Z">
         <w:r>
           <w:rPr>
             <w:rFonts w:cs="Times New Roman"/>
@@ -4774,7 +4774,7 @@
         </w:rPr>
         <w:t xml:space="preserve"> </w:t>
       </w:r>
-      <w:del w:id="9030" w:author="Claude" w:date="2026-10-08T20:38:21Z">
+      <w:del w:id="9030" w:author="Claude" w:date="2026-10-08T22:18:30Z">
         <w:r>
           <w:rPr>
             <w:rFonts w:cs="Times New Roman"/>
@@ -4782,7 +4782,7 @@
           <w:delText xml:space="preserve">than</w:delText>
         </w:r>
       </w:del>
-      <w:ins w:id="9029" w:author="Claude" w:date="2026-10-08T20:38:21Z">
+      <w:ins w:id="9029" w:author="Claude" w:date="2026-10-08T22:18:30Z">
         <w:r>
           <w:rPr>
             <w:rFonts w:cs="Times New Roman"/>
@@ -4796,7 +4796,7 @@
         </w:rPr>
         <w:t xml:space="preserve"> </w:t>
       </w:r>
-      <w:del w:id="9028" w:author="Claude" w:date="2026-10-08T20:38:21Z">
+      <w:del w:id="9028" w:author="Claude" w:date="2026-10-08T22:18:30Z">
         <w:r>
           <w:rPr>
             <w:rFonts w:cs="Times New Roman"/>
@@ -4804,7 +4804,7 @@
           <w:delText xml:space="preserve">consumed</w:delText>
         </w:r>
       </w:del>
-      <w:ins w:id="9027" w:author="Claude" w:date="2026-10-08T20:38:21Z">
+      <w:ins w:id="9027" w:author="Claude" w:date="2026-10-08T22:18:30Z">
         <w:r>
           <w:rPr>
             <w:rFonts w:cs="Times New Roman"/>
@@ -5258,7 +5258,7 @@
         <w:t xml:space="preserve">generating OH⁻ ions that increase the local alkalinity and promote formation of </w:t>
       </w:r>
       <w:proofErr w:type="spellStart"/>
-      <w:del w:id="9054" w:author="Claude" w:date="2026-10-08T20:38:21Z">
+      <w:del w:id="9054" w:author="Claude" w:date="2026-10-08T22:18:30Z">
         <w:r>
           <w:rPr>
             <w:rFonts w:cs="Times New Roman"/>
@@ -5279,7 +5279,7 @@
         </w:rPr>
         <w:t>-based corrosion</w:t>
       </w:r>
-      <w:del w:id="9053" w:author="Claude" w:date="2026-10-08T20:38:21Z">
+      <w:del w:id="9053" w:author="Claude" w:date="2026-10-08T22:18:30Z">
         <w:r>
           <w:rPr>
             <w:rFonts w:cs="Times New Roman"/>
@@ -5293,7 +5293,7 @@
         </w:rPr>
         <w:t xml:space="preserve"> </w:t>
       </w:r>
-      <w:del w:id="9052" w:author="Claude" w:date="2026-10-08T20:38:21Z">
+      <w:del w:id="9052" w:author="Claude" w:date="2026-10-08T22:18:30Z">
         <w:r>
           <w:rPr>
             <w:rFonts w:cs="Times New Roman"/>
@@ -5301,7 +5301,7 @@
           <w:delText xml:space="preserve">film</w:delText>
         </w:r>
       </w:del>
-      <w:ins w:id="9051" w:author="Claude" w:date="2026-10-08T20:38:21Z">
+      <w:ins w:id="9051" w:author="Claude" w:date="2026-10-08T22:18:30Z">
         <w:r>
           <w:rPr>
             <w:rFonts w:cs="Times New Roman"/>
@@ -5327,7 +5327,7 @@
         </w:rPr>
         <w:t xml:space="preserve">At the same time, chloride-induced </w:t>
       </w:r>
-      <w:del w:id="9050" w:author="Claude" w:date="2026-10-08T20:38:21Z">
+      <w:del w:id="9050" w:author="Claude" w:date="2026-10-08T22:18:30Z">
         <w:r>
           <w:rPr>
             <w:rFonts w:cs="Times New Roman"/>
@@ -5335,7 +5335,7 @@
           <w:delText xml:space="preserve">film</w:delText>
         </w:r>
       </w:del>
-      <w:ins w:id="9049" w:author="Claude" w:date="2026-10-08T20:38:21Z">
+      <w:ins w:id="9049" w:author="Claude" w:date="2026-10-08T22:18:30Z">
         <w:r>
           <w:rPr>
             <w:rFonts w:cs="Times New Roman"/>
@@ -6184,12 +6184,12 @@
       <w:r>
         <w:t xml:space="preserve">Here, the corrosion-product </w:t>
       </w:r>
-      <w:del w:id="9056" w:author="Claude" w:date="2026-10-08T20:38:21Z">
+      <w:del w:id="9056" w:author="Claude" w:date="2026-10-08T22:18:30Z">
         <w:r>
           <w:delText xml:space="preserve">film</w:delText>
         </w:r>
       </w:del>
-      <w:ins w:id="9055" w:author="Claude" w:date="2026-10-08T20:38:21Z">
+      <w:ins w:id="9055" w:author="Claude" w:date="2026-10-08T22:18:30Z">
         <w:r>
           <w:t>field</w:t>
         </w:r>
@@ -6633,7 +6633,7 @@
       <w:r>
         <w:t xml:space="preserve"> the rates of corrosion-product </w:t>
       </w:r>
-      <w:del w:id="9071" w:author="Claude" w:date="2026-10-08T20:38:21Z">
+      <w:del w:id="9071" w:author="Claude" w:date="2026-10-08T22:18:30Z">
         <w:r>
           <w:delText xml:space="preserve">film </w:delText>
         </w:r>
@@ -6641,7 +6641,7 @@
       <w:r>
         <w:t xml:space="preserve">formation and chloride-mediated </w:t>
       </w:r>
-      <w:del w:id="9070" w:author="Claude" w:date="2026-10-08T20:38:21Z">
+      <w:del w:id="9070" w:author="Claude" w:date="2026-10-08T22:18:30Z">
         <w:r>
           <w:delText xml:space="preserve">film </w:delText>
         </w:r>
@@ -6649,7 +6649,7 @@
       <w:r>
         <w:t xml:space="preserve">dissolution, respectively</w:t>
       </w:r>
-      <w:ins w:id="9069" w:author="Claude" w:date="2026-10-08T20:38:21Z">
+      <w:ins w:id="9069" w:author="Claude" w:date="2026-10-08T22:18:30Z">
         <w:r>
           <w:t xml:space="preserve">. The chloride exponent in Eq. 11 is an effective reaction order, not the stoichiometric one of Eq. 5</w:t>
         </w:r>
@@ -6747,7 +6747,7 @@
         </w:rPr>
         <w:t xml:space="preserve">, which suppresses further growth as the </w:t>
       </w:r>
-      <w:del w:id="9068" w:author="Claude" w:date="2026-10-08T20:38:21Z">
+      <w:del w:id="9068" w:author="Claude" w:date="2026-10-08T22:18:30Z">
         <w:r>
           <w:rPr>
             <w:rFonts w:cs="Times New Roman"/>
@@ -6755,7 +6755,7 @@
           <w:delText xml:space="preserve">film</w:delText>
         </w:r>
       </w:del>
-      <w:ins w:id="9067" w:author="Claude" w:date="2026-10-08T20:38:21Z">
+      <w:ins w:id="9067" w:author="Claude" w:date="2026-10-08T22:18:30Z">
         <w:r>
           <w:rPr>
             <w:rFonts w:cs="Times New Roman"/>
@@ -6878,12 +6878,12 @@
       <w:r>
         <w:t xml:space="preserve"> </w:t>
       </w:r>
-      <w:ins w:id="9065" w:author="Claude" w:date="2026-10-08T20:38:21Z">
+      <w:ins w:id="9065" w:author="Claude" w:date="2026-10-08T22:18:30Z">
         <w:r>
           <w:t xml:space="preserve">(in g mm⁻³)</w:t>
         </w:r>
       </w:ins>
-      <w:ins w:id="9066" w:author="Claude" w:date="2026-10-08T20:38:21Z">
+      <w:ins w:id="9066" w:author="Claude" w:date="2026-10-08T22:18:30Z">
         <w:r>
           <w:rPr>
             <w:rFonts w:cs="Times New Roman"/>
@@ -6931,12 +6931,12 @@
       <w:r>
         <w:t xml:space="preserve">As the </w:t>
       </w:r>
-      <w:del w:id="9064" w:author="Claude" w:date="2026-10-08T20:38:21Z">
+      <w:del w:id="9064" w:author="Claude" w:date="2026-10-08T22:18:30Z">
         <w:r>
           <w:delText xml:space="preserve">film</w:delText>
         </w:r>
       </w:del>
-      <w:ins w:id="9063" w:author="Claude" w:date="2026-10-08T20:38:21Z">
+      <w:ins w:id="9063" w:author="Claude" w:date="2026-10-08T22:18:30Z">
         <w:r>
           <w:t>corrosion</w:t>
         </w:r>
@@ -6944,12 +6944,12 @@
       <w:r>
         <w:t xml:space="preserve"> </w:t>
       </w:r>
-      <w:del w:id="9062" w:author="Claude" w:date="2026-10-08T20:38:21Z">
+      <w:del w:id="9062" w:author="Claude" w:date="2026-10-08T22:18:30Z">
         <w:r>
           <w:delText xml:space="preserve">accumulates</w:delText>
         </w:r>
       </w:del>
-      <w:ins w:id="9061" w:author="Claude" w:date="2026-10-08T20:38:21Z">
+      <w:ins w:id="9061" w:author="Claude" w:date="2026-10-08T22:18:30Z">
         <w:r>
           <w:t>products accumulate</w:t>
         </w:r>
@@ -6957,12 +6957,12 @@
       <w:r>
         <w:t xml:space="preserve">, </w:t>
       </w:r>
-      <w:del w:id="9060" w:author="Claude" w:date="2026-10-08T20:38:21Z">
+      <w:del w:id="9060" w:author="Claude" w:date="2026-10-08T22:18:30Z">
         <w:r>
           <w:delText xml:space="preserve">it</w:delText>
         </w:r>
       </w:del>
-      <w:ins w:id="9059" w:author="Claude" w:date="2026-10-08T20:38:21Z">
+      <w:ins w:id="9059" w:author="Claude" w:date="2026-10-08T22:18:30Z">
         <w:r>
           <w:t xml:space="preserve">they</w:t>
         </w:r>
@@ -6970,12 +6970,12 @@
       <w:r>
         <w:t xml:space="preserve"> </w:t>
       </w:r>
-      <w:del w:id="9058" w:author="Claude" w:date="2026-10-08T20:38:21Z">
+      <w:del w:id="9058" w:author="Claude" w:date="2026-10-08T22:18:30Z">
         <w:r>
           <w:delText xml:space="preserve">impedes</w:delText>
         </w:r>
       </w:del>
-      <w:ins w:id="9057" w:author="Claude" w:date="2026-10-08T20:38:21Z">
+      <w:ins w:id="9057" w:author="Claude" w:date="2026-10-08T22:18:30Z">
         <w:r>
           <w:t xml:space="preserve">impede</w:t>
         </w:r>
@@ -7350,12 +7350,12 @@
       <w:r>
         <w:t xml:space="preserve">​ is the free-solution diffusivity, and the transport reduction depends on the </w:t>
       </w:r>
-      <w:del w:id="9073" w:author="Claude" w:date="2026-10-08T20:38:21Z">
+      <w:del w:id="9073" w:author="Claude" w:date="2026-10-08T22:18:30Z">
         <w:r>
           <w:delText xml:space="preserve">film</w:delText>
         </w:r>
       </w:del>
-      <w:ins w:id="9072" w:author="Claude" w:date="2026-10-08T20:38:21Z">
+      <w:ins w:id="9072" w:author="Claude" w:date="2026-10-08T22:18:30Z">
         <w:r>
           <w:t xml:space="preserve">corrosion-product region</w:t>
         </w:r>
@@ -8259,7 +8259,7 @@
         </w:rPr>
         <w:t xml:space="preserve"> is the solid </w:t>
       </w:r>
-      <w:del w:id="9076" w:author="Claude" w:date="2026-10-08T20:38:21Z">
+      <w:del w:id="9076" w:author="Claude" w:date="2026-10-08T22:18:30Z">
         <w:r>
           <w:rPr>
             <w:rFonts w:cs="Times New Roman"/>
@@ -8267,7 +8267,7 @@
           <w:delText xml:space="preserve">molar</w:delText>
         </w:r>
       </w:del>
-      <w:ins w:id="9075" w:author="Claude" w:date="2026-10-08T20:38:21Z">
+      <w:ins w:id="9075" w:author="Claude" w:date="2026-10-08T22:18:30Z">
         <w:r>
           <w:rPr>
             <w:rFonts w:cs="Times New Roman"/>
@@ -8377,7 +8377,7 @@
         </w:rPr>
         <w:t xml:space="preserve"> saturation concentration</w:t>
       </w:r>
-      <w:ins w:id="9074" w:author="Claude" w:date="2026-10-08T20:38:21Z">
+      <w:ins w:id="9074" w:author="Claude" w:date="2026-10-08T22:18:30Z">
         <w:r>
           <w:rPr>
             <w:rFonts w:cs="Times New Roman"/>
@@ -9419,7 +9419,7 @@
         </w:rPr>
         <w:t xml:space="preserve">).</w:t>
       </w:r>
-      <w:ins w:id="9077" w:author="Claude" w:date="2026-10-08T20:38:21Z">
+      <w:ins w:id="9077" w:author="Claude" w:date="2026-10-08T22:18:30Z">
         <w:r>
           <w:rPr>
             <w:rFonts w:cs="Times New Roman"/>
@@ -9457,12 +9457,12 @@
       <w:r>
         <w:t xml:space="preserve">Parametrically generated implant geometries were discretized into tetrahedral meshes and embedded within </w:t>
       </w:r>
-      <w:del w:id="9085" w:author="Claude" w:date="2026-10-08T20:38:21Z">
+      <w:del w:id="9085" w:author="Claude" w:date="2026-10-08T22:18:30Z">
         <w:r>
           <w:delText xml:space="preserve">an</w:delText>
         </w:r>
       </w:del>
-      <w:ins w:id="9084" w:author="Claude" w:date="2026-10-08T20:38:21Z">
+      <w:ins w:id="9084" w:author="Claude" w:date="2026-10-08T22:18:30Z">
         <w:r>
           <w:t xml:space="preserve">a 30 × 30 × 30 mm</w:t>
         </w:r>
@@ -9473,7 +9473,7 @@
       <w:r>
         <w:t>electrolyte domain</w:t>
       </w:r>
-      <w:ins w:id="9083" w:author="Claude" w:date="2026-10-08T20:38:21Z">
+      <w:ins w:id="9083" w:author="Claude" w:date="2026-10-08T22:18:30Z">
         <w:r>
           <w:t xml:space="preserve">,</w:t>
         </w:r>
@@ -9481,12 +9481,12 @@
       <w:r>
         <w:t xml:space="preserve"> </w:t>
       </w:r>
-      <w:del w:id="9082" w:author="Claude" w:date="2026-10-08T20:38:21Z">
+      <w:del w:id="9082" w:author="Claude" w:date="2026-10-08T22:18:30Z">
         <w:r>
           <w:delText xml:space="preserve">at</w:delText>
         </w:r>
       </w:del>
-      <w:ins w:id="9081" w:author="Claude" w:date="2026-10-08T20:38:21Z">
+      <w:ins w:id="9081" w:author="Claude" w:date="2026-10-08T22:18:30Z">
         <w:r>
           <w:t xml:space="preserve">identical</w:t>
         </w:r>
@@ -9494,12 +9494,12 @@
       <w:r>
         <w:t xml:space="preserve"> </w:t>
       </w:r>
-      <w:del w:id="9080" w:author="Claude" w:date="2026-10-08T20:38:21Z">
+      <w:del w:id="9080" w:author="Claude" w:date="2026-10-08T22:18:30Z">
         <w:r>
           <w:delText xml:space="preserve">least</w:delText>
         </w:r>
       </w:del>
-      <w:ins w:id="9079" w:author="Claude" w:date="2026-10-08T20:38:21Z">
+      <w:ins w:id="9079" w:author="Claude" w:date="2026-10-08T22:18:30Z">
         <w:r>
           <w:t xml:space="preserve">for the disc and the stent and larger than</w:t>
         </w:r>
@@ -9507,7 +9507,7 @@
       <w:r>
         <w:t xml:space="preserve"> three times</w:t>
       </w:r>
-      <w:del w:id="9078" w:author="Claude" w:date="2026-10-08T20:38:21Z">
+      <w:del w:id="9078" w:author="Claude" w:date="2026-10-08T22:18:30Z">
         <w:r>
           <w:delText xml:space="preserve"> larger than</w:delText>
         </w:r>
@@ -9553,22 +9553,22 @@
       <w:r>
         <w:t>Physiological initial and boundary conditions were imposed throughout the electrolyte domain, including continuous oxygen replenishment at the electrolyte-air interface and kinetic flux conditions at the moving metal-electrolyte boundary</w:t>
       </w:r>
-      <w:ins w:id="9091" w:author="Claude" w:date="2026-10-08T20:38:21Z">
+      <w:ins w:id="9091" w:author="Claude" w:date="2026-10-08T22:18:30Z">
         <w:r>
           <w:t xml:space="preserve">. The 48 h medium renewal used in the immersion tests was not modeled explicitly; instead, dissolved oxygen was assumed to be </w:t>
         </w:r>
       </w:ins>
-      <w:ins w:id="9092" w:author="Claude" w:date="2026-10-08T20:38:21Z">
+      <w:ins w:id="9092" w:author="Claude" w:date="2026-10-08T22:18:30Z">
         <w:r>
           <w:t>continuously replenished at the electrolyte–air interface</w:t>
         </w:r>
       </w:ins>
-      <w:ins w:id="9093" w:author="Claude" w:date="2026-10-08T20:38:21Z">
+      <w:ins w:id="9093" w:author="Claude" w:date="2026-10-08T22:18:30Z">
         <w:r>
           <w:t xml:space="preserve"> and </w:t>
         </w:r>
       </w:ins>
-      <w:ins w:id="9094" w:author="Claude" w:date="2026-10-08T20:38:21Z">
+      <w:ins w:id="9094" w:author="Claude" w:date="2026-10-08T22:18:30Z">
         <w:r>
           <w:t>no natural convection was considered (static conditions)</w:t>
         </w:r>
@@ -9613,12 +9613,12 @@
       <w:r>
         <w:t xml:space="preserve">normalized </w:t>
       </w:r>
-      <w:del w:id="9090" w:author="Claude" w:date="2026-10-08T20:38:21Z">
+      <w:del w:id="9090" w:author="Claude" w:date="2026-10-08T22:18:30Z">
         <w:r>
           <w:delText xml:space="preserve">film</w:delText>
         </w:r>
       </w:del>
-      <w:ins w:id="9089" w:author="Claude" w:date="2026-10-08T20:38:21Z">
+      <w:ins w:id="9089" w:author="Claude" w:date="2026-10-08T22:18:30Z">
         <w:r>
           <w:t>corrosion-product</w:t>
         </w:r>
@@ -9650,7 +9650,7 @@
       <w:r>
         <w:t xml:space="preserve">), while spatial distributions of oxygen concentration and corrosion-product </w:t>
       </w:r>
-      <w:del w:id="9088" w:author="Claude" w:date="2026-10-08T20:38:21Z">
+      <w:del w:id="9088" w:author="Claude" w:date="2026-10-08T22:18:30Z">
         <w:r>
           <w:delText xml:space="preserve">film </w:delText>
         </w:r>
@@ -9732,12 +9732,12 @@
       <w:r>
         <w:t xml:space="preserve">used in the simulations. </w:t>
       </w:r>
-      <w:ins w:id="9086" w:author="Claude" w:date="2026-10-08T20:38:21Z">
+      <w:ins w:id="9086" w:author="Claude" w:date="2026-10-08T22:18:30Z">
         <w:r>
           <w:t xml:space="preserve">A global mass balance shows that the O₂ consumed at the interface is about 1/32 of the stoichiometric requirement for the Zn lost at 24 h and about 1/24 at 168 h (Section S8), so Zn recession is not stoichiometrically coupled to O₂ consumption in the present formulation.</w:t>
         </w:r>
       </w:ins>
-      <w:ins w:id="9087" w:author="Claude" w:date="2026-10-08T20:38:21Z">
+      <w:ins w:id="9087" w:author="Claude" w:date="2026-10-08T22:18:30Z">
         <w:r>
           <w:t xml:space="preserve"> </w:t>
         </w:r>
@@ -13820,12 +13820,12 @@
       <w:r>
         <w:t xml:space="preserve">. Each parameter was varied </w:t>
       </w:r>
-      <w:del w:id="9104" w:author="Claude" w:date="2026-10-08T20:38:21Z">
+      <w:del w:id="9104" w:author="Claude" w:date="2026-10-08T22:18:30Z">
         <w:r>
           <w:delText xml:space="preserve">across</w:delText>
         </w:r>
       </w:del>
-      <w:ins w:id="9103" w:author="Claude" w:date="2026-10-08T20:38:21Z">
+      <w:ins w:id="9103" w:author="Claude" w:date="2026-10-08T22:18:30Z">
         <w:r>
           <w:t xml:space="preserve">above</w:t>
         </w:r>
@@ -13833,12 +13833,12 @@
       <w:r>
         <w:t xml:space="preserve"> </w:t>
       </w:r>
-      <w:del w:id="9102" w:author="Claude" w:date="2026-10-08T20:38:21Z">
+      <w:del w:id="9102" w:author="Claude" w:date="2026-10-08T22:18:30Z">
         <w:r>
           <w:delText xml:space="preserve">representative</w:delText>
         </w:r>
       </w:del>
-      <w:ins w:id="9101" w:author="Claude" w:date="2026-10-08T20:38:21Z">
+      <w:ins w:id="9101" w:author="Claude" w:date="2026-10-08T22:18:30Z">
         <w:r>
           <w:t xml:space="preserve">and below the baseline</w:t>
         </w:r>
@@ -13846,12 +13846,12 @@
       <w:r>
         <w:t xml:space="preserve"> values while the remaining parameters were held constant. The resulting changes in mass loss, corrosion-</w:t>
       </w:r>
-      <w:del w:id="9100" w:author="Claude" w:date="2026-10-08T20:38:21Z">
+      <w:del w:id="9100" w:author="Claude" w:date="2026-10-08T22:18:30Z">
         <w:r>
           <w:delText xml:space="preserve">film</w:delText>
         </w:r>
       </w:del>
-      <w:ins w:id="9099" w:author="Claude" w:date="2026-10-08T20:38:21Z">
+      <w:ins w:id="9099" w:author="Claude" w:date="2026-10-08T22:18:30Z">
         <w:r>
           <w:t xml:space="preserve">product</w:t>
         </w:r>
@@ -13859,12 +13859,12 @@
       <w:r>
         <w:t xml:space="preserve"> </w:t>
       </w:r>
-      <w:del w:id="9098" w:author="Claude" w:date="2026-10-08T20:38:21Z">
+      <w:del w:id="9098" w:author="Claude" w:date="2026-10-08T22:18:30Z">
         <w:r>
           <w:delText xml:space="preserve">coverage</w:delText>
         </w:r>
       </w:del>
-      <w:ins w:id="9097" w:author="Claude" w:date="2026-10-08T20:38:21Z">
+      <w:ins w:id="9097" w:author="Claude" w:date="2026-10-08T22:18:30Z">
         <w:r>
           <w:t xml:space="preserve">saturation (F/Fₘₐₓ)</w:t>
         </w:r>
@@ -13878,12 +13878,12 @@
       <w:r>
         <w:t xml:space="preserve"> the roles of passivation, </w:t>
       </w:r>
-      <w:del w:id="9096" w:author="Claude" w:date="2026-10-08T20:38:21Z">
+      <w:del w:id="9096" w:author="Claude" w:date="2026-10-08T22:18:30Z">
         <w:r>
           <w:delText xml:space="preserve">film</w:delText>
         </w:r>
       </w:del>
-      <w:ins w:id="9095" w:author="Claude" w:date="2026-10-08T20:38:21Z">
+      <w:ins w:id="9095" w:author="Claude" w:date="2026-10-08T22:18:30Z">
         <w:r>
           <w:t xml:space="preserve">corrosion-product</w:t>
         </w:r>
@@ -14390,7 +14390,7 @@
         </w:rPr>
         <w:t xml:space="preserve">effective </w:t>
       </w:r>
-      <w:del w:id="9110" w:author="Claude" w:date="2026-10-08T20:38:21Z">
+      <w:del w:id="9110" w:author="Claude" w:date="2026-10-08T22:18:30Z">
         <w:r>
           <w:rPr>
             <w:rFonts w:cs="Times New Roman"/>
@@ -14398,7 +14398,7 @@
           <w:delText xml:space="preserve">film</w:delText>
         </w:r>
       </w:del>
-      <w:ins w:id="9109" w:author="Claude" w:date="2026-10-08T20:38:21Z">
+      <w:ins w:id="9109" w:author="Claude" w:date="2026-10-08T22:18:30Z">
         <w:r>
           <w:rPr>
             <w:rFonts w:cs="Times New Roman"/>
@@ -14412,7 +14412,7 @@
         </w:rPr>
         <w:t xml:space="preserve">-</w:t>
       </w:r>
-      <w:ins w:id="9108" w:author="Claude" w:date="2026-10-08T20:38:21Z">
+      <w:ins w:id="9108" w:author="Claude" w:date="2026-10-08T22:18:30Z">
         <w:r>
           <w:rPr>
             <w:rFonts w:cs="Times New Roman"/>
@@ -14541,7 +14541,7 @@
         </w:rPr>
         <w:t xml:space="preserve">effective </w:t>
       </w:r>
-      <w:del w:id="9107" w:author="Claude" w:date="2026-10-08T20:38:21Z">
+      <w:del w:id="9107" w:author="Claude" w:date="2026-10-08T22:18:30Z">
         <w:r>
           <w:rPr>
             <w:rFonts w:cs="Times New Roman"/>
@@ -14549,7 +14549,7 @@
           <w:delText xml:space="preserve">film</w:delText>
         </w:r>
       </w:del>
-      <w:ins w:id="9106" w:author="Claude" w:date="2026-10-08T20:38:21Z">
+      <w:ins w:id="9106" w:author="Claude" w:date="2026-10-08T22:18:30Z">
         <w:r>
           <w:rPr>
             <w:rFonts w:cs="Times New Roman"/>
@@ -14563,7 +14563,7 @@
         </w:rPr>
         <w:t xml:space="preserve">-</w:t>
       </w:r>
-      <w:ins w:id="9105" w:author="Claude" w:date="2026-10-08T20:38:21Z">
+      <w:ins w:id="9105" w:author="Claude" w:date="2026-10-08T22:18:30Z">
         <w:r>
           <w:rPr>
             <w:rFonts w:cs="Times New Roman"/>
@@ -15259,7 +15259,7 @@
       <w:r>
         <w:t xml:space="preserve">2% against the calibration dataset. These results show that the proposed three-parameter framework can closely reproduce the calibration measurements. The combination of low calibration error and rapid convergence supports the framework’s potential as a </w:t>
       </w:r>
-      <w:del w:id="9112" w:author="Claude" w:date="2026-10-08T20:38:21Z">
+      <w:del w:id="9112" w:author="Claude" w:date="2026-10-08T22:18:30Z">
         <w:r>
           <w:delText xml:space="preserve">computationally tractable </w:delText>
         </w:r>
@@ -15267,7 +15267,7 @@
       <w:r>
         <w:t xml:space="preserve">basis for predictive Zn biodegradation modeling, subject to independent validation.</w:t>
       </w:r>
-      <w:ins w:id="9111" w:author="Claude" w:date="2026-10-08T20:38:21Z">
+      <w:ins w:id="9111" w:author="Claude" w:date="2026-10-08T22:18:30Z">
         <w:r>
           <w:t xml:space="preserve"> Calibration remained computationally tractable because only three parameters were calibrated on a coarse mesh, at about 2 h per 3D simulation (Table S4 in the Supplementary Information).</w:t>
         </w:r>
@@ -15877,7 +15877,7 @@
                 <w:szCs w:val="22"/>
               </w:rPr>
             </w:pPr>
-            <w:ins w:id="9251" w:author="Claude" w:date="2026-10-08T20:38:21Z">
+            <w:ins w:id="9253" w:author="Claude" w:date="2026-10-08T22:18:30Z">
               <w:r>
                 <w:t>L² mol⁻² h⁻¹</w:t>
               </w:r>
@@ -16161,7 +16161,7 @@
       <w:tr>
         <w:trPr>
           <w:cantSplit/>
-          <w:ins w:id="20004" w:author="Claude" w:date="2026-10-08T20:38:21Z"/>
+          <w:ins w:id="20004" w:author="Claude" w:date="2026-10-08T22:18:30Z"/>
         </w:trPr>
         <w:tc>
           <w:tcPr>
@@ -16173,13 +16173,13 @@
               <w:spacing w:line="240" w:lineRule="auto"/>
               <w:jc w:val="left"/>
               <w:rPr>
-                <w:ins w:id="20006" w:author="Claude" w:date="2026-10-08T20:38:21Z"/>
+                <w:ins w:id="20006" w:author="Claude" w:date="2026-10-08T22:18:30Z"/>
                 <w:rFonts w:cs="Times New Roman"/>
                 <w:sz w:val="22"/>
                 <w:szCs w:val="22"/>
               </w:rPr>
             </w:pPr>
-            <w:ins w:id="20005" w:author="Claude" w:date="2026-10-08T20:38:21Z">
+            <w:ins w:id="20005" w:author="Claude" w:date="2026-10-08T22:18:30Z">
               <w:r>
                 <w:t>M(O₂)</w:t>
               </w:r>
@@ -16196,13 +16196,13 @@
               <w:spacing w:line="240" w:lineRule="auto"/>
               <w:jc w:val="left"/>
               <w:rPr>
-                <w:ins w:id="20008" w:author="Claude" w:date="2026-10-08T20:38:21Z"/>
+                <w:ins w:id="20008" w:author="Claude" w:date="2026-10-08T22:18:30Z"/>
                 <w:rFonts w:cs="Times New Roman"/>
                 <w:sz w:val="22"/>
                 <w:szCs w:val="22"/>
               </w:rPr>
             </w:pPr>
-            <w:ins w:id="20007" w:author="Claude" w:date="2026-10-08T20:38:21Z">
+            <w:ins w:id="20007" w:author="Claude" w:date="2026-10-08T22:18:30Z">
               <w:r>
                 <w:t>g mol⁻¹</w:t>
               </w:r>
@@ -16219,13 +16219,13 @@
               <w:spacing w:line="240" w:lineRule="auto"/>
               <w:jc w:val="left"/>
               <w:rPr>
-                <w:ins w:id="20010" w:author="Claude" w:date="2026-10-08T20:38:21Z"/>
+                <w:ins w:id="20010" w:author="Claude" w:date="2026-10-08T22:18:30Z"/>
                 <w:rFonts w:cs="Times New Roman"/>
                 <w:sz w:val="22"/>
                 <w:szCs w:val="22"/>
               </w:rPr>
             </w:pPr>
-            <w:ins w:id="20009" w:author="Claude" w:date="2026-10-08T20:38:21Z">
+            <w:ins w:id="20009" w:author="Claude" w:date="2026-10-08T22:18:30Z">
               <w:r>
                 <w:t>fixed</w:t>
               </w:r>
@@ -16242,13 +16242,13 @@
               <w:spacing w:line="240" w:lineRule="auto"/>
               <w:jc w:val="left"/>
               <w:rPr>
-                <w:ins w:id="20012" w:author="Claude" w:date="2026-10-08T20:38:21Z"/>
+                <w:ins w:id="20012" w:author="Claude" w:date="2026-10-08T22:18:30Z"/>
                 <w:rFonts w:cs="Times New Roman"/>
                 <w:sz w:val="22"/>
                 <w:szCs w:val="22"/>
               </w:rPr>
             </w:pPr>
-            <w:ins w:id="20011" w:author="Claude" w:date="2026-10-08T20:38:21Z">
+            <w:ins w:id="20011" w:author="Claude" w:date="2026-10-08T22:18:30Z">
               <w:r>
                 <w:t>32</w:t>
               </w:r>
@@ -16889,12 +16889,12 @@
       <w:r>
         <w:t xml:space="preserve">The associated </w:t>
       </w:r>
-      <w:del w:id="9145" w:author="Claude" w:date="2026-10-08T20:38:21Z">
+      <w:del w:id="9145" w:author="Claude" w:date="2026-10-08T22:18:30Z">
         <w:r>
           <w:delText xml:space="preserve">film</w:delText>
         </w:r>
       </w:del>
-      <w:ins w:id="9144" w:author="Claude" w:date="2026-10-08T20:38:21Z">
+      <w:ins w:id="9144" w:author="Claude" w:date="2026-10-08T22:18:30Z">
         <w:r>
           <w:t xml:space="preserve">corrosion</w:t>
         </w:r>
@@ -16902,12 +16902,12 @@
       <w:r>
         <w:t xml:space="preserve">-</w:t>
       </w:r>
-      <w:del w:id="9143" w:author="Claude" w:date="2026-10-08T20:38:21Z">
+      <w:del w:id="9143" w:author="Claude" w:date="2026-10-08T22:18:30Z">
         <w:r>
           <w:delText xml:space="preserve">coverage</w:delText>
         </w:r>
       </w:del>
-      <w:ins w:id="9142" w:author="Claude" w:date="2026-10-08T20:38:21Z">
+      <w:ins w:id="9142" w:author="Claude" w:date="2026-10-08T22:18:30Z">
         <w:r>
           <w:t xml:space="preserve">product saturation</w:t>
         </w:r>
@@ -17035,12 +17035,12 @@
       <w:r>
         <w:t xml:space="preserve"> into corrosion products through the </w:t>
       </w:r>
-      <w:del w:id="9141" w:author="Claude" w:date="2026-10-08T20:38:21Z">
+      <w:del w:id="9141" w:author="Claude" w:date="2026-10-08T22:18:30Z">
         <w:r>
           <w:delText xml:space="preserve">film</w:delText>
         </w:r>
       </w:del>
-      <w:ins w:id="9140" w:author="Claude" w:date="2026-10-08T20:38:21Z">
+      <w:ins w:id="9140" w:author="Claude" w:date="2026-10-08T22:18:30Z">
         <w:r>
           <w:t xml:space="preserve">corrosion</w:t>
         </w:r>
@@ -17048,7 +17048,7 @@
       <w:r>
         <w:t xml:space="preserve">-</w:t>
       </w:r>
-      <w:ins w:id="9139" w:author="Claude" w:date="2026-10-08T20:38:21Z">
+      <w:ins w:id="9139" w:author="Claude" w:date="2026-10-08T22:18:30Z">
         <w:r>
           <w:t xml:space="preserve">product </w:t>
         </w:r>
@@ -17056,12 +17056,12 @@
       <w:r>
         <w:t xml:space="preserve">growth term, resulting in faster </w:t>
       </w:r>
-      <w:del w:id="9138" w:author="Claude" w:date="2026-10-08T20:38:21Z">
+      <w:del w:id="9138" w:author="Claude" w:date="2026-10-08T22:18:30Z">
         <w:r>
           <w:delText xml:space="preserve">film</w:delText>
         </w:r>
       </w:del>
-      <w:ins w:id="9137" w:author="Claude" w:date="2026-10-08T20:38:21Z">
+      <w:ins w:id="9137" w:author="Claude" w:date="2026-10-08T22:18:30Z">
         <w:r>
           <w:t xml:space="preserve">corrosion-product</w:t>
         </w:r>
@@ -17072,12 +17072,12 @@
       <w:r>
         <w:t xml:space="preserve">accumulation and greater </w:t>
       </w:r>
-      <w:del w:id="9136" w:author="Claude" w:date="2026-10-08T20:38:21Z">
+      <w:del w:id="9136" w:author="Claude" w:date="2026-10-08T22:18:30Z">
         <w:r>
           <w:delText xml:space="preserve">surface</w:delText>
         </w:r>
       </w:del>
-      <w:ins w:id="9135" w:author="Claude" w:date="2026-10-08T20:38:21Z">
+      <w:ins w:id="9135" w:author="Claude" w:date="2026-10-08T22:18:30Z">
         <w:r>
           <w:t xml:space="preserve">corrosion-product</w:t>
         </w:r>
@@ -17085,12 +17085,12 @@
       <w:r>
         <w:t xml:space="preserve"> </w:t>
       </w:r>
-      <w:del w:id="9134" w:author="Claude" w:date="2026-10-08T20:38:21Z">
+      <w:del w:id="9134" w:author="Claude" w:date="2026-10-08T22:18:30Z">
         <w:r>
           <w:delText xml:space="preserve">coverage</w:delText>
         </w:r>
       </w:del>
-      <w:ins w:id="9133" w:author="Claude" w:date="2026-10-08T20:38:21Z">
+      <w:ins w:id="9133" w:author="Claude" w:date="2026-10-08T22:18:30Z">
         <w:r>
           <w:t xml:space="preserve">saturation</w:t>
         </w:r>
@@ -17210,12 +17210,12 @@
       <w:r>
         <w:t xml:space="preserve">enhanced the </w:t>
       </w:r>
-      <w:del w:id="9132" w:author="Claude" w:date="2026-10-08T20:38:21Z">
+      <w:del w:id="9132" w:author="Claude" w:date="2026-10-08T22:18:30Z">
         <w:r>
           <w:delText xml:space="preserve">film</w:delText>
         </w:r>
       </w:del>
-      <w:ins w:id="9131" w:author="Claude" w:date="2026-10-08T20:38:21Z">
+      <w:ins w:id="9131" w:author="Claude" w:date="2026-10-08T22:18:30Z">
         <w:r>
           <w:t xml:space="preserve">corrosion-product</w:t>
         </w:r>
@@ -17226,12 +17226,12 @@
       <w:r>
         <w:t xml:space="preserve">dissolution term, reducing </w:t>
       </w:r>
-      <w:del w:id="9130" w:author="Claude" w:date="2026-10-08T20:38:21Z">
+      <w:del w:id="9130" w:author="Claude" w:date="2026-10-08T22:18:30Z">
         <w:r>
           <w:delText xml:space="preserve">film</w:delText>
         </w:r>
       </w:del>
-      <w:ins w:id="9129" w:author="Claude" w:date="2026-10-08T20:38:21Z">
+      <w:ins w:id="9129" w:author="Claude" w:date="2026-10-08T22:18:30Z">
         <w:r>
           <w:t xml:space="preserve">corrosion-product</w:t>
         </w:r>
@@ -17242,12 +17242,12 @@
       <w:r>
         <w:t xml:space="preserve">retention and leading to lower </w:t>
       </w:r>
-      <w:del w:id="9128" w:author="Claude" w:date="2026-10-08T20:38:21Z">
+      <w:del w:id="9128" w:author="Claude" w:date="2026-10-08T22:18:30Z">
         <w:r>
           <w:delText xml:space="preserve">surface</w:delText>
         </w:r>
       </w:del>
-      <w:ins w:id="9127" w:author="Claude" w:date="2026-10-08T20:38:21Z">
+      <w:ins w:id="9127" w:author="Claude" w:date="2026-10-08T22:18:30Z">
         <w:r>
           <w:t xml:space="preserve">corrosion-product</w:t>
         </w:r>
@@ -17255,12 +17255,12 @@
       <w:r>
         <w:t xml:space="preserve"> </w:t>
       </w:r>
-      <w:del w:id="9126" w:author="Claude" w:date="2026-10-08T20:38:21Z">
+      <w:del w:id="9126" w:author="Claude" w:date="2026-10-08T22:18:30Z">
         <w:r>
           <w:delText xml:space="preserve">coverage</w:delText>
         </w:r>
       </w:del>
-      <w:ins w:id="9125" w:author="Claude" w:date="2026-10-08T20:38:21Z">
+      <w:ins w:id="9125" w:author="Claude" w:date="2026-10-08T22:18:30Z">
         <w:r>
           <w:t xml:space="preserve">saturation</w:t>
         </w:r>
@@ -17387,12 +17387,12 @@
       <w:r>
         <w:t xml:space="preserve">however, caused only modest changes in </w:t>
       </w:r>
-      <w:del w:id="9124" w:author="Claude" w:date="2026-10-08T20:38:21Z">
+      <w:del w:id="9124" w:author="Claude" w:date="2026-10-08T22:18:30Z">
         <w:r>
           <w:delText xml:space="preserve">film</w:delText>
         </w:r>
       </w:del>
-      <w:ins w:id="9123" w:author="Claude" w:date="2026-10-08T20:38:21Z">
+      <w:ins w:id="9123" w:author="Claude" w:date="2026-10-08T22:18:30Z">
         <w:r>
           <w:t xml:space="preserve">corrosion-product</w:t>
         </w:r>
@@ -17400,12 +17400,12 @@
       <w:r>
         <w:t xml:space="preserve"> </w:t>
       </w:r>
-      <w:del w:id="9122" w:author="Claude" w:date="2026-10-08T20:38:21Z">
+      <w:del w:id="9122" w:author="Claude" w:date="2026-10-08T22:18:30Z">
         <w:r>
           <w:delText xml:space="preserve">coverage</w:delText>
         </w:r>
       </w:del>
-      <w:ins w:id="9121" w:author="Claude" w:date="2026-10-08T20:38:21Z">
+      <w:ins w:id="9121" w:author="Claude" w:date="2026-10-08T22:18:30Z">
         <w:r>
           <w:t xml:space="preserve">saturation</w:t>
         </w:r>
@@ -17482,12 +17482,12 @@
       <w:r>
         <w:t xml:space="preserve">because oxygen reduction influences </w:t>
       </w:r>
-      <w:del w:id="9120" w:author="Claude" w:date="2026-10-08T20:38:21Z">
+      <w:del w:id="9120" w:author="Claude" w:date="2026-10-08T22:18:30Z">
         <w:r>
           <w:delText xml:space="preserve">film</w:delText>
         </w:r>
       </w:del>
-      <w:ins w:id="9119" w:author="Claude" w:date="2026-10-08T20:38:21Z">
+      <w:ins w:id="9119" w:author="Claude" w:date="2026-10-08T22:18:30Z">
         <w:r>
           <w:t xml:space="preserve">corrosion-product</w:t>
         </w:r>
@@ -17591,12 +17591,12 @@
       <w:r>
         <w:t xml:space="preserve">​ act directly on the competing processes of </w:t>
       </w:r>
-      <w:del w:id="9118" w:author="Claude" w:date="2026-10-08T20:38:21Z">
+      <w:del w:id="9118" w:author="Claude" w:date="2026-10-08T22:18:30Z">
         <w:r>
           <w:delText xml:space="preserve">film</w:delText>
         </w:r>
       </w:del>
-      <w:ins w:id="9117" w:author="Claude" w:date="2026-10-08T20:38:21Z">
+      <w:ins w:id="9117" w:author="Claude" w:date="2026-10-08T22:18:30Z">
         <w:r>
           <w:t xml:space="preserve">corrosion-product</w:t>
         </w:r>
@@ -17607,12 +17607,12 @@
       <w:r>
         <w:t xml:space="preserve">formation and dissolution, making </w:t>
       </w:r>
-      <w:del w:id="9116" w:author="Claude" w:date="2026-10-08T20:38:21Z">
+      <w:del w:id="9116" w:author="Claude" w:date="2026-10-08T22:18:30Z">
         <w:r>
           <w:delText xml:space="preserve">film</w:delText>
         </w:r>
       </w:del>
-      <w:ins w:id="9115" w:author="Claude" w:date="2026-10-08T20:38:21Z">
+      <w:ins w:id="9115" w:author="Claude" w:date="2026-10-08T22:18:30Z">
         <w:r>
           <w:t xml:space="preserve">corrosion-product</w:t>
         </w:r>
@@ -17620,12 +17620,12 @@
       <w:r>
         <w:t xml:space="preserve"> </w:t>
       </w:r>
-      <w:del w:id="9114" w:author="Claude" w:date="2026-10-08T20:38:21Z">
+      <w:del w:id="9114" w:author="Claude" w:date="2026-10-08T22:18:30Z">
         <w:r>
           <w:delText xml:space="preserve">coverage</w:delText>
         </w:r>
       </w:del>
-      <w:ins w:id="9113" w:author="Claude" w:date="2026-10-08T20:38:21Z">
+      <w:ins w:id="9113" w:author="Claude" w:date="2026-10-08T22:18:30Z">
         <w:r>
           <w:t xml:space="preserve">saturation</w:t>
         </w:r>
@@ -17717,7 +17717,7 @@
         </w:rPr>
         <w:fldChar w:fldCharType="separate"/>
       </w:r>
-      <w:del w:id="9158" w:author="Claude" w:date="2026-10-08T20:38:21Z">
+      <w:del w:id="9158" w:author="Claude" w:date="2026-10-08T22:18:30Z">
         <w:r>
           <w:rPr>
             <w:b/>
@@ -17766,7 +17766,7 @@
         <w:t>i</w:t>
       </w:r>
       <w:proofErr w:type="spellEnd"/>
-      <w:del w:id="9157" w:author="Claude" w:date="2026-10-08T20:38:21Z">
+      <w:del w:id="9157" w:author="Claude" w:date="2026-10-08T22:18:30Z">
         <w:r>
           <w:rPr>
             <w:rFonts w:cs="Times New Roman"/>
@@ -17786,7 +17786,7 @@
         </w:rPr>
         <w:t xml:space="preserve">Conditions that promoted greater </w:t>
       </w:r>
-      <w:del w:id="9156" w:author="Claude" w:date="2026-10-08T20:38:21Z">
+      <w:del w:id="9156" w:author="Claude" w:date="2026-10-08T22:18:30Z">
         <w:r>
           <w:rPr>
             <w:rFonts w:cs="Times New Roman"/>
@@ -17794,7 +17794,7 @@
           <w:delText xml:space="preserve">film</w:delText>
         </w:r>
       </w:del>
-      <w:ins w:id="9155" w:author="Claude" w:date="2026-10-08T20:38:21Z">
+      <w:ins w:id="9155" w:author="Claude" w:date="2026-10-08T22:18:30Z">
         <w:r>
           <w:rPr>
             <w:rFonts w:cs="Times New Roman"/>
@@ -17808,7 +17808,7 @@
         </w:rPr>
         <w:t xml:space="preserve"> </w:t>
       </w:r>
-      <w:del w:id="9154" w:author="Claude" w:date="2026-10-08T20:38:21Z">
+      <w:del w:id="9154" w:author="Claude" w:date="2026-10-08T22:18:30Z">
         <w:r>
           <w:rPr>
             <w:rFonts w:cs="Times New Roman"/>
@@ -17816,7 +17816,7 @@
           <w:delText xml:space="preserve">coverage</w:delText>
         </w:r>
       </w:del>
-      <w:ins w:id="9153" w:author="Claude" w:date="2026-10-08T20:38:21Z">
+      <w:ins w:id="9153" w:author="Claude" w:date="2026-10-08T22:18:30Z">
         <w:r>
           <w:rPr>
             <w:rFonts w:cs="Times New Roman"/>
@@ -17908,7 +17908,7 @@
         </w:rPr>
         <w:t>produced lower interfacial oxygen concentrations because the accumulated corrosion</w:t>
       </w:r>
-      <w:del w:id="9152" w:author="Claude" w:date="2026-10-08T20:38:21Z">
+      <w:del w:id="9152" w:author="Claude" w:date="2026-10-08T22:18:30Z">
         <w:r>
           <w:rPr>
             <w:rFonts w:cs="Times New Roman"/>
@@ -17922,7 +17922,7 @@
         </w:rPr>
         <w:t xml:space="preserve"> </w:t>
       </w:r>
-      <w:del w:id="9151" w:author="Claude" w:date="2026-10-08T20:38:21Z">
+      <w:del w:id="9151" w:author="Claude" w:date="2026-10-08T22:18:30Z">
         <w:r>
           <w:rPr>
             <w:rFonts w:cs="Times New Roman"/>
@@ -17930,7 +17930,7 @@
           <w:delText xml:space="preserve">layer</w:delText>
         </w:r>
       </w:del>
-      <w:ins w:id="9150" w:author="Claude" w:date="2026-10-08T20:38:21Z">
+      <w:ins w:id="9150" w:author="Claude" w:date="2026-10-08T22:18:30Z">
         <w:r>
           <w:rPr>
             <w:rFonts w:cs="Times New Roman"/>
@@ -18067,7 +18067,7 @@
         </w:rPr>
         <w:t xml:space="preserve">where accelerated cathodic oxygen consumption reduced interfacial oxygen concentrations despite only modest changes in </w:t>
       </w:r>
-      <w:del w:id="9149" w:author="Claude" w:date="2026-10-08T20:38:21Z">
+      <w:del w:id="9149" w:author="Claude" w:date="2026-10-08T22:18:30Z">
         <w:r>
           <w:rPr>
             <w:rFonts w:cs="Times New Roman"/>
@@ -18075,7 +18075,7 @@
           <w:delText xml:space="preserve">film</w:delText>
         </w:r>
       </w:del>
-      <w:ins w:id="9148" w:author="Claude" w:date="2026-10-08T20:38:21Z">
+      <w:ins w:id="9148" w:author="Claude" w:date="2026-10-08T22:18:30Z">
         <w:r>
           <w:rPr>
             <w:rFonts w:cs="Times New Roman"/>
@@ -18089,7 +18089,7 @@
         </w:rPr>
         <w:t xml:space="preserve"> </w:t>
       </w:r>
-      <w:del w:id="9147" w:author="Claude" w:date="2026-10-08T20:38:21Z">
+      <w:del w:id="9147" w:author="Claude" w:date="2026-10-08T22:18:30Z">
         <w:r>
           <w:rPr>
             <w:rFonts w:cs="Times New Roman"/>
@@ -18097,7 +18097,7 @@
           <w:delText xml:space="preserve">coverage</w:delText>
         </w:r>
       </w:del>
-      <w:ins w:id="9146" w:author="Claude" w:date="2026-10-08T20:38:21Z">
+      <w:ins w:id="9146" w:author="Claude" w:date="2026-10-08T22:18:30Z">
         <w:r>
           <w:rPr>
             <w:rFonts w:cs="Times New Roman"/>
@@ -18369,12 +18369,12 @@
       <w:r>
         <w:t xml:space="preserve"> Local parameter sweeps of kinetic parameters. Panels (a–c) show cumulative mass loss (%), panels (d–f) show </w:t>
       </w:r>
-      <w:del w:id="9165" w:author="Claude" w:date="2026-10-08T20:38:21Z">
+      <w:del w:id="9165" w:author="Claude" w:date="2026-10-08T22:18:30Z">
         <w:r>
           <w:delText xml:space="preserve">film</w:delText>
         </w:r>
       </w:del>
-      <w:ins w:id="9164" w:author="Claude" w:date="2026-10-08T20:38:21Z">
+      <w:ins w:id="9164" w:author="Claude" w:date="2026-10-08T22:18:30Z">
         <w:r>
           <w:t xml:space="preserve">the</w:t>
         </w:r>
@@ -18382,12 +18382,12 @@
       <w:r>
         <w:t xml:space="preserve"> </w:t>
       </w:r>
-      <w:del w:id="9163" w:author="Claude" w:date="2026-10-08T20:38:21Z">
+      <w:del w:id="9163" w:author="Claude" w:date="2026-10-08T22:18:30Z">
         <w:r>
           <w:delText xml:space="preserve">coverage</w:delText>
         </w:r>
       </w:del>
-      <w:ins w:id="9162" w:author="Claude" w:date="2026-10-08T20:38:21Z">
+      <w:ins w:id="9162" w:author="Claude" w:date="2026-10-08T22:18:30Z">
         <w:r>
           <w:t xml:space="preserve">normalized corrosion-product saturation, F/Fₘₐₓ</w:t>
         </w:r>
@@ -18398,12 +18398,12 @@
       <w:r>
         <w:t xml:space="preserve">(%), and panels (</w:t>
       </w:r>
-      <w:del w:id="9161" w:author="Claude" w:date="2026-10-08T20:38:21Z">
+      <w:del w:id="9161" w:author="Claude" w:date="2026-10-08T22:18:30Z">
         <w:r>
           <w:delText xml:space="preserve">g-i</w:delText>
         </w:r>
       </w:del>
-      <w:ins w:id="9159" w:author="Claude" w:date="2026-10-08T20:38:21Z">
+      <w:ins w:id="9159" w:author="Claude" w:date="2026-10-08T22:18:30Z">
         <w:r>
           <w:t xml:space="preserve">g</w:t>
         </w:r>
@@ -18418,7 +18418,7 @@
           <w:t>–</w:t>
         </w:r>
       </w:ins>
-      <w:ins w:id="9160" w:author="Claude" w:date="2026-10-08T20:38:21Z">
+      <w:ins w:id="9160" w:author="Claude" w:date="2026-10-08T22:18:30Z">
         <w:r>
           <w:t xml:space="preserve">i</w:t>
         </w:r>
@@ -19646,7 +19646,7 @@
         </w:rPr>
         <w:t xml:space="preserve">), with an RMSE of 0.0159% and </w:t>
       </w:r>
-      <w:del w:id="9167" w:author="Claude" w:date="2026-10-08T20:38:21Z">
+      <w:del w:id="9167" w:author="Claude" w:date="2026-10-08T22:18:30Z">
         <w:r>
           <w:rPr>
             <w:rFonts w:cs="Times New Roman"/>
@@ -19654,7 +19654,7 @@
           <w:delText xml:space="preserve">a</w:delText>
         </w:r>
       </w:del>
-      <w:ins w:id="9166" w:author="Claude" w:date="2026-10-08T20:38:21Z">
+      <w:ins w:id="9166" w:author="Claude" w:date="2026-10-08T22:18:30Z">
         <w:r>
           <w:rPr>
             <w:rFonts w:cs="Times New Roman"/>
@@ -19889,7 +19889,7 @@
         </w:rPr>
         <w:t xml:space="preserve">Corrosion products progressively accumulated near the Zn surface, forming a </w:t>
       </w:r>
-      <w:del w:id="9185" w:author="Claude" w:date="2026-10-08T20:38:21Z">
+      <w:del w:id="9185" w:author="Claude" w:date="2026-10-08T22:18:30Z">
         <w:r>
           <w:rPr>
             <w:rFonts w:cs="Times New Roman"/>
@@ -19897,7 +19897,7 @@
           <w:delText xml:space="preserve">distinct</w:delText>
         </w:r>
       </w:del>
-      <w:ins w:id="9184" w:author="Claude" w:date="2026-10-08T20:38:21Z">
+      <w:ins w:id="9184" w:author="Claude" w:date="2026-10-08T22:18:30Z">
         <w:r>
           <w:rPr>
             <w:rFonts w:cs="Times New Roman"/>
@@ -19911,7 +19911,7 @@
         </w:rPr>
         <w:t xml:space="preserve"> </w:t>
       </w:r>
-      <w:del w:id="9183" w:author="Claude" w:date="2026-10-08T20:38:21Z">
+      <w:del w:id="9183" w:author="Claude" w:date="2026-10-08T22:18:30Z">
         <w:r>
           <w:rPr>
             <w:rFonts w:cs="Times New Roman"/>
@@ -19919,7 +19919,7 @@
           <w:delText xml:space="preserve">film</w:delText>
         </w:r>
       </w:del>
-      <w:ins w:id="9182" w:author="Claude" w:date="2026-10-08T20:38:21Z">
+      <w:ins w:id="9182" w:author="Claude" w:date="2026-10-08T22:18:30Z">
         <w:r>
           <w:rPr>
             <w:rFonts w:cs="Times New Roman"/>
@@ -19933,7 +19933,7 @@
         </w:rPr>
         <w:t xml:space="preserve"> </w:t>
       </w:r>
-      <w:del w:id="9181" w:author="Claude" w:date="2026-10-08T20:38:21Z">
+      <w:del w:id="9181" w:author="Claude" w:date="2026-10-08T22:18:30Z">
         <w:r>
           <w:rPr>
             <w:rFonts w:cs="Times New Roman"/>
@@ -19941,7 +19941,7 @@
           <w:delText xml:space="preserve">layer</w:delText>
         </w:r>
       </w:del>
-      <w:ins w:id="9180" w:author="Claude" w:date="2026-10-08T20:38:21Z">
+      <w:ins w:id="9180" w:author="Claude" w:date="2026-10-08T22:18:30Z">
         <w:r>
           <w:rPr>
             <w:rFonts w:cs="Times New Roman"/>
@@ -19961,7 +19961,7 @@
         </w:rPr>
         <w:t xml:space="preserve">by 168 h and developing into a </w:t>
       </w:r>
-      <w:del w:id="9179" w:author="Claude" w:date="2026-10-08T20:38:21Z">
+      <w:del w:id="9179" w:author="Claude" w:date="2026-10-08T22:18:30Z">
         <w:r>
           <w:rPr>
             <w:rFonts w:cs="Times New Roman"/>
@@ -19969,7 +19969,7 @@
           <w:delText xml:space="preserve">dense</w:delText>
         </w:r>
       </w:del>
-      <w:ins w:id="9178" w:author="Claude" w:date="2026-10-08T20:38:21Z">
+      <w:ins w:id="9178" w:author="Claude" w:date="2026-10-08T22:18:30Z">
         <w:r>
           <w:rPr>
             <w:rFonts w:cs="Times New Roman"/>
@@ -19983,7 +19983,7 @@
         </w:rPr>
         <w:t xml:space="preserve"> </w:t>
       </w:r>
-      <w:del w:id="9177" w:author="Claude" w:date="2026-10-08T20:38:21Z">
+      <w:del w:id="9177" w:author="Claude" w:date="2026-10-08T22:18:30Z">
         <w:r>
           <w:rPr>
             <w:rFonts w:cs="Times New Roman"/>
@@ -19991,7 +19991,7 @@
           <w:delText xml:space="preserve">near</w:delText>
         </w:r>
       </w:del>
-      <w:ins w:id="9176" w:author="Claude" w:date="2026-10-08T20:38:21Z">
+      <w:ins w:id="9176" w:author="Claude" w:date="2026-10-08T22:18:30Z">
         <w:r>
           <w:rPr>
             <w:rFonts w:cs="Times New Roman"/>
@@ -20005,7 +20005,7 @@
         </w:rPr>
         <w:t xml:space="preserve">-</w:t>
       </w:r>
-      <w:del w:id="9175" w:author="Claude" w:date="2026-10-08T20:38:21Z">
+      <w:del w:id="9175" w:author="Claude" w:date="2026-10-08T22:18:30Z">
         <w:r>
           <w:rPr>
             <w:rFonts w:cs="Times New Roman"/>
@@ -20013,7 +20013,7 @@
           <w:delText xml:space="preserve">surface</w:delText>
         </w:r>
       </w:del>
-      <w:ins w:id="9174" w:author="Claude" w:date="2026-10-08T20:38:21Z">
+      <w:ins w:id="9174" w:author="Claude" w:date="2026-10-08T22:18:30Z">
         <w:r>
           <w:rPr>
             <w:rFonts w:cs="Times New Roman"/>
@@ -20100,7 +20100,7 @@
         </w:rPr>
         <w:t xml:space="preserve">). As the </w:t>
       </w:r>
-      <w:del w:id="9173" w:author="Claude" w:date="2026-10-08T20:38:21Z">
+      <w:del w:id="9173" w:author="Claude" w:date="2026-10-08T22:18:30Z">
         <w:r>
           <w:rPr>
             <w:rFonts w:cs="Times New Roman"/>
@@ -20108,7 +20108,7 @@
           <w:delText xml:space="preserve">film</w:delText>
         </w:r>
       </w:del>
-      <w:ins w:id="9172" w:author="Claude" w:date="2026-10-08T20:38:21Z">
+      <w:ins w:id="9172" w:author="Claude" w:date="2026-10-08T22:18:30Z">
         <w:r>
           <w:rPr>
             <w:rFonts w:cs="Times New Roman"/>
@@ -20122,7 +20122,7 @@
         </w:rPr>
         <w:t xml:space="preserve"> </w:t>
       </w:r>
-      <w:del w:id="9171" w:author="Claude" w:date="2026-10-08T20:38:21Z">
+      <w:del w:id="9171" w:author="Claude" w:date="2026-10-08T22:18:30Z">
         <w:r>
           <w:rPr>
             <w:rFonts w:cs="Times New Roman"/>
@@ -20130,7 +20130,7 @@
           <w:delText xml:space="preserve">thickened</w:delText>
         </w:r>
       </w:del>
-      <w:ins w:id="9170" w:author="Claude" w:date="2026-10-08T20:38:21Z">
+      <w:ins w:id="9170" w:author="Claude" w:date="2026-10-08T22:18:30Z">
         <w:r>
           <w:rPr>
             <w:rFonts w:cs="Times New Roman"/>
@@ -20223,7 +20223,7 @@
         </w:rPr>
         <w:t xml:space="preserve">). The oxygen-deficient boundary layer expanded with immersion time, while radial concentration variations remained small, indicating predominantly one-dimensional transport normal to the surface. The combined effects of </w:t>
       </w:r>
-      <w:del w:id="9169" w:author="Claude" w:date="2026-10-08T20:38:21Z">
+      <w:del w:id="9169" w:author="Claude" w:date="2026-10-08T22:18:30Z">
         <w:r>
           <w:rPr>
             <w:rFonts w:cs="Times New Roman"/>
@@ -20231,7 +20231,7 @@
           <w:delText xml:space="preserve">film</w:delText>
         </w:r>
       </w:del>
-      <w:ins w:id="9168" w:author="Claude" w:date="2026-10-08T20:38:21Z">
+      <w:ins w:id="9168" w:author="Claude" w:date="2026-10-08T22:18:30Z">
         <w:r>
           <w:rPr>
             <w:rFonts w:cs="Times New Roman"/>
@@ -20568,7 +20568,7 @@
         </w:rPr>
         <w:t xml:space="preserve">In addition to mass-loss validation, the model was evaluated against </w:t>
       </w:r>
-      <w:del w:id="9201" w:author="Claude" w:date="2026-10-08T20:38:21Z">
+      <w:del w:id="9201" w:author="Claude" w:date="2026-10-08T22:18:30Z">
         <w:r>
           <w:rPr>
             <w:rFonts w:cs="Times New Roman"/>
@@ -20576,7 +20576,7 @@
           <w:delText xml:space="preserve">Literature</w:delText>
         </w:r>
       </w:del>
-      <w:ins w:id="9200" w:author="Claude" w:date="2026-10-08T20:38:21Z">
+      <w:ins w:id="9200" w:author="Claude" w:date="2026-10-08T22:18:30Z">
         <w:r>
           <w:rPr>
             <w:rFonts w:cs="Times New Roman"/>
@@ -20768,7 +20768,7 @@
         </w:rPr>
         <w:t>, the model reproduced the overall evolution of both quantities, capturing the rapid initial increase followed by a gradual plateau</w:t>
       </w:r>
-      <w:ins w:id="9199" w:author="Claude" w:date="2026-10-08T20:38:21Z">
+      <w:ins w:id="9199" w:author="Claude" w:date="2026-10-08T22:18:30Z">
         <w:r>
           <w:rPr>
             <w:rFonts w:cs="Times New Roman"/>
@@ -20782,7 +20782,7 @@
         </w:rPr>
         <w:t xml:space="preserve"> </w:t>
       </w:r>
-      <w:del w:id="9198" w:author="Claude" w:date="2026-10-08T20:38:21Z">
+      <w:del w:id="9198" w:author="Claude" w:date="2026-10-08T22:18:30Z">
         <w:r>
           <w:rPr>
             <w:rFonts w:cs="Times New Roman"/>
@@ -20790,7 +20790,7 @@
           <w:delText xml:space="preserve">(Pearson</w:delText>
         </w:r>
       </w:del>
-      <w:ins w:id="9197" w:author="Claude" w:date="2026-10-08T20:38:21Z">
+      <w:ins w:id="9197" w:author="Claude" w:date="2026-10-08T22:18:30Z">
         <w:r>
           <w:rPr>
             <w:rFonts w:cs="Times New Roman"/>
@@ -20804,7 +20804,7 @@
         </w:rPr>
         <w:t xml:space="preserve"> </w:t>
       </w:r>
-      <w:del w:id="9196" w:author="Claude" w:date="2026-10-08T20:38:21Z">
+      <w:del w:id="9196" w:author="Claude" w:date="2026-10-08T22:18:30Z">
         <w:r>
           <w:rPr>
             <w:rFonts w:cs="Times New Roman"/>
@@ -20812,7 +20812,7 @@
           <w:delText xml:space="preserve">r</w:delText>
         </w:r>
       </w:del>
-      <w:ins w:id="9195" w:author="Claude" w:date="2026-10-08T20:38:21Z">
+      <w:ins w:id="9195" w:author="Claude" w:date="2026-10-08T22:18:30Z">
         <w:r>
           <w:rPr>
             <w:rFonts w:cs="Times New Roman"/>
@@ -20826,7 +20826,7 @@
         </w:rPr>
         <w:t xml:space="preserve"> </w:t>
       </w:r>
-      <w:del w:id="9194" w:author="Claude" w:date="2026-10-08T20:38:21Z">
+      <w:del w:id="9194" w:author="Claude" w:date="2026-10-08T22:18:30Z">
         <w:r>
           <w:rPr>
             <w:rFonts w:cs="Times New Roman"/>
@@ -20834,7 +20834,7 @@
           <w:delText xml:space="preserve">=</w:delText>
         </w:r>
       </w:del>
-      <w:ins w:id="9193" w:author="Claude" w:date="2026-10-08T20:38:21Z">
+      <w:ins w:id="9193" w:author="Claude" w:date="2026-10-08T22:18:30Z">
         <w:r>
           <w:rPr>
             <w:rFonts w:cs="Times New Roman"/>
@@ -20848,7 +20848,7 @@
         </w:rPr>
         <w:t xml:space="preserve"> </w:t>
       </w:r>
-      <w:del w:id="9192" w:author="Claude" w:date="2026-10-08T20:38:21Z">
+      <w:del w:id="9192" w:author="Claude" w:date="2026-10-08T22:18:30Z">
         <w:r>
           <w:rPr>
             <w:rFonts w:cs="Times New Roman"/>
@@ -20856,7 +20856,7 @@
           <w:delText xml:space="preserve">0.96</w:delText>
         </w:r>
       </w:del>
-      <w:ins w:id="9191" w:author="Claude" w:date="2026-10-08T20:38:21Z">
+      <w:ins w:id="9191" w:author="Claude" w:date="2026-10-08T22:18:30Z">
         <w:r>
           <w:rPr>
             <w:rFonts w:cs="Times New Roman"/>
@@ -20870,7 +20870,7 @@
         </w:rPr>
         <w:t xml:space="preserve"> for Zn²⁺ and </w:t>
       </w:r>
-      <w:del w:id="9190" w:author="Claude" w:date="2026-10-08T20:38:21Z">
+      <w:del w:id="9190" w:author="Claude" w:date="2026-10-08T22:18:30Z">
         <w:r>
           <w:rPr>
             <w:rFonts w:cs="Times New Roman"/>
@@ -20878,7 +20878,7 @@
           <w:delText xml:space="preserve">0</w:delText>
         </w:r>
       </w:del>
-      <w:ins w:id="9189" w:author="Claude" w:date="2026-10-08T20:38:21Z">
+      <w:ins w:id="9189" w:author="Claude" w:date="2026-10-08T22:18:30Z">
         <w:r>
           <w:rPr>
             <w:rFonts w:cs="Times New Roman"/>
@@ -20892,7 +20892,7 @@
         </w:rPr>
         <w:t xml:space="preserve">.</w:t>
       </w:r>
-      <w:del w:id="9188" w:author="Claude" w:date="2026-10-08T20:38:21Z">
+      <w:del w:id="9188" w:author="Claude" w:date="2026-10-08T22:18:30Z">
         <w:r>
           <w:rPr>
             <w:rFonts w:cs="Times New Roman"/>
@@ -20900,7 +20900,7 @@
           <w:delText xml:space="preserve">95</w:delText>
         </w:r>
       </w:del>
-      <w:ins w:id="9187" w:author="Claude" w:date="2026-10-08T20:38:21Z">
+      <w:ins w:id="9187" w:author="Claude" w:date="2026-10-08T22:18:30Z">
         <w:r>
           <w:rPr>
             <w:rFonts w:cs="Times New Roman"/>
@@ -20927,7 +20927,7 @@
         </w:rPr>
         <w:t xml:space="preserve">pH</w:t>
       </w:r>
-      <w:del w:id="9186" w:author="Claude" w:date="2026-10-08T20:38:21Z">
+      <w:del w:id="9186" w:author="Claude" w:date="2026-10-08T22:18:30Z">
         <w:r>
           <w:rPr>
             <w:rFonts w:cs="Times New Roman"/>
@@ -21171,8 +21171,26 @@
           <w:b/>
           <w:bCs/>
         </w:rPr>
-        <w:t>Figure S9</w:t>
-      </w:r>
+        <w:t xml:space="preserve">Figure </w:t>
+      </w:r>
+      <w:del w:id="9203" w:author="Claude" w:date="2026-10-08T22:18:30Z">
+        <w:r>
+          <w:rPr>
+            <w:b/>
+            <w:bCs/>
+          </w:rPr>
+          <w:delText xml:space="preserve">S9</w:delText>
+        </w:r>
+      </w:del>
+      <w:ins w:id="9202" w:author="Claude" w:date="2026-10-08T22:18:30Z">
+        <w:r>
+          <w:rPr>
+            <w:b/>
+            <w:bCs/>
+          </w:rPr>
+          <w:t xml:space="preserve">S8</w:t>
+        </w:r>
+      </w:ins>
       <w:r>
         <w:t>)</w:t>
       </w:r>
@@ -22239,12 +22257,12 @@
       <w:r>
         <w:t>penetration depths varied only slightly, ranging from approximately 2.</w:t>
       </w:r>
-      <w:del w:id="9205" w:author="Claude" w:date="2026-10-08T20:38:21Z">
+      <w:del w:id="9207" w:author="Claude" w:date="2026-10-08T22:18:30Z">
         <w:r>
           <w:delText xml:space="preserve">1</w:delText>
         </w:r>
       </w:del>
-      <w:ins w:id="9204" w:author="Claude" w:date="2026-10-08T20:38:21Z">
+      <w:ins w:id="9206" w:author="Claude" w:date="2026-10-08T22:18:30Z">
         <w:r>
           <w:t>4</w:t>
         </w:r>
@@ -22252,12 +22270,12 @@
       <w:r>
         <w:t xml:space="preserve"> to 2.7 µm across the curved-wire configurations (30°, 90°, and 150° arcs) and from 2.1 to 2.</w:t>
       </w:r>
-      <w:del w:id="9203" w:author="Claude" w:date="2026-10-08T20:38:21Z">
+      <w:del w:id="9205" w:author="Claude" w:date="2026-10-08T22:18:30Z">
         <w:r>
           <w:delText xml:space="preserve">7</w:delText>
         </w:r>
       </w:del>
-      <w:ins w:id="9202" w:author="Claude" w:date="2026-10-08T20:38:21Z">
+      <w:ins w:id="9204" w:author="Claude" w:date="2026-10-08T22:18:30Z">
         <w:r>
           <w:t xml:space="preserve">4</w:t>
         </w:r>
@@ -22442,7 +22460,7 @@
           <w:t xml:space="preserve"> </w:t>
         </w:r>
       </w:ins>
-      <w:ins w:id="9206" w:author="Claude" w:date="2026-10-08T20:38:21Z">
+      <w:ins w:id="9208" w:author="Claude" w:date="2026-10-08T22:18:30Z">
         <w:r>
           <w:t>(error bars: ±1 SD around the cross-section perimeter)</w:t>
         </w:r>
@@ -22481,7 +22499,7 @@
       <w:r>
         <w:t>The corrosion</w:t>
       </w:r>
-      <w:del w:id="9239" w:author="Claude" w:date="2026-10-08T20:38:21Z">
+      <w:del w:id="9241" w:author="Claude" w:date="2026-10-08T22:18:30Z">
         <w:r>
           <w:delText xml:space="preserve">-product</w:delText>
         </w:r>
@@ -22489,12 +22507,12 @@
       <w:r>
         <w:t xml:space="preserve"> </w:t>
       </w:r>
-      <w:del w:id="9238" w:author="Claude" w:date="2026-10-08T20:38:21Z">
+      <w:del w:id="9240" w:author="Claude" w:date="2026-10-08T22:18:30Z">
         <w:r>
           <w:delText xml:space="preserve">layer</w:delText>
         </w:r>
       </w:del>
-      <w:ins w:id="9237" w:author="Claude" w:date="2026-10-08T20:38:21Z">
+      <w:ins w:id="9239" w:author="Claude" w:date="2026-10-08T22:18:30Z">
         <w:r>
           <w:t xml:space="preserve">products</w:t>
         </w:r>
@@ -22502,12 +22520,12 @@
       <w:r>
         <w:t xml:space="preserve"> </w:t>
       </w:r>
-      <w:del w:id="9236" w:author="Claude" w:date="2026-10-08T20:38:21Z">
+      <w:del w:id="9238" w:author="Claude" w:date="2026-10-08T22:18:30Z">
         <w:r>
           <w:delText xml:space="preserve">is</w:delText>
         </w:r>
       </w:del>
-      <w:ins w:id="9235" w:author="Claude" w:date="2026-10-08T20:38:21Z">
+      <w:ins w:id="9237" w:author="Claude" w:date="2026-10-08T22:18:30Z">
         <w:r>
           <w:t xml:space="preserve">are</w:t>
         </w:r>
@@ -22526,12 +22544,12 @@
       <w:r>
         <w:t xml:space="preserve">-based </w:t>
       </w:r>
-      <w:del w:id="9234" w:author="Claude" w:date="2026-10-08T20:38:21Z">
+      <w:del w:id="9236" w:author="Claude" w:date="2026-10-08T22:18:30Z">
         <w:r>
           <w:delText xml:space="preserve">film</w:delText>
         </w:r>
       </w:del>
-      <w:ins w:id="9233" w:author="Claude" w:date="2026-10-08T20:38:21Z">
+      <w:ins w:id="9235" w:author="Claude" w:date="2026-10-08T22:18:30Z">
         <w:r>
           <w:t xml:space="preserve">field</w:t>
         </w:r>
@@ -22542,7 +22560,7 @@
       <w:r>
         <w:t>rather than</w:t>
       </w:r>
-      <w:ins w:id="9232" w:author="Claude" w:date="2026-10-08T20:38:21Z">
+      <w:ins w:id="9234" w:author="Claude" w:date="2026-10-08T22:18:30Z">
         <w:r>
           <w:t xml:space="preserve"> a discrete surface film or</w:t>
         </w:r>
@@ -22553,12 +22571,12 @@
       <w:r>
         <w:t xml:space="preserve">a heterogeneous, composition-dependent structure</w:t>
       </w:r>
-      <w:del w:id="9231" w:author="Claude" w:date="2026-10-08T20:38:21Z">
+      <w:del w:id="9233" w:author="Claude" w:date="2026-10-08T22:18:30Z">
         <w:r>
           <w:delText xml:space="preserve">.</w:delText>
         </w:r>
       </w:del>
-      <w:ins w:id="9230" w:author="Claude" w:date="2026-10-08T20:38:21Z">
+      <w:ins w:id="9232" w:author="Claude" w:date="2026-10-08T22:18:30Z">
         <w:r>
           <w:t xml:space="preserve">,</w:t>
         </w:r>
@@ -22566,12 +22584,12 @@
       <w:r>
         <w:t xml:space="preserve"> </w:t>
       </w:r>
-      <w:del w:id="9229" w:author="Claude" w:date="2026-10-08T20:38:21Z">
+      <w:del w:id="9231" w:author="Claude" w:date="2026-10-08T22:18:30Z">
         <w:r>
           <w:delText xml:space="preserve">Secondary</w:delText>
         </w:r>
       </w:del>
-      <w:ins w:id="9228" w:author="Claude" w:date="2026-10-08T20:38:21Z">
+      <w:ins w:id="9230" w:author="Claude" w:date="2026-10-08T22:18:30Z">
         <w:r>
           <w:t xml:space="preserve">and</w:t>
         </w:r>
@@ -22579,7 +22597,7 @@
       <w:r>
         <w:t xml:space="preserve"> phosphate-, carbonate-, </w:t>
       </w:r>
-      <w:ins w:id="9227" w:author="Claude" w:date="2026-10-08T20:38:21Z">
+      <w:ins w:id="9229" w:author="Claude" w:date="2026-10-08T22:18:30Z">
         <w:r>
           <w:t xml:space="preserve">calcium-, </w:t>
         </w:r>
@@ -22587,12 +22605,12 @@
       <w:r>
         <w:t xml:space="preserve">and </w:t>
       </w:r>
-      <w:del w:id="9226" w:author="Claude" w:date="2026-10-08T20:38:21Z">
+      <w:del w:id="9228" w:author="Claude" w:date="2026-10-08T22:18:30Z">
         <w:r>
           <w:delText xml:space="preserve">calcium</w:delText>
         </w:r>
       </w:del>
-      <w:ins w:id="9225" w:author="Claude" w:date="2026-10-08T20:38:21Z">
+      <w:ins w:id="9227" w:author="Claude" w:date="2026-10-08T22:18:30Z">
         <w:r>
           <w:t xml:space="preserve">chloride</w:t>
         </w:r>
@@ -22600,7 +22618,7 @@
       <w:r>
         <w:t xml:space="preserve">-containing phases</w:t>
       </w:r>
-      <w:ins w:id="9224" w:author="Claude" w:date="2026-10-08T20:38:21Z">
+      <w:ins w:id="9226" w:author="Claude" w:date="2026-10-08T22:18:30Z">
         <w:r>
           <w:t xml:space="preserve">,</w:t>
         </w:r>
@@ -22608,12 +22626,12 @@
       <w:r>
         <w:t xml:space="preserve"> </w:t>
       </w:r>
-      <w:del w:id="9223" w:author="Claude" w:date="2026-10-08T20:38:21Z">
+      <w:del w:id="9225" w:author="Claude" w:date="2026-10-08T22:18:30Z">
         <w:r>
           <w:delText xml:space="preserve">that</w:delText>
         </w:r>
       </w:del>
-      <w:ins w:id="9222" w:author="Claude" w:date="2026-10-08T20:38:21Z">
+      <w:ins w:id="9224" w:author="Claude" w:date="2026-10-08T22:18:30Z">
         <w:r>
           <w:t xml:space="preserve">which</w:t>
         </w:r>
@@ -22621,12 +22639,12 @@
       <w:r>
         <w:t xml:space="preserve"> </w:t>
       </w:r>
-      <w:del w:id="9221" w:author="Claude" w:date="2026-10-08T20:38:21Z">
+      <w:del w:id="9223" w:author="Claude" w:date="2026-10-08T22:18:30Z">
         <w:r>
           <w:delText xml:space="preserve">may</w:delText>
         </w:r>
       </w:del>
-      <w:ins w:id="9220" w:author="Claude" w:date="2026-10-08T20:38:21Z">
+      <w:ins w:id="9222" w:author="Claude" w:date="2026-10-08T22:18:30Z">
         <w:r>
           <w:t xml:space="preserve">can</w:t>
         </w:r>
@@ -22634,12 +22652,12 @@
       <w:r>
         <w:t xml:space="preserve"> </w:t>
       </w:r>
-      <w:del w:id="9219" w:author="Claude" w:date="2026-10-08T20:38:21Z">
+      <w:del w:id="9221" w:author="Claude" w:date="2026-10-08T22:18:30Z">
         <w:r>
           <w:delText xml:space="preserve">develop</w:delText>
         </w:r>
       </w:del>
-      <w:ins w:id="9218" w:author="Claude" w:date="2026-10-08T20:38:21Z">
+      <w:ins w:id="9220" w:author="Claude" w:date="2026-10-08T22:18:30Z">
         <w:r>
           <w:t xml:space="preserve">form</w:t>
         </w:r>
@@ -22647,12 +22665,12 @@
       <w:r>
         <w:t xml:space="preserve"> </w:t>
       </w:r>
-      <w:del w:id="9217" w:author="Claude" w:date="2026-10-08T20:38:21Z">
+      <w:del w:id="9219" w:author="Claude" w:date="2026-10-08T22:18:30Z">
         <w:r>
           <w:delText xml:space="preserve">over</w:delText>
         </w:r>
       </w:del>
-      <w:ins w:id="9216" w:author="Claude" w:date="2026-10-08T20:38:21Z">
+      <w:ins w:id="9218" w:author="Claude" w:date="2026-10-08T22:18:30Z">
         <w:r>
           <w:t xml:space="preserve">within</w:t>
         </w:r>
@@ -22660,12 +22678,12 @@
       <w:r>
         <w:t xml:space="preserve"> </w:t>
       </w:r>
-      <w:del w:id="9215" w:author="Claude" w:date="2026-10-08T20:38:21Z">
+      <w:del w:id="9217" w:author="Claude" w:date="2026-10-08T22:18:30Z">
         <w:r>
           <w:delText xml:space="preserve">longer</w:delText>
         </w:r>
       </w:del>
-      <w:ins w:id="9214" w:author="Claude" w:date="2026-10-08T20:38:21Z">
+      <w:ins w:id="9216" w:author="Claude" w:date="2026-10-08T22:18:30Z">
         <w:r>
           <w:t xml:space="preserve">hours</w:t>
         </w:r>
@@ -22673,12 +22691,12 @@
       <w:r>
         <w:t xml:space="preserve"> </w:t>
       </w:r>
-      <w:del w:id="9213" w:author="Claude" w:date="2026-10-08T20:38:21Z">
+      <w:del w:id="9215" w:author="Claude" w:date="2026-10-08T22:18:30Z">
         <w:r>
           <w:delText xml:space="preserve">periods</w:delText>
         </w:r>
       </w:del>
-      <w:ins w:id="9212" w:author="Claude" w:date="2026-10-08T20:38:21Z">
+      <w:ins w:id="9214" w:author="Claude" w:date="2026-10-08T22:18:30Z">
         <w:r>
           <w:t xml:space="preserve">to days in vitro,</w:t>
         </w:r>
@@ -22686,7 +22704,7 @@
       <w:r>
         <w:t xml:space="preserve"> are</w:t>
       </w:r>
-      <w:del w:id="9211" w:author="Claude" w:date="2026-10-08T20:38:21Z">
+      <w:del w:id="9213" w:author="Claude" w:date="2026-10-08T22:18:30Z">
         <w:r>
           <w:delText xml:space="preserve"> therefore</w:delText>
         </w:r>
@@ -22694,12 +22712,12 @@
       <w:r>
         <w:t xml:space="preserve"> not explicitly resolved</w:t>
       </w:r>
-      <w:ins w:id="9208" w:author="Claude" w:date="2026-10-08T20:38:21Z">
+      <w:ins w:id="9210" w:author="Claude" w:date="2026-10-08T22:18:30Z">
         <w:r>
           <w:t xml:space="preserve">. The film field is defined on the fixed mesh on the electrolyte side of the moving interface rather than attached to it, and the ZnO/Zn volume ratio (about 1.6) is not represented. </w:t>
         </w:r>
       </w:ins>
-      <w:ins w:id="9209" w:author="Claude" w:date="2026-10-08T20:38:21Z">
+      <w:ins w:id="9211" w:author="Claude" w:date="2026-10-08T22:18:30Z">
         <w:r>
           <w:t xml:space="preserve">The dissolved oxygen concentration (3.5 mg L⁻¹) was taken from literature values for physiological fluids rather than measured experimentally. As oxygen concentration is closely coupled to the ORR rate coefficient, the calibrated </w:t>
         </w:r>
@@ -22734,7 +22752,7 @@
           </m:sub>
         </m:sSub>
       </m:oMath>
-      <w:ins w:id="9210" w:author="Claude" w:date="2026-10-08T20:38:21Z">
+      <w:ins w:id="9212" w:author="Claude" w:date="2026-10-08T22:18:30Z">
         <w:r>
           <w:t xml:space="preserve">​ should be regarded as an effective parameter that partially incorporates uncertainty in oxygen availability</w:t>
         </w:r>
@@ -22781,7 +22799,7 @@
       <w:r>
         <w:t xml:space="preserve"> mass loss represents a predictive demonstration rather than formal validation. Further validation against spatially resolved measurements of corrosion-product coverage, oxygen availability, and local penetration is therefore required, particularly for complex implant geometries.</w:t>
       </w:r>
-      <w:ins w:id="9207" w:author="Claude" w:date="2026-10-08T20:38:21Z">
+      <w:ins w:id="9209" w:author="Claude" w:date="2026-10-08T22:18:30Z">
         <w:r>
           <w:t xml:space="preserve"> Because O₂ consumption at the interface is not stoichiometrically coupled to Zn loss, the absolute interfacial O₂ depletion in Figures 4g–i and 5d is underestimated relative to a stoichiometric model, and these panels should be read as relative patterns. Independent measurements of Zn²⁺ release by ICP and direct mechanism tests, such as film thickness from FIB or SEM cross-sections or stirred and different-O₂ experiments, were not performed and are also needed.</w:t>
         </w:r>
@@ -22794,12 +22812,12 @@
       <w:r>
         <w:t xml:space="preserve">Future developments should incorporate physiologically realistic flow conditions, additional ionic species, multiphase corrosion-product evolution, and spatially heterogeneous electrochemical activity. Extending the framework to Zn alloys will also require accounting for alloying elements, secondary phases, and galvanic interactions. Although the </w:t>
       </w:r>
-      <w:del w:id="9243" w:author="Claude" w:date="2026-10-08T20:38:21Z">
+      <w:del w:id="9245" w:author="Claude" w:date="2026-10-08T22:18:30Z">
         <w:r>
           <w:delText xml:space="preserve">current physics</w:delText>
         </w:r>
       </w:del>
-      <w:ins w:id="9242" w:author="Claude" w:date="2026-10-08T20:38:21Z">
+      <w:ins w:id="9244" w:author="Claude" w:date="2026-10-08T22:18:30Z">
         <w:r>
           <w:t xml:space="preserve">high</w:t>
         </w:r>
@@ -22807,12 +22825,12 @@
       <w:r>
         <w:t xml:space="preserve">-</w:t>
       </w:r>
-      <w:del w:id="9241" w:author="Claude" w:date="2026-10-08T20:38:21Z">
+      <w:del w:id="9243" w:author="Claude" w:date="2026-10-08T22:18:30Z">
         <w:r>
           <w:delText xml:space="preserve">based</w:delText>
         </w:r>
       </w:del>
-      <w:ins w:id="9240" w:author="Claude" w:date="2026-10-08T20:38:21Z">
+      <w:ins w:id="9242" w:author="Claude" w:date="2026-10-08T22:18:30Z">
         <w:r>
           <w:t xml:space="preserve">fidelity</w:t>
         </w:r>
@@ -22911,7 +22929,7 @@
         <w:pStyle w:val="BodyText"/>
         <w:ind w:firstLine="0"/>
         <w:rPr>
-          <w:ins w:id="20001" w:author="Claude" w:date="2026-10-08T20:38:21Z"/>
+          <w:ins w:id="20001" w:author="Claude" w:date="2026-10-08T22:18:30Z"/>
         </w:rPr>
       </w:pPr>
     </w:p>
@@ -22920,7 +22938,7 @@
         <w:pStyle w:val="BodyText"/>
         <w:ind w:firstLine="0"/>
         <w:rPr>
-          <w:ins w:id="20002" w:author="Claude" w:date="2026-10-08T20:38:21Z"/>
+          <w:ins w:id="20002" w:author="Claude" w:date="2026-10-08T22:18:30Z"/>
         </w:rPr>
       </w:pPr>
     </w:p>
@@ -22929,7 +22947,7 @@
         <w:pStyle w:val="BodyText"/>
         <w:ind w:firstLine="0"/>
         <w:rPr>
-          <w:ins w:id="20003" w:author="Claude" w:date="2026-10-08T20:38:21Z"/>
+          <w:ins w:id="20003" w:author="Claude" w:date="2026-10-08T22:18:30Z"/>
         </w:rPr>
       </w:pPr>
     </w:p>
@@ -22953,7 +22971,7 @@
       <w:r>
         <w:t>for a six-crown stent</w:t>
       </w:r>
-      <w:del w:id="9250" w:author="Claude" w:date="2026-10-08T20:38:21Z">
+      <w:del w:id="9252" w:author="Claude" w:date="2026-10-08T22:18:30Z">
         <w:r>
           <w:delText xml:space="preserve">,</w:delText>
         </w:r>
@@ -22961,12 +22979,12 @@
       <w:r>
         <w:t xml:space="preserve"> </w:t>
       </w:r>
-      <w:del w:id="9249" w:author="Claude" w:date="2026-10-08T20:38:21Z">
+      <w:del w:id="9251" w:author="Claude" w:date="2026-10-08T22:18:30Z">
         <w:r>
           <w:delText xml:space="preserve">consistent</w:delText>
         </w:r>
       </w:del>
-      <w:ins w:id="9248" w:author="Claude" w:date="2026-10-08T20:38:21Z">
+      <w:ins w:id="9250" w:author="Claude" w:date="2026-10-08T22:18:30Z">
         <w:r>
           <w:t xml:space="preserve">of</w:t>
         </w:r>
@@ -22974,12 +22992,12 @@
       <w:r>
         <w:t xml:space="preserve"> </w:t>
       </w:r>
-      <w:del w:id="9247" w:author="Claude" w:date="2026-10-08T20:38:21Z">
+      <w:del w:id="9249" w:author="Claude" w:date="2026-10-08T22:18:30Z">
         <w:r>
           <w:delText xml:space="preserve">with</w:delText>
         </w:r>
       </w:del>
-      <w:ins w:id="9246" w:author="Claude" w:date="2026-10-08T20:38:21Z">
+      <w:ins w:id="9248" w:author="Claude" w:date="2026-10-08T22:18:30Z">
         <w:r>
           <w:t xml:space="preserve">the same order of magnitude as</w:t>
         </w:r>
@@ -23000,12 +23018,12 @@
       <w:r>
         <w:t xml:space="preserve"> observations. Mechanistic and sensitivity analyses </w:t>
       </w:r>
-      <w:del w:id="9245" w:author="Claude" w:date="2026-10-08T20:38:21Z">
+      <w:del w:id="9247" w:author="Claude" w:date="2026-10-08T22:18:30Z">
         <w:r>
           <w:delText xml:space="preserve">identified</w:delText>
         </w:r>
       </w:del>
-      <w:ins w:id="9244" w:author="Claude" w:date="2026-10-08T20:38:21Z">
+      <w:ins w:id="9246" w:author="Claude" w:date="2026-10-08T22:18:30Z">
         <w:r>
           <w:t>identify</w:t>
         </w:r>

</xml_diff>

<commit_message>
Apply user-round edits: captions, cross-refs, Rule A caption, mesh <0.2%, response rows
</commit_message>
<xml_diff>
--- a/deliver/Manuscript_tracked.docx
+++ b/deliver/Manuscript_tracked.docx
@@ -1,6 +1,6 @@
 
 <file path=word/document.xml><?xml version="1.0" encoding="utf-8"?>
-<w:document xmlns:wpc="http://schemas.microsoft.com/office/word/2010/wordprocessingCanvas" xmlns:cx="http://schemas.microsoft.com/office/drawing/2014/chartex" xmlns:cx1="http://schemas.microsoft.com/office/drawing/2015/9/8/chartex" xmlns:cx2="http://schemas.microsoft.com/office/drawing/2015/10/21/chartex" xmlns:cx3="http://schemas.microsoft.com/office/drawing/2016/5/9/chartex" xmlns:cx4="http://schemas.microsoft.com/office/drawing/2016/5/10/chartex" xmlns:cx5="http://schemas.microsoft.com/office/drawing/2016/5/11/chartex" xmlns:cx6="http://schemas.microsoft.com/office/drawing/2016/5/12/chartex" xmlns:cx7="http://schemas.microsoft.com/office/drawing/2016/5/13/chartex" xmlns:cx8="http://schemas.microsoft.com/office/drawing/2016/5/14/chartex" xmlns:mc="http://schemas.openxmlformats.org/markup-compatibility/2006" xmlns:aink="http://schemas.microsoft.com/office/drawing/2016/ink" xmlns:am3d="http://schemas.microsoft.com/office/drawing/2017/model3d" xmlns:o="urn:schemas-microsoft-com:office:office" xmlns:oel="http://schemas.microsoft.com/office/2019/extlst" xmlns:r="http://schemas.openxmlformats.org/officeDocument/2006/relationships" xmlns:m="http://schemas.openxmlformats.org/officeDocument/2006/math" xmlns:v="urn:schemas-microsoft-com:vml" xmlns:wp14="http://schemas.microsoft.com/office/word/2010/wordprocessingDrawing" xmlns:wp="http://schemas.openxmlformats.org/drawingml/2006/wordprocessingDrawing" xmlns:w10="urn:schemas-microsoft-com:office:word" xmlns:w="http://schemas.openxmlformats.org/wordprocessingml/2006/main" xmlns:w14="http://schemas.microsoft.com/office/word/2010/wordml" xmlns:w15="http://schemas.microsoft.com/office/word/2012/wordml" xmlns:w16cex="http://schemas.microsoft.com/office/word/2018/wordml/cex" xmlns:w16cid="http://schemas.microsoft.com/office/word/2016/wordml/cid" xmlns:w16="http://schemas.microsoft.com/office/word/2018/wordml" xmlns:w16du="http://schemas.microsoft.com/office/word/2023/wordml/word16du" xmlns:w16sdtdh="http://schemas.microsoft.com/office/word/2020/wordml/sdtdatahash" xmlns:w16sdtfl="http://schemas.microsoft.com/office/word/2024/wordml/sdtformatlock" xmlns:w16se="http://schemas.microsoft.com/office/word/2015/wordml/symex" xmlns:wpg="http://schemas.microsoft.com/office/word/2010/wordprocessingGroup" xmlns:wpi="http://schemas.microsoft.com/office/word/2010/wordprocessingInk" xmlns:wne="http://schemas.microsoft.com/office/word/2006/wordml" xmlns:wps="http://schemas.microsoft.com/office/word/2010/wordprocessingShape" mc:Ignorable="w14 w15 w16se w16cid w16 w16cex w16sdtdh w16sdtfl w16du wp14">
+<w:document xmlns:wpc="http://schemas.microsoft.com/office/word/2010/wordprocessingCanvas" xmlns:cx="http://schemas.microsoft.com/office/drawing/2014/chartex" xmlns:cx1="http://schemas.microsoft.com/office/drawing/2015/9/8/chartex" xmlns:cx2="http://schemas.microsoft.com/office/drawing/2015/10/21/chartex" xmlns:cx3="http://schemas.microsoft.com/office/drawing/2016/5/9/chartex" xmlns:cx4="http://schemas.microsoft.com/office/drawing/2016/5/10/chartex" xmlns:cx5="http://schemas.microsoft.com/office/drawing/2016/5/11/chartex" xmlns:cx6="http://schemas.microsoft.com/office/drawing/2016/5/12/chartex" xmlns:cx7="http://schemas.microsoft.com/office/drawing/2016/5/13/chartex" xmlns:cx8="http://schemas.microsoft.com/office/drawing/2016/5/14/chartex" xmlns:mc="http://schemas.openxmlformats.org/markup-compatibility/2006" xmlns:aink="http://schemas.microsoft.com/office/drawing/2016/ink" xmlns:am3d="http://schemas.microsoft.com/office/drawing/2017/model3d" xmlns:o="urn:schemas-microsoft-com:office:office" xmlns:r="http://schemas.openxmlformats.org/officeDocument/2006/relationships" xmlns:m="http://schemas.openxmlformats.org/officeDocument/2006/math" xmlns:v="urn:schemas-microsoft-com:vml" xmlns:wp14="http://schemas.microsoft.com/office/word/2010/wordprocessingDrawing" xmlns:wp="http://schemas.openxmlformats.org/drawingml/2006/wordprocessingDrawing" xmlns:w10="urn:schemas-microsoft-com:office:word" xmlns:w="http://schemas.openxmlformats.org/wordprocessingml/2006/main" xmlns:w14="http://schemas.microsoft.com/office/word/2010/wordml" xmlns:w15="http://schemas.microsoft.com/office/word/2012/wordml" xmlns:w16cex="http://schemas.microsoft.com/office/word/2018/wordml/cex" xmlns:w16cid="http://schemas.microsoft.com/office/word/2016/wordml/cid" xmlns:w16="http://schemas.microsoft.com/office/word/2018/wordml" xmlns:w16sdtdh="http://schemas.microsoft.com/office/word/2020/wordml/sdtdatahash" xmlns:w16se="http://schemas.microsoft.com/office/word/2015/wordml/symex" xmlns:wpg="http://schemas.microsoft.com/office/word/2010/wordprocessingGroup" xmlns:wpi="http://schemas.microsoft.com/office/word/2010/wordprocessingInk" xmlns:wne="http://schemas.microsoft.com/office/word/2006/wordml" xmlns:wps="http://schemas.microsoft.com/office/word/2010/wordprocessingShape" mc:Ignorable="w14 w15 w16se w16cid w16 w16cex w16sdtdh wp14">
   <w:body>
     <w:p>
       <w:pPr>
@@ -290,6 +290,7 @@
           <w:b/>
           <w:bCs/>
         </w:rPr>
+        <w:lastRenderedPageBreak/>
         <w:t>Abstract</w:t>
       </w:r>
     </w:p>
@@ -299,54 +300,19 @@
         <w:jc w:val="both"/>
       </w:pPr>
       <w:r>
-        <w:t xml:space="preserve">Zinc (Zn) is a promising biodegradable metal for temporary implants, yet predictive computational frameworks for its degradation under physiological conditions remain limited. In this study, a three-dimensional (3D) mechanistic reaction-diffusion model is developed by coupling oxygen reduction reaction (ORR) kinetics, mass transport, corrosion-product evolution, and moving-interface tracking. Initial sensitivity analysis demonstrates that dissolved oxygen availability primarily controls Zn biodegradation. Calibrated</w:t>
-      </w:r>
-      <w:del w:id="9008" w:author="Claude" w:date="2026-10-08T22:18:30Z">
-        <w:r>
-          <w:delText xml:space="preserve"> using three effective kinetic parameters</w:delText>
-        </w:r>
-      </w:del>
-      <w:r>
-        <w:t xml:space="preserve"> against literature immersion mass-loss data over 14 days, the model predicts the 28-day mass-loss evolution measured in this study, yielding a root-mean-square error (RMSE) of 0.0159%. The simulations reveal a self-limiting mechanism in which corrosion-product accumulation progressively restricts oxygen transport to the metal surface, driving a transition from reaction-controlled to diffusion-controlled degradation. When applied without geometry-specific recalibration to a six-crown Zn stent, the model predicts approximately 6% mass loss after one month, </w:t>
-      </w:r>
-      <w:del w:id="9007" w:author="Claude" w:date="2026-10-08T22:18:30Z">
-        <w:r>
-          <w:delText xml:space="preserve">consistent</w:delText>
-        </w:r>
-      </w:del>
-      <w:ins w:id="9006" w:author="Claude" w:date="2026-10-08T22:18:30Z">
-        <w:r>
-          <w:t xml:space="preserve">of</w:t>
-        </w:r>
-      </w:ins>
-      <w:r>
-        <w:t xml:space="preserve"> </w:t>
-      </w:r>
-      <w:del w:id="9005" w:author="Claude" w:date="2026-10-08T22:18:30Z">
-        <w:r>
-          <w:delText xml:space="preserve">in</w:delText>
-        </w:r>
-      </w:del>
-      <w:ins w:id="9004" w:author="Claude" w:date="2026-10-08T22:18:30Z">
-        <w:r>
-          <w:t xml:space="preserve">the same order of</w:t>
-        </w:r>
-      </w:ins>
-      <w:r>
-        <w:t xml:space="preserve"> magnitude </w:t>
-      </w:r>
-      <w:del w:id="9003" w:author="Claude" w:date="2026-10-08T22:18:30Z">
-        <w:r>
-          <w:delText xml:space="preserve">with</w:delText>
-        </w:r>
-      </w:del>
-      <w:ins w:id="9002" w:author="Claude" w:date="2026-10-08T22:18:30Z">
-        <w:r>
-          <w:t xml:space="preserve">as</w:t>
-        </w:r>
-      </w:ins>
-      <w:r>
-        <w:t xml:space="preserve"> </w:t>
+        <w:t xml:space="preserve">Zinc (Zn) is a promising biodegradable metal for temporary implants, yet predictive computational frameworks for its degradation under physiological conditions remain limited. In this study, a three-dimensional (3D) mechanistic reaction-diffusion model is developed by coupling oxygen reduction reaction (ORR) kinetics, mass transport, corrosion-product evolution, and moving-interface tracking. Initial sensitivity analysis demonstrates that dissolved oxygen availability primarily controls Zn biodegradation. Calibrated against literature immersion mass-loss data over 14 days, the model predicts the 28-day mass-loss evolution measured in this study, yielding a root-mean-square error (RMSE) of 0.0159%. The simulations reveal a self-limiting mechanism in which corrosion-product accumulation progressively restricts oxygen transport to the metal surface, driving a transition from reaction-controlled to diffusion-controlled degradation. When applied </w:t>
+      </w:r>
+      <w:r>
+        <w:t>to a six-crown Zn stent without geometry-specific recalibration, the model predicts approximately 6% mass loss after one month, on</w:t>
+      </w:r>
+      <w:r>
+        <w:t xml:space="preserve"> the same order of </w:t>
+      </w:r>
+      <w:r>
+        <w:t xml:space="preserve">magnitude </w:t>
+      </w:r>
+      <w:r>
+        <w:t xml:space="preserve">as </w:t>
       </w:r>
       <w:r>
         <w:t xml:space="preserve">reported </w:t>
@@ -358,15 +324,7 @@
         <w:t>in vivo</w:t>
       </w:r>
       <w:r>
-        <w:t xml:space="preserve"> observations, and captures crown-localized degradation driven by geometry-dependent oxygen transport. By linking implant geometry to degradation rate and spatial morphology, the framework provides a </w:t>
-      </w:r>
-      <w:del w:id="9001" w:author="Claude" w:date="2026-10-08T22:18:30Z">
-        <w:r>
-          <w:delText xml:space="preserve">low-dimensional, </w:delText>
-        </w:r>
-      </w:del>
-      <w:r>
-        <w:t xml:space="preserve">mechanistic basis for predicting Zn implant degradation and supports degradation-informed implant design.</w:t>
+        <w:t xml:space="preserve"> observations, and captures crown-localized degradation driven by geometry-dependent oxygen transport. By linking implant geometry to degradation rate and spatial morphology, the framework provides a mechanistic basis for predicting Zn implant degradation and supports degradation-informed implant design.</w:t>
       </w:r>
     </w:p>
     <w:p>
@@ -393,6 +351,7 @@
           <w:b/>
           <w:bCs/>
         </w:rPr>
+        <w:lastRenderedPageBreak/>
         <w:t>Table of Contents</w:t>
       </w:r>
     </w:p>
@@ -516,6 +475,7 @@
         <w:pStyle w:val="Heading1"/>
       </w:pPr>
       <w:r>
+        <w:lastRenderedPageBreak/>
         <w:t>Introduction</w:t>
       </w:r>
     </w:p>
@@ -790,6 +750,7 @@
         <w:t xml:space="preserve"> calibrated parameters. Their predictive </w:t>
       </w:r>
       <w:r>
+        <w:lastRenderedPageBreak/>
         <w:t>capability may therefore be limited outside the geometries and environmental conditions used for calibration</w:t>
       </w:r>
       <w:r>
@@ -1079,6 +1040,7 @@
         <w:pStyle w:val="Heading1"/>
       </w:pPr>
       <w:r>
+        <w:lastRenderedPageBreak/>
         <w:t>Method</w:t>
       </w:r>
       <w:r>
@@ -1288,12 +1250,12 @@
       <w:r>
         <w:t>. (a) Reaction–diffusion model coupling species transport and corrosion-</w:t>
       </w:r>
-      <w:del w:id="9010" w:author="Claude" w:date="2026-10-08T22:18:30Z">
+      <w:del w:id="1" w:author="Claude" w:date="2026-10-08T20:38:00Z">
         <w:r>
-          <w:delText xml:space="preserve">film</w:delText>
+          <w:delText>film</w:delText>
         </w:r>
       </w:del>
-      <w:ins w:id="9009" w:author="Claude" w:date="2026-10-08T22:18:30Z">
+      <w:ins w:id="2" w:author="Claude" w:date="2026-10-08T20:38:00Z">
         <w:r>
           <w:t>product</w:t>
         </w:r>
@@ -1354,7 +1316,7 @@
       <w:pPr>
         <w:pStyle w:val="Heading2"/>
       </w:pPr>
-      <w:bookmarkStart w:id="1" w:name="sec:methods:materials"/>
+      <w:bookmarkStart w:id="3" w:name="sec:methods:materials"/>
       <w:r>
         <w:t>Experimental Procedure</w:t>
       </w:r>
@@ -1405,21 +1367,20 @@
         <w:rPr>
           <w:rFonts w:cs="Times New Roman"/>
         </w:rPr>
-        <w:t xml:space="preserve">ultrasonically cleaned in Milli-Q water, acetone, and ethanol to remove residual surface contaminants, then dried and stored under vacuum until use. Hanks’ Balanced Salt Solution (HBSS; Gibco, calcium- and magnesium-free</w:t>
-      </w:r>
-      <w:ins w:id="9011" w:author="Claude" w:date="2026-10-08T22:18:30Z">
-        <w:r>
-          <w:rPr>
-            <w:rFonts w:cs="Times New Roman"/>
-          </w:rPr>
-          <w:t xml:space="preserve">; pH 7.4</w:t>
-        </w:r>
-      </w:ins>
-      <w:r>
-        <w:rPr>
-          <w:rFonts w:cs="Times New Roman"/>
-        </w:rPr>
-        <w:t xml:space="preserve">) was selected as the immersion medium.</w:t>
+        <w:lastRenderedPageBreak/>
+        <w:t>ultrasonically cleaned in Milli-Q water, acetone, and ethanol to remove residual surface contaminants, then dried and stored under vacuum until use. Hanks’ Balanced Salt Solution (HBSS; Gibco, calcium- and magnesium-free</w:t>
+      </w:r>
+      <w:r>
+        <w:rPr>
+          <w:rFonts w:cs="Times New Roman"/>
+        </w:rPr>
+        <w:t xml:space="preserve">; pH 7.4) </w:t>
+      </w:r>
+      <w:r>
+        <w:rPr>
+          <w:rFonts w:cs="Times New Roman"/>
+        </w:rPr>
+        <w:t>was selected as the immersion medium.</w:t>
       </w:r>
     </w:p>
     <w:p>
@@ -1560,7 +1521,7 @@
         <w:t>chromic acid solution in accordance with ISO 8407:2009. The cleaned specimens were rinsed, dried, and reweighed, and the mass loss was calculated from the difference between the initial and post-cleaning masses.</w:t>
       </w:r>
     </w:p>
-    <w:bookmarkEnd w:id="1"/>
+    <w:bookmarkEnd w:id="3"/>
     <w:p>
       <w:pPr>
         <w:pStyle w:val="Heading2"/>
@@ -1573,12 +1534,12 @@
       <w:pPr>
         <w:pStyle w:val="Heading3"/>
       </w:pPr>
-      <w:bookmarkStart w:id="2" w:name="_Ref238646573"/>
-      <w:bookmarkStart w:id="3" w:name="sec:model:chemistry"/>
+      <w:bookmarkStart w:id="4" w:name="_Ref238646573"/>
+      <w:bookmarkStart w:id="5" w:name="sec:model:chemistry"/>
       <w:r>
         <w:t>Electrochemical Mechanisms of Zn Biodegradation</w:t>
       </w:r>
-      <w:bookmarkEnd w:id="2"/>
+      <w:bookmarkEnd w:id="4"/>
     </w:p>
     <w:p>
       <w:pPr>
@@ -3011,6 +2972,7 @@
         <w:rPr>
           <w:rFonts w:cs="Times New Roman"/>
         </w:rPr>
+        <w:lastRenderedPageBreak/>
         <w:t xml:space="preserve">Overall degradation </w:t>
       </w:r>
       <w:r>
@@ -3019,22 +2981,89 @@
         </w:rPr>
         <w:t xml:space="preserve">therefore results from a dynamic balance between ORR-driven passivation and chloride-mediated </w:t>
       </w:r>
-      <w:del w:id="9018" w:author="Claude" w:date="2026-10-08T22:18:30Z">
-        <w:r>
-          <w:rPr>
-            <w:rFonts w:cs="Times New Roman"/>
-          </w:rPr>
-          <w:delText xml:space="preserve">film</w:delText>
-        </w:r>
-      </w:del>
-      <w:ins w:id="9017" w:author="Claude" w:date="2026-10-08T22:18:30Z">
-        <w:r>
-          <w:rPr>
-            <w:rFonts w:cs="Times New Roman"/>
-          </w:rPr>
-          <w:t xml:space="preserve">corrosion-product</w:t>
-        </w:r>
-      </w:ins>
+      <w:r>
+        <w:rPr>
+          <w:rFonts w:cs="Times New Roman"/>
+        </w:rPr>
+        <w:t xml:space="preserve">corrosion-product </w:t>
+      </w:r>
+      <w:r>
+        <w:rPr>
+          <w:rFonts w:cs="Times New Roman"/>
+        </w:rPr>
+        <w:t xml:space="preserve">dissolution. </w:t>
+      </w:r>
+      <w:r>
+        <w:rPr>
+          <w:rFonts w:cs="Times New Roman"/>
+        </w:rPr>
+        <w:t xml:space="preserve">Although phosphate and carbonate species may contribute to the formation of secondary corrosion products such as </w:t>
+      </w:r>
+      <w:proofErr w:type="spellStart"/>
+      <w:r>
+        <w:rPr>
+          <w:rFonts w:cs="Times New Roman"/>
+        </w:rPr>
+        <w:t>hopeite</w:t>
+      </w:r>
+      <w:proofErr w:type="spellEnd"/>
+      <w:r>
+        <w:rPr>
+          <w:rFonts w:cs="Times New Roman"/>
+        </w:rPr>
+        <w:t xml:space="preserve">, smithsonite, and </w:t>
+      </w:r>
+      <w:proofErr w:type="spellStart"/>
+      <w:r>
+        <w:rPr>
+          <w:rFonts w:cs="Times New Roman"/>
+        </w:rPr>
+        <w:t>simonkolleite</w:t>
+      </w:r>
+      <w:proofErr w:type="spellEnd"/>
+      <w:r>
+        <w:rPr>
+          <w:rFonts w:cs="Times New Roman"/>
+        </w:rPr>
+        <w:t xml:space="preserve"> at longer timescales </w:t>
+      </w:r>
+      <w:r>
+        <w:rPr>
+          <w:rFonts w:cs="Times New Roman"/>
+        </w:rPr>
+        <w:fldChar w:fldCharType="begin"/>
+      </w:r>
+      <w:r>
+        <w:rPr>
+          <w:rFonts w:cs="Times New Roman"/>
+        </w:rPr>
+        <w:instrText xml:space="preserve"> ADDIN ZOTERO_ITEM CSL_CITATION {"citationID":"r0ugdedM","properties":{"unsorted":false,"formattedCitation":"\\super [27]\\nosupersub{}","plainCitation":"[27]","noteIndex":0},"citationItems":[{"id":4074,"uris":["http://zotero.org/users/16939557/items/3MX3HALM","http://zotero.org/users/16939557/items/33BRYGX4"],"itemData":{"id":4074,"type":"article-journal","citation-key":"liuComparativeStudiesDegradation2019","container-title":"JOM","DOI":"10.1007/s11837-019-03357-3","ISSN":"1047-4838, 1543-1851","issue":"4","journalAbbreviation":"JOM","language":"en","page":"1414-1425","source":"DOI.org (Crossref)","title":"Comparative Studies on Degradation Behavior of Pure Zinc in Various Simulated Body Fluids","volume":"71","author":[{"family":"Liu","given":"Xiao"},{"family":"Yang","given":"Hongtao"},{"family":"Liu","given":"Yang"},{"family":"Xiong","given":"Pan"},{"family":"Guo","given":"Hui"},{"family":"Huang","given":"Her-Hsiung"},{"family":"Zheng","given":"Yufeng"}],"issued":{"date-parts":[["2019",4]]}}}],"schema":"https://github.com/citation-style-language/schema/raw/master/csl-citation.json"} </w:instrText>
+      </w:r>
+      <w:r>
+        <w:rPr>
+          <w:rFonts w:cs="Times New Roman"/>
+        </w:rPr>
+        <w:fldChar w:fldCharType="separate"/>
+      </w:r>
+      <w:r>
+        <w:rPr>
+          <w:rFonts w:cs="Times New Roman"/>
+          <w:vertAlign w:val="superscript"/>
+        </w:rPr>
+        <w:t>[27]</w:t>
+      </w:r>
+      <w:r>
+        <w:rPr>
+          <w:rFonts w:cs="Times New Roman"/>
+        </w:rPr>
+        <w:fldChar w:fldCharType="end"/>
+      </w:r>
+      <w:r>
+        <w:rPr>
+          <w:rFonts w:cs="Times New Roman"/>
+        </w:rPr>
+        <w:t>,</w:t>
+      </w:r>
       <w:r>
         <w:rPr>
           <w:rFonts w:cs="Times New Roman"/>
@@ -3045,136 +3074,13 @@
         <w:rPr>
           <w:rFonts w:cs="Times New Roman"/>
         </w:rPr>
-        <w:t xml:space="preserve">dissolution. </w:t>
-      </w:r>
-      <w:r>
-        <w:rPr>
-          <w:rFonts w:cs="Times New Roman"/>
-        </w:rPr>
-        <w:t xml:space="preserve">Although phosphate and carbonate species may contribute to the formation of secondary corrosion products such as </w:t>
-      </w:r>
-      <w:proofErr w:type="spellStart"/>
-      <w:r>
-        <w:rPr>
-          <w:rFonts w:cs="Times New Roman"/>
-        </w:rPr>
-        <w:t>hopeite</w:t>
-      </w:r>
-      <w:proofErr w:type="spellEnd"/>
-      <w:r>
-        <w:rPr>
-          <w:rFonts w:cs="Times New Roman"/>
-        </w:rPr>
-        <w:t xml:space="preserve">, smithsonite, and </w:t>
-      </w:r>
-      <w:proofErr w:type="spellStart"/>
-      <w:r>
-        <w:rPr>
-          <w:rFonts w:cs="Times New Roman"/>
-        </w:rPr>
-        <w:t>simonkolleite</w:t>
-      </w:r>
-      <w:proofErr w:type="spellEnd"/>
-      <w:r>
-        <w:rPr>
-          <w:rFonts w:cs="Times New Roman"/>
-        </w:rPr>
-        <w:t xml:space="preserve"> at longer timescales </w:t>
-      </w:r>
-      <w:r>
-        <w:rPr>
-          <w:rFonts w:cs="Times New Roman"/>
-        </w:rPr>
-        <w:fldChar w:fldCharType="begin"/>
-      </w:r>
-      <w:r>
-        <w:rPr>
-          <w:rFonts w:cs="Times New Roman"/>
-        </w:rPr>
-        <w:instrText xml:space="preserve"> ADDIN ZOTERO_ITEM CSL_CITATION {"citationID":"r0ugdedM","properties":{"unsorted":false,"formattedCitation":"\\super [27]\\nosupersub{}","plainCitation":"[27]","noteIndex":0},"citationItems":[{"id":4074,"uris":["http://zotero.org/users/16939557/items/3MX3HALM","http://zotero.org/users/16939557/items/33BRYGX4"],"itemData":{"id":4074,"type":"article-journal","citation-key":"liuComparativeStudiesDegradation2019","container-title":"JOM","DOI":"10.1007/s11837-019-03357-3","ISSN":"1047-4838, 1543-1851","issue":"4","journalAbbreviation":"JOM","language":"en","page":"1414-1425","source":"DOI.org (Crossref)","title":"Comparative Studies on Degradation Behavior of Pure Zinc in Various Simulated Body Fluids","volume":"71","author":[{"family":"Liu","given":"Xiao"},{"family":"Yang","given":"Hongtao"},{"family":"Liu","given":"Yang"},{"family":"Xiong","given":"Pan"},{"family":"Guo","given":"Hui"},{"family":"Huang","given":"Her-Hsiung"},{"family":"Zheng","given":"Yufeng"}],"issued":{"date-parts":[["2019",4]]}}}],"schema":"https://github.com/citation-style-language/schema/raw/master/csl-citation.json"} </w:instrText>
-      </w:r>
-      <w:r>
-        <w:rPr>
-          <w:rFonts w:cs="Times New Roman"/>
-        </w:rPr>
-        <w:fldChar w:fldCharType="separate"/>
-      </w:r>
-      <w:r>
-        <w:rPr>
-          <w:rFonts w:cs="Times New Roman"/>
-          <w:vertAlign w:val="superscript"/>
-        </w:rPr>
-        <w:t>[27]</w:t>
-      </w:r>
-      <w:r>
-        <w:rPr>
-          <w:rFonts w:cs="Times New Roman"/>
-        </w:rPr>
-        <w:fldChar w:fldCharType="end"/>
-      </w:r>
-      <w:del w:id="9016" w:author="Claude" w:date="2026-10-08T22:18:30Z">
-        <w:r>
-          <w:rPr>
-            <w:rFonts w:cs="Times New Roman"/>
-          </w:rPr>
-          <w:delText xml:space="preserve">, in vivo observations indicate that early degradation is dominated by a thin ZnO layer, with more complex phases appearing only after approximately 4.5 months [29]. Therefore, for the one-month simulation period considered here,</w:delText>
-        </w:r>
-      </w:del>
-      <w:r>
-        <w:rPr>
-          <w:rFonts w:cs="Times New Roman"/>
-        </w:rPr>
-        <w:t xml:space="preserve"> </w:t>
-      </w:r>
-      <w:r>
-        <w:rPr>
-          <w:rFonts w:cs="Times New Roman"/>
-        </w:rPr>
         <w:t xml:space="preserve">the corrosion </w:t>
       </w:r>
-      <w:del w:id="9015" w:author="Claude" w:date="2026-10-08T22:18:30Z">
-        <w:r>
-          <w:rPr>
-            <w:rFonts w:cs="Times New Roman"/>
-          </w:rPr>
-          <w:delText xml:space="preserve">film</w:delText>
-        </w:r>
-      </w:del>
-      <w:ins w:id="9014" w:author="Claude" w:date="2026-10-08T22:18:30Z">
-        <w:r>
-          <w:rPr>
-            <w:rFonts w:cs="Times New Roman"/>
-          </w:rPr>
-          <w:t xml:space="preserve">products</w:t>
-        </w:r>
-      </w:ins>
-      <w:r>
-        <w:rPr>
-          <w:rFonts w:cs="Times New Roman"/>
-        </w:rPr>
-        <w:t xml:space="preserve"> </w:t>
-      </w:r>
-      <w:del w:id="9013" w:author="Claude" w:date="2026-10-08T22:18:30Z">
-        <w:r>
-          <w:rPr>
-            <w:rFonts w:cs="Times New Roman"/>
-          </w:rPr>
-          <w:delText xml:space="preserve">is</w:delText>
-        </w:r>
-      </w:del>
-      <w:ins w:id="9012" w:author="Claude" w:date="2026-10-08T22:18:30Z">
-        <w:r>
-          <w:rPr>
-            <w:rFonts w:cs="Times New Roman"/>
-          </w:rPr>
-          <w:t xml:space="preserve">are</w:t>
-        </w:r>
-      </w:ins>
-      <w:r>
-        <w:rPr>
-          <w:rFonts w:cs="Times New Roman"/>
-        </w:rPr>
-        <w:t xml:space="preserve"> </w:t>
+      <w:r>
+        <w:rPr>
+          <w:rFonts w:cs="Times New Roman"/>
+        </w:rPr>
+        <w:t xml:space="preserve">products are </w:t>
       </w:r>
       <w:r>
         <w:rPr>
@@ -3198,8 +3104,8 @@
         <w:ind w:firstLine="0"/>
         <w:jc w:val="center"/>
       </w:pPr>
-      <w:bookmarkStart w:id="4" w:name="fig:chemistry"/>
-      <w:bookmarkEnd w:id="3"/>
+      <w:bookmarkStart w:id="6" w:name="fig:chemistry"/>
+      <w:bookmarkEnd w:id="5"/>
       <w:r>
         <w:rPr>
           <w:noProof/>
@@ -3251,7 +3157,7 @@
       <w:pPr>
         <w:pStyle w:val="Captions"/>
       </w:pPr>
-      <w:bookmarkStart w:id="5" w:name="_Ref238652979"/>
+      <w:bookmarkStart w:id="7" w:name="_Ref238652979"/>
       <w:r>
         <w:rPr>
           <w:b/>
@@ -3309,7 +3215,7 @@
         </w:rPr>
         <w:fldChar w:fldCharType="end"/>
       </w:r>
-      <w:bookmarkEnd w:id="5"/>
+      <w:bookmarkEnd w:id="7"/>
       <w:r>
         <w:rPr>
           <w:b/>
@@ -3323,29 +3229,15 @@
       <w:r>
         <w:t xml:space="preserve">Schematic of the coupled mechanistic framework for Zn biodegradation in physiological media. (a) Electrochemical reactions governing Zn dissolution, oxygen reduction, </w:t>
       </w:r>
-      <w:del w:id="9023" w:author="Claude" w:date="2026-10-08T22:18:30Z">
-        <w:r>
-          <w:delText xml:space="preserve">film</w:delText>
-        </w:r>
-      </w:del>
-      <w:ins w:id="9022" w:author="Claude" w:date="2026-10-08T22:18:30Z">
-        <w:r>
-          <w:t>corrosion-product</w:t>
-        </w:r>
-      </w:ins>
-      <w:r>
-        <w:t xml:space="preserve"> formation, and chloride-induced </w:t>
-      </w:r>
-      <w:del w:id="9021" w:author="Claude" w:date="2026-10-08T22:18:30Z">
-        <w:r>
-          <w:delText xml:space="preserve">film breakdown</w:delText>
-        </w:r>
-      </w:del>
-      <w:ins w:id="9020" w:author="Claude" w:date="2026-10-08T22:18:30Z">
-        <w:r>
-          <w:t>dissolution</w:t>
-        </w:r>
-      </w:ins>
+      <w:r>
+        <w:t xml:space="preserve">corrosion-product </w:t>
+      </w:r>
+      <w:r>
+        <w:t xml:space="preserve">formation, and chloride-induced </w:t>
+      </w:r>
+      <w:r>
+        <w:t>dissolution</w:t>
+      </w:r>
       <w:r>
         <w:t>, (</w:t>
       </w:r>
@@ -3353,15 +3245,7 @@
         <w:t>b</w:t>
       </w:r>
       <w:r>
-        <w:t xml:space="preserve">) porous corrosion-product</w:t>
-      </w:r>
-      <w:del w:id="9019" w:author="Claude" w:date="2026-10-08T22:18:30Z">
-        <w:r>
-          <w:delText xml:space="preserve"> film</w:delText>
-        </w:r>
-      </w:del>
-      <w:r>
-        <w:t xml:space="preserve"> structure showing the influence of porosity and tortuosity on effective species diffusion</w:t>
+        <w:t>) porous corrosion-product structure showing the influence of porosity and tortuosity on effective species diffusion</w:t>
       </w:r>
       <w:r>
         <w:t>, (c) level-set tracking of the moving metal-electrolyte interface and associated species transport.</w:t>
@@ -3372,7 +3256,7 @@
         <w:pStyle w:val="Captions"/>
       </w:pPr>
     </w:p>
-    <w:bookmarkEnd w:id="4"/>
+    <w:bookmarkEnd w:id="6"/>
     <w:p>
       <w:pPr>
         <w:pStyle w:val="Heading3"/>
@@ -3494,6 +3378,7 @@
         <w:rPr>
           <w:rFonts w:cs="Times New Roman"/>
         </w:rPr>
+        <w:lastRenderedPageBreak/>
         <w:t>together with the static immersion conditions considered in this study (</w:t>
       </w:r>
       <m:oMath>
@@ -4050,22 +3935,12 @@
         </w:rPr>
         <w:t>the corrosion-</w:t>
       </w:r>
-      <w:del w:id="9026" w:author="Claude" w:date="2026-10-08T22:18:30Z">
-        <w:r>
-          <w:rPr>
-            <w:rFonts w:cs="Times New Roman"/>
-          </w:rPr>
-          <w:delText xml:space="preserve">film</w:delText>
-        </w:r>
-      </w:del>
-      <w:ins w:id="9025" w:author="Claude" w:date="2026-10-08T22:18:30Z">
-        <w:r>
-          <w:rPr>
-            <w:rFonts w:cs="Times New Roman"/>
-          </w:rPr>
-          <w:t>product</w:t>
-        </w:r>
-      </w:ins>
+      <w:r>
+        <w:rPr>
+          <w:rFonts w:cs="Times New Roman"/>
+        </w:rPr>
+        <w:t>product</w:t>
+      </w:r>
       <w:r>
         <w:rPr>
           <w:rFonts w:cs="Times New Roman"/>
@@ -4162,11 +4037,6 @@
       <w:r>
         <w:t xml:space="preserve">. The reaction term was applied exclusively at the moving Zn–electrolyte interface, such that oxygen must diffuse to the Zn surface before being consumed. </w:t>
       </w:r>
-      <w:ins w:id="9024" w:author="Claude" w:date="2026-10-08T22:18:30Z">
-        <w:r>
-          <w:t xml:space="preserve">The interface term δ_Γ is a sharp surface integral over the zero level set (FreeFEM int2d with the levelset option), with no smoothing parameter; a smoothed delta function with a width equal to the minimum mesh size is used only in post-processing averages.</w:t>
-        </w:r>
-      </w:ins>
     </w:p>
     <w:p>
       <w:pPr>
@@ -4576,257 +4446,143 @@
         </w:rPr>
         <w:t xml:space="preserve">Chloride </w:t>
       </w:r>
-      <w:del w:id="9048" w:author="Claude" w:date="2026-10-08T22:18:30Z">
-        <w:r>
-          <w:rPr>
-            <w:rFonts w:cs="Times New Roman"/>
-          </w:rPr>
-          <w:delText xml:space="preserve">acts</w:delText>
-        </w:r>
-      </w:del>
-      <w:ins w:id="9047" w:author="Claude" w:date="2026-10-08T22:18:30Z">
-        <w:r>
-          <w:rPr>
-            <w:rFonts w:cs="Times New Roman"/>
-          </w:rPr>
-          <w:t xml:space="preserve">is treated</w:t>
-        </w:r>
-      </w:ins>
-      <w:r>
-        <w:rPr>
-          <w:rFonts w:cs="Times New Roman"/>
-        </w:rPr>
-        <w:t xml:space="preserve"> as </w:t>
-      </w:r>
-      <w:del w:id="9046" w:author="Claude" w:date="2026-10-08T22:18:30Z">
-        <w:r>
-          <w:rPr>
-            <w:rFonts w:cs="Times New Roman"/>
-          </w:rPr>
-          <w:delText xml:space="preserve">a</w:delText>
-        </w:r>
-      </w:del>
-      <w:ins w:id="9045" w:author="Claude" w:date="2026-10-08T22:18:30Z">
-        <w:r>
-          <w:rPr>
-            <w:rFonts w:cs="Times New Roman"/>
-          </w:rPr>
-          <w:t xml:space="preserve">effectively</w:t>
-        </w:r>
-      </w:ins>
+      <w:r>
+        <w:rPr>
+          <w:rFonts w:cs="Times New Roman"/>
+        </w:rPr>
+        <w:t>acts</w:t>
+      </w:r>
       <w:r>
         <w:rPr>
           <w:rFonts w:cs="Times New Roman"/>
         </w:rPr>
         <w:t xml:space="preserve"> </w:t>
       </w:r>
-      <w:del w:id="9044" w:author="Claude" w:date="2026-10-08T22:18:30Z">
-        <w:r>
-          <w:rPr>
-            <w:rFonts w:cs="Times New Roman"/>
-          </w:rPr>
-          <w:delText xml:space="preserve">catalytic species</w:delText>
-        </w:r>
-      </w:del>
-      <w:ins w:id="9043" w:author="Claude" w:date="2026-10-08T22:18:30Z">
-        <w:r>
-          <w:rPr>
-            <w:rFonts w:cs="Times New Roman"/>
-          </w:rPr>
-          <w:t xml:space="preserve">non-consumed</w:t>
-        </w:r>
-      </w:ins>
+      <w:r>
+        <w:rPr>
+          <w:rFonts w:cs="Times New Roman"/>
+        </w:rPr>
+        <w:t xml:space="preserve">as </w:t>
+      </w:r>
+      <w:r>
+        <w:rPr>
+          <w:rFonts w:cs="Times New Roman"/>
+        </w:rPr>
+        <w:t>a</w:t>
+      </w:r>
+      <w:r>
+        <w:rPr>
+          <w:rFonts w:cs="Times New Roman"/>
+        </w:rPr>
+        <w:t xml:space="preserve"> </w:t>
+      </w:r>
+      <w:r>
+        <w:rPr>
+          <w:rFonts w:cs="Times New Roman"/>
+        </w:rPr>
+        <w:t>catalytic species</w:t>
+      </w:r>
       <w:r>
         <w:rPr>
           <w:rFonts w:cs="Times New Roman"/>
         </w:rPr>
         <w:t xml:space="preserve">, </w:t>
       </w:r>
-      <w:del w:id="9042" w:author="Claude" w:date="2026-10-08T22:18:30Z">
-        <w:r>
-          <w:rPr>
-            <w:rFonts w:cs="Times New Roman"/>
-          </w:rPr>
-          <w:delText xml:space="preserve">being</w:delText>
-        </w:r>
-      </w:del>
-      <w:ins w:id="9041" w:author="Claude" w:date="2026-10-08T22:18:30Z">
-        <w:r>
-          <w:rPr>
-            <w:rFonts w:cs="Times New Roman"/>
-          </w:rPr>
-          <w:t xml:space="preserve">because</w:t>
-        </w:r>
-      </w:ins>
+      <w:r>
+        <w:rPr>
+          <w:rFonts w:cs="Times New Roman"/>
+        </w:rPr>
+        <w:t>being</w:t>
+      </w:r>
       <w:r>
         <w:rPr>
           <w:rFonts w:cs="Times New Roman"/>
         </w:rPr>
         <w:t xml:space="preserve"> </w:t>
       </w:r>
-      <w:del w:id="9040" w:author="Claude" w:date="2026-10-08T22:18:30Z">
-        <w:r>
-          <w:rPr>
-            <w:rFonts w:cs="Times New Roman"/>
-          </w:rPr>
-          <w:delText xml:space="preserve">regenerated</w:delText>
-        </w:r>
-      </w:del>
-      <w:ins w:id="9039" w:author="Claude" w:date="2026-10-08T22:18:30Z">
-        <w:r>
-          <w:rPr>
-            <w:rFonts w:cs="Times New Roman"/>
-          </w:rPr>
-          <w:t xml:space="preserve">it</w:t>
-        </w:r>
-      </w:ins>
+      <w:r>
+        <w:rPr>
+          <w:rFonts w:cs="Times New Roman"/>
+        </w:rPr>
+        <w:t>regenerated</w:t>
+      </w:r>
       <w:r>
         <w:rPr>
           <w:rFonts w:cs="Times New Roman"/>
         </w:rPr>
         <w:t xml:space="preserve"> </w:t>
       </w:r>
-      <w:del w:id="9038" w:author="Claude" w:date="2026-10-08T22:18:30Z">
-        <w:r>
-          <w:rPr>
-            <w:rFonts w:cs="Times New Roman"/>
-          </w:rPr>
-          <w:delText xml:space="preserve">during</w:delText>
-        </w:r>
-      </w:del>
-      <w:ins w:id="9037" w:author="Claude" w:date="2026-10-08T22:18:30Z">
-        <w:r>
-          <w:rPr>
-            <w:rFonts w:cs="Times New Roman"/>
-          </w:rPr>
-          <w:t xml:space="preserve">is</w:t>
-        </w:r>
-      </w:ins>
+      <w:r>
+        <w:rPr>
+          <w:rFonts w:cs="Times New Roman"/>
+        </w:rPr>
+        <w:t>during</w:t>
+      </w:r>
       <w:r>
         <w:rPr>
           <w:rFonts w:cs="Times New Roman"/>
         </w:rPr>
         <w:t xml:space="preserve"> </w:t>
       </w:r>
-      <w:del w:id="9036" w:author="Claude" w:date="2026-10-08T22:18:30Z">
-        <w:r>
-          <w:rPr>
-            <w:rFonts w:cs="Times New Roman"/>
-          </w:rPr>
-          <w:delText xml:space="preserve">film</w:delText>
-        </w:r>
-      </w:del>
-      <w:ins w:id="9035" w:author="Claude" w:date="2026-10-08T22:18:30Z">
-        <w:r>
-          <w:rPr>
-            <w:rFonts w:cs="Times New Roman"/>
-          </w:rPr>
-          <w:t xml:space="preserve">in</w:t>
-        </w:r>
-      </w:ins>
+      <w:r>
+        <w:rPr>
+          <w:rFonts w:cs="Times New Roman"/>
+        </w:rPr>
+        <w:t>film</w:t>
+      </w:r>
       <w:r>
         <w:rPr>
           <w:rFonts w:cs="Times New Roman"/>
         </w:rPr>
         <w:t xml:space="preserve"> </w:t>
       </w:r>
-      <w:del w:id="9034" w:author="Claude" w:date="2026-10-08T22:18:30Z">
-        <w:r>
-          <w:rPr>
-            <w:rFonts w:cs="Times New Roman"/>
-          </w:rPr>
-          <w:delText xml:space="preserve">breakdown</w:delText>
-        </w:r>
-      </w:del>
-      <w:ins w:id="9033" w:author="Claude" w:date="2026-10-08T22:18:30Z">
-        <w:r>
-          <w:rPr>
-            <w:rFonts w:cs="Times New Roman"/>
-          </w:rPr>
-          <w:t xml:space="preserve">large</w:t>
-        </w:r>
-      </w:ins>
+      <w:r>
+        <w:rPr>
+          <w:rFonts w:cs="Times New Roman"/>
+        </w:rPr>
+        <w:t>breakdown</w:t>
+      </w:r>
       <w:r>
         <w:rPr>
           <w:rFonts w:cs="Times New Roman"/>
         </w:rPr>
         <w:t xml:space="preserve"> </w:t>
       </w:r>
-      <w:del w:id="9032" w:author="Claude" w:date="2026-10-08T22:18:30Z">
-        <w:r>
-          <w:rPr>
-            <w:rFonts w:cs="Times New Roman"/>
-          </w:rPr>
-          <w:delText xml:space="preserve">rather</w:delText>
-        </w:r>
-      </w:del>
-      <w:ins w:id="9031" w:author="Claude" w:date="2026-10-08T22:18:30Z">
-        <w:r>
-          <w:rPr>
-            <w:rFonts w:cs="Times New Roman"/>
-          </w:rPr>
-          <w:t xml:space="preserve">excess</w:t>
-        </w:r>
-      </w:ins>
+      <w:r>
+        <w:rPr>
+          <w:rFonts w:cs="Times New Roman"/>
+        </w:rPr>
+        <w:t>rather</w:t>
+      </w:r>
       <w:r>
         <w:rPr>
           <w:rFonts w:cs="Times New Roman"/>
         </w:rPr>
         <w:t xml:space="preserve"> </w:t>
       </w:r>
-      <w:del w:id="9030" w:author="Claude" w:date="2026-10-08T22:18:30Z">
-        <w:r>
-          <w:rPr>
-            <w:rFonts w:cs="Times New Roman"/>
-          </w:rPr>
-          <w:delText xml:space="preserve">than</w:delText>
-        </w:r>
-      </w:del>
-      <w:ins w:id="9029" w:author="Claude" w:date="2026-10-08T22:18:30Z">
-        <w:r>
-          <w:rPr>
-            <w:rFonts w:cs="Times New Roman"/>
-          </w:rPr>
-          <w:t xml:space="preserve">(142.3</w:t>
-        </w:r>
-      </w:ins>
+      <w:r>
+        <w:rPr>
+          <w:rFonts w:cs="Times New Roman"/>
+        </w:rPr>
+        <w:t>than</w:t>
+      </w:r>
       <w:r>
         <w:rPr>
           <w:rFonts w:cs="Times New Roman"/>
         </w:rPr>
         <w:t xml:space="preserve"> </w:t>
       </w:r>
-      <w:del w:id="9028" w:author="Claude" w:date="2026-10-08T22:18:30Z">
-        <w:r>
-          <w:rPr>
-            <w:rFonts w:cs="Times New Roman"/>
-          </w:rPr>
-          <w:delText xml:space="preserve">consumed</w:delText>
-        </w:r>
-      </w:del>
-      <w:ins w:id="9027" w:author="Claude" w:date="2026-10-08T22:18:30Z">
-        <w:r>
-          <w:rPr>
-            <w:rFonts w:cs="Times New Roman"/>
-          </w:rPr>
-          <w:t xml:space="preserve">mmol L⁻¹) and is not appreciably depleted by corrosion-product dissolution</w:t>
-        </w:r>
-      </w:ins>
+      <w:r>
+        <w:rPr>
+          <w:rFonts w:cs="Times New Roman"/>
+        </w:rPr>
+        <w:t>consumed</w:t>
+      </w:r>
       <w:r>
         <w:rPr>
           <w:rFonts w:cs="Times New Roman"/>
         </w:rPr>
         <w:t xml:space="preserve"> </w:t>
-      </w:r>
-      <w:r>
-        <w:rPr>
-          <w:rFonts w:cs="Times New Roman"/>
-        </w:rPr>
-      </w:r>
-      <w:r>
-        <w:rPr>
-          <w:rFonts w:cs="Times New Roman"/>
-        </w:rPr>
       </w:r>
       <w:r>
         <w:rPr>
@@ -5258,14 +5014,6 @@
         <w:t xml:space="preserve">generating OH⁻ ions that increase the local alkalinity and promote formation of </w:t>
       </w:r>
       <w:proofErr w:type="spellStart"/>
-      <w:del w:id="9054" w:author="Claude" w:date="2026-10-08T22:18:30Z">
-        <w:r>
-          <w:rPr>
-            <w:rFonts w:cs="Times New Roman"/>
-          </w:rPr>
-          <w:delText xml:space="preserve">a </w:delText>
-        </w:r>
-      </w:del>
       <w:r>
         <w:rPr>
           <w:rFonts w:cs="Times New Roman"/>
@@ -5277,77 +5025,37 @@
         <w:rPr>
           <w:rFonts w:cs="Times New Roman"/>
         </w:rPr>
-        <w:t>-based corrosion</w:t>
-      </w:r>
-      <w:del w:id="9053" w:author="Claude" w:date="2026-10-08T22:18:30Z">
-        <w:r>
-          <w:rPr>
-            <w:rFonts w:cs="Times New Roman"/>
-          </w:rPr>
-          <w:delText xml:space="preserve">-product</w:delText>
-        </w:r>
-      </w:del>
-      <w:r>
-        <w:rPr>
-          <w:rFonts w:cs="Times New Roman"/>
-        </w:rPr>
-        <w:t xml:space="preserve"> </w:t>
-      </w:r>
-      <w:del w:id="9052" w:author="Claude" w:date="2026-10-08T22:18:30Z">
-        <w:r>
-          <w:rPr>
-            <w:rFonts w:cs="Times New Roman"/>
-          </w:rPr>
-          <w:delText xml:space="preserve">film</w:delText>
-        </w:r>
-      </w:del>
-      <w:ins w:id="9051" w:author="Claude" w:date="2026-10-08T22:18:30Z">
-        <w:r>
-          <w:rPr>
-            <w:rFonts w:cs="Times New Roman"/>
-          </w:rPr>
-          <w:t xml:space="preserve">products</w:t>
-        </w:r>
-      </w:ins>
-      <w:r>
-        <w:rPr>
-          <w:rFonts w:cs="Times New Roman"/>
-        </w:rPr>
-        <w:t xml:space="preserve">.</w:t>
-      </w:r>
-      <w:r>
-        <w:rPr>
-          <w:rFonts w:cs="Times New Roman"/>
-        </w:rPr>
-        <w:t xml:space="preserve"> </w:t>
-      </w:r>
-      <w:r>
-        <w:rPr>
-          <w:rFonts w:cs="Times New Roman"/>
-        </w:rPr>
-        <w:t xml:space="preserve">At the same time, chloride-induced </w:t>
-      </w:r>
-      <w:del w:id="9050" w:author="Claude" w:date="2026-10-08T22:18:30Z">
-        <w:r>
-          <w:rPr>
-            <w:rFonts w:cs="Times New Roman"/>
-          </w:rPr>
-          <w:delText xml:space="preserve">film</w:delText>
-        </w:r>
-      </w:del>
-      <w:ins w:id="9049" w:author="Claude" w:date="2026-10-08T22:18:30Z">
-        <w:r>
-          <w:rPr>
-            <w:rFonts w:cs="Times New Roman"/>
-          </w:rPr>
-          <w:t>corrosion-product</w:t>
-        </w:r>
-      </w:ins>
-      <w:r>
-        <w:rPr>
-          <w:rFonts w:cs="Times New Roman"/>
-        </w:rPr>
-        <w:t xml:space="preserve"> dissolution releases hydroxide back into the electrolyte</w:t>
+        <w:t xml:space="preserve">-based corrosion </w:t>
+      </w:r>
+      <w:r>
+        <w:rPr>
+          <w:rFonts w:cs="Times New Roman"/>
+        </w:rPr>
+        <w:t>products</w:t>
+      </w:r>
+      <w:r>
+        <w:rPr>
+          <w:rFonts w:cs="Times New Roman"/>
+        </w:rPr>
+        <w:t>.</w:t>
+      </w:r>
+      <w:r>
+        <w:rPr>
+          <w:rFonts w:cs="Times New Roman"/>
+        </w:rPr>
+        <w:t xml:space="preserve"> At the same time, chloride-induced </w:t>
+      </w:r>
+      <w:r>
+        <w:rPr>
+          <w:rFonts w:cs="Times New Roman"/>
+        </w:rPr>
+        <w:t xml:space="preserve">corrosion-product </w:t>
+      </w:r>
+      <w:r>
+        <w:rPr>
+          <w:rFonts w:cs="Times New Roman"/>
+        </w:rPr>
+        <w:t>dissolution releases hydroxide back into the electrolyte</w:t>
       </w:r>
       <w:r>
         <w:rPr>
@@ -5506,7 +5214,16 @@
                         <w:rPr>
                           <w:rFonts w:cs="Times New Roman"/>
                         </w:rPr>
-                        <m:t>eff</m:t>
+                        <m:t>ef</m:t>
+                      </m:r>
+                      <m:r>
+                        <m:rPr>
+                          <m:nor/>
+                        </m:rPr>
+                        <w:rPr>
+                          <w:rFonts w:cs="Times New Roman"/>
+                        </w:rPr>
+                        <m:t>f</m:t>
                       </m:r>
                     </m:sup>
                   </m:sSubSup>
@@ -6182,18 +5899,12 @@
         <w:ind w:firstLine="0"/>
       </w:pPr>
       <w:r>
+        <w:lastRenderedPageBreak/>
         <w:t xml:space="preserve">Here, the corrosion-product </w:t>
       </w:r>
-      <w:del w:id="9056" w:author="Claude" w:date="2026-10-08T22:18:30Z">
-        <w:r>
-          <w:delText xml:space="preserve">film</w:delText>
-        </w:r>
-      </w:del>
-      <w:ins w:id="9055" w:author="Claude" w:date="2026-10-08T22:18:30Z">
-        <w:r>
-          <w:t>field</w:t>
-        </w:r>
-      </w:ins>
+      <w:r>
+        <w:t>field</w:t>
+      </w:r>
       <w:r>
         <w:t xml:space="preserve"> (</w:t>
       </w:r>
@@ -6490,7 +6201,19 @@
           <w:rPr>
             <w:rFonts w:ascii="Cambria Math" w:hAnsi="Cambria Math" w:cs="Times New Roman"/>
           </w:rPr>
-          <m:t> F </m:t>
+          <m:t> </m:t>
+        </m:r>
+        <m:r>
+          <w:rPr>
+            <w:rFonts w:ascii="Cambria Math" w:hAnsi="Cambria Math" w:cs="Times New Roman"/>
+          </w:rPr>
+          <m:t>F</m:t>
+        </m:r>
+        <m:r>
+          <w:rPr>
+            <w:rFonts w:ascii="Cambria Math" w:hAnsi="Cambria Math" w:cs="Times New Roman"/>
+          </w:rPr>
+          <m:t> </m:t>
         </m:r>
         <m:sSubSup>
           <m:sSubSupPr>
@@ -6631,31 +6354,10 @@
         <w:t>govern</w:t>
       </w:r>
       <w:r>
-        <w:t xml:space="preserve"> the rates of corrosion-product </w:t>
-      </w:r>
-      <w:del w:id="9071" w:author="Claude" w:date="2026-10-08T22:18:30Z">
-        <w:r>
-          <w:delText xml:space="preserve">film </w:delText>
-        </w:r>
-      </w:del>
-      <w:r>
-        <w:t xml:space="preserve">formation and chloride-mediated </w:t>
-      </w:r>
-      <w:del w:id="9070" w:author="Claude" w:date="2026-10-08T22:18:30Z">
-        <w:r>
-          <w:delText xml:space="preserve">film </w:delText>
-        </w:r>
-      </w:del>
-      <w:r>
-        <w:t xml:space="preserve">dissolution, respectively</w:t>
-      </w:r>
-      <w:ins w:id="9069" w:author="Claude" w:date="2026-10-08T22:18:30Z">
-        <w:r>
-          <w:t xml:space="preserve">. The chloride exponent in Eq. 11 is an effective reaction order, not the stoichiometric one of Eq. 5</w:t>
-        </w:r>
-      </w:ins>
-      <w:r>
-        <w:t xml:space="preserve">. </w:t>
+        <w:t xml:space="preserve"> the rates of corrosion-product formation and chloride-mediated dissolution, respectively</w:t>
+      </w:r>
+      <w:r>
+        <w:t xml:space="preserve">. The chloride exponent in Eq. 11 is an effective reaction order, not the stoichiometric one of Eq. 5. </w:t>
       </w:r>
       <w:r>
         <w:rPr>
@@ -6747,22 +6449,12 @@
         </w:rPr>
         <w:t xml:space="preserve">, which suppresses further growth as the </w:t>
       </w:r>
-      <w:del w:id="9068" w:author="Claude" w:date="2026-10-08T22:18:30Z">
-        <w:r>
-          <w:rPr>
-            <w:rFonts w:cs="Times New Roman"/>
-          </w:rPr>
-          <w:delText xml:space="preserve">film</w:delText>
-        </w:r>
-      </w:del>
-      <w:ins w:id="9067" w:author="Claude" w:date="2026-10-08T22:18:30Z">
-        <w:r>
-          <w:rPr>
-            <w:rFonts w:cs="Times New Roman"/>
-          </w:rPr>
-          <w:t>corrosion-product concentration</w:t>
-        </w:r>
-      </w:ins>
+      <w:r>
+        <w:rPr>
+          <w:rFonts w:cs="Times New Roman"/>
+        </w:rPr>
+        <w:t>corrosion-product concentration</w:t>
+      </w:r>
       <w:r>
         <w:rPr>
           <w:rFonts w:cs="Times New Roman"/>
@@ -6878,19 +6570,6 @@
       <w:r>
         <w:t xml:space="preserve"> </w:t>
       </w:r>
-      <w:ins w:id="9065" w:author="Claude" w:date="2026-10-08T22:18:30Z">
-        <w:r>
-          <w:t xml:space="preserve">(in g mm⁻³)</w:t>
-        </w:r>
-      </w:ins>
-      <w:ins w:id="9066" w:author="Claude" w:date="2026-10-08T22:18:30Z">
-        <w:r>
-          <w:rPr>
-            <w:rFonts w:cs="Times New Roman"/>
-          </w:rPr>
-          <w:t xml:space="preserve"> </w:t>
-        </w:r>
-      </w:ins>
       <w:r>
         <w:rPr>
           <w:rFonts w:cs="Times New Roman"/>
@@ -6931,57 +6610,8 @@
       <w:r>
         <w:t xml:space="preserve">As the </w:t>
       </w:r>
-      <w:del w:id="9064" w:author="Claude" w:date="2026-10-08T22:18:30Z">
-        <w:r>
-          <w:delText xml:space="preserve">film</w:delText>
-        </w:r>
-      </w:del>
-      <w:ins w:id="9063" w:author="Claude" w:date="2026-10-08T22:18:30Z">
-        <w:r>
-          <w:t>corrosion</w:t>
-        </w:r>
-      </w:ins>
-      <w:r>
-        <w:t xml:space="preserve"> </w:t>
-      </w:r>
-      <w:del w:id="9062" w:author="Claude" w:date="2026-10-08T22:18:30Z">
-        <w:r>
-          <w:delText xml:space="preserve">accumulates</w:delText>
-        </w:r>
-      </w:del>
-      <w:ins w:id="9061" w:author="Claude" w:date="2026-10-08T22:18:30Z">
-        <w:r>
-          <w:t>products accumulate</w:t>
-        </w:r>
-      </w:ins>
-      <w:r>
-        <w:t xml:space="preserve">, </w:t>
-      </w:r>
-      <w:del w:id="9060" w:author="Claude" w:date="2026-10-08T22:18:30Z">
-        <w:r>
-          <w:delText xml:space="preserve">it</w:delText>
-        </w:r>
-      </w:del>
-      <w:ins w:id="9059" w:author="Claude" w:date="2026-10-08T22:18:30Z">
-        <w:r>
-          <w:t xml:space="preserve">they</w:t>
-        </w:r>
-      </w:ins>
-      <w:r>
-        <w:t xml:space="preserve"> </w:t>
-      </w:r>
-      <w:del w:id="9058" w:author="Claude" w:date="2026-10-08T22:18:30Z">
-        <w:r>
-          <w:delText xml:space="preserve">impedes</w:delText>
-        </w:r>
-      </w:del>
-      <w:ins w:id="9057" w:author="Claude" w:date="2026-10-08T22:18:30Z">
-        <w:r>
-          <w:t xml:space="preserve">impede</w:t>
-        </w:r>
-      </w:ins>
-      <w:r>
-        <w:t xml:space="preserve"> </w:t>
+      <w:r>
+        <w:t xml:space="preserve">corrosion products accumulate, they impede </w:t>
       </w:r>
       <w:r>
         <w:t xml:space="preserve">species transport by reducing the effective diffusivity according to </w:t>
@@ -7350,21 +6980,11 @@
       <w:r>
         <w:t xml:space="preserve">​ is the free-solution diffusivity, and the transport reduction depends on the </w:t>
       </w:r>
-      <w:del w:id="9073" w:author="Claude" w:date="2026-10-08T22:18:30Z">
-        <w:r>
-          <w:delText xml:space="preserve">film</w:delText>
-        </w:r>
-      </w:del>
-      <w:ins w:id="9072" w:author="Claude" w:date="2026-10-08T22:18:30Z">
-        <w:r>
-          <w:t xml:space="preserve">corrosion-product region</w:t>
-        </w:r>
-      </w:ins>
-      <w:r>
-        <w:t xml:space="preserve">'s </w:t>
-      </w:r>
-      <w:r>
-        <w:t>porosity (</w:t>
+      <w:r>
+        <w:t>corrosion-product region</w:t>
+      </w:r>
+      <w:r>
+        <w:t>'s porosity (</w:t>
       </w:r>
       <m:oMath>
         <m:r>
@@ -7491,14 +7111,14 @@
         </w:rPr>
         <w:t xml:space="preserve"> </w:t>
       </w:r>
-      <w:bookmarkStart w:id="6" w:name="_Hlk237963744"/>
+      <w:bookmarkStart w:id="8" w:name="_Hlk237963744"/>
       <w:r>
         <w:rPr>
           <w:rFonts w:cs="Times New Roman"/>
         </w:rPr>
         <w:t>implicitly defines the interface as the zero-level set separating the metal and electrolyte domains,</w:t>
       </w:r>
-      <w:bookmarkEnd w:id="6"/>
+      <w:bookmarkEnd w:id="8"/>
       <w:r>
         <w:rPr>
           <w:rFonts w:cs="Times New Roman"/>
@@ -7851,6 +7471,7 @@
         </w:rPr>
         <w:t>Equation (17)</w:t>
       </w:r>
+      <w:proofErr w:type="gramStart"/>
       <w:r>
         <w:rPr>
           <w:rFonts w:cs="Times New Roman"/>
@@ -7863,6 +7484,7 @@
         </w:rPr>
         <w:t>.</w:t>
       </w:r>
+      <w:proofErr w:type="gramEnd"/>
       <w:r>
         <w:rPr>
           <w:rFonts w:cs="Times New Roman"/>
@@ -7880,12 +7502,12 @@
       <w:pPr>
         <w:pStyle w:val="Heading3"/>
       </w:pPr>
-      <w:bookmarkStart w:id="7" w:name="_Ref239691057"/>
-      <w:bookmarkStart w:id="8" w:name="sec:model:velocity"/>
+      <w:bookmarkStart w:id="9" w:name="_Ref239691057"/>
+      <w:bookmarkStart w:id="10" w:name="sec:model:velocity"/>
       <w:r>
         <w:t>Interface Recession Velocity</w:t>
       </w:r>
-      <w:bookmarkEnd w:id="7"/>
+      <w:bookmarkEnd w:id="9"/>
     </w:p>
     <w:p>
       <w:pPr>
@@ -8218,6 +7840,7 @@
         <w:rPr>
           <w:rFonts w:cs="Times New Roman"/>
         </w:rPr>
+        <w:lastRenderedPageBreak/>
         <w:t xml:space="preserve">where </w:t>
       </w:r>
       <m:oMath>
@@ -8259,22 +7882,12 @@
         </w:rPr>
         <w:t xml:space="preserve"> is the solid </w:t>
       </w:r>
-      <w:del w:id="9076" w:author="Claude" w:date="2026-10-08T22:18:30Z">
-        <w:r>
-          <w:rPr>
-            <w:rFonts w:cs="Times New Roman"/>
-          </w:rPr>
-          <w:delText xml:space="preserve">molar</w:delText>
-        </w:r>
-      </w:del>
-      <w:ins w:id="9075" w:author="Claude" w:date="2026-10-08T22:18:30Z">
-        <w:r>
-          <w:rPr>
-            <w:rFonts w:cs="Times New Roman"/>
-          </w:rPr>
-          <w:t xml:space="preserve">mass</w:t>
-        </w:r>
-      </w:ins>
+      <w:r>
+        <w:rPr>
+          <w:rFonts w:cs="Times New Roman"/>
+        </w:rPr>
+        <w:t>mass</w:t>
+      </w:r>
       <w:r>
         <w:rPr>
           <w:rFonts w:cs="Times New Roman"/>
@@ -8375,21 +7988,21 @@
         <w:rPr>
           <w:rFonts w:cs="Times New Roman"/>
         </w:rPr>
-        <w:t xml:space="preserve"> saturation concentration</w:t>
-      </w:r>
-      <w:ins w:id="9074" w:author="Claude" w:date="2026-10-08T22:18:30Z">
-        <w:r>
-          <w:rPr>
-            <w:rFonts w:cs="Times New Roman"/>
-          </w:rPr>
-          <w:t xml:space="preserve"> (a mass concentration); [Zn]sol, used below, is the solid molar density of Zn</w:t>
-        </w:r>
-      </w:ins>
-      <w:r>
-        <w:rPr>
-          <w:rFonts w:cs="Times New Roman"/>
-        </w:rPr>
-        <w:t xml:space="preserve">. Assuming first-order oxygen reduction kinetics and the reaction stoichiometry of </w:t>
+        <w:t xml:space="preserve"> saturation </w:t>
+      </w:r>
+      <w:proofErr w:type="gramStart"/>
+      <w:r>
+        <w:rPr>
+          <w:rFonts w:cs="Times New Roman"/>
+        </w:rPr>
+        <w:t>concentration.</w:t>
+      </w:r>
+      <w:proofErr w:type="gramEnd"/>
+      <w:r>
+        <w:rPr>
+          <w:rFonts w:cs="Times New Roman"/>
+        </w:rPr>
+        <w:t xml:space="preserve"> Assuming first-order oxygen reduction kinetics and the reaction stoichiometry of </w:t>
       </w:r>
       <w:r>
         <w:rPr>
@@ -8745,6 +8358,37 @@
         <w:rPr>
           <w:rFonts w:cs="Times New Roman"/>
         </w:rPr>
+        <w:t xml:space="preserve">Where </w:t>
+      </w:r>
+      <w:r>
+        <w:rPr>
+          <w:rFonts w:cs="Times New Roman"/>
+        </w:rPr>
+        <w:t>M</w:t>
+      </w:r>
+      <w:r>
+        <w:rPr>
+          <w:rFonts w:cs="Times New Roman"/>
+          <w:vertAlign w:val="subscript"/>
+        </w:rPr>
+        <w:t>O₂</w:t>
+      </w:r>
+      <w:r>
+        <w:rPr>
+          <w:rFonts w:cs="Times New Roman"/>
+        </w:rPr>
+        <w:t xml:space="preserve"> is the molar mass of </w:t>
+      </w:r>
+      <w:r>
+        <w:rPr>
+          <w:rFonts w:cs="Times New Roman"/>
+        </w:rPr>
+        <w:t xml:space="preserve">oxygen. </w:t>
+      </w:r>
+      <w:r>
+        <w:rPr>
+          <w:rFonts w:cs="Times New Roman"/>
+        </w:rPr>
         <w:t>As corrosion products accumulate and restrict oxygen transport to the metal surface, an oxygen-transport-limited recession velocity is given by:</w:t>
       </w:r>
     </w:p>
@@ -9417,27 +9061,19 @@
         <w:rPr>
           <w:rFonts w:cs="Times New Roman"/>
         </w:rPr>
-        <w:t xml:space="preserve">).</w:t>
-      </w:r>
-      <w:ins w:id="9077" w:author="Claude" w:date="2026-10-08T22:18:30Z">
-        <w:r>
-          <w:rPr>
-            <w:rFonts w:cs="Times New Roman"/>
-          </w:rPr>
-          <w:t xml:space="preserve"> In Eqs. 15 and 16, C_O₂ (3.5 mg L⁻¹, i.e. 1.09 × 10⁻¹⁰ mol mm⁻³) is molar and M_O₂ is the molar mass of O₂. M_O₂C_O₂ is the O₂ mass concentration used by the solver and [Zn]sol is the molar density, so k_ORR is an effective coefficient that also carries a unit factor of mol g⁻¹.</w:t>
-        </w:r>
-      </w:ins>
+        <w:t>).</w:t>
+      </w:r>
     </w:p>
     <w:p>
       <w:pPr>
         <w:pStyle w:val="Heading2"/>
       </w:pPr>
-      <w:bookmarkStart w:id="9" w:name="_Ref240381709"/>
-      <w:bookmarkStart w:id="10" w:name="tab:params"/>
+      <w:bookmarkStart w:id="11" w:name="_Ref240381709"/>
+      <w:bookmarkStart w:id="12" w:name="tab:params"/>
       <w:r>
         <w:t>Numerical Implementation and Simulation Setup</w:t>
       </w:r>
-      <w:bookmarkEnd w:id="9"/>
+      <w:bookmarkEnd w:id="11"/>
     </w:p>
     <w:p>
       <w:pPr>
@@ -9457,70 +9093,38 @@
       <w:r>
         <w:t xml:space="preserve">Parametrically generated implant geometries were discretized into tetrahedral meshes and embedded within </w:t>
       </w:r>
-      <w:del w:id="9085" w:author="Claude" w:date="2026-10-08T22:18:30Z">
-        <w:r>
-          <w:delText xml:space="preserve">an</w:delText>
-        </w:r>
-      </w:del>
-      <w:ins w:id="9084" w:author="Claude" w:date="2026-10-08T22:18:30Z">
-        <w:r>
-          <w:t xml:space="preserve">a 30 × 30 × 30 mm</w:t>
-        </w:r>
-      </w:ins>
-      <w:r>
-        <w:t xml:space="preserve"> </w:t>
+      <w:r>
+        <w:t xml:space="preserve">a 30 × 30 × 30 mm </w:t>
       </w:r>
       <w:r>
         <w:t>electrolyte domain</w:t>
       </w:r>
-      <w:ins w:id="9083" w:author="Claude" w:date="2026-10-08T22:18:30Z">
-        <w:r>
-          <w:t xml:space="preserve">,</w:t>
-        </w:r>
-      </w:ins>
-      <w:r>
-        <w:t xml:space="preserve"> </w:t>
-      </w:r>
-      <w:del w:id="9082" w:author="Claude" w:date="2026-10-08T22:18:30Z">
-        <w:r>
-          <w:delText xml:space="preserve">at</w:delText>
-        </w:r>
-      </w:del>
-      <w:ins w:id="9081" w:author="Claude" w:date="2026-10-08T22:18:30Z">
-        <w:r>
-          <w:t xml:space="preserve">identical</w:t>
-        </w:r>
-      </w:ins>
-      <w:r>
-        <w:t xml:space="preserve"> </w:t>
-      </w:r>
-      <w:del w:id="9080" w:author="Claude" w:date="2026-10-08T22:18:30Z">
-        <w:r>
-          <w:delText xml:space="preserve">least</w:delText>
-        </w:r>
-      </w:del>
-      <w:ins w:id="9079" w:author="Claude" w:date="2026-10-08T22:18:30Z">
-        <w:r>
-          <w:t xml:space="preserve">for the disc and the stent and larger than</w:t>
-        </w:r>
-      </w:ins>
-      <w:r>
-        <w:t xml:space="preserve"> three times</w:t>
-      </w:r>
-      <w:del w:id="9078" w:author="Claude" w:date="2026-10-08T22:18:30Z">
-        <w:r>
-          <w:delText xml:space="preserve"> larger than</w:delText>
-        </w:r>
-      </w:del>
-      <w:r>
-        <w:t xml:space="preserve"> the implant characteristic dimension in each direction</w:t>
-      </w:r>
-      <w:ins w:id="11" w:author="Claude" w:date="2026-10-08T04:28:00Z">
+      <w:ins w:id="13" w:author="Claude" w:date="2026-10-08T20:38:00Z">
         <w:r>
           <w:t>,</w:t>
         </w:r>
       </w:ins>
       <w:r>
+        <w:t xml:space="preserve"> </w:t>
+      </w:r>
+      <w:r>
+        <w:t>identical</w:t>
+      </w:r>
+      <w:r>
+        <w:t xml:space="preserve"> </w:t>
+      </w:r>
+      <w:r>
+        <w:t>for the disc and the stent and larger than</w:t>
+      </w:r>
+      <w:r>
+        <w:t xml:space="preserve"> three times the implant characteristic dimension in each direction</w:t>
+      </w:r>
+      <w:ins w:id="14" w:author="Claude" w:date="2026-10-08T04:28:00Z">
+        <w:r>
+          <w:t>,</w:t>
+        </w:r>
+      </w:ins>
+      <w:r>
         <w:t xml:space="preserve"> to minimize boundary effects. </w:t>
       </w:r>
       <w:r>
@@ -9533,7 +9137,20 @@
         <w:t xml:space="preserve"> </w:t>
       </w:r>
       <w:r>
-        <w:t>To resolve steep concentration gradients near the corrosion front, distance-based mesh refinement was applied around the metal-electrolyte interface, with progressively coarser elements away from the surface. Mesh convergence analysis identified a final mesh containing 18.9 million tetrahedral elements, for which predicted mass loss changed by less than 1% with further refinement (</w:t>
+        <w:t xml:space="preserve">To resolve steep concentration gradients near the corrosion front, distance-based mesh refinement was applied around the metal-electrolyte interface, with progressively coarser elements away from the surface. Mesh convergence analysis identified a final mesh containing 18.9 million tetrahedral elements, for which predicted mass loss changed by less than </w:t>
+      </w:r>
+      <w:del w:id="9010" w:author="Claude" w:date="2026-10-08T22:54:30Z">
+        <w:r>
+          <w:delText xml:space="preserve">1</w:delText>
+        </w:r>
+      </w:del>
+      <w:ins w:id="9009" w:author="Claude" w:date="2026-10-08T22:54:30Z">
+        <w:r>
+          <w:t xml:space="preserve">0.2</w:t>
+        </w:r>
+      </w:ins>
+      <w:r>
+        <w:t xml:space="preserve">% with further refinement (</w:t>
       </w:r>
       <w:r>
         <w:rPr>
@@ -9553,26 +9170,27 @@
       <w:r>
         <w:t>Physiological initial and boundary conditions were imposed throughout the electrolyte domain, including continuous oxygen replenishment at the electrolyte-air interface and kinetic flux conditions at the moving metal-electrolyte boundary</w:t>
       </w:r>
-      <w:ins w:id="9091" w:author="Claude" w:date="2026-10-08T22:18:30Z">
-        <w:r>
-          <w:t xml:space="preserve">. The 48 h medium renewal used in the immersion tests was not modeled explicitly; instead, dissolved oxygen was assumed to be </w:t>
-        </w:r>
-      </w:ins>
-      <w:ins w:id="9092" w:author="Claude" w:date="2026-10-08T22:18:30Z">
-        <w:r>
-          <w:t>continuously replenished at the electrolyte–air interface</w:t>
-        </w:r>
-      </w:ins>
-      <w:ins w:id="9093" w:author="Claude" w:date="2026-10-08T22:18:30Z">
-        <w:r>
-          <w:t xml:space="preserve"> and </w:t>
-        </w:r>
-      </w:ins>
-      <w:ins w:id="9094" w:author="Claude" w:date="2026-10-08T22:18:30Z">
-        <w:r>
-          <w:t>no natural convection was considered (static conditions)</w:t>
-        </w:r>
-      </w:ins>
+      <w:r>
+        <w:t xml:space="preserve">. The </w:t>
+      </w:r>
+      <w:proofErr w:type="gramStart"/>
+      <w:r>
+        <w:t>48 h</w:t>
+      </w:r>
+      <w:proofErr w:type="gramEnd"/>
+      <w:r>
+        <w:t xml:space="preserve"> medium renewal used in the immersion tests was not modeled explicitly; instead, dissolved oxygen was assumed to be </w:t>
+      </w:r>
+      <w:r>
+        <w:lastRenderedPageBreak/>
+        <w:t>continuously replenished at the electrolyte–air interface</w:t>
+      </w:r>
+      <w:r>
+        <w:t xml:space="preserve"> and </w:t>
+      </w:r>
+      <w:r>
+        <w:t>no natural convection was considered (static conditions)</w:t>
+      </w:r>
       <w:r>
         <w:t xml:space="preserve">. Simulations were executed in parallel using </w:t>
       </w:r>
@@ -9613,16 +9231,9 @@
       <w:r>
         <w:t xml:space="preserve">normalized </w:t>
       </w:r>
-      <w:del w:id="9090" w:author="Claude" w:date="2026-10-08T22:18:30Z">
-        <w:r>
-          <w:delText xml:space="preserve">film</w:delText>
-        </w:r>
-      </w:del>
-      <w:ins w:id="9089" w:author="Claude" w:date="2026-10-08T22:18:30Z">
-        <w:r>
-          <w:t>corrosion-product</w:t>
-        </w:r>
-      </w:ins>
+      <w:r>
+        <w:t>corrosion-product</w:t>
+      </w:r>
       <w:r>
         <w:t xml:space="preserve"> saturation</w:t>
       </w:r>
@@ -9648,15 +9259,7 @@
         <w:t>Equation S3</w:t>
       </w:r>
       <w:r>
-        <w:t xml:space="preserve">), while spatial distributions of oxygen concentration and corrosion-product </w:t>
-      </w:r>
-      <w:del w:id="9088" w:author="Claude" w:date="2026-10-08T22:18:30Z">
-        <w:r>
-          <w:delText xml:space="preserve">film </w:delText>
-        </w:r>
-      </w:del>
-      <w:r>
-        <w:t xml:space="preserve">fields were used to interpret degradation mechanisms.</w:t>
+        <w:t>), while spatial distributions of oxygen concentration and corrosion-product fields were used to interpret degradation mechanisms.</w:t>
       </w:r>
       <w:r>
         <w:t xml:space="preserve"> </w:t>
@@ -9732,16 +9335,6 @@
       <w:r>
         <w:t xml:space="preserve">used in the simulations. </w:t>
       </w:r>
-      <w:ins w:id="9086" w:author="Claude" w:date="2026-10-08T22:18:30Z">
-        <w:r>
-          <w:t xml:space="preserve">A global mass balance shows that the O₂ consumed at the interface is about 1/32 of the stoichiometric requirement for the Zn lost at 24 h and about 1/24 at 168 h (Section S8), so Zn recession is not stoichiometrically coupled to O₂ consumption in the present formulation.</w:t>
-        </w:r>
-      </w:ins>
-      <w:ins w:id="9087" w:author="Claude" w:date="2026-10-08T22:18:30Z">
-        <w:r>
-          <w:t xml:space="preserve"> </w:t>
-        </w:r>
-      </w:ins>
     </w:p>
     <w:p>
       <w:pPr>
@@ -9757,7 +9350,7 @@
           <w:rFonts w:cs="Times New Roman"/>
         </w:rPr>
       </w:pPr>
-      <w:bookmarkStart w:id="12" w:name="_Ref238635735"/>
+      <w:bookmarkStart w:id="15" w:name="_Ref238635735"/>
       <w:r>
         <w:rPr>
           <w:b/>
@@ -9801,7 +9394,7 @@
         </w:rPr>
         <w:fldChar w:fldCharType="end"/>
       </w:r>
-      <w:bookmarkEnd w:id="12"/>
+      <w:bookmarkEnd w:id="15"/>
       <w:r>
         <w:rPr>
           <w:b/>
@@ -13478,7 +13071,7 @@
           </w:p>
         </w:tc>
       </w:tr>
-      <w:bookmarkEnd w:id="10"/>
+      <w:bookmarkEnd w:id="12"/>
     </w:tbl>
     <w:p>
       <w:pPr>
@@ -13489,12 +13082,13 @@
         </w:rPr>
       </w:pPr>
     </w:p>
-    <w:bookmarkEnd w:id="8"/>
+    <w:bookmarkEnd w:id="10"/>
     <w:p>
       <w:pPr>
         <w:pStyle w:val="Heading2"/>
       </w:pPr>
       <w:r>
+        <w:lastRenderedPageBreak/>
         <w:t>Model Optimization and Calibration</w:t>
       </w:r>
     </w:p>
@@ -13820,55 +13414,15 @@
       <w:r>
         <w:t xml:space="preserve">. Each parameter was varied </w:t>
       </w:r>
-      <w:del w:id="9104" w:author="Claude" w:date="2026-10-08T22:18:30Z">
-        <w:r>
-          <w:delText xml:space="preserve">across</w:delText>
-        </w:r>
-      </w:del>
-      <w:ins w:id="9103" w:author="Claude" w:date="2026-10-08T22:18:30Z">
-        <w:r>
-          <w:t xml:space="preserve">above</w:t>
-        </w:r>
-      </w:ins>
-      <w:r>
-        <w:t xml:space="preserve"> </w:t>
-      </w:r>
-      <w:del w:id="9102" w:author="Claude" w:date="2026-10-08T22:18:30Z">
-        <w:r>
-          <w:delText xml:space="preserve">representative</w:delText>
-        </w:r>
-      </w:del>
-      <w:ins w:id="9101" w:author="Claude" w:date="2026-10-08T22:18:30Z">
-        <w:r>
-          <w:t xml:space="preserve">and below the baseline</w:t>
-        </w:r>
-      </w:ins>
+      <w:r>
+        <w:t>above and below the baseline</w:t>
+      </w:r>
       <w:r>
         <w:t xml:space="preserve"> values while the remaining parameters were held constant. The resulting changes in mass loss, corrosion-</w:t>
       </w:r>
-      <w:del w:id="9100" w:author="Claude" w:date="2026-10-08T22:18:30Z">
-        <w:r>
-          <w:delText xml:space="preserve">film</w:delText>
-        </w:r>
-      </w:del>
-      <w:ins w:id="9099" w:author="Claude" w:date="2026-10-08T22:18:30Z">
-        <w:r>
-          <w:t xml:space="preserve">product</w:t>
-        </w:r>
-      </w:ins>
-      <w:r>
-        <w:t xml:space="preserve"> </w:t>
-      </w:r>
-      <w:del w:id="9098" w:author="Claude" w:date="2026-10-08T22:18:30Z">
-        <w:r>
-          <w:delText xml:space="preserve">coverage</w:delText>
-        </w:r>
-      </w:del>
-      <w:ins w:id="9097" w:author="Claude" w:date="2026-10-08T22:18:30Z">
-        <w:r>
-          <w:t xml:space="preserve">saturation (F/Fₘₐₓ)</w:t>
-        </w:r>
-      </w:ins>
+      <w:r>
+        <w:t>product saturation (F/Fₘₐₓ)</w:t>
+      </w:r>
       <w:r>
         <w:t xml:space="preserve">, and interfacial oxygen concentration were analyzed to </w:t>
       </w:r>
@@ -13878,18 +13432,8 @@
       <w:r>
         <w:t xml:space="preserve"> the roles of passivation, </w:t>
       </w:r>
-      <w:del w:id="9096" w:author="Claude" w:date="2026-10-08T22:18:30Z">
-        <w:r>
-          <w:delText xml:space="preserve">film</w:delText>
-        </w:r>
-      </w:del>
-      <w:ins w:id="9095" w:author="Claude" w:date="2026-10-08T22:18:30Z">
-        <w:r>
-          <w:t xml:space="preserve">corrosion-product</w:t>
-        </w:r>
-      </w:ins>
-      <w:r>
-        <w:t xml:space="preserve"> </w:t>
+      <w:r>
+        <w:t xml:space="preserve">corrosion-product </w:t>
       </w:r>
       <w:r>
         <w:t>dissolution, and oxygen-reduction kinetics in governing Zn degradation behavior.</w:t>
@@ -14168,6 +13712,7 @@
         <w:t xml:space="preserve"> To quantify </w:t>
       </w:r>
       <w:r>
+        <w:lastRenderedPageBreak/>
         <w:t>geometry-dependent degradation, spatial distributions of oxygen concentration, corrosion-product accumulation, and interface recession were analyzed throughout the simulation. Cross-sectional profiles extracted from representative straight-strut and crown regions were used to evaluate local penetration depth and degradation heterogeneity.</w:t>
       </w:r>
     </w:p>
@@ -14201,7 +13746,7 @@
           <w:rFonts w:cs="Times New Roman"/>
         </w:rPr>
       </w:pPr>
-      <w:bookmarkStart w:id="13" w:name="fig:gsa"/>
+      <w:bookmarkStart w:id="16" w:name="fig:gsa"/>
       <w:r>
         <w:rPr>
           <w:rFonts w:cs="Times New Roman"/>
@@ -14390,36 +13935,12 @@
         </w:rPr>
         <w:t xml:space="preserve">effective </w:t>
       </w:r>
-      <w:del w:id="9110" w:author="Claude" w:date="2026-10-08T22:18:30Z">
-        <w:r>
-          <w:rPr>
-            <w:rFonts w:cs="Times New Roman"/>
-          </w:rPr>
-          <w:delText xml:space="preserve">film</w:delText>
-        </w:r>
-      </w:del>
-      <w:ins w:id="9109" w:author="Claude" w:date="2026-10-08T22:18:30Z">
-        <w:r>
-          <w:rPr>
-            <w:rFonts w:cs="Times New Roman"/>
-          </w:rPr>
-          <w:t xml:space="preserve">corrosion</w:t>
-        </w:r>
-      </w:ins>
-      <w:r>
-        <w:rPr>
-          <w:rFonts w:cs="Times New Roman"/>
-        </w:rPr>
-        <w:t xml:space="preserve">-</w:t>
-      </w:r>
-      <w:ins w:id="9108" w:author="Claude" w:date="2026-10-08T22:18:30Z">
-        <w:r>
-          <w:rPr>
-            <w:rFonts w:cs="Times New Roman"/>
-          </w:rPr>
-          <w:t xml:space="preserve">product </w:t>
-        </w:r>
-      </w:ins>
+      <w:r>
+        <w:rPr>
+          <w:rFonts w:cs="Times New Roman"/>
+        </w:rPr>
+        <w:t xml:space="preserve">corrosion-product </w:t>
+      </w:r>
       <w:r>
         <w:rPr>
           <w:rFonts w:cs="Times New Roman"/>
@@ -14541,36 +14062,24 @@
         </w:rPr>
         <w:t xml:space="preserve">effective </w:t>
       </w:r>
-      <w:del w:id="9107" w:author="Claude" w:date="2026-10-08T22:18:30Z">
-        <w:r>
-          <w:rPr>
-            <w:rFonts w:cs="Times New Roman"/>
-          </w:rPr>
-          <w:delText xml:space="preserve">film</w:delText>
-        </w:r>
-      </w:del>
-      <w:ins w:id="9106" w:author="Claude" w:date="2026-10-08T22:18:30Z">
-        <w:r>
-          <w:rPr>
-            <w:rFonts w:cs="Times New Roman"/>
-          </w:rPr>
-          <w:t xml:space="preserve">corrosion</w:t>
-        </w:r>
-      </w:ins>
-      <w:r>
-        <w:rPr>
-          <w:rFonts w:cs="Times New Roman"/>
-        </w:rPr>
-        <w:t xml:space="preserve">-</w:t>
-      </w:r>
-      <w:ins w:id="9105" w:author="Claude" w:date="2026-10-08T22:18:30Z">
-        <w:r>
-          <w:rPr>
-            <w:rFonts w:cs="Times New Roman"/>
-          </w:rPr>
-          <w:t xml:space="preserve">product </w:t>
-        </w:r>
-      </w:ins>
+      <w:r>
+        <w:rPr>
+          <w:rFonts w:cs="Times New Roman"/>
+        </w:rPr>
+        <w:t>corrosion</w:t>
+      </w:r>
+      <w:r>
+        <w:rPr>
+          <w:rFonts w:cs="Times New Roman"/>
+        </w:rPr>
+        <w:t>-</w:t>
+      </w:r>
+      <w:r>
+        <w:rPr>
+          <w:rFonts w:cs="Times New Roman"/>
+        </w:rPr>
+        <w:t xml:space="preserve">product </w:t>
+      </w:r>
       <w:r>
         <w:rPr>
           <w:rFonts w:cs="Times New Roman"/>
@@ -15257,21 +14766,8 @@
         <w:t>4</w:t>
       </w:r>
       <w:r>
-        <w:t xml:space="preserve">2% against the calibration dataset. These results show that the proposed three-parameter framework can closely reproduce the calibration measurements. The combination of low calibration error and rapid convergence supports the framework’s potential as a </w:t>
-      </w:r>
-      <w:del w:id="9112" w:author="Claude" w:date="2026-10-08T22:18:30Z">
-        <w:r>
-          <w:delText xml:space="preserve">computationally tractable </w:delText>
-        </w:r>
-      </w:del>
-      <w:r>
-        <w:t xml:space="preserve">basis for predictive Zn biodegradation modeling, subject to independent validation.</w:t>
-      </w:r>
-      <w:ins w:id="9111" w:author="Claude" w:date="2026-10-08T22:18:30Z">
-        <w:r>
-          <w:t xml:space="preserve"> Calibration remained computationally tractable because only three parameters were calibrated on a coarse mesh, at about 2 h per 3D simulation (Table S4 in the Supplementary Information).</w:t>
-        </w:r>
-      </w:ins>
+        <w:t>2% against the calibration dataset. These results show that the proposed three-parameter framework can closely reproduce the calibration measurements. The combination of low calibration error and rapid convergence supports the framework’s potential as a basis for predictive Zn biodegradation modeling, subject to independent validation.</w:t>
+      </w:r>
     </w:p>
     <w:p>
       <w:pPr>
@@ -15289,6 +14785,7 @@
         <w:rPr>
           <w:noProof/>
         </w:rPr>
+        <w:lastRenderedPageBreak/>
         <w:drawing>
           <wp:inline distT="0" distB="0" distL="0" distR="0" wp14:anchorId="36BA34D6" wp14:editId="69364FA5">
             <wp:extent cx="5760720" cy="2543694"/>
@@ -15336,7 +14833,7 @@
       <w:pPr>
         <w:pStyle w:val="Captions"/>
       </w:pPr>
-      <w:bookmarkStart w:id="14" w:name="_Ref239754266"/>
+      <w:bookmarkStart w:id="17" w:name="_Ref239754266"/>
       <w:r>
         <w:rPr>
           <w:b/>
@@ -15394,7 +14891,7 @@
         </w:rPr>
         <w:fldChar w:fldCharType="end"/>
       </w:r>
-      <w:bookmarkEnd w:id="14"/>
+      <w:bookmarkEnd w:id="17"/>
       <w:r>
         <w:rPr>
           <w:b/>
@@ -15431,8 +14928,8 @@
           <w:i/>
         </w:rPr>
       </w:pPr>
-      <w:bookmarkStart w:id="15" w:name="_Ref238636197"/>
-      <w:bookmarkStart w:id="16" w:name="tab:optim_params"/>
+      <w:bookmarkStart w:id="18" w:name="_Ref238636197"/>
+      <w:bookmarkStart w:id="19" w:name="tab:optim_params"/>
       <w:r>
         <w:rPr>
           <w:b/>
@@ -15476,7 +14973,7 @@
         </w:rPr>
         <w:fldChar w:fldCharType="end"/>
       </w:r>
-      <w:bookmarkEnd w:id="15"/>
+      <w:bookmarkEnd w:id="18"/>
       <w:r>
         <w:rPr>
           <w:b/>
@@ -15877,11 +15374,149 @@
                 <w:szCs w:val="22"/>
               </w:rPr>
             </w:pPr>
-            <w:ins w:id="9253" w:author="Claude" w:date="2026-10-08T22:18:30Z">
-              <w:r>
-                <w:t>L² mol⁻² h⁻¹</w:t>
-              </w:r>
-            </w:ins>
+            <m:oMathPara>
+              <m:oMath>
+                <m:r>
+                  <w:rPr>
+                    <w:rFonts w:ascii="Cambria Math" w:hAnsi="Cambria Math" w:cs="Times New Roman"/>
+                    <w:sz w:val="22"/>
+                    <w:szCs w:val="22"/>
+                  </w:rPr>
+                  <m:t>m</m:t>
+                </m:r>
+                <m:sSup>
+                  <m:sSupPr>
+                    <m:ctrlPr>
+                      <w:rPr>
+                        <w:rFonts w:ascii="Cambria Math" w:hAnsi="Cambria Math" w:cs="Times New Roman"/>
+                        <w:sz w:val="22"/>
+                        <w:szCs w:val="22"/>
+                      </w:rPr>
+                    </m:ctrlPr>
+                  </m:sSupPr>
+                  <m:e>
+                    <m:r>
+                      <w:rPr>
+                        <w:rFonts w:ascii="Cambria Math" w:hAnsi="Cambria Math" w:cs="Times New Roman"/>
+                        <w:sz w:val="22"/>
+                        <w:szCs w:val="22"/>
+                      </w:rPr>
+                      <m:t>m</m:t>
+                    </m:r>
+                  </m:e>
+                  <m:sup>
+                    <m:r>
+                      <w:rPr>
+                        <w:rFonts w:ascii="Cambria Math" w:hAnsi="Cambria Math" w:cs="Times New Roman"/>
+                        <w:sz w:val="22"/>
+                        <w:szCs w:val="22"/>
+                      </w:rPr>
+                      <m:t>6</m:t>
+                    </m:r>
+                  </m:sup>
+                </m:sSup>
+                <m:r>
+                  <w:rPr>
+                    <w:rFonts w:ascii="Cambria Math" w:hAnsi="Cambria Math" w:cs="Times New Roman"/>
+                    <w:sz w:val="22"/>
+                    <w:szCs w:val="22"/>
+                  </w:rPr>
+                  <m:t> </m:t>
+                </m:r>
+                <m:sSup>
+                  <m:sSupPr>
+                    <m:ctrlPr>
+                      <w:rPr>
+                        <w:rFonts w:ascii="Cambria Math" w:hAnsi="Cambria Math" w:cs="Times New Roman"/>
+                        <w:sz w:val="22"/>
+                        <w:szCs w:val="22"/>
+                      </w:rPr>
+                    </m:ctrlPr>
+                  </m:sSupPr>
+                  <m:e>
+                    <m:r>
+                      <w:rPr>
+                        <w:rFonts w:ascii="Cambria Math" w:hAnsi="Cambria Math" w:cs="Times New Roman"/>
+                        <w:sz w:val="22"/>
+                        <w:szCs w:val="22"/>
+                      </w:rPr>
+                      <m:t>g</m:t>
+                    </m:r>
+                  </m:e>
+                  <m:sup>
+                    <m:r>
+                      <m:rPr>
+                        <m:sty m:val="p"/>
+                      </m:rPr>
+                      <w:rPr>
+                        <w:rFonts w:ascii="Cambria Math" w:hAnsi="Cambria Math" w:cs="Times New Roman"/>
+                        <w:sz w:val="22"/>
+                        <w:szCs w:val="22"/>
+                      </w:rPr>
+                      <m:t>-</m:t>
+                    </m:r>
+                    <m:r>
+                      <w:rPr>
+                        <w:rFonts w:ascii="Cambria Math" w:hAnsi="Cambria Math" w:cs="Times New Roman"/>
+                        <w:sz w:val="22"/>
+                        <w:szCs w:val="22"/>
+                      </w:rPr>
+                      <m:t>2</m:t>
+                    </m:r>
+                  </m:sup>
+                </m:sSup>
+                <m:r>
+                  <w:rPr>
+                    <w:rFonts w:ascii="Cambria Math" w:hAnsi="Cambria Math" w:cs="Times New Roman"/>
+                    <w:sz w:val="22"/>
+                    <w:szCs w:val="22"/>
+                  </w:rPr>
+                  <m:t> </m:t>
+                </m:r>
+                <m:sSup>
+                  <m:sSupPr>
+                    <m:ctrlPr>
+                      <w:rPr>
+                        <w:rFonts w:ascii="Cambria Math" w:hAnsi="Cambria Math" w:cs="Times New Roman"/>
+                        <w:sz w:val="22"/>
+                        <w:szCs w:val="22"/>
+                      </w:rPr>
+                    </m:ctrlPr>
+                  </m:sSupPr>
+                  <m:e>
+                    <m:r>
+                      <w:rPr>
+                        <w:rFonts w:ascii="Cambria Math" w:hAnsi="Cambria Math" w:cs="Times New Roman"/>
+                        <w:sz w:val="22"/>
+                        <w:szCs w:val="22"/>
+                      </w:rPr>
+                      <m:t>h</m:t>
+                    </m:r>
+                  </m:e>
+                  <m:sup>
+                    <m:r>
+                      <m:rPr>
+                        <m:sty m:val="p"/>
+                      </m:rPr>
+                      <w:rPr>
+                        <w:rFonts w:ascii="Cambria Math" w:hAnsi="Cambria Math" w:cs="Times New Roman"/>
+                        <w:sz w:val="22"/>
+                        <w:szCs w:val="22"/>
+                      </w:rPr>
+                      <m:t>-</m:t>
+                    </m:r>
+                    <m:r>
+                      <w:rPr>
+                        <w:rFonts w:ascii="Cambria Math" w:hAnsi="Cambria Math" w:cs="Times New Roman"/>
+                        <w:sz w:val="22"/>
+                        <w:szCs w:val="22"/>
+                      </w:rPr>
+                      <m:t>1</m:t>
+                    </m:r>
+                  </m:sup>
+                </m:sSup>
+              </m:oMath>
+            </m:oMathPara>
           </w:p>
         </w:tc>
         <w:tc>
@@ -15906,20 +15541,6 @@
                 <w:szCs w:val="22"/>
               </w:rPr>
               <w:t>[5, 100]</w:t>
-            </w:r>
-            <w:r>
-              <w:rPr>
-                <w:rFonts w:cs="Times New Roman"/>
-                <w:sz w:val="22"/>
-                <w:szCs w:val="22"/>
-              </w:rPr>
-            </w:r>
-            <w:r>
-              <w:rPr>
-                <w:rFonts w:cs="Times New Roman"/>
-                <w:sz w:val="22"/>
-                <w:szCs w:val="22"/>
-              </w:rPr>
             </w:r>
           </w:p>
         </w:tc>
@@ -16102,34 +15723,6 @@
               </w:rPr>
               <w:t>[0.05, 5.0]</w:t>
             </w:r>
-            <w:r>
-              <w:rPr>
-                <w:rFonts w:cs="Times New Roman"/>
-                <w:sz w:val="22"/>
-                <w:szCs w:val="22"/>
-              </w:rPr>
-            </w:r>
-            <w:r>
-              <w:rPr>
-                <w:rFonts w:cs="Times New Roman"/>
-                <w:sz w:val="22"/>
-                <w:szCs w:val="22"/>
-              </w:rPr>
-            </w:r>
-            <w:r>
-              <w:rPr>
-                <w:rFonts w:cs="Times New Roman"/>
-                <w:sz w:val="22"/>
-                <w:szCs w:val="22"/>
-              </w:rPr>
-            </w:r>
-            <w:r>
-              <w:rPr>
-                <w:rFonts w:cs="Times New Roman"/>
-                <w:sz w:val="22"/>
-                <w:szCs w:val="22"/>
-              </w:rPr>
-            </w:r>
           </w:p>
         </w:tc>
         <w:tc>
@@ -16158,105 +15751,7 @@
           </w:p>
         </w:tc>
       </w:tr>
-      <w:tr>
-        <w:trPr>
-          <w:cantSplit/>
-          <w:ins w:id="20004" w:author="Claude" w:date="2026-10-08T22:18:30Z"/>
-        </w:trPr>
-        <w:tc>
-          <w:tcPr>
-            <w:tcW w:w="896" w:type="pct"/>
-          </w:tcPr>
-          <w:p>
-            <w:pPr>
-              <w:pStyle w:val="Compact"/>
-              <w:spacing w:line="240" w:lineRule="auto"/>
-              <w:jc w:val="left"/>
-              <w:rPr>
-                <w:ins w:id="20006" w:author="Claude" w:date="2026-10-08T22:18:30Z"/>
-                <w:rFonts w:cs="Times New Roman"/>
-                <w:sz w:val="22"/>
-                <w:szCs w:val="22"/>
-              </w:rPr>
-            </w:pPr>
-            <w:ins w:id="20005" w:author="Claude" w:date="2026-10-08T22:18:30Z">
-              <w:r>
-                <w:t>M(O₂)</w:t>
-              </w:r>
-            </w:ins>
-          </w:p>
-        </w:tc>
-        <w:tc>
-          <w:tcPr>
-            <w:tcW w:w="1227" w:type="pct"/>
-          </w:tcPr>
-          <w:p>
-            <w:pPr>
-              <w:pStyle w:val="Compact"/>
-              <w:spacing w:line="240" w:lineRule="auto"/>
-              <w:jc w:val="left"/>
-              <w:rPr>
-                <w:ins w:id="20008" w:author="Claude" w:date="2026-10-08T22:18:30Z"/>
-                <w:rFonts w:cs="Times New Roman"/>
-                <w:sz w:val="22"/>
-                <w:szCs w:val="22"/>
-              </w:rPr>
-            </w:pPr>
-            <w:ins w:id="20007" w:author="Claude" w:date="2026-10-08T22:18:30Z">
-              <w:r>
-                <w:t>g mol⁻¹</w:t>
-              </w:r>
-            </w:ins>
-          </w:p>
-        </w:tc>
-        <w:tc>
-          <w:tcPr>
-            <w:tcW w:w="1474" w:type="pct"/>
-          </w:tcPr>
-          <w:p>
-            <w:pPr>
-              <w:pStyle w:val="Compact"/>
-              <w:spacing w:line="240" w:lineRule="auto"/>
-              <w:jc w:val="left"/>
-              <w:rPr>
-                <w:ins w:id="20010" w:author="Claude" w:date="2026-10-08T22:18:30Z"/>
-                <w:rFonts w:cs="Times New Roman"/>
-                <w:sz w:val="22"/>
-                <w:szCs w:val="22"/>
-              </w:rPr>
-            </w:pPr>
-            <w:ins w:id="20009" w:author="Claude" w:date="2026-10-08T22:18:30Z">
-              <w:r>
-                <w:t>fixed</w:t>
-              </w:r>
-            </w:ins>
-          </w:p>
-        </w:tc>
-        <w:tc>
-          <w:tcPr>
-            <w:tcW w:w="1403" w:type="pct"/>
-          </w:tcPr>
-          <w:p>
-            <w:pPr>
-              <w:pStyle w:val="Compact"/>
-              <w:spacing w:line="240" w:lineRule="auto"/>
-              <w:jc w:val="left"/>
-              <w:rPr>
-                <w:ins w:id="20012" w:author="Claude" w:date="2026-10-08T22:18:30Z"/>
-                <w:rFonts w:cs="Times New Roman"/>
-                <w:sz w:val="22"/>
-                <w:szCs w:val="22"/>
-              </w:rPr>
-            </w:pPr>
-            <w:ins w:id="20011" w:author="Claude" w:date="2026-10-08T22:18:30Z">
-              <w:r>
-                <w:t>32</w:t>
-              </w:r>
-            </w:ins>
-          </w:p>
-        </w:tc>
-      </w:tr>
-      <w:bookmarkEnd w:id="16"/>
+      <w:bookmarkEnd w:id="19"/>
     </w:tbl>
     <w:p>
       <w:pPr>
@@ -16889,31 +16384,8 @@
       <w:r>
         <w:t xml:space="preserve">The associated </w:t>
       </w:r>
-      <w:del w:id="9145" w:author="Claude" w:date="2026-10-08T22:18:30Z">
-        <w:r>
-          <w:delText xml:space="preserve">film</w:delText>
-        </w:r>
-      </w:del>
-      <w:ins w:id="9144" w:author="Claude" w:date="2026-10-08T22:18:30Z">
-        <w:r>
-          <w:t xml:space="preserve">corrosion</w:t>
-        </w:r>
-      </w:ins>
-      <w:r>
-        <w:t xml:space="preserve">-</w:t>
-      </w:r>
-      <w:del w:id="9143" w:author="Claude" w:date="2026-10-08T22:18:30Z">
-        <w:r>
-          <w:delText xml:space="preserve">coverage</w:delText>
-        </w:r>
-      </w:del>
-      <w:ins w:id="9142" w:author="Claude" w:date="2026-10-08T22:18:30Z">
-        <w:r>
-          <w:t xml:space="preserve">product saturation</w:t>
-        </w:r>
-      </w:ins>
-      <w:r>
-        <w:t xml:space="preserve"> </w:t>
+      <w:r>
+        <w:t xml:space="preserve">corrosion-product saturation </w:t>
       </w:r>
       <w:r>
         <w:t>responses in</w:t>
@@ -17035,66 +16507,25 @@
       <w:r>
         <w:t xml:space="preserve"> into corrosion products through the </w:t>
       </w:r>
-      <w:del w:id="9141" w:author="Claude" w:date="2026-10-08T22:18:30Z">
-        <w:r>
-          <w:delText xml:space="preserve">film</w:delText>
-        </w:r>
-      </w:del>
-      <w:ins w:id="9140" w:author="Claude" w:date="2026-10-08T22:18:30Z">
-        <w:r>
-          <w:t xml:space="preserve">corrosion</w:t>
-        </w:r>
-      </w:ins>
-      <w:r>
-        <w:t xml:space="preserve">-</w:t>
-      </w:r>
-      <w:ins w:id="9139" w:author="Claude" w:date="2026-10-08T22:18:30Z">
-        <w:r>
-          <w:t xml:space="preserve">product </w:t>
-        </w:r>
-      </w:ins>
+      <w:r>
+        <w:t xml:space="preserve">corrosion-product </w:t>
+      </w:r>
       <w:r>
         <w:t xml:space="preserve">growth term, resulting in faster </w:t>
       </w:r>
-      <w:del w:id="9138" w:author="Claude" w:date="2026-10-08T22:18:30Z">
-        <w:r>
-          <w:delText xml:space="preserve">film</w:delText>
-        </w:r>
-      </w:del>
-      <w:ins w:id="9137" w:author="Claude" w:date="2026-10-08T22:18:30Z">
-        <w:r>
-          <w:t xml:space="preserve">corrosion-product</w:t>
-        </w:r>
-      </w:ins>
-      <w:r>
-        <w:t xml:space="preserve"> </w:t>
+      <w:r>
+        <w:t xml:space="preserve">corrosion-product </w:t>
       </w:r>
       <w:r>
         <w:t xml:space="preserve">accumulation and greater </w:t>
       </w:r>
-      <w:del w:id="9136" w:author="Claude" w:date="2026-10-08T22:18:30Z">
-        <w:r>
-          <w:delText xml:space="preserve">surface</w:delText>
-        </w:r>
-      </w:del>
-      <w:ins w:id="9135" w:author="Claude" w:date="2026-10-08T22:18:30Z">
-        <w:r>
-          <w:t xml:space="preserve">corrosion-product</w:t>
-        </w:r>
-      </w:ins>
-      <w:r>
-        <w:t xml:space="preserve"> </w:t>
-      </w:r>
-      <w:del w:id="9134" w:author="Claude" w:date="2026-10-08T22:18:30Z">
-        <w:r>
-          <w:delText xml:space="preserve">coverage</w:delText>
-        </w:r>
-      </w:del>
-      <w:ins w:id="9133" w:author="Claude" w:date="2026-10-08T22:18:30Z">
-        <w:r>
-          <w:t xml:space="preserve">saturation</w:t>
-        </w:r>
-      </w:ins>
+      <w:r>
+        <w:t xml:space="preserve">corrosion-product </w:t>
+      </w:r>
+      <w:r>
+        <w:lastRenderedPageBreak/>
+        <w:t>saturation</w:t>
+      </w:r>
       <w:r>
         <w:t xml:space="preserve"> </w:t>
       </w:r>
@@ -17210,61 +16641,21 @@
       <w:r>
         <w:t xml:space="preserve">enhanced the </w:t>
       </w:r>
-      <w:del w:id="9132" w:author="Claude" w:date="2026-10-08T22:18:30Z">
-        <w:r>
-          <w:delText xml:space="preserve">film</w:delText>
-        </w:r>
-      </w:del>
-      <w:ins w:id="9131" w:author="Claude" w:date="2026-10-08T22:18:30Z">
-        <w:r>
-          <w:t xml:space="preserve">corrosion-product</w:t>
-        </w:r>
-      </w:ins>
-      <w:r>
-        <w:t xml:space="preserve"> </w:t>
+      <w:r>
+        <w:t xml:space="preserve">corrosion-product </w:t>
       </w:r>
       <w:r>
         <w:t xml:space="preserve">dissolution term, reducing </w:t>
       </w:r>
-      <w:del w:id="9130" w:author="Claude" w:date="2026-10-08T22:18:30Z">
-        <w:r>
-          <w:delText xml:space="preserve">film</w:delText>
-        </w:r>
-      </w:del>
-      <w:ins w:id="9129" w:author="Claude" w:date="2026-10-08T22:18:30Z">
-        <w:r>
-          <w:t xml:space="preserve">corrosion-product</w:t>
-        </w:r>
-      </w:ins>
-      <w:r>
-        <w:t xml:space="preserve"> </w:t>
-      </w:r>
-      <w:r>
-        <w:t xml:space="preserve">retention and leading to lower </w:t>
-      </w:r>
-      <w:del w:id="9128" w:author="Claude" w:date="2026-10-08T22:18:30Z">
-        <w:r>
-          <w:delText xml:space="preserve">surface</w:delText>
-        </w:r>
-      </w:del>
-      <w:ins w:id="9127" w:author="Claude" w:date="2026-10-08T22:18:30Z">
-        <w:r>
-          <w:t xml:space="preserve">corrosion-product</w:t>
-        </w:r>
-      </w:ins>
-      <w:r>
-        <w:t xml:space="preserve"> </w:t>
-      </w:r>
-      <w:del w:id="9126" w:author="Claude" w:date="2026-10-08T22:18:30Z">
-        <w:r>
-          <w:delText xml:space="preserve">coverage</w:delText>
-        </w:r>
-      </w:del>
-      <w:ins w:id="9125" w:author="Claude" w:date="2026-10-08T22:18:30Z">
-        <w:r>
-          <w:t xml:space="preserve">saturation</w:t>
-        </w:r>
-      </w:ins>
+      <w:r>
+        <w:t>corrosion-product</w:t>
+      </w:r>
+      <w:r>
+        <w:t xml:space="preserve"> retention and leading to lower </w:t>
+      </w:r>
+      <w:r>
+        <w:t>corrosion-product saturation</w:t>
+      </w:r>
       <w:r>
         <w:t xml:space="preserve"> </w:t>
       </w:r>
@@ -17387,113 +16778,83 @@
       <w:r>
         <w:t xml:space="preserve">however, caused only modest changes in </w:t>
       </w:r>
-      <w:del w:id="9124" w:author="Claude" w:date="2026-10-08T22:18:30Z">
-        <w:r>
-          <w:delText xml:space="preserve">film</w:delText>
-        </w:r>
-      </w:del>
-      <w:ins w:id="9123" w:author="Claude" w:date="2026-10-08T22:18:30Z">
-        <w:r>
-          <w:t xml:space="preserve">corrosion-product</w:t>
-        </w:r>
-      </w:ins>
+      <w:r>
+        <w:t>corrosion-product saturation</w:t>
+      </w:r>
+      <w:r>
+        <w:t xml:space="preserve"> (</w:t>
+      </w:r>
+      <w:r>
+        <w:rPr>
+          <w:rFonts w:cs="Times New Roman"/>
+          <w:b/>
+          <w:bCs/>
+        </w:rPr>
+        <w:fldChar w:fldCharType="begin"/>
+      </w:r>
+      <w:r>
+        <w:rPr>
+          <w:rFonts w:cs="Times New Roman"/>
+          <w:b/>
+          <w:bCs/>
+        </w:rPr>
+        <w:instrText xml:space="preserve"> REF _Ref239754180 \h  \* MERGEFORMAT </w:instrText>
+      </w:r>
+      <w:r>
+        <w:rPr>
+          <w:rFonts w:cs="Times New Roman"/>
+          <w:b/>
+          <w:bCs/>
+        </w:rPr>
+      </w:r>
+      <w:r>
+        <w:rPr>
+          <w:rFonts w:cs="Times New Roman"/>
+          <w:b/>
+          <w:bCs/>
+        </w:rPr>
+        <w:fldChar w:fldCharType="separate"/>
+      </w:r>
+      <w:r>
+        <w:rPr>
+          <w:b/>
+          <w:bCs/>
+        </w:rPr>
+        <w:t xml:space="preserve">Figure </w:t>
+      </w:r>
+      <w:r>
+        <w:rPr>
+          <w:b/>
+          <w:bCs/>
+        </w:rPr>
+        <w:t>4</w:t>
+      </w:r>
+      <w:r>
+        <w:rPr>
+          <w:rFonts w:cs="Times New Roman"/>
+          <w:b/>
+          <w:bCs/>
+        </w:rPr>
+        <w:fldChar w:fldCharType="end"/>
+      </w:r>
+      <w:r>
+        <w:rPr>
+          <w:b/>
+          <w:bCs/>
+        </w:rPr>
+        <w:t>f)</w:t>
+      </w:r>
+      <w:r>
+        <w:t>,</w:t>
+      </w:r>
       <w:r>
         <w:t xml:space="preserve"> </w:t>
       </w:r>
-      <w:del w:id="9122" w:author="Claude" w:date="2026-10-08T22:18:30Z">
-        <w:r>
-          <w:delText xml:space="preserve">coverage</w:delText>
-        </w:r>
-      </w:del>
-      <w:ins w:id="9121" w:author="Claude" w:date="2026-10-08T22:18:30Z">
-        <w:r>
-          <w:t xml:space="preserve">saturation</w:t>
-        </w:r>
-      </w:ins>
-      <w:r>
-        <w:t xml:space="preserve"> (</w:t>
-      </w:r>
-      <w:r>
-        <w:rPr>
-          <w:rFonts w:cs="Times New Roman"/>
-          <w:b/>
-          <w:bCs/>
-        </w:rPr>
-        <w:fldChar w:fldCharType="begin"/>
-      </w:r>
-      <w:r>
-        <w:rPr>
-          <w:rFonts w:cs="Times New Roman"/>
-          <w:b/>
-          <w:bCs/>
-        </w:rPr>
-        <w:instrText xml:space="preserve"> REF _Ref239754180 \h  \* MERGEFORMAT </w:instrText>
-      </w:r>
-      <w:r>
-        <w:rPr>
-          <w:rFonts w:cs="Times New Roman"/>
-          <w:b/>
-          <w:bCs/>
-        </w:rPr>
-      </w:r>
-      <w:r>
-        <w:rPr>
-          <w:rFonts w:cs="Times New Roman"/>
-          <w:b/>
-          <w:bCs/>
-        </w:rPr>
-        <w:fldChar w:fldCharType="separate"/>
-      </w:r>
-      <w:r>
-        <w:rPr>
-          <w:b/>
-          <w:bCs/>
-        </w:rPr>
-        <w:t xml:space="preserve">Figure </w:t>
-      </w:r>
-      <w:r>
-        <w:rPr>
-          <w:b/>
-          <w:bCs/>
-        </w:rPr>
-        <w:t>4</w:t>
-      </w:r>
-      <w:r>
-        <w:rPr>
-          <w:rFonts w:cs="Times New Roman"/>
-          <w:b/>
-          <w:bCs/>
-        </w:rPr>
-        <w:fldChar w:fldCharType="end"/>
-      </w:r>
-      <w:r>
-        <w:rPr>
-          <w:b/>
-          <w:bCs/>
-        </w:rPr>
-        <w:t>f)</w:t>
-      </w:r>
-      <w:r>
-        <w:t>,</w:t>
-      </w:r>
-      <w:r>
-        <w:t xml:space="preserve"> </w:t>
-      </w:r>
       <w:r>
         <w:t xml:space="preserve">because oxygen reduction influences </w:t>
       </w:r>
-      <w:del w:id="9120" w:author="Claude" w:date="2026-10-08T22:18:30Z">
-        <w:r>
-          <w:delText xml:space="preserve">film</w:delText>
-        </w:r>
-      </w:del>
-      <w:ins w:id="9119" w:author="Claude" w:date="2026-10-08T22:18:30Z">
-        <w:r>
-          <w:t xml:space="preserve">corrosion-product</w:t>
-        </w:r>
-      </w:ins>
-      <w:r>
-        <w:t xml:space="preserve"> </w:t>
+      <w:r>
+        <w:t xml:space="preserve">corrosion-product </w:t>
       </w:r>
       <w:r>
         <w:t>growth only indirectly through its effect on the</w:t>
@@ -17591,47 +16952,17 @@
       <w:r>
         <w:t xml:space="preserve">​ act directly on the competing processes of </w:t>
       </w:r>
-      <w:del w:id="9118" w:author="Claude" w:date="2026-10-08T22:18:30Z">
-        <w:r>
-          <w:delText xml:space="preserve">film</w:delText>
-        </w:r>
-      </w:del>
-      <w:ins w:id="9117" w:author="Claude" w:date="2026-10-08T22:18:30Z">
-        <w:r>
-          <w:t xml:space="preserve">corrosion-product</w:t>
-        </w:r>
-      </w:ins>
-      <w:r>
-        <w:t xml:space="preserve"> </w:t>
-      </w:r>
-      <w:r>
-        <w:t xml:space="preserve">formation and dissolution, making </w:t>
-      </w:r>
-      <w:del w:id="9116" w:author="Claude" w:date="2026-10-08T22:18:30Z">
-        <w:r>
-          <w:delText xml:space="preserve">film</w:delText>
-        </w:r>
-      </w:del>
-      <w:ins w:id="9115" w:author="Claude" w:date="2026-10-08T22:18:30Z">
-        <w:r>
-          <w:t xml:space="preserve">corrosion-product</w:t>
-        </w:r>
-      </w:ins>
-      <w:r>
-        <w:t xml:space="preserve"> </w:t>
-      </w:r>
-      <w:del w:id="9114" w:author="Claude" w:date="2026-10-08T22:18:30Z">
-        <w:r>
-          <w:delText xml:space="preserve">coverage</w:delText>
-        </w:r>
-      </w:del>
-      <w:ins w:id="9113" w:author="Claude" w:date="2026-10-08T22:18:30Z">
-        <w:r>
-          <w:t xml:space="preserve">saturation</w:t>
-        </w:r>
-      </w:ins>
-      <w:r>
-        <w:t xml:space="preserve"> substantially more sensitive to these parameters than to </w:t>
+      <w:r>
+        <w:t>corrosion-product</w:t>
+      </w:r>
+      <w:r>
+        <w:t xml:space="preserve"> formation and dissolution, making </w:t>
+      </w:r>
+      <w:r>
+        <w:t xml:space="preserve">film corrosion-product coverage saturation </w:t>
+      </w:r>
+      <w:r>
+        <w:t xml:space="preserve">substantially more sensitive to these parameters than to </w:t>
       </w:r>
       <m:oMath>
         <m:sSub>
@@ -17717,15 +17048,6 @@
         </w:rPr>
         <w:fldChar w:fldCharType="separate"/>
       </w:r>
-      <w:del w:id="9158" w:author="Claude" w:date="2026-10-08T22:18:30Z">
-        <w:r>
-          <w:rPr>
-            <w:b/>
-            <w:bCs/>
-          </w:rPr>
-          <w:delText xml:space="preserve">(</w:delText>
-        </w:r>
-      </w:del>
       <w:r>
         <w:rPr>
           <w:b/>
@@ -17766,14 +17088,6 @@
         <w:t>i</w:t>
       </w:r>
       <w:proofErr w:type="spellEnd"/>
-      <w:del w:id="9157" w:author="Claude" w:date="2026-10-08T22:18:30Z">
-        <w:r>
-          <w:rPr>
-            <w:rFonts w:cs="Times New Roman"/>
-          </w:rPr>
-          <w:delText xml:space="preserve">)</w:delText>
-        </w:r>
-      </w:del>
       <w:r>
         <w:rPr>
           <w:rFonts w:cs="Times New Roman"/>
@@ -17786,44 +17100,24 @@
         </w:rPr>
         <w:t xml:space="preserve">Conditions that promoted greater </w:t>
       </w:r>
-      <w:del w:id="9156" w:author="Claude" w:date="2026-10-08T22:18:30Z">
-        <w:r>
-          <w:rPr>
-            <w:rFonts w:cs="Times New Roman"/>
-          </w:rPr>
-          <w:delText xml:space="preserve">film</w:delText>
-        </w:r>
-      </w:del>
-      <w:ins w:id="9155" w:author="Claude" w:date="2026-10-08T22:18:30Z">
-        <w:r>
-          <w:rPr>
-            <w:rFonts w:cs="Times New Roman"/>
-          </w:rPr>
-          <w:t>corrosion-product</w:t>
-        </w:r>
-      </w:ins>
+      <w:r>
+        <w:rPr>
+          <w:rFonts w:cs="Times New Roman"/>
+        </w:rPr>
+        <w:t>corrosion-product</w:t>
+      </w:r>
       <w:r>
         <w:rPr>
           <w:rFonts w:cs="Times New Roman"/>
         </w:rPr>
         <w:t xml:space="preserve"> </w:t>
       </w:r>
-      <w:del w:id="9154" w:author="Claude" w:date="2026-10-08T22:18:30Z">
-        <w:r>
-          <w:rPr>
-            <w:rFonts w:cs="Times New Roman"/>
-          </w:rPr>
-          <w:delText xml:space="preserve">coverage</w:delText>
-        </w:r>
-      </w:del>
-      <w:ins w:id="9153" w:author="Claude" w:date="2026-10-08T22:18:30Z">
-        <w:r>
-          <w:rPr>
-            <w:rFonts w:cs="Times New Roman"/>
-          </w:rPr>
-          <w:t>saturation</w:t>
-        </w:r>
-      </w:ins>
+      <w:r>
+        <w:rPr>
+          <w:rFonts w:cs="Times New Roman"/>
+        </w:rPr>
+        <w:t>saturation</w:t>
+      </w:r>
       <w:r>
         <w:rPr>
           <w:rFonts w:cs="Times New Roman"/>
@@ -17906,49 +17200,19 @@
         <w:rPr>
           <w:rFonts w:cs="Times New Roman"/>
         </w:rPr>
-        <w:t>produced lower interfacial oxygen concentrations because the accumulated corrosion</w:t>
-      </w:r>
-      <w:del w:id="9152" w:author="Claude" w:date="2026-10-08T22:18:30Z">
-        <w:r>
-          <w:rPr>
-            <w:rFonts w:cs="Times New Roman"/>
-          </w:rPr>
-          <w:delText xml:space="preserve">-product</w:delText>
-        </w:r>
-      </w:del>
-      <w:r>
-        <w:rPr>
-          <w:rFonts w:cs="Times New Roman"/>
-        </w:rPr>
-        <w:t xml:space="preserve"> </w:t>
-      </w:r>
-      <w:del w:id="9151" w:author="Claude" w:date="2026-10-08T22:18:30Z">
-        <w:r>
-          <w:rPr>
-            <w:rFonts w:cs="Times New Roman"/>
-          </w:rPr>
-          <w:delText xml:space="preserve">layer</w:delText>
-        </w:r>
-      </w:del>
-      <w:ins w:id="9150" w:author="Claude" w:date="2026-10-08T22:18:30Z">
-        <w:r>
-          <w:rPr>
-            <w:rFonts w:cs="Times New Roman"/>
-          </w:rPr>
-          <w:t xml:space="preserve">products</w:t>
-        </w:r>
-      </w:ins>
-      <w:r>
-        <w:rPr>
-          <w:rFonts w:cs="Times New Roman"/>
-        </w:rPr>
-        <w:t xml:space="preserve"> </w:t>
-      </w:r>
-      <w:r>
-        <w:rPr>
-          <w:rFonts w:cs="Times New Roman"/>
-        </w:rPr>
-        <w:t>increased resistance to oxygen transport. Nevertheless, the strongest oxygen depletion occurred at high</w:t>
+        <w:t xml:space="preserve">produced lower interfacial oxygen concentrations because the accumulated corrosion </w:t>
+      </w:r>
+      <w:r>
+        <w:rPr>
+          <w:rFonts w:cs="Times New Roman"/>
+        </w:rPr>
+        <w:t>products</w:t>
+      </w:r>
+      <w:r>
+        <w:rPr>
+          <w:rFonts w:cs="Times New Roman"/>
+        </w:rPr>
+        <w:t xml:space="preserve"> increased resistance to oxygen transport. Nevertheless, the strongest oxygen depletion occurred at high</w:t>
       </w:r>
       <w:r>
         <w:rPr>
@@ -18067,44 +17331,24 @@
         </w:rPr>
         <w:t xml:space="preserve">where accelerated cathodic oxygen consumption reduced interfacial oxygen concentrations despite only modest changes in </w:t>
       </w:r>
-      <w:del w:id="9149" w:author="Claude" w:date="2026-10-08T22:18:30Z">
-        <w:r>
-          <w:rPr>
-            <w:rFonts w:cs="Times New Roman"/>
-          </w:rPr>
-          <w:delText xml:space="preserve">film</w:delText>
-        </w:r>
-      </w:del>
-      <w:ins w:id="9148" w:author="Claude" w:date="2026-10-08T22:18:30Z">
-        <w:r>
-          <w:rPr>
-            <w:rFonts w:cs="Times New Roman"/>
-          </w:rPr>
-          <w:t xml:space="preserve">corrosion-product</w:t>
-        </w:r>
-      </w:ins>
+      <w:r>
+        <w:rPr>
+          <w:rFonts w:cs="Times New Roman"/>
+        </w:rPr>
+        <w:t>corrosion-product</w:t>
+      </w:r>
       <w:r>
         <w:rPr>
           <w:rFonts w:cs="Times New Roman"/>
         </w:rPr>
         <w:t xml:space="preserve"> </w:t>
       </w:r>
-      <w:del w:id="9147" w:author="Claude" w:date="2026-10-08T22:18:30Z">
-        <w:r>
-          <w:rPr>
-            <w:rFonts w:cs="Times New Roman"/>
-          </w:rPr>
-          <w:delText xml:space="preserve">coverage</w:delText>
-        </w:r>
-      </w:del>
-      <w:ins w:id="9146" w:author="Claude" w:date="2026-10-08T22:18:30Z">
-        <w:r>
-          <w:rPr>
-            <w:rFonts w:cs="Times New Roman"/>
-          </w:rPr>
-          <w:t xml:space="preserve">saturation</w:t>
-        </w:r>
-      </w:ins>
+      <w:r>
+        <w:rPr>
+          <w:rFonts w:cs="Times New Roman"/>
+        </w:rPr>
+        <w:t>saturation</w:t>
+      </w:r>
       <w:r>
         <w:rPr>
           <w:rFonts w:cs="Times New Roman"/>
@@ -18250,6 +17494,7 @@
         <w:rPr>
           <w:noProof/>
         </w:rPr>
+        <w:lastRenderedPageBreak/>
         <w:drawing>
           <wp:inline distT="0" distB="0" distL="0" distR="0" wp14:anchorId="36EF7F28" wp14:editId="13A4B40B">
             <wp:extent cx="5760720" cy="4561205"/>
@@ -18300,7 +17545,7 @@
           <w:rFonts w:cs="Times New Roman"/>
         </w:rPr>
       </w:pPr>
-      <w:bookmarkStart w:id="17" w:name="_Ref239754180"/>
+      <w:bookmarkStart w:id="20" w:name="_Ref239754180"/>
       <w:r>
         <w:rPr>
           <w:b/>
@@ -18358,7 +17603,7 @@
         </w:rPr>
         <w:fldChar w:fldCharType="end"/>
       </w:r>
-      <w:bookmarkEnd w:id="17"/>
+      <w:bookmarkEnd w:id="20"/>
       <w:r>
         <w:rPr>
           <w:b/>
@@ -18369,62 +17614,28 @@
       <w:r>
         <w:t xml:space="preserve"> Local parameter sweeps of kinetic parameters. Panels (a–c) show cumulative mass loss (%), panels (d–f) show </w:t>
       </w:r>
-      <w:del w:id="9165" w:author="Claude" w:date="2026-10-08T22:18:30Z">
-        <w:r>
-          <w:delText xml:space="preserve">film</w:delText>
-        </w:r>
-      </w:del>
-      <w:ins w:id="9164" w:author="Claude" w:date="2026-10-08T22:18:30Z">
-        <w:r>
-          <w:t xml:space="preserve">the</w:t>
-        </w:r>
-      </w:ins>
+      <w:r>
+        <w:t>the</w:t>
+      </w:r>
       <w:r>
         <w:t xml:space="preserve"> </w:t>
       </w:r>
-      <w:del w:id="9163" w:author="Claude" w:date="2026-10-08T22:18:30Z">
-        <w:r>
-          <w:delText xml:space="preserve">coverage</w:delText>
-        </w:r>
-      </w:del>
-      <w:ins w:id="9162" w:author="Claude" w:date="2026-10-08T22:18:30Z">
-        <w:r>
-          <w:t xml:space="preserve">normalized corrosion-product saturation, F/Fₘₐₓ</w:t>
-        </w:r>
-      </w:ins>
-      <w:r>
-        <w:t xml:space="preserve"> </w:t>
-      </w:r>
-      <w:r>
-        <w:t xml:space="preserve">(%), and panels (</w:t>
-      </w:r>
-      <w:del w:id="9161" w:author="Claude" w:date="2026-10-08T22:18:30Z">
-        <w:r>
-          <w:delText xml:space="preserve">g-i</w:delText>
-        </w:r>
-      </w:del>
-      <w:ins w:id="9159" w:author="Claude" w:date="2026-10-08T22:18:30Z">
-        <w:r>
-          <w:t xml:space="preserve">g</w:t>
-        </w:r>
-      </w:ins>
-      <w:del w:id="18" w:author="Claude" w:date="2026-10-08T04:28:00Z">
-        <w:r>
-          <w:delText>-</w:delText>
-        </w:r>
-      </w:del>
-      <w:ins w:id="19" w:author="Claude" w:date="2026-10-08T04:28:00Z">
-        <w:r>
-          <w:t>–</w:t>
-        </w:r>
-      </w:ins>
-      <w:ins w:id="9160" w:author="Claude" w:date="2026-10-08T22:18:30Z">
-        <w:r>
-          <w:t xml:space="preserve">i</w:t>
-        </w:r>
-      </w:ins>
-      <w:r>
-        <w:t xml:space="preserve">) show interfacial dissolved oxygen concentration (</w:t>
+      <w:r>
+        <w:t>normalized corrosion-product saturation, F/Fₘₐₓ</w:t>
+      </w:r>
+      <w:r>
+        <w:t xml:space="preserve"> (%), and panels (</w:t>
+      </w:r>
+      <w:r>
+        <w:t>g–</w:t>
+      </w:r>
+      <w:proofErr w:type="spellStart"/>
+      <w:r>
+        <w:t>i</w:t>
+      </w:r>
+      <w:proofErr w:type="spellEnd"/>
+      <w:r>
+        <w:t>) show interfacial dissolved oxygen concentration (</w:t>
       </w:r>
       <w:r>
         <w:rPr>
@@ -18546,7 +17757,7 @@
         </w:rPr>
       </w:pPr>
     </w:p>
-    <w:bookmarkEnd w:id="13"/>
+    <w:bookmarkEnd w:id="16"/>
     <w:p>
       <w:pPr>
         <w:pStyle w:val="Heading2"/>
@@ -18711,13 +17922,14 @@
           <w:iCs w:val="0"/>
         </w:rPr>
       </w:pPr>
-      <w:bookmarkStart w:id="20" w:name="_Ref238632622"/>
-      <w:bookmarkStart w:id="21" w:name="_Ref240375786"/>
-      <w:r>
-        <w:rPr>
-          <w:b/>
-          <w:bCs/>
-        </w:rPr>
+      <w:bookmarkStart w:id="21" w:name="_Ref238632622"/>
+      <w:bookmarkStart w:id="22" w:name="_Ref240375786"/>
+      <w:r>
+        <w:rPr>
+          <w:b/>
+          <w:bCs/>
+        </w:rPr>
+        <w:lastRenderedPageBreak/>
         <w:t xml:space="preserve">Table </w:t>
       </w:r>
       <w:r>
@@ -18756,8 +17968,8 @@
         </w:rPr>
         <w:fldChar w:fldCharType="end"/>
       </w:r>
-      <w:bookmarkEnd w:id="20"/>
       <w:bookmarkEnd w:id="21"/>
+      <w:bookmarkEnd w:id="22"/>
       <w:r>
         <w:rPr>
           <w:b/>
@@ -19646,22 +18858,12 @@
         </w:rPr>
         <w:t xml:space="preserve">), with an RMSE of 0.0159% and </w:t>
       </w:r>
-      <w:del w:id="9167" w:author="Claude" w:date="2026-10-08T22:18:30Z">
-        <w:r>
-          <w:rPr>
-            <w:rFonts w:cs="Times New Roman"/>
-          </w:rPr>
-          <w:delText xml:space="preserve">a</w:delText>
-        </w:r>
-      </w:del>
-      <w:ins w:id="9166" w:author="Claude" w:date="2026-10-08T22:18:30Z">
-        <w:r>
-          <w:rPr>
-            <w:rFonts w:cs="Times New Roman"/>
-          </w:rPr>
-          <w:t>an</w:t>
-        </w:r>
-      </w:ins>
+      <w:r>
+        <w:rPr>
+          <w:rFonts w:cs="Times New Roman"/>
+        </w:rPr>
+        <w:t>an</w:t>
+      </w:r>
       <w:r>
         <w:rPr>
           <w:rFonts w:cs="Times New Roman"/>
@@ -19889,71 +19091,23 @@
         </w:rPr>
         <w:t xml:space="preserve">Corrosion products progressively accumulated near the Zn surface, forming a </w:t>
       </w:r>
-      <w:del w:id="9185" w:author="Claude" w:date="2026-10-08T22:18:30Z">
-        <w:r>
-          <w:rPr>
-            <w:rFonts w:cs="Times New Roman"/>
-          </w:rPr>
-          <w:delText xml:space="preserve">distinct</w:delText>
-        </w:r>
-      </w:del>
-      <w:ins w:id="9184" w:author="Claude" w:date="2026-10-08T22:18:30Z">
-        <w:r>
-          <w:rPr>
-            <w:rFonts w:cs="Times New Roman"/>
-          </w:rPr>
-          <w:t xml:space="preserve">diffuse</w:t>
-        </w:r>
-      </w:ins>
+      <w:r>
+        <w:rPr>
+          <w:rFonts w:cs="Times New Roman"/>
+        </w:rPr>
+        <w:t>diffuse</w:t>
+      </w:r>
       <w:r>
         <w:rPr>
           <w:rFonts w:cs="Times New Roman"/>
         </w:rPr>
         <w:t xml:space="preserve"> </w:t>
       </w:r>
-      <w:del w:id="9183" w:author="Claude" w:date="2026-10-08T22:18:30Z">
-        <w:r>
-          <w:rPr>
-            <w:rFonts w:cs="Times New Roman"/>
-          </w:rPr>
-          <w:delText xml:space="preserve">film</w:delText>
-        </w:r>
-      </w:del>
-      <w:ins w:id="9182" w:author="Claude" w:date="2026-10-08T22:18:30Z">
-        <w:r>
-          <w:rPr>
-            <w:rFonts w:cs="Times New Roman"/>
-          </w:rPr>
-          <w:t xml:space="preserve">corrosion-product</w:t>
-        </w:r>
-      </w:ins>
-      <w:r>
-        <w:rPr>
-          <w:rFonts w:cs="Times New Roman"/>
-        </w:rPr>
-        <w:t xml:space="preserve"> </w:t>
-      </w:r>
-      <w:del w:id="9181" w:author="Claude" w:date="2026-10-08T22:18:30Z">
-        <w:r>
-          <w:rPr>
-            <w:rFonts w:cs="Times New Roman"/>
-          </w:rPr>
-          <w:delText xml:space="preserve">layer</w:delText>
-        </w:r>
-      </w:del>
-      <w:ins w:id="9180" w:author="Claude" w:date="2026-10-08T22:18:30Z">
-        <w:r>
-          <w:rPr>
-            <w:rFonts w:cs="Times New Roman"/>
-          </w:rPr>
-          <w:t xml:space="preserve">accumulation</w:t>
-        </w:r>
-      </w:ins>
-      <w:r>
-        <w:rPr>
-          <w:rFonts w:cs="Times New Roman"/>
-        </w:rPr>
-        <w:t xml:space="preserve"> </w:t>
+      <w:r>
+        <w:rPr>
+          <w:rFonts w:cs="Times New Roman"/>
+        </w:rPr>
+        <w:t xml:space="preserve">corrosion-product accumulation </w:t>
       </w:r>
       <w:r>
         <w:rPr>
@@ -19961,71 +19115,11 @@
         </w:rPr>
         <w:t xml:space="preserve">by 168 h and developing into a </w:t>
       </w:r>
-      <w:del w:id="9179" w:author="Claude" w:date="2026-10-08T22:18:30Z">
-        <w:r>
-          <w:rPr>
-            <w:rFonts w:cs="Times New Roman"/>
-          </w:rPr>
-          <w:delText xml:space="preserve">dense</w:delText>
-        </w:r>
-      </w:del>
-      <w:ins w:id="9178" w:author="Claude" w:date="2026-10-08T22:18:30Z">
-        <w:r>
-          <w:rPr>
-            <w:rFonts w:cs="Times New Roman"/>
-          </w:rPr>
-          <w:t xml:space="preserve">homogenized</w:t>
-        </w:r>
-      </w:ins>
-      <w:r>
-        <w:rPr>
-          <w:rFonts w:cs="Times New Roman"/>
-        </w:rPr>
-        <w:t xml:space="preserve"> </w:t>
-      </w:r>
-      <w:del w:id="9177" w:author="Claude" w:date="2026-10-08T22:18:30Z">
-        <w:r>
-          <w:rPr>
-            <w:rFonts w:cs="Times New Roman"/>
-          </w:rPr>
-          <w:delText xml:space="preserve">near</w:delText>
-        </w:r>
-      </w:del>
-      <w:ins w:id="9176" w:author="Claude" w:date="2026-10-08T22:18:30Z">
-        <w:r>
-          <w:rPr>
-            <w:rFonts w:cs="Times New Roman"/>
-          </w:rPr>
-          <w:t xml:space="preserve">corrosion</w:t>
-        </w:r>
-      </w:ins>
-      <w:r>
-        <w:rPr>
-          <w:rFonts w:cs="Times New Roman"/>
-        </w:rPr>
-        <w:t xml:space="preserve">-</w:t>
-      </w:r>
-      <w:del w:id="9175" w:author="Claude" w:date="2026-10-08T22:18:30Z">
-        <w:r>
-          <w:rPr>
-            <w:rFonts w:cs="Times New Roman"/>
-          </w:rPr>
-          <w:delText xml:space="preserve">surface</w:delText>
-        </w:r>
-      </w:del>
-      <w:ins w:id="9174" w:author="Claude" w:date="2026-10-08T22:18:30Z">
-        <w:r>
-          <w:rPr>
-            <w:rFonts w:cs="Times New Roman"/>
-          </w:rPr>
-          <w:t xml:space="preserve">product</w:t>
-        </w:r>
-      </w:ins>
-      <w:r>
-        <w:rPr>
-          <w:rFonts w:cs="Times New Roman"/>
-        </w:rPr>
-        <w:t xml:space="preserve"> </w:t>
+      <w:r>
+        <w:rPr>
+          <w:rFonts w:cs="Times New Roman"/>
+        </w:rPr>
+        <w:t xml:space="preserve">homogenized corrosion-product </w:t>
       </w:r>
       <w:r>
         <w:rPr>
@@ -20100,44 +19194,12 @@
         </w:rPr>
         <w:t xml:space="preserve">). As the </w:t>
       </w:r>
-      <w:del w:id="9173" w:author="Claude" w:date="2026-10-08T22:18:30Z">
-        <w:r>
-          <w:rPr>
-            <w:rFonts w:cs="Times New Roman"/>
-          </w:rPr>
-          <w:delText xml:space="preserve">film</w:delText>
-        </w:r>
-      </w:del>
-      <w:ins w:id="9172" w:author="Claude" w:date="2026-10-08T22:18:30Z">
-        <w:r>
-          <w:rPr>
-            <w:rFonts w:cs="Times New Roman"/>
-          </w:rPr>
-          <w:t xml:space="preserve">near-surface</w:t>
-        </w:r>
-      </w:ins>
-      <w:r>
-        <w:rPr>
-          <w:rFonts w:cs="Times New Roman"/>
-        </w:rPr>
-        <w:t xml:space="preserve"> </w:t>
-      </w:r>
-      <w:del w:id="9171" w:author="Claude" w:date="2026-10-08T22:18:30Z">
-        <w:r>
-          <w:rPr>
-            <w:rFonts w:cs="Times New Roman"/>
-          </w:rPr>
-          <w:delText xml:space="preserve">thickened</w:delText>
-        </w:r>
-      </w:del>
-      <w:ins w:id="9170" w:author="Claude" w:date="2026-10-08T22:18:30Z">
-        <w:r>
-          <w:rPr>
-            <w:rFonts w:cs="Times New Roman"/>
-          </w:rPr>
-          <w:t xml:space="preserve">corrosion-product field developed</w:t>
-        </w:r>
-      </w:ins>
+      <w:r>
+        <w:rPr>
+          <w:rFonts w:cs="Times New Roman"/>
+        </w:rPr>
+        <w:t>near-surface corrosion-product field developed</w:t>
+      </w:r>
       <w:r>
         <w:rPr>
           <w:rFonts w:cs="Times New Roman"/>
@@ -20223,22 +19285,12 @@
         </w:rPr>
         <w:t xml:space="preserve">). The oxygen-deficient boundary layer expanded with immersion time, while radial concentration variations remained small, indicating predominantly one-dimensional transport normal to the surface. The combined effects of </w:t>
       </w:r>
-      <w:del w:id="9169" w:author="Claude" w:date="2026-10-08T22:18:30Z">
-        <w:r>
-          <w:rPr>
-            <w:rFonts w:cs="Times New Roman"/>
-          </w:rPr>
-          <w:delText xml:space="preserve">film</w:delText>
-        </w:r>
-      </w:del>
-      <w:ins w:id="9168" w:author="Claude" w:date="2026-10-08T22:18:30Z">
-        <w:r>
-          <w:rPr>
-            <w:rFonts w:cs="Times New Roman"/>
-          </w:rPr>
-          <w:t>corrosion-product</w:t>
-        </w:r>
-      </w:ins>
+      <w:r>
+        <w:rPr>
+          <w:rFonts w:cs="Times New Roman"/>
+        </w:rPr>
+        <w:t>corrosion-product</w:t>
+      </w:r>
       <w:r>
         <w:rPr>
           <w:rFonts w:cs="Times New Roman"/>
@@ -20299,6 +19351,7 @@
         <w:rPr>
           <w:noProof/>
         </w:rPr>
+        <w:lastRenderedPageBreak/>
         <w:drawing>
           <wp:inline distT="0" distB="0" distL="0" distR="0" wp14:anchorId="36D8AFC4" wp14:editId="61EC0E62">
             <wp:extent cx="5760720" cy="5880735"/>
@@ -20346,7 +19399,7 @@
       <w:pPr>
         <w:pStyle w:val="Captions"/>
       </w:pPr>
-      <w:bookmarkStart w:id="22" w:name="_Ref239754424"/>
+      <w:bookmarkStart w:id="23" w:name="_Ref239754424"/>
       <w:r>
         <w:rPr>
           <w:b/>
@@ -20404,7 +19457,7 @@
         </w:rPr>
         <w:fldChar w:fldCharType="end"/>
       </w:r>
-      <w:bookmarkEnd w:id="22"/>
+      <w:bookmarkEnd w:id="23"/>
       <w:r>
         <w:rPr>
           <w:b/>
@@ -20568,33 +19621,17 @@
         </w:rPr>
         <w:t xml:space="preserve">In addition to mass-loss validation, the model was evaluated against </w:t>
       </w:r>
-      <w:del w:id="9201" w:author="Claude" w:date="2026-10-08T22:18:30Z">
-        <w:r>
-          <w:rPr>
-            <w:rFonts w:cs="Times New Roman"/>
-          </w:rPr>
-          <w:delText xml:space="preserve">Literature</w:delText>
-        </w:r>
-      </w:del>
-      <w:ins w:id="9200" w:author="Claude" w:date="2026-10-08T22:18:30Z">
-        <w:r>
-          <w:rPr>
-            <w:rFonts w:cs="Times New Roman"/>
-          </w:rPr>
-          <w:t xml:space="preserve">literature</w:t>
-        </w:r>
-      </w:ins>
-      <w:r>
-        <w:rPr>
-          <w:rFonts w:cs="Times New Roman"/>
-        </w:rPr>
-        <w:t xml:space="preserve"> </w:t>
-      </w:r>
-      <w:r>
-        <w:rPr>
-          <w:rFonts w:cs="Times New Roman"/>
-        </w:rPr>
-        <w:t xml:space="preserve">measurements of </w:t>
+      <w:r>
+        <w:rPr>
+          <w:rFonts w:cs="Times New Roman"/>
+        </w:rPr>
+        <w:t>literature</w:t>
+      </w:r>
+      <w:r>
+        <w:rPr>
+          <w:rFonts w:cs="Times New Roman"/>
+        </w:rPr>
+        <w:t xml:space="preserve"> measurements of </w:t>
       </w:r>
       <m:oMath>
         <m:r>
@@ -20754,6 +19791,7 @@
         </w:rPr>
         <w:fldChar w:fldCharType="end"/>
       </w:r>
+      <w:proofErr w:type="gramStart"/>
       <w:r>
         <w:rPr>
           <w:rFonts w:cs="Times New Roman"/>
@@ -20762,13 +19800,14 @@
         </w:rPr>
         <w:t>e,f</w:t>
       </w:r>
+      <w:proofErr w:type="gramEnd"/>
       <w:r>
         <w:rPr>
           <w:rFonts w:cs="Times New Roman"/>
         </w:rPr>
         <w:t>, the model reproduced the overall evolution of both quantities, capturing the rapid initial increase followed by a gradual plateau</w:t>
       </w:r>
-      <w:ins w:id="9199" w:author="Claude" w:date="2026-10-08T22:18:30Z">
+      <w:ins w:id="24" w:author="Claude" w:date="2026-10-08T20:38:00Z">
         <w:r>
           <w:rPr>
             <w:rFonts w:cs="Times New Roman"/>
@@ -20782,172 +19821,58 @@
         </w:rPr>
         <w:t xml:space="preserve"> </w:t>
       </w:r>
-      <w:del w:id="9198" w:author="Claude" w:date="2026-10-08T22:18:30Z">
+      <w:r>
+        <w:rPr>
+          <w:rFonts w:cs="Times New Roman"/>
+        </w:rPr>
+        <w:t>with errors at 336 h of 44%</w:t>
+      </w:r>
+      <w:r>
+        <w:rPr>
+          <w:rFonts w:cs="Times New Roman"/>
+        </w:rPr>
+        <w:t xml:space="preserve"> for Zn²⁺ and </w:t>
+      </w:r>
+      <w:r>
+        <w:rPr>
+          <w:rFonts w:cs="Times New Roman"/>
+        </w:rPr>
+        <w:t>2.8%</w:t>
+      </w:r>
+      <w:r>
+        <w:rPr>
+          <w:rFonts w:cs="Times New Roman"/>
+        </w:rPr>
+        <w:t xml:space="preserve"> for </w:t>
+      </w:r>
+      <w:proofErr w:type="spellStart"/>
+      <w:r>
+        <w:rPr>
+          <w:rFonts w:cs="Times New Roman"/>
+        </w:rPr>
+        <w:t>pH</w:t>
+      </w:r>
+      <w:del w:id="25" w:author="Claude" w:date="2026-10-08T20:38:00Z">
         <w:r>
           <w:rPr>
             <w:rFonts w:cs="Times New Roman"/>
           </w:rPr>
-          <w:delText xml:space="preserve">(Pearson</w:delText>
+          <w:delText>)</w:delText>
         </w:r>
       </w:del>
-      <w:ins w:id="9197" w:author="Claude" w:date="2026-10-08T22:18:30Z">
-        <w:r>
-          <w:rPr>
-            <w:rFonts w:cs="Times New Roman"/>
-          </w:rPr>
-          <w:t xml:space="preserve">with</w:t>
-        </w:r>
-      </w:ins>
+      <w:r>
+        <w:rPr>
+          <w:rFonts w:cs="Times New Roman"/>
+        </w:rPr>
+        <w:t>.</w:t>
+      </w:r>
+      <w:proofErr w:type="spellEnd"/>
       <w:r>
         <w:rPr>
           <w:rFonts w:cs="Times New Roman"/>
         </w:rPr>
         <w:t xml:space="preserve"> </w:t>
       </w:r>
-      <w:del w:id="9196" w:author="Claude" w:date="2026-10-08T22:18:30Z">
-        <w:r>
-          <w:rPr>
-            <w:rFonts w:cs="Times New Roman"/>
-          </w:rPr>
-          <w:delText xml:space="preserve">r</w:delText>
-        </w:r>
-      </w:del>
-      <w:ins w:id="9195" w:author="Claude" w:date="2026-10-08T22:18:30Z">
-        <w:r>
-          <w:rPr>
-            <w:rFonts w:cs="Times New Roman"/>
-          </w:rPr>
-          <w:t xml:space="preserve">errors</w:t>
-        </w:r>
-      </w:ins>
-      <w:r>
-        <w:rPr>
-          <w:rFonts w:cs="Times New Roman"/>
-        </w:rPr>
-        <w:t xml:space="preserve"> </w:t>
-      </w:r>
-      <w:del w:id="9194" w:author="Claude" w:date="2026-10-08T22:18:30Z">
-        <w:r>
-          <w:rPr>
-            <w:rFonts w:cs="Times New Roman"/>
-          </w:rPr>
-          <w:delText xml:space="preserve">=</w:delText>
-        </w:r>
-      </w:del>
-      <w:ins w:id="9193" w:author="Claude" w:date="2026-10-08T22:18:30Z">
-        <w:r>
-          <w:rPr>
-            <w:rFonts w:cs="Times New Roman"/>
-          </w:rPr>
-          <w:t xml:space="preserve">at</w:t>
-        </w:r>
-      </w:ins>
-      <w:r>
-        <w:rPr>
-          <w:rFonts w:cs="Times New Roman"/>
-        </w:rPr>
-        <w:t xml:space="preserve"> </w:t>
-      </w:r>
-      <w:del w:id="9192" w:author="Claude" w:date="2026-10-08T22:18:30Z">
-        <w:r>
-          <w:rPr>
-            <w:rFonts w:cs="Times New Roman"/>
-          </w:rPr>
-          <w:delText xml:space="preserve">0.96</w:delText>
-        </w:r>
-      </w:del>
-      <w:ins w:id="9191" w:author="Claude" w:date="2026-10-08T22:18:30Z">
-        <w:r>
-          <w:rPr>
-            <w:rFonts w:cs="Times New Roman"/>
-          </w:rPr>
-          <w:t xml:space="preserve">336 h of 44%</w:t>
-        </w:r>
-      </w:ins>
-      <w:r>
-        <w:rPr>
-          <w:rFonts w:cs="Times New Roman"/>
-        </w:rPr>
-        <w:t xml:space="preserve"> for Zn²⁺ and </w:t>
-      </w:r>
-      <w:del w:id="9190" w:author="Claude" w:date="2026-10-08T22:18:30Z">
-        <w:r>
-          <w:rPr>
-            <w:rFonts w:cs="Times New Roman"/>
-          </w:rPr>
-          <w:delText xml:space="preserve">0</w:delText>
-        </w:r>
-      </w:del>
-      <w:ins w:id="9189" w:author="Claude" w:date="2026-10-08T22:18:30Z">
-        <w:r>
-          <w:rPr>
-            <w:rFonts w:cs="Times New Roman"/>
-          </w:rPr>
-          <w:t xml:space="preserve">2</w:t>
-        </w:r>
-      </w:ins>
-      <w:r>
-        <w:rPr>
-          <w:rFonts w:cs="Times New Roman"/>
-        </w:rPr>
-        <w:t xml:space="preserve">.</w:t>
-      </w:r>
-      <w:del w:id="9188" w:author="Claude" w:date="2026-10-08T22:18:30Z">
-        <w:r>
-          <w:rPr>
-            <w:rFonts w:cs="Times New Roman"/>
-          </w:rPr>
-          <w:delText xml:space="preserve">95</w:delText>
-        </w:r>
-      </w:del>
-      <w:ins w:id="9187" w:author="Claude" w:date="2026-10-08T22:18:30Z">
-        <w:r>
-          <w:rPr>
-            <w:rFonts w:cs="Times New Roman"/>
-          </w:rPr>
-          <w:t xml:space="preserve">8%</w:t>
-        </w:r>
-      </w:ins>
-      <w:r>
-        <w:rPr>
-          <w:rFonts w:cs="Times New Roman"/>
-        </w:rPr>
-        <w:t xml:space="preserve"> </w:t>
-      </w:r>
-      <w:r>
-        <w:rPr>
-          <w:rFonts w:cs="Times New Roman"/>
-        </w:rPr>
-        <w:t xml:space="preserve">for </w:t>
-      </w:r>
-      <w:proofErr w:type="spellStart"/>
-      <w:r>
-        <w:rPr>
-          <w:rFonts w:cs="Times New Roman"/>
-        </w:rPr>
-        <w:t xml:space="preserve">pH</w:t>
-      </w:r>
-      <w:del w:id="9186" w:author="Claude" w:date="2026-10-08T22:18:30Z">
-        <w:r>
-          <w:rPr>
-            <w:rFonts w:cs="Times New Roman"/>
-          </w:rPr>
-          <w:delText xml:space="preserve">)</w:delText>
-        </w:r>
-      </w:del>
-      <w:r>
-        <w:rPr>
-          <w:rFonts w:cs="Times New Roman"/>
-        </w:rPr>
-        <w:t xml:space="preserve">.</w:t>
-      </w:r>
-      <w:proofErr w:type="spellEnd"/>
-      <w:r>
-        <w:rPr>
-          <w:rFonts w:cs="Times New Roman"/>
-        </w:rPr>
-        <w:t xml:space="preserve"> </w:t>
-      </w:r>
       <w:r>
         <w:rPr>
           <w:rFonts w:cs="Times New Roman"/>
@@ -20958,6 +19883,7 @@
         <w:rPr>
           <w:rFonts w:cs="Times New Roman"/>
         </w:rPr>
+        <w:lastRenderedPageBreak/>
         <w:t xml:space="preserve">reaction terms. </w:t>
       </w:r>
       <w:r>
@@ -21161,7 +20087,15 @@
         <w:t xml:space="preserve"> corrosion-product chemistry. </w:t>
       </w:r>
       <w:r>
-        <w:t>The higher mass loss is consistent with the observed relationship between surface area-to-volume ratio (SA:V) and degradation, where cumulative mass loss increased approximately linearly with SA:V</w:t>
+        <w:t>The higher mass loss is consistent with the observed relationship between surface area-to-volume ratio (</w:t>
+      </w:r>
+      <w:proofErr w:type="gramStart"/>
+      <w:r>
+        <w:t>SA:V</w:t>
+      </w:r>
+      <w:proofErr w:type="gramEnd"/>
+      <w:r>
+        <w:t>) and degradation, where cumulative mass loss increased approximately linearly with SA:V</w:t>
       </w:r>
       <w:r>
         <w:t xml:space="preserve"> (</w:t>
@@ -21173,7 +20107,7 @@
         </w:rPr>
         <w:t xml:space="preserve">Figure </w:t>
       </w:r>
-      <w:del w:id="9203" w:author="Claude" w:date="2026-10-08T22:18:30Z">
+      <w:del w:id="9012" w:author="Claude" w:date="2026-10-08T22:54:30Z">
         <w:r>
           <w:rPr>
             <w:b/>
@@ -21182,7 +20116,7 @@
           <w:delText xml:space="preserve">S9</w:delText>
         </w:r>
       </w:del>
-      <w:ins w:id="9202" w:author="Claude" w:date="2026-10-08T22:18:30Z">
+      <w:ins w:id="9011" w:author="Claude" w:date="2026-10-08T22:54:30Z">
         <w:r>
           <w:rPr>
             <w:b/>
@@ -21201,7 +20135,15 @@
         <w:t xml:space="preserve"> </w:t>
       </w:r>
       <w:r>
-        <w:t>However, the stent exhibited less pronounced temporal deceleration in mass loss than the disc, indicating that geometric influences on degradation extend beyond SA:V alone.</w:t>
+        <w:t xml:space="preserve">However, the stent exhibited less pronounced temporal deceleration in mass loss than the disc, indicating that geometric influences on degradation extend beyond </w:t>
+      </w:r>
+      <w:proofErr w:type="gramStart"/>
+      <w:r>
+        <w:t>SA:V</w:t>
+      </w:r>
+      <w:proofErr w:type="gramEnd"/>
+      <w:r>
+        <w:t xml:space="preserve"> alone.</w:t>
       </w:r>
     </w:p>
     <w:p>
@@ -21315,6 +20257,7 @@
         <w:rPr>
           <w:noProof/>
         </w:rPr>
+        <w:lastRenderedPageBreak/>
         <w:drawing>
           <wp:inline distT="0" distB="0" distL="0" distR="0" wp14:anchorId="2EA5A68C" wp14:editId="605B727F">
             <wp:extent cx="5760720" cy="2087880"/>
@@ -21362,7 +20305,7 @@
       <w:pPr>
         <w:pStyle w:val="Captions"/>
       </w:pPr>
-      <w:bookmarkStart w:id="23" w:name="_Ref239754601"/>
+      <w:bookmarkStart w:id="26" w:name="_Ref239754601"/>
       <w:r>
         <w:rPr>
           <w:b/>
@@ -21420,7 +20363,7 @@
         </w:rPr>
         <w:fldChar w:fldCharType="end"/>
       </w:r>
-      <w:bookmarkEnd w:id="23"/>
+      <w:bookmarkEnd w:id="26"/>
       <w:r>
         <w:rPr>
           <w:b/>
@@ -21706,6 +20649,7 @@
         </w:rPr>
         <w:fldChar w:fldCharType="end"/>
       </w:r>
+      <w:proofErr w:type="gramStart"/>
       <w:r>
         <w:rPr>
           <w:b/>
@@ -21714,7 +20658,11 @@
         <w:t>c,d</w:t>
       </w:r>
       <w:r>
-        <w:t xml:space="preserve">. </w:t>
+        <w:t>.</w:t>
+      </w:r>
+      <w:proofErr w:type="gramEnd"/>
+      <w:r>
+        <w:t xml:space="preserve"> </w:t>
       </w:r>
       <w:r>
         <w:t>Section 1, located along a relatively straight strut segment, exhibited comparatively uniform recession, with penetration depths ranging from approximately</w:t>
@@ -21902,6 +20850,7 @@
         <w:t xml:space="preserve">). This asymmetric recession shows that the nominal corrosion rate alone cannot predict local </w:t>
       </w:r>
       <w:r>
+        <w:lastRenderedPageBreak/>
         <w:t>material loss because device geometry redistributes oxygen availability and corrosion activity across the implant surface.</w:t>
       </w:r>
     </w:p>
@@ -21916,7 +20865,7 @@
         <w:ind w:firstLine="0"/>
         <w:jc w:val="center"/>
       </w:pPr>
-      <w:bookmarkStart w:id="24" w:name="fig:casestudy2"/>
+      <w:bookmarkStart w:id="27" w:name="fig:casestudy2"/>
       <w:r>
         <w:rPr>
           <w:noProof/>
@@ -21968,7 +20917,7 @@
       <w:pPr>
         <w:pStyle w:val="Captions"/>
       </w:pPr>
-      <w:bookmarkStart w:id="25" w:name="_Ref239754694"/>
+      <w:bookmarkStart w:id="28" w:name="_Ref239754694"/>
       <w:r>
         <w:rPr>
           <w:b/>
@@ -22026,7 +20975,7 @@
         </w:rPr>
         <w:fldChar w:fldCharType="end"/>
       </w:r>
-      <w:bookmarkEnd w:id="25"/>
+      <w:bookmarkEnd w:id="28"/>
       <w:r>
         <w:rPr>
           <w:b/>
@@ -22062,10 +21011,12 @@
         <w:t> h, (b) schematic illustration of oxygen transport to the inner and outer-curvature surfaces of the stent crown, (</w:t>
       </w:r>
       <w:proofErr w:type="spellStart"/>
+      <w:proofErr w:type="gramStart"/>
       <w:r>
         <w:t>c,d</w:t>
       </w:r>
       <w:proofErr w:type="spellEnd"/>
+      <w:proofErr w:type="gramEnd"/>
       <w:r>
         <w:t>) evolution of the metal cross-sectional profiles at Sections 1 and 2, respectively.</w:t>
       </w:r>
@@ -22212,6 +21163,7 @@
         <w:t xml:space="preserve">, suggesting that spacing became increasingly important as corrosion products accumulated. At a center-to-center spacing of 0.30 mm, overlapping oxygen-depletion fields restricted oxygen availability within the gap and suppressed the overall oxygen-reduction reaction, resulting in lower cumulative mass loss. Increasing the spacing to 1.60 mm weakened this interaction, allowing each wire to receive oxygen more independently and shifting the response toward that of the isolated wire. This transport-shielding behavior is </w:t>
       </w:r>
       <w:r>
+        <w:lastRenderedPageBreak/>
         <w:t>consistent with observations in porous Zn scaffolds</w:t>
       </w:r>
       <w:r>
@@ -22257,34 +21209,17 @@
       <w:r>
         <w:t>penetration depths varied only slightly, ranging from approximately 2.</w:t>
       </w:r>
-      <w:del w:id="9207" w:author="Claude" w:date="2026-10-08T22:18:30Z">
-        <w:r>
-          <w:delText xml:space="preserve">1</w:delText>
-        </w:r>
-      </w:del>
-      <w:ins w:id="9206" w:author="Claude" w:date="2026-10-08T22:18:30Z">
-        <w:r>
-          <w:t>4</w:t>
-        </w:r>
-      </w:ins>
+      <w:r>
+        <w:t>4</w:t>
+      </w:r>
       <w:r>
         <w:t xml:space="preserve"> to 2.7 µm across the curved-wire configurations (30°, 90°, and 150° arcs) and from 2.1 to 2.</w:t>
       </w:r>
-      <w:del w:id="9205" w:author="Claude" w:date="2026-10-08T22:18:30Z">
-        <w:r>
-          <w:delText xml:space="preserve">7</w:delText>
-        </w:r>
-      </w:del>
-      <w:ins w:id="9204" w:author="Claude" w:date="2026-10-08T22:18:30Z">
-        <w:r>
-          <w:t xml:space="preserve">4</w:t>
-        </w:r>
-      </w:ins>
-      <w:r>
-        <w:t xml:space="preserve"> </w:t>
-      </w:r>
-      <w:r>
-        <w:t xml:space="preserve">µm across the </w:t>
+      <w:r>
+        <w:t>4</w:t>
+      </w:r>
+      <w:r>
+        <w:t xml:space="preserve"> µm across the </w:t>
       </w:r>
       <w:proofErr w:type="spellStart"/>
       <w:r>
@@ -22338,6 +21273,7 @@
         <w:rPr>
           <w:noProof/>
         </w:rPr>
+        <w:lastRenderedPageBreak/>
         <w:drawing>
           <wp:inline distT="0" distB="0" distL="0" distR="0" wp14:anchorId="103F8303" wp14:editId="43B18CC7">
             <wp:extent cx="5760720" cy="4576445"/>
@@ -22385,7 +21321,7 @@
       <w:pPr>
         <w:pStyle w:val="Captions"/>
       </w:pPr>
-      <w:bookmarkStart w:id="26" w:name="_Ref241074684"/>
+      <w:bookmarkStart w:id="29" w:name="_Ref241074684"/>
       <w:r>
         <w:rPr>
           <w:b/>
@@ -22429,7 +21365,7 @@
         </w:rPr>
         <w:fldChar w:fldCharType="end"/>
       </w:r>
-      <w:bookmarkEnd w:id="26"/>
+      <w:bookmarkEnd w:id="29"/>
       <w:r>
         <w:rPr>
           <w:b/>
@@ -22455,16 +21391,9 @@
       <w:r>
         <w:t>mean local penetration depth for the corresponding curvature and spacing configurations</w:t>
       </w:r>
-      <w:ins w:id="27" w:author="Claude" w:date="2026-10-08T04:28:00Z">
-        <w:r>
-          <w:t xml:space="preserve"> </w:t>
-        </w:r>
-      </w:ins>
-      <w:ins w:id="9208" w:author="Claude" w:date="2026-10-08T22:18:30Z">
-        <w:r>
-          <w:t>(error bars: ±1 SD around the cross-section perimeter)</w:t>
-        </w:r>
-      </w:ins>
+      <w:r>
+        <w:t xml:space="preserve"> (error bars: ±1 SD around the cross-section perimeter)</w:t>
+      </w:r>
       <w:r>
         <w:t xml:space="preserve">, and (d) </w:t>
       </w:r>
@@ -22499,229 +21428,81 @@
       <w:r>
         <w:t>The corrosion</w:t>
       </w:r>
-      <w:del w:id="9241" w:author="Claude" w:date="2026-10-08T22:18:30Z">
+      <w:del w:id="30" w:author="Claude" w:date="2026-10-08T20:38:00Z">
         <w:r>
-          <w:delText xml:space="preserve">-product</w:delText>
+          <w:delText>-</w:delText>
         </w:r>
       </w:del>
       <w:r>
+        <w:t xml:space="preserve"> products are </w:t>
+      </w:r>
+      <w:r>
+        <w:t xml:space="preserve">treated as a homogenized </w:t>
+      </w:r>
+      <w:proofErr w:type="spellStart"/>
+      <w:r>
+        <w:t>ZnO</w:t>
+      </w:r>
+      <w:proofErr w:type="spellEnd"/>
+      <w:r>
+        <w:t xml:space="preserve">-based </w:t>
+      </w:r>
+      <w:r>
+        <w:t>field</w:t>
+      </w:r>
+      <w:r>
+        <w:t xml:space="preserve"> rather than</w:t>
+      </w:r>
+      <w:r>
+        <w:t xml:space="preserve"> a discrete surface film or</w:t>
+      </w:r>
+      <w:r>
+        <w:t xml:space="preserve"> a heterogeneous, composition-dependent structure</w:t>
+      </w:r>
+      <w:r>
+        <w:t>,</w:t>
+      </w:r>
+      <w:r>
         <w:t xml:space="preserve"> </w:t>
       </w:r>
-      <w:del w:id="9240" w:author="Claude" w:date="2026-10-08T22:18:30Z">
+      <w:r>
+        <w:t>and</w:t>
+      </w:r>
+      <w:r>
+        <w:t xml:space="preserve"> phosphate-, carbonate-, </w:t>
+      </w:r>
+      <w:r>
+        <w:t xml:space="preserve">calcium-, </w:t>
+      </w:r>
+      <w:r>
+        <w:t xml:space="preserve">and </w:t>
+      </w:r>
+      <w:r>
+        <w:t>chloride</w:t>
+      </w:r>
+      <w:r>
+        <w:t>-containing phases</w:t>
+      </w:r>
+      <w:ins w:id="31" w:author="Claude" w:date="2026-10-08T20:38:00Z">
         <w:r>
-          <w:delText xml:space="preserve">layer</w:delText>
-        </w:r>
-      </w:del>
-      <w:ins w:id="9239" w:author="Claude" w:date="2026-10-08T22:18:30Z">
-        <w:r>
-          <w:t xml:space="preserve">products</w:t>
+          <w:t>,</w:t>
         </w:r>
       </w:ins>
       <w:r>
         <w:t xml:space="preserve"> </w:t>
       </w:r>
-      <w:del w:id="9238" w:author="Claude" w:date="2026-10-08T22:18:30Z">
-        <w:r>
-          <w:delText xml:space="preserve">is</w:delText>
-        </w:r>
-      </w:del>
-      <w:ins w:id="9237" w:author="Claude" w:date="2026-10-08T22:18:30Z">
-        <w:r>
-          <w:t xml:space="preserve">are</w:t>
-        </w:r>
-      </w:ins>
-      <w:r>
-        <w:t xml:space="preserve"> </w:t>
-      </w:r>
-      <w:r>
-        <w:t xml:space="preserve">treated as a homogenized </w:t>
-      </w:r>
-      <w:proofErr w:type="spellStart"/>
-      <w:r>
-        <w:t>ZnO</w:t>
-      </w:r>
-      <w:proofErr w:type="spellEnd"/>
-      <w:r>
-        <w:t xml:space="preserve">-based </w:t>
-      </w:r>
-      <w:del w:id="9236" w:author="Claude" w:date="2026-10-08T22:18:30Z">
-        <w:r>
-          <w:delText xml:space="preserve">film</w:delText>
-        </w:r>
-      </w:del>
-      <w:ins w:id="9235" w:author="Claude" w:date="2026-10-08T22:18:30Z">
-        <w:r>
-          <w:t xml:space="preserve">field</w:t>
-        </w:r>
-      </w:ins>
-      <w:r>
-        <w:t xml:space="preserve"> </w:t>
-      </w:r>
-      <w:r>
-        <w:t>rather than</w:t>
-      </w:r>
-      <w:ins w:id="9234" w:author="Claude" w:date="2026-10-08T22:18:30Z">
-        <w:r>
-          <w:t xml:space="preserve"> a discrete surface film or</w:t>
-        </w:r>
-      </w:ins>
-      <w:r>
-        <w:t xml:space="preserve"> </w:t>
-      </w:r>
-      <w:r>
-        <w:t xml:space="preserve">a heterogeneous, composition-dependent structure</w:t>
-      </w:r>
-      <w:del w:id="9233" w:author="Claude" w:date="2026-10-08T22:18:30Z">
-        <w:r>
-          <w:delText xml:space="preserve">.</w:delText>
-        </w:r>
-      </w:del>
-      <w:ins w:id="9232" w:author="Claude" w:date="2026-10-08T22:18:30Z">
-        <w:r>
-          <w:t xml:space="preserve">,</w:t>
-        </w:r>
-      </w:ins>
-      <w:r>
-        <w:t xml:space="preserve"> </w:t>
-      </w:r>
-      <w:del w:id="9231" w:author="Claude" w:date="2026-10-08T22:18:30Z">
-        <w:r>
-          <w:delText xml:space="preserve">Secondary</w:delText>
-        </w:r>
-      </w:del>
-      <w:ins w:id="9230" w:author="Claude" w:date="2026-10-08T22:18:30Z">
-        <w:r>
-          <w:t xml:space="preserve">and</w:t>
-        </w:r>
-      </w:ins>
-      <w:r>
-        <w:t xml:space="preserve"> phosphate-, carbonate-, </w:t>
-      </w:r>
-      <w:ins w:id="9229" w:author="Claude" w:date="2026-10-08T22:18:30Z">
-        <w:r>
-          <w:t xml:space="preserve">calcium-, </w:t>
-        </w:r>
-      </w:ins>
-      <w:r>
-        <w:t xml:space="preserve">and </w:t>
-      </w:r>
-      <w:del w:id="9228" w:author="Claude" w:date="2026-10-08T22:18:30Z">
-        <w:r>
-          <w:delText xml:space="preserve">calcium</w:delText>
-        </w:r>
-      </w:del>
-      <w:ins w:id="9227" w:author="Claude" w:date="2026-10-08T22:18:30Z">
-        <w:r>
-          <w:t xml:space="preserve">chloride</w:t>
-        </w:r>
-      </w:ins>
-      <w:r>
-        <w:t xml:space="preserve">-containing phases</w:t>
-      </w:r>
-      <w:ins w:id="9226" w:author="Claude" w:date="2026-10-08T22:18:30Z">
-        <w:r>
-          <w:t xml:space="preserve">,</w:t>
-        </w:r>
-      </w:ins>
-      <w:r>
-        <w:t xml:space="preserve"> </w:t>
-      </w:r>
-      <w:del w:id="9225" w:author="Claude" w:date="2026-10-08T22:18:30Z">
-        <w:r>
-          <w:delText xml:space="preserve">that</w:delText>
-        </w:r>
-      </w:del>
-      <w:ins w:id="9224" w:author="Claude" w:date="2026-10-08T22:18:30Z">
-        <w:r>
-          <w:t xml:space="preserve">which</w:t>
-        </w:r>
-      </w:ins>
-      <w:r>
-        <w:t xml:space="preserve"> </w:t>
-      </w:r>
-      <w:del w:id="9223" w:author="Claude" w:date="2026-10-08T22:18:30Z">
-        <w:r>
-          <w:delText xml:space="preserve">may</w:delText>
-        </w:r>
-      </w:del>
-      <w:ins w:id="9222" w:author="Claude" w:date="2026-10-08T22:18:30Z">
-        <w:r>
-          <w:t xml:space="preserve">can</w:t>
-        </w:r>
-      </w:ins>
-      <w:r>
-        <w:t xml:space="preserve"> </w:t>
-      </w:r>
-      <w:del w:id="9221" w:author="Claude" w:date="2026-10-08T22:18:30Z">
-        <w:r>
-          <w:delText xml:space="preserve">develop</w:delText>
-        </w:r>
-      </w:del>
-      <w:ins w:id="9220" w:author="Claude" w:date="2026-10-08T22:18:30Z">
-        <w:r>
-          <w:t xml:space="preserve">form</w:t>
-        </w:r>
-      </w:ins>
-      <w:r>
-        <w:t xml:space="preserve"> </w:t>
-      </w:r>
-      <w:del w:id="9219" w:author="Claude" w:date="2026-10-08T22:18:30Z">
-        <w:r>
-          <w:delText xml:space="preserve">over</w:delText>
-        </w:r>
-      </w:del>
-      <w:ins w:id="9218" w:author="Claude" w:date="2026-10-08T22:18:30Z">
-        <w:r>
-          <w:t xml:space="preserve">within</w:t>
-        </w:r>
-      </w:ins>
-      <w:r>
-        <w:t xml:space="preserve"> </w:t>
-      </w:r>
-      <w:del w:id="9217" w:author="Claude" w:date="2026-10-08T22:18:30Z">
-        <w:r>
-          <w:delText xml:space="preserve">longer</w:delText>
-        </w:r>
-      </w:del>
-      <w:ins w:id="9216" w:author="Claude" w:date="2026-10-08T22:18:30Z">
-        <w:r>
-          <w:t xml:space="preserve">hours</w:t>
-        </w:r>
-      </w:ins>
-      <w:r>
-        <w:t xml:space="preserve"> </w:t>
-      </w:r>
-      <w:del w:id="9215" w:author="Claude" w:date="2026-10-08T22:18:30Z">
-        <w:r>
-          <w:delText xml:space="preserve">periods</w:delText>
-        </w:r>
-      </w:del>
-      <w:ins w:id="9214" w:author="Claude" w:date="2026-10-08T22:18:30Z">
-        <w:r>
-          <w:t xml:space="preserve">to days in vitro,</w:t>
-        </w:r>
-      </w:ins>
-      <w:r>
-        <w:t xml:space="preserve"> are</w:t>
-      </w:r>
-      <w:del w:id="9213" w:author="Claude" w:date="2026-10-08T22:18:30Z">
-        <w:r>
-          <w:delText xml:space="preserve"> therefore</w:delText>
-        </w:r>
-      </w:del>
-      <w:r>
-        <w:t xml:space="preserve"> not explicitly resolved</w:t>
-      </w:r>
-      <w:ins w:id="9210" w:author="Claude" w:date="2026-10-08T22:18:30Z">
-        <w:r>
-          <w:t xml:space="preserve">. The film field is defined on the fixed mesh on the electrolyte side of the moving interface rather than attached to it, and the ZnO/Zn volume ratio (about 1.6) is not represented. </w:t>
-        </w:r>
-      </w:ins>
-      <w:ins w:id="9211" w:author="Claude" w:date="2026-10-08T22:18:30Z">
-        <w:r>
-          <w:t xml:space="preserve">The dissolved oxygen concentration (3.5 mg L⁻¹) was taken from literature values for physiological fluids rather than measured experimentally. As oxygen concentration is closely coupled to the ORR rate coefficient, the calibrated </w:t>
-        </w:r>
-      </w:ins>
+      <w:r>
+        <w:t>which can form within days in vitro,</w:t>
+      </w:r>
+      <w:r>
+        <w:t xml:space="preserve"> are not explicitly resolved</w:t>
+      </w:r>
+      <w:r>
+        <w:t xml:space="preserve">. </w:t>
+      </w:r>
+      <w:r>
+        <w:t xml:space="preserve">The dissolved oxygen concentration (3.5 mg L⁻¹) was taken from literature values for physiological fluids rather than measured experimentally. As oxygen concentration is closely coupled to the ORR rate coefficient, the calibrated </w:t>
+      </w:r>
       <m:oMath>
         <m:sSub>
           <m:sSubPr>
@@ -22752,13 +21533,8 @@
           </m:sub>
         </m:sSub>
       </m:oMath>
-      <w:ins w:id="9212" w:author="Claude" w:date="2026-10-08T22:18:30Z">
-        <w:r>
-          <w:t xml:space="preserve">​ should be regarded as an effective parameter that partially incorporates uncertainty in oxygen availability</w:t>
-        </w:r>
-      </w:ins>
-      <w:r>
-        <w:t xml:space="preserve">.</w:t>
+      <w:r>
+        <w:t>​ should be regarded as an effective parameter that partially incorporates uncertainty in oxygen availability.</w:t>
       </w:r>
       <w:r>
         <w:t xml:space="preserve"> </w:t>
@@ -22773,13 +21549,14 @@
         <w:t>in vivo</w:t>
       </w:r>
       <w:r>
-        <w:t xml:space="preserve">. Moreover, </w:t>
-      </w:r>
-      <w:r>
-        <w:t xml:space="preserve">the </w:t>
-      </w:r>
-      <w:r>
-        <w:t xml:space="preserve">model assumes homogeneous electrochemical activity, preventing </w:t>
+        <w:t xml:space="preserve">. </w:t>
+      </w:r>
+      <w:r>
+        <w:lastRenderedPageBreak/>
+        <w:t xml:space="preserve">Moreover, </w:t>
+      </w:r>
+      <w:r>
+        <w:t xml:space="preserve">the model assumes homogeneous electrochemical activity, preventing </w:t>
       </w:r>
       <w:r>
         <w:t xml:space="preserve">prediction of pitting, micro-galvanic coupling, and stress-assisted degradation. Although </w:t>
@@ -22799,11 +21576,15 @@
       <w:r>
         <w:t xml:space="preserve"> mass loss represents a predictive demonstration rather than formal validation. Further validation against spatially resolved measurements of corrosion-product coverage, oxygen availability, and local penetration is therefore required, particularly for complex implant geometries.</w:t>
       </w:r>
-      <w:ins w:id="9209" w:author="Claude" w:date="2026-10-08T22:18:30Z">
-        <w:r>
-          <w:t xml:space="preserve"> Because O₂ consumption at the interface is not stoichiometrically coupled to Zn loss, the absolute interfacial O₂ depletion in Figures 4g–i and 5d is underestimated relative to a stoichiometric model, and these panels should be read as relative patterns. Independent measurements of Zn²⁺ release by ICP and direct mechanism tests, such as film thickness from FIB or SEM cross-sections or stirred and different-O₂ experiments, were not performed and are also needed.</w:t>
-        </w:r>
-      </w:ins>
+      <w:r>
+        <w:t xml:space="preserve"> Independent measurements of Zn²⁺ release by ICP and direct mechanism tests, such as film thickness from FIB or SEM cross-sections or stirred and different-O₂ experiments, were not performed and </w:t>
+      </w:r>
+      <w:r>
+        <w:t>can be used for further validation</w:t>
+      </w:r>
+      <w:r>
+        <w:t>.</w:t>
+      </w:r>
     </w:p>
     <w:p>
       <w:pPr>
@@ -22812,31 +21593,11 @@
       <w:r>
         <w:t xml:space="preserve">Future developments should incorporate physiologically realistic flow conditions, additional ionic species, multiphase corrosion-product evolution, and spatially heterogeneous electrochemical activity. Extending the framework to Zn alloys will also require accounting for alloying elements, secondary phases, and galvanic interactions. Although the </w:t>
       </w:r>
-      <w:del w:id="9245" w:author="Claude" w:date="2026-10-08T22:18:30Z">
-        <w:r>
-          <w:delText xml:space="preserve">current physics</w:delText>
-        </w:r>
-      </w:del>
-      <w:ins w:id="9244" w:author="Claude" w:date="2026-10-08T22:18:30Z">
-        <w:r>
-          <w:t xml:space="preserve">high</w:t>
-        </w:r>
-      </w:ins>
-      <w:r>
-        <w:t xml:space="preserve">-</w:t>
-      </w:r>
-      <w:del w:id="9243" w:author="Claude" w:date="2026-10-08T22:18:30Z">
-        <w:r>
-          <w:delText xml:space="preserve">based</w:delText>
-        </w:r>
-      </w:del>
-      <w:ins w:id="9242" w:author="Claude" w:date="2026-10-08T22:18:30Z">
-        <w:r>
-          <w:t xml:space="preserve">fidelity</w:t>
-        </w:r>
-      </w:ins>
-      <w:r>
-        <w:t xml:space="preserve"> simulations remain computationally demanding, the reduced calibrated parameter space</w:t>
+      <w:r>
+        <w:t xml:space="preserve">high-fidelity </w:t>
+      </w:r>
+      <w:r>
+        <w:t>simulations remain computationally demanding, the reduced calibrated parameter space</w:t>
       </w:r>
       <w:r>
         <w:t xml:space="preserve"> </w:t>
@@ -22929,7 +21690,7 @@
         <w:pStyle w:val="BodyText"/>
         <w:ind w:firstLine="0"/>
         <w:rPr>
-          <w:ins w:id="20001" w:author="Claude" w:date="2026-10-08T22:18:30Z"/>
+          <w:ins w:id="32" w:author="Claude" w:date="2026-10-08T20:38:00Z"/>
         </w:rPr>
       </w:pPr>
     </w:p>
@@ -22938,7 +21699,7 @@
         <w:pStyle w:val="BodyText"/>
         <w:ind w:firstLine="0"/>
         <w:rPr>
-          <w:ins w:id="20002" w:author="Claude" w:date="2026-10-08T22:18:30Z"/>
+          <w:ins w:id="33" w:author="Claude" w:date="2026-10-08T20:38:00Z"/>
         </w:rPr>
       </w:pPr>
     </w:p>
@@ -22947,11 +21708,11 @@
         <w:pStyle w:val="BodyText"/>
         <w:ind w:firstLine="0"/>
         <w:rPr>
-          <w:ins w:id="20003" w:author="Claude" w:date="2026-10-08T22:18:30Z"/>
+          <w:ins w:id="34" w:author="Claude" w:date="2026-10-08T20:38:00Z"/>
         </w:rPr>
       </w:pPr>
     </w:p>
-    <w:bookmarkEnd w:id="24"/>
+    <w:bookmarkEnd w:id="27"/>
     <w:p>
       <w:pPr>
         <w:pStyle w:val="Heading1"/>
@@ -22964,49 +21725,26 @@
       <w:pPr>
         <w:pStyle w:val="BodyText"/>
       </w:pPr>
-      <w:bookmarkStart w:id="28" w:name="_Hlk238630414"/>
+      <w:bookmarkStart w:id="35" w:name="_Hlk238630414"/>
       <w:r>
         <w:t xml:space="preserve">Zn biodegradation under physiological conditions becomes an oxygen-transport-controlled process after an initial reaction-controlled stage in which implant geometry governs the spatial evolution of material loss. The proposed 3D reaction-diffusion model closely reproduced independent 28-day immersion data (RMSE = 0.0159%) and, without further calibration, predicted approximately 6% mass loss </w:t>
       </w:r>
       <w:r>
         <w:t>for a six-crown stent</w:t>
       </w:r>
-      <w:del w:id="9252" w:author="Claude" w:date="2026-10-08T22:18:30Z">
+      <w:del w:id="36" w:author="Claude" w:date="2026-10-08T20:38:00Z">
         <w:r>
-          <w:delText xml:space="preserve">,</w:delText>
+          <w:delText>,</w:delText>
         </w:r>
       </w:del>
       <w:r>
         <w:t xml:space="preserve"> </w:t>
       </w:r>
-      <w:del w:id="9251" w:author="Claude" w:date="2026-10-08T22:18:30Z">
-        <w:r>
-          <w:delText xml:space="preserve">consistent</w:delText>
-        </w:r>
-      </w:del>
-      <w:ins w:id="9250" w:author="Claude" w:date="2026-10-08T22:18:30Z">
-        <w:r>
-          <w:t xml:space="preserve">of</w:t>
-        </w:r>
-      </w:ins>
-      <w:r>
-        <w:t xml:space="preserve"> </w:t>
-      </w:r>
-      <w:del w:id="9249" w:author="Claude" w:date="2026-10-08T22:18:30Z">
-        <w:r>
-          <w:delText xml:space="preserve">with</w:delText>
-        </w:r>
-      </w:del>
-      <w:ins w:id="9248" w:author="Claude" w:date="2026-10-08T22:18:30Z">
-        <w:r>
-          <w:t xml:space="preserve">the same order of magnitude as</w:t>
-        </w:r>
-      </w:ins>
-      <w:r>
-        <w:t xml:space="preserve"> </w:t>
-      </w:r>
-      <w:r>
-        <w:t xml:space="preserve">reported </w:t>
+      <w:r>
+        <w:t>of the same order of magnitude as</w:t>
+      </w:r>
+      <w:r>
+        <w:t xml:space="preserve"> reported </w:t>
       </w:r>
       <w:r>
         <w:rPr>
@@ -23018,20 +21756,13 @@
       <w:r>
         <w:t xml:space="preserve"> observations. Mechanistic and sensitivity analyses </w:t>
       </w:r>
-      <w:del w:id="9247" w:author="Claude" w:date="2026-10-08T22:18:30Z">
-        <w:r>
-          <w:delText xml:space="preserve">identified</w:delText>
-        </w:r>
-      </w:del>
-      <w:ins w:id="9246" w:author="Claude" w:date="2026-10-08T22:18:30Z">
-        <w:r>
-          <w:t>identify</w:t>
-        </w:r>
-      </w:ins>
+      <w:r>
+        <w:t>identify</w:t>
+      </w:r>
       <w:r>
         <w:t xml:space="preserve"> oxygen availability as the primary driver of degradation, with corrosion-product accumulation progressively restricting transport and leading to diffusion-controlled behavior. Importantly, localized degradation emerged naturally from geometry-dependent transport phenomena, without imposing spatially varying corrosion kinetics. While curvature and inter-strut spacing produced only modest changes in cumulative mass loss, they strongly altered the distribution of material recession, demonstrating that global degradation metrics can obscure the localized thinning responsible for structural failure. These findings establish geometry as a critical determinant of biodegradable implant performance and provide a predictive framework for integrating degradation into the design and optimization of Zn stents and other biodegradable metallic implants, enabling structural performance to be considered throughout the implant lifetime rather than only at implantation.</w:t>
       </w:r>
-      <w:bookmarkEnd w:id="28"/>
+      <w:bookmarkEnd w:id="35"/>
     </w:p>
     <w:p>
       <w:pPr>
@@ -23107,6 +21838,36 @@
     <w:p>
       <w:pPr>
         <w:pStyle w:val="MainText"/>
+        <w:spacing w:before="240" w:after="240" w:line="240" w:lineRule="auto"/>
+        <w:rPr>
+          <w:b/>
+          <w:bCs/>
+        </w:rPr>
+      </w:pPr>
+    </w:p>
+    <w:p>
+      <w:pPr>
+        <w:pStyle w:val="MainText"/>
+        <w:spacing w:before="240" w:after="240" w:line="240" w:lineRule="auto"/>
+        <w:rPr>
+          <w:b/>
+          <w:bCs/>
+        </w:rPr>
+      </w:pPr>
+    </w:p>
+    <w:p>
+      <w:pPr>
+        <w:pStyle w:val="MainText"/>
+        <w:spacing w:before="240" w:after="240" w:line="240" w:lineRule="auto"/>
+        <w:rPr>
+          <w:b/>
+          <w:bCs/>
+        </w:rPr>
+      </w:pPr>
+    </w:p>
+    <w:p>
+      <w:pPr>
+        <w:pStyle w:val="MainText"/>
         <w:keepNext/>
         <w:spacing w:before="240" w:after="240" w:line="240" w:lineRule="auto"/>
         <w:rPr>
@@ -23119,6 +21880,7 @@
           <w:b/>
           <w:bCs/>
         </w:rPr>
+        <w:lastRenderedPageBreak/>
         <w:t>Author contribution</w:t>
       </w:r>
     </w:p>
@@ -23174,10 +21936,7 @@
         <w:t>Yunlong Tang:</w:t>
       </w:r>
       <w:r>
-        <w:t xml:space="preserve"> Conceptualization, Supervision, Resources, </w:t>
-      </w:r>
-      <w:r>
-        <w:t>Writing – review &amp; editing.</w:t>
+        <w:t xml:space="preserve"> Conceptualization, Supervision, Resources, Writing – review &amp; editing.</w:t>
       </w:r>
       <w:r>
         <w:t xml:space="preserve"> </w:t>
@@ -23385,6 +22144,7 @@
           <w:b/>
           <w:bCs/>
         </w:rPr>
+        <w:lastRenderedPageBreak/>
         <w:t>References</w:t>
       </w:r>
     </w:p>
@@ -23825,6 +22585,7 @@
         <w:t xml:space="preserve">16. D. Gastaldi, V. Sassi, L. Petrini, M. Vedani, S. Trasatti, and F. Migliavacca, “Continuum Damage Model for Bioresorbable Magnesium Alloy Devices — Application to Coronary </w:t>
       </w:r>
       <w:r>
+        <w:lastRenderedPageBreak/>
         <w:t xml:space="preserve">Stents,” </w:t>
       </w:r>
       <w:r>
@@ -24259,6 +23020,7 @@
           <w:i/>
           <w:iCs/>
         </w:rPr>
+        <w:lastRenderedPageBreak/>
         <w:t>Contaminant Transport, Sorption/Desorption and Dissolution Kinetics</w:t>
       </w:r>
       <w:r>
@@ -24710,7 +23472,7 @@
 </file>
 
 <file path=word/endnotes.xml><?xml version="1.0" encoding="utf-8"?>
-<w:endnotes xmlns:wpc="http://schemas.microsoft.com/office/word/2010/wordprocessingCanvas" xmlns:cx="http://schemas.microsoft.com/office/drawing/2014/chartex" xmlns:cx1="http://schemas.microsoft.com/office/drawing/2015/9/8/chartex" xmlns:cx2="http://schemas.microsoft.com/office/drawing/2015/10/21/chartex" xmlns:cx3="http://schemas.microsoft.com/office/drawing/2016/5/9/chartex" xmlns:cx4="http://schemas.microsoft.com/office/drawing/2016/5/10/chartex" xmlns:cx5="http://schemas.microsoft.com/office/drawing/2016/5/11/chartex" xmlns:cx6="http://schemas.microsoft.com/office/drawing/2016/5/12/chartex" xmlns:cx7="http://schemas.microsoft.com/office/drawing/2016/5/13/chartex" xmlns:cx8="http://schemas.microsoft.com/office/drawing/2016/5/14/chartex" xmlns:mc="http://schemas.openxmlformats.org/markup-compatibility/2006" xmlns:aink="http://schemas.microsoft.com/office/drawing/2016/ink" xmlns:am3d="http://schemas.microsoft.com/office/drawing/2017/model3d" xmlns:o="urn:schemas-microsoft-com:office:office" xmlns:oel="http://schemas.microsoft.com/office/2019/extlst" xmlns:r="http://schemas.openxmlformats.org/officeDocument/2006/relationships" xmlns:m="http://schemas.openxmlformats.org/officeDocument/2006/math" xmlns:v="urn:schemas-microsoft-com:vml" xmlns:wp14="http://schemas.microsoft.com/office/word/2010/wordprocessingDrawing" xmlns:wp="http://schemas.openxmlformats.org/drawingml/2006/wordprocessingDrawing" xmlns:w10="urn:schemas-microsoft-com:office:word" xmlns:w="http://schemas.openxmlformats.org/wordprocessingml/2006/main" xmlns:w14="http://schemas.microsoft.com/office/word/2010/wordml" xmlns:w15="http://schemas.microsoft.com/office/word/2012/wordml" xmlns:w16cex="http://schemas.microsoft.com/office/word/2018/wordml/cex" xmlns:w16cid="http://schemas.microsoft.com/office/word/2016/wordml/cid" xmlns:w16="http://schemas.microsoft.com/office/word/2018/wordml" xmlns:w16du="http://schemas.microsoft.com/office/word/2023/wordml/word16du" xmlns:w16sdtdh="http://schemas.microsoft.com/office/word/2020/wordml/sdtdatahash" xmlns:w16sdtfl="http://schemas.microsoft.com/office/word/2024/wordml/sdtformatlock" xmlns:w16se="http://schemas.microsoft.com/office/word/2015/wordml/symex" xmlns:wpg="http://schemas.microsoft.com/office/word/2010/wordprocessingGroup" xmlns:wpi="http://schemas.microsoft.com/office/word/2010/wordprocessingInk" xmlns:wne="http://schemas.microsoft.com/office/word/2006/wordml" xmlns:wps="http://schemas.microsoft.com/office/word/2010/wordprocessingShape" mc:Ignorable="w14 w15 w16se w16cid w16 w16cex w16sdtdh w16sdtfl w16du wp14">
+<w:endnotes xmlns:wpc="http://schemas.microsoft.com/office/word/2010/wordprocessingCanvas" xmlns:cx="http://schemas.microsoft.com/office/drawing/2014/chartex" xmlns:cx1="http://schemas.microsoft.com/office/drawing/2015/9/8/chartex" xmlns:cx2="http://schemas.microsoft.com/office/drawing/2015/10/21/chartex" xmlns:cx3="http://schemas.microsoft.com/office/drawing/2016/5/9/chartex" xmlns:cx4="http://schemas.microsoft.com/office/drawing/2016/5/10/chartex" xmlns:cx5="http://schemas.microsoft.com/office/drawing/2016/5/11/chartex" xmlns:cx6="http://schemas.microsoft.com/office/drawing/2016/5/12/chartex" xmlns:cx7="http://schemas.microsoft.com/office/drawing/2016/5/13/chartex" xmlns:cx8="http://schemas.microsoft.com/office/drawing/2016/5/14/chartex" xmlns:mc="http://schemas.openxmlformats.org/markup-compatibility/2006" xmlns:aink="http://schemas.microsoft.com/office/drawing/2016/ink" xmlns:am3d="http://schemas.microsoft.com/office/drawing/2017/model3d" xmlns:o="urn:schemas-microsoft-com:office:office" xmlns:r="http://schemas.openxmlformats.org/officeDocument/2006/relationships" xmlns:m="http://schemas.openxmlformats.org/officeDocument/2006/math" xmlns:v="urn:schemas-microsoft-com:vml" xmlns:wp14="http://schemas.microsoft.com/office/word/2010/wordprocessingDrawing" xmlns:wp="http://schemas.openxmlformats.org/drawingml/2006/wordprocessingDrawing" xmlns:w10="urn:schemas-microsoft-com:office:word" xmlns:w="http://schemas.openxmlformats.org/wordprocessingml/2006/main" xmlns:w14="http://schemas.microsoft.com/office/word/2010/wordml" xmlns:w15="http://schemas.microsoft.com/office/word/2012/wordml" xmlns:w16cex="http://schemas.microsoft.com/office/word/2018/wordml/cex" xmlns:w16cid="http://schemas.microsoft.com/office/word/2016/wordml/cid" xmlns:w16="http://schemas.microsoft.com/office/word/2018/wordml" xmlns:w16sdtdh="http://schemas.microsoft.com/office/word/2020/wordml/sdtdatahash" xmlns:w16se="http://schemas.microsoft.com/office/word/2015/wordml/symex" xmlns:wpg="http://schemas.microsoft.com/office/word/2010/wordprocessingGroup" xmlns:wpi="http://schemas.microsoft.com/office/word/2010/wordprocessingInk" xmlns:wne="http://schemas.microsoft.com/office/word/2006/wordml" xmlns:wps="http://schemas.microsoft.com/office/word/2010/wordprocessingShape" mc:Ignorable="w14 w15 w16se w16cid w16 w16cex w16sdtdh wp14">
   <w:endnote w:type="separator" w:id="-1">
     <w:p>
       <w:r>
@@ -24729,7 +23491,7 @@
 </file>
 
 <file path=word/footer1.xml><?xml version="1.0" encoding="utf-8"?>
-<w:ftr xmlns:wpc="http://schemas.microsoft.com/office/word/2010/wordprocessingCanvas" xmlns:cx="http://schemas.microsoft.com/office/drawing/2014/chartex" xmlns:cx1="http://schemas.microsoft.com/office/drawing/2015/9/8/chartex" xmlns:cx2="http://schemas.microsoft.com/office/drawing/2015/10/21/chartex" xmlns:cx3="http://schemas.microsoft.com/office/drawing/2016/5/9/chartex" xmlns:cx4="http://schemas.microsoft.com/office/drawing/2016/5/10/chartex" xmlns:cx5="http://schemas.microsoft.com/office/drawing/2016/5/11/chartex" xmlns:cx6="http://schemas.microsoft.com/office/drawing/2016/5/12/chartex" xmlns:cx7="http://schemas.microsoft.com/office/drawing/2016/5/13/chartex" xmlns:cx8="http://schemas.microsoft.com/office/drawing/2016/5/14/chartex" xmlns:mc="http://schemas.openxmlformats.org/markup-compatibility/2006" xmlns:aink="http://schemas.microsoft.com/office/drawing/2016/ink" xmlns:am3d="http://schemas.microsoft.com/office/drawing/2017/model3d" xmlns:o="urn:schemas-microsoft-com:office:office" xmlns:oel="http://schemas.microsoft.com/office/2019/extlst" xmlns:r="http://schemas.openxmlformats.org/officeDocument/2006/relationships" xmlns:m="http://schemas.openxmlformats.org/officeDocument/2006/math" xmlns:v="urn:schemas-microsoft-com:vml" xmlns:wp14="http://schemas.microsoft.com/office/word/2010/wordprocessingDrawing" xmlns:wp="http://schemas.openxmlformats.org/drawingml/2006/wordprocessingDrawing" xmlns:w10="urn:schemas-microsoft-com:office:word" xmlns:w="http://schemas.openxmlformats.org/wordprocessingml/2006/main" xmlns:w14="http://schemas.microsoft.com/office/word/2010/wordml" xmlns:w15="http://schemas.microsoft.com/office/word/2012/wordml" xmlns:w16cex="http://schemas.microsoft.com/office/word/2018/wordml/cex" xmlns:w16cid="http://schemas.microsoft.com/office/word/2016/wordml/cid" xmlns:w16="http://schemas.microsoft.com/office/word/2018/wordml" xmlns:w16du="http://schemas.microsoft.com/office/word/2023/wordml/word16du" xmlns:w16sdtdh="http://schemas.microsoft.com/office/word/2020/wordml/sdtdatahash" xmlns:w16sdtfl="http://schemas.microsoft.com/office/word/2024/wordml/sdtformatlock" xmlns:w16se="http://schemas.microsoft.com/office/word/2015/wordml/symex" xmlns:wpg="http://schemas.microsoft.com/office/word/2010/wordprocessingGroup" xmlns:wpi="http://schemas.microsoft.com/office/word/2010/wordprocessingInk" xmlns:wne="http://schemas.microsoft.com/office/word/2006/wordml" xmlns:wps="http://schemas.microsoft.com/office/word/2010/wordprocessingShape" mc:Ignorable="w14 w15 w16se w16cid w16 w16cex w16sdtdh w16sdtfl w16du wp14">
+<w:ftr xmlns:wpc="http://schemas.microsoft.com/office/word/2010/wordprocessingCanvas" xmlns:cx="http://schemas.microsoft.com/office/drawing/2014/chartex" xmlns:cx1="http://schemas.microsoft.com/office/drawing/2015/9/8/chartex" xmlns:cx2="http://schemas.microsoft.com/office/drawing/2015/10/21/chartex" xmlns:cx3="http://schemas.microsoft.com/office/drawing/2016/5/9/chartex" xmlns:cx4="http://schemas.microsoft.com/office/drawing/2016/5/10/chartex" xmlns:cx5="http://schemas.microsoft.com/office/drawing/2016/5/11/chartex" xmlns:cx6="http://schemas.microsoft.com/office/drawing/2016/5/12/chartex" xmlns:cx7="http://schemas.microsoft.com/office/drawing/2016/5/13/chartex" xmlns:cx8="http://schemas.microsoft.com/office/drawing/2016/5/14/chartex" xmlns:mc="http://schemas.openxmlformats.org/markup-compatibility/2006" xmlns:aink="http://schemas.microsoft.com/office/drawing/2016/ink" xmlns:am3d="http://schemas.microsoft.com/office/drawing/2017/model3d" xmlns:o="urn:schemas-microsoft-com:office:office" xmlns:r="http://schemas.openxmlformats.org/officeDocument/2006/relationships" xmlns:m="http://schemas.openxmlformats.org/officeDocument/2006/math" xmlns:v="urn:schemas-microsoft-com:vml" xmlns:wp14="http://schemas.microsoft.com/office/word/2010/wordprocessingDrawing" xmlns:wp="http://schemas.openxmlformats.org/drawingml/2006/wordprocessingDrawing" xmlns:w10="urn:schemas-microsoft-com:office:word" xmlns:w="http://schemas.openxmlformats.org/wordprocessingml/2006/main" xmlns:w14="http://schemas.microsoft.com/office/word/2010/wordml" xmlns:w15="http://schemas.microsoft.com/office/word/2012/wordml" xmlns:w16cex="http://schemas.microsoft.com/office/word/2018/wordml/cex" xmlns:w16cid="http://schemas.microsoft.com/office/word/2016/wordml/cid" xmlns:w16="http://schemas.microsoft.com/office/word/2018/wordml" xmlns:w16sdtdh="http://schemas.microsoft.com/office/word/2020/wordml/sdtdatahash" xmlns:w16se="http://schemas.microsoft.com/office/word/2015/wordml/symex" xmlns:wpg="http://schemas.microsoft.com/office/word/2010/wordprocessingGroup" xmlns:wpi="http://schemas.microsoft.com/office/word/2010/wordprocessingInk" xmlns:wne="http://schemas.microsoft.com/office/word/2006/wordml" xmlns:wps="http://schemas.microsoft.com/office/word/2010/wordprocessingShape" mc:Ignorable="w14 w15 w16se w16cid w16 w16cex w16sdtdh wp14">
   <w:p>
     <w:pPr>
       <w:pStyle w:val="Footer"/>
@@ -24764,7 +23526,7 @@
 </file>
 
 <file path=word/footnotes.xml><?xml version="1.0" encoding="utf-8"?>
-<w:footnotes xmlns:wpc="http://schemas.microsoft.com/office/word/2010/wordprocessingCanvas" xmlns:cx="http://schemas.microsoft.com/office/drawing/2014/chartex" xmlns:cx1="http://schemas.microsoft.com/office/drawing/2015/9/8/chartex" xmlns:cx2="http://schemas.microsoft.com/office/drawing/2015/10/21/chartex" xmlns:cx3="http://schemas.microsoft.com/office/drawing/2016/5/9/chartex" xmlns:cx4="http://schemas.microsoft.com/office/drawing/2016/5/10/chartex" xmlns:cx5="http://schemas.microsoft.com/office/drawing/2016/5/11/chartex" xmlns:cx6="http://schemas.microsoft.com/office/drawing/2016/5/12/chartex" xmlns:cx7="http://schemas.microsoft.com/office/drawing/2016/5/13/chartex" xmlns:cx8="http://schemas.microsoft.com/office/drawing/2016/5/14/chartex" xmlns:mc="http://schemas.openxmlformats.org/markup-compatibility/2006" xmlns:aink="http://schemas.microsoft.com/office/drawing/2016/ink" xmlns:am3d="http://schemas.microsoft.com/office/drawing/2017/model3d" xmlns:o="urn:schemas-microsoft-com:office:office" xmlns:oel="http://schemas.microsoft.com/office/2019/extlst" xmlns:r="http://schemas.openxmlformats.org/officeDocument/2006/relationships" xmlns:m="http://schemas.openxmlformats.org/officeDocument/2006/math" xmlns:v="urn:schemas-microsoft-com:vml" xmlns:wp14="http://schemas.microsoft.com/office/word/2010/wordprocessingDrawing" xmlns:wp="http://schemas.openxmlformats.org/drawingml/2006/wordprocessingDrawing" xmlns:w10="urn:schemas-microsoft-com:office:word" xmlns:w="http://schemas.openxmlformats.org/wordprocessingml/2006/main" xmlns:w14="http://schemas.microsoft.com/office/word/2010/wordml" xmlns:w15="http://schemas.microsoft.com/office/word/2012/wordml" xmlns:w16cex="http://schemas.microsoft.com/office/word/2018/wordml/cex" xmlns:w16cid="http://schemas.microsoft.com/office/word/2016/wordml/cid" xmlns:w16="http://schemas.microsoft.com/office/word/2018/wordml" xmlns:w16du="http://schemas.microsoft.com/office/word/2023/wordml/word16du" xmlns:w16sdtdh="http://schemas.microsoft.com/office/word/2020/wordml/sdtdatahash" xmlns:w16sdtfl="http://schemas.microsoft.com/office/word/2024/wordml/sdtformatlock" xmlns:w16se="http://schemas.microsoft.com/office/word/2015/wordml/symex" xmlns:wpg="http://schemas.microsoft.com/office/word/2010/wordprocessingGroup" xmlns:wpi="http://schemas.microsoft.com/office/word/2010/wordprocessingInk" xmlns:wne="http://schemas.microsoft.com/office/word/2006/wordml" xmlns:wps="http://schemas.microsoft.com/office/word/2010/wordprocessingShape" mc:Ignorable="w14 w15 w16se w16cid w16 w16cex w16sdtdh w16sdtfl w16du wp14">
+<w:footnotes xmlns:wpc="http://schemas.microsoft.com/office/word/2010/wordprocessingCanvas" xmlns:cx="http://schemas.microsoft.com/office/drawing/2014/chartex" xmlns:cx1="http://schemas.microsoft.com/office/drawing/2015/9/8/chartex" xmlns:cx2="http://schemas.microsoft.com/office/drawing/2015/10/21/chartex" xmlns:cx3="http://schemas.microsoft.com/office/drawing/2016/5/9/chartex" xmlns:cx4="http://schemas.microsoft.com/office/drawing/2016/5/10/chartex" xmlns:cx5="http://schemas.microsoft.com/office/drawing/2016/5/11/chartex" xmlns:cx6="http://schemas.microsoft.com/office/drawing/2016/5/12/chartex" xmlns:cx7="http://schemas.microsoft.com/office/drawing/2016/5/13/chartex" xmlns:cx8="http://schemas.microsoft.com/office/drawing/2016/5/14/chartex" xmlns:mc="http://schemas.openxmlformats.org/markup-compatibility/2006" xmlns:aink="http://schemas.microsoft.com/office/drawing/2016/ink" xmlns:am3d="http://schemas.microsoft.com/office/drawing/2017/model3d" xmlns:o="urn:schemas-microsoft-com:office:office" xmlns:r="http://schemas.openxmlformats.org/officeDocument/2006/relationships" xmlns:m="http://schemas.openxmlformats.org/officeDocument/2006/math" xmlns:v="urn:schemas-microsoft-com:vml" xmlns:wp14="http://schemas.microsoft.com/office/word/2010/wordprocessingDrawing" xmlns:wp="http://schemas.openxmlformats.org/drawingml/2006/wordprocessingDrawing" xmlns:w10="urn:schemas-microsoft-com:office:word" xmlns:w="http://schemas.openxmlformats.org/wordprocessingml/2006/main" xmlns:w14="http://schemas.microsoft.com/office/word/2010/wordml" xmlns:w15="http://schemas.microsoft.com/office/word/2012/wordml" xmlns:w16cex="http://schemas.microsoft.com/office/word/2018/wordml/cex" xmlns:w16cid="http://schemas.microsoft.com/office/word/2016/wordml/cid" xmlns:w16="http://schemas.microsoft.com/office/word/2018/wordml" xmlns:w16sdtdh="http://schemas.microsoft.com/office/word/2020/wordml/sdtdatahash" xmlns:w16se="http://schemas.microsoft.com/office/word/2015/wordml/symex" xmlns:wpg="http://schemas.microsoft.com/office/word/2010/wordprocessingGroup" xmlns:wpi="http://schemas.microsoft.com/office/word/2010/wordprocessingInk" xmlns:wne="http://schemas.microsoft.com/office/word/2006/wordml" xmlns:wps="http://schemas.microsoft.com/office/word/2010/wordprocessingShape" mc:Ignorable="w14 w15 w16se w16cid w16 w16cex w16sdtdh wp14">
   <w:footnote w:type="separator" w:id="-1">
     <w:p>
       <w:r>
@@ -24783,7 +23545,7 @@
 </file>
 
 <file path=word/header1.xml><?xml version="1.0" encoding="utf-8"?>
-<w:hdr xmlns:wpc="http://schemas.microsoft.com/office/word/2010/wordprocessingCanvas" xmlns:cx="http://schemas.microsoft.com/office/drawing/2014/chartex" xmlns:cx1="http://schemas.microsoft.com/office/drawing/2015/9/8/chartex" xmlns:cx2="http://schemas.microsoft.com/office/drawing/2015/10/21/chartex" xmlns:cx3="http://schemas.microsoft.com/office/drawing/2016/5/9/chartex" xmlns:cx4="http://schemas.microsoft.com/office/drawing/2016/5/10/chartex" xmlns:cx5="http://schemas.microsoft.com/office/drawing/2016/5/11/chartex" xmlns:cx6="http://schemas.microsoft.com/office/drawing/2016/5/12/chartex" xmlns:cx7="http://schemas.microsoft.com/office/drawing/2016/5/13/chartex" xmlns:cx8="http://schemas.microsoft.com/office/drawing/2016/5/14/chartex" xmlns:mc="http://schemas.openxmlformats.org/markup-compatibility/2006" xmlns:aink="http://schemas.microsoft.com/office/drawing/2016/ink" xmlns:am3d="http://schemas.microsoft.com/office/drawing/2017/model3d" xmlns:o="urn:schemas-microsoft-com:office:office" xmlns:oel="http://schemas.microsoft.com/office/2019/extlst" xmlns:r="http://schemas.openxmlformats.org/officeDocument/2006/relationships" xmlns:m="http://schemas.openxmlformats.org/officeDocument/2006/math" xmlns:v="urn:schemas-microsoft-com:vml" xmlns:wp14="http://schemas.microsoft.com/office/word/2010/wordprocessingDrawing" xmlns:wp="http://schemas.openxmlformats.org/drawingml/2006/wordprocessingDrawing" xmlns:w10="urn:schemas-microsoft-com:office:word" xmlns:w="http://schemas.openxmlformats.org/wordprocessingml/2006/main" xmlns:w14="http://schemas.microsoft.com/office/word/2010/wordml" xmlns:w15="http://schemas.microsoft.com/office/word/2012/wordml" xmlns:w16cex="http://schemas.microsoft.com/office/word/2018/wordml/cex" xmlns:w16cid="http://schemas.microsoft.com/office/word/2016/wordml/cid" xmlns:w16="http://schemas.microsoft.com/office/word/2018/wordml" xmlns:w16du="http://schemas.microsoft.com/office/word/2023/wordml/word16du" xmlns:w16sdtdh="http://schemas.microsoft.com/office/word/2020/wordml/sdtdatahash" xmlns:w16sdtfl="http://schemas.microsoft.com/office/word/2024/wordml/sdtformatlock" xmlns:w16se="http://schemas.microsoft.com/office/word/2015/wordml/symex" xmlns:wpg="http://schemas.microsoft.com/office/word/2010/wordprocessingGroup" xmlns:wpi="http://schemas.microsoft.com/office/word/2010/wordprocessingInk" xmlns:wne="http://schemas.microsoft.com/office/word/2006/wordml" xmlns:wps="http://schemas.microsoft.com/office/word/2010/wordprocessingShape" mc:Ignorable="w14 w15 w16se w16cid w16 w16cex w16sdtdh w16sdtfl w16du wp14">
+<w:hdr xmlns:wpc="http://schemas.microsoft.com/office/word/2010/wordprocessingCanvas" xmlns:cx="http://schemas.microsoft.com/office/drawing/2014/chartex" xmlns:cx1="http://schemas.microsoft.com/office/drawing/2015/9/8/chartex" xmlns:cx2="http://schemas.microsoft.com/office/drawing/2015/10/21/chartex" xmlns:cx3="http://schemas.microsoft.com/office/drawing/2016/5/9/chartex" xmlns:cx4="http://schemas.microsoft.com/office/drawing/2016/5/10/chartex" xmlns:cx5="http://schemas.microsoft.com/office/drawing/2016/5/11/chartex" xmlns:cx6="http://schemas.microsoft.com/office/drawing/2016/5/12/chartex" xmlns:cx7="http://schemas.microsoft.com/office/drawing/2016/5/13/chartex" xmlns:cx8="http://schemas.microsoft.com/office/drawing/2016/5/14/chartex" xmlns:mc="http://schemas.openxmlformats.org/markup-compatibility/2006" xmlns:aink="http://schemas.microsoft.com/office/drawing/2016/ink" xmlns:am3d="http://schemas.microsoft.com/office/drawing/2017/model3d" xmlns:o="urn:schemas-microsoft-com:office:office" xmlns:r="http://schemas.openxmlformats.org/officeDocument/2006/relationships" xmlns:m="http://schemas.openxmlformats.org/officeDocument/2006/math" xmlns:v="urn:schemas-microsoft-com:vml" xmlns:wp14="http://schemas.microsoft.com/office/word/2010/wordprocessingDrawing" xmlns:wp="http://schemas.openxmlformats.org/drawingml/2006/wordprocessingDrawing" xmlns:w10="urn:schemas-microsoft-com:office:word" xmlns:w="http://schemas.openxmlformats.org/wordprocessingml/2006/main" xmlns:w14="http://schemas.microsoft.com/office/word/2010/wordml" xmlns:w15="http://schemas.microsoft.com/office/word/2012/wordml" xmlns:w16cex="http://schemas.microsoft.com/office/word/2018/wordml/cex" xmlns:w16cid="http://schemas.microsoft.com/office/word/2016/wordml/cid" xmlns:w16="http://schemas.microsoft.com/office/word/2018/wordml" xmlns:w16sdtdh="http://schemas.microsoft.com/office/word/2020/wordml/sdtdatahash" xmlns:w16se="http://schemas.microsoft.com/office/word/2015/wordml/symex" xmlns:wpg="http://schemas.microsoft.com/office/word/2010/wordprocessingGroup" xmlns:wpi="http://schemas.microsoft.com/office/word/2010/wordprocessingInk" xmlns:wne="http://schemas.microsoft.com/office/word/2006/wordml" xmlns:wps="http://schemas.microsoft.com/office/word/2010/wordprocessingShape" mc:Ignorable="w14 w15 w16se w16cid w16 w16cex w16sdtdh wp14">
   <w:p>
     <w:pPr>
       <w:pStyle w:val="Header"/>
@@ -24857,7 +23619,7 @@
 </file>
 
 <file path=word/numbering.xml><?xml version="1.0" encoding="utf-8"?>
-<w:numbering xmlns:wpc="http://schemas.microsoft.com/office/word/2010/wordprocessingCanvas" xmlns:cx="http://schemas.microsoft.com/office/drawing/2014/chartex" xmlns:cx1="http://schemas.microsoft.com/office/drawing/2015/9/8/chartex" xmlns:cx2="http://schemas.microsoft.com/office/drawing/2015/10/21/chartex" xmlns:cx3="http://schemas.microsoft.com/office/drawing/2016/5/9/chartex" xmlns:cx4="http://schemas.microsoft.com/office/drawing/2016/5/10/chartex" xmlns:cx5="http://schemas.microsoft.com/office/drawing/2016/5/11/chartex" xmlns:cx6="http://schemas.microsoft.com/office/drawing/2016/5/12/chartex" xmlns:cx7="http://schemas.microsoft.com/office/drawing/2016/5/13/chartex" xmlns:cx8="http://schemas.microsoft.com/office/drawing/2016/5/14/chartex" xmlns:mc="http://schemas.openxmlformats.org/markup-compatibility/2006" xmlns:aink="http://schemas.microsoft.com/office/drawing/2016/ink" xmlns:am3d="http://schemas.microsoft.com/office/drawing/2017/model3d" xmlns:o="urn:schemas-microsoft-com:office:office" xmlns:oel="http://schemas.microsoft.com/office/2019/extlst" xmlns:r="http://schemas.openxmlformats.org/officeDocument/2006/relationships" xmlns:m="http://schemas.openxmlformats.org/officeDocument/2006/math" xmlns:v="urn:schemas-microsoft-com:vml" xmlns:wp14="http://schemas.microsoft.com/office/word/2010/wordprocessingDrawing" xmlns:wp="http://schemas.openxmlformats.org/drawingml/2006/wordprocessingDrawing" xmlns:w10="urn:schemas-microsoft-com:office:word" xmlns:w="http://schemas.openxmlformats.org/wordprocessingml/2006/main" xmlns:w14="http://schemas.microsoft.com/office/word/2010/wordml" xmlns:w15="http://schemas.microsoft.com/office/word/2012/wordml" xmlns:w16cex="http://schemas.microsoft.com/office/word/2018/wordml/cex" xmlns:w16cid="http://schemas.microsoft.com/office/word/2016/wordml/cid" xmlns:w16="http://schemas.microsoft.com/office/word/2018/wordml" xmlns:w16du="http://schemas.microsoft.com/office/word/2023/wordml/word16du" xmlns:w16sdtdh="http://schemas.microsoft.com/office/word/2020/wordml/sdtdatahash" xmlns:w16sdtfl="http://schemas.microsoft.com/office/word/2024/wordml/sdtformatlock" xmlns:w16se="http://schemas.microsoft.com/office/word/2015/wordml/symex" xmlns:wpg="http://schemas.microsoft.com/office/word/2010/wordprocessingGroup" xmlns:wpi="http://schemas.microsoft.com/office/word/2010/wordprocessingInk" xmlns:wne="http://schemas.microsoft.com/office/word/2006/wordml" xmlns:wps="http://schemas.microsoft.com/office/word/2010/wordprocessingShape" mc:Ignorable="w14 w15 w16se w16cid w16 w16cex w16sdtdh w16sdtfl w16du wp14">
+<w:numbering xmlns:wpc="http://schemas.microsoft.com/office/word/2010/wordprocessingCanvas" xmlns:cx="http://schemas.microsoft.com/office/drawing/2014/chartex" xmlns:cx1="http://schemas.microsoft.com/office/drawing/2015/9/8/chartex" xmlns:cx2="http://schemas.microsoft.com/office/drawing/2015/10/21/chartex" xmlns:cx3="http://schemas.microsoft.com/office/drawing/2016/5/9/chartex" xmlns:cx4="http://schemas.microsoft.com/office/drawing/2016/5/10/chartex" xmlns:cx5="http://schemas.microsoft.com/office/drawing/2016/5/11/chartex" xmlns:cx6="http://schemas.microsoft.com/office/drawing/2016/5/12/chartex" xmlns:cx7="http://schemas.microsoft.com/office/drawing/2016/5/13/chartex" xmlns:cx8="http://schemas.microsoft.com/office/drawing/2016/5/14/chartex" xmlns:mc="http://schemas.openxmlformats.org/markup-compatibility/2006" xmlns:aink="http://schemas.microsoft.com/office/drawing/2016/ink" xmlns:am3d="http://schemas.microsoft.com/office/drawing/2017/model3d" xmlns:o="urn:schemas-microsoft-com:office:office" xmlns:r="http://schemas.openxmlformats.org/officeDocument/2006/relationships" xmlns:m="http://schemas.openxmlformats.org/officeDocument/2006/math" xmlns:v="urn:schemas-microsoft-com:vml" xmlns:wp14="http://schemas.microsoft.com/office/word/2010/wordprocessingDrawing" xmlns:wp="http://schemas.openxmlformats.org/drawingml/2006/wordprocessingDrawing" xmlns:w10="urn:schemas-microsoft-com:office:word" xmlns:w="http://schemas.openxmlformats.org/wordprocessingml/2006/main" xmlns:w14="http://schemas.microsoft.com/office/word/2010/wordml" xmlns:w15="http://schemas.microsoft.com/office/word/2012/wordml" xmlns:w16cex="http://schemas.microsoft.com/office/word/2018/wordml/cex" xmlns:w16cid="http://schemas.microsoft.com/office/word/2016/wordml/cid" xmlns:w16="http://schemas.microsoft.com/office/word/2018/wordml" xmlns:w16sdtdh="http://schemas.microsoft.com/office/word/2020/wordml/sdtdatahash" xmlns:w16se="http://schemas.microsoft.com/office/word/2015/wordml/symex" xmlns:wpg="http://schemas.microsoft.com/office/word/2010/wordprocessingGroup" xmlns:wpi="http://schemas.microsoft.com/office/word/2010/wordprocessingInk" xmlns:wne="http://schemas.microsoft.com/office/word/2006/wordml" xmlns:wps="http://schemas.microsoft.com/office/word/2010/wordprocessingShape" mc:Ignorable="w14 w15 w16se w16cid w16 w16cex w16sdtdh wp14">
   <w:abstractNum w:abstractNumId="0" w15:restartNumberingAfterBreak="0">
     <w:nsid w:val="090830BF"/>
     <w:multiLevelType w:val="multilevel"/>
@@ -25105,23 +23867,23 @@
       </w:pPr>
     </w:lvl>
   </w:abstractNum>
-  <w:num w:numId="1" w16cid:durableId="574631635">
+  <w:num w:numId="1">
     <w:abstractNumId w:val="2"/>
   </w:num>
-  <w:num w:numId="2" w16cid:durableId="829520197">
+  <w:num w:numId="2">
     <w:abstractNumId w:val="0"/>
   </w:num>
-  <w:num w:numId="3" w16cid:durableId="2029675556">
+  <w:num w:numId="3">
     <w:abstractNumId w:val="1"/>
   </w:num>
-  <w:num w:numId="4" w16cid:durableId="1511599704">
+  <w:num w:numId="4">
     <w:abstractNumId w:val="1"/>
   </w:num>
 </w:numbering>
 </file>
 
 <file path=word/styles.xml><?xml version="1.0" encoding="utf-8"?>
-<w:styles xmlns:mc="http://schemas.openxmlformats.org/markup-compatibility/2006" xmlns:r="http://schemas.openxmlformats.org/officeDocument/2006/relationships" xmlns:w="http://schemas.openxmlformats.org/wordprocessingml/2006/main" xmlns:w14="http://schemas.microsoft.com/office/word/2010/wordml" xmlns:w15="http://schemas.microsoft.com/office/word/2012/wordml" xmlns:w16cex="http://schemas.microsoft.com/office/word/2018/wordml/cex" xmlns:w16cid="http://schemas.microsoft.com/office/word/2016/wordml/cid" xmlns:w16="http://schemas.microsoft.com/office/word/2018/wordml" xmlns:w16du="http://schemas.microsoft.com/office/word/2023/wordml/word16du" xmlns:w16sdtdh="http://schemas.microsoft.com/office/word/2020/wordml/sdtdatahash" xmlns:w16sdtfl="http://schemas.microsoft.com/office/word/2024/wordml/sdtformatlock" xmlns:w16se="http://schemas.microsoft.com/office/word/2015/wordml/symex" mc:Ignorable="w14 w15 w16se w16cid w16 w16cex w16sdtdh w16sdtfl w16du">
+<w:styles xmlns:mc="http://schemas.openxmlformats.org/markup-compatibility/2006" xmlns:r="http://schemas.openxmlformats.org/officeDocument/2006/relationships" xmlns:w="http://schemas.openxmlformats.org/wordprocessingml/2006/main" xmlns:w14="http://schemas.microsoft.com/office/word/2010/wordml" xmlns:w15="http://schemas.microsoft.com/office/word/2012/wordml" xmlns:w16cex="http://schemas.microsoft.com/office/word/2018/wordml/cex" xmlns:w16cid="http://schemas.microsoft.com/office/word/2016/wordml/cid" xmlns:w16="http://schemas.microsoft.com/office/word/2018/wordml" xmlns:w16sdtdh="http://schemas.microsoft.com/office/word/2020/wordml/sdtdatahash" xmlns:w16se="http://schemas.microsoft.com/office/word/2015/wordml/symex" mc:Ignorable="w14 w15 w16se w16cid w16 w16cex w16sdtdh">
   <w:docDefaults>
     <w:rPrDefault>
       <w:rPr>
@@ -27019,9 +25781,9 @@
 </file>
 
 <file path=customXml/item1.xml><?xml version="1.0" encoding="utf-8"?>
-<ControlsStorage xmlns="urn:schemas-microsoft-com.VSTO2008Demos.ControlsStorage">
-  <Controls>AAEAAAD/////AQAAAAAAAAAMAgAAAEVDaGVtNFdvcmQuQ29yZSwgVmVyc2lvbj0xLjAuMC4wLCBDdWx0dXJlPW5ldXRyYWwsIFB1YmxpY0tleVRva2VuPW51bGwHAQAAAAABAAAAAAAAAAQgQ2hlbTRXb3JkLkNvcmUuQ29udHJvbFByb3BlcnRpZXMCAAAACw==</Controls>
-</ControlsStorage>
+<p:properties xmlns:p="http://schemas.microsoft.com/office/2006/metadata/properties" xmlns:xsi="http://www.w3.org/2001/XMLSchema-instance" xmlns:pc="http://schemas.microsoft.com/office/infopath/2007/PartnerControls">
+  <documentManagement/>
+</p:properties>
 </file>
 
 <file path=customXml/item2.xml><?xml version="1.0" encoding="utf-8"?>
@@ -27242,16 +26004,12 @@
 </file>
 
 <file path=customXml/item3.xml><?xml version="1.0" encoding="utf-8"?>
-<p:properties xmlns:p="http://schemas.microsoft.com/office/2006/metadata/properties" xmlns:xsi="http://www.w3.org/2001/XMLSchema-instance" xmlns:pc="http://schemas.microsoft.com/office/infopath/2007/PartnerControls">
-  <documentManagement/>
-</p:properties>
+<ControlsStorage xmlns="urn:schemas-microsoft-com.VSTO2008Demos.ControlsStorage">
+  <Controls>AAEAAAD/////AQAAAAAAAAAMAgAAAEVDaGVtNFdvcmQuQ29yZSwgVmVyc2lvbj0xLjAuMC4wLCBDdWx0dXJlPW5ldXRyYWwsIFB1YmxpY0tleVRva2VuPW51bGwHAQAAAAABAAAAAAAAAAQgQ2hlbTRXb3JkLkNvcmUuQ29udHJvbFByb3BlcnRpZXMCAAAACw==</Controls>
+</ControlsStorage>
 </file>
 
 <file path=customXml/item4.xml><?xml version="1.0" encoding="utf-8"?>
-<b:Sources xmlns:b="http://schemas.openxmlformats.org/officeDocument/2006/bibliography" xmlns="http://schemas.openxmlformats.org/officeDocument/2006/bibliography" SelectedStyle="\APASixthEditionOfficeOnline.xsl" StyleName="APA" Version="6"/>
-</file>
-
-<file path=customXml/item5.xml><?xml version="1.0" encoding="utf-8"?>
 <?mso-contentType ?>
 <FormTemplates xmlns="http://schemas.microsoft.com/sharepoint/v3/contenttype/forms">
   <Display>DocumentLibraryForm</Display>
@@ -27260,10 +26018,15 @@
 </FormTemplates>
 </file>
 
+<file path=customXml/item5.xml><?xml version="1.0" encoding="utf-8"?>
+<b:Sources xmlns:b="http://schemas.openxmlformats.org/officeDocument/2006/bibliography" xmlns="http://schemas.openxmlformats.org/officeDocument/2006/bibliography" SelectedStyle="\APASixthEditionOfficeOnline.xsl" StyleName="APA" Version="6"/>
+</file>
+
 <file path=customXml/itemProps1.xml><?xml version="1.0" encoding="utf-8"?>
-<ds:datastoreItem xmlns:ds="http://schemas.openxmlformats.org/officeDocument/2006/customXml" ds:itemID="{E3F19EBF-8207-4BE7-AD18-240ED1895C11}">
+<ds:datastoreItem xmlns:ds="http://schemas.openxmlformats.org/officeDocument/2006/customXml" ds:itemID="{96D19C85-73BE-4F5D-979F-58BFDE5BBE12}">
   <ds:schemaRefs>
-    <ds:schemaRef ds:uri="urn:schemas-microsoft-com.VSTO2008Demos.ControlsStorage"/>
+    <ds:schemaRef ds:uri="http://schemas.microsoft.com/office/2006/metadata/properties"/>
+    <ds:schemaRef ds:uri="http://schemas.microsoft.com/office/infopath/2007/PartnerControls"/>
   </ds:schemaRefs>
 </ds:datastoreItem>
 </file>
@@ -27288,26 +26051,25 @@
 </file>
 
 <file path=customXml/itemProps3.xml><?xml version="1.0" encoding="utf-8"?>
-<ds:datastoreItem xmlns:ds="http://schemas.openxmlformats.org/officeDocument/2006/customXml" ds:itemID="{96D19C85-73BE-4F5D-979F-58BFDE5BBE12}">
+<ds:datastoreItem xmlns:ds="http://schemas.openxmlformats.org/officeDocument/2006/customXml" ds:itemID="{E3F19EBF-8207-4BE7-AD18-240ED1895C11}">
   <ds:schemaRefs>
-    <ds:schemaRef ds:uri="http://schemas.microsoft.com/office/2006/metadata/properties"/>
-    <ds:schemaRef ds:uri="http://schemas.microsoft.com/office/infopath/2007/PartnerControls"/>
+    <ds:schemaRef ds:uri="urn:schemas-microsoft-com.VSTO2008Demos.ControlsStorage"/>
   </ds:schemaRefs>
 </ds:datastoreItem>
 </file>
 
 <file path=customXml/itemProps4.xml><?xml version="1.0" encoding="utf-8"?>
+<ds:datastoreItem xmlns:ds="http://schemas.openxmlformats.org/officeDocument/2006/customXml" ds:itemID="{75886F76-A765-4714-B899-7AC2DC4334A1}">
+  <ds:schemaRefs>
+    <ds:schemaRef ds:uri="http://schemas.microsoft.com/sharepoint/v3/contenttype/forms"/>
+  </ds:schemaRefs>
+</ds:datastoreItem>
+</file>
+
+<file path=customXml/itemProps5.xml><?xml version="1.0" encoding="utf-8"?>
 <ds:datastoreItem xmlns:ds="http://schemas.openxmlformats.org/officeDocument/2006/customXml" ds:itemID="{DE724972-9DFC-40BC-BA35-EDB291A5A412}">
   <ds:schemaRefs>
     <ds:schemaRef ds:uri="http://schemas.openxmlformats.org/officeDocument/2006/bibliography"/>
   </ds:schemaRefs>
 </ds:datastoreItem>
-</file>
-
-<file path=customXml/itemProps5.xml><?xml version="1.0" encoding="utf-8"?>
-<ds:datastoreItem xmlns:ds="http://schemas.openxmlformats.org/officeDocument/2006/customXml" ds:itemID="{75886F76-A765-4714-B899-7AC2DC4334A1}">
-  <ds:schemaRefs>
-    <ds:schemaRef ds:uri="http://schemas.microsoft.com/sharepoint/v3/contenttype/forms"/>
-  </ds:schemaRefs>
-</ds:datastoreItem>
 </file>
</xml_diff>

<commit_message>
SI contents cleanup, Table S1 caption, manuscript film wording, A1.4
</commit_message>
<xml_diff>
--- a/deliver/Manuscript_tracked.docx
+++ b/deliver/Manuscript_tracked.docx
@@ -27,15 +27,7 @@
         <w:spacing w:line="360" w:lineRule="auto"/>
       </w:pPr>
       <w:r>
-        <w:t xml:space="preserve">Henaka Ariyarathna, Xuan Yang, </w:t>
-      </w:r>
-      <w:proofErr w:type="spellStart"/>
-      <w:r>
-        <w:t>Aijun</w:t>
-      </w:r>
-      <w:proofErr w:type="spellEnd"/>
-      <w:r>
-        <w:t xml:space="preserve"> Huang, Yunlong Tang</w:t>
+        <w:t>Henaka Ariyarathna, Xuan Yang, Aijun Huang, Yunlong Tang</w:t>
       </w:r>
       <m:oMath>
         <m:sSup>
@@ -306,16 +298,7 @@
         <w:t>to a six-crown Zn stent without geometry-specific recalibration, the model predicts approximately 6% mass loss after one month, on</w:t>
       </w:r>
       <w:r>
-        <w:t xml:space="preserve"> the same order of </w:t>
-      </w:r>
-      <w:r>
-        <w:t xml:space="preserve">magnitude </w:t>
-      </w:r>
-      <w:r>
-        <w:t xml:space="preserve">as </w:t>
-      </w:r>
-      <w:r>
-        <w:t xml:space="preserve">reported </w:t>
+        <w:t xml:space="preserve"> the same order of magnitude as reported </w:t>
       </w:r>
       <w:r>
         <w:rPr>
@@ -1261,11 +1244,7 @@
         </w:r>
       </w:ins>
       <w:r>
-        <w:t xml:space="preserve"> evolution with moving-interface tracking; (b) calibration of the three effective kinetic parameters (</w:t>
-      </w:r>
-      <w:proofErr w:type="spellStart"/>
-      <w:r>
-        <w:t>k</w:t>
+        <w:t xml:space="preserve"> evolution with moving-interface tracking; (b) calibration of the three effective kinetic parameters (k</w:t>
       </w:r>
       <w:r>
         <w:rPr>
@@ -1273,13 +1252,8 @@
         </w:rPr>
         <w:t>f</w:t>
       </w:r>
-      <w:proofErr w:type="spellEnd"/>
-      <w:r>
-        <w:t xml:space="preserve">, </w:t>
-      </w:r>
-      <w:proofErr w:type="spellStart"/>
-      <w:r>
-        <w:t>k</w:t>
+      <w:r>
+        <w:t>, k</w:t>
       </w:r>
       <w:r>
         <w:rPr>
@@ -1287,13 +1261,8 @@
         </w:rPr>
         <w:t>d</w:t>
       </w:r>
-      <w:proofErr w:type="spellEnd"/>
-      <w:r>
-        <w:t xml:space="preserve">, </w:t>
-      </w:r>
-      <w:proofErr w:type="spellStart"/>
-      <w:r>
-        <w:t>k</w:t>
+      <w:r>
+        <w:t>, k</w:t>
       </w:r>
       <w:r>
         <w:rPr>
@@ -1301,7 +1270,6 @@
         </w:rPr>
         <w:t>ORR</w:t>
       </w:r>
-      <w:proofErr w:type="spellEnd"/>
       <w:r>
         <w:t>) against literature mass-loss data (0–336 h); (c) validation against the mass loss measured in this study (0–672 h) for Ø10 × 2 mm discs; and (d) model predictions for a six-crown Zn stent.</w:t>
       </w:r>
@@ -1333,21 +1301,7 @@
         <w:rPr>
           <w:rFonts w:cs="Times New Roman"/>
         </w:rPr>
-        <w:t xml:space="preserve">Commercially pure Zn (99.99 </w:t>
-      </w:r>
-      <w:proofErr w:type="spellStart"/>
-      <w:r>
-        <w:rPr>
-          <w:rFonts w:cs="Times New Roman"/>
-        </w:rPr>
-        <w:t>wt</w:t>
-      </w:r>
-      <w:proofErr w:type="spellEnd"/>
-      <w:r>
-        <w:rPr>
-          <w:rFonts w:cs="Times New Roman"/>
-        </w:rPr>
-        <w:t xml:space="preserve">%) was processed by casting, homogenization, and hot extrusion to produce fully dense rods (10 mm diameter), from which disc specimens (10 mm diameter, 2 mm thickness) were prepared. Prior to testing, specimens were mechanically ground through successive silicon carbide abrasive grades and finished with </w:t>
+        <w:t xml:space="preserve">Commercially pure Zn (99.99 wt%) was processed by casting, homogenization, and hot extrusion to produce fully dense rods (10 mm diameter), from which disc specimens (10 mm diameter, 2 mm thickness) were prepared. Prior to testing, specimens were mechanically ground through successive silicon carbide abrasive grades and finished with </w:t>
       </w:r>
       <m:oMath>
         <m:r>
@@ -1368,19 +1322,7 @@
           <w:rFonts w:cs="Times New Roman"/>
         </w:rPr>
         <w:lastRenderedPageBreak/>
-        <w:t>ultrasonically cleaned in Milli-Q water, acetone, and ethanol to remove residual surface contaminants, then dried and stored under vacuum until use. Hanks’ Balanced Salt Solution (HBSS; Gibco, calcium- and magnesium-free</w:t>
-      </w:r>
-      <w:r>
-        <w:rPr>
-          <w:rFonts w:cs="Times New Roman"/>
-        </w:rPr>
-        <w:t xml:space="preserve">; pH 7.4) </w:t>
-      </w:r>
-      <w:r>
-        <w:rPr>
-          <w:rFonts w:cs="Times New Roman"/>
-        </w:rPr>
-        <w:t>was selected as the immersion medium.</w:t>
+        <w:t>ultrasonically cleaned in Milli-Q water, acetone, and ethanol to remove residual surface contaminants, then dried and stored under vacuum until use. Hanks’ Balanced Salt Solution (HBSS; Gibco, calcium- and magnesium-free; pH 7.4) was selected as the immersion medium.</w:t>
       </w:r>
     </w:p>
     <w:p>
@@ -2979,53 +2921,13 @@
         <w:rPr>
           <w:rFonts w:cs="Times New Roman"/>
         </w:rPr>
-        <w:t xml:space="preserve">therefore results from a dynamic balance between ORR-driven passivation and chloride-mediated </w:t>
-      </w:r>
-      <w:r>
-        <w:rPr>
-          <w:rFonts w:cs="Times New Roman"/>
-        </w:rPr>
-        <w:t xml:space="preserve">corrosion-product </w:t>
-      </w:r>
-      <w:r>
-        <w:rPr>
-          <w:rFonts w:cs="Times New Roman"/>
-        </w:rPr>
-        <w:t xml:space="preserve">dissolution. </w:t>
-      </w:r>
-      <w:r>
-        <w:rPr>
-          <w:rFonts w:cs="Times New Roman"/>
-        </w:rPr>
-        <w:t xml:space="preserve">Although phosphate and carbonate species may contribute to the formation of secondary corrosion products such as </w:t>
-      </w:r>
-      <w:proofErr w:type="spellStart"/>
-      <w:r>
-        <w:rPr>
-          <w:rFonts w:cs="Times New Roman"/>
-        </w:rPr>
-        <w:t>hopeite</w:t>
-      </w:r>
-      <w:proofErr w:type="spellEnd"/>
-      <w:r>
-        <w:rPr>
-          <w:rFonts w:cs="Times New Roman"/>
-        </w:rPr>
-        <w:t xml:space="preserve">, smithsonite, and </w:t>
-      </w:r>
-      <w:proofErr w:type="spellStart"/>
-      <w:r>
-        <w:rPr>
-          <w:rFonts w:cs="Times New Roman"/>
-        </w:rPr>
-        <w:t>simonkolleite</w:t>
-      </w:r>
-      <w:proofErr w:type="spellEnd"/>
-      <w:r>
-        <w:rPr>
-          <w:rFonts w:cs="Times New Roman"/>
-        </w:rPr>
-        <w:t xml:space="preserve"> at longer timescales </w:t>
+        <w:t xml:space="preserve">therefore results from a dynamic balance between ORR-driven passivation and chloride-mediated corrosion-product dissolution. </w:t>
+      </w:r>
+      <w:r>
+        <w:rPr>
+          <w:rFonts w:cs="Times New Roman"/>
+        </w:rPr>
+        <w:t>Although phosphate and carbonate species may contribute to the formation of secondary corrosion products such as hopeite, smithsonite, and simonkolleite at longer timescales </w:t>
       </w:r>
       <w:r>
         <w:rPr>
@@ -3074,19 +2976,7 @@
         <w:rPr>
           <w:rFonts w:cs="Times New Roman"/>
         </w:rPr>
-        <w:t xml:space="preserve">the corrosion </w:t>
-      </w:r>
-      <w:r>
-        <w:rPr>
-          <w:rFonts w:cs="Times New Roman"/>
-        </w:rPr>
-        <w:t xml:space="preserve">products are </w:t>
-      </w:r>
-      <w:r>
-        <w:rPr>
-          <w:rFonts w:cs="Times New Roman"/>
-        </w:rPr>
-        <w:t>modeled as a single ZnO phase.</w:t>
+        <w:t>the corrosion products are modeled as a single ZnO phase.</w:t>
       </w:r>
     </w:p>
     <w:p>
@@ -3227,19 +3117,7 @@
         <w:t xml:space="preserve"> </w:t>
       </w:r>
       <w:r>
-        <w:t xml:space="preserve">Schematic of the coupled mechanistic framework for Zn biodegradation in physiological media. (a) Electrochemical reactions governing Zn dissolution, oxygen reduction, </w:t>
-      </w:r>
-      <w:r>
-        <w:t xml:space="preserve">corrosion-product </w:t>
-      </w:r>
-      <w:r>
-        <w:t xml:space="preserve">formation, and chloride-induced </w:t>
-      </w:r>
-      <w:r>
-        <w:t>dissolution</w:t>
-      </w:r>
-      <w:r>
-        <w:t>, (</w:t>
+        <w:t>Schematic of the coupled mechanistic framework for Zn biodegradation in physiological media. (a) Electrochemical reactions governing Zn dissolution, oxygen reduction, corrosion-product formation, and chloride-induced dissolution, (</w:t>
       </w:r>
       <w:r>
         <w:t>b</w:t>
@@ -3347,7 +3225,7 @@
         <w:rPr>
           <w:rFonts w:cs="Times New Roman"/>
         </w:rPr>
-        <w:instrText xml:space="preserve"> ADDIN ZOTERO_ITEM CSL_CITATION {"citationID":"2YDw3E7n","properties":{"unsorted":false,"formattedCitation":"\\super [30]\\nosupersub{}","plainCitation":"[30]","noteIndex":0},"citationItems":[{"id":4562,"uris":["http://zotero.org/users/16939557/items/8FBQWKCF"],"itemData":{"id":4562,"type":"article-journal","citation-key":"katonaValidatingCorrosionModels2026","container-title":"Corrosion Science","DOI":"10.1016/j.corsci.2025.113495","ISSN":"0010938X","journalAbbreviation":"Corrosion Science","language":"en","page":"113495","source":"DOI.org (Crossref)","title":"Validating corrosion models: A comparison of governing equations","title-short":"Validating corrosion models","volume":"259","author":[{"family":"Katona","given":"R.M."},{"family":"Taylor","given":"J."},{"family":"Schaller","given":"R.F."}],"issued":{"date-parts":[["2026",2]]}}}],"schema":"https://github.com/citation-style-language/schema/raw/master/csl-citation.json"} </w:instrText>
+        <w:instrText xml:space="preserve"> ADDIN ZOTERO_ITEM CSL_CITATION {"citationID":"2YDw3E7n","properties":{"unsorted":false,"formattedCitation":"\\super [29]\\nosupersub{}","plainCitation":"[29]","noteIndex":0},"citationItems":[{"id":4562,"uris":["http://zotero.org/users/16939557/items/8FBQWKCF"],"itemData":{"id":4562,"type":"article-journal","citation-key":"katonaValidatingCorrosionModels2026","container-title":"Corrosion Science","DOI":"10.1016/j.corsci.2025.113495","ISSN":"0010938X","journalAbbreviation":"Corrosion Science","language":"en","page":"113495","source":"DOI.org (Crossref)","title":"Validating corrosion models: A comparison of governing equations","title-short":"Validating corrosion models","volume":"259","author":[{"family":"Katona","given":"R.M."},{"family":"Taylor","given":"J."},{"family":"Schaller","given":"R.F."}],"issued":{"date-parts":[["2026",2]]}}}],"schema":"https://github.com/citation-style-language/schema/raw/master/csl-citation.json"} </w:instrText>
       </w:r>
       <w:r>
         <w:rPr>
@@ -3360,7 +3238,7 @@
           <w:rFonts w:cs="Times New Roman"/>
           <w:vertAlign w:val="superscript"/>
         </w:rPr>
-        <w:t>[30]</w:t>
+        <w:t>[29]</w:t>
       </w:r>
       <w:r>
         <w:rPr>
@@ -3933,19 +3811,7 @@
         <w:rPr>
           <w:rFonts w:cs="Times New Roman"/>
         </w:rPr>
-        <w:t>the corrosion-</w:t>
-      </w:r>
-      <w:r>
-        <w:rPr>
-          <w:rFonts w:cs="Times New Roman"/>
-        </w:rPr>
-        <w:t>product</w:t>
-      </w:r>
-      <w:r>
-        <w:rPr>
-          <w:rFonts w:cs="Times New Roman"/>
-        </w:rPr>
-        <w:t xml:space="preserve"> field</w:t>
+        <w:t>the corrosion-product field</w:t>
       </w:r>
       <w:r>
         <w:rPr>
@@ -4456,13 +4322,7 @@
         <w:rPr>
           <w:rFonts w:cs="Times New Roman"/>
         </w:rPr>
-        <w:t xml:space="preserve"> </w:t>
-      </w:r>
-      <w:r>
-        <w:rPr>
-          <w:rFonts w:cs="Times New Roman"/>
-        </w:rPr>
-        <w:t xml:space="preserve">as </w:t>
+        <w:t xml:space="preserve"> as </w:t>
       </w:r>
       <w:r>
         <w:rPr>
@@ -5011,51 +4871,13 @@
         <w:rPr>
           <w:rFonts w:cs="Times New Roman"/>
         </w:rPr>
-        <w:t xml:space="preserve">generating OH⁻ ions that increase the local alkalinity and promote formation of </w:t>
-      </w:r>
-      <w:proofErr w:type="spellStart"/>
-      <w:r>
-        <w:rPr>
-          <w:rFonts w:cs="Times New Roman"/>
-        </w:rPr>
-        <w:t>ZnO</w:t>
-      </w:r>
-      <w:proofErr w:type="spellEnd"/>
-      <w:r>
-        <w:rPr>
-          <w:rFonts w:cs="Times New Roman"/>
-        </w:rPr>
-        <w:t xml:space="preserve">-based corrosion </w:t>
-      </w:r>
-      <w:r>
-        <w:rPr>
-          <w:rFonts w:cs="Times New Roman"/>
-        </w:rPr>
-        <w:t>products</w:t>
-      </w:r>
-      <w:r>
-        <w:rPr>
-          <w:rFonts w:cs="Times New Roman"/>
-        </w:rPr>
-        <w:t>.</w:t>
-      </w:r>
-      <w:r>
-        <w:rPr>
-          <w:rFonts w:cs="Times New Roman"/>
-        </w:rPr>
-        <w:t xml:space="preserve"> At the same time, chloride-induced </w:t>
-      </w:r>
-      <w:r>
-        <w:rPr>
-          <w:rFonts w:cs="Times New Roman"/>
-        </w:rPr>
-        <w:t xml:space="preserve">corrosion-product </w:t>
-      </w:r>
-      <w:r>
-        <w:rPr>
-          <w:rFonts w:cs="Times New Roman"/>
-        </w:rPr>
-        <w:t>dissolution releases hydroxide back into the electrolyte</w:t>
+        <w:t>generating OH⁻ ions that increase the local alkalinity and promote formation of ZnO-based corrosion products.</w:t>
+      </w:r>
+      <w:r>
+        <w:rPr>
+          <w:rFonts w:cs="Times New Roman"/>
+        </w:rPr>
+        <w:t xml:space="preserve"> At the same time, chloride-induced corrosion-product dissolution releases hydroxide back into the electrolyte</w:t>
       </w:r>
       <w:r>
         <w:rPr>
@@ -5214,16 +5036,7 @@
                         <w:rPr>
                           <w:rFonts w:cs="Times New Roman"/>
                         </w:rPr>
-                        <m:t>ef</m:t>
-                      </m:r>
-                      <m:r>
-                        <m:rPr>
-                          <m:nor/>
-                        </m:rPr>
-                        <w:rPr>
-                          <w:rFonts w:cs="Times New Roman"/>
-                        </w:rPr>
-                        <m:t>f</m:t>
+                        <m:t>eff</m:t>
                       </m:r>
                     </m:sup>
                   </m:sSubSup>
@@ -5900,10 +5713,7 @@
       </w:pPr>
       <w:r>
         <w:lastRenderedPageBreak/>
-        <w:t xml:space="preserve">Here, the corrosion-product </w:t>
-      </w:r>
-      <w:r>
-        <w:t>field</w:t>
+        <w:t>Here, the corrosion-product field</w:t>
       </w:r>
       <w:r>
         <w:t xml:space="preserve"> (</w:t>
@@ -5947,15 +5757,7 @@
         <w:t>the</w:t>
       </w:r>
       <w:r>
-        <w:t xml:space="preserve"> balance between </w:t>
-      </w:r>
-      <w:proofErr w:type="spellStart"/>
-      <w:r>
-        <w:t>ZnO</w:t>
-      </w:r>
-      <w:proofErr w:type="spellEnd"/>
-      <w:r>
-        <w:t xml:space="preserve"> precipitation and chloride-mediated dissolution</w:t>
+        <w:t xml:space="preserve"> balance between ZnO precipitation and chloride-mediated dissolution</w:t>
       </w:r>
       <w:r>
         <w:t xml:space="preserve"> as follows</w:t>
@@ -6201,19 +6003,7 @@
           <w:rPr>
             <w:rFonts w:ascii="Cambria Math" w:hAnsi="Cambria Math" w:cs="Times New Roman"/>
           </w:rPr>
-          <m:t> </m:t>
-        </m:r>
-        <m:r>
-          <w:rPr>
-            <w:rFonts w:ascii="Cambria Math" w:hAnsi="Cambria Math" w:cs="Times New Roman"/>
-          </w:rPr>
-          <m:t>F</m:t>
-        </m:r>
-        <m:r>
-          <w:rPr>
-            <w:rFonts w:ascii="Cambria Math" w:hAnsi="Cambria Math" w:cs="Times New Roman"/>
-          </w:rPr>
-          <m:t> </m:t>
+          <m:t> F </m:t>
         </m:r>
         <m:sSubSup>
           <m:sSubSupPr>
@@ -6354,10 +6144,7 @@
         <w:t>govern</w:t>
       </w:r>
       <w:r>
-        <w:t xml:space="preserve"> the rates of corrosion-product formation and chloride-mediated dissolution, respectively</w:t>
-      </w:r>
-      <w:r>
-        <w:t xml:space="preserve">. The chloride exponent in Eq. 11 is an effective reaction order, not the stoichiometric one of Eq. 5. </w:t>
+        <w:t xml:space="preserve"> the rates of corrosion-product formation and chloride-mediated dissolution, respectively. The chloride exponent in Eq. 11 is an effective reaction order, not the stoichiometric one of Eq. 5. </w:t>
       </w:r>
       <w:r>
         <w:rPr>
@@ -6447,19 +6234,7 @@
         <w:rPr>
           <w:rFonts w:cs="Times New Roman"/>
         </w:rPr>
-        <w:t xml:space="preserve">, which suppresses further growth as the </w:t>
-      </w:r>
-      <w:r>
-        <w:rPr>
-          <w:rFonts w:cs="Times New Roman"/>
-        </w:rPr>
-        <w:t>corrosion-product concentration</w:t>
-      </w:r>
-      <w:r>
-        <w:rPr>
-          <w:rFonts w:cs="Times New Roman"/>
-        </w:rPr>
-        <w:t xml:space="preserve"> approaches its maximum density </w:t>
+        <w:t xml:space="preserve">, which suppresses further growth as the corrosion-product concentration approaches its maximum density </w:t>
       </w:r>
       <m:oMath>
         <m:sSub>
@@ -6608,19 +6383,13 @@
         <w:t xml:space="preserve">. </w:t>
       </w:r>
       <w:r>
-        <w:t xml:space="preserve">As the </w:t>
-      </w:r>
-      <w:r>
-        <w:t xml:space="preserve">corrosion products accumulate, they impede </w:t>
-      </w:r>
-      <w:r>
-        <w:t xml:space="preserve">species transport by reducing the effective diffusivity according to </w:t>
+        <w:t xml:space="preserve">As the corrosion products accumulate, they impede species transport by reducing the effective diffusivity according to </w:t>
       </w:r>
       <w:r>
         <w:fldChar w:fldCharType="begin"/>
       </w:r>
       <w:r>
-        <w:instrText xml:space="preserve"> ADDIN ZOTERO_ITEM CSL_CITATION {"citationID":"aPcMg5PW","properties":{"unsorted":false,"formattedCitation":"\\super [31]\\nosupersub{}","plainCitation":"[31]","noteIndex":0},"citationItems":[{"id":4560,"uris":["http://zotero.org/users/16939557/items/5GV9KWGS"],"itemData":{"id":4560,"type":"book","abstract":"Diffusion in Natural Porous Media: Contaminant Transport, Sorption/Desorption and Dissolution Kinetics introduces the general principles of diffusion in the subsurface environment and discusses the implications for the fate and transport of contaminants in soils and groundwater. Emphasis is placed on sorption/desorption and the dissolution kinetics of organic contaminants, both of which are limited by the slow speed of molecular diffusion. Diffusion in Natural Porous Media: Contaminant Transport, Sorption/Desorption and Dissolution Kinetics compiles methods for calculating the diffusion coefficients of organic compounds (in aqueous solution or vapor phase) in natural porous media. The author uses analytical solutions of Fick's 2nd law and some simple numerical models to model diffusive transport under various initial and boundary conditions. A number of these models may be solved using spreadsheets. The book examines sorption/desorption rates of organic compounds in various soils and aquifer materials, and also examines the dissolution kinetics of nonaqueous phase liquids in aquifers, in both the trapped residual phase and in pools. Diffusion in Natural Porous Media: Contaminant Transport, Sorption/Desorption and Dissolution Kinetics concludes with a discussion of the impact of slow diffusion processes on soil and groundwater decontamination and the implications of these processes for groundwater risk assessment","citation-key":"grathwohlDiffusionNaturalPorous1998","collection-number":"1","collection-title":"Topics in Environmental Fluid Mechanics","DOI":"10.1007/978-1-4615-5683-1","ISBN":"978-1-4613-7602-6","language":"eng","number-of-pages":"207","publisher":"Springer","publisher-place":"Boston, MA","source":"K10plus ISBN","title":"Diffusion in Natural Porous Media: Contaminant Transport, Sorption/Desorption and Dissolution Kinetics","title-short":"Diffusion in Natural Porous Media","author":[{"family":"Grathwohl","given":"Peter"}],"issued":{"date-parts":[["1998"]]}}}],"schema":"https://github.com/citation-style-language/schema/raw/master/csl-citation.json"} </w:instrText>
+        <w:instrText xml:space="preserve"> ADDIN ZOTERO_ITEM CSL_CITATION {"citationID":"aPcMg5PW","properties":{"unsorted":false,"formattedCitation":"\\super [30]\\nosupersub{}","plainCitation":"[30]","noteIndex":0},"citationItems":[{"id":4560,"uris":["http://zotero.org/users/16939557/items/5GV9KWGS"],"itemData":{"id":4560,"type":"book","abstract":"Diffusion in Natural Porous Media: Contaminant Transport, Sorption/Desorption and Dissolution Kinetics introduces the general principles of diffusion in the subsurface environment and discusses the implications for the fate and transport of contaminants in soils and groundwater. Emphasis is placed on sorption/desorption and the dissolution kinetics of organic contaminants, both of which are limited by the slow speed of molecular diffusion. Diffusion in Natural Porous Media: Contaminant Transport, Sorption/Desorption and Dissolution Kinetics compiles methods for calculating the diffusion coefficients of organic compounds (in aqueous solution or vapor phase) in natural porous media. The author uses analytical solutions of Fick's 2nd law and some simple numerical models to model diffusive transport under various initial and boundary conditions. A number of these models may be solved using spreadsheets. The book examines sorption/desorption rates of organic compounds in various soils and aquifer materials, and also examines the dissolution kinetics of nonaqueous phase liquids in aquifers, in both the trapped residual phase and in pools. Diffusion in Natural Porous Media: Contaminant Transport, Sorption/Desorption and Dissolution Kinetics concludes with a discussion of the impact of slow diffusion processes on soil and groundwater decontamination and the implications of these processes for groundwater risk assessment","citation-key":"grathwohlDiffusionNaturalPorous1998","collection-number":"1","collection-title":"Topics in Environmental Fluid Mechanics","DOI":"10.1007/978-1-4615-5683-1","ISBN":"978-1-4613-7602-6","language":"eng","number-of-pages":"207","publisher":"Springer","publisher-place":"Boston, MA","source":"K10plus ISBN","title":"Diffusion in Natural Porous Media: Contaminant Transport, Sorption/Desorption and Dissolution Kinetics","title-short":"Diffusion in Natural Porous Media","author":[{"family":"Grathwohl","given":"Peter"}],"issued":{"date-parts":[["1998"]]}}}],"schema":"https://github.com/citation-style-language/schema/raw/master/csl-citation.json"} </w:instrText>
       </w:r>
       <w:r>
         <w:fldChar w:fldCharType="separate"/>
@@ -6630,7 +6399,7 @@
           <w:rFonts w:cs="Times New Roman"/>
           <w:vertAlign w:val="superscript"/>
         </w:rPr>
-        <w:t>[31]</w:t>
+        <w:t>[30]</w:t>
       </w:r>
       <w:r>
         <w:fldChar w:fldCharType="end"/>
@@ -6978,13 +6747,7 @@
         </m:sSubSup>
       </m:oMath>
       <w:r>
-        <w:t xml:space="preserve">​ is the free-solution diffusivity, and the transport reduction depends on the </w:t>
-      </w:r>
-      <w:r>
-        <w:t>corrosion-product region</w:t>
-      </w:r>
-      <w:r>
-        <w:t>'s porosity (</w:t>
+        <w:t>​ is the free-solution diffusivity, and the transport reduction depends on the corrosion-product region's porosity (</w:t>
       </w:r>
       <m:oMath>
         <m:r>
@@ -7235,7 +6998,7 @@
         <w:rPr>
           <w:rFonts w:cs="Times New Roman"/>
         </w:rPr>
-        <w:instrText xml:space="preserve"> ADDIN ZOTERO_ITEM CSL_CITATION {"citationID":"r7domCi5","properties":{"unsorted":false,"formattedCitation":"\\super [32]\\nosupersub{}","plainCitation":"[32]","noteIndex":0},"citationItems":[{"id":1729,"uris":["http://zotero.org/users/16939557/items/TDPP5UDX"],"itemData":{"id":1729,"type":"article-journal","citation-key":"wilderAdaptiveLevelSet2015","container-title":"Journal of Engineering Mathematics","DOI":"10.1007/s10665-014-9732-3","ISSN":"0022-0833, 1573-2703","issue":"1","journalAbbreviation":"J Eng Math","language":"en","page":"121-142","source":"DOI.org (Crossref)","title":"An adaptive level set approach for modeling damage due to galvanic corrosion","volume":"91","author":[{"family":"Wilder","given":"Joseph W."},{"family":"Clemons","given":"Curtis"},{"family":"Golovaty","given":"Dmitry"},{"family":"Kreider","given":"Kevin L."},{"family":"Young","given":"Gerald W."},{"family":"Lillard","given":"R. Scott"}],"issued":{"date-parts":[["2015",4]]}}}],"schema":"https://github.com/citation-style-language/schema/raw/master/csl-citation.json"} </w:instrText>
+        <w:instrText xml:space="preserve"> ADDIN ZOTERO_ITEM CSL_CITATION {"citationID":"r7domCi5","properties":{"unsorted":false,"formattedCitation":"\\super [31]\\nosupersub{}","plainCitation":"[31]","noteIndex":0},"citationItems":[{"id":1729,"uris":["http://zotero.org/users/16939557/items/TDPP5UDX"],"itemData":{"id":1729,"type":"article-journal","citation-key":"wilderAdaptiveLevelSet2015","container-title":"Journal of Engineering Mathematics","DOI":"10.1007/s10665-014-9732-3","ISSN":"0022-0833, 1573-2703","issue":"1","journalAbbreviation":"J Eng Math","language":"en","page":"121-142","source":"DOI.org (Crossref)","title":"An adaptive level set approach for modeling damage due to galvanic corrosion","volume":"91","author":[{"family":"Wilder","given":"Joseph W."},{"family":"Clemons","given":"Curtis"},{"family":"Golovaty","given":"Dmitry"},{"family":"Kreider","given":"Kevin L."},{"family":"Young","given":"Gerald W."},{"family":"Lillard","given":"R. Scott"}],"issued":{"date-parts":[["2015",4]]}}}],"schema":"https://github.com/citation-style-language/schema/raw/master/csl-citation.json"} </w:instrText>
       </w:r>
       <w:r>
         <w:rPr>
@@ -7248,7 +7011,7 @@
           <w:rFonts w:cs="Times New Roman"/>
           <w:vertAlign w:val="superscript"/>
         </w:rPr>
-        <w:t>[32]</w:t>
+        <w:t>[31]</w:t>
       </w:r>
       <w:r>
         <w:rPr>
@@ -7471,7 +7234,6 @@
         </w:rPr>
         <w:t>Equation (17)</w:t>
       </w:r>
-      <w:proofErr w:type="gramStart"/>
       <w:r>
         <w:rPr>
           <w:rFonts w:cs="Times New Roman"/>
@@ -7484,7 +7246,6 @@
         </w:rPr>
         <w:t>.</w:t>
       </w:r>
-      <w:proofErr w:type="gramEnd"/>
       <w:r>
         <w:rPr>
           <w:rFonts w:cs="Times New Roman"/>
@@ -7545,7 +7306,7 @@
         <w:rPr>
           <w:rFonts w:cs="Times New Roman"/>
         </w:rPr>
-        <w:instrText xml:space="preserve"> ADDIN ZOTERO_ITEM CSL_CITATION {"citationID":"BuP2nsvm","properties":{"unsorted":false,"formattedCitation":"\\super [33]\\nosupersub{}","plainCitation":"[33]","noteIndex":0},"citationItems":[{"id":1697,"uris":["http://zotero.org/users/16939557/items/M7J7YKJU"],"itemData":{"id":1697,"type":"article-journal","citation-key":"groganPhysicalCorrosionModel2014","container-title":"Acta Biomaterialia","DOI":"10.1016/j.actbio.2013.12.059","ISSN":"17427061","issue":"5","journalAbbreviation":"Acta Biomaterialia","language":"en","page":"2313-2322","source":"DOI.org (Crossref)","title":"A physical corrosion model for bioabsorbable metal stents","volume":"10","author":[{"family":"Grogan","given":"J.A."},{"family":"Leen","given":"S.B."},{"family":"McHugh","given":"P.E."}],"issued":{"date-parts":[["2014",5]]}}}],"schema":"https://github.com/citation-style-language/schema/raw/master/csl-citation.json"} </w:instrText>
+        <w:instrText xml:space="preserve"> ADDIN ZOTERO_ITEM CSL_CITATION {"citationID":"BuP2nsvm","properties":{"unsorted":false,"formattedCitation":"\\super [32]\\nosupersub{}","plainCitation":"[32]","noteIndex":0},"citationItems":[{"id":1697,"uris":["http://zotero.org/users/16939557/items/M7J7YKJU"],"itemData":{"id":1697,"type":"article-journal","citation-key":"groganPhysicalCorrosionModel2014","container-title":"Acta Biomaterialia","DOI":"10.1016/j.actbio.2013.12.059","ISSN":"17427061","issue":"5","journalAbbreviation":"Acta Biomaterialia","language":"en","page":"2313-2322","source":"DOI.org (Crossref)","title":"A physical corrosion model for bioabsorbable metal stents","volume":"10","author":[{"family":"Grogan","given":"J.A."},{"family":"Leen","given":"S.B."},{"family":"McHugh","given":"P.E."}],"issued":{"date-parts":[["2014",5]]}}}],"schema":"https://github.com/citation-style-language/schema/raw/master/csl-citation.json"} </w:instrText>
       </w:r>
       <w:r>
         <w:rPr>
@@ -7558,7 +7319,7 @@
           <w:rFonts w:cs="Times New Roman"/>
           <w:vertAlign w:val="superscript"/>
         </w:rPr>
-        <w:t>[33]</w:t>
+        <w:t>[32]</w:t>
       </w:r>
       <w:r>
         <w:rPr>
@@ -7880,19 +7641,7 @@
         <w:rPr>
           <w:rFonts w:cs="Times New Roman"/>
         </w:rPr>
-        <w:t xml:space="preserve"> is the solid </w:t>
-      </w:r>
-      <w:r>
-        <w:rPr>
-          <w:rFonts w:cs="Times New Roman"/>
-        </w:rPr>
-        <w:t>mass</w:t>
-      </w:r>
-      <w:r>
-        <w:rPr>
-          <w:rFonts w:cs="Times New Roman"/>
-        </w:rPr>
-        <w:t xml:space="preserve"> density of Zn, and </w:t>
+        <w:t xml:space="preserve"> is the solid mass density of Zn, and </w:t>
       </w:r>
       <m:oMath>
         <m:r>
@@ -7988,21 +7737,7 @@
         <w:rPr>
           <w:rFonts w:cs="Times New Roman"/>
         </w:rPr>
-        <w:t xml:space="preserve"> saturation </w:t>
-      </w:r>
-      <w:proofErr w:type="gramStart"/>
-      <w:r>
-        <w:rPr>
-          <w:rFonts w:cs="Times New Roman"/>
-        </w:rPr>
-        <w:t>concentration.</w:t>
-      </w:r>
-      <w:proofErr w:type="gramEnd"/>
-      <w:r>
-        <w:rPr>
-          <w:rFonts w:cs="Times New Roman"/>
-        </w:rPr>
-        <w:t xml:space="preserve"> Assuming first-order oxygen reduction kinetics and the reaction stoichiometry of </w:t>
+        <w:t xml:space="preserve"> saturation concentration. Assuming first-order oxygen reduction kinetics and the reaction stoichiometry of </w:t>
       </w:r>
       <w:r>
         <w:rPr>
@@ -9080,24 +8815,10 @@
         <w:pStyle w:val="BodyText"/>
       </w:pPr>
       <w:r>
-        <w:t xml:space="preserve">The coupled reaction-diffusion and moving-boundary framework was implemented in </w:t>
-      </w:r>
-      <w:proofErr w:type="spellStart"/>
-      <w:r>
-        <w:t>FreeFEM</w:t>
-      </w:r>
-      <w:proofErr w:type="spellEnd"/>
-      <w:r>
-        <w:t xml:space="preserve">++ and solved using first-order finite elements with implicit time integration. </w:t>
-      </w:r>
-      <w:r>
-        <w:t xml:space="preserve">Parametrically generated implant geometries were discretized into tetrahedral meshes and embedded within </w:t>
-      </w:r>
-      <w:r>
-        <w:t xml:space="preserve">a 30 × 30 × 30 mm </w:t>
-      </w:r>
-      <w:r>
-        <w:t>electrolyte domain</w:t>
+        <w:t xml:space="preserve">The coupled reaction-diffusion and moving-boundary framework was implemented in FreeFEM++ and solved using first-order finite elements with implicit time integration. </w:t>
+      </w:r>
+      <w:r>
+        <w:t>Parametrically generated implant geometries were discretized into tetrahedral meshes and embedded within a 30 × 30 × 30 mm electrolyte domain</w:t>
       </w:r>
       <w:ins w:id="13" w:author="Claude" w:date="2026-10-08T20:38:00Z">
         <w:r>
@@ -9105,19 +8826,7 @@
         </w:r>
       </w:ins>
       <w:r>
-        <w:t xml:space="preserve"> </w:t>
-      </w:r>
-      <w:r>
-        <w:t>identical</w:t>
-      </w:r>
-      <w:r>
-        <w:t xml:space="preserve"> </w:t>
-      </w:r>
-      <w:r>
-        <w:t>for the disc and the stent and larger than</w:t>
-      </w:r>
-      <w:r>
-        <w:t xml:space="preserve"> three times the implant characteristic dimension in each direction</w:t>
+        <w:t xml:space="preserve"> identical for the disc and the stent and larger than three times the implant characteristic dimension in each direction</w:t>
       </w:r>
       <w:ins w:id="14" w:author="Claude" w:date="2026-10-08T04:28:00Z">
         <w:r>
@@ -9139,18 +8848,18 @@
       <w:r>
         <w:t xml:space="preserve">To resolve steep concentration gradients near the corrosion front, distance-based mesh refinement was applied around the metal-electrolyte interface, with progressively coarser elements away from the surface. Mesh convergence analysis identified a final mesh containing 18.9 million tetrahedral elements, for which predicted mass loss changed by less than </w:t>
       </w:r>
-      <w:del w:id="9010" w:author="Claude" w:date="2026-10-08T22:54:30Z">
+      <w:del w:id="15" w:author="Claude" w:date="2026-10-08T22:54:00Z">
         <w:r>
-          <w:delText xml:space="preserve">1</w:delText>
+          <w:delText>1</w:delText>
         </w:r>
       </w:del>
-      <w:ins w:id="9009" w:author="Claude" w:date="2026-10-08T22:54:30Z">
+      <w:ins w:id="16" w:author="Claude" w:date="2026-10-08T22:54:00Z">
         <w:r>
-          <w:t xml:space="preserve">0.2</w:t>
+          <w:t>0.2</w:t>
         </w:r>
       </w:ins>
       <w:r>
-        <w:t xml:space="preserve">% with further refinement (</w:t>
+        <w:t>% with further refinement (</w:t>
       </w:r>
       <w:r>
         <w:rPr>
@@ -9168,18 +8877,7 @@
         <w:pStyle w:val="BodyText"/>
       </w:pPr>
       <w:r>
-        <w:t>Physiological initial and boundary conditions were imposed throughout the electrolyte domain, including continuous oxygen replenishment at the electrolyte-air interface and kinetic flux conditions at the moving metal-electrolyte boundary</w:t>
-      </w:r>
-      <w:r>
-        <w:t xml:space="preserve">. The </w:t>
-      </w:r>
-      <w:proofErr w:type="gramStart"/>
-      <w:r>
-        <w:t>48 h</w:t>
-      </w:r>
-      <w:proofErr w:type="gramEnd"/>
-      <w:r>
-        <w:t xml:space="preserve"> medium renewal used in the immersion tests was not modeled explicitly; instead, dissolved oxygen was assumed to be </w:t>
+        <w:t xml:space="preserve">Physiological initial and boundary conditions were imposed throughout the electrolyte domain, including continuous oxygen replenishment at the electrolyte-air interface and kinetic flux conditions at the moving metal-electrolyte boundary. The 48 h medium renewal used in the immersion tests was not modeled explicitly; instead, dissolved oxygen was assumed to be </w:t>
       </w:r>
       <w:r>
         <w:lastRenderedPageBreak/>
@@ -9189,18 +8887,7 @@
         <w:t xml:space="preserve"> and </w:t>
       </w:r>
       <w:r>
-        <w:t>no natural convection was considered (static conditions)</w:t>
-      </w:r>
-      <w:r>
-        <w:t xml:space="preserve">. Simulations were executed in parallel using </w:t>
-      </w:r>
-      <w:proofErr w:type="spellStart"/>
-      <w:r>
-        <w:t>FreeFEM</w:t>
-      </w:r>
-      <w:proofErr w:type="spellEnd"/>
-      <w:r>
-        <w:t>++ MPI on a high-performance computing cluster, and degradation metrics together with concentration and interface fields were recorded at regular time intervals.</w:t>
+        <w:t>no natural convection was considered (static conditions). Simulations were executed in parallel using FreeFEM++ MPI on a high-performance computing cluster, and degradation metrics together with concentration and interface fields were recorded at regular time intervals.</w:t>
       </w:r>
       <w:r>
         <w:t xml:space="preserve"> Predicted mass loss, corrosion rate (</w:t>
@@ -9229,27 +8916,13 @@
         <w:t xml:space="preserve">, </w:t>
       </w:r>
       <w:r>
-        <w:t xml:space="preserve">normalized </w:t>
-      </w:r>
-      <w:r>
-        <w:t>corrosion-product</w:t>
-      </w:r>
-      <w:r>
-        <w:t xml:space="preserve"> saturation</w:t>
+        <w:t>normalized corrosion-product saturation</w:t>
       </w:r>
       <w:r>
         <w:t>, and dissolved oxygen concentration</w:t>
       </w:r>
       <w:r>
-        <w:t xml:space="preserve"> were extracted during post-processing. The transition between reaction-controlled and diffusion-controlled degradation was quantified using the local </w:t>
-      </w:r>
-      <w:proofErr w:type="spellStart"/>
-      <w:r>
-        <w:t>Damköhler</w:t>
-      </w:r>
-      <w:proofErr w:type="spellEnd"/>
-      <w:r>
-        <w:t xml:space="preserve"> number (</w:t>
+        <w:t xml:space="preserve"> were extracted during post-processing. The transition between reaction-controlled and diffusion-controlled degradation was quantified using the local Damköhler number (</w:t>
       </w:r>
       <w:r>
         <w:rPr>
@@ -9350,7 +9023,7 @@
           <w:rFonts w:cs="Times New Roman"/>
         </w:rPr>
       </w:pPr>
-      <w:bookmarkStart w:id="15" w:name="_Ref238635735"/>
+      <w:bookmarkStart w:id="17" w:name="_Ref238635735"/>
       <w:r>
         <w:rPr>
           <w:b/>
@@ -9394,7 +9067,7 @@
         </w:rPr>
         <w:fldChar w:fldCharType="end"/>
       </w:r>
-      <w:bookmarkEnd w:id="15"/>
+      <w:bookmarkEnd w:id="17"/>
       <w:r>
         <w:rPr>
           <w:b/>
@@ -9779,7 +9452,7 @@
                 <w:sz w:val="22"/>
                 <w:szCs w:val="22"/>
               </w:rPr>
-              <w:instrText xml:space="preserve"> ADDIN ZOTERO_ITEM CSL_CITATION {"citationID":"bkkoCSJb","properties":{"unsorted":false,"formattedCitation":"\\super [34]\\nosupersub{}","plainCitation":"[34]","noteIndex":0},"citationItems":[{"id":3844,"uris":["http://zotero.org/users/16939557/items/YSXNXCNJ"],"itemData":{"id":3844,"type":"book","abstract":"Presents chemistry and physics tables and profiles notable scientists, highlighting their achievements","citation-key":"rumbleCRCHandbookChemistry2017","edition":"98th edition 2017-2018","ISBN":"978-1-4987-8454-2","language":"eng","publisher":"CRC Press, Taylor &amp; Francis Group","publisher-place":"Boca Raton London New York","source":"K10plus ISBN","title":"CRC handbook of chemistry and physics","editor":[{"family":"Rumble","given":"John R."}],"issued":{"date-parts":[["2017"]]}}}],"schema":"https://github.com/citation-style-language/schema/raw/master/csl-citation.json"} </w:instrText>
+              <w:instrText xml:space="preserve"> ADDIN ZOTERO_ITEM CSL_CITATION {"citationID":"bkkoCSJb","properties":{"unsorted":false,"formattedCitation":"\\super [33]\\nosupersub{}","plainCitation":"[33]","noteIndex":0},"citationItems":[{"id":3844,"uris":["http://zotero.org/users/16939557/items/YSXNXCNJ"],"itemData":{"id":3844,"type":"book","abstract":"Presents chemistry and physics tables and profiles notable scientists, highlighting their achievements","citation-key":"rumbleCRCHandbookChemistry2017","edition":"98th edition 2017-2018","ISBN":"978-1-4987-8454-2","language":"eng","publisher":"CRC Press, Taylor &amp; Francis Group","publisher-place":"Boca Raton London New York","source":"K10plus ISBN","title":"CRC handbook of chemistry and physics","editor":[{"family":"Rumble","given":"John R."}],"issued":{"date-parts":[["2017"]]}}}],"schema":"https://github.com/citation-style-language/schema/raw/master/csl-citation.json"} </w:instrText>
             </w:r>
             <w:r>
               <w:rPr>
@@ -9795,7 +9468,7 @@
                 <w:sz w:val="22"/>
                 <w:vertAlign w:val="superscript"/>
               </w:rPr>
-              <w:t>[34]</w:t>
+              <w:t>[33]</w:t>
             </w:r>
             <w:r>
               <w:rPr>
@@ -9956,7 +9629,7 @@
                 <w:sz w:val="22"/>
                 <w:szCs w:val="22"/>
               </w:rPr>
-              <w:instrText xml:space="preserve"> ADDIN ZOTERO_ITEM CSL_CITATION {"citationID":"fY7GQsE5","properties":{"unsorted":false,"formattedCitation":"\\super [34]\\nosupersub{}","plainCitation":"[34]","noteIndex":0},"citationItems":[{"id":3844,"uris":["http://zotero.org/users/16939557/items/YSXNXCNJ"],"itemData":{"id":3844,"type":"book","abstract":"Presents chemistry and physics tables and profiles notable scientists, highlighting their achievements","citation-key":"rumbleCRCHandbookChemistry2017","edition":"98th edition 2017-2018","ISBN":"978-1-4987-8454-2","language":"eng","publisher":"CRC Press, Taylor &amp; Francis Group","publisher-place":"Boca Raton London New York","source":"K10plus ISBN","title":"CRC handbook of chemistry and physics","editor":[{"family":"Rumble","given":"John R."}],"issued":{"date-parts":[["2017"]]}}}],"schema":"https://github.com/citation-style-language/schema/raw/master/csl-citation.json"} </w:instrText>
+              <w:instrText xml:space="preserve"> ADDIN ZOTERO_ITEM CSL_CITATION {"citationID":"fY7GQsE5","properties":{"unsorted":false,"formattedCitation":"\\super [33]\\nosupersub{}","plainCitation":"[33]","noteIndex":0},"citationItems":[{"id":3844,"uris":["http://zotero.org/users/16939557/items/YSXNXCNJ"],"itemData":{"id":3844,"type":"book","abstract":"Presents chemistry and physics tables and profiles notable scientists, highlighting their achievements","citation-key":"rumbleCRCHandbookChemistry2017","edition":"98th edition 2017-2018","ISBN":"978-1-4987-8454-2","language":"eng","publisher":"CRC Press, Taylor &amp; Francis Group","publisher-place":"Boca Raton London New York","source":"K10plus ISBN","title":"CRC handbook of chemistry and physics","editor":[{"family":"Rumble","given":"John R."}],"issued":{"date-parts":[["2017"]]}}}],"schema":"https://github.com/citation-style-language/schema/raw/master/csl-citation.json"} </w:instrText>
             </w:r>
             <w:r>
               <w:rPr>
@@ -9972,7 +9645,7 @@
                 <w:sz w:val="22"/>
                 <w:vertAlign w:val="superscript"/>
               </w:rPr>
-              <w:t>[34]</w:t>
+              <w:t>[33]</w:t>
             </w:r>
             <w:r>
               <w:rPr>
@@ -10310,7 +9983,7 @@
                 <w:sz w:val="22"/>
                 <w:szCs w:val="22"/>
               </w:rPr>
-              <w:instrText xml:space="preserve"> ADDIN ZOTERO_ITEM CSL_CITATION {"citationID":"Vft5a5IP","properties":{"unsorted":false,"formattedCitation":"\\super [34]\\nosupersub{}","plainCitation":"[34]","noteIndex":0},"citationItems":[{"id":3844,"uris":["http://zotero.org/users/16939557/items/YSXNXCNJ"],"itemData":{"id":3844,"type":"book","abstract":"Presents chemistry and physics tables and profiles notable scientists, highlighting their achievements","citation-key":"rumbleCRCHandbookChemistry2017","edition":"98th edition 2017-2018","ISBN":"978-1-4987-8454-2","language":"eng","publisher":"CRC Press, Taylor &amp; Francis Group","publisher-place":"Boca Raton London New York","source":"K10plus ISBN","title":"CRC handbook of chemistry and physics","editor":[{"family":"Rumble","given":"John R."}],"issued":{"date-parts":[["2017"]]}}}],"schema":"https://github.com/citation-style-language/schema/raw/master/csl-citation.json"} </w:instrText>
+              <w:instrText xml:space="preserve"> ADDIN ZOTERO_ITEM CSL_CITATION {"citationID":"Vft5a5IP","properties":{"unsorted":false,"formattedCitation":"\\super [33]\\nosupersub{}","plainCitation":"[33]","noteIndex":0},"citationItems":[{"id":3844,"uris":["http://zotero.org/users/16939557/items/YSXNXCNJ"],"itemData":{"id":3844,"type":"book","abstract":"Presents chemistry and physics tables and profiles notable scientists, highlighting their achievements","citation-key":"rumbleCRCHandbookChemistry2017","edition":"98th edition 2017-2018","ISBN":"978-1-4987-8454-2","language":"eng","publisher":"CRC Press, Taylor &amp; Francis Group","publisher-place":"Boca Raton London New York","source":"K10plus ISBN","title":"CRC handbook of chemistry and physics","editor":[{"family":"Rumble","given":"John R."}],"issued":{"date-parts":[["2017"]]}}}],"schema":"https://github.com/citation-style-language/schema/raw/master/csl-citation.json"} </w:instrText>
             </w:r>
             <w:r>
               <w:rPr>
@@ -10326,7 +9999,7 @@
                 <w:sz w:val="22"/>
                 <w:vertAlign w:val="superscript"/>
               </w:rPr>
-              <w:t>[34]</w:t>
+              <w:t>[33]</w:t>
             </w:r>
             <w:r>
               <w:rPr>
@@ -10581,7 +10254,7 @@
                 <w:sz w:val="22"/>
                 <w:szCs w:val="22"/>
               </w:rPr>
-              <w:instrText xml:space="preserve"> ADDIN ZOTERO_ITEM CSL_CITATION {"citationID":"l2tMpFrk","properties":{"unsorted":false,"formattedCitation":"\\super [34]\\nosupersub{}","plainCitation":"[34]","noteIndex":0},"citationItems":[{"id":3844,"uris":["http://zotero.org/users/16939557/items/YSXNXCNJ"],"itemData":{"id":3844,"type":"book","abstract":"Presents chemistry and physics tables and profiles notable scientists, highlighting their achievements","citation-key":"rumbleCRCHandbookChemistry2017","edition":"98th edition 2017-2018","ISBN":"978-1-4987-8454-2","language":"eng","publisher":"CRC Press, Taylor &amp; Francis Group","publisher-place":"Boca Raton London New York","source":"K10plus ISBN","title":"CRC handbook of chemistry and physics","editor":[{"family":"Rumble","given":"John R."}],"issued":{"date-parts":[["2017"]]}}}],"schema":"https://github.com/citation-style-language/schema/raw/master/csl-citation.json"} </w:instrText>
+              <w:instrText xml:space="preserve"> ADDIN ZOTERO_ITEM CSL_CITATION {"citationID":"l2tMpFrk","properties":{"unsorted":false,"formattedCitation":"\\super [33]\\nosupersub{}","plainCitation":"[33]","noteIndex":0},"citationItems":[{"id":3844,"uris":["http://zotero.org/users/16939557/items/YSXNXCNJ"],"itemData":{"id":3844,"type":"book","abstract":"Presents chemistry and physics tables and profiles notable scientists, highlighting their achievements","citation-key":"rumbleCRCHandbookChemistry2017","edition":"98th edition 2017-2018","ISBN":"978-1-4987-8454-2","language":"eng","publisher":"CRC Press, Taylor &amp; Francis Group","publisher-place":"Boca Raton London New York","source":"K10plus ISBN","title":"CRC handbook of chemistry and physics","editor":[{"family":"Rumble","given":"John R."}],"issued":{"date-parts":[["2017"]]}}}],"schema":"https://github.com/citation-style-language/schema/raw/master/csl-citation.json"} </w:instrText>
             </w:r>
             <w:r>
               <w:rPr>
@@ -10597,7 +10270,7 @@
                 <w:sz w:val="22"/>
                 <w:vertAlign w:val="superscript"/>
               </w:rPr>
-              <w:t>[34]</w:t>
+              <w:t>[33]</w:t>
             </w:r>
             <w:r>
               <w:rPr>
@@ -10852,7 +10525,7 @@
                 <w:sz w:val="22"/>
                 <w:szCs w:val="22"/>
               </w:rPr>
-              <w:instrText xml:space="preserve"> ADDIN ZOTERO_ITEM CSL_CITATION {"citationID":"NlQlyJ8K","properties":{"unsorted":false,"formattedCitation":"\\super [34]\\nosupersub{}","plainCitation":"[34]","noteIndex":0},"citationItems":[{"id":3844,"uris":["http://zotero.org/users/16939557/items/YSXNXCNJ"],"itemData":{"id":3844,"type":"book","abstract":"Presents chemistry and physics tables and profiles notable scientists, highlighting their achievements","citation-key":"rumbleCRCHandbookChemistry2017","edition":"98th edition 2017-2018","ISBN":"978-1-4987-8454-2","language":"eng","publisher":"CRC Press, Taylor &amp; Francis Group","publisher-place":"Boca Raton London New York","source":"K10plus ISBN","title":"CRC handbook of chemistry and physics","editor":[{"family":"Rumble","given":"John R."}],"issued":{"date-parts":[["2017"]]}}}],"schema":"https://github.com/citation-style-language/schema/raw/master/csl-citation.json"} </w:instrText>
+              <w:instrText xml:space="preserve"> ADDIN ZOTERO_ITEM CSL_CITATION {"citationID":"NlQlyJ8K","properties":{"unsorted":false,"formattedCitation":"\\super [33]\\nosupersub{}","plainCitation":"[33]","noteIndex":0},"citationItems":[{"id":3844,"uris":["http://zotero.org/users/16939557/items/YSXNXCNJ"],"itemData":{"id":3844,"type":"book","abstract":"Presents chemistry and physics tables and profiles notable scientists, highlighting their achievements","citation-key":"rumbleCRCHandbookChemistry2017","edition":"98th edition 2017-2018","ISBN":"978-1-4987-8454-2","language":"eng","publisher":"CRC Press, Taylor &amp; Francis Group","publisher-place":"Boca Raton London New York","source":"K10plus ISBN","title":"CRC handbook of chemistry and physics","editor":[{"family":"Rumble","given":"John R."}],"issued":{"date-parts":[["2017"]]}}}],"schema":"https://github.com/citation-style-language/schema/raw/master/csl-citation.json"} </w:instrText>
             </w:r>
             <w:r>
               <w:rPr>
@@ -10868,7 +10541,7 @@
                 <w:sz w:val="22"/>
                 <w:vertAlign w:val="superscript"/>
               </w:rPr>
-              <w:t>[34]</w:t>
+              <w:t>[33]</w:t>
             </w:r>
             <w:r>
               <w:rPr>
@@ -11138,7 +10811,7 @@
                 <w:sz w:val="22"/>
                 <w:szCs w:val="22"/>
               </w:rPr>
-              <w:instrText xml:space="preserve"> ADDIN ZOTERO_ITEM CSL_CITATION {"citationID":"m13lUIve","properties":{"unsorted":false,"formattedCitation":"\\super [35]\\nosupersub{}","plainCitation":"[35]","noteIndex":0},"citationItems":[{"id":3994,"uris":["http://zotero.org/users/16939557/items/TWITJIEX","http://zotero.org/users/16939557/items/6XPFCI3L"],"itemData":{"id":3994,"type":"article-journal","citation-key":"hanTemperatureDependenceOxygen1996","container-title":"The Journal of Physical Chemistry","DOI":"10.1021/jp952903y","ISSN":"0022-3654, 1541-5740","issue":"13","journalAbbreviation":"J. Phys. Chem.","language":"en","page":"5597-5602","source":"DOI.org (Crossref)","title":"&lt;b&gt;Temperature Dependence of Oxygen Diffusion in&lt;/b&gt; &lt;b&gt;H&lt;/b&gt; &lt;b&gt;&lt;sub&gt;2&lt;/sub&gt; &lt;/b&gt; &lt;b&gt;O and D&lt;/b&gt; &lt;b&gt;&lt;sub&gt;2&lt;/sub&gt; &lt;/b&gt; &lt;b&gt;O&lt;/b&gt;","volume":"100","author":[{"family":"Han","given":"Ping"},{"family":"Bartels","given":"David M."}],"issued":{"date-parts":[["1996",1,1]]}}}],"schema":"https://github.com/citation-style-language/schema/raw/master/csl-citation.json"} </w:instrText>
+              <w:instrText xml:space="preserve"> ADDIN ZOTERO_ITEM CSL_CITATION {"citationID":"m13lUIve","properties":{"unsorted":false,"formattedCitation":"\\super [34]\\nosupersub{}","plainCitation":"[34]","noteIndex":0},"citationItems":[{"id":3994,"uris":["http://zotero.org/users/16939557/items/TWITJIEX","http://zotero.org/users/16939557/items/6XPFCI3L"],"itemData":{"id":3994,"type":"article-journal","citation-key":"hanTemperatureDependenceOxygen1996","container-title":"The Journal of Physical Chemistry","DOI":"10.1021/jp952903y","ISSN":"0022-3654, 1541-5740","issue":"13","journalAbbreviation":"J. Phys. Chem.","language":"en","page":"5597-5602","source":"DOI.org (Crossref)","title":"&lt;b&gt;Temperature Dependence of Oxygen Diffusion in&lt;/b&gt; &lt;b&gt;H&lt;/b&gt; &lt;b&gt;&lt;sub&gt;2&lt;/sub&gt; &lt;/b&gt; &lt;b&gt;O and D&lt;/b&gt; &lt;b&gt;&lt;sub&gt;2&lt;/sub&gt; &lt;/b&gt; &lt;b&gt;O&lt;/b&gt;","volume":"100","author":[{"family":"Han","given":"Ping"},{"family":"Bartels","given":"David M."}],"issued":{"date-parts":[["1996",1,1]]}}}],"schema":"https://github.com/citation-style-language/schema/raw/master/csl-citation.json"} </w:instrText>
             </w:r>
             <w:r>
               <w:rPr>
@@ -11154,7 +10827,7 @@
                 <w:sz w:val="22"/>
                 <w:vertAlign w:val="superscript"/>
               </w:rPr>
-              <w:t>[35]</w:t>
+              <w:t>[34]</w:t>
             </w:r>
             <w:r>
               <w:rPr>
@@ -11398,7 +11071,7 @@
                 <w:sz w:val="22"/>
                 <w:szCs w:val="22"/>
               </w:rPr>
-              <w:instrText xml:space="preserve"> ADDIN ZOTERO_ITEM CSL_CITATION {"citationID":"hHwQHmrQ","properties":{"unsorted":false,"formattedCitation":"\\super [34]\\nosupersub{}","plainCitation":"[34]","noteIndex":0},"citationItems":[{"id":3844,"uris":["http://zotero.org/users/16939557/items/YSXNXCNJ"],"itemData":{"id":3844,"type":"book","abstract":"Presents chemistry and physics tables and profiles notable scientists, highlighting their achievements","citation-key":"rumbleCRCHandbookChemistry2017","edition":"98th edition 2017-2018","ISBN":"978-1-4987-8454-2","language":"eng","publisher":"CRC Press, Taylor &amp; Francis Group","publisher-place":"Boca Raton London New York","source":"K10plus ISBN","title":"CRC handbook of chemistry and physics","editor":[{"family":"Rumble","given":"John R."}],"issued":{"date-parts":[["2017"]]}}}],"schema":"https://github.com/citation-style-language/schema/raw/master/csl-citation.json"} </w:instrText>
+              <w:instrText xml:space="preserve"> ADDIN ZOTERO_ITEM CSL_CITATION {"citationID":"hHwQHmrQ","properties":{"unsorted":false,"formattedCitation":"\\super [33]\\nosupersub{}","plainCitation":"[33]","noteIndex":0},"citationItems":[{"id":3844,"uris":["http://zotero.org/users/16939557/items/YSXNXCNJ"],"itemData":{"id":3844,"type":"book","abstract":"Presents chemistry and physics tables and profiles notable scientists, highlighting their achievements","citation-key":"rumbleCRCHandbookChemistry2017","edition":"98th edition 2017-2018","ISBN":"978-1-4987-8454-2","language":"eng","publisher":"CRC Press, Taylor &amp; Francis Group","publisher-place":"Boca Raton London New York","source":"K10plus ISBN","title":"CRC handbook of chemistry and physics","editor":[{"family":"Rumble","given":"John R."}],"issued":{"date-parts":[["2017"]]}}}],"schema":"https://github.com/citation-style-language/schema/raw/master/csl-citation.json"} </w:instrText>
             </w:r>
             <w:r>
               <w:rPr>
@@ -11414,7 +11087,7 @@
                 <w:sz w:val="22"/>
                 <w:vertAlign w:val="superscript"/>
               </w:rPr>
-              <w:t>[34]</w:t>
+              <w:t>[33]</w:t>
             </w:r>
             <w:r>
               <w:rPr>
@@ -11540,7 +11213,7 @@
                 <w:sz w:val="22"/>
                 <w:szCs w:val="22"/>
               </w:rPr>
-              <w:instrText xml:space="preserve"> ADDIN ZOTERO_ITEM CSL_CITATION {"citationID":"oOAQfSGY","properties":{"unsorted":false,"formattedCitation":"\\super [36]\\nosupersub{}","plainCitation":"[36]","noteIndex":0},"citationItems":[{"id":4093,"uris":["http://zotero.org/users/16939557/items/UL4PDBDZ"],"itemData":{"id":4093,"type":"article-journal","abstract":"Porous films of metals and metal oxides exhibit larger surface areas and higher reactivities than those of dense films. Therefore, they have gained growing attention as potential materials for use in various applications. This study reports the use of a modified direct current magnetron sputtering method to form porous Zn-ZnO composite films, wherein a subsequent wet post-oxidation process is employed to fabricate pure porous ZnO films. The porous Zn-ZnO composite films were initially formed in clusters, and evaluation of their resulting properties allowed the optimal conditions to be determined. An oxygen ratio of 0.3% in the argon gas flow resulted in the best porosity, while a process pressure of 14 mTorr was optimal. Following deposition, porous ZnO films were obtained through rapid thermal annealing in the presence of water vapor, and the properties and porosities of the obtained films were analyzed. An oxidation temperature of 500 °C was optimal, with an oxidation time of 5 min giving a pure ZnO film with 26% porosity. Due to the fact that the films produced using this method are highly reliable, they could be employed in applications that require large specific surface areas, such as sensors, supercapacitors, and batteries.","citation-key":"parkFabricationHighlyPorous2021","container-title":"Materials","DOI":"10.3390/ma14206112","ISSN":"1996-1944","issue":"20","journalAbbreviation":"Materials","language":"en","page":"6112","source":"DOI.org (Crossref)","title":"Fabrication of Highly Porous and Pure Zinc Oxide Films Using Modified DC Magnetron Sputtering and Post-Oxidation","volume":"14","author":[{"family":"Park","given":"Se-Yong"},{"family":"Rho","given":"Soon-Ho"},{"family":"Lee","given":"Hwan-Seok"},{"family":"Kim","given":"Kyoung-Min"},{"family":"Lee","given":"Hee-Chul"}],"issued":{"date-parts":[["2021",10,15]]}}}],"schema":"https://github.com/citation-style-language/schema/raw/master/csl-citation.json"} </w:instrText>
+              <w:instrText xml:space="preserve"> ADDIN ZOTERO_ITEM CSL_CITATION {"citationID":"oOAQfSGY","properties":{"unsorted":false,"formattedCitation":"\\super [35]\\nosupersub{}","plainCitation":"[35]","noteIndex":0},"citationItems":[{"id":4093,"uris":["http://zotero.org/users/16939557/items/UL4PDBDZ"],"itemData":{"id":4093,"type":"article-journal","abstract":"Porous films of metals and metal oxides exhibit larger surface areas and higher reactivities than those of dense films. Therefore, they have gained growing attention as potential materials for use in various applications. This study reports the use of a modified direct current magnetron sputtering method to form porous Zn-ZnO composite films, wherein a subsequent wet post-oxidation process is employed to fabricate pure porous ZnO films. The porous Zn-ZnO composite films were initially formed in clusters, and evaluation of their resulting properties allowed the optimal conditions to be determined. An oxygen ratio of 0.3% in the argon gas flow resulted in the best porosity, while a process pressure of 14 mTorr was optimal. Following deposition, porous ZnO films were obtained through rapid thermal annealing in the presence of water vapor, and the properties and porosities of the obtained films were analyzed. An oxidation temperature of 500 °C was optimal, with an oxidation time of 5 min giving a pure ZnO film with 26% porosity. Due to the fact that the films produced using this method are highly reliable, they could be employed in applications that require large specific surface areas, such as sensors, supercapacitors, and batteries.","citation-key":"parkFabricationHighlyPorous2021","container-title":"Materials","DOI":"10.3390/ma14206112","ISSN":"1996-1944","issue":"20","journalAbbreviation":"Materials","language":"en","page":"6112","source":"DOI.org (Crossref)","title":"Fabrication of Highly Porous and Pure Zinc Oxide Films Using Modified DC Magnetron Sputtering and Post-Oxidation","volume":"14","author":[{"family":"Park","given":"Se-Yong"},{"family":"Rho","given":"Soon-Ho"},{"family":"Lee","given":"Hwan-Seok"},{"family":"Kim","given":"Kyoung-Min"},{"family":"Lee","given":"Hee-Chul"}],"issued":{"date-parts":[["2021",10,15]]}}}],"schema":"https://github.com/citation-style-language/schema/raw/master/csl-citation.json"} </w:instrText>
             </w:r>
             <w:r>
               <w:rPr>
@@ -11556,7 +11229,7 @@
                 <w:sz w:val="22"/>
                 <w:vertAlign w:val="superscript"/>
               </w:rPr>
-              <w:t>[36]</w:t>
+              <w:t>[35]</w:t>
             </w:r>
             <w:r>
               <w:rPr>
@@ -11769,7 +11442,7 @@
                 <w:sz w:val="22"/>
                 <w:vertAlign w:val="superscript"/>
               </w:rPr>
-              <w:instrText xml:space="preserve"> ADDIN ZOTERO_ITEM CSL_CITATION {"citationID":"Au8QZnxE","properties":{"unsorted":false,"formattedCitation":"\\super [37]\\nosupersub{}","plainCitation":"[37]","noteIndex":0},"citationItems":[{"id":3991,"uris":["http://zotero.org/users/16939557/items/PJ5WSM85"],"itemData":{"id":3991,"type":"chapter","abstract":"Abstract\n            \n              It is generally assumed that transport resistance in porous media, which can also be expressed as tortuosity, correlates somehow with the pore volume fraction. Hence, mathematical expressions such as the Bruggeman relation (i.e.,\n              τ\n              2\n               = \n              ε\n              −1/2\n              ) are often used to describe tortuosity (\n              τ\n              )—porosity (\n              ε\n              ) relationships in porous materials. In this chapter, the validity of such mathematical expressions is critically evaluated based on empirical data from literature. More than 2200 datapoints (i.e.,\n              τ\n              –\n              ε\n              couples) are collected from 69 studies on porous media transport. When the empirical data is analysed separately for different material types (e.g., for battery electrodes, SOFC electrodes, sandstones, packed spheres etc.), the resulting\n              τ\n              versus\n              ε\n              —plots do not show clear trend lines, that could be expressed with a mathematical expression. Instead, the datapoints for different materials show strongly scattered distributions in rather ill-defined ‘characteristic’ fields. Overall, those characteristic fields are strongly overlapping, which means that the\n              τ\n              –\n              ε\n              characteristics of different materials cannot be separated clearly. When the empirical data is analysed for different tortuosity types, a much more consistent pattern becomes apparent. Hence, the observed\n              τ\n              −\n              ε\n              pattern indicates that the measured tortuosity values strongly depend on the involved type of tortuosity. A relative order of measured tortuosity values then becomes apparent. For example, the values observed for direct geometric and mixed tortuosities are concentrated in a relatively narrow band close to the Bruggeman trend line, with values that are typically &lt; 2. In contrast, indirect tortuosities show higher values, and they scatter over a much larger range. Based on the analysis of empirical data, a detailed pattern with a very consistent relative order among the different tortuosity types can be established. The main conclusion from this chapter is thus that the tortuosity value that is measured for a specific material, is much more dependent on the type of tortuosity than it is dependent on the material and its microstructure. The empirical data also illustrates that tortuosity is not strictly bound to porosity. As the pore volume decreases, the more scattering of tortuosity values can be observed. Consequently, any mathematical expression that aims to provide a generalized description of\n              τ\n              −\n              ε\n              relationships in porous media must be questioned. A short section is thus provided with a discussion of the limitations of such mathematical expressions for\n              τ\n              −\n              ε\n              relationships. This discussion also includes a description of the rare and special cases, for which the use of such mathematical expressions can be justified.","citation-key":"holzerTortuosityPorosityRelationshipsReview2023","container-title":"Tortuosity and Microstructure Effects in Porous Media","DOI":"10.1007/978-3-031-30477-4_3","ISBN":"978-3-031-30476-7","language":"en","note":"collection-title: Springer Series in Materials Science","page":"51-89","publisher":"Springer International Publishing","publisher-place":"Cham","source":"DOI.org (Crossref)","title":"Tortuosity-Porosity Relationships: Review of Empirical Data from Literature","title-short":"Tortuosity-Porosity Relationships","URL":"https://link.springer.com/10.1007/978-3-031-30477-4_3","volume":"333","container-author":[{"family":"Holzer","given":"Lorenz"},{"family":"Marmet","given":"Philip"},{"family":"Fingerle","given":"Mathias"},{"family":"Wiegmann","given":"Andreas"},{"family":"Neumann","given":"Matthias"},{"family":"Schmidt","given":"Volker"}],"author":[{"family":"Holzer","given":"Lorenz"},{"family":"Marmet","given":"Philip"},{"family":"Fingerle","given":"Mathias"},{"family":"Wiegmann","given":"Andreas"},{"family":"Neumann","given":"Matthias"},{"family":"Schmidt","given":"Volker"}],"accessed":{"date-parts":[["2026",3,12]]},"issued":{"date-parts":[["2023"]]}}}],"schema":"https://github.com/citation-style-language/schema/raw/master/csl-citation.json"} </w:instrText>
+              <w:instrText xml:space="preserve"> ADDIN ZOTERO_ITEM CSL_CITATION {"citationID":"Au8QZnxE","properties":{"unsorted":false,"formattedCitation":"\\super [36]\\nosupersub{}","plainCitation":"[36]","noteIndex":0},"citationItems":[{"id":3991,"uris":["http://zotero.org/users/16939557/items/PJ5WSM85"],"itemData":{"id":3991,"type":"chapter","abstract":"Abstract\n            \n              It is generally assumed that transport resistance in porous media, which can also be expressed as tortuosity, correlates somehow with the pore volume fraction. Hence, mathematical expressions such as the Bruggeman relation (i.e.,\n              τ\n              2\n               = \n              ε\n              −1/2\n              ) are often used to describe tortuosity (\n              τ\n              )—porosity (\n              ε\n              ) relationships in porous materials. In this chapter, the validity of such mathematical expressions is critically evaluated based on empirical data from literature. More than 2200 datapoints (i.e.,\n              τ\n              –\n              ε\n              couples) are collected from 69 studies on porous media transport. When the empirical data is analysed separately for different material types (e.g., for battery electrodes, SOFC electrodes, sandstones, packed spheres etc.), the resulting\n              τ\n              versus\n              ε\n              —plots do not show clear trend lines, that could be expressed with a mathematical expression. Instead, the datapoints for different materials show strongly scattered distributions in rather ill-defined ‘characteristic’ fields. Overall, those characteristic fields are strongly overlapping, which means that the\n              τ\n              –\n              ε\n              characteristics of different materials cannot be separated clearly. When the empirical data is analysed for different tortuosity types, a much more consistent pattern becomes apparent. Hence, the observed\n              τ\n              −\n              ε\n              pattern indicates that the measured tortuosity values strongly depend on the involved type of tortuosity. A relative order of measured tortuosity values then becomes apparent. For example, the values observed for direct geometric and mixed tortuosities are concentrated in a relatively narrow band close to the Bruggeman trend line, with values that are typically &lt; 2. In contrast, indirect tortuosities show higher values, and they scatter over a much larger range. Based on the analysis of empirical data, a detailed pattern with a very consistent relative order among the different tortuosity types can be established. The main conclusion from this chapter is thus that the tortuosity value that is measured for a specific material, is much more dependent on the type of tortuosity than it is dependent on the material and its microstructure. The empirical data also illustrates that tortuosity is not strictly bound to porosity. As the pore volume decreases, the more scattering of tortuosity values can be observed. Consequently, any mathematical expression that aims to provide a generalized description of\n              τ\n              −\n              ε\n              relationships in porous media must be questioned. A short section is thus provided with a discussion of the limitations of such mathematical expressions for\n              τ\n              −\n              ε\n              relationships. This discussion also includes a description of the rare and special cases, for which the use of such mathematical expressions can be justified.","citation-key":"holzerTortuosityPorosityRelationshipsReview2023","container-title":"Tortuosity and Microstructure Effects in Porous Media","DOI":"10.1007/978-3-031-30477-4_3","ISBN":"978-3-031-30476-7","language":"en","note":"collection-title: Springer Series in Materials Science","page":"51-89","publisher":"Springer International Publishing","publisher-place":"Cham","source":"DOI.org (Crossref)","title":"Tortuosity-Porosity Relationships: Review of Empirical Data from Literature","title-short":"Tortuosity-Porosity Relationships","URL":"https://link.springer.com/10.1007/978-3-031-30477-4_3","volume":"333","container-author":[{"family":"Holzer","given":"Lorenz"},{"family":"Marmet","given":"Philip"},{"family":"Fingerle","given":"Mathias"},{"family":"Wiegmann","given":"Andreas"},{"family":"Neumann","given":"Matthias"},{"family":"Schmidt","given":"Volker"}],"author":[{"family":"Holzer","given":"Lorenz"},{"family":"Marmet","given":"Philip"},{"family":"Fingerle","given":"Mathias"},{"family":"Wiegmann","given":"Andreas"},{"family":"Neumann","given":"Matthias"},{"family":"Schmidt","given":"Volker"}],"accessed":{"date-parts":[["2026",3,12]]},"issued":{"date-parts":[["2023"]]}}}],"schema":"https://github.com/citation-style-language/schema/raw/master/csl-citation.json"} </w:instrText>
             </w:r>
             <w:r>
               <w:rPr>
@@ -11785,7 +11458,7 @@
                 <w:sz w:val="22"/>
                 <w:vertAlign w:val="superscript"/>
               </w:rPr>
-              <w:t>[37]</w:t>
+              <w:t>[36]</w:t>
             </w:r>
             <w:r>
               <w:rPr>
@@ -11821,7 +11494,7 @@
                 <w:sz w:val="22"/>
                 <w:szCs w:val="22"/>
               </w:rPr>
-              <w:instrText xml:space="preserve"> ADDIN ZOTERO_ITEM CSL_CITATION {"citationID":"9qIzsxfq","properties":{"unsorted":false,"formattedCitation":"\\super [34]\\nosupersub{}","plainCitation":"[34]","noteIndex":0},"citationItems":[{"id":3844,"uris":["http://zotero.org/users/16939557/items/YSXNXCNJ"],"itemData":{"id":3844,"type":"book","abstract":"Presents chemistry and physics tables and profiles notable scientists, highlighting their achievements","citation-key":"rumbleCRCHandbookChemistry2017","edition":"98th edition 2017-2018","ISBN":"978-1-4987-8454-2","language":"eng","publisher":"CRC Press, Taylor &amp; Francis Group","publisher-place":"Boca Raton London New York","source":"K10plus ISBN","title":"CRC handbook of chemistry and physics","editor":[{"family":"Rumble","given":"John R."}],"issued":{"date-parts":[["2017"]]}}}],"schema":"https://github.com/citation-style-language/schema/raw/master/csl-citation.json"} </w:instrText>
+              <w:instrText xml:space="preserve"> ADDIN ZOTERO_ITEM CSL_CITATION {"citationID":"9qIzsxfq","properties":{"unsorted":false,"formattedCitation":"\\super [33]\\nosupersub{}","plainCitation":"[33]","noteIndex":0},"citationItems":[{"id":3844,"uris":["http://zotero.org/users/16939557/items/YSXNXCNJ"],"itemData":{"id":3844,"type":"book","abstract":"Presents chemistry and physics tables and profiles notable scientists, highlighting their achievements","citation-key":"rumbleCRCHandbookChemistry2017","edition":"98th edition 2017-2018","ISBN":"978-1-4987-8454-2","language":"eng","publisher":"CRC Press, Taylor &amp; Francis Group","publisher-place":"Boca Raton London New York","source":"K10plus ISBN","title":"CRC handbook of chemistry and physics","editor":[{"family":"Rumble","given":"John R."}],"issued":{"date-parts":[["2017"]]}}}],"schema":"https://github.com/citation-style-language/schema/raw/master/csl-citation.json"} </w:instrText>
             </w:r>
             <w:r>
               <w:rPr>
@@ -11837,7 +11510,7 @@
                 <w:sz w:val="22"/>
                 <w:vertAlign w:val="superscript"/>
               </w:rPr>
-              <w:t>[34]</w:t>
+              <w:t>[33]</w:t>
             </w:r>
             <w:r>
               <w:rPr>
@@ -12145,7 +11818,7 @@
                 <w:sz w:val="22"/>
                 <w:szCs w:val="22"/>
               </w:rPr>
-              <w:instrText xml:space="preserve"> ADDIN ZOTERO_ITEM CSL_CITATION {"citationID":"4uE0bPh7","properties":{"unsorted":false,"formattedCitation":"\\super [38]\\nosupersub{}","plainCitation":"[38]","noteIndex":0},"citationItems":[{"id":3507,"uris":["http://zotero.org/users/16939557/items/3SWFGNFX"],"itemData":{"id":3507,"type":"article-journal","citation-key":"chenFluidinducedCorrosionBehavior2021","container-title":"Journal of Materials Science &amp; Technology","DOI":"10.1016/j.jmst.2021.02.050","ISSN":"10050302","journalAbbreviation":"Journal of Materials Science &amp; Technology","language":"en","page":"134-147","source":"DOI.org (Crossref)","title":"Fluid-induced corrosion behavior of degradable zinc for stent application","volume":"91","author":[{"family":"Chen","given":"Kai"},{"family":"Gu","given":"Xuenan"},{"family":"Sun","given":"Hui"},{"family":"Tang","given":"Hongyan"},{"family":"Yang","given":"Hongtao"},{"family":"Gong","given":"Xianghui"},{"family":"Fan","given":"Yubo"}],"issued":{"date-parts":[["2021",11]]}}}],"schema":"https://github.com/citation-style-language/schema/raw/master/csl-citation.json"} </w:instrText>
+              <w:instrText xml:space="preserve"> ADDIN ZOTERO_ITEM CSL_CITATION {"citationID":"4uE0bPh7","properties":{"unsorted":false,"formattedCitation":"\\super [37]\\nosupersub{}","plainCitation":"[37]","noteIndex":0},"citationItems":[{"id":3507,"uris":["http://zotero.org/users/16939557/items/3SWFGNFX"],"itemData":{"id":3507,"type":"article-journal","citation-key":"chenFluidinducedCorrosionBehavior2021","container-title":"Journal of Materials Science &amp; Technology","DOI":"10.1016/j.jmst.2021.02.050","ISSN":"10050302","journalAbbreviation":"Journal of Materials Science &amp; Technology","language":"en","page":"134-147","source":"DOI.org (Crossref)","title":"Fluid-induced corrosion behavior of degradable zinc for stent application","volume":"91","author":[{"family":"Chen","given":"Kai"},{"family":"Gu","given":"Xuenan"},{"family":"Sun","given":"Hui"},{"family":"Tang","given":"Hongyan"},{"family":"Yang","given":"Hongtao"},{"family":"Gong","given":"Xianghui"},{"family":"Fan","given":"Yubo"}],"issued":{"date-parts":[["2021",11]]}}}],"schema":"https://github.com/citation-style-language/schema/raw/master/csl-citation.json"} </w:instrText>
             </w:r>
             <w:r>
               <w:rPr>
@@ -12161,7 +11834,7 @@
                 <w:sz w:val="22"/>
                 <w:vertAlign w:val="superscript"/>
               </w:rPr>
-              <w:t>[38]</w:t>
+              <w:t>[37]</w:t>
             </w:r>
             <w:r>
               <w:rPr>
@@ -12652,7 +12325,7 @@
                 <w:sz w:val="22"/>
                 <w:szCs w:val="22"/>
               </w:rPr>
-              <w:instrText xml:space="preserve"> ADDIN ZOTERO_ITEM CSL_CITATION {"citationID":"ZtOdV6sS","properties":{"unsorted":false,"formattedCitation":"\\super [39]\\nosupersub{}","plainCitation":"[39]","noteIndex":0},"citationItems":[{"id":4092,"uris":["http://zotero.org/users/16939557/items/946AFXXG"],"itemData":{"id":4092,"type":"article-journal","abstract":"The electrochemical corrosion characteristics of AZ31 and AZ61 magnesium alloys were analyzed in terms of potentiodynamic tests and electrochemical impedance spectroscopy. The influence of the solution composition and material surface finish was examined also through the analysis of corrosion products created on the samples’ surface after electrochemical measurements in terms of scanning electron microscopy using energy-dispersive spectroscopy. Obtained data revealed the differences in the response of the magnesium alloys to enriched Hank’s Balanced Salt Solution—HBSS+ (with Mg2+ and Ca2+ ions) and Hank’s Balanced Salt Solution—HBSS (without Mg2+ and Ca2+ ions). Both examined alloys exhibited better corrosion resistance from the thermodynamic and kinetic point of view in the enriched HBSS+. AZ61 magnesium alloy reached higher values of polarization resistance than AZ31 magnesium alloy in both the used corrosion solutions. Phosphate-based corrosion products were characteristic for the AZ31 and AZ61 alloys tested in the HBSS (without Mg2+ and Ca2+ ions). The combination of phosphate-based corrosion products and clusters of MgO and Mg(OH)2 was typical for the surface of samples tested in the enriched HBSS+ (with Mg2+ and Ca2+ ions). Pitting corrosion attack was observed only in the case of enriched HBSS+.","citation-key":"tkaczInfluenceCompositionHanks2017","container-title":"Metals","DOI":"10.3390/met7110465","ISSN":"2075-4701","issue":"11","journalAbbreviation":"Metals","language":"en","page":"465","source":"DOI.org (Crossref)","title":"Influence of the Composition of the Hank’s Balanced Salt Solution on the Corrosion Behavior of AZ31 and AZ61 Magnesium Alloys","volume":"7","author":[{"family":"Tkacz","given":"Jakub"},{"family":"Slouková","given":"Karolína"},{"family":"Minda","given":"Jozef"},{"family":"Drábiková","given":"Juliána"},{"family":"Fintová","given":"Stanislava"},{"family":"Doležal","given":"Pavel"},{"family":"Wasserbauer","given":"Jaromír"}],"issued":{"date-parts":[["2017",11,1]]}}}],"schema":"https://github.com/citation-style-language/schema/raw/master/csl-citation.json"} </w:instrText>
+              <w:instrText xml:space="preserve"> ADDIN ZOTERO_ITEM CSL_CITATION {"citationID":"ZtOdV6sS","properties":{"unsorted":false,"formattedCitation":"\\super [38]\\nosupersub{}","plainCitation":"[38]","noteIndex":0},"citationItems":[{"id":4092,"uris":["http://zotero.org/users/16939557/items/946AFXXG"],"itemData":{"id":4092,"type":"article-journal","abstract":"The electrochemical corrosion characteristics of AZ31 and AZ61 magnesium alloys were analyzed in terms of potentiodynamic tests and electrochemical impedance spectroscopy. The influence of the solution composition and material surface finish was examined also through the analysis of corrosion products created on the samples’ surface after electrochemical measurements in terms of scanning electron microscopy using energy-dispersive spectroscopy. Obtained data revealed the differences in the response of the magnesium alloys to enriched Hank’s Balanced Salt Solution—HBSS+ (with Mg2+ and Ca2+ ions) and Hank’s Balanced Salt Solution—HBSS (without Mg2+ and Ca2+ ions). Both examined alloys exhibited better corrosion resistance from the thermodynamic and kinetic point of view in the enriched HBSS+. AZ61 magnesium alloy reached higher values of polarization resistance than AZ31 magnesium alloy in both the used corrosion solutions. Phosphate-based corrosion products were characteristic for the AZ31 and AZ61 alloys tested in the HBSS (without Mg2+ and Ca2+ ions). The combination of phosphate-based corrosion products and clusters of MgO and Mg(OH)2 was typical for the surface of samples tested in the enriched HBSS+ (with Mg2+ and Ca2+ ions). Pitting corrosion attack was observed only in the case of enriched HBSS+.","citation-key":"tkaczInfluenceCompositionHanks2017","container-title":"Metals","DOI":"10.3390/met7110465","ISSN":"2075-4701","issue":"11","journalAbbreviation":"Metals","language":"en","page":"465","source":"DOI.org (Crossref)","title":"Influence of the Composition of the Hank’s Balanced Salt Solution on the Corrosion Behavior of AZ31 and AZ61 Magnesium Alloys","volume":"7","author":[{"family":"Tkacz","given":"Jakub"},{"family":"Slouková","given":"Karolína"},{"family":"Minda","given":"Jozef"},{"family":"Drábiková","given":"Juliána"},{"family":"Fintová","given":"Stanislava"},{"family":"Doležal","given":"Pavel"},{"family":"Wasserbauer","given":"Jaromír"}],"issued":{"date-parts":[["2017",11,1]]}}}],"schema":"https://github.com/citation-style-language/schema/raw/master/csl-citation.json"} </w:instrText>
             </w:r>
             <w:r>
               <w:rPr>
@@ -12668,7 +12341,7 @@
                 <w:sz w:val="22"/>
                 <w:vertAlign w:val="superscript"/>
               </w:rPr>
-              <w:t>[39]</w:t>
+              <w:t>[38]</w:t>
             </w:r>
             <w:r>
               <w:rPr>
@@ -13042,7 +12715,7 @@
                 <w:sz w:val="22"/>
                 <w:szCs w:val="22"/>
               </w:rPr>
-              <w:instrText xml:space="preserve"> ADDIN ZOTERO_ITEM CSL_CITATION {"citationID":"GVtRPvVm","properties":{"unsorted":false,"formattedCitation":"\\super [40]\\nosupersub{}","plainCitation":"[40]","noteIndex":0},"citationItems":[{"id":3922,"uris":["http://zotero.org/users/16939557/items/9XZFX7JJ"],"itemData":{"id":3922,"type":"article-journal","citation-key":"kokuboHowUsefulSBF2006","container-title":"Biomaterials","DOI":"10.1016/j.biomaterials.2006.01.017","ISSN":"01429612","issue":"15","journalAbbreviation":"Biomaterials","language":"en","page":"2907-2915","source":"DOI.org (Crossref)","title":"How useful is SBF in predicting in vivo bone bioactivity?","volume":"27","author":[{"family":"Kokubo","given":"Tadashi"},{"family":"Takadama","given":"Hiroaki"}],"issued":{"date-parts":[["2006",5]]}}}],"schema":"https://github.com/citation-style-language/schema/raw/master/csl-citation.json"} </w:instrText>
+              <w:instrText xml:space="preserve"> ADDIN ZOTERO_ITEM CSL_CITATION {"citationID":"GVtRPvVm","properties":{"unsorted":false,"formattedCitation":"\\super [39]\\nosupersub{}","plainCitation":"[39]","noteIndex":0},"citationItems":[{"id":3922,"uris":["http://zotero.org/users/16939557/items/9XZFX7JJ"],"itemData":{"id":3922,"type":"article-journal","citation-key":"kokuboHowUsefulSBF2006","container-title":"Biomaterials","DOI":"10.1016/j.biomaterials.2006.01.017","ISSN":"01429612","issue":"15","journalAbbreviation":"Biomaterials","language":"en","page":"2907-2915","source":"DOI.org (Crossref)","title":"How useful is SBF in predicting in vivo bone bioactivity?","volume":"27","author":[{"family":"Kokubo","given":"Tadashi"},{"family":"Takadama","given":"Hiroaki"}],"issued":{"date-parts":[["2006",5]]}}}],"schema":"https://github.com/citation-style-language/schema/raw/master/csl-citation.json"} </w:instrText>
             </w:r>
             <w:r>
               <w:rPr>
@@ -13058,7 +12731,7 @@
                 <w:sz w:val="22"/>
                 <w:vertAlign w:val="superscript"/>
               </w:rPr>
-              <w:t>[40]</w:t>
+              <w:t>[39]</w:t>
             </w:r>
             <w:r>
               <w:rPr>
@@ -13258,7 +12931,7 @@
         <w:rPr>
           <w:rFonts w:cs="Times New Roman"/>
         </w:rPr>
-        <w:instrText xml:space="preserve"> ADDIN ZOTERO_ITEM CSL_CITATION {"citationID":"4C0fw3Ct","properties":{"unsorted":false,"formattedCitation":"\\super [41]\\nosupersub{}","plainCitation":"[41]","noteIndex":0},"citationItems":[{"id":3943,"uris":["http://zotero.org/users/16939557/items/QAXDRACS"],"itemData":{"id":3943,"type":"article-journal","citation-key":"liuInitialFormationCorrosion2018","container-title":"Journal of Materials Science &amp; Technology","DOI":"10.1016/j.jmst.2018.05.005","ISSN":"10050302","issue":"12","journalAbbreviation":"Journal of Materials Science &amp; Technology","language":"en","page":"2271-2282","source":"DOI.org (Crossref)","title":"Initial formation of corrosion products on pure zinc in simulated body fluid","volume":"34","author":[{"family":"Liu","given":"Lijun"},{"family":"Meng","given":"Yao"},{"family":"Dong","given":"Chaofang"},{"family":"Yan","given":"Yu"},{"family":"Volinsky","given":"Alex A."},{"family":"Wang","given":"Lu-Ning"}],"issued":{"date-parts":[["2018",12]]}}}],"schema":"https://github.com/citation-style-language/schema/raw/master/csl-citation.json"} </w:instrText>
+        <w:instrText xml:space="preserve"> ADDIN ZOTERO_ITEM CSL_CITATION {"citationID":"4C0fw3Ct","properties":{"unsorted":false,"formattedCitation":"\\super [40]\\nosupersub{}","plainCitation":"[40]","noteIndex":0},"citationItems":[{"id":3943,"uris":["http://zotero.org/users/16939557/items/QAXDRACS"],"itemData":{"id":3943,"type":"article-journal","citation-key":"liuInitialFormationCorrosion2018","container-title":"Journal of Materials Science &amp; Technology","DOI":"10.1016/j.jmst.2018.05.005","ISSN":"10050302","issue":"12","journalAbbreviation":"Journal of Materials Science &amp; Technology","language":"en","page":"2271-2282","source":"DOI.org (Crossref)","title":"Initial formation of corrosion products on pure zinc in simulated body fluid","volume":"34","author":[{"family":"Liu","given":"Lijun"},{"family":"Meng","given":"Yao"},{"family":"Dong","given":"Chaofang"},{"family":"Yan","given":"Yu"},{"family":"Volinsky","given":"Alex A."},{"family":"Wang","given":"Lu-Ning"}],"issued":{"date-parts":[["2018",12]]}}}],"schema":"https://github.com/citation-style-language/schema/raw/master/csl-citation.json"} </w:instrText>
       </w:r>
       <w:r>
         <w:rPr>
@@ -13271,7 +12944,7 @@
           <w:rFonts w:cs="Times New Roman"/>
           <w:vertAlign w:val="superscript"/>
         </w:rPr>
-        <w:t>[41]</w:t>
+        <w:t>[40]</w:t>
       </w:r>
       <w:r>
         <w:rPr>
@@ -13412,31 +13085,13 @@
         </m:r>
       </m:oMath>
       <w:r>
-        <w:t xml:space="preserve">. Each parameter was varied </w:t>
-      </w:r>
-      <w:r>
-        <w:t>above and below the baseline</w:t>
-      </w:r>
-      <w:r>
-        <w:t xml:space="preserve"> values while the remaining parameters were held constant. The resulting changes in mass loss, corrosion-</w:t>
-      </w:r>
-      <w:r>
-        <w:t>product saturation (F/Fₘₐₓ)</w:t>
-      </w:r>
-      <w:r>
-        <w:t xml:space="preserve">, and interfacial oxygen concentration were analyzed to </w:t>
+        <w:t xml:space="preserve">. Each parameter was varied above and below the baseline values while the remaining parameters were held constant. The resulting changes in mass loss, corrosion-product saturation (F/Fₘₐₓ), and interfacial oxygen concentration were analyzed to </w:t>
       </w:r>
       <w:r>
         <w:t>investigate</w:t>
       </w:r>
       <w:r>
-        <w:t xml:space="preserve"> the roles of passivation, </w:t>
-      </w:r>
-      <w:r>
-        <w:t xml:space="preserve">corrosion-product </w:t>
-      </w:r>
-      <w:r>
-        <w:t>dissolution, and oxygen-reduction kinetics in governing Zn degradation behavior.</w:t>
+        <w:t xml:space="preserve"> the roles of passivation, corrosion-product dissolution, and oxygen-reduction kinetics in governing Zn degradation behavior.</w:t>
       </w:r>
     </w:p>
     <w:p>
@@ -13478,7 +13133,7 @@
         <w:fldChar w:fldCharType="begin"/>
       </w:r>
       <w:r>
-        <w:instrText xml:space="preserve"> ADDIN ZOTERO_ITEM CSL_CITATION {"citationID":"9eSARvh4","properties":{"unsorted":false,"formattedCitation":"\\super [42]\\nosupersub{}","plainCitation":"[42]","noteIndex":0},"citationItems":[{"id":3479,"uris":["http://zotero.org/users/16939557/items/VGDYQBA9"],"itemData":{"id":3479,"type":"article-journal","citation-key":"mostaedZincbasedAlloysDegradable2018","container-title":"Acta Biomaterialia","DOI":"10.1016/j.actbio.2018.03.005","ISSN":"17427061","journalAbbreviation":"Acta Biomaterialia","language":"en","page":"1-23","source":"DOI.org (Crossref)","title":"Zinc-based alloys for degradable vascular stent applications","volume":"71","author":[{"family":"Mostaed","given":"Ehsan"},{"family":"Sikora-Jasinska","given":"Malgorzata"},{"family":"Drelich","given":"Jaroslaw W."},{"family":"Vedani","given":"Maurizio"}],"issued":{"date-parts":[["2018",4]]}}}],"schema":"https://github.com/citation-style-language/schema/raw/master/csl-citation.json"} </w:instrText>
+        <w:instrText xml:space="preserve"> ADDIN ZOTERO_ITEM CSL_CITATION {"citationID":"9eSARvh4","properties":{"unsorted":false,"formattedCitation":"\\super [41]\\nosupersub{}","plainCitation":"[41]","noteIndex":0},"citationItems":[{"id":3479,"uris":["http://zotero.org/users/16939557/items/VGDYQBA9"],"itemData":{"id":3479,"type":"article-journal","citation-key":"mostaedZincbasedAlloysDegradable2018","container-title":"Acta Biomaterialia","DOI":"10.1016/j.actbio.2018.03.005","ISSN":"17427061","journalAbbreviation":"Acta Biomaterialia","language":"en","page":"1-23","source":"DOI.org (Crossref)","title":"Zinc-based alloys for degradable vascular stent applications","volume":"71","author":[{"family":"Mostaed","given":"Ehsan"},{"family":"Sikora-Jasinska","given":"Malgorzata"},{"family":"Drelich","given":"Jaroslaw W."},{"family":"Vedani","given":"Maurizio"}],"issued":{"date-parts":[["2018",4]]}}}],"schema":"https://github.com/citation-style-language/schema/raw/master/csl-citation.json"} </w:instrText>
       </w:r>
       <w:r>
         <w:fldChar w:fldCharType="separate"/>
@@ -13488,7 +13143,7 @@
           <w:rFonts w:cs="Times New Roman"/>
           <w:vertAlign w:val="superscript"/>
         </w:rPr>
-        <w:t>[42]</w:t>
+        <w:t>[41]</w:t>
       </w:r>
       <w:r>
         <w:fldChar w:fldCharType="end"/>
@@ -13746,7 +13401,7 @@
           <w:rFonts w:cs="Times New Roman"/>
         </w:rPr>
       </w:pPr>
-      <w:bookmarkStart w:id="16" w:name="fig:gsa"/>
+      <w:bookmarkStart w:id="18" w:name="fig:gsa"/>
       <w:r>
         <w:rPr>
           <w:rFonts w:cs="Times New Roman"/>
@@ -13933,19 +13588,7 @@
         <w:rPr>
           <w:rFonts w:cs="Times New Roman"/>
         </w:rPr>
-        <w:t xml:space="preserve">effective </w:t>
-      </w:r>
-      <w:r>
-        <w:rPr>
-          <w:rFonts w:cs="Times New Roman"/>
-        </w:rPr>
-        <w:t xml:space="preserve">corrosion-product </w:t>
-      </w:r>
-      <w:r>
-        <w:rPr>
-          <w:rFonts w:cs="Times New Roman"/>
-        </w:rPr>
-        <w:t>dissolution coefficient</w:t>
+        <w:t>effective corrosion-product dissolution coefficient</w:t>
       </w:r>
       <w:r>
         <w:rPr>
@@ -14060,31 +13703,7 @@
         <w:rPr>
           <w:rFonts w:cs="Times New Roman"/>
         </w:rPr>
-        <w:t xml:space="preserve">effective </w:t>
-      </w:r>
-      <w:r>
-        <w:rPr>
-          <w:rFonts w:cs="Times New Roman"/>
-        </w:rPr>
-        <w:t>corrosion</w:t>
-      </w:r>
-      <w:r>
-        <w:rPr>
-          <w:rFonts w:cs="Times New Roman"/>
-        </w:rPr>
-        <w:t>-</w:t>
-      </w:r>
-      <w:r>
-        <w:rPr>
-          <w:rFonts w:cs="Times New Roman"/>
-        </w:rPr>
-        <w:t xml:space="preserve">product </w:t>
-      </w:r>
-      <w:r>
-        <w:rPr>
-          <w:rFonts w:cs="Times New Roman"/>
-        </w:rPr>
-        <w:t>formation coefficient</w:t>
+        <w:t>effective corrosion-product formation coefficient</w:t>
       </w:r>
       <w:r>
         <w:rPr>
@@ -14833,7 +14452,7 @@
       <w:pPr>
         <w:pStyle w:val="Captions"/>
       </w:pPr>
-      <w:bookmarkStart w:id="17" w:name="_Ref239754266"/>
+      <w:bookmarkStart w:id="19" w:name="_Ref239754266"/>
       <w:r>
         <w:rPr>
           <w:b/>
@@ -14891,7 +14510,7 @@
         </w:rPr>
         <w:fldChar w:fldCharType="end"/>
       </w:r>
-      <w:bookmarkEnd w:id="17"/>
+      <w:bookmarkEnd w:id="19"/>
       <w:r>
         <w:rPr>
           <w:b/>
@@ -14928,8 +14547,8 @@
           <w:i/>
         </w:rPr>
       </w:pPr>
-      <w:bookmarkStart w:id="18" w:name="_Ref238636197"/>
-      <w:bookmarkStart w:id="19" w:name="tab:optim_params"/>
+      <w:bookmarkStart w:id="20" w:name="_Ref238636197"/>
+      <w:bookmarkStart w:id="21" w:name="tab:optim_params"/>
       <w:r>
         <w:rPr>
           <w:b/>
@@ -14973,7 +14592,7 @@
         </w:rPr>
         <w:fldChar w:fldCharType="end"/>
       </w:r>
-      <w:bookmarkEnd w:id="18"/>
+      <w:bookmarkEnd w:id="20"/>
       <w:r>
         <w:rPr>
           <w:b/>
@@ -15751,7 +15370,7 @@
           </w:p>
         </w:tc>
       </w:tr>
-      <w:bookmarkEnd w:id="19"/>
+      <w:bookmarkEnd w:id="21"/>
     </w:tbl>
     <w:p>
       <w:pPr>
@@ -16382,13 +16001,7 @@
         <w:pStyle w:val="BodyText"/>
       </w:pPr>
       <w:r>
-        <w:t xml:space="preserve">The associated </w:t>
-      </w:r>
-      <w:r>
-        <w:t xml:space="preserve">corrosion-product saturation </w:t>
-      </w:r>
-      <w:r>
-        <w:t>responses in</w:t>
+        <w:t>The associated corrosion-product saturation responses in</w:t>
       </w:r>
       <w:r>
         <w:t xml:space="preserve"> </w:t>
@@ -16505,22 +16118,7 @@
         <w:t>2+</w:t>
       </w:r>
       <w:r>
-        <w:t xml:space="preserve"> into corrosion products through the </w:t>
-      </w:r>
-      <w:r>
-        <w:t xml:space="preserve">corrosion-product </w:t>
-      </w:r>
-      <w:r>
-        <w:t xml:space="preserve">growth term, resulting in faster </w:t>
-      </w:r>
-      <w:r>
-        <w:t xml:space="preserve">corrosion-product </w:t>
-      </w:r>
-      <w:r>
-        <w:t xml:space="preserve">accumulation and greater </w:t>
-      </w:r>
-      <w:r>
-        <w:t xml:space="preserve">corrosion-product </w:t>
+        <w:t xml:space="preserve"> into corrosion products through the corrosion-product growth term, resulting in faster corrosion-product accumulation and greater corrosion-product </w:t>
       </w:r>
       <w:r>
         <w:lastRenderedPageBreak/>
@@ -16639,25 +16237,7 @@
         <w:t xml:space="preserve"> </w:t>
       </w:r>
       <w:r>
-        <w:t xml:space="preserve">enhanced the </w:t>
-      </w:r>
-      <w:r>
-        <w:t xml:space="preserve">corrosion-product </w:t>
-      </w:r>
-      <w:r>
-        <w:t xml:space="preserve">dissolution term, reducing </w:t>
-      </w:r>
-      <w:r>
-        <w:t>corrosion-product</w:t>
-      </w:r>
-      <w:r>
-        <w:t xml:space="preserve"> retention and leading to lower </w:t>
-      </w:r>
-      <w:r>
-        <w:t>corrosion-product saturation</w:t>
-      </w:r>
-      <w:r>
-        <w:t xml:space="preserve"> </w:t>
+        <w:t xml:space="preserve">enhanced the corrosion-product dissolution term, reducing corrosion-product retention and leading to lower corrosion-product saturation </w:t>
       </w:r>
       <w:r>
         <w:rPr>
@@ -16776,13 +16356,7 @@
         <w:t xml:space="preserve">, </w:t>
       </w:r>
       <w:r>
-        <w:t xml:space="preserve">however, caused only modest changes in </w:t>
-      </w:r>
-      <w:r>
-        <w:t>corrosion-product saturation</w:t>
-      </w:r>
-      <w:r>
-        <w:t xml:space="preserve"> (</w:t>
+        <w:t>however, caused only modest changes in corrosion-product saturation (</w:t>
       </w:r>
       <w:r>
         <w:rPr>
@@ -16851,13 +16425,7 @@
         <w:t xml:space="preserve"> </w:t>
       </w:r>
       <w:r>
-        <w:t xml:space="preserve">because oxygen reduction influences </w:t>
-      </w:r>
-      <w:r>
-        <w:t xml:space="preserve">corrosion-product </w:t>
-      </w:r>
-      <w:r>
-        <w:t>growth only indirectly through its effect on the</w:t>
+        <w:t>because oxygen reduction influences corrosion-product growth only indirectly through its effect on the</w:t>
       </w:r>
       <w:r>
         <w:t xml:space="preserve"> Zn</w:t>
@@ -16950,16 +16518,23 @@
         </m:sSub>
       </m:oMath>
       <w:r>
-        <w:t xml:space="preserve">​ act directly on the competing processes of </w:t>
-      </w:r>
-      <w:r>
-        <w:t>corrosion-product</w:t>
-      </w:r>
-      <w:r>
-        <w:t xml:space="preserve"> formation and dissolution, making </w:t>
-      </w:r>
-      <w:r>
-        <w:t xml:space="preserve">film corrosion-product coverage saturation </w:t>
+        <w:t xml:space="preserve">​ act directly on the competing processes of corrosion-product formation and dissolution, making </w:t>
+      </w:r>
+      <w:del w:id="9002" w:author="Claude" w:date="2026-10-08T23:09:54Z">
+        <w:r>
+          <w:delText xml:space="preserve">film </w:delText>
+        </w:r>
+      </w:del>
+      <w:r>
+        <w:t xml:space="preserve">corrosion-product</w:t>
+      </w:r>
+      <w:del w:id="9001" w:author="Claude" w:date="2026-10-08T23:09:54Z">
+        <w:r>
+          <w:delText xml:space="preserve"> coverage</w:delText>
+        </w:r>
+      </w:del>
+      <w:r>
+        <w:t xml:space="preserve"> saturation </w:t>
       </w:r>
       <w:r>
         <w:t xml:space="preserve">substantially more sensitive to these parameters than to </w:t>
@@ -17076,18 +16651,8 @@
           <w:b/>
           <w:bCs/>
         </w:rPr>
-        <w:t>g–</w:t>
-      </w:r>
-      <w:proofErr w:type="spellStart"/>
-      <w:r>
-        <w:rPr>
-          <w:rFonts w:cs="Times New Roman"/>
-          <w:b/>
-          <w:bCs/>
-        </w:rPr>
-        <w:t>i</w:t>
-      </w:r>
-      <w:proofErr w:type="spellEnd"/>
+        <w:t>g–i</w:t>
+      </w:r>
       <w:r>
         <w:rPr>
           <w:rFonts w:cs="Times New Roman"/>
@@ -17098,31 +16663,7 @@
         <w:rPr>
           <w:rFonts w:cs="Times New Roman"/>
         </w:rPr>
-        <w:t xml:space="preserve">Conditions that promoted greater </w:t>
-      </w:r>
-      <w:r>
-        <w:rPr>
-          <w:rFonts w:cs="Times New Roman"/>
-        </w:rPr>
-        <w:t>corrosion-product</w:t>
-      </w:r>
-      <w:r>
-        <w:rPr>
-          <w:rFonts w:cs="Times New Roman"/>
-        </w:rPr>
-        <w:t xml:space="preserve"> </w:t>
-      </w:r>
-      <w:r>
-        <w:rPr>
-          <w:rFonts w:cs="Times New Roman"/>
-        </w:rPr>
-        <w:t>saturation</w:t>
-      </w:r>
-      <w:r>
-        <w:rPr>
-          <w:rFonts w:cs="Times New Roman"/>
-        </w:rPr>
-        <w:t>, specifically high</w:t>
+        <w:t>Conditions that promoted greater corrosion-product saturation, specifically high</w:t>
       </w:r>
       <w:r>
         <w:rPr>
@@ -17200,19 +16741,7 @@
         <w:rPr>
           <w:rFonts w:cs="Times New Roman"/>
         </w:rPr>
-        <w:t xml:space="preserve">produced lower interfacial oxygen concentrations because the accumulated corrosion </w:t>
-      </w:r>
-      <w:r>
-        <w:rPr>
-          <w:rFonts w:cs="Times New Roman"/>
-        </w:rPr>
-        <w:t>products</w:t>
-      </w:r>
-      <w:r>
-        <w:rPr>
-          <w:rFonts w:cs="Times New Roman"/>
-        </w:rPr>
-        <w:t xml:space="preserve"> increased resistance to oxygen transport. Nevertheless, the strongest oxygen depletion occurred at high</w:t>
+        <w:t>produced lower interfacial oxygen concentrations because the accumulated corrosion products increased resistance to oxygen transport. Nevertheless, the strongest oxygen depletion occurred at high</w:t>
       </w:r>
       <w:r>
         <w:rPr>
@@ -17329,31 +16858,7 @@
         <w:rPr>
           <w:rFonts w:cs="Times New Roman"/>
         </w:rPr>
-        <w:t xml:space="preserve">where accelerated cathodic oxygen consumption reduced interfacial oxygen concentrations despite only modest changes in </w:t>
-      </w:r>
-      <w:r>
-        <w:rPr>
-          <w:rFonts w:cs="Times New Roman"/>
-        </w:rPr>
-        <w:t>corrosion-product</w:t>
-      </w:r>
-      <w:r>
-        <w:rPr>
-          <w:rFonts w:cs="Times New Roman"/>
-        </w:rPr>
-        <w:t xml:space="preserve"> </w:t>
-      </w:r>
-      <w:r>
-        <w:rPr>
-          <w:rFonts w:cs="Times New Roman"/>
-        </w:rPr>
-        <w:t>saturation</w:t>
-      </w:r>
-      <w:r>
-        <w:rPr>
-          <w:rFonts w:cs="Times New Roman"/>
-        </w:rPr>
-        <w:t>.</w:t>
+        <w:t>where accelerated cathodic oxygen consumption reduced interfacial oxygen concentrations despite only modest changes in corrosion-product saturation.</w:t>
       </w:r>
       <w:r>
         <w:rPr>
@@ -17545,7 +17050,7 @@
           <w:rFonts w:cs="Times New Roman"/>
         </w:rPr>
       </w:pPr>
-      <w:bookmarkStart w:id="20" w:name="_Ref239754180"/>
+      <w:bookmarkStart w:id="22" w:name="_Ref239754180"/>
       <w:r>
         <w:rPr>
           <w:b/>
@@ -17603,7 +17108,7 @@
         </w:rPr>
         <w:fldChar w:fldCharType="end"/>
       </w:r>
-      <w:bookmarkEnd w:id="20"/>
+      <w:bookmarkEnd w:id="22"/>
       <w:r>
         <w:rPr>
           <w:b/>
@@ -17612,30 +17117,7 @@
         <w:t>.</w:t>
       </w:r>
       <w:r>
-        <w:t xml:space="preserve"> Local parameter sweeps of kinetic parameters. Panels (a–c) show cumulative mass loss (%), panels (d–f) show </w:t>
-      </w:r>
-      <w:r>
-        <w:t>the</w:t>
-      </w:r>
-      <w:r>
-        <w:t xml:space="preserve"> </w:t>
-      </w:r>
-      <w:r>
-        <w:t>normalized corrosion-product saturation, F/Fₘₐₓ</w:t>
-      </w:r>
-      <w:r>
-        <w:t xml:space="preserve"> (%), and panels (</w:t>
-      </w:r>
-      <w:r>
-        <w:t>g–</w:t>
-      </w:r>
-      <w:proofErr w:type="spellStart"/>
-      <w:r>
-        <w:t>i</w:t>
-      </w:r>
-      <w:proofErr w:type="spellEnd"/>
-      <w:r>
-        <w:t>) show interfacial dissolved oxygen concentration (</w:t>
+        <w:t xml:space="preserve"> Local parameter sweeps of kinetic parameters. Panels (a–c) show cumulative mass loss (%), panels (d–f) show the normalized corrosion-product saturation, F/Fₘₐₓ (%), and panels (g–i) show interfacial dissolved oxygen concentration (</w:t>
       </w:r>
       <w:r>
         <w:rPr>
@@ -17757,7 +17239,7 @@
         </w:rPr>
       </w:pPr>
     </w:p>
-    <w:bookmarkEnd w:id="16"/>
+    <w:bookmarkEnd w:id="18"/>
     <w:p>
       <w:pPr>
         <w:pStyle w:val="Heading2"/>
@@ -17878,7 +17360,7 @@
         <w:rPr>
           <w:rFonts w:cs="Times New Roman"/>
         </w:rPr>
-        <w:instrText xml:space="preserve"> ADDIN ZOTERO_ITEM CSL_CITATION {"citationID":"LQYpQdDy","properties":{"unsorted":false,"formattedCitation":"\\super [41,43]\\nosupersub{}","plainCitation":"[41,43]","noteIndex":0},"citationItems":[{"id":2423,"uris":["http://zotero.org/users/16939557/items/CXTYID6S"],"itemData":{"id":2423,"type":"article-journal","citation-key":"mengInitialFormationCorrosion2019","container-title":"Bioactive Materials","DOI":"10.1016/j.bioactmat.2018.08.003","ISSN":"2452199X","journalAbbreviation":"Bioactive Materials","language":"en","page":"87-96","source":"DOI.org (Crossref)","title":"Initial formation of corrosion products on pure zinc in saline solution","volume":"4","author":[{"family":"Meng","given":"Yao"},{"family":"Liu","given":"Lijun"},{"family":"Zhang","given":"Dawei"},{"family":"Dong","given":"Chaofang"},{"family":"Yan","given":"Yu"},{"family":"Volinsky","given":"Alex A."},{"family":"Wang","given":"Lu-Ning"}],"issued":{"date-parts":[["2019",12]]}}},{"id":3943,"uris":["http://zotero.org/users/16939557/items/QAXDRACS"],"itemData":{"id":3943,"type":"article-journal","citation-key":"liuInitialFormationCorrosion2018","container-title":"Journal of Materials Science &amp; Technology","DOI":"10.1016/j.jmst.2018.05.005","ISSN":"10050302","issue":"12","journalAbbreviation":"Journal of Materials Science &amp; Technology","language":"en","page":"2271-2282","source":"DOI.org (Crossref)","title":"Initial formation of corrosion products on pure zinc in simulated body fluid","volume":"34","author":[{"family":"Liu","given":"Lijun"},{"family":"Meng","given":"Yao"},{"family":"Dong","given":"Chaofang"},{"family":"Yan","given":"Yu"},{"family":"Volinsky","given":"Alex A."},{"family":"Wang","given":"Lu-Ning"}],"issued":{"date-parts":[["2018",12]]}}}],"schema":"https://github.com/citation-style-language/schema/raw/master/csl-citation.json"} </w:instrText>
+        <w:instrText xml:space="preserve"> ADDIN ZOTERO_ITEM CSL_CITATION {"citationID":"LQYpQdDy","properties":{"unsorted":false,"formattedCitation":"\\super [40,42]\\nosupersub{}","plainCitation":"[40,42]","noteIndex":0},"citationItems":[{"id":2423,"uris":["http://zotero.org/users/16939557/items/CXTYID6S"],"itemData":{"id":2423,"type":"article-journal","citation-key":"mengInitialFormationCorrosion2019","container-title":"Bioactive Materials","DOI":"10.1016/j.bioactmat.2018.08.003","ISSN":"2452199X","journalAbbreviation":"Bioactive Materials","language":"en","page":"87-96","source":"DOI.org (Crossref)","title":"Initial formation of corrosion products on pure zinc in saline solution","volume":"4","author":[{"family":"Meng","given":"Yao"},{"family":"Liu","given":"Lijun"},{"family":"Zhang","given":"Dawei"},{"family":"Dong","given":"Chaofang"},{"family":"Yan","given":"Yu"},{"family":"Volinsky","given":"Alex A."},{"family":"Wang","given":"Lu-Ning"}],"issued":{"date-parts":[["2019",12]]}}},{"id":3943,"uris":["http://zotero.org/users/16939557/items/QAXDRACS"],"itemData":{"id":3943,"type":"article-journal","citation-key":"liuInitialFormationCorrosion2018","container-title":"Journal of Materials Science &amp; Technology","DOI":"10.1016/j.jmst.2018.05.005","ISSN":"10050302","issue":"12","journalAbbreviation":"Journal of Materials Science &amp; Technology","language":"en","page":"2271-2282","source":"DOI.org (Crossref)","title":"Initial formation of corrosion products on pure zinc in simulated body fluid","volume":"34","author":[{"family":"Liu","given":"Lijun"},{"family":"Meng","given":"Yao"},{"family":"Dong","given":"Chaofang"},{"family":"Yan","given":"Yu"},{"family":"Volinsky","given":"Alex A."},{"family":"Wang","given":"Lu-Ning"}],"issued":{"date-parts":[["2018",12]]}}}],"schema":"https://github.com/citation-style-language/schema/raw/master/csl-citation.json"} </w:instrText>
       </w:r>
       <w:r>
         <w:rPr>
@@ -17891,7 +17373,7 @@
           <w:rFonts w:cs="Times New Roman"/>
           <w:vertAlign w:val="superscript"/>
         </w:rPr>
-        <w:t>[41,43]</w:t>
+        <w:t>[40,42]</w:t>
       </w:r>
       <w:r>
         <w:rPr>
@@ -17922,8 +17404,8 @@
           <w:iCs w:val="0"/>
         </w:rPr>
       </w:pPr>
-      <w:bookmarkStart w:id="21" w:name="_Ref238632622"/>
-      <w:bookmarkStart w:id="22" w:name="_Ref240375786"/>
+      <w:bookmarkStart w:id="23" w:name="_Ref238632622"/>
+      <w:bookmarkStart w:id="24" w:name="_Ref240375786"/>
       <w:r>
         <w:rPr>
           <w:b/>
@@ -17968,8 +17450,8 @@
         </w:rPr>
         <w:fldChar w:fldCharType="end"/>
       </w:r>
-      <w:bookmarkEnd w:id="21"/>
-      <w:bookmarkEnd w:id="22"/>
+      <w:bookmarkEnd w:id="23"/>
+      <w:bookmarkEnd w:id="24"/>
       <w:r>
         <w:rPr>
           <w:b/>
@@ -18856,19 +18338,7 @@
         <w:rPr>
           <w:rFonts w:cs="Times New Roman"/>
         </w:rPr>
-        <w:t xml:space="preserve">), with an RMSE of 0.0159% and </w:t>
-      </w:r>
-      <w:r>
-        <w:rPr>
-          <w:rFonts w:cs="Times New Roman"/>
-        </w:rPr>
-        <w:t>an</w:t>
-      </w:r>
-      <w:r>
-        <w:rPr>
-          <w:rFonts w:cs="Times New Roman"/>
-        </w:rPr>
-        <w:t xml:space="preserve"> </w:t>
+        <w:t xml:space="preserve">), with an RMSE of 0.0159% and an </w:t>
       </w:r>
       <m:oMath>
         <m:sSup>
@@ -19024,13 +18494,8 @@
         </w:rPr>
         <w:t xml:space="preserve">. </w:t>
       </w:r>
-      <w:proofErr w:type="spellStart"/>
-      <w:r>
-        <w:t>Damköhler</w:t>
-      </w:r>
-      <w:proofErr w:type="spellEnd"/>
-      <w:r>
-        <w:t xml:space="preserve">-number analysis quantified this transition, </w:t>
+      <w:r>
+        <w:t xml:space="preserve">Damköhler-number analysis quantified this transition, </w:t>
       </w:r>
       <w:r>
         <w:t xml:space="preserve">revealing an initial degradation regime governed by cathodic reaction kinetics. After approximately </w:t>
@@ -19089,43 +18554,7 @@
         <w:rPr>
           <w:rFonts w:cs="Times New Roman"/>
         </w:rPr>
-        <w:t xml:space="preserve">Corrosion products progressively accumulated near the Zn surface, forming a </w:t>
-      </w:r>
-      <w:r>
-        <w:rPr>
-          <w:rFonts w:cs="Times New Roman"/>
-        </w:rPr>
-        <w:t>diffuse</w:t>
-      </w:r>
-      <w:r>
-        <w:rPr>
-          <w:rFonts w:cs="Times New Roman"/>
-        </w:rPr>
-        <w:t xml:space="preserve"> </w:t>
-      </w:r>
-      <w:r>
-        <w:rPr>
-          <w:rFonts w:cs="Times New Roman"/>
-        </w:rPr>
-        <w:t xml:space="preserve">corrosion-product accumulation </w:t>
-      </w:r>
-      <w:r>
-        <w:rPr>
-          <w:rFonts w:cs="Times New Roman"/>
-        </w:rPr>
-        <w:t xml:space="preserve">by 168 h and developing into a </w:t>
-      </w:r>
-      <w:r>
-        <w:rPr>
-          <w:rFonts w:cs="Times New Roman"/>
-        </w:rPr>
-        <w:t xml:space="preserve">homogenized corrosion-product </w:t>
-      </w:r>
-      <w:r>
-        <w:rPr>
-          <w:rFonts w:cs="Times New Roman"/>
-        </w:rPr>
-        <w:t>region by 672 h (</w:t>
+        <w:t>Corrosion products progressively accumulated near the Zn surface, forming a diffuse corrosion-product accumulation by 168 h and developing into a homogenized corrosion-product region by 672 h (</w:t>
       </w:r>
       <w:r>
         <w:rPr>
@@ -19192,19 +18621,7 @@
         <w:rPr>
           <w:rFonts w:cs="Times New Roman"/>
         </w:rPr>
-        <w:t xml:space="preserve">). As the </w:t>
-      </w:r>
-      <w:r>
-        <w:rPr>
-          <w:rFonts w:cs="Times New Roman"/>
-        </w:rPr>
-        <w:t>near-surface corrosion-product field developed</w:t>
-      </w:r>
-      <w:r>
-        <w:rPr>
-          <w:rFonts w:cs="Times New Roman"/>
-        </w:rPr>
-        <w:t xml:space="preserve">, transport resistance increased, progressively restricting oxygen diffusion toward the interface. </w:t>
+        <w:t xml:space="preserve">). As the near-surface corrosion-product field developed, transport resistance increased, progressively restricting oxygen diffusion toward the interface. </w:t>
       </w:r>
       <w:r>
         <w:rPr>
@@ -19283,19 +18700,7 @@
         <w:rPr>
           <w:rFonts w:cs="Times New Roman"/>
         </w:rPr>
-        <w:t xml:space="preserve">). The oxygen-deficient boundary layer expanded with immersion time, while radial concentration variations remained small, indicating predominantly one-dimensional transport normal to the surface. The combined effects of </w:t>
-      </w:r>
-      <w:r>
-        <w:rPr>
-          <w:rFonts w:cs="Times New Roman"/>
-        </w:rPr>
-        <w:t>corrosion-product</w:t>
-      </w:r>
-      <w:r>
-        <w:rPr>
-          <w:rFonts w:cs="Times New Roman"/>
-        </w:rPr>
-        <w:t xml:space="preserve">-induced transport limitation and oxygen consumption reduced interfacial oxygen availability, thereby suppressing ORR activity and producing the gradual decline in degradation rate. This mechanism is </w:t>
+        <w:t xml:space="preserve">). The oxygen-deficient boundary layer expanded with immersion time, while radial concentration variations remained small, indicating predominantly one-dimensional transport normal to the surface. The combined effects of corrosion-product-induced transport limitation and oxygen consumption reduced interfacial oxygen availability, thereby suppressing ORR activity and producing the gradual decline in degradation rate. This mechanism is </w:t>
       </w:r>
       <w:r>
         <w:rPr>
@@ -19313,7 +18718,7 @@
         <w:fldChar w:fldCharType="begin"/>
       </w:r>
       <w:r>
-        <w:instrText xml:space="preserve"> ADDIN ZOTERO_ITEM CSL_CITATION {"citationID":"6uxvWidd","properties":{"unsorted":false,"formattedCitation":"\\super [43]\\nosupersub{}","plainCitation":"[43]","noteIndex":0},"citationItems":[{"id":2423,"uris":["http://zotero.org/users/16939557/items/CXTYID6S"],"itemData":{"id":2423,"type":"article-journal","citation-key":"mengInitialFormationCorrosion2019","container-title":"Bioactive Materials","DOI":"10.1016/j.bioactmat.2018.08.003","ISSN":"2452199X","journalAbbreviation":"Bioactive Materials","language":"en","page":"87-96","source":"DOI.org (Crossref)","title":"Initial formation of corrosion products on pure zinc in saline solution","volume":"4","author":[{"family":"Meng","given":"Yao"},{"family":"Liu","given":"Lijun"},{"family":"Zhang","given":"Dawei"},{"family":"Dong","given":"Chaofang"},{"family":"Yan","given":"Yu"},{"family":"Volinsky","given":"Alex A."},{"family":"Wang","given":"Lu-Ning"}],"issued":{"date-parts":[["2019",12]]}}}],"schema":"https://github.com/citation-style-language/schema/raw/master/csl-citation.json"} </w:instrText>
+        <w:instrText xml:space="preserve"> ADDIN ZOTERO_ITEM CSL_CITATION {"citationID":"Z8FXhBbL","properties":{"unsorted":false,"formattedCitation":"\\super [42]\\nosupersub{}","plainCitation":"[42]","noteIndex":0},"citationItems":[{"id":2423,"uris":["http://zotero.org/users/16939557/items/CXTYID6S"],"itemData":{"id":2423,"type":"article-journal","citation-key":"mengInitialFormationCorrosion2019","container-title":"Bioactive Materials","DOI":"10.1016/j.bioactmat.2018.08.003","ISSN":"2452199X","journalAbbreviation":"Bioactive Materials","language":"en","page":"87-96","source":"DOI.org (Crossref)","title":"Initial formation of corrosion products on pure zinc in saline solution","volume":"4","author":[{"family":"Meng","given":"Yao"},{"family":"Liu","given":"Lijun"},{"family":"Zhang","given":"Dawei"},{"family":"Dong","given":"Chaofang"},{"family":"Yan","given":"Yu"},{"family":"Volinsky","given":"Alex A."},{"family":"Wang","given":"Lu-Ning"}],"issued":{"date-parts":[["2019",12]]}}}],"schema":"https://github.com/citation-style-language/schema/raw/master/csl-citation.json"} </w:instrText>
       </w:r>
       <w:r>
         <w:fldChar w:fldCharType="separate"/>
@@ -19323,7 +18728,7 @@
           <w:rFonts w:cs="Times New Roman"/>
           <w:vertAlign w:val="superscript"/>
         </w:rPr>
-        <w:t>[43]</w:t>
+        <w:t>[42]</w:t>
       </w:r>
       <w:r>
         <w:fldChar w:fldCharType="end"/>
@@ -19399,7 +18804,7 @@
       <w:pPr>
         <w:pStyle w:val="Captions"/>
       </w:pPr>
-      <w:bookmarkStart w:id="23" w:name="_Ref239754424"/>
+      <w:bookmarkStart w:id="25" w:name="_Ref239754424"/>
       <w:r>
         <w:rPr>
           <w:b/>
@@ -19457,7 +18862,7 @@
         </w:rPr>
         <w:fldChar w:fldCharType="end"/>
       </w:r>
-      <w:bookmarkEnd w:id="23"/>
+      <w:bookmarkEnd w:id="25"/>
       <w:r>
         <w:rPr>
           <w:b/>
@@ -19583,7 +18988,7 @@
         <w:fldChar w:fldCharType="begin"/>
       </w:r>
       <w:r>
-        <w:instrText xml:space="preserve"> ADDIN ZOTERO_ITEM CSL_CITATION {"citationID":"zWLvEZL3","properties":{"unsorted":false,"formattedCitation":"\\super [41]\\nosupersub{}","plainCitation":"[41]","noteIndex":0},"citationItems":[{"id":3943,"uris":["http://zotero.org/users/16939557/items/QAXDRACS"],"itemData":{"id":3943,"type":"article-journal","citation-key":"liuInitialFormationCorrosion2018","container-title":"Journal of Materials Science &amp; Technology","DOI":"10.1016/j.jmst.2018.05.005","ISSN":"10050302","issue":"12","journalAbbreviation":"Journal of Materials Science &amp; Technology","language":"en","page":"2271-2282","source":"DOI.org (Crossref)","title":"Initial formation of corrosion products on pure zinc in simulated body fluid","volume":"34","author":[{"family":"Liu","given":"Lijun"},{"family":"Meng","given":"Yao"},{"family":"Dong","given":"Chaofang"},{"family":"Yan","given":"Yu"},{"family":"Volinsky","given":"Alex A."},{"family":"Wang","given":"Lu-Ning"}],"issued":{"date-parts":[["2018",12]]}}}],"schema":"https://github.com/citation-style-language/schema/raw/master/csl-citation.json"} </w:instrText>
+        <w:instrText xml:space="preserve"> ADDIN ZOTERO_ITEM CSL_CITATION {"citationID":"zWLvEZL3","properties":{"unsorted":false,"formattedCitation":"\\super [40]\\nosupersub{}","plainCitation":"[40]","noteIndex":0},"citationItems":[{"id":3943,"uris":["http://zotero.org/users/16939557/items/QAXDRACS"],"itemData":{"id":3943,"type":"article-journal","citation-key":"liuInitialFormationCorrosion2018","container-title":"Journal of Materials Science &amp; Technology","DOI":"10.1016/j.jmst.2018.05.005","ISSN":"10050302","issue":"12","journalAbbreviation":"Journal of Materials Science &amp; Technology","language":"en","page":"2271-2282","source":"DOI.org (Crossref)","title":"Initial formation of corrosion products on pure zinc in simulated body fluid","volume":"34","author":[{"family":"Liu","given":"Lijun"},{"family":"Meng","given":"Yao"},{"family":"Dong","given":"Chaofang"},{"family":"Yan","given":"Yu"},{"family":"Volinsky","given":"Alex A."},{"family":"Wang","given":"Lu-Ning"}],"issued":{"date-parts":[["2018",12]]}}}],"schema":"https://github.com/citation-style-language/schema/raw/master/csl-citation.json"} </w:instrText>
       </w:r>
       <w:r>
         <w:fldChar w:fldCharType="separate"/>
@@ -19594,7 +18999,7 @@
           <w:szCs w:val="24"/>
           <w:vertAlign w:val="superscript"/>
         </w:rPr>
-        <w:t>[41]</w:t>
+        <w:t>[40]</w:t>
       </w:r>
       <w:r>
         <w:fldChar w:fldCharType="end"/>
@@ -19619,19 +19024,7 @@
         <w:rPr>
           <w:rFonts w:cs="Times New Roman"/>
         </w:rPr>
-        <w:t xml:space="preserve">In addition to mass-loss validation, the model was evaluated against </w:t>
-      </w:r>
-      <w:r>
-        <w:rPr>
-          <w:rFonts w:cs="Times New Roman"/>
-        </w:rPr>
-        <w:t>literature</w:t>
-      </w:r>
-      <w:r>
-        <w:rPr>
-          <w:rFonts w:cs="Times New Roman"/>
-        </w:rPr>
-        <w:t xml:space="preserve"> measurements of </w:t>
+        <w:t xml:space="preserve">In addition to mass-loss validation, the model was evaluated against literature measurements of </w:t>
       </w:r>
       <m:oMath>
         <m:r>
@@ -19691,7 +19084,7 @@
         <w:rPr>
           <w:rFonts w:cs="Times New Roman"/>
         </w:rPr>
-        <w:instrText xml:space="preserve"> ADDIN ZOTERO_ITEM CSL_CITATION {"citationID":"TNsDeudZ","properties":{"unsorted":false,"formattedCitation":"\\super [41]\\nosupersub{}","plainCitation":"[41]","noteIndex":0},"citationItems":[{"id":3943,"uris":["http://zotero.org/users/16939557/items/QAXDRACS"],"itemData":{"id":3943,"type":"article-journal","citation-key":"liuInitialFormationCorrosion2018","container-title":"Journal of Materials Science &amp; Technology","DOI":"10.1016/j.jmst.2018.05.005","ISSN":"10050302","issue":"12","journalAbbreviation":"Journal of Materials Science &amp; Technology","language":"en","page":"2271-2282","source":"DOI.org (Crossref)","title":"Initial formation of corrosion products on pure zinc in simulated body fluid","volume":"34","author":[{"family":"Liu","given":"Lijun"},{"family":"Meng","given":"Yao"},{"family":"Dong","given":"Chaofang"},{"family":"Yan","given":"Yu"},{"family":"Volinsky","given":"Alex A."},{"family":"Wang","given":"Lu-Ning"}],"issued":{"date-parts":[["2018",12]]}}}],"schema":"https://github.com/citation-style-language/schema/raw/master/csl-citation.json"} </w:instrText>
+        <w:instrText xml:space="preserve"> ADDIN ZOTERO_ITEM CSL_CITATION {"citationID":"TNsDeudZ","properties":{"unsorted":false,"formattedCitation":"\\super [40]\\nosupersub{}","plainCitation":"[40]","noteIndex":0},"citationItems":[{"id":3943,"uris":["http://zotero.org/users/16939557/items/QAXDRACS"],"itemData":{"id":3943,"type":"article-journal","citation-key":"liuInitialFormationCorrosion2018","container-title":"Journal of Materials Science &amp; Technology","DOI":"10.1016/j.jmst.2018.05.005","ISSN":"10050302","issue":"12","journalAbbreviation":"Journal of Materials Science &amp; Technology","language":"en","page":"2271-2282","source":"DOI.org (Crossref)","title":"Initial formation of corrosion products on pure zinc in simulated body fluid","volume":"34","author":[{"family":"Liu","given":"Lijun"},{"family":"Meng","given":"Yao"},{"family":"Dong","given":"Chaofang"},{"family":"Yan","given":"Yu"},{"family":"Volinsky","given":"Alex A."},{"family":"Wang","given":"Lu-Ning"}],"issued":{"date-parts":[["2018",12]]}}}],"schema":"https://github.com/citation-style-language/schema/raw/master/csl-citation.json"} </w:instrText>
       </w:r>
       <w:r>
         <w:rPr>
@@ -19704,7 +19097,7 @@
           <w:rFonts w:cs="Times New Roman"/>
           <w:vertAlign w:val="superscript"/>
         </w:rPr>
-        <w:t>[41]</w:t>
+        <w:t>[40]</w:t>
       </w:r>
       <w:r>
         <w:rPr>
@@ -19791,7 +19184,6 @@
         </w:rPr>
         <w:fldChar w:fldCharType="end"/>
       </w:r>
-      <w:proofErr w:type="gramStart"/>
       <w:r>
         <w:rPr>
           <w:rFonts w:cs="Times New Roman"/>
@@ -19800,14 +19192,13 @@
         </w:rPr>
         <w:t>e,f</w:t>
       </w:r>
-      <w:proofErr w:type="gramEnd"/>
       <w:r>
         <w:rPr>
           <w:rFonts w:cs="Times New Roman"/>
         </w:rPr>
         <w:t>, the model reproduced the overall evolution of both quantities, capturing the rapid initial increase followed by a gradual plateau</w:t>
       </w:r>
-      <w:ins w:id="24" w:author="Claude" w:date="2026-10-08T20:38:00Z">
+      <w:ins w:id="26" w:author="Claude" w:date="2026-10-08T20:38:00Z">
         <w:r>
           <w:rPr>
             <w:rFonts w:cs="Times New Roman"/>
@@ -19819,40 +19210,9 @@
         <w:rPr>
           <w:rFonts w:cs="Times New Roman"/>
         </w:rPr>
-        <w:t xml:space="preserve"> </w:t>
-      </w:r>
-      <w:r>
-        <w:rPr>
-          <w:rFonts w:cs="Times New Roman"/>
-        </w:rPr>
-        <w:t>with errors at 336 h of 44%</w:t>
-      </w:r>
-      <w:r>
-        <w:rPr>
-          <w:rFonts w:cs="Times New Roman"/>
-        </w:rPr>
-        <w:t xml:space="preserve"> for Zn²⁺ and </w:t>
-      </w:r>
-      <w:r>
-        <w:rPr>
-          <w:rFonts w:cs="Times New Roman"/>
-        </w:rPr>
-        <w:t>2.8%</w:t>
-      </w:r>
-      <w:r>
-        <w:rPr>
-          <w:rFonts w:cs="Times New Roman"/>
-        </w:rPr>
-        <w:t xml:space="preserve"> for </w:t>
-      </w:r>
-      <w:proofErr w:type="spellStart"/>
-      <w:r>
-        <w:rPr>
-          <w:rFonts w:cs="Times New Roman"/>
-        </w:rPr>
-        <w:t>pH</w:t>
-      </w:r>
-      <w:del w:id="25" w:author="Claude" w:date="2026-10-08T20:38:00Z">
+        <w:t xml:space="preserve"> with errors at 336 h of 44% for Zn²⁺ and 2.8% for pH</w:t>
+      </w:r>
+      <w:del w:id="27" w:author="Claude" w:date="2026-10-08T20:38:00Z">
         <w:r>
           <w:rPr>
             <w:rFonts w:cs="Times New Roman"/>
@@ -19864,14 +19224,7 @@
         <w:rPr>
           <w:rFonts w:cs="Times New Roman"/>
         </w:rPr>
-        <w:t>.</w:t>
-      </w:r>
-      <w:proofErr w:type="spellEnd"/>
-      <w:r>
-        <w:rPr>
-          <w:rFonts w:cs="Times New Roman"/>
-        </w:rPr>
-        <w:t xml:space="preserve"> </w:t>
+        <w:t xml:space="preserve">. </w:t>
       </w:r>
       <w:r>
         <w:rPr>
@@ -20087,15 +19440,7 @@
         <w:t xml:space="preserve"> corrosion-product chemistry. </w:t>
       </w:r>
       <w:r>
-        <w:t>The higher mass loss is consistent with the observed relationship between surface area-to-volume ratio (</w:t>
-      </w:r>
-      <w:proofErr w:type="gramStart"/>
-      <w:r>
-        <w:t>SA:V</w:t>
-      </w:r>
-      <w:proofErr w:type="gramEnd"/>
-      <w:r>
-        <w:t>) and degradation, where cumulative mass loss increased approximately linearly with SA:V</w:t>
+        <w:t>The higher mass loss is consistent with the observed relationship between surface area-to-volume ratio (SA:V) and degradation, where cumulative mass loss increased approximately linearly with SA:V</w:t>
       </w:r>
       <w:r>
         <w:t xml:space="preserve"> (</w:t>
@@ -20107,22 +19452,22 @@
         </w:rPr>
         <w:t xml:space="preserve">Figure </w:t>
       </w:r>
-      <w:del w:id="9012" w:author="Claude" w:date="2026-10-08T22:54:30Z">
+      <w:del w:id="28" w:author="Claude" w:date="2026-10-08T22:54:00Z">
         <w:r>
           <w:rPr>
             <w:b/>
             <w:bCs/>
           </w:rPr>
-          <w:delText xml:space="preserve">S9</w:delText>
+          <w:delText>S9</w:delText>
         </w:r>
       </w:del>
-      <w:ins w:id="9011" w:author="Claude" w:date="2026-10-08T22:54:30Z">
+      <w:ins w:id="29" w:author="Claude" w:date="2026-10-08T22:54:00Z">
         <w:r>
           <w:rPr>
             <w:b/>
             <w:bCs/>
           </w:rPr>
-          <w:t xml:space="preserve">S8</w:t>
+          <w:t>S8</w:t>
         </w:r>
       </w:ins>
       <w:r>
@@ -20135,15 +19480,7 @@
         <w:t xml:space="preserve"> </w:t>
       </w:r>
       <w:r>
-        <w:t xml:space="preserve">However, the stent exhibited less pronounced temporal deceleration in mass loss than the disc, indicating that geometric influences on degradation extend beyond </w:t>
-      </w:r>
-      <w:proofErr w:type="gramStart"/>
-      <w:r>
-        <w:t>SA:V</w:t>
-      </w:r>
-      <w:proofErr w:type="gramEnd"/>
-      <w:r>
-        <w:t xml:space="preserve"> alone.</w:t>
+        <w:t>However, the stent exhibited less pronounced temporal deceleration in mass loss than the disc, indicating that geometric influences on degradation extend beyond SA:V alone.</w:t>
       </w:r>
     </w:p>
     <w:p>
@@ -20305,7 +19642,7 @@
       <w:pPr>
         <w:pStyle w:val="Captions"/>
       </w:pPr>
-      <w:bookmarkStart w:id="26" w:name="_Ref239754601"/>
+      <w:bookmarkStart w:id="30" w:name="_Ref239754601"/>
       <w:r>
         <w:rPr>
           <w:b/>
@@ -20363,7 +19700,7 @@
         </w:rPr>
         <w:fldChar w:fldCharType="end"/>
       </w:r>
-      <w:bookmarkEnd w:id="26"/>
+      <w:bookmarkEnd w:id="30"/>
       <w:r>
         <w:rPr>
           <w:b/>
@@ -20649,7 +19986,6 @@
         </w:rPr>
         <w:fldChar w:fldCharType="end"/>
       </w:r>
-      <w:proofErr w:type="gramStart"/>
       <w:r>
         <w:rPr>
           <w:b/>
@@ -20658,11 +19994,7 @@
         <w:t>c,d</w:t>
       </w:r>
       <w:r>
-        <w:t>.</w:t>
-      </w:r>
-      <w:proofErr w:type="gramEnd"/>
-      <w:r>
-        <w:t xml:space="preserve"> </w:t>
+        <w:t xml:space="preserve">. </w:t>
       </w:r>
       <w:r>
         <w:t>Section 1, located along a relatively straight strut segment, exhibited comparatively uniform recession, with penetration depths ranging from approximately</w:t>
@@ -20865,7 +20197,7 @@
         <w:ind w:firstLine="0"/>
         <w:jc w:val="center"/>
       </w:pPr>
-      <w:bookmarkStart w:id="27" w:name="fig:casestudy2"/>
+      <w:bookmarkStart w:id="31" w:name="fig:casestudy2"/>
       <w:r>
         <w:rPr>
           <w:noProof/>
@@ -20917,7 +20249,7 @@
       <w:pPr>
         <w:pStyle w:val="Captions"/>
       </w:pPr>
-      <w:bookmarkStart w:id="28" w:name="_Ref239754694"/>
+      <w:bookmarkStart w:id="32" w:name="_Ref239754694"/>
       <w:r>
         <w:rPr>
           <w:b/>
@@ -20975,7 +20307,7 @@
         </w:rPr>
         <w:fldChar w:fldCharType="end"/>
       </w:r>
-      <w:bookmarkEnd w:id="28"/>
+      <w:bookmarkEnd w:id="32"/>
       <w:r>
         <w:rPr>
           <w:b/>
@@ -21008,17 +20340,7 @@
         <w:t>672</w:t>
       </w:r>
       <w:r>
-        <w:t> h, (b) schematic illustration of oxygen transport to the inner and outer-curvature surfaces of the stent crown, (</w:t>
-      </w:r>
-      <w:proofErr w:type="spellStart"/>
-      <w:proofErr w:type="gramStart"/>
-      <w:r>
-        <w:t>c,d</w:t>
-      </w:r>
-      <w:proofErr w:type="spellEnd"/>
-      <w:proofErr w:type="gramEnd"/>
-      <w:r>
-        <w:t>) evolution of the metal cross-sectional profiles at Sections 1 and 2, respectively.</w:t>
+        <w:t> h, (b) schematic illustration of oxygen transport to the inner and outer-curvature surfaces of the stent crown, (c,d) evolution of the metal cross-sectional profiles at Sections 1 and 2, respectively.</w:t>
       </w:r>
     </w:p>
     <w:p>
@@ -21207,27 +20529,7 @@
         <w:t xml:space="preserve">Although the effects on cumulative mass loss were relatively modest, geometry strongly influenced the spatial distribution of degradation. Mean </w:t>
       </w:r>
       <w:r>
-        <w:t>penetration depths varied only slightly, ranging from approximately 2.</w:t>
-      </w:r>
-      <w:r>
-        <w:t>4</w:t>
-      </w:r>
-      <w:r>
-        <w:t xml:space="preserve"> to 2.7 µm across the curved-wire configurations (30°, 90°, and 150° arcs) and from 2.1 to 2.</w:t>
-      </w:r>
-      <w:r>
-        <w:t>4</w:t>
-      </w:r>
-      <w:r>
-        <w:t xml:space="preserve"> µm across the </w:t>
-      </w:r>
-      <w:proofErr w:type="spellStart"/>
-      <w:r>
-        <w:t>straight</w:t>
-      </w:r>
-      <w:proofErr w:type="spellEnd"/>
-      <w:r>
-        <w:t>, closely spaced, and widely spaced wire configurations</w:t>
+        <w:t>penetration depths varied only slightly, ranging from approximately 2.4 to 2.7 µm across the curved-wire configurations (30°, 90°, and 150° arcs) and from 2.1 to 2.4 µm across the straight, closely spaced, and widely spaced wire configurations</w:t>
       </w:r>
       <w:r>
         <w:t xml:space="preserve"> (</w:t>
@@ -21321,7 +20623,7 @@
       <w:pPr>
         <w:pStyle w:val="Captions"/>
       </w:pPr>
-      <w:bookmarkStart w:id="29" w:name="_Ref241074684"/>
+      <w:bookmarkStart w:id="33" w:name="_Ref241074684"/>
       <w:r>
         <w:rPr>
           <w:b/>
@@ -21365,7 +20667,7 @@
         </w:rPr>
         <w:fldChar w:fldCharType="end"/>
       </w:r>
-      <w:bookmarkEnd w:id="29"/>
+      <w:bookmarkEnd w:id="33"/>
       <w:r>
         <w:rPr>
           <w:b/>
@@ -21389,10 +20691,7 @@
         <w:t xml:space="preserve"> spacings of 0.30 and 1.60 mm, (c) </w:t>
       </w:r>
       <w:r>
-        <w:t>mean local penetration depth for the corresponding curvature and spacing configurations</w:t>
-      </w:r>
-      <w:r>
-        <w:t xml:space="preserve"> (error bars: ±1 SD around the cross-section perimeter)</w:t>
+        <w:t>mean local penetration depth for the corresponding curvature and spacing configurations (error bars: ±1 SD around the cross-section perimeter)</w:t>
       </w:r>
       <w:r>
         <w:t xml:space="preserve">, and (d) </w:t>
@@ -21428,74 +20727,21 @@
       <w:r>
         <w:t>The corrosion</w:t>
       </w:r>
-      <w:del w:id="30" w:author="Claude" w:date="2026-10-08T20:38:00Z">
+      <w:del w:id="34" w:author="Claude" w:date="2026-10-08T20:38:00Z">
         <w:r>
           <w:delText>-</w:delText>
         </w:r>
       </w:del>
       <w:r>
-        <w:t xml:space="preserve"> products are </w:t>
-      </w:r>
-      <w:r>
-        <w:t xml:space="preserve">treated as a homogenized </w:t>
-      </w:r>
-      <w:proofErr w:type="spellStart"/>
-      <w:r>
-        <w:t>ZnO</w:t>
-      </w:r>
-      <w:proofErr w:type="spellEnd"/>
-      <w:r>
-        <w:t xml:space="preserve">-based </w:t>
-      </w:r>
-      <w:r>
-        <w:t>field</w:t>
-      </w:r>
-      <w:r>
-        <w:t xml:space="preserve"> rather than</w:t>
-      </w:r>
-      <w:r>
-        <w:t xml:space="preserve"> a discrete surface film or</w:t>
-      </w:r>
-      <w:r>
-        <w:t xml:space="preserve"> a heterogeneous, composition-dependent structure</w:t>
-      </w:r>
-      <w:r>
-        <w:t>,</w:t>
-      </w:r>
-      <w:r>
-        <w:t xml:space="preserve"> </w:t>
-      </w:r>
-      <w:r>
-        <w:t>and</w:t>
-      </w:r>
-      <w:r>
-        <w:t xml:space="preserve"> phosphate-, carbonate-, </w:t>
-      </w:r>
-      <w:r>
-        <w:t xml:space="preserve">calcium-, </w:t>
-      </w:r>
-      <w:r>
-        <w:t xml:space="preserve">and </w:t>
-      </w:r>
-      <w:r>
-        <w:t>chloride</w:t>
-      </w:r>
-      <w:r>
-        <w:t>-containing phases</w:t>
-      </w:r>
-      <w:ins w:id="31" w:author="Claude" w:date="2026-10-08T20:38:00Z">
+        <w:t xml:space="preserve"> products are treated as a homogenized ZnO-based field rather than a discrete surface film or a heterogeneous, composition-dependent structure, and phosphate-, carbonate-, calcium-, and chloride-containing phases</w:t>
+      </w:r>
+      <w:ins w:id="35" w:author="Claude" w:date="2026-10-08T20:38:00Z">
         <w:r>
           <w:t>,</w:t>
         </w:r>
       </w:ins>
       <w:r>
-        <w:t xml:space="preserve"> </w:t>
-      </w:r>
-      <w:r>
-        <w:t>which can form within days in vitro,</w:t>
-      </w:r>
-      <w:r>
-        <w:t xml:space="preserve"> are not explicitly resolved</w:t>
+        <w:t xml:space="preserve"> which can form within days in vitro, are not explicitly resolved</w:t>
       </w:r>
       <w:r>
         <w:t xml:space="preserve">. </w:t>
@@ -21574,10 +20820,7 @@
         <w:t>in vivo</w:t>
       </w:r>
       <w:r>
-        <w:t xml:space="preserve"> mass loss represents a predictive demonstration rather than formal validation. Further validation against spatially resolved measurements of corrosion-product coverage, oxygen availability, and local penetration is therefore required, particularly for complex implant geometries.</w:t>
-      </w:r>
-      <w:r>
-        <w:t xml:space="preserve"> Independent measurements of Zn²⁺ release by ICP and direct mechanism tests, such as film thickness from FIB or SEM cross-sections or stirred and different-O₂ experiments, were not performed and </w:t>
+        <w:t xml:space="preserve"> mass loss represents a predictive demonstration rather than formal validation. Further validation against spatially resolved measurements of corrosion-product coverage, oxygen availability, and local penetration is therefore required, particularly for complex implant geometries. Independent measurements of Zn²⁺ release by ICP and direct mechanism tests, such as film thickness from FIB or SEM cross-sections or stirred and different-O₂ experiments, were not performed and </w:t>
       </w:r>
       <w:r>
         <w:t>can be used for further validation</w:t>
@@ -21591,13 +20834,7 @@
         <w:pStyle w:val="BodyText"/>
       </w:pPr>
       <w:r>
-        <w:t xml:space="preserve">Future developments should incorporate physiologically realistic flow conditions, additional ionic species, multiphase corrosion-product evolution, and spatially heterogeneous electrochemical activity. Extending the framework to Zn alloys will also require accounting for alloying elements, secondary phases, and galvanic interactions. Although the </w:t>
-      </w:r>
-      <w:r>
-        <w:t xml:space="preserve">high-fidelity </w:t>
-      </w:r>
-      <w:r>
-        <w:t>simulations remain computationally demanding, the reduced calibrated parameter space</w:t>
+        <w:t>Future developments should incorporate physiologically realistic flow conditions, additional ionic species, multiphase corrosion-product evolution, and spatially heterogeneous electrochemical activity. Extending the framework to Zn alloys will also require accounting for alloying elements, secondary phases, and galvanic interactions. Although the high-fidelity simulations remain computationally demanding, the reduced calibrated parameter space</w:t>
       </w:r>
       <w:r>
         <w:t xml:space="preserve"> </w:t>
@@ -21651,7 +20888,7 @@
         <w:fldChar w:fldCharType="begin"/>
       </w:r>
       <w:r>
-        <w:instrText xml:space="preserve"> ADDIN ZOTERO_ITEM CSL_CITATION {"citationID":"Zd9tPSIo","properties":{"unsorted":false,"formattedCitation":"\\super [44,45]\\nosupersub{}","plainCitation":"[44,45]","noteIndex":0},"citationItems":[{"id":5765,"uris":["http://zotero.org/users/16939557/items/FPYDBSXS"],"itemData":{"id":5765,"type":"article-journal","citation-key":"liOptimizingStructuralDesign2022","container-title":"Materials &amp; Design","DOI":"10.1016/j.matdes.2022.110843","ISSN":"02641275","journalAbbreviation":"Materials &amp; Design","language":"en","page":"110843","source":"DOI.org (Crossref)","title":"Optimizing structural design on biodegradable magnesium alloy vascular stent for reducing strut thickness and raising radial strength","volume":"220","author":[{"family":"Li","given":"Yafei"},{"family":"Wang","given":"Jianfeng"},{"family":"Sheng","given":"Kun"},{"family":"Miao","given":"Fulong"},{"family":"Wang","given":"Yan"},{"family":"Zhang","given":"Yifan"},{"family":"Hou","given":"Ruiqing"},{"family":"Mei","given":"Di"},{"family":"Sun","given":"Yufeng"},{"family":"Zheng","given":"Yufeng"},{"family":"Guan","given":"Shaokang"}],"issued":{"date-parts":[["2022",8]]}}},{"id":5766,"uris":["http://zotero.org/users/16939557/items/3V2WPL8B"],"itemData":{"id":5766,"type":"article-journal","abstract":"The emergence of biodegradable stents addresses the limitations of the long-term presence of permanent bare metal stents in the human body. Following implantation, these stents can significantly reduce the occurrence of chronic complications such as inflammation and thrombosis, thus becoming a mainstream approach in the treatment of interventional cardiovascular diseases. Currently, the materials used for biodegradable stents are typically polymers. However, the inherent properties of the materials dictate that polymer stents exhibit lower mechanical performance and biocompatibility. Magnesium alloy materials, on the basis of their biodegradability, exhibit superior mechanical performance when compared to polymers, possessing the potential to address this issue. However, the presence of stress concentration in the stent structure necessitates further designs and mechanical performance analyses of magnesium alloy stents. In this work, a biodegradable stent based on WE43 alloy is designed. The stent incorporates the micro-protrusion structure to enhance the mechanical performance. Furthermore, to evaluate the clinical applicability of the stent, the mechanical performance of the biodegradable magnesium alloy stent is conducted through finite element analysis (FEA). The results show that the maximum equivalent stress in all four aspects is below the ultimate tensile strength of 370 MPa for the WE43 magnesium alloy, demonstrating excellent mechanical performance. Additionally, after crimping and expansion, the radial support strength and radial support force reached 780 mN/mm and 1.56 N, respectively. Compared to the advanced reported stent structures, the radial support strength and radial support force are enhanced by 13% and 47%, respectively. Additionally, flexibility analysis indicated that the flexibility of the stent design in this study is improved by a factor of 9.76, ensuring the stent’s capability to navigate through complex vasculature during implantation.","citation-key":"chenDesignMechanicalPerformance2024","container-title":"Metals","DOI":"10.3390/met14060704","ISSN":"2075-4701","issue":"6","journalAbbreviation":"Metals","language":"en","page":"704","source":"DOI.org (Crossref)","title":"Design and Mechanical Performance Evaluation of WE43 Magnesium Alloy Biodegradable Stents via Finite Element Analysis","volume":"14","author":[{"family":"Chen","given":"Jiaxuan"},{"family":"Dong","given":"Fang"},{"family":"Liu","given":"Sheng"}],"issued":{"date-parts":[["2024",6,14]]}}}],"schema":"https://github.com/citation-style-language/schema/raw/master/csl-citation.json"} </w:instrText>
+        <w:instrText xml:space="preserve"> ADDIN ZOTERO_ITEM CSL_CITATION {"citationID":"Zd9tPSIo","properties":{"unsorted":false,"formattedCitation":"\\super [43,44]\\nosupersub{}","plainCitation":"[43,44]","noteIndex":0},"citationItems":[{"id":5765,"uris":["http://zotero.org/users/16939557/items/FPYDBSXS"],"itemData":{"id":5765,"type":"article-journal","citation-key":"liOptimizingStructuralDesign2022","container-title":"Materials &amp; Design","DOI":"10.1016/j.matdes.2022.110843","ISSN":"02641275","journalAbbreviation":"Materials &amp; Design","language":"en","page":"110843","source":"DOI.org (Crossref)","title":"Optimizing structural design on biodegradable magnesium alloy vascular stent for reducing strut thickness and raising radial strength","volume":"220","author":[{"family":"Li","given":"Yafei"},{"family":"Wang","given":"Jianfeng"},{"family":"Sheng","given":"Kun"},{"family":"Miao","given":"Fulong"},{"family":"Wang","given":"Yan"},{"family":"Zhang","given":"Yifan"},{"family":"Hou","given":"Ruiqing"},{"family":"Mei","given":"Di"},{"family":"Sun","given":"Yufeng"},{"family":"Zheng","given":"Yufeng"},{"family":"Guan","given":"Shaokang"}],"issued":{"date-parts":[["2022",8]]}}},{"id":5766,"uris":["http://zotero.org/users/16939557/items/3V2WPL8B"],"itemData":{"id":5766,"type":"article-journal","abstract":"The emergence of biodegradable stents addresses the limitations of the long-term presence of permanent bare metal stents in the human body. Following implantation, these stents can significantly reduce the occurrence of chronic complications such as inflammation and thrombosis, thus becoming a mainstream approach in the treatment of interventional cardiovascular diseases. Currently, the materials used for biodegradable stents are typically polymers. However, the inherent properties of the materials dictate that polymer stents exhibit lower mechanical performance and biocompatibility. Magnesium alloy materials, on the basis of their biodegradability, exhibit superior mechanical performance when compared to polymers, possessing the potential to address this issue. However, the presence of stress concentration in the stent structure necessitates further designs and mechanical performance analyses of magnesium alloy stents. In this work, a biodegradable stent based on WE43 alloy is designed. The stent incorporates the micro-protrusion structure to enhance the mechanical performance. Furthermore, to evaluate the clinical applicability of the stent, the mechanical performance of the biodegradable magnesium alloy stent is conducted through finite element analysis (FEA). The results show that the maximum equivalent stress in all four aspects is below the ultimate tensile strength of 370 MPa for the WE43 magnesium alloy, demonstrating excellent mechanical performance. Additionally, after crimping and expansion, the radial support strength and radial support force reached 780 mN/mm and 1.56 N, respectively. Compared to the advanced reported stent structures, the radial support strength and radial support force are enhanced by 13% and 47%, respectively. Additionally, flexibility analysis indicated that the flexibility of the stent design in this study is improved by a factor of 9.76, ensuring the stent’s capability to navigate through complex vasculature during implantation.","citation-key":"chenDesignMechanicalPerformance2024","container-title":"Metals","DOI":"10.3390/met14060704","ISSN":"2075-4701","issue":"6","journalAbbreviation":"Metals","language":"en","page":"704","source":"DOI.org (Crossref)","title":"Design and Mechanical Performance Evaluation of WE43 Magnesium Alloy Biodegradable Stents via Finite Element Analysis","volume":"14","author":[{"family":"Chen","given":"Jiaxuan"},{"family":"Dong","given":"Fang"},{"family":"Liu","given":"Sheng"}],"issued":{"date-parts":[["2024",6,14]]}}}],"schema":"https://github.com/citation-style-language/schema/raw/master/csl-citation.json"} </w:instrText>
       </w:r>
       <w:r>
         <w:fldChar w:fldCharType="separate"/>
@@ -21661,7 +20898,7 @@
           <w:rFonts w:cs="Times New Roman"/>
           <w:vertAlign w:val="superscript"/>
         </w:rPr>
-        <w:t>[44,45]</w:t>
+        <w:t>[43,44]</w:t>
       </w:r>
       <w:r>
         <w:fldChar w:fldCharType="end"/>
@@ -21690,7 +20927,7 @@
         <w:pStyle w:val="BodyText"/>
         <w:ind w:firstLine="0"/>
         <w:rPr>
-          <w:ins w:id="32" w:author="Claude" w:date="2026-10-08T20:38:00Z"/>
+          <w:ins w:id="36" w:author="Claude" w:date="2026-10-08T20:38:00Z"/>
         </w:rPr>
       </w:pPr>
     </w:p>
@@ -21699,7 +20936,7 @@
         <w:pStyle w:val="BodyText"/>
         <w:ind w:firstLine="0"/>
         <w:rPr>
-          <w:ins w:id="33" w:author="Claude" w:date="2026-10-08T20:38:00Z"/>
+          <w:ins w:id="37" w:author="Claude" w:date="2026-10-08T20:38:00Z"/>
         </w:rPr>
       </w:pPr>
     </w:p>
@@ -21708,11 +20945,11 @@
         <w:pStyle w:val="BodyText"/>
         <w:ind w:firstLine="0"/>
         <w:rPr>
-          <w:ins w:id="34" w:author="Claude" w:date="2026-10-08T20:38:00Z"/>
+          <w:ins w:id="38" w:author="Claude" w:date="2026-10-08T20:38:00Z"/>
         </w:rPr>
       </w:pPr>
     </w:p>
-    <w:bookmarkEnd w:id="27"/>
+    <w:bookmarkEnd w:id="31"/>
     <w:p>
       <w:pPr>
         <w:pStyle w:val="Heading1"/>
@@ -21725,26 +20962,20 @@
       <w:pPr>
         <w:pStyle w:val="BodyText"/>
       </w:pPr>
-      <w:bookmarkStart w:id="35" w:name="_Hlk238630414"/>
+      <w:bookmarkStart w:id="39" w:name="_Hlk238630414"/>
       <w:r>
         <w:t xml:space="preserve">Zn biodegradation under physiological conditions becomes an oxygen-transport-controlled process after an initial reaction-controlled stage in which implant geometry governs the spatial evolution of material loss. The proposed 3D reaction-diffusion model closely reproduced independent 28-day immersion data (RMSE = 0.0159%) and, without further calibration, predicted approximately 6% mass loss </w:t>
       </w:r>
       <w:r>
         <w:t>for a six-crown stent</w:t>
       </w:r>
-      <w:del w:id="36" w:author="Claude" w:date="2026-10-08T20:38:00Z">
+      <w:del w:id="40" w:author="Claude" w:date="2026-10-08T20:38:00Z">
         <w:r>
           <w:delText>,</w:delText>
         </w:r>
       </w:del>
       <w:r>
-        <w:t xml:space="preserve"> </w:t>
-      </w:r>
-      <w:r>
-        <w:t>of the same order of magnitude as</w:t>
-      </w:r>
-      <w:r>
-        <w:t xml:space="preserve"> reported </w:t>
+        <w:t xml:space="preserve"> of the same order of magnitude as reported </w:t>
       </w:r>
       <w:r>
         <w:rPr>
@@ -21762,7 +20993,7 @@
       <w:r>
         <w:t xml:space="preserve"> oxygen availability as the primary driver of degradation, with corrosion-product accumulation progressively restricting transport and leading to diffusion-controlled behavior. Importantly, localized degradation emerged naturally from geometry-dependent transport phenomena, without imposing spatially varying corrosion kinetics. While curvature and inter-strut spacing produced only modest changes in cumulative mass loss, they strongly altered the distribution of material recession, demonstrating that global degradation metrics can obscure the localized thinning responsible for structural failure. These findings establish geometry as a critical determinant of biodegradable implant performance and provide a predictive framework for integrating degradation into the design and optimization of Zn stents and other biodegradable metallic implants, enabling structural performance to be considered throughout the implant lifetime rather than only at implantation.</w:t>
       </w:r>
-      <w:bookmarkEnd w:id="35"/>
+      <w:bookmarkEnd w:id="39"/>
     </w:p>
     <w:p>
       <w:pPr>
@@ -21796,15 +21027,7 @@
         <w:jc w:val="both"/>
       </w:pPr>
       <w:r>
-        <w:t xml:space="preserve">The authors acknowledge the use of Monash University’s High-Performance Computing (M3) facility and the Monash </w:t>
-      </w:r>
-      <w:proofErr w:type="spellStart"/>
-      <w:r>
-        <w:t>eResearch</w:t>
-      </w:r>
-      <w:proofErr w:type="spellEnd"/>
-      <w:r>
-        <w:t xml:space="preserve"> </w:t>
+        <w:t xml:space="preserve">The authors acknowledge the use of Monash University’s High-Performance Computing (M3) facility and the Monash eResearch </w:t>
       </w:r>
       <w:r>
         <w:t>Center</w:t>
@@ -21909,21 +21132,12 @@
       <w:r>
         <w:t xml:space="preserve"> Data curation, Investigation, Writing – original draft. </w:t>
       </w:r>
-      <w:proofErr w:type="spellStart"/>
-      <w:r>
-        <w:rPr>
-          <w:b/>
-          <w:bCs/>
-        </w:rPr>
-        <w:t>Aijun</w:t>
-      </w:r>
-      <w:proofErr w:type="spellEnd"/>
-      <w:r>
-        <w:rPr>
-          <w:b/>
-          <w:bCs/>
-        </w:rPr>
-        <w:t xml:space="preserve"> Huang:</w:t>
+      <w:r>
+        <w:rPr>
+          <w:b/>
+          <w:bCs/>
+        </w:rPr>
+        <w:t>Aijun Huang:</w:t>
       </w:r>
       <w:r>
         <w:t xml:space="preserve"> Conceptualization, Funding acquisition, Project administration, Supervision. </w:t>
@@ -21941,21 +21155,12 @@
       <w:r>
         <w:t xml:space="preserve"> </w:t>
       </w:r>
-      <w:proofErr w:type="spellStart"/>
-      <w:r>
-        <w:rPr>
-          <w:b/>
-          <w:bCs/>
-        </w:rPr>
-        <w:t>Yuman</w:t>
-      </w:r>
-      <w:proofErr w:type="spellEnd"/>
-      <w:r>
-        <w:rPr>
-          <w:b/>
-          <w:bCs/>
-        </w:rPr>
-        <w:t xml:space="preserve"> Zhu:</w:t>
+      <w:r>
+        <w:rPr>
+          <w:b/>
+          <w:bCs/>
+        </w:rPr>
+        <w:t>Yuman Zhu:</w:t>
       </w:r>
       <w:r>
         <w:t xml:space="preserve"> Conceptualization, Supervision, Writing – review &amp; editing.</w:t>
@@ -22950,14 +22155,14 @@
         <w:pStyle w:val="Bibliography"/>
       </w:pPr>
       <w:r>
-        <w:t xml:space="preserve">29. P. K. Bowen, J. Drelich, and J. Goldman, “Zinc Exhibits Ideal Physiological Corrosion Behavior for Bioabsorbable Stents,” </w:t>
+        <w:t xml:space="preserve">29. R. M. Katona, J. Taylor, and R. F. Schaller, “Validating Corrosion Models: A Comparison of Governing Equations,” </w:t>
       </w:r>
       <w:r>
         <w:rPr>
           <w:i/>
           <w:iCs/>
         </w:rPr>
-        <w:t>Advanced Materials</w:t>
+        <w:t>Corrosion Science</w:t>
       </w:r>
       <w:r>
         <w:t xml:space="preserve"> </w:t>
@@ -22967,10 +22172,10 @@
           <w:i/>
           <w:iCs/>
         </w:rPr>
-        <w:t>25</w:t>
-      </w:r>
-      <w:r>
-        <w:t>, no. 18 (2013): 2577–2582, https://doi.org/10.1002/adma.201300226.</w:t>
+        <w:t>259</w:t>
+      </w:r>
+      <w:r>
+        <w:t xml:space="preserve"> (2026): 113495, https://doi.org/10.1016/j.corsci.2025.113495.</w:t>
       </w:r>
     </w:p>
     <w:p>
@@ -22978,27 +22183,17 @@
         <w:pStyle w:val="Bibliography"/>
       </w:pPr>
       <w:r>
-        <w:t xml:space="preserve">30. R. M. Katona, J. Taylor, and R. F. Schaller, “Validating Corrosion Models: A Comparison of Governing Equations,” </w:t>
+        <w:t xml:space="preserve">30. P. Grathwohl, “Diffusion in Natural Porous Media: Contaminant Transport, Sorption/Desorption and Dissolution Kinetics,” </w:t>
       </w:r>
       <w:r>
         <w:rPr>
           <w:i/>
           <w:iCs/>
         </w:rPr>
-        <w:t>Corrosion Science</w:t>
-      </w:r>
-      <w:r>
-        <w:t xml:space="preserve"> </w:t>
-      </w:r>
-      <w:r>
-        <w:rPr>
-          <w:i/>
-          <w:iCs/>
-        </w:rPr>
-        <w:t>259</w:t>
-      </w:r>
-      <w:r>
-        <w:t xml:space="preserve"> (2026): 113495, https://doi.org/10.1016/j.corsci.2025.113495.</w:t>
+        <w:t>Diffusion in Natural Porous Media: Contaminant Transport, Sorption/Desorption and Dissolution Kinetics</w:t>
+      </w:r>
+      <w:r>
+        <w:t>, Springer: Boston, MA 1998, https://doi.org/10.1007/978-1-4615-5683-1.</w:t>
       </w:r>
     </w:p>
     <w:p>
@@ -23006,25 +22201,28 @@
         <w:pStyle w:val="Bibliography"/>
       </w:pPr>
       <w:r>
-        <w:t xml:space="preserve">31. P. Grathwohl, “Diffusion in Natural Porous Media: Contaminant Transport, Sorption/Desorption and Dissolution Kinetics,” </w:t>
+        <w:t xml:space="preserve">31. J. W. Wilder, C. Clemons, D. Golovaty, K. L. Kreider, G. W. Young, and R. S. Lillard, “An Adaptive Level Set Approach for Modeling Damage Due to Galvanic Corrosion,” </w:t>
       </w:r>
       <w:r>
         <w:rPr>
           <w:i/>
           <w:iCs/>
         </w:rPr>
-        <w:t xml:space="preserve">Diffusion in Natural Porous Media: </w:t>
+        <w:lastRenderedPageBreak/>
+        <w:t>Journal of Engineering Mathematics</w:t>
+      </w:r>
+      <w:r>
+        <w:t xml:space="preserve"> </w:t>
       </w:r>
       <w:r>
         <w:rPr>
           <w:i/>
           <w:iCs/>
         </w:rPr>
-        <w:lastRenderedPageBreak/>
-        <w:t>Contaminant Transport, Sorption/Desorption and Dissolution Kinetics</w:t>
-      </w:r>
-      <w:r>
-        <w:t>, Springer: Boston, MA 1998, https://doi.org/10.1007/978-1-4615-5683-1.</w:t>
+        <w:t>91</w:t>
+      </w:r>
+      <w:r>
+        <w:t>, no. 1 (2015): 121–142, https://doi.org/10.1007/s10665-014-9732-3.</w:t>
       </w:r>
     </w:p>
     <w:p>
@@ -23032,14 +22230,14 @@
         <w:pStyle w:val="Bibliography"/>
       </w:pPr>
       <w:r>
-        <w:t xml:space="preserve">32. J. W. Wilder, C. Clemons, D. Golovaty, K. L. Kreider, G. W. Young, and R. S. Lillard, “An Adaptive Level Set Approach for Modeling Damage Due to Galvanic Corrosion,” </w:t>
+        <w:t xml:space="preserve">32. J. A. Grogan, S. B. Leen, and P. E. McHugh, “A Physical Corrosion Model for Bioabsorbable Metal Stents,” </w:t>
       </w:r>
       <w:r>
         <w:rPr>
           <w:i/>
           <w:iCs/>
         </w:rPr>
-        <w:t>Journal of Engineering Mathematics</w:t>
+        <w:t>Acta Biomaterialia</w:t>
       </w:r>
       <w:r>
         <w:t xml:space="preserve"> </w:t>
@@ -23049,10 +22247,10 @@
           <w:i/>
           <w:iCs/>
         </w:rPr>
-        <w:t>91</w:t>
-      </w:r>
-      <w:r>
-        <w:t>, no. 1 (2015): 121–142, https://doi.org/10.1007/s10665-014-9732-3.</w:t>
+        <w:t>10</w:t>
+      </w:r>
+      <w:r>
+        <w:t>, no. 5 (2014): 2313–2322, https://doi.org/10.1016/j.actbio.2013.12.059.</w:t>
       </w:r>
     </w:p>
     <w:p>
@@ -23060,27 +22258,17 @@
         <w:pStyle w:val="Bibliography"/>
       </w:pPr>
       <w:r>
-        <w:t xml:space="preserve">33. J. A. Grogan, S. B. Leen, and P. E. McHugh, “A Physical Corrosion Model for Bioabsorbable Metal Stents,” </w:t>
+        <w:t xml:space="preserve">33. J. R. Rumble, Ed., “CRC Handbook of Chemistry and Physics,” </w:t>
       </w:r>
       <w:r>
         <w:rPr>
           <w:i/>
           <w:iCs/>
         </w:rPr>
-        <w:t>Acta Biomaterialia</w:t>
-      </w:r>
-      <w:r>
-        <w:t xml:space="preserve"> </w:t>
-      </w:r>
-      <w:r>
-        <w:rPr>
-          <w:i/>
-          <w:iCs/>
-        </w:rPr>
-        <w:t>10</w:t>
-      </w:r>
-      <w:r>
-        <w:t>, no. 5 (2014): 2313–2322, https://doi.org/10.1016/j.actbio.2013.12.059.</w:t>
+        <w:t>CRC handbook of chemistry and physics</w:t>
+      </w:r>
+      <w:r>
+        <w:t>, 98th edition 2017-2018., CRC Press, Taylor &amp; Francis Group: Boca Raton London New York 2017.</w:t>
       </w:r>
     </w:p>
     <w:p>
@@ -23088,17 +22276,103 @@
         <w:pStyle w:val="Bibliography"/>
       </w:pPr>
       <w:r>
-        <w:t xml:space="preserve">34. J. R. Rumble, Ed., “CRC Handbook of Chemistry and Physics,” </w:t>
+        <w:t>34. P. Han, and D. M. Bartels, “</w:t>
+      </w:r>
+      <w:r>
+        <w:rPr>
+          <w:b/>
+          <w:bCs/>
+        </w:rPr>
+        <w:t>Temperature Dependence of Oxygen Diffusion in</w:t>
+      </w:r>
+      <w:r>
+        <w:t xml:space="preserve"> </w:t>
+      </w:r>
+      <w:r>
+        <w:rPr>
+          <w:b/>
+          <w:bCs/>
+        </w:rPr>
+        <w:t>H</w:t>
+      </w:r>
+      <w:r>
+        <w:t xml:space="preserve"> </w:t>
+      </w:r>
+      <w:r>
+        <w:rPr>
+          <w:b/>
+          <w:bCs/>
+          <w:vertAlign w:val="subscript"/>
+        </w:rPr>
+        <w:t>2</w:t>
+      </w:r>
+      <w:r>
+        <w:rPr>
+          <w:b/>
+          <w:bCs/>
+        </w:rPr>
+        <w:t xml:space="preserve"> </w:t>
+      </w:r>
+      <w:r>
+        <w:t xml:space="preserve"> </w:t>
+      </w:r>
+      <w:r>
+        <w:rPr>
+          <w:b/>
+          <w:bCs/>
+        </w:rPr>
+        <w:t>O and D</w:t>
+      </w:r>
+      <w:r>
+        <w:t xml:space="preserve"> </w:t>
+      </w:r>
+      <w:r>
+        <w:rPr>
+          <w:b/>
+          <w:bCs/>
+          <w:vertAlign w:val="subscript"/>
+        </w:rPr>
+        <w:t>2</w:t>
+      </w:r>
+      <w:r>
+        <w:rPr>
+          <w:b/>
+          <w:bCs/>
+        </w:rPr>
+        <w:t xml:space="preserve"> </w:t>
+      </w:r>
+      <w:r>
+        <w:t xml:space="preserve"> </w:t>
+      </w:r>
+      <w:r>
+        <w:rPr>
+          <w:b/>
+          <w:bCs/>
+        </w:rPr>
+        <w:t>O</w:t>
+      </w:r>
+      <w:r>
+        <w:t xml:space="preserve">,” </w:t>
       </w:r>
       <w:r>
         <w:rPr>
           <w:i/>
           <w:iCs/>
         </w:rPr>
-        <w:t>CRC handbook of chemistry and physics</w:t>
-      </w:r>
-      <w:r>
-        <w:t>, 98th edition 2017-2018., CRC Press, Taylor &amp; Francis Group: Boca Raton London New York 2017.</w:t>
+        <w:t>The Journal of Physical Chemistry</w:t>
+      </w:r>
+      <w:r>
+        <w:t xml:space="preserve"> </w:t>
+      </w:r>
+      <w:r>
+        <w:rPr>
+          <w:i/>
+          <w:iCs/>
+        </w:rPr>
+        <w:t>100</w:t>
+      </w:r>
+      <w:r>
+        <w:t>, no. 13 (1996): 5597–5602, https://doi.org/10.1021/jp952903y.</w:t>
       </w:r>
     </w:p>
     <w:p>
@@ -23106,32 +22380,14 @@
         <w:pStyle w:val="Bibliography"/>
       </w:pPr>
       <w:r>
-        <w:t>35. P. Han, and D. M. Bartels, “Temperature Dependence of Oxygen Diffusion in H</w:t>
-      </w:r>
-      <w:r>
-        <w:rPr>
-          <w:vertAlign w:val="subscript"/>
-        </w:rPr>
-        <w:t>2</w:t>
-      </w:r>
-      <w:r>
-        <w:t>O and D</w:t>
-      </w:r>
-      <w:r>
-        <w:rPr>
-          <w:vertAlign w:val="subscript"/>
-        </w:rPr>
-        <w:t>2</w:t>
-      </w:r>
-      <w:r>
-        <w:t xml:space="preserve">O,” </w:t>
+        <w:t xml:space="preserve">35. S.-Y. Park, S.-H. Rho, H.-S. Lee, K.-M. Kim, and H.-C. Lee, “Fabrication of Highly Porous and Pure Zinc Oxide Films Using Modified DC Magnetron Sputtering and Post-Oxidation,” </w:t>
       </w:r>
       <w:r>
         <w:rPr>
           <w:i/>
           <w:iCs/>
         </w:rPr>
-        <w:t>The Journal of Physical Chemistry</w:t>
+        <w:t>Materials</w:t>
       </w:r>
       <w:r>
         <w:t xml:space="preserve"> </w:t>
@@ -23141,10 +22397,10 @@
           <w:i/>
           <w:iCs/>
         </w:rPr>
-        <w:t>100</w:t>
-      </w:r>
-      <w:r>
-        <w:t>, no. 13 (1996): 5597–5602, https://doi.org/10.1021/jp952903y.</w:t>
+        <w:t>14</w:t>
+      </w:r>
+      <w:r>
+        <w:t>, no. 20 (2021): 6112, https://doi.org/10.3390/ma14206112.</w:t>
       </w:r>
     </w:p>
     <w:p>
@@ -23152,27 +22408,17 @@
         <w:pStyle w:val="Bibliography"/>
       </w:pPr>
       <w:r>
-        <w:t xml:space="preserve">36. S.-Y. Park, S.-H. Rho, H.-S. Lee, K.-M. Kim, and H.-C. Lee, “Fabrication of Highly Porous and Pure Zinc Oxide Films Using Modified DC Magnetron Sputtering and Post-Oxidation,” </w:t>
+        <w:t xml:space="preserve">36. L. Holzer, P. Marmet, M. Fingerle, A. Wiegmann, M. Neumann, and V. Schmidt, “Tortuosity-Porosity Relationships: Review of Empirical Data from Literature,” in </w:t>
       </w:r>
       <w:r>
         <w:rPr>
           <w:i/>
           <w:iCs/>
         </w:rPr>
-        <w:t>Materials</w:t>
-      </w:r>
-      <w:r>
-        <w:t xml:space="preserve"> </w:t>
-      </w:r>
-      <w:r>
-        <w:rPr>
-          <w:i/>
-          <w:iCs/>
-        </w:rPr>
-        <w:t>14</w:t>
-      </w:r>
-      <w:r>
-        <w:t>, no. 20 (2021): 6112, https://doi.org/10.3390/ma14206112.</w:t>
+        <w:t>Tortuosity and Microstructure Effects in Porous Media</w:t>
+      </w:r>
+      <w:r>
+        <w:t>, Vol. 333, Springer International Publishing: Cham 2023, pp. 51–89, https://doi.org/10.1007/978-3-031-30477-4_3.</w:t>
       </w:r>
     </w:p>
     <w:p>
@@ -23180,17 +22426,27 @@
         <w:pStyle w:val="Bibliography"/>
       </w:pPr>
       <w:r>
-        <w:t xml:space="preserve">37. L. Holzer, P. Marmet, M. Fingerle, A. Wiegmann, M. Neumann, and V. Schmidt, “Tortuosity-Porosity Relationships: Review of Empirical Data from Literature,” in </w:t>
+        <w:t xml:space="preserve">37. K. Chen, X. Gu, H. Sun, et al., “Fluid-Induced Corrosion Behavior of Degradable Zinc for Stent Application,” </w:t>
       </w:r>
       <w:r>
         <w:rPr>
           <w:i/>
           <w:iCs/>
         </w:rPr>
-        <w:t>Tortuosity and Microstructure Effects in Porous Media</w:t>
-      </w:r>
-      <w:r>
-        <w:t>, Vol. 333, Springer International Publishing: Cham 2023, pp. 51–89, https://doi.org/10.1007/978-3-031-30477-4_3.</w:t>
+        <w:t>Journal of Materials Science &amp; Technology</w:t>
+      </w:r>
+      <w:r>
+        <w:t xml:space="preserve"> </w:t>
+      </w:r>
+      <w:r>
+        <w:rPr>
+          <w:i/>
+          <w:iCs/>
+        </w:rPr>
+        <w:t>91</w:t>
+      </w:r>
+      <w:r>
+        <w:t xml:space="preserve"> (2021): 134–147, https://doi.org/10.1016/j.jmst.2021.02.050.</w:t>
       </w:r>
     </w:p>
     <w:p>
@@ -23198,14 +22454,14 @@
         <w:pStyle w:val="Bibliography"/>
       </w:pPr>
       <w:r>
-        <w:t xml:space="preserve">38. K. Chen, X. Gu, H. Sun, et al., “Fluid-Induced Corrosion Behavior of Degradable Zinc for Stent Application,” </w:t>
+        <w:t xml:space="preserve">38. J. Tkacz, K. Slouková, J. Minda, et al., “Influence of the Composition of the Hank’s Balanced Salt Solution on the Corrosion Behavior of AZ31 and AZ61 Magnesium Alloys,” </w:t>
       </w:r>
       <w:r>
         <w:rPr>
           <w:i/>
           <w:iCs/>
         </w:rPr>
-        <w:t>Journal of Materials Science &amp; Technology</w:t>
+        <w:t>Metals</w:t>
       </w:r>
       <w:r>
         <w:t xml:space="preserve"> </w:t>
@@ -23215,10 +22471,10 @@
           <w:i/>
           <w:iCs/>
         </w:rPr>
-        <w:t>91</w:t>
-      </w:r>
-      <w:r>
-        <w:t xml:space="preserve"> (2021): 134–147, https://doi.org/10.1016/j.jmst.2021.02.050.</w:t>
+        <w:t>7</w:t>
+      </w:r>
+      <w:r>
+        <w:t>, no. 11 (2017): 465, https://doi.org/10.3390/met7110465.</w:t>
       </w:r>
     </w:p>
     <w:p>
@@ -23226,14 +22482,14 @@
         <w:pStyle w:val="Bibliography"/>
       </w:pPr>
       <w:r>
-        <w:t xml:space="preserve">39. J. Tkacz, K. Slouková, J. Minda, et al., “Influence of the Composition of the Hank’s Balanced Salt Solution on the Corrosion Behavior of AZ31 and AZ61 Magnesium Alloys,” </w:t>
+        <w:t xml:space="preserve">39. T. Kokubo, and H. Takadama, “How Useful Is SBF in Predicting in Vivo Bone Bioactivity?,” </w:t>
       </w:r>
       <w:r>
         <w:rPr>
           <w:i/>
           <w:iCs/>
         </w:rPr>
-        <w:t>Metals</w:t>
+        <w:t>Biomaterials</w:t>
       </w:r>
       <w:r>
         <w:t xml:space="preserve"> </w:t>
@@ -23243,10 +22499,10 @@
           <w:i/>
           <w:iCs/>
         </w:rPr>
-        <w:t>7</w:t>
-      </w:r>
-      <w:r>
-        <w:t>, no. 11 (2017): 465, https://doi.org/10.3390/met7110465.</w:t>
+        <w:t>27</w:t>
+      </w:r>
+      <w:r>
+        <w:t>, no. 15 (2006): 2907–2915, https://doi.org/10.1016/j.biomaterials.2006.01.017.</w:t>
       </w:r>
     </w:p>
     <w:p>
@@ -23254,14 +22510,14 @@
         <w:pStyle w:val="Bibliography"/>
       </w:pPr>
       <w:r>
-        <w:t xml:space="preserve">40. T. Kokubo, and H. Takadama, “How Useful Is SBF in Predicting in Vivo Bone Bioactivity?,” </w:t>
+        <w:t xml:space="preserve">40. L. Liu, Y. Meng, C. Dong, Y. Yan, A. A. Volinsky, and L.-N. Wang, “Initial Formation of Corrosion Products on Pure Zinc in Simulated Body Fluid,” </w:t>
       </w:r>
       <w:r>
         <w:rPr>
           <w:i/>
           <w:iCs/>
         </w:rPr>
-        <w:t>Biomaterials</w:t>
+        <w:t>Journal of Materials Science &amp; Technology</w:t>
       </w:r>
       <w:r>
         <w:t xml:space="preserve"> </w:t>
@@ -23271,10 +22527,10 @@
           <w:i/>
           <w:iCs/>
         </w:rPr>
-        <w:t>27</w:t>
-      </w:r>
-      <w:r>
-        <w:t>, no. 15 (2006): 2907–2915, https://doi.org/10.1016/j.biomaterials.2006.01.017.</w:t>
+        <w:t>34</w:t>
+      </w:r>
+      <w:r>
+        <w:t>, no. 12 (2018): 2271–2282, https://doi.org/10.1016/j.jmst.2018.05.005.</w:t>
       </w:r>
     </w:p>
     <w:p>
@@ -23282,14 +22538,14 @@
         <w:pStyle w:val="Bibliography"/>
       </w:pPr>
       <w:r>
-        <w:t xml:space="preserve">41. L. Liu, Y. Meng, C. Dong, Y. Yan, A. A. Volinsky, and L.-N. Wang, “Initial Formation of Corrosion Products on Pure Zinc in Simulated Body Fluid,” </w:t>
+        <w:t xml:space="preserve">41. E. Mostaed, M. Sikora-Jasinska, J. W. Drelich, and M. Vedani, “Zinc-Based Alloys for Degradable Vascular Stent Applications,” </w:t>
       </w:r>
       <w:r>
         <w:rPr>
           <w:i/>
           <w:iCs/>
         </w:rPr>
-        <w:t>Journal of Materials Science &amp; Technology</w:t>
+        <w:t>Acta Biomaterialia</w:t>
       </w:r>
       <w:r>
         <w:t xml:space="preserve"> </w:t>
@@ -23299,10 +22555,10 @@
           <w:i/>
           <w:iCs/>
         </w:rPr>
-        <w:t>34</w:t>
-      </w:r>
-      <w:r>
-        <w:t>, no. 12 (2018): 2271–2282, https://doi.org/10.1016/j.jmst.2018.05.005.</w:t>
+        <w:t>71</w:t>
+      </w:r>
+      <w:r>
+        <w:t xml:space="preserve"> (2018): 1–23, https://doi.org/10.1016/j.actbio.2018.03.005.</w:t>
       </w:r>
     </w:p>
     <w:p>
@@ -23310,14 +22566,14 @@
         <w:pStyle w:val="Bibliography"/>
       </w:pPr>
       <w:r>
-        <w:t xml:space="preserve">42. E. Mostaed, M. Sikora-Jasinska, J. W. Drelich, and M. Vedani, “Zinc-Based Alloys for Degradable Vascular Stent Applications,” </w:t>
+        <w:t xml:space="preserve">42. Y. Meng, L. Liu, D. Zhang, et al., “Initial Formation of Corrosion Products on Pure Zinc in Saline Solution,” </w:t>
       </w:r>
       <w:r>
         <w:rPr>
           <w:i/>
           <w:iCs/>
         </w:rPr>
-        <w:t>Acta Biomaterialia</w:t>
+        <w:t>Bioactive Materials</w:t>
       </w:r>
       <w:r>
         <w:t xml:space="preserve"> </w:t>
@@ -23327,10 +22583,10 @@
           <w:i/>
           <w:iCs/>
         </w:rPr>
-        <w:t>71</w:t>
-      </w:r>
-      <w:r>
-        <w:t xml:space="preserve"> (2018): 1–23, https://doi.org/10.1016/j.actbio.2018.03.005.</w:t>
+        <w:t>4</w:t>
+      </w:r>
+      <w:r>
+        <w:t xml:space="preserve"> (2019): 87–96, https://doi.org/10.1016/j.bioactmat.2018.08.003.</w:t>
       </w:r>
     </w:p>
     <w:p>
@@ -23338,14 +22594,14 @@
         <w:pStyle w:val="Bibliography"/>
       </w:pPr>
       <w:r>
-        <w:t xml:space="preserve">43. Y. Meng, L. Liu, D. Zhang, et al., “Initial Formation of Corrosion Products on Pure Zinc in Saline Solution,” </w:t>
+        <w:t xml:space="preserve">43. Y. Li, J. Wang, K. Sheng, et al., “Optimizing Structural Design on Biodegradable Magnesium Alloy Vascular Stent for Reducing Strut Thickness and Raising Radial Strength,” </w:t>
       </w:r>
       <w:r>
         <w:rPr>
           <w:i/>
           <w:iCs/>
         </w:rPr>
-        <w:t>Bioactive Materials</w:t>
+        <w:t>Materials &amp; Design</w:t>
       </w:r>
       <w:r>
         <w:t xml:space="preserve"> </w:t>
@@ -23355,10 +22611,10 @@
           <w:i/>
           <w:iCs/>
         </w:rPr>
-        <w:t>4</w:t>
-      </w:r>
-      <w:r>
-        <w:t xml:space="preserve"> (2019): 87–96, https://doi.org/10.1016/j.bioactmat.2018.08.003.</w:t>
+        <w:t>220</w:t>
+      </w:r>
+      <w:r>
+        <w:t xml:space="preserve"> (2022): 110843, https://doi.org/10.1016/j.matdes.2022.110843.</w:t>
       </w:r>
     </w:p>
     <w:p>
@@ -23366,35 +22622,7 @@
         <w:pStyle w:val="Bibliography"/>
       </w:pPr>
       <w:r>
-        <w:t xml:space="preserve">44. Y. Li, J. Wang, K. Sheng, et al., “Optimizing Structural Design on Biodegradable Magnesium Alloy Vascular Stent for Reducing Strut Thickness and Raising Radial Strength,” </w:t>
-      </w:r>
-      <w:r>
-        <w:rPr>
-          <w:i/>
-          <w:iCs/>
-        </w:rPr>
-        <w:t>Materials &amp; Design</w:t>
-      </w:r>
-      <w:r>
-        <w:t xml:space="preserve"> </w:t>
-      </w:r>
-      <w:r>
-        <w:rPr>
-          <w:i/>
-          <w:iCs/>
-        </w:rPr>
-        <w:t>220</w:t>
-      </w:r>
-      <w:r>
-        <w:t xml:space="preserve"> (2022): 110843, https://doi.org/10.1016/j.matdes.2022.110843.</w:t>
-      </w:r>
-    </w:p>
-    <w:p>
-      <w:pPr>
-        <w:pStyle w:val="Bibliography"/>
-      </w:pPr>
-      <w:r>
-        <w:t xml:space="preserve">45. J. Chen, F. Dong, and S. Liu, “Design and Mechanical Performance Evaluation of WE43 Magnesium Alloy Biodegradable Stents via Finite Element Analysis,” </w:t>
+        <w:t xml:space="preserve">44. J. Chen, F. Dong, and S. Liu, “Design and Mechanical Performance Evaluation of WE43 Magnesium Alloy Biodegradable Stents via Finite Element Analysis,” </w:t>
       </w:r>
       <w:r>
         <w:rPr>
@@ -25781,9 +25009,9 @@
 </file>
 
 <file path=customXml/item1.xml><?xml version="1.0" encoding="utf-8"?>
-<p:properties xmlns:p="http://schemas.microsoft.com/office/2006/metadata/properties" xmlns:xsi="http://www.w3.org/2001/XMLSchema-instance" xmlns:pc="http://schemas.microsoft.com/office/infopath/2007/PartnerControls">
-  <documentManagement/>
-</p:properties>
+<ControlsStorage xmlns="urn:schemas-microsoft-com.VSTO2008Demos.ControlsStorage">
+  <Controls>AAEAAAD/////AQAAAAAAAAAMAgAAAEVDaGVtNFdvcmQuQ29yZSwgVmVyc2lvbj0xLjAuMC4wLCBDdWx0dXJlPW5ldXRyYWwsIFB1YmxpY0tleVRva2VuPW51bGwHAQAAAAABAAAAAAAAAAQgQ2hlbTRXb3JkLkNvcmUuQ29udHJvbFByb3BlcnRpZXMCAAAACw==</Controls>
+</ControlsStorage>
 </file>
 
 <file path=customXml/item2.xml><?xml version="1.0" encoding="utf-8"?>
@@ -26004,12 +25232,16 @@
 </file>
 
 <file path=customXml/item3.xml><?xml version="1.0" encoding="utf-8"?>
-<ControlsStorage xmlns="urn:schemas-microsoft-com.VSTO2008Demos.ControlsStorage">
-  <Controls>AAEAAAD/////AQAAAAAAAAAMAgAAAEVDaGVtNFdvcmQuQ29yZSwgVmVyc2lvbj0xLjAuMC4wLCBDdWx0dXJlPW5ldXRyYWwsIFB1YmxpY0tleVRva2VuPW51bGwHAQAAAAABAAAAAAAAAAQgQ2hlbTRXb3JkLkNvcmUuQ29udHJvbFByb3BlcnRpZXMCAAAACw==</Controls>
-</ControlsStorage>
+<p:properties xmlns:p="http://schemas.microsoft.com/office/2006/metadata/properties" xmlns:xsi="http://www.w3.org/2001/XMLSchema-instance" xmlns:pc="http://schemas.microsoft.com/office/infopath/2007/PartnerControls">
+  <documentManagement/>
+</p:properties>
 </file>
 
 <file path=customXml/item4.xml><?xml version="1.0" encoding="utf-8"?>
+<b:Sources xmlns:b="http://schemas.openxmlformats.org/officeDocument/2006/bibliography" xmlns="http://schemas.openxmlformats.org/officeDocument/2006/bibliography" SelectedStyle="\APASixthEditionOfficeOnline.xsl" StyleName="APA" Version="6"/>
+</file>
+
+<file path=customXml/item5.xml><?xml version="1.0" encoding="utf-8"?>
 <?mso-contentType ?>
 <FormTemplates xmlns="http://schemas.microsoft.com/sharepoint/v3/contenttype/forms">
   <Display>DocumentLibraryForm</Display>
@@ -26018,15 +25250,10 @@
 </FormTemplates>
 </file>
 
-<file path=customXml/item5.xml><?xml version="1.0" encoding="utf-8"?>
-<b:Sources xmlns:b="http://schemas.openxmlformats.org/officeDocument/2006/bibliography" xmlns="http://schemas.openxmlformats.org/officeDocument/2006/bibliography" SelectedStyle="\APASixthEditionOfficeOnline.xsl" StyleName="APA" Version="6"/>
-</file>
-
 <file path=customXml/itemProps1.xml><?xml version="1.0" encoding="utf-8"?>
-<ds:datastoreItem xmlns:ds="http://schemas.openxmlformats.org/officeDocument/2006/customXml" ds:itemID="{96D19C85-73BE-4F5D-979F-58BFDE5BBE12}">
+<ds:datastoreItem xmlns:ds="http://schemas.openxmlformats.org/officeDocument/2006/customXml" ds:itemID="{E3F19EBF-8207-4BE7-AD18-240ED1895C11}">
   <ds:schemaRefs>
-    <ds:schemaRef ds:uri="http://schemas.microsoft.com/office/2006/metadata/properties"/>
-    <ds:schemaRef ds:uri="http://schemas.microsoft.com/office/infopath/2007/PartnerControls"/>
+    <ds:schemaRef ds:uri="urn:schemas-microsoft-com.VSTO2008Demos.ControlsStorage"/>
   </ds:schemaRefs>
 </ds:datastoreItem>
 </file>
@@ -26051,25 +25278,26 @@
 </file>
 
 <file path=customXml/itemProps3.xml><?xml version="1.0" encoding="utf-8"?>
-<ds:datastoreItem xmlns:ds="http://schemas.openxmlformats.org/officeDocument/2006/customXml" ds:itemID="{E3F19EBF-8207-4BE7-AD18-240ED1895C11}">
+<ds:datastoreItem xmlns:ds="http://schemas.openxmlformats.org/officeDocument/2006/customXml" ds:itemID="{96D19C85-73BE-4F5D-979F-58BFDE5BBE12}">
   <ds:schemaRefs>
-    <ds:schemaRef ds:uri="urn:schemas-microsoft-com.VSTO2008Demos.ControlsStorage"/>
+    <ds:schemaRef ds:uri="http://schemas.microsoft.com/office/2006/metadata/properties"/>
+    <ds:schemaRef ds:uri="http://schemas.microsoft.com/office/infopath/2007/PartnerControls"/>
   </ds:schemaRefs>
 </ds:datastoreItem>
 </file>
 
 <file path=customXml/itemProps4.xml><?xml version="1.0" encoding="utf-8"?>
+<ds:datastoreItem xmlns:ds="http://schemas.openxmlformats.org/officeDocument/2006/customXml" ds:itemID="{DE724972-9DFC-40BC-BA35-EDB291A5A412}">
+  <ds:schemaRefs>
+    <ds:schemaRef ds:uri="http://schemas.openxmlformats.org/officeDocument/2006/bibliography"/>
+  </ds:schemaRefs>
+</ds:datastoreItem>
+</file>
+
+<file path=customXml/itemProps5.xml><?xml version="1.0" encoding="utf-8"?>
 <ds:datastoreItem xmlns:ds="http://schemas.openxmlformats.org/officeDocument/2006/customXml" ds:itemID="{75886F76-A765-4714-B899-7AC2DC4334A1}">
   <ds:schemaRefs>
     <ds:schemaRef ds:uri="http://schemas.microsoft.com/sharepoint/v3/contenttype/forms"/>
   </ds:schemaRefs>
 </ds:datastoreItem>
-</file>
-
-<file path=customXml/itemProps5.xml><?xml version="1.0" encoding="utf-8"?>
-<ds:datastoreItem xmlns:ds="http://schemas.openxmlformats.org/officeDocument/2006/customXml" ds:itemID="{DE724972-9DFC-40BC-BA35-EDB291A5A412}">
-  <ds:schemaRefs>
-    <ds:schemaRef ds:uri="http://schemas.openxmlformats.org/officeDocument/2006/bibliography"/>
-  </ds:schemaRefs>
-</ds:datastoreItem>
 </file>
</xml_diff>

<commit_message>
Second reviewer report: draft responses (major/minor), tracked manuscript/SI edits (grammar, convergence wording, conclusion, SI S5 heading)
</commit_message>
<xml_diff>
--- a/deliver/Manuscript_tracked.docx
+++ b/deliver/Manuscript_tracked.docx
@@ -8089,11 +8089,27 @@
           <w:rFonts w:cs="Times New Roman"/>
         </w:rPr>
       </w:pPr>
-      <w:r>
-        <w:rPr>
-          <w:rFonts w:cs="Times New Roman"/>
-        </w:rPr>
-        <w:t xml:space="preserve">Where </w:t>
+      <w:del w:id="9002" w:author="Claude" w:date="2026-10-08T23:18:06Z">
+        <w:r>
+          <w:rPr>
+            <w:rFonts w:cs="Times New Roman"/>
+          </w:rPr>
+          <w:delText xml:space="preserve">Where</w:delText>
+        </w:r>
+      </w:del>
+      <w:ins w:id="9001" w:author="Claude" w:date="2026-10-08T23:18:06Z">
+        <w:r>
+          <w:rPr>
+            <w:rFonts w:cs="Times New Roman"/>
+          </w:rPr>
+          <w:t xml:space="preserve">where</w:t>
+        </w:r>
+      </w:ins>
+      <w:r>
+        <w:rPr>
+          <w:rFonts w:cs="Times New Roman"/>
+        </w:rPr>
+        <w:t xml:space="preserve"> </w:t>
       </w:r>
       <w:r>
         <w:rPr>
@@ -14235,8 +14251,78 @@
         <w:t xml:space="preserve">These parameters were then calibrated within the 3D reaction-diffusion framework using Bayesian optimization. </w:t>
       </w:r>
       <w:r>
-        <w:t>Following the initial exploration of the admissible parameter space, the optimization rapidly reduced the RMSE from approximately 0.28% to below 0.05% and identified a distinct optimum after 22 iterations</w:t>
-      </w:r>
+        <w:t xml:space="preserve">Following the initial exploration of the admissible parameter space, the optimization rapidly reduced the RMSE from approximately 0.28% to below 0.05% and </w:t>
+      </w:r>
+      <w:del w:id="9013" w:author="Claude" w:date="2026-10-08T23:18:06Z">
+        <w:r>
+          <w:delText xml:space="preserve">identified</w:delText>
+        </w:r>
+      </w:del>
+      <w:ins w:id="9012" w:author="Claude" w:date="2026-10-08T23:18:06Z">
+        <w:r>
+          <w:t xml:space="preserve">reached</w:t>
+        </w:r>
+      </w:ins>
+      <w:r>
+        <w:t xml:space="preserve"> </w:t>
+      </w:r>
+      <w:del w:id="9011" w:author="Claude" w:date="2026-10-08T23:18:06Z">
+        <w:r>
+          <w:delText xml:space="preserve">a</w:delText>
+        </w:r>
+      </w:del>
+      <w:ins w:id="9010" w:author="Claude" w:date="2026-10-08T23:18:06Z">
+        <w:r>
+          <w:t xml:space="preserve">its</w:t>
+        </w:r>
+      </w:ins>
+      <w:r>
+        <w:t xml:space="preserve"> </w:t>
+      </w:r>
+      <w:del w:id="9009" w:author="Claude" w:date="2026-10-08T23:18:06Z">
+        <w:r>
+          <w:delText xml:space="preserve">distinct</w:delText>
+        </w:r>
+      </w:del>
+      <w:ins w:id="9008" w:author="Claude" w:date="2026-10-08T23:18:06Z">
+        <w:r>
+          <w:t xml:space="preserve">lowest</w:t>
+        </w:r>
+      </w:ins>
+      <w:r>
+        <w:t xml:space="preserve"> </w:t>
+      </w:r>
+      <w:del w:id="9007" w:author="Claude" w:date="2026-10-08T23:18:06Z">
+        <w:r>
+          <w:delText xml:space="preserve">optimum</w:delText>
+        </w:r>
+      </w:del>
+      <w:ins w:id="9006" w:author="Claude" w:date="2026-10-08T23:18:06Z">
+        <w:r>
+          <w:t xml:space="preserve">RMSE</w:t>
+        </w:r>
+      </w:ins>
+      <w:r>
+        <w:t xml:space="preserve"> </w:t>
+      </w:r>
+      <w:del w:id="9005" w:author="Claude" w:date="2026-10-08T23:18:06Z">
+        <w:r>
+          <w:delText xml:space="preserve">after</w:delText>
+        </w:r>
+      </w:del>
+      <w:ins w:id="9004" w:author="Claude" w:date="2026-10-08T23:18:06Z">
+        <w:r>
+          <w:t xml:space="preserve">at iteration</w:t>
+        </w:r>
+      </w:ins>
+      <w:r>
+        <w:t xml:space="preserve"> 22</w:t>
+      </w:r>
+      <w:del w:id="9003" w:author="Claude" w:date="2026-10-08T23:18:06Z">
+        <w:r>
+          <w:delText xml:space="preserve"> iterations</w:delText>
+        </w:r>
+      </w:del>
       <w:r>
         <w:t xml:space="preserve"> (</w:t>
       </w:r>
@@ -14305,7 +14391,15 @@
         <w:t xml:space="preserve"> </w:t>
       </w:r>
       <w:r>
-        <w:t>Subsequent evaluations and local refinement produced no further improvement, indicating stable convergence rather than continued sensitivity to parameter exploration. The optimized parameter set</w:t>
+        <w:t xml:space="preserve">Subsequent evaluations and local refinement produced no further improvement</w:t>
+      </w:r>
+      <w:del w:id="9014" w:author="Claude" w:date="2026-10-08T23:18:06Z">
+        <w:r>
+          <w:delText xml:space="preserve">, indicating stable convergence rather than continued sensitivity to parameter exploration</w:delText>
+        </w:r>
+      </w:del>
+      <w:r>
+        <w:t xml:space="preserve">. The optimized parameter set</w:t>
       </w:r>
       <w:r>
         <w:t xml:space="preserve"> </w:t>
@@ -14385,7 +14479,23 @@
         <w:t>4</w:t>
       </w:r>
       <w:r>
-        <w:t>2% against the calibration dataset. These results show that the proposed three-parameter framework can closely reproduce the calibration measurements. The combination of low calibration error and rapid convergence supports the framework’s potential as a basis for predictive Zn biodegradation modeling, subject to independent validation.</w:t>
+        <w:t xml:space="preserve">2% against the calibration dataset. These results show that the proposed three-parameter framework can closely reproduce the calibration measurements. The </w:t>
+      </w:r>
+      <w:del w:id="9016" w:author="Claude" w:date="2026-10-08T23:18:06Z">
+        <w:r>
+          <w:delText xml:space="preserve">combination of </w:delText>
+        </w:r>
+      </w:del>
+      <w:r>
+        <w:t xml:space="preserve">low calibration error</w:t>
+      </w:r>
+      <w:del w:id="9015" w:author="Claude" w:date="2026-10-08T23:18:06Z">
+        <w:r>
+          <w:delText xml:space="preserve"> and rapid convergence</w:delText>
+        </w:r>
+      </w:del>
+      <w:r>
+        <w:t xml:space="preserve"> supports the framework’s potential as a basis for predictive Zn biodegradation modeling, subject to independent validation.</w:t>
       </w:r>
     </w:p>
     <w:p>
@@ -15880,17 +15990,41 @@
           </m:sub>
         </m:sSub>
       </m:oMath>
+      <w:ins w:id="9001" w:author="Claude" w:date="2026-10-08T23:19:33Z">
+        <w:r>
+          <w:rPr>
+            <w:rFonts w:cs="Times New Roman"/>
+          </w:rPr>
+          <w:t xml:space="preserve">,</w:t>
+        </w:r>
+      </w:ins>
       <w:r>
         <w:rPr>
           <w:rFonts w:cs="Times New Roman"/>
         </w:rPr>
         <w:t xml:space="preserve"> </w:t>
       </w:r>
-      <w:r>
-        <w:rPr>
-          <w:rFonts w:cs="Times New Roman"/>
-        </w:rPr>
-        <w:t xml:space="preserve">for which increasing the oxygen-reduction rate coefficient markedly accelerated degradation and produced substantially greater cumulative mass loss </w:t>
+      <w:del w:id="9003" w:author="Claude" w:date="2026-10-08T23:19:33Z">
+        <w:r>
+          <w:rPr>
+            <w:rFonts w:cs="Times New Roman"/>
+          </w:rPr>
+          <w:delText xml:space="preserve">for which</w:delText>
+        </w:r>
+      </w:del>
+      <w:ins w:id="9002" w:author="Claude" w:date="2026-10-08T23:19:33Z">
+        <w:r>
+          <w:rPr>
+            <w:rFonts w:cs="Times New Roman"/>
+          </w:rPr>
+          <w:t xml:space="preserve">where</w:t>
+        </w:r>
+      </w:ins>
+      <w:r>
+        <w:rPr>
+          <w:rFonts w:cs="Times New Roman"/>
+        </w:rPr>
+        <w:t xml:space="preserve"> increasing the oxygen-reduction rate coefficient markedly accelerated degradation and produced substantially greater cumulative mass loss </w:t>
       </w:r>
       <w:r>
         <w:rPr>
@@ -20991,7 +21125,20 @@
         <w:t>identify</w:t>
       </w:r>
       <w:r>
-        <w:t xml:space="preserve"> oxygen availability as the primary driver of degradation, with corrosion-product accumulation progressively restricting transport and leading to diffusion-controlled behavior. Importantly, localized degradation emerged naturally from geometry-dependent transport phenomena, without imposing spatially varying corrosion kinetics. While curvature and inter-strut spacing produced only modest changes in cumulative mass loss, they strongly altered the distribution of material recession, demonstrating that global degradation metrics can obscure the localized thinning responsible for structural failure. These findings establish geometry as a critical determinant of biodegradable implant performance and provide a predictive framework for integrating degradation into the design and optimization of Zn stents and other biodegradable metallic implants, enabling structural performance to be considered throughout the implant lifetime rather than only at implantation.</w:t>
+        <w:t xml:space="preserve"> oxygen availability as the primary driver of degradation, with corrosion-product accumulation progressively restricting transport and leading to diffusion-controlled behavior. Importantly, localized degradation emerged naturally from geometry-dependent transport phenomena, without imposing spatially varying corrosion kinetics. While curvature and inter-strut spacing produced only modest changes in cumulative mass loss, they strongly altered the distribution of material recession, demonstrating that global degradation metrics can obscure the localized thinning responsible for structural failure. These findings establish geometry as a critical determinant of biodegradable implant performance and provide a predictive framework for integrating degradation into the design and optimization of Zn stents and other biodegradable metallic implants, </w:t>
+      </w:r>
+      <w:del w:id="9019" w:author="Claude" w:date="2026-10-08T23:18:06Z">
+        <w:r>
+          <w:delText xml:space="preserve">enabling</w:delText>
+        </w:r>
+      </w:del>
+      <w:ins w:id="9018" w:author="Claude" w:date="2026-10-08T23:18:06Z">
+        <w:r>
+          <w:t xml:space="preserve">which could enable</w:t>
+        </w:r>
+      </w:ins>
+      <w:r>
+        <w:t xml:space="preserve"> structural performance to be considered throughout the implant lifetime rather than only at implantation.</w:t>
       </w:r>
       <w:bookmarkEnd w:id="39"/>
     </w:p>

</xml_diff>

<commit_message>
Save user's latest MS/SI; re-add recent edits as tracked
</commit_message>
<xml_diff>
--- a/deliver/Manuscript_tracked.docx
+++ b/deliver/Manuscript_tracked.docx
@@ -27,7 +27,15 @@
         <w:spacing w:line="360" w:lineRule="auto"/>
       </w:pPr>
       <w:r>
-        <w:t>Henaka Ariyarathna, Xuan Yang, Aijun Huang, Yunlong Tang</w:t>
+        <w:t xml:space="preserve">Henaka Ariyarathna, Xuan Yang, </w:t>
+      </w:r>
+      <w:proofErr w:type="spellStart"/>
+      <w:r>
+        <w:t>Aijun</w:t>
+      </w:r>
+      <w:proofErr w:type="spellEnd"/>
+      <w:r>
+        <w:t xml:space="preserve"> Huang, Yunlong Tang</w:t>
       </w:r>
       <m:oMath>
         <m:sSup>
@@ -1233,18 +1241,15 @@
       <w:r>
         <w:t>. (a) Reaction–diffusion model coupling species transport and corrosion-</w:t>
       </w:r>
-      <w:del w:id="1" w:author="Claude" w:date="2026-10-08T20:38:00Z">
-        <w:r>
-          <w:delText>film</w:delText>
-        </w:r>
-      </w:del>
-      <w:ins w:id="2" w:author="Claude" w:date="2026-10-08T20:38:00Z">
-        <w:r>
-          <w:t>product</w:t>
-        </w:r>
-      </w:ins>
-      <w:r>
-        <w:t xml:space="preserve"> evolution with moving-interface tracking; (b) calibration of the three effective kinetic parameters (k</w:t>
+      <w:r>
+        <w:t>product</w:t>
+      </w:r>
+      <w:r>
+        <w:t xml:space="preserve"> evolution with moving-interface tracking; (b) calibration of the three effective kinetic parameters (</w:t>
+      </w:r>
+      <w:proofErr w:type="spellStart"/>
+      <w:r>
+        <w:t>k</w:t>
       </w:r>
       <w:r>
         <w:rPr>
@@ -1252,8 +1257,13 @@
         </w:rPr>
         <w:t>f</w:t>
       </w:r>
-      <w:r>
-        <w:t>, k</w:t>
+      <w:proofErr w:type="spellEnd"/>
+      <w:r>
+        <w:t xml:space="preserve">, </w:t>
+      </w:r>
+      <w:proofErr w:type="spellStart"/>
+      <w:r>
+        <w:t>k</w:t>
       </w:r>
       <w:r>
         <w:rPr>
@@ -1261,8 +1271,13 @@
         </w:rPr>
         <w:t>d</w:t>
       </w:r>
-      <w:r>
-        <w:t>, k</w:t>
+      <w:proofErr w:type="spellEnd"/>
+      <w:r>
+        <w:t xml:space="preserve">, </w:t>
+      </w:r>
+      <w:proofErr w:type="spellStart"/>
+      <w:r>
+        <w:t>k</w:t>
       </w:r>
       <w:r>
         <w:rPr>
@@ -1270,6 +1285,7 @@
         </w:rPr>
         <w:t>ORR</w:t>
       </w:r>
+      <w:proofErr w:type="spellEnd"/>
       <w:r>
         <w:t>) against literature mass-loss data (0–336 h); (c) validation against the mass loss measured in this study (0–672 h) for Ø10 × 2 mm discs; and (d) model predictions for a six-crown Zn stent.</w:t>
       </w:r>
@@ -1284,7 +1300,7 @@
       <w:pPr>
         <w:pStyle w:val="Heading2"/>
       </w:pPr>
-      <w:bookmarkStart w:id="3" w:name="sec:methods:materials"/>
+      <w:bookmarkStart w:id="1" w:name="sec:methods:materials"/>
       <w:r>
         <w:t>Experimental Procedure</w:t>
       </w:r>
@@ -1301,7 +1317,21 @@
         <w:rPr>
           <w:rFonts w:cs="Times New Roman"/>
         </w:rPr>
-        <w:t xml:space="preserve">Commercially pure Zn (99.99 wt%) was processed by casting, homogenization, and hot extrusion to produce fully dense rods (10 mm diameter), from which disc specimens (10 mm diameter, 2 mm thickness) were prepared. Prior to testing, specimens were mechanically ground through successive silicon carbide abrasive grades and finished with </w:t>
+        <w:t xml:space="preserve">Commercially pure Zn (99.99 </w:t>
+      </w:r>
+      <w:proofErr w:type="spellStart"/>
+      <w:r>
+        <w:rPr>
+          <w:rFonts w:cs="Times New Roman"/>
+        </w:rPr>
+        <w:t>wt</w:t>
+      </w:r>
+      <w:proofErr w:type="spellEnd"/>
+      <w:r>
+        <w:rPr>
+          <w:rFonts w:cs="Times New Roman"/>
+        </w:rPr>
+        <w:t xml:space="preserve">%) was processed by casting, homogenization, and hot extrusion to produce fully dense rods (10 mm diameter), from which disc specimens (10 mm diameter, 2 mm thickness) were prepared. Prior to testing, specimens were mechanically ground through successive silicon carbide abrasive grades and finished with </w:t>
       </w:r>
       <m:oMath>
         <m:r>
@@ -1463,7 +1493,7 @@
         <w:t>chromic acid solution in accordance with ISO 8407:2009. The cleaned specimens were rinsed, dried, and reweighed, and the mass loss was calculated from the difference between the initial and post-cleaning masses.</w:t>
       </w:r>
     </w:p>
-    <w:bookmarkEnd w:id="3"/>
+    <w:bookmarkEnd w:id="1"/>
     <w:p>
       <w:pPr>
         <w:pStyle w:val="Heading2"/>
@@ -1476,12 +1506,12 @@
       <w:pPr>
         <w:pStyle w:val="Heading3"/>
       </w:pPr>
-      <w:bookmarkStart w:id="4" w:name="_Ref238646573"/>
-      <w:bookmarkStart w:id="5" w:name="sec:model:chemistry"/>
+      <w:bookmarkStart w:id="2" w:name="_Ref238646573"/>
+      <w:bookmarkStart w:id="3" w:name="sec:model:chemistry"/>
       <w:r>
         <w:t>Electrochemical Mechanisms of Zn Biodegradation</w:t>
       </w:r>
-      <w:bookmarkEnd w:id="4"/>
+      <w:bookmarkEnd w:id="2"/>
     </w:p>
     <w:p>
       <w:pPr>
@@ -2927,7 +2957,35 @@
         <w:rPr>
           <w:rFonts w:cs="Times New Roman"/>
         </w:rPr>
-        <w:t>Although phosphate and carbonate species may contribute to the formation of secondary corrosion products such as hopeite, smithsonite, and simonkolleite at longer timescales </w:t>
+        <w:t xml:space="preserve">Although phosphate and carbonate species may contribute to the formation of secondary corrosion products such as </w:t>
+      </w:r>
+      <w:proofErr w:type="spellStart"/>
+      <w:r>
+        <w:rPr>
+          <w:rFonts w:cs="Times New Roman"/>
+        </w:rPr>
+        <w:t>hopeite</w:t>
+      </w:r>
+      <w:proofErr w:type="spellEnd"/>
+      <w:r>
+        <w:rPr>
+          <w:rFonts w:cs="Times New Roman"/>
+        </w:rPr>
+        <w:t xml:space="preserve">, smithsonite, and </w:t>
+      </w:r>
+      <w:proofErr w:type="spellStart"/>
+      <w:r>
+        <w:rPr>
+          <w:rFonts w:cs="Times New Roman"/>
+        </w:rPr>
+        <w:t>simonkolleite</w:t>
+      </w:r>
+      <w:proofErr w:type="spellEnd"/>
+      <w:r>
+        <w:rPr>
+          <w:rFonts w:cs="Times New Roman"/>
+        </w:rPr>
+        <w:t xml:space="preserve"> at longer timescales </w:t>
       </w:r>
       <w:r>
         <w:rPr>
@@ -2976,7 +3034,21 @@
         <w:rPr>
           <w:rFonts w:cs="Times New Roman"/>
         </w:rPr>
-        <w:t>the corrosion products are modeled as a single ZnO phase.</w:t>
+        <w:t xml:space="preserve">the corrosion products are modeled as a single </w:t>
+      </w:r>
+      <w:proofErr w:type="spellStart"/>
+      <w:r>
+        <w:rPr>
+          <w:rFonts w:cs="Times New Roman"/>
+        </w:rPr>
+        <w:t>ZnO</w:t>
+      </w:r>
+      <w:proofErr w:type="spellEnd"/>
+      <w:r>
+        <w:rPr>
+          <w:rFonts w:cs="Times New Roman"/>
+        </w:rPr>
+        <w:t xml:space="preserve"> phase.</w:t>
       </w:r>
     </w:p>
     <w:p>
@@ -2994,8 +3066,8 @@
         <w:ind w:firstLine="0"/>
         <w:jc w:val="center"/>
       </w:pPr>
-      <w:bookmarkStart w:id="6" w:name="fig:chemistry"/>
-      <w:bookmarkEnd w:id="5"/>
+      <w:bookmarkStart w:id="4" w:name="fig:chemistry"/>
+      <w:bookmarkEnd w:id="3"/>
       <w:r>
         <w:rPr>
           <w:noProof/>
@@ -3047,7 +3119,7 @@
       <w:pPr>
         <w:pStyle w:val="Captions"/>
       </w:pPr>
-      <w:bookmarkStart w:id="7" w:name="_Ref238652979"/>
+      <w:bookmarkStart w:id="5" w:name="_Ref238652979"/>
       <w:r>
         <w:rPr>
           <w:b/>
@@ -3105,7 +3177,7 @@
         </w:rPr>
         <w:fldChar w:fldCharType="end"/>
       </w:r>
-      <w:bookmarkEnd w:id="7"/>
+      <w:bookmarkEnd w:id="5"/>
       <w:r>
         <w:rPr>
           <w:b/>
@@ -3134,7 +3206,7 @@
         <w:pStyle w:val="Captions"/>
       </w:pPr>
     </w:p>
-    <w:bookmarkEnd w:id="6"/>
+    <w:bookmarkEnd w:id="4"/>
     <w:p>
       <w:pPr>
         <w:pStyle w:val="Heading3"/>
@@ -3628,7 +3700,21 @@
         <w:rPr>
           <w:rFonts w:cs="Times New Roman"/>
         </w:rPr>
-        <w:t xml:space="preserve">​ denote species concentration, effective diffusivity, and reaction terms, respectively. </w:t>
+        <w:t>​ denote species concentration, effective diffusiv</w:t>
+      </w:r>
+      <w:proofErr w:type="spellStart"/>
+      <w:r>
+        <w:rPr>
+          <w:rFonts w:cs="Times New Roman"/>
+        </w:rPr>
+        <w:t>ity</w:t>
+      </w:r>
+      <w:proofErr w:type="spellEnd"/>
+      <w:r>
+        <w:rPr>
+          <w:rFonts w:cs="Times New Roman"/>
+        </w:rPr>
+        <w:t xml:space="preserve">, and reaction terms, respectively. </w:t>
       </w:r>
     </w:p>
     <w:p>
@@ -4871,7 +4957,21 @@
         <w:rPr>
           <w:rFonts w:cs="Times New Roman"/>
         </w:rPr>
-        <w:t>generating OH⁻ ions that increase the local alkalinity and promote formation of ZnO-based corrosion products.</w:t>
+        <w:t xml:space="preserve">generating OH⁻ ions that increase the local alkalinity and promote formation of </w:t>
+      </w:r>
+      <w:proofErr w:type="spellStart"/>
+      <w:r>
+        <w:rPr>
+          <w:rFonts w:cs="Times New Roman"/>
+        </w:rPr>
+        <w:t>ZnO</w:t>
+      </w:r>
+      <w:proofErr w:type="spellEnd"/>
+      <w:r>
+        <w:rPr>
+          <w:rFonts w:cs="Times New Roman"/>
+        </w:rPr>
+        <w:t>-based corrosion products.</w:t>
       </w:r>
       <w:r>
         <w:rPr>
@@ -5757,7 +5857,15 @@
         <w:t>the</w:t>
       </w:r>
       <w:r>
-        <w:t xml:space="preserve"> balance between ZnO precipitation and chloride-mediated dissolution</w:t>
+        <w:t xml:space="preserve"> balance between </w:t>
+      </w:r>
+      <w:proofErr w:type="spellStart"/>
+      <w:r>
+        <w:t>ZnO</w:t>
+      </w:r>
+      <w:proofErr w:type="spellEnd"/>
+      <w:r>
+        <w:t xml:space="preserve"> precipitation and chloride-mediated dissolution</w:t>
       </w:r>
       <w:r>
         <w:t xml:space="preserve"> as follows</w:t>
@@ -6874,14 +6982,14 @@
         </w:rPr>
         <w:t xml:space="preserve"> </w:t>
       </w:r>
-      <w:bookmarkStart w:id="8" w:name="_Hlk237963744"/>
+      <w:bookmarkStart w:id="6" w:name="_Hlk237963744"/>
       <w:r>
         <w:rPr>
           <w:rFonts w:cs="Times New Roman"/>
         </w:rPr>
         <w:t>implicitly defines the interface as the zero-level set separating the metal and electrolyte domains,</w:t>
       </w:r>
-      <w:bookmarkEnd w:id="8"/>
+      <w:bookmarkEnd w:id="6"/>
       <w:r>
         <w:rPr>
           <w:rFonts w:cs="Times New Roman"/>
@@ -7234,6 +7342,7 @@
         </w:rPr>
         <w:t>Equation (17)</w:t>
       </w:r>
+      <w:proofErr w:type="gramStart"/>
       <w:r>
         <w:rPr>
           <w:rFonts w:cs="Times New Roman"/>
@@ -7246,6 +7355,7 @@
         </w:rPr>
         <w:t>.</w:t>
       </w:r>
+      <w:proofErr w:type="gramEnd"/>
       <w:r>
         <w:rPr>
           <w:rFonts w:cs="Times New Roman"/>
@@ -7263,12 +7373,12 @@
       <w:pPr>
         <w:pStyle w:val="Heading3"/>
       </w:pPr>
-      <w:bookmarkStart w:id="9" w:name="_Ref239691057"/>
-      <w:bookmarkStart w:id="10" w:name="sec:model:velocity"/>
+      <w:bookmarkStart w:id="7" w:name="_Ref239691057"/>
+      <w:bookmarkStart w:id="8" w:name="sec:model:velocity"/>
       <w:r>
         <w:t>Interface Recession Velocity</w:t>
       </w:r>
-      <w:bookmarkEnd w:id="9"/>
+      <w:bookmarkEnd w:id="7"/>
     </w:p>
     <w:p>
       <w:pPr>
@@ -7737,7 +7847,21 @@
         <w:rPr>
           <w:rFonts w:cs="Times New Roman"/>
         </w:rPr>
-        <w:t xml:space="preserve"> saturation concentration. Assuming first-order oxygen reduction kinetics and the reaction stoichiometry of </w:t>
+        <w:t xml:space="preserve"> saturation </w:t>
+      </w:r>
+      <w:proofErr w:type="gramStart"/>
+      <w:r>
+        <w:rPr>
+          <w:rFonts w:cs="Times New Roman"/>
+        </w:rPr>
+        <w:t>concentration.</w:t>
+      </w:r>
+      <w:proofErr w:type="gramEnd"/>
+      <w:r>
+        <w:rPr>
+          <w:rFonts w:cs="Times New Roman"/>
+        </w:rPr>
+        <w:t xml:space="preserve"> Assuming first-order oxygen reduction kinetics and the reaction stoichiometry of </w:t>
       </w:r>
       <w:r>
         <w:rPr>
@@ -8089,7 +8213,7 @@
           <w:rFonts w:cs="Times New Roman"/>
         </w:rPr>
       </w:pPr>
-      <w:del w:id="9002" w:author="Claude" w:date="2026-10-08T23:18:06Z">
+      <w:del w:id="9002" w:author="Claude" w:date="2026-10-08T23:42:36Z">
         <w:r>
           <w:rPr>
             <w:rFonts w:cs="Times New Roman"/>
@@ -8097,7 +8221,7 @@
           <w:delText xml:space="preserve">Where</w:delText>
         </w:r>
       </w:del>
-      <w:ins w:id="9001" w:author="Claude" w:date="2026-10-08T23:18:06Z">
+      <w:ins w:id="9001" w:author="Claude" w:date="2026-10-08T23:42:36Z">
         <w:r>
           <w:rPr>
             <w:rFonts w:cs="Times New Roman"/>
@@ -8819,24 +8943,32 @@
       <w:pPr>
         <w:pStyle w:val="Heading2"/>
       </w:pPr>
-      <w:bookmarkStart w:id="11" w:name="_Ref240381709"/>
-      <w:bookmarkStart w:id="12" w:name="tab:params"/>
+      <w:bookmarkStart w:id="9" w:name="_Ref240381709"/>
+      <w:bookmarkStart w:id="10" w:name="tab:params"/>
       <w:r>
         <w:t>Numerical Implementation and Simulation Setup</w:t>
       </w:r>
-      <w:bookmarkEnd w:id="11"/>
+      <w:bookmarkEnd w:id="9"/>
     </w:p>
     <w:p>
       <w:pPr>
         <w:pStyle w:val="BodyText"/>
       </w:pPr>
       <w:r>
-        <w:t xml:space="preserve">The coupled reaction-diffusion and moving-boundary framework was implemented in FreeFEM++ and solved using first-order finite elements with implicit time integration. </w:t>
+        <w:t xml:space="preserve">The coupled reaction-diffusion and moving-boundary framework was implemented in </w:t>
+      </w:r>
+      <w:proofErr w:type="spellStart"/>
+      <w:r>
+        <w:t>FreeFEM</w:t>
+      </w:r>
+      <w:proofErr w:type="spellEnd"/>
+      <w:r>
+        <w:t xml:space="preserve">++ and solved using first-order finite elements with implicit time integration. </w:t>
       </w:r>
       <w:r>
         <w:t>Parametrically generated implant geometries were discretized into tetrahedral meshes and embedded within a 30 × 30 × 30 mm electrolyte domain</w:t>
       </w:r>
-      <w:ins w:id="13" w:author="Claude" w:date="2026-10-08T20:38:00Z">
+      <w:ins w:id="11" w:author="Claude" w:date="2026-10-08T20:38:00Z">
         <w:r>
           <w:t>,</w:t>
         </w:r>
@@ -8844,7 +8976,7 @@
       <w:r>
         <w:t xml:space="preserve"> identical for the disc and the stent and larger than three times the implant characteristic dimension in each direction</w:t>
       </w:r>
-      <w:ins w:id="14" w:author="Claude" w:date="2026-10-08T04:28:00Z">
+      <w:ins w:id="12" w:author="Claude" w:date="2026-10-08T04:28:00Z">
         <w:r>
           <w:t>,</w:t>
         </w:r>
@@ -8864,16 +8996,9 @@
       <w:r>
         <w:t xml:space="preserve">To resolve steep concentration gradients near the corrosion front, distance-based mesh refinement was applied around the metal-electrolyte interface, with progressively coarser elements away from the surface. Mesh convergence analysis identified a final mesh containing 18.9 million tetrahedral elements, for which predicted mass loss changed by less than </w:t>
       </w:r>
-      <w:del w:id="15" w:author="Claude" w:date="2026-10-08T22:54:00Z">
-        <w:r>
-          <w:delText>1</w:delText>
-        </w:r>
-      </w:del>
-      <w:ins w:id="16" w:author="Claude" w:date="2026-10-08T22:54:00Z">
-        <w:r>
-          <w:t>0.2</w:t>
-        </w:r>
-      </w:ins>
+      <w:r>
+        <w:t>0.2</w:t>
+      </w:r>
       <w:r>
         <w:t>% with further refinement (</w:t>
       </w:r>
@@ -8893,7 +9018,15 @@
         <w:pStyle w:val="BodyText"/>
       </w:pPr>
       <w:r>
-        <w:t xml:space="preserve">Physiological initial and boundary conditions were imposed throughout the electrolyte domain, including continuous oxygen replenishment at the electrolyte-air interface and kinetic flux conditions at the moving metal-electrolyte boundary. The 48 h medium renewal used in the immersion tests was not modeled explicitly; instead, dissolved oxygen was assumed to be </w:t>
+        <w:t xml:space="preserve">Physiological initial and boundary conditions were imposed throughout the electrolyte domain, including continuous oxygen replenishment at the electrolyte-air interface and kinetic flux conditions at the moving metal-electrolyte boundary. The </w:t>
+      </w:r>
+      <w:proofErr w:type="gramStart"/>
+      <w:r>
+        <w:t>48 h</w:t>
+      </w:r>
+      <w:proofErr w:type="gramEnd"/>
+      <w:r>
+        <w:t xml:space="preserve"> medium renewal used in the immersion tests was not modeled explicitly; instead, dissolved oxygen was assumed to be </w:t>
       </w:r>
       <w:r>
         <w:lastRenderedPageBreak/>
@@ -8903,7 +9036,15 @@
         <w:t xml:space="preserve"> and </w:t>
       </w:r>
       <w:r>
-        <w:t>no natural convection was considered (static conditions). Simulations were executed in parallel using FreeFEM++ MPI on a high-performance computing cluster, and degradation metrics together with concentration and interface fields were recorded at regular time intervals.</w:t>
+        <w:t xml:space="preserve">no natural convection was considered (static conditions). Simulations were executed in parallel using </w:t>
+      </w:r>
+      <w:proofErr w:type="spellStart"/>
+      <w:r>
+        <w:t>FreeFEM</w:t>
+      </w:r>
+      <w:proofErr w:type="spellEnd"/>
+      <w:r>
+        <w:t>++ MPI on a high-performance computing cluster, and degradation metrics together with concentration and interface fields were recorded at regular time intervals.</w:t>
       </w:r>
       <w:r>
         <w:t xml:space="preserve"> Predicted mass loss, corrosion rate (</w:t>
@@ -8938,7 +9079,15 @@
         <w:t>, and dissolved oxygen concentration</w:t>
       </w:r>
       <w:r>
-        <w:t xml:space="preserve"> were extracted during post-processing. The transition between reaction-controlled and diffusion-controlled degradation was quantified using the local Damköhler number (</w:t>
+        <w:t xml:space="preserve"> were extracted during post-processing. The transition between reaction-controlled and diffusion-controlled degradation was quantified using the local </w:t>
+      </w:r>
+      <w:proofErr w:type="spellStart"/>
+      <w:r>
+        <w:t>Damköhler</w:t>
+      </w:r>
+      <w:proofErr w:type="spellEnd"/>
+      <w:r>
+        <w:t xml:space="preserve"> number (</w:t>
       </w:r>
       <w:r>
         <w:rPr>
@@ -9039,7 +9188,7 @@
           <w:rFonts w:cs="Times New Roman"/>
         </w:rPr>
       </w:pPr>
-      <w:bookmarkStart w:id="17" w:name="_Ref238635735"/>
+      <w:bookmarkStart w:id="13" w:name="_Ref238635735"/>
       <w:r>
         <w:rPr>
           <w:b/>
@@ -9083,7 +9232,7 @@
         </w:rPr>
         <w:fldChar w:fldCharType="end"/>
       </w:r>
-      <w:bookmarkEnd w:id="17"/>
+      <w:bookmarkEnd w:id="13"/>
       <w:r>
         <w:rPr>
           <w:b/>
@@ -12760,7 +12909,7 @@
           </w:p>
         </w:tc>
       </w:tr>
-      <w:bookmarkEnd w:id="12"/>
+      <w:bookmarkEnd w:id="10"/>
     </w:tbl>
     <w:p>
       <w:pPr>
@@ -12771,7 +12920,7 @@
         </w:rPr>
       </w:pPr>
     </w:p>
-    <w:bookmarkEnd w:id="10"/>
+    <w:bookmarkEnd w:id="8"/>
     <w:p>
       <w:pPr>
         <w:pStyle w:val="Heading2"/>
@@ -13417,7 +13566,7 @@
           <w:rFonts w:cs="Times New Roman"/>
         </w:rPr>
       </w:pPr>
-      <w:bookmarkStart w:id="18" w:name="fig:gsa"/>
+      <w:bookmarkStart w:id="14" w:name="fig:gsa"/>
       <w:r>
         <w:rPr>
           <w:rFonts w:cs="Times New Roman"/>
@@ -14253,12 +14402,12 @@
       <w:r>
         <w:t xml:space="preserve">Following the initial exploration of the admissible parameter space, the optimization rapidly reduced the RMSE from approximately 0.28% to below 0.05% and </w:t>
       </w:r>
-      <w:del w:id="9013" w:author="Claude" w:date="2026-10-08T23:18:06Z">
+      <w:del w:id="9013" w:author="Claude" w:date="2026-10-08T23:42:36Z">
         <w:r>
           <w:delText xml:space="preserve">identified</w:delText>
         </w:r>
       </w:del>
-      <w:ins w:id="9012" w:author="Claude" w:date="2026-10-08T23:18:06Z">
+      <w:ins w:id="9012" w:author="Claude" w:date="2026-10-08T23:42:36Z">
         <w:r>
           <w:t xml:space="preserve">reached</w:t>
         </w:r>
@@ -14266,12 +14415,12 @@
       <w:r>
         <w:t xml:space="preserve"> </w:t>
       </w:r>
-      <w:del w:id="9011" w:author="Claude" w:date="2026-10-08T23:18:06Z">
+      <w:del w:id="9011" w:author="Claude" w:date="2026-10-08T23:42:36Z">
         <w:r>
           <w:delText xml:space="preserve">a</w:delText>
         </w:r>
       </w:del>
-      <w:ins w:id="9010" w:author="Claude" w:date="2026-10-08T23:18:06Z">
+      <w:ins w:id="9010" w:author="Claude" w:date="2026-10-08T23:42:36Z">
         <w:r>
           <w:t xml:space="preserve">its</w:t>
         </w:r>
@@ -14279,12 +14428,12 @@
       <w:r>
         <w:t xml:space="preserve"> </w:t>
       </w:r>
-      <w:del w:id="9009" w:author="Claude" w:date="2026-10-08T23:18:06Z">
+      <w:del w:id="9009" w:author="Claude" w:date="2026-10-08T23:42:36Z">
         <w:r>
           <w:delText xml:space="preserve">distinct</w:delText>
         </w:r>
       </w:del>
-      <w:ins w:id="9008" w:author="Claude" w:date="2026-10-08T23:18:06Z">
+      <w:ins w:id="9008" w:author="Claude" w:date="2026-10-08T23:42:36Z">
         <w:r>
           <w:t xml:space="preserve">lowest</w:t>
         </w:r>
@@ -14292,12 +14441,12 @@
       <w:r>
         <w:t xml:space="preserve"> </w:t>
       </w:r>
-      <w:del w:id="9007" w:author="Claude" w:date="2026-10-08T23:18:06Z">
+      <w:del w:id="9007" w:author="Claude" w:date="2026-10-08T23:42:36Z">
         <w:r>
           <w:delText xml:space="preserve">optimum</w:delText>
         </w:r>
       </w:del>
-      <w:ins w:id="9006" w:author="Claude" w:date="2026-10-08T23:18:06Z">
+      <w:ins w:id="9006" w:author="Claude" w:date="2026-10-08T23:42:36Z">
         <w:r>
           <w:t xml:space="preserve">RMSE</w:t>
         </w:r>
@@ -14305,12 +14454,12 @@
       <w:r>
         <w:t xml:space="preserve"> </w:t>
       </w:r>
-      <w:del w:id="9005" w:author="Claude" w:date="2026-10-08T23:18:06Z">
+      <w:del w:id="9005" w:author="Claude" w:date="2026-10-08T23:42:36Z">
         <w:r>
           <w:delText xml:space="preserve">after</w:delText>
         </w:r>
       </w:del>
-      <w:ins w:id="9004" w:author="Claude" w:date="2026-10-08T23:18:06Z">
+      <w:ins w:id="9004" w:author="Claude" w:date="2026-10-08T23:42:36Z">
         <w:r>
           <w:t xml:space="preserve">at iteration</w:t>
         </w:r>
@@ -14318,7 +14467,7 @@
       <w:r>
         <w:t xml:space="preserve"> 22</w:t>
       </w:r>
-      <w:del w:id="9003" w:author="Claude" w:date="2026-10-08T23:18:06Z">
+      <w:del w:id="9003" w:author="Claude" w:date="2026-10-08T23:42:36Z">
         <w:r>
           <w:delText xml:space="preserve"> iterations</w:delText>
         </w:r>
@@ -14393,7 +14542,7 @@
       <w:r>
         <w:t xml:space="preserve">Subsequent evaluations and local refinement produced no further improvement</w:t>
       </w:r>
-      <w:del w:id="9014" w:author="Claude" w:date="2026-10-08T23:18:06Z">
+      <w:del w:id="9014" w:author="Claude" w:date="2026-10-08T23:42:36Z">
         <w:r>
           <w:delText xml:space="preserve">, indicating stable convergence rather than continued sensitivity to parameter exploration</w:delText>
         </w:r>
@@ -14481,7 +14630,7 @@
       <w:r>
         <w:t xml:space="preserve">2% against the calibration dataset. These results show that the proposed three-parameter framework can closely reproduce the calibration measurements. The </w:t>
       </w:r>
-      <w:del w:id="9016" w:author="Claude" w:date="2026-10-08T23:18:06Z">
+      <w:del w:id="9016" w:author="Claude" w:date="2026-10-08T23:42:36Z">
         <w:r>
           <w:delText xml:space="preserve">combination of </w:delText>
         </w:r>
@@ -14489,7 +14638,7 @@
       <w:r>
         <w:t xml:space="preserve">low calibration error</w:t>
       </w:r>
-      <w:del w:id="9015" w:author="Claude" w:date="2026-10-08T23:18:06Z">
+      <w:del w:id="9015" w:author="Claude" w:date="2026-10-08T23:42:36Z">
         <w:r>
           <w:delText xml:space="preserve"> and rapid convergence</w:delText>
         </w:r>
@@ -14562,7 +14711,7 @@
       <w:pPr>
         <w:pStyle w:val="Captions"/>
       </w:pPr>
-      <w:bookmarkStart w:id="19" w:name="_Ref239754266"/>
+      <w:bookmarkStart w:id="15" w:name="_Ref239754266"/>
       <w:r>
         <w:rPr>
           <w:b/>
@@ -14620,7 +14769,7 @@
         </w:rPr>
         <w:fldChar w:fldCharType="end"/>
       </w:r>
-      <w:bookmarkEnd w:id="19"/>
+      <w:bookmarkEnd w:id="15"/>
       <w:r>
         <w:rPr>
           <w:b/>
@@ -14657,8 +14806,8 @@
           <w:i/>
         </w:rPr>
       </w:pPr>
-      <w:bookmarkStart w:id="20" w:name="_Ref238636197"/>
-      <w:bookmarkStart w:id="21" w:name="tab:optim_params"/>
+      <w:bookmarkStart w:id="16" w:name="_Ref238636197"/>
+      <w:bookmarkStart w:id="17" w:name="tab:optim_params"/>
       <w:r>
         <w:rPr>
           <w:b/>
@@ -14702,7 +14851,7 @@
         </w:rPr>
         <w:fldChar w:fldCharType="end"/>
       </w:r>
-      <w:bookmarkEnd w:id="20"/>
+      <w:bookmarkEnd w:id="16"/>
       <w:r>
         <w:rPr>
           <w:b/>
@@ -15480,7 +15629,7 @@
           </w:p>
         </w:tc>
       </w:tr>
-      <w:bookmarkEnd w:id="21"/>
+      <w:bookmarkEnd w:id="17"/>
     </w:tbl>
     <w:p>
       <w:pPr>
@@ -15830,11 +15979,19 @@
         </w:rPr>
         <w:t>while</w:t>
       </w:r>
-      <w:r>
-        <w:rPr>
-          <w:rFonts w:cs="Times New Roman"/>
-        </w:rPr>
-        <w:t xml:space="preserve">, increasing </w:t>
+      <w:del w:id="9017" w:author="Claude" w:date="2026-10-08T23:42:36Z">
+        <w:r>
+          <w:rPr>
+            <w:rFonts w:cs="Times New Roman"/>
+          </w:rPr>
+          <w:delText xml:space="preserve">,</w:delText>
+        </w:r>
+      </w:del>
+      <w:r>
+        <w:rPr>
+          <w:rFonts w:cs="Times New Roman"/>
+        </w:rPr>
+        <w:t xml:space="preserve"> increasing </w:t>
       </w:r>
       <m:oMath>
         <m:sSub>
@@ -15990,7 +16147,7 @@
           </m:sub>
         </m:sSub>
       </m:oMath>
-      <w:ins w:id="9001" w:author="Claude" w:date="2026-10-08T23:19:33Z">
+      <w:ins w:id="9020" w:author="Claude" w:date="2026-10-08T23:42:36Z">
         <w:r>
           <w:rPr>
             <w:rFonts w:cs="Times New Roman"/>
@@ -16004,7 +16161,7 @@
         </w:rPr>
         <w:t xml:space="preserve"> </w:t>
       </w:r>
-      <w:del w:id="9003" w:author="Claude" w:date="2026-10-08T23:19:33Z">
+      <w:del w:id="9022" w:author="Claude" w:date="2026-10-08T23:42:36Z">
         <w:r>
           <w:rPr>
             <w:rFonts w:cs="Times New Roman"/>
@@ -16012,7 +16169,7 @@
           <w:delText xml:space="preserve">for which</w:delText>
         </w:r>
       </w:del>
-      <w:ins w:id="9002" w:author="Claude" w:date="2026-10-08T23:19:33Z">
+      <w:ins w:id="9021" w:author="Claude" w:date="2026-10-08T23:42:36Z">
         <w:r>
           <w:rPr>
             <w:rFonts w:cs="Times New Roman"/>
@@ -16654,15 +16811,15 @@
       <w:r>
         <w:t xml:space="preserve">​ act directly on the competing processes of corrosion-product formation and dissolution, making </w:t>
       </w:r>
-      <w:del w:id="9002" w:author="Claude" w:date="2026-10-08T23:09:54Z">
+      <w:del w:id="18" w:author="Claude" w:date="2026-10-08T23:09:00Z">
         <w:r>
           <w:delText xml:space="preserve">film </w:delText>
         </w:r>
       </w:del>
       <w:r>
-        <w:t xml:space="preserve">corrosion-product</w:t>
-      </w:r>
-      <w:del w:id="9001" w:author="Claude" w:date="2026-10-08T23:09:54Z">
+        <w:t>corrosion-product</w:t>
+      </w:r>
+      <w:del w:id="19" w:author="Claude" w:date="2026-10-08T23:09:00Z">
         <w:r>
           <w:delText xml:space="preserve"> coverage</w:delText>
         </w:r>
@@ -16785,8 +16942,18 @@
           <w:b/>
           <w:bCs/>
         </w:rPr>
-        <w:t>g–i</w:t>
-      </w:r>
+        <w:t>g–</w:t>
+      </w:r>
+      <w:proofErr w:type="spellStart"/>
+      <w:r>
+        <w:rPr>
+          <w:rFonts w:cs="Times New Roman"/>
+          <w:b/>
+          <w:bCs/>
+        </w:rPr>
+        <w:t>i</w:t>
+      </w:r>
+      <w:proofErr w:type="spellEnd"/>
       <w:r>
         <w:rPr>
           <w:rFonts w:cs="Times New Roman"/>
@@ -17184,7 +17351,7 @@
           <w:rFonts w:cs="Times New Roman"/>
         </w:rPr>
       </w:pPr>
-      <w:bookmarkStart w:id="22" w:name="_Ref239754180"/>
+      <w:bookmarkStart w:id="20" w:name="_Ref239754180"/>
       <w:r>
         <w:rPr>
           <w:b/>
@@ -17242,7 +17409,7 @@
         </w:rPr>
         <w:fldChar w:fldCharType="end"/>
       </w:r>
-      <w:bookmarkEnd w:id="22"/>
+      <w:bookmarkEnd w:id="20"/>
       <w:r>
         <w:rPr>
           <w:b/>
@@ -17251,7 +17418,15 @@
         <w:t>.</w:t>
       </w:r>
       <w:r>
-        <w:t xml:space="preserve"> Local parameter sweeps of kinetic parameters. Panels (a–c) show cumulative mass loss (%), panels (d–f) show the normalized corrosion-product saturation, F/Fₘₐₓ (%), and panels (g–i) show interfacial dissolved oxygen concentration (</w:t>
+        <w:t xml:space="preserve"> Local parameter sweeps of kinetic parameters. Panels (a–c) show cumulative mass loss (%), panels (d–f) show the normalized corrosion-product saturation, F/Fₘₐₓ (%), and panels (g–</w:t>
+      </w:r>
+      <w:proofErr w:type="spellStart"/>
+      <w:r>
+        <w:t>i</w:t>
+      </w:r>
+      <w:proofErr w:type="spellEnd"/>
+      <w:r>
+        <w:t>) show interfacial dissolved oxygen concentration (</w:t>
       </w:r>
       <w:r>
         <w:rPr>
@@ -17373,7 +17548,7 @@
         </w:rPr>
       </w:pPr>
     </w:p>
-    <w:bookmarkEnd w:id="18"/>
+    <w:bookmarkEnd w:id="14"/>
     <w:p>
       <w:pPr>
         <w:pStyle w:val="Heading2"/>
@@ -17538,8 +17713,8 @@
           <w:iCs w:val="0"/>
         </w:rPr>
       </w:pPr>
-      <w:bookmarkStart w:id="23" w:name="_Ref238632622"/>
-      <w:bookmarkStart w:id="24" w:name="_Ref240375786"/>
+      <w:bookmarkStart w:id="21" w:name="_Ref238632622"/>
+      <w:bookmarkStart w:id="22" w:name="_Ref240375786"/>
       <w:r>
         <w:rPr>
           <w:b/>
@@ -17584,8 +17759,8 @@
         </w:rPr>
         <w:fldChar w:fldCharType="end"/>
       </w:r>
-      <w:bookmarkEnd w:id="23"/>
-      <w:bookmarkEnd w:id="24"/>
+      <w:bookmarkEnd w:id="21"/>
+      <w:bookmarkEnd w:id="22"/>
       <w:r>
         <w:rPr>
           <w:b/>
@@ -18628,8 +18803,13 @@
         </w:rPr>
         <w:t xml:space="preserve">. </w:t>
       </w:r>
-      <w:r>
-        <w:t xml:space="preserve">Damköhler-number analysis quantified this transition, </w:t>
+      <w:proofErr w:type="spellStart"/>
+      <w:r>
+        <w:t>Damköhler</w:t>
+      </w:r>
+      <w:proofErr w:type="spellEnd"/>
+      <w:r>
+        <w:t xml:space="preserve">-number analysis quantified this transition, </w:t>
       </w:r>
       <w:r>
         <w:t xml:space="preserve">revealing an initial degradation regime governed by cathodic reaction kinetics. After approximately </w:t>
@@ -18938,7 +19118,7 @@
       <w:pPr>
         <w:pStyle w:val="Captions"/>
       </w:pPr>
-      <w:bookmarkStart w:id="25" w:name="_Ref239754424"/>
+      <w:bookmarkStart w:id="23" w:name="_Ref239754424"/>
       <w:r>
         <w:rPr>
           <w:b/>
@@ -18996,7 +19176,7 @@
         </w:rPr>
         <w:fldChar w:fldCharType="end"/>
       </w:r>
-      <w:bookmarkEnd w:id="25"/>
+      <w:bookmarkEnd w:id="23"/>
       <w:r>
         <w:rPr>
           <w:b/>
@@ -19318,6 +19498,7 @@
         </w:rPr>
         <w:fldChar w:fldCharType="end"/>
       </w:r>
+      <w:proofErr w:type="gramStart"/>
       <w:r>
         <w:rPr>
           <w:rFonts w:cs="Times New Roman"/>
@@ -19326,13 +19507,14 @@
         </w:rPr>
         <w:t>e,f</w:t>
       </w:r>
+      <w:proofErr w:type="gramEnd"/>
       <w:r>
         <w:rPr>
           <w:rFonts w:cs="Times New Roman"/>
         </w:rPr>
         <w:t>, the model reproduced the overall evolution of both quantities, capturing the rapid initial increase followed by a gradual plateau</w:t>
       </w:r>
-      <w:ins w:id="26" w:author="Claude" w:date="2026-10-08T20:38:00Z">
+      <w:ins w:id="24" w:author="Claude" w:date="2026-10-08T20:38:00Z">
         <w:r>
           <w:rPr>
             <w:rFonts w:cs="Times New Roman"/>
@@ -19344,9 +19526,16 @@
         <w:rPr>
           <w:rFonts w:cs="Times New Roman"/>
         </w:rPr>
-        <w:t xml:space="preserve"> with errors at 336 h of 44% for Zn²⁺ and 2.8% for pH</w:t>
-      </w:r>
-      <w:del w:id="27" w:author="Claude" w:date="2026-10-08T20:38:00Z">
+        <w:t xml:space="preserve"> with errors at 336 h of 44% for Zn²⁺ and 2.8% for </w:t>
+      </w:r>
+      <w:proofErr w:type="spellStart"/>
+      <w:r>
+        <w:rPr>
+          <w:rFonts w:cs="Times New Roman"/>
+        </w:rPr>
+        <w:t>pH</w:t>
+      </w:r>
+      <w:del w:id="25" w:author="Claude" w:date="2026-10-08T20:38:00Z">
         <w:r>
           <w:rPr>
             <w:rFonts w:cs="Times New Roman"/>
@@ -19358,7 +19547,14 @@
         <w:rPr>
           <w:rFonts w:cs="Times New Roman"/>
         </w:rPr>
-        <w:t xml:space="preserve">. </w:t>
+        <w:t>.</w:t>
+      </w:r>
+      <w:proofErr w:type="spellEnd"/>
+      <w:r>
+        <w:rPr>
+          <w:rFonts w:cs="Times New Roman"/>
+        </w:rPr>
+        <w:t xml:space="preserve"> </w:t>
       </w:r>
       <w:r>
         <w:rPr>
@@ -19574,7 +19770,15 @@
         <w:t xml:space="preserve"> corrosion-product chemistry. </w:t>
       </w:r>
       <w:r>
-        <w:t>The higher mass loss is consistent with the observed relationship between surface area-to-volume ratio (SA:V) and degradation, where cumulative mass loss increased approximately linearly with SA:V</w:t>
+        <w:t>The higher mass loss is consistent with the observed relationship between surface area-to-volume ratio (</w:t>
+      </w:r>
+      <w:proofErr w:type="gramStart"/>
+      <w:r>
+        <w:t>SA:V</w:t>
+      </w:r>
+      <w:proofErr w:type="gramEnd"/>
+      <w:r>
+        <w:t>) and degradation, where cumulative mass loss increased approximately linearly with SA:V</w:t>
       </w:r>
       <w:r>
         <w:t xml:space="preserve"> (</w:t>
@@ -19586,24 +19790,13 @@
         </w:rPr>
         <w:t xml:space="preserve">Figure </w:t>
       </w:r>
-      <w:del w:id="28" w:author="Claude" w:date="2026-10-08T22:54:00Z">
-        <w:r>
-          <w:rPr>
-            <w:b/>
-            <w:bCs/>
-          </w:rPr>
-          <w:delText>S9</w:delText>
-        </w:r>
-      </w:del>
-      <w:ins w:id="29" w:author="Claude" w:date="2026-10-08T22:54:00Z">
-        <w:r>
-          <w:rPr>
-            <w:b/>
-            <w:bCs/>
-          </w:rPr>
-          <w:t>S8</w:t>
-        </w:r>
-      </w:ins>
+      <w:r>
+        <w:rPr>
+          <w:b/>
+          <w:bCs/>
+        </w:rPr>
+        <w:t>S8</w:t>
+      </w:r>
       <w:r>
         <w:t>)</w:t>
       </w:r>
@@ -19614,7 +19807,15 @@
         <w:t xml:space="preserve"> </w:t>
       </w:r>
       <w:r>
-        <w:t>However, the stent exhibited less pronounced temporal deceleration in mass loss than the disc, indicating that geometric influences on degradation extend beyond SA:V alone.</w:t>
+        <w:t xml:space="preserve">However, the stent exhibited less pronounced temporal deceleration in mass loss than the disc, indicating that geometric influences on degradation extend beyond </w:t>
+      </w:r>
+      <w:proofErr w:type="gramStart"/>
+      <w:r>
+        <w:t>SA:V</w:t>
+      </w:r>
+      <w:proofErr w:type="gramEnd"/>
+      <w:r>
+        <w:t xml:space="preserve"> alone.</w:t>
       </w:r>
     </w:p>
     <w:p>
@@ -19776,7 +19977,7 @@
       <w:pPr>
         <w:pStyle w:val="Captions"/>
       </w:pPr>
-      <w:bookmarkStart w:id="30" w:name="_Ref239754601"/>
+      <w:bookmarkStart w:id="26" w:name="_Ref239754601"/>
       <w:r>
         <w:rPr>
           <w:b/>
@@ -19834,7 +20035,7 @@
         </w:rPr>
         <w:fldChar w:fldCharType="end"/>
       </w:r>
-      <w:bookmarkEnd w:id="30"/>
+      <w:bookmarkEnd w:id="26"/>
       <w:r>
         <w:rPr>
           <w:b/>
@@ -20120,6 +20321,7 @@
         </w:rPr>
         <w:fldChar w:fldCharType="end"/>
       </w:r>
+      <w:proofErr w:type="gramStart"/>
       <w:r>
         <w:rPr>
           <w:b/>
@@ -20128,7 +20330,11 @@
         <w:t>c,d</w:t>
       </w:r>
       <w:r>
-        <w:t xml:space="preserve">. </w:t>
+        <w:t>.</w:t>
+      </w:r>
+      <w:proofErr w:type="gramEnd"/>
+      <w:r>
+        <w:t xml:space="preserve"> </w:t>
       </w:r>
       <w:r>
         <w:t>Section 1, located along a relatively straight strut segment, exhibited comparatively uniform recession, with penetration depths ranging from approximately</w:t>
@@ -20331,7 +20537,7 @@
         <w:ind w:firstLine="0"/>
         <w:jc w:val="center"/>
       </w:pPr>
-      <w:bookmarkStart w:id="31" w:name="fig:casestudy2"/>
+      <w:bookmarkStart w:id="27" w:name="fig:casestudy2"/>
       <w:r>
         <w:rPr>
           <w:noProof/>
@@ -20383,7 +20589,7 @@
       <w:pPr>
         <w:pStyle w:val="Captions"/>
       </w:pPr>
-      <w:bookmarkStart w:id="32" w:name="_Ref239754694"/>
+      <w:bookmarkStart w:id="28" w:name="_Ref239754694"/>
       <w:r>
         <w:rPr>
           <w:b/>
@@ -20441,7 +20647,7 @@
         </w:rPr>
         <w:fldChar w:fldCharType="end"/>
       </w:r>
-      <w:bookmarkEnd w:id="32"/>
+      <w:bookmarkEnd w:id="28"/>
       <w:r>
         <w:rPr>
           <w:b/>
@@ -20474,7 +20680,17 @@
         <w:t>672</w:t>
       </w:r>
       <w:r>
-        <w:t> h, (b) schematic illustration of oxygen transport to the inner and outer-curvature surfaces of the stent crown, (c,d) evolution of the metal cross-sectional profiles at Sections 1 and 2, respectively.</w:t>
+        <w:t> h, (b) schematic illustration of oxygen transport to the inner and outer-curvature surfaces of the stent crown, (</w:t>
+      </w:r>
+      <w:proofErr w:type="spellStart"/>
+      <w:proofErr w:type="gramStart"/>
+      <w:r>
+        <w:t>c,d</w:t>
+      </w:r>
+      <w:proofErr w:type="spellEnd"/>
+      <w:proofErr w:type="gramEnd"/>
+      <w:r>
+        <w:t>) evolution of the metal cross-sectional profiles at Sections 1 and 2, respectively.</w:t>
       </w:r>
     </w:p>
     <w:p>
@@ -20663,7 +20879,15 @@
         <w:t xml:space="preserve">Although the effects on cumulative mass loss were relatively modest, geometry strongly influenced the spatial distribution of degradation. Mean </w:t>
       </w:r>
       <w:r>
-        <w:t>penetration depths varied only slightly, ranging from approximately 2.4 to 2.7 µm across the curved-wire configurations (30°, 90°, and 150° arcs) and from 2.1 to 2.4 µm across the straight, closely spaced, and widely spaced wire configurations</w:t>
+        <w:t xml:space="preserve">penetration depths varied only slightly, ranging from approximately 2.4 to 2.7 µm across the curved-wire configurations (30°, 90°, and 150° arcs) and from 2.1 to 2.4 µm across the </w:t>
+      </w:r>
+      <w:proofErr w:type="spellStart"/>
+      <w:r>
+        <w:t>straight</w:t>
+      </w:r>
+      <w:proofErr w:type="spellEnd"/>
+      <w:r>
+        <w:t>, closely spaced, and widely spaced wire configurations</w:t>
       </w:r>
       <w:r>
         <w:t xml:space="preserve"> (</w:t>
@@ -20757,7 +20981,7 @@
       <w:pPr>
         <w:pStyle w:val="Captions"/>
       </w:pPr>
-      <w:bookmarkStart w:id="33" w:name="_Ref241074684"/>
+      <w:bookmarkStart w:id="29" w:name="_Ref241074684"/>
       <w:r>
         <w:rPr>
           <w:b/>
@@ -20801,7 +21025,7 @@
         </w:rPr>
         <w:fldChar w:fldCharType="end"/>
       </w:r>
-      <w:bookmarkEnd w:id="33"/>
+      <w:bookmarkEnd w:id="29"/>
       <w:r>
         <w:rPr>
           <w:b/>
@@ -20861,15 +21085,23 @@
       <w:r>
         <w:t>The corrosion</w:t>
       </w:r>
-      <w:del w:id="34" w:author="Claude" w:date="2026-10-08T20:38:00Z">
+      <w:del w:id="30" w:author="Claude" w:date="2026-10-08T20:38:00Z">
         <w:r>
           <w:delText>-</w:delText>
         </w:r>
       </w:del>
       <w:r>
-        <w:t xml:space="preserve"> products are treated as a homogenized ZnO-based field rather than a discrete surface film or a heterogeneous, composition-dependent structure, and phosphate-, carbonate-, calcium-, and chloride-containing phases</w:t>
-      </w:r>
-      <w:ins w:id="35" w:author="Claude" w:date="2026-10-08T20:38:00Z">
+        <w:t xml:space="preserve"> products are treated as a homogenized </w:t>
+      </w:r>
+      <w:proofErr w:type="spellStart"/>
+      <w:r>
+        <w:t>ZnO</w:t>
+      </w:r>
+      <w:proofErr w:type="spellEnd"/>
+      <w:r>
+        <w:t>-based field rather than a discrete surface film or a heterogeneous, composition-dependent structure, and phosphate-, carbonate-, calcium-, and chloride-containing phases</w:t>
+      </w:r>
+      <w:ins w:id="31" w:author="Claude" w:date="2026-10-08T20:38:00Z">
         <w:r>
           <w:t>,</w:t>
         </w:r>
@@ -21061,7 +21293,7 @@
         <w:pStyle w:val="BodyText"/>
         <w:ind w:firstLine="0"/>
         <w:rPr>
-          <w:ins w:id="36" w:author="Claude" w:date="2026-10-08T20:38:00Z"/>
+          <w:ins w:id="32" w:author="Claude" w:date="2026-10-08T20:38:00Z"/>
         </w:rPr>
       </w:pPr>
     </w:p>
@@ -21070,7 +21302,7 @@
         <w:pStyle w:val="BodyText"/>
         <w:ind w:firstLine="0"/>
         <w:rPr>
-          <w:ins w:id="37" w:author="Claude" w:date="2026-10-08T20:38:00Z"/>
+          <w:ins w:id="33" w:author="Claude" w:date="2026-10-08T20:38:00Z"/>
         </w:rPr>
       </w:pPr>
     </w:p>
@@ -21079,11 +21311,11 @@
         <w:pStyle w:val="BodyText"/>
         <w:ind w:firstLine="0"/>
         <w:rPr>
-          <w:ins w:id="38" w:author="Claude" w:date="2026-10-08T20:38:00Z"/>
+          <w:ins w:id="34" w:author="Claude" w:date="2026-10-08T20:38:00Z"/>
         </w:rPr>
       </w:pPr>
     </w:p>
-    <w:bookmarkEnd w:id="31"/>
+    <w:bookmarkEnd w:id="27"/>
     <w:p>
       <w:pPr>
         <w:pStyle w:val="Heading1"/>
@@ -21096,14 +21328,14 @@
       <w:pPr>
         <w:pStyle w:val="BodyText"/>
       </w:pPr>
-      <w:bookmarkStart w:id="39" w:name="_Hlk238630414"/>
+      <w:bookmarkStart w:id="35" w:name="_Hlk238630414"/>
       <w:r>
         <w:t xml:space="preserve">Zn biodegradation under physiological conditions becomes an oxygen-transport-controlled process after an initial reaction-controlled stage in which implant geometry governs the spatial evolution of material loss. The proposed 3D reaction-diffusion model closely reproduced independent 28-day immersion data (RMSE = 0.0159%) and, without further calibration, predicted approximately 6% mass loss </w:t>
       </w:r>
       <w:r>
         <w:t>for a six-crown stent</w:t>
       </w:r>
-      <w:del w:id="40" w:author="Claude" w:date="2026-10-08T20:38:00Z">
+      <w:del w:id="36" w:author="Claude" w:date="2026-10-08T20:38:00Z">
         <w:r>
           <w:delText>,</w:delText>
         </w:r>
@@ -21127,12 +21359,12 @@
       <w:r>
         <w:t xml:space="preserve"> oxygen availability as the primary driver of degradation, with corrosion-product accumulation progressively restricting transport and leading to diffusion-controlled behavior. Importantly, localized degradation emerged naturally from geometry-dependent transport phenomena, without imposing spatially varying corrosion kinetics. While curvature and inter-strut spacing produced only modest changes in cumulative mass loss, they strongly altered the distribution of material recession, demonstrating that global degradation metrics can obscure the localized thinning responsible for structural failure. These findings establish geometry as a critical determinant of biodegradable implant performance and provide a predictive framework for integrating degradation into the design and optimization of Zn stents and other biodegradable metallic implants, </w:t>
       </w:r>
-      <w:del w:id="9019" w:author="Claude" w:date="2026-10-08T23:18:06Z">
+      <w:del w:id="9019" w:author="Claude" w:date="2026-10-08T23:42:36Z">
         <w:r>
           <w:delText xml:space="preserve">enabling</w:delText>
         </w:r>
       </w:del>
-      <w:ins w:id="9018" w:author="Claude" w:date="2026-10-08T23:18:06Z">
+      <w:ins w:id="9018" w:author="Claude" w:date="2026-10-08T23:42:36Z">
         <w:r>
           <w:t xml:space="preserve">which could enable</w:t>
         </w:r>
@@ -21140,7 +21372,7 @@
       <w:r>
         <w:t xml:space="preserve"> structural performance to be considered throughout the implant lifetime rather than only at implantation.</w:t>
       </w:r>
-      <w:bookmarkEnd w:id="39"/>
+      <w:bookmarkEnd w:id="35"/>
     </w:p>
     <w:p>
       <w:pPr>
@@ -21174,7 +21406,15 @@
         <w:jc w:val="both"/>
       </w:pPr>
       <w:r>
-        <w:t xml:space="preserve">The authors acknowledge the use of Monash University’s High-Performance Computing (M3) facility and the Monash eResearch </w:t>
+        <w:t xml:space="preserve">The authors acknowledge the use of Monash University’s High-Performance Computing (M3) facility and the Monash </w:t>
+      </w:r>
+      <w:proofErr w:type="spellStart"/>
+      <w:r>
+        <w:t>eResearch</w:t>
+      </w:r>
+      <w:proofErr w:type="spellEnd"/>
+      <w:r>
+        <w:t xml:space="preserve"> </w:t>
       </w:r>
       <w:r>
         <w:t>Center</w:t>
@@ -21279,12 +21519,21 @@
       <w:r>
         <w:t xml:space="preserve"> Data curation, Investigation, Writing – original draft. </w:t>
       </w:r>
-      <w:r>
-        <w:rPr>
-          <w:b/>
-          <w:bCs/>
-        </w:rPr>
-        <w:t>Aijun Huang:</w:t>
+      <w:proofErr w:type="spellStart"/>
+      <w:r>
+        <w:rPr>
+          <w:b/>
+          <w:bCs/>
+        </w:rPr>
+        <w:t>Aijun</w:t>
+      </w:r>
+      <w:proofErr w:type="spellEnd"/>
+      <w:r>
+        <w:rPr>
+          <w:b/>
+          <w:bCs/>
+        </w:rPr>
+        <w:t xml:space="preserve"> Huang:</w:t>
       </w:r>
       <w:r>
         <w:t xml:space="preserve"> Conceptualization, Funding acquisition, Project administration, Supervision. </w:t>
@@ -21302,12 +21551,21 @@
       <w:r>
         <w:t xml:space="preserve"> </w:t>
       </w:r>
-      <w:r>
-        <w:rPr>
-          <w:b/>
-          <w:bCs/>
-        </w:rPr>
-        <w:t>Yuman Zhu:</w:t>
+      <w:proofErr w:type="spellStart"/>
+      <w:r>
+        <w:rPr>
+          <w:b/>
+          <w:bCs/>
+        </w:rPr>
+        <w:t>Yuman</w:t>
+      </w:r>
+      <w:proofErr w:type="spellEnd"/>
+      <w:r>
+        <w:rPr>
+          <w:b/>
+          <w:bCs/>
+        </w:rPr>
+        <w:t xml:space="preserve"> Zhu:</w:t>
       </w:r>
       <w:r>
         <w:t xml:space="preserve"> Conceptualization, Supervision, Writing – review &amp; editing.</w:t>
@@ -25156,12 +25414,6 @@
 </file>
 
 <file path=customXml/item1.xml><?xml version="1.0" encoding="utf-8"?>
-<ControlsStorage xmlns="urn:schemas-microsoft-com.VSTO2008Demos.ControlsStorage">
-  <Controls>AAEAAAD/////AQAAAAAAAAAMAgAAAEVDaGVtNFdvcmQuQ29yZSwgVmVyc2lvbj0xLjAuMC4wLCBDdWx0dXJlPW5ldXRyYWwsIFB1YmxpY0tleVRva2VuPW51bGwHAQAAAAABAAAAAAAAAAQgQ2hlbTRXb3JkLkNvcmUuQ29udHJvbFByb3BlcnRpZXMCAAAACw==</Controls>
-</ControlsStorage>
-</file>
-
-<file path=customXml/item2.xml><?xml version="1.0" encoding="utf-8"?>
 <ct:contentTypeSchema xmlns:ct="http://schemas.microsoft.com/office/2006/metadata/contentType" xmlns:ma="http://schemas.microsoft.com/office/2006/metadata/properties/metaAttributes" ct:_="" ma:_="" ma:contentTypeName="Dokument" ma:contentTypeID="0x01010070446C3525B3CB46BD92ABA5C2617223" ma:contentTypeVersion="12" ma:contentTypeDescription="Ein neues Dokument erstellen." ma:contentTypeScope="" ma:versionID="ace6bbd061d3e3241e07436f437a906c">
   <xsd:schema xmlns:xsd="http://www.w3.org/2001/XMLSchema" xmlns:xs="http://www.w3.org/2001/XMLSchema" xmlns:p="http://schemas.microsoft.com/office/2006/metadata/properties" xmlns:ns2="981f2fdf-0e4d-4708-9882-12f25bf7d4fe" xmlns:ns3="4fe7dd48-639f-4daa-8770-f50527565b0b" targetNamespace="http://schemas.microsoft.com/office/2006/metadata/properties" ma:root="true" ma:fieldsID="645148a839964f4ba651d3ea90aa0208" ns2:_="" ns3:_="">
     <xsd:import namespace="981f2fdf-0e4d-4708-9882-12f25bf7d4fe"/>
@@ -25378,17 +25630,13 @@
 </ct:contentTypeSchema>
 </file>
 
-<file path=customXml/item3.xml><?xml version="1.0" encoding="utf-8"?>
-<p:properties xmlns:p="http://schemas.microsoft.com/office/2006/metadata/properties" xmlns:xsi="http://www.w3.org/2001/XMLSchema-instance" xmlns:pc="http://schemas.microsoft.com/office/infopath/2007/PartnerControls">
-  <documentManagement/>
-</p:properties>
+<file path=customXml/item2.xml><?xml version="1.0" encoding="utf-8"?>
+<ControlsStorage xmlns="urn:schemas-microsoft-com.VSTO2008Demos.ControlsStorage">
+  <Controls>AAEAAAD/////AQAAAAAAAAAMAgAAAEVDaGVtNFdvcmQuQ29yZSwgVmVyc2lvbj0xLjAuMC4wLCBDdWx0dXJlPW5ldXRyYWwsIFB1YmxpY0tleVRva2VuPW51bGwHAQAAAAABAAAAAAAAAAQgQ2hlbTRXb3JkLkNvcmUuQ29udHJvbFByb3BlcnRpZXMCAAAACw==</Controls>
+</ControlsStorage>
 </file>
 
-<file path=customXml/item4.xml><?xml version="1.0" encoding="utf-8"?>
-<b:Sources xmlns:b="http://schemas.openxmlformats.org/officeDocument/2006/bibliography" xmlns="http://schemas.openxmlformats.org/officeDocument/2006/bibliography" SelectedStyle="\APASixthEditionOfficeOnline.xsl" StyleName="APA" Version="6"/>
-</file>
-
-<file path=customXml/item5.xml><?xml version="1.0" encoding="utf-8"?>
+<file path=customXml/item3.xml><?xml version="1.0" encoding="utf-8"?>
 <?mso-contentType ?>
 <FormTemplates xmlns="http://schemas.microsoft.com/sharepoint/v3/contenttype/forms">
   <Display>DocumentLibraryForm</Display>
@@ -25397,15 +25645,17 @@
 </FormTemplates>
 </file>
 
-<file path=customXml/itemProps1.xml><?xml version="1.0" encoding="utf-8"?>
-<ds:datastoreItem xmlns:ds="http://schemas.openxmlformats.org/officeDocument/2006/customXml" ds:itemID="{E3F19EBF-8207-4BE7-AD18-240ED1895C11}">
-  <ds:schemaRefs>
-    <ds:schemaRef ds:uri="urn:schemas-microsoft-com.VSTO2008Demos.ControlsStorage"/>
-  </ds:schemaRefs>
-</ds:datastoreItem>
+<file path=customXml/item4.xml><?xml version="1.0" encoding="utf-8"?>
+<b:Sources xmlns:b="http://schemas.openxmlformats.org/officeDocument/2006/bibliography" xmlns="http://schemas.openxmlformats.org/officeDocument/2006/bibliography" SelectedStyle="\APASixthEditionOfficeOnline.xsl" StyleName="APA" Version="6"/>
 </file>
 
-<file path=customXml/itemProps2.xml><?xml version="1.0" encoding="utf-8"?>
+<file path=customXml/item5.xml><?xml version="1.0" encoding="utf-8"?>
+<p:properties xmlns:p="http://schemas.microsoft.com/office/2006/metadata/properties" xmlns:xsi="http://www.w3.org/2001/XMLSchema-instance" xmlns:pc="http://schemas.microsoft.com/office/infopath/2007/PartnerControls">
+  <documentManagement/>
+</p:properties>
+</file>
+
+<file path=customXml/itemProps1.xml><?xml version="1.0" encoding="utf-8"?>
 <ds:datastoreItem xmlns:ds="http://schemas.openxmlformats.org/officeDocument/2006/customXml" ds:itemID="{C86C925C-E763-4769-9959-2FEDA6D7CE8A}">
   <ds:schemaRefs>
     <ds:schemaRef ds:uri="http://schemas.microsoft.com/office/2006/metadata/contentType"/>
@@ -25424,11 +25674,18 @@
 </ds:datastoreItem>
 </file>
 
+<file path=customXml/itemProps2.xml><?xml version="1.0" encoding="utf-8"?>
+<ds:datastoreItem xmlns:ds="http://schemas.openxmlformats.org/officeDocument/2006/customXml" ds:itemID="{E3F19EBF-8207-4BE7-AD18-240ED1895C11}">
+  <ds:schemaRefs>
+    <ds:schemaRef ds:uri="urn:schemas-microsoft-com.VSTO2008Demos.ControlsStorage"/>
+  </ds:schemaRefs>
+</ds:datastoreItem>
+</file>
+
 <file path=customXml/itemProps3.xml><?xml version="1.0" encoding="utf-8"?>
-<ds:datastoreItem xmlns:ds="http://schemas.openxmlformats.org/officeDocument/2006/customXml" ds:itemID="{96D19C85-73BE-4F5D-979F-58BFDE5BBE12}">
+<ds:datastoreItem xmlns:ds="http://schemas.openxmlformats.org/officeDocument/2006/customXml" ds:itemID="{75886F76-A765-4714-B899-7AC2DC4334A1}">
   <ds:schemaRefs>
-    <ds:schemaRef ds:uri="http://schemas.microsoft.com/office/2006/metadata/properties"/>
-    <ds:schemaRef ds:uri="http://schemas.microsoft.com/office/infopath/2007/PartnerControls"/>
+    <ds:schemaRef ds:uri="http://schemas.microsoft.com/sharepoint/v3/contenttype/forms"/>
   </ds:schemaRefs>
 </ds:datastoreItem>
 </file>
@@ -25442,9 +25699,10 @@
 </file>
 
 <file path=customXml/itemProps5.xml><?xml version="1.0" encoding="utf-8"?>
-<ds:datastoreItem xmlns:ds="http://schemas.openxmlformats.org/officeDocument/2006/customXml" ds:itemID="{75886F76-A765-4714-B899-7AC2DC4334A1}">
+<ds:datastoreItem xmlns:ds="http://schemas.openxmlformats.org/officeDocument/2006/customXml" ds:itemID="{96D19C85-73BE-4F5D-979F-58BFDE5BBE12}">
   <ds:schemaRefs>
-    <ds:schemaRef ds:uri="http://schemas.microsoft.com/sharepoint/v3/contenttype/forms"/>
+    <ds:schemaRef ds:uri="http://schemas.microsoft.com/office/2006/metadata/properties"/>
+    <ds:schemaRef ds:uri="http://schemas.microsoft.com/office/infopath/2007/PartnerControls"/>
   </ds:schemaRefs>
 </ds:datastoreItem>
 </file>
</xml_diff>

<commit_message>
k_d units mm^6 g^-2 h^-1 (mass-based Cl in Eq. 11), ranges converted, units table, workbook, B1.3
</commit_message>
<xml_diff>
--- a/deliver/Manuscript_tracked.docx
+++ b/deliver/Manuscript_tracked.docx
@@ -7324,13 +7324,13 @@
           <m:num>
             <m:r>
               <w:rPr>
-                <w:ins w:id="20216" w:author="Claude" w:date="2026-10-09T01:35:33Z"/>
+                <w:ins w:id="20001" w:author="Claude" w:date="2026-10-09T02:09:02Z"/>
               </w:rPr>
               <m:t xml:space="preserve">∂</m:t>
             </m:r>
             <m:r>
               <w:rPr>
-                <w:ins w:id="20217" w:author="Claude" w:date="2026-10-09T01:35:33Z"/>
+                <w:ins w:id="20002" w:author="Claude" w:date="2026-10-09T02:09:02Z"/>
               </w:rPr>
               <m:t xml:space="preserve">F</m:t>
             </m:r>
@@ -7338,13 +7338,13 @@
           <m:den>
             <m:r>
               <w:rPr>
-                <w:ins w:id="20218" w:author="Claude" w:date="2026-10-09T01:35:33Z"/>
+                <w:ins w:id="20003" w:author="Claude" w:date="2026-10-09T02:09:02Z"/>
               </w:rPr>
               <m:t xml:space="preserve">∂</m:t>
             </m:r>
             <m:r>
               <w:rPr>
-                <w:ins w:id="20219" w:author="Claude" w:date="2026-10-09T01:35:33Z"/>
+                <w:ins w:id="20004" w:author="Claude" w:date="2026-10-09T02:09:02Z"/>
               </w:rPr>
               <m:t xml:space="preserve">t</m:t>
             </m:r>
@@ -7352,7 +7352,7 @@
         </m:f>
         <m:r>
           <w:rPr>
-            <w:ins w:id="20220" w:author="Claude" w:date="2026-10-09T01:35:33Z"/>
+            <w:ins w:id="20005" w:author="Claude" w:date="2026-10-09T02:09:02Z"/>
           </w:rPr>
           <m:t xml:space="preserve">=</m:t>
         </m:r>
@@ -7360,7 +7360,7 @@
           <m:e>
             <m:r>
               <w:rPr>
-                <w:ins w:id="20221" w:author="Claude" w:date="2026-10-09T01:35:33Z"/>
+                <w:ins w:id="20006" w:author="Claude" w:date="2026-10-09T02:09:02Z"/>
               </w:rPr>
               <m:t xml:space="preserve">k</m:t>
             </m:r>
@@ -7368,7 +7368,7 @@
           <m:sub>
             <m:r>
               <w:rPr>
-                <w:ins w:id="20222" w:author="Claude" w:date="2026-10-09T01:35:33Z"/>
+                <w:ins w:id="20007" w:author="Claude" w:date="2026-10-09T02:09:02Z"/>
               </w:rPr>
               <m:t xml:space="preserve">f</m:t>
             </m:r>
@@ -7378,7 +7378,7 @@
           <m:e>
             <m:r>
               <w:rPr>
-                <w:ins w:id="20223" w:author="Claude" w:date="2026-10-09T01:35:33Z"/>
+                <w:ins w:id="20008" w:author="Claude" w:date="2026-10-09T02:09:02Z"/>
               </w:rPr>
               <m:t xml:space="preserve">C</m:t>
             </m:r>
@@ -7386,7 +7386,7 @@
           <m:sub>
             <m:r>
               <w:rPr>
-                <w:ins w:id="20224" w:author="Claude" w:date="2026-10-09T01:35:33Z"/>
+                <w:ins w:id="20009" w:author="Claude" w:date="2026-10-09T02:09:02Z"/>
               </w:rPr>
               <m:t xml:space="preserve">Zn</m:t>
             </m:r>
@@ -7394,7 +7394,7 @@
         </m:sSub>
         <m:r>
           <w:rPr>
-            <w:ins w:id="20225" w:author="Claude" w:date="2026-10-09T01:35:33Z"/>
+            <w:ins w:id="20010" w:author="Claude" w:date="2026-10-09T02:09:02Z"/>
           </w:rPr>
           <m:t xml:space="preserve">(1−</m:t>
         </m:r>
@@ -7402,7 +7402,7 @@
           <m:num>
             <m:r>
               <w:rPr>
-                <w:ins w:id="20226" w:author="Claude" w:date="2026-10-09T01:35:33Z"/>
+                <w:ins w:id="20011" w:author="Claude" w:date="2026-10-09T02:09:02Z"/>
               </w:rPr>
               <m:t xml:space="preserve">F</m:t>
             </m:r>
@@ -7412,7 +7412,7 @@
               <m:e>
                 <m:r>
                   <w:rPr>
-                    <w:ins w:id="20227" w:author="Claude" w:date="2026-10-09T01:35:33Z"/>
+                    <w:ins w:id="20012" w:author="Claude" w:date="2026-10-09T02:09:02Z"/>
                   </w:rPr>
                   <m:t xml:space="preserve">F</m:t>
                 </m:r>
@@ -7420,7 +7420,7 @@
               <m:sub>
                 <m:r>
                   <w:rPr>
-                    <w:ins w:id="20228" w:author="Claude" w:date="2026-10-09T01:35:33Z"/>
+                    <w:ins w:id="20013" w:author="Claude" w:date="2026-10-09T02:09:02Z"/>
                   </w:rPr>
                   <m:t xml:space="preserve">max</m:t>
                 </m:r>
@@ -7430,7 +7430,7 @@
         </m:f>
         <m:r>
           <w:rPr>
-            <w:ins w:id="20229" w:author="Claude" w:date="2026-10-09T01:35:33Z"/>
+            <w:ins w:id="20014" w:author="Claude" w:date="2026-10-09T02:09:02Z"/>
           </w:rPr>
           <m:t xml:space="preserve">)−</m:t>
         </m:r>
@@ -7438,7 +7438,7 @@
           <m:e>
             <m:r>
               <w:rPr>
-                <w:ins w:id="20230" w:author="Claude" w:date="2026-10-09T01:35:33Z"/>
+                <w:ins w:id="20015" w:author="Claude" w:date="2026-10-09T02:09:02Z"/>
               </w:rPr>
               <m:t xml:space="preserve">k</m:t>
             </m:r>
@@ -7446,7 +7446,7 @@
           <m:sub>
             <m:r>
               <w:rPr>
-                <w:ins w:id="20231" w:author="Claude" w:date="2026-10-09T01:35:33Z"/>
+                <w:ins w:id="20016" w:author="Claude" w:date="2026-10-09T02:09:02Z"/>
               </w:rPr>
               <m:t xml:space="preserve">d</m:t>
             </m:r>
@@ -7454,89 +7454,35 @@
         </m:sSub>
         <m:r>
           <w:rPr>
-            <w:ins w:id="20232" w:author="Claude" w:date="2026-10-09T01:35:33Z"/>
+            <w:ins w:id="20017" w:author="Claude" w:date="2026-10-09T02:09:02Z"/>
           </w:rPr>
           <m:t xml:space="preserve">F</m:t>
         </m:r>
         <m:sSup>
           <m:e>
-            <m:r>
-              <w:rPr>
-                <w:ins w:id="20233" w:author="Claude" w:date="2026-10-09T01:35:33Z"/>
-              </w:rPr>
-              <m:t xml:space="preserve">(</m:t>
-            </m:r>
-            <m:f>
-              <m:num>
-                <m:sSup>
-                  <m:e>
-                    <m:r>
-                      <w:rPr>
-                        <w:ins w:id="20234" w:author="Claude" w:date="2026-10-09T01:35:33Z"/>
-                      </w:rPr>
-                      <m:t xml:space="preserve">10</m:t>
-                    </m:r>
-                  </m:e>
-                  <m:sup>
-                    <m:r>
-                      <w:rPr>
-                        <w:ins w:id="20235" w:author="Claude" w:date="2026-10-09T01:35:33Z"/>
-                      </w:rPr>
-                      <m:t xml:space="preserve">6</m:t>
-                    </m:r>
-                  </m:sup>
-                </m:sSup>
-                <m:sSub>
-                  <m:e>
-                    <m:r>
-                      <w:rPr>
-                        <w:ins w:id="20236" w:author="Claude" w:date="2026-10-09T01:35:33Z"/>
-                      </w:rPr>
-                      <m:t xml:space="preserve">C</m:t>
-                    </m:r>
-                  </m:e>
-                  <m:sub>
-                    <m:r>
-                      <w:rPr>
-                        <w:ins w:id="20237" w:author="Claude" w:date="2026-10-09T01:35:33Z"/>
-                      </w:rPr>
-                      <m:t xml:space="preserve">Cl</m:t>
-                    </m:r>
-                  </m:sub>
-                </m:sSub>
-              </m:num>
-              <m:den>
-                <m:sSub>
-                  <m:e>
-                    <m:r>
-                      <w:rPr>
-                        <w:ins w:id="20238" w:author="Claude" w:date="2026-10-09T01:35:33Z"/>
-                      </w:rPr>
-                      <m:t xml:space="preserve">M</m:t>
-                    </m:r>
-                  </m:e>
-                  <m:sub>
-                    <m:r>
-                      <w:rPr>
-                        <w:ins w:id="20239" w:author="Claude" w:date="2026-10-09T01:35:33Z"/>
-                      </w:rPr>
-                      <m:t xml:space="preserve">Cl</m:t>
-                    </m:r>
-                  </m:sub>
-                </m:sSub>
-              </m:den>
-            </m:f>
-            <m:r>
-              <w:rPr>
-                <w:ins w:id="20240" w:author="Claude" w:date="2026-10-09T01:35:33Z"/>
-              </w:rPr>
-              <m:t xml:space="preserve">)</m:t>
-            </m:r>
+            <m:sSub>
+              <m:e>
+                <m:r>
+                  <w:rPr>
+                    <w:ins w:id="20018" w:author="Claude" w:date="2026-10-09T02:09:02Z"/>
+                  </w:rPr>
+                  <m:t xml:space="preserve">C</m:t>
+                </m:r>
+              </m:e>
+              <m:sub>
+                <m:r>
+                  <w:rPr>
+                    <w:ins w:id="20019" w:author="Claude" w:date="2026-10-09T02:09:02Z"/>
+                  </w:rPr>
+                  <m:t xml:space="preserve">Cl</m:t>
+                </m:r>
+              </m:sub>
+            </m:sSub>
           </m:e>
           <m:sup>
             <m:r>
               <w:rPr>
-                <w:ins w:id="20241" w:author="Claude" w:date="2026-10-09T01:35:33Z"/>
+                <w:ins w:id="20020" w:author="Claude" w:date="2026-10-09T02:09:02Z"/>
               </w:rPr>
               <m:t xml:space="preserve">2</m:t>
             </m:r>
@@ -7648,7 +7594,7 @@
       </w:r>
       <w:ins w:id="9001" w:author="Claude" w:date="2026-10-09T01:35:33Z">
         <w:r>
-          <w:t xml:space="preserve">. Cl⁻ is converted to mol L⁻¹ inside this term, so k_d has units L² mol⁻² h⁻¹</w:t>
+          <w:t xml:space="preserve">. C_Cl is the Cl⁻ mass concentration, so k_d has units mm⁶ g⁻² h⁻¹</w:t>
         </w:r>
       </w:ins>
       <w:r>
@@ -17884,7 +17830,7 @@
                   <w:sz w:val="22"/>
                   <w:szCs w:val="22"/>
                 </w:rPr>
-                <w:t xml:space="preserve">0.01</w:t>
+                <w:t xml:space="preserve">8.0 × 10⁶</w:t>
               </w:r>
             </w:ins>
             <w:r>
@@ -17912,7 +17858,7 @@
                   <w:sz w:val="22"/>
                   <w:szCs w:val="22"/>
                 </w:rPr>
-                <w:t xml:space="preserve">10³</w:t>
+                <w:t xml:space="preserve">8.0 × 10¹¹</w:t>
               </w:r>
             </w:ins>
             <w:r>

</xml_diff>

<commit_message>
Restructure: narrative start of reaction-diffusion section; level set method section with velocity derivation
</commit_message>
<xml_diff>
--- a/deliver/Manuscript_tracked.docx
+++ b/deliver/Manuscript_tracked.docx
@@ -3217,6 +3217,19 @@
       <w:r>
         <w:t xml:space="preserve"> Model</w:t>
       </w:r>
+    </w:p>
+    <w:p>
+      <w:pPr>
+        <w:pStyle w:val="BodyText"/>
+        <w:rPr>
+          <w:ins w:id="20002" w:author="Claude" w:date="2026-10-09T02:10:29Z"/>
+        </w:rPr>
+      </w:pPr>
+      <w:ins w:id="20001" w:author="Claude" w:date="2026-10-09T02:10:29Z">
+        <w:r>
+          <w:t xml:space="preserve">To our knowledge, previous mechanistic biodegradation models generally determined interface motion from either a Stefan condition based on metal-ion transport or an interfacial reaction-rate expression, with transitions between controlling mechanisms imposed through rate-selection criteria. Since most mechanistic biodegradation models have been developed for Mg-based systems, oxygen has rarely been treated as a dynamically evolving species coupled to interface recession, species transport, and corrosion-product evolution. Therefore, such models have limited capability to predict how local oxygen availability influences Zn degradation kinetics or drives transitions between reaction-controlled and diffusion-controlled degradation. This limitation is particularly important for porous Zn structures, where experimental studies have shown that oxygen availability and transport strongly affect degradation behavior [12,13]. In the present framework, interface recession, oxygen consumption, Zn²⁺ release, and corrosion-product evolution are unified through a single oxygen-reduction flux arising from the reaction-diffusion system. Oxygen transport, reaction kinetics, and interface evolution are therefore intrinsically coupled, allowing the transition from reaction-controlled to diffusion-controlled degradation to emerge naturally from the governing equations and enabling quantitative prediction of oxygen-mediated degradation behavior.</w:t>
+        </w:r>
+      </w:ins>
     </w:p>
     <w:p>
       <w:pPr>
@@ -8293,192 +8306,245 @@
         <w:pStyle w:val="FirstParagraph"/>
         <w:ind w:firstLine="360"/>
         <w:rPr>
+          <w:del w:id="20074" w:author="Claude" w:date="2026-10-09T02:10:29Z"/>
           <w:rFonts w:cs="Times New Roman"/>
         </w:rPr>
       </w:pPr>
-      <w:r>
-        <w:rPr>
-          <w:rFonts w:cs="Times New Roman"/>
-        </w:rPr>
-        <w:t xml:space="preserve">The evolving metal-electrolyte interface is tracked using </w:t>
-      </w:r>
-      <w:r>
-        <w:rPr>
-          <w:rFonts w:cs="Times New Roman"/>
-        </w:rPr>
-        <w:t>the level set method</w:t>
-      </w:r>
-      <w:r>
-        <w:rPr>
-          <w:rFonts w:cs="Times New Roman"/>
-        </w:rPr>
-        <w:t>, in which a signed-distance function (</w:t>
-      </w:r>
+      <w:del w:id="20047" w:author="Claude" w:date="2026-10-09T02:10:29Z">
+        <w:r>
+          <w:rPr>
+            <w:rFonts w:cs="Times New Roman"/>
+          </w:rPr>
+          <w:delText xml:space="preserve">The evolving metal-electrolyte interface is tracked using </w:delText>
+        </w:r>
+      </w:del>
+      <w:del w:id="20048" w:author="Claude" w:date="2026-10-09T02:10:29Z">
+        <w:r>
+          <w:rPr>
+            <w:rFonts w:cs="Times New Roman"/>
+          </w:rPr>
+          <w:delText xml:space="preserve">the level set method</w:delText>
+        </w:r>
+      </w:del>
+      <w:del w:id="20049" w:author="Claude" w:date="2026-10-09T02:10:29Z">
+        <w:r>
+          <w:rPr>
+            <w:rFonts w:cs="Times New Roman"/>
+          </w:rPr>
+          <w:delText xml:space="preserve">, in which a signed-distance function (</w:delText>
+        </w:r>
+      </w:del>
       <m:oMath>
         <m:r>
           <w:rPr>
+            <w:del w:id="20072" w:author="Claude" w:date="2026-10-09T02:10:29Z"/>
             <w:rFonts w:ascii="Cambria Math" w:hAnsi="Cambria Math" w:cs="Times New Roman"/>
           </w:rPr>
           <m:t>ϕ)</m:t>
         </m:r>
       </m:oMath>
-      <w:r>
-        <w:rPr>
-          <w:rFonts w:cs="Times New Roman"/>
-        </w:rPr>
-        <w:t xml:space="preserve"> </w:t>
-      </w:r>
+      <w:del w:id="20050" w:author="Claude" w:date="2026-10-09T02:10:29Z">
+        <w:r>
+          <w:rPr>
+            <w:rFonts w:cs="Times New Roman"/>
+          </w:rPr>
+          <w:delText xml:space="preserve"> </w:delText>
+        </w:r>
+      </w:del>
       <w:bookmarkStart w:id="6" w:name="_Hlk237963744"/>
-      <w:r>
-        <w:rPr>
-          <w:rFonts w:cs="Times New Roman"/>
-        </w:rPr>
-        <w:t>implicitly defines the interface as the zero-level set separating the metal and electrolyte domains,</w:t>
-      </w:r>
+      <w:del w:id="20051" w:author="Claude" w:date="2026-10-09T02:10:29Z">
+        <w:r>
+          <w:rPr>
+            <w:rFonts w:cs="Times New Roman"/>
+          </w:rPr>
+          <w:delText xml:space="preserve">implicitly defines the interface as the zero-level set separating the metal and electrolyte domains,</w:delText>
+        </w:r>
+      </w:del>
       <w:bookmarkEnd w:id="6"/>
-      <w:r>
-        <w:rPr>
-          <w:rFonts w:cs="Times New Roman"/>
-        </w:rPr>
-        <w:t xml:space="preserve"> as </w:t>
-      </w:r>
-      <w:r>
-        <w:rPr>
-          <w:rFonts w:cs="Times New Roman"/>
-        </w:rPr>
-        <w:t>shown</w:t>
-      </w:r>
-      <w:r>
-        <w:rPr>
-          <w:rFonts w:cs="Times New Roman"/>
-        </w:rPr>
-        <w:t xml:space="preserve"> in </w:t>
-      </w:r>
-      <w:r>
-        <w:rPr>
-          <w:rFonts w:cs="Times New Roman"/>
-          <w:b/>
-          <w:bCs/>
-        </w:rPr>
-        <w:fldChar w:fldCharType="begin"/>
-      </w:r>
-      <w:r>
-        <w:rPr>
-          <w:rFonts w:cs="Times New Roman"/>
-          <w:b/>
-          <w:bCs/>
-        </w:rPr>
-        <w:instrText xml:space="preserve"> REF _Ref238652979 \h  \* MERGEFORMAT </w:instrText>
-      </w:r>
-      <w:r>
-        <w:rPr>
-          <w:rFonts w:cs="Times New Roman"/>
-          <w:b/>
-          <w:bCs/>
-        </w:rPr>
-      </w:r>
-      <w:r>
-        <w:rPr>
-          <w:rFonts w:cs="Times New Roman"/>
-          <w:b/>
-          <w:bCs/>
-        </w:rPr>
-        <w:fldChar w:fldCharType="separate"/>
-      </w:r>
-      <w:r>
-        <w:rPr>
-          <w:b/>
-          <w:bCs/>
-        </w:rPr>
-        <w:t xml:space="preserve">Figure </w:t>
-      </w:r>
-      <w:r>
-        <w:rPr>
-          <w:b/>
-          <w:bCs/>
-          <w:noProof/>
-        </w:rPr>
-        <w:t>2</w:t>
-      </w:r>
-      <w:r>
-        <w:rPr>
-          <w:rFonts w:cs="Times New Roman"/>
-          <w:b/>
-          <w:bCs/>
-        </w:rPr>
-        <w:fldChar w:fldCharType="end"/>
-      </w:r>
-      <w:r>
-        <w:rPr>
-          <w:rFonts w:cs="Times New Roman"/>
-          <w:b/>
-          <w:bCs/>
-        </w:rPr>
-        <w:t>c</w:t>
-      </w:r>
-      <w:r>
-        <w:rPr>
-          <w:rFonts w:cs="Times New Roman"/>
-        </w:rPr>
-        <w:t xml:space="preserve">. </w:t>
-      </w:r>
-      <w:r>
-        <w:rPr>
-          <w:rFonts w:cs="Times New Roman"/>
-        </w:rPr>
-        <w:t xml:space="preserve">Corrosion-driven interface motion is represented by the evolution of </w:t>
-      </w:r>
+      <w:del w:id="20052" w:author="Claude" w:date="2026-10-09T02:10:29Z">
+        <w:r>
+          <w:rPr>
+            <w:rFonts w:cs="Times New Roman"/>
+          </w:rPr>
+          <w:delText xml:space="preserve"> as </w:delText>
+        </w:r>
+      </w:del>
+      <w:del w:id="20053" w:author="Claude" w:date="2026-10-09T02:10:29Z">
+        <w:r>
+          <w:rPr>
+            <w:rFonts w:cs="Times New Roman"/>
+          </w:rPr>
+          <w:delText xml:space="preserve">shown</w:delText>
+        </w:r>
+      </w:del>
+      <w:del w:id="20054" w:author="Claude" w:date="2026-10-09T02:10:29Z">
+        <w:r>
+          <w:rPr>
+            <w:rFonts w:cs="Times New Roman"/>
+          </w:rPr>
+          <w:delText xml:space="preserve"> in </w:delText>
+        </w:r>
+      </w:del>
+      <w:del w:id="20055" w:author="Claude" w:date="2026-10-09T02:10:29Z">
+        <w:r>
+          <w:rPr>
+            <w:rFonts w:cs="Times New Roman"/>
+            <w:b/>
+            <w:bCs/>
+          </w:rPr>
+          <w:fldChar w:fldCharType="begin"/>
+        </w:r>
+      </w:del>
+      <w:del w:id="20056" w:author="Claude" w:date="2026-10-09T02:10:29Z">
+        <w:r>
+          <w:rPr>
+            <w:rFonts w:cs="Times New Roman"/>
+            <w:b/>
+            <w:bCs/>
+          </w:rPr>
+          <w:instrText xml:space="preserve"> REF _Ref238652979 \h  \* MERGEFORMAT </w:instrText>
+        </w:r>
+      </w:del>
+      <w:del w:id="20057" w:author="Claude" w:date="2026-10-09T02:10:29Z">
+        <w:r>
+          <w:rPr>
+            <w:rFonts w:cs="Times New Roman"/>
+            <w:b/>
+            <w:bCs/>
+          </w:rPr>
+        </w:r>
+      </w:del>
+      <w:del w:id="20058" w:author="Claude" w:date="2026-10-09T02:10:29Z">
+        <w:r>
+          <w:rPr>
+            <w:rFonts w:cs="Times New Roman"/>
+            <w:b/>
+            <w:bCs/>
+          </w:rPr>
+          <w:fldChar w:fldCharType="separate"/>
+        </w:r>
+      </w:del>
+      <w:del w:id="20059" w:author="Claude" w:date="2026-10-09T02:10:29Z">
+        <w:r>
+          <w:rPr>
+            <w:b/>
+            <w:bCs/>
+          </w:rPr>
+          <w:delText xml:space="preserve">Figure </w:delText>
+        </w:r>
+      </w:del>
+      <w:del w:id="20060" w:author="Claude" w:date="2026-10-09T02:10:29Z">
+        <w:r>
+          <w:rPr>
+            <w:b/>
+            <w:bCs/>
+            <w:noProof/>
+          </w:rPr>
+          <w:delText xml:space="preserve">2</w:delText>
+        </w:r>
+      </w:del>
+      <w:del w:id="20061" w:author="Claude" w:date="2026-10-09T02:10:29Z">
+        <w:r>
+          <w:rPr>
+            <w:rFonts w:cs="Times New Roman"/>
+            <w:b/>
+            <w:bCs/>
+          </w:rPr>
+          <w:fldChar w:fldCharType="end"/>
+        </w:r>
+      </w:del>
+      <w:del w:id="20062" w:author="Claude" w:date="2026-10-09T02:10:29Z">
+        <w:r>
+          <w:rPr>
+            <w:rFonts w:cs="Times New Roman"/>
+            <w:b/>
+            <w:bCs/>
+          </w:rPr>
+          <w:delText xml:space="preserve">c</w:delText>
+        </w:r>
+      </w:del>
+      <w:del w:id="20063" w:author="Claude" w:date="2026-10-09T02:10:29Z">
+        <w:r>
+          <w:rPr>
+            <w:rFonts w:cs="Times New Roman"/>
+          </w:rPr>
+          <w:delText xml:space="preserve">. </w:delText>
+        </w:r>
+      </w:del>
+      <w:del w:id="20064" w:author="Claude" w:date="2026-10-09T02:10:29Z">
+        <w:r>
+          <w:rPr>
+            <w:rFonts w:cs="Times New Roman"/>
+          </w:rPr>
+          <w:delText xml:space="preserve">Corrosion-driven interface motion is represented by the evolution of </w:delText>
+        </w:r>
+      </w:del>
       <m:oMath>
         <m:r>
           <w:rPr>
+            <w:del w:id="20073" w:author="Claude" w:date="2026-10-09T02:10:29Z"/>
             <w:rFonts w:ascii="Cambria Math" w:hAnsi="Cambria Math" w:cs="Times New Roman"/>
           </w:rPr>
           <m:t>ϕ</m:t>
         </m:r>
       </m:oMath>
-      <w:r>
-        <w:rPr>
-          <w:rFonts w:cs="Times New Roman"/>
-        </w:rPr>
-        <w:t xml:space="preserve"> according to the Hamilton-Jacobi equation </w:t>
-      </w:r>
-      <w:r>
-        <w:rPr>
-          <w:rFonts w:cs="Times New Roman"/>
-        </w:rPr>
-        <w:fldChar w:fldCharType="begin"/>
-      </w:r>
-      <w:r>
-        <w:rPr>
-          <w:rFonts w:cs="Times New Roman"/>
-        </w:rPr>
-        <w:instrText xml:space="preserve"> ADDIN ZOTERO_ITEM CSL_CITATION {"citationID":"r7domCi5","properties":{"unsorted":false,"formattedCitation":"\\super [31]\\nosupersub{}","plainCitation":"[31]","noteIndex":0},"citationItems":[{"id":1729,"uris":["http://zotero.org/users/16939557/items/TDPP5UDX"],"itemData":{"id":1729,"type":"article-journal","citation-key":"wilderAdaptiveLevelSet2015","container-title":"Journal of Engineering Mathematics","DOI":"10.1007/s10665-014-9732-3","ISSN":"0022-0833, 1573-2703","issue":"1","journalAbbreviation":"J Eng Math","language":"en","page":"121-142","source":"DOI.org (Crossref)","title":"An adaptive level set approach for modeling damage due to galvanic corrosion","volume":"91","author":[{"family":"Wilder","given":"Joseph W."},{"family":"Clemons","given":"Curtis"},{"family":"Golovaty","given":"Dmitry"},{"family":"Kreider","given":"Kevin L."},{"family":"Young","given":"Gerald W."},{"family":"Lillard","given":"R. Scott"}],"issued":{"date-parts":[["2015",4]]}}}],"schema":"https://github.com/citation-style-language/schema/raw/master/csl-citation.json"} </w:instrText>
-      </w:r>
-      <w:r>
-        <w:rPr>
-          <w:rFonts w:cs="Times New Roman"/>
-        </w:rPr>
-        <w:fldChar w:fldCharType="separate"/>
-      </w:r>
-      <w:r>
-        <w:rPr>
-          <w:rFonts w:cs="Times New Roman"/>
-          <w:vertAlign w:val="superscript"/>
-        </w:rPr>
-        <w:t>[31]</w:t>
-      </w:r>
-      <w:r>
-        <w:rPr>
-          <w:rFonts w:cs="Times New Roman"/>
-        </w:rPr>
-        <w:fldChar w:fldCharType="end"/>
-      </w:r>
-      <w:r>
-        <w:rPr>
-          <w:rFonts w:cs="Times New Roman"/>
-        </w:rPr>
-        <w:t>:</w:t>
-      </w:r>
+      <w:del w:id="20065" w:author="Claude" w:date="2026-10-09T02:10:29Z">
+        <w:r>
+          <w:rPr>
+            <w:rFonts w:cs="Times New Roman"/>
+          </w:rPr>
+          <w:delText xml:space="preserve"> according to the Hamilton-Jacobi equation </w:delText>
+        </w:r>
+      </w:del>
+      <w:del w:id="20066" w:author="Claude" w:date="2026-10-09T02:10:29Z">
+        <w:r>
+          <w:rPr>
+            <w:rFonts w:cs="Times New Roman"/>
+          </w:rPr>
+          <w:fldChar w:fldCharType="begin"/>
+        </w:r>
+      </w:del>
+      <w:del w:id="20067" w:author="Claude" w:date="2026-10-09T02:10:29Z">
+        <w:r>
+          <w:rPr>
+            <w:rFonts w:cs="Times New Roman"/>
+          </w:rPr>
+          <w:instrText xml:space="preserve"> ADDIN ZOTERO_ITEM CSL_CITATION {"citationID":"r7domCi5","properties":{"unsorted":false,"formattedCitation":"\\super [31]\\nosupersub{}","plainCitation":"[31]","noteIndex":0},"citationItems":[{"id":1729,"uris":["http://zotero.org/users/16939557/items/TDPP5UDX"],"itemData":{"id":1729,"type":"article-journal","citation-key":"wilderAdaptiveLevelSet2015","container-title":"Journal of Engineering Mathematics","DOI":"10.1007/s10665-014-9732-3","ISSN":"0022-0833, 1573-2703","issue":"1","journalAbbreviation":"J Eng Math","language":"en","page":"121-142","source":"DOI.org (Crossref)","title":"An adaptive level set approach for modeling damage due to galvanic corrosion","volume":"91","author":[{"family":"Wilder","given":"Joseph W."},{"family":"Clemons","given":"Curtis"},{"family":"Golovaty","given":"Dmitry"},{"family":"Kreider","given":"Kevin L."},{"family":"Young","given":"Gerald W."},{"family":"Lillard","given":"R. Scott"}],"issued":{"date-parts":[["2015",4]]}}}],"schema":"https://github.com/citation-style-language/schema/raw/master/csl-citation.json"} </w:instrText>
+        </w:r>
+      </w:del>
+      <w:del w:id="20068" w:author="Claude" w:date="2026-10-09T02:10:29Z">
+        <w:r>
+          <w:rPr>
+            <w:rFonts w:cs="Times New Roman"/>
+          </w:rPr>
+          <w:fldChar w:fldCharType="separate"/>
+        </w:r>
+      </w:del>
+      <w:del w:id="20069" w:author="Claude" w:date="2026-10-09T02:10:29Z">
+        <w:r>
+          <w:rPr>
+            <w:rFonts w:cs="Times New Roman"/>
+            <w:vertAlign w:val="superscript"/>
+          </w:rPr>
+          <w:delText xml:space="preserve">[31]</w:delText>
+        </w:r>
+      </w:del>
+      <w:del w:id="20070" w:author="Claude" w:date="2026-10-09T02:10:29Z">
+        <w:r>
+          <w:rPr>
+            <w:rFonts w:cs="Times New Roman"/>
+          </w:rPr>
+          <w:fldChar w:fldCharType="end"/>
+        </w:r>
+      </w:del>
+      <w:del w:id="20071" w:author="Claude" w:date="2026-10-09T02:10:29Z">
+        <w:r>
+          <w:rPr>
+            <w:rFonts w:cs="Times New Roman"/>
+          </w:rPr>
+          <w:delText xml:space="preserve">:</w:delText>
+        </w:r>
+      </w:del>
     </w:p>
     <w:p>
       <w:pPr>
@@ -8489,6 +8555,7 @@
         <w:spacing w:before="240" w:after="240"/>
         <w:ind w:firstLine="0"/>
         <w:rPr>
+          <w:del w:id="20090" w:author="Claude" w:date="2026-10-09T02:10:29Z"/>
           <w:rFonts w:cs="Times New Roman"/>
         </w:rPr>
       </w:pPr>
@@ -8507,12 +8574,14 @@
                 <m:sty m:val="p"/>
               </m:rPr>
               <w:rPr>
+                <w:del w:id="20078" w:author="Claude" w:date="2026-10-09T02:10:29Z"/>
                 <w:rFonts w:ascii="Cambria Math" w:hAnsi="Cambria Math" w:cs="Times New Roman"/>
               </w:rPr>
               <m:t>∂</m:t>
             </m:r>
             <m:r>
               <w:rPr>
+                <w:del w:id="20079" w:author="Claude" w:date="2026-10-09T02:10:29Z"/>
                 <w:rFonts w:ascii="Cambria Math" w:hAnsi="Cambria Math" w:cs="Times New Roman"/>
               </w:rPr>
               <m:t>ϕ</m:t>
@@ -8524,12 +8593,14 @@
                 <m:sty m:val="p"/>
               </m:rPr>
               <w:rPr>
+                <w:del w:id="20080" w:author="Claude" w:date="2026-10-09T02:10:29Z"/>
                 <w:rFonts w:ascii="Cambria Math" w:hAnsi="Cambria Math" w:cs="Times New Roman"/>
               </w:rPr>
               <m:t>∂</m:t>
             </m:r>
             <m:r>
               <w:rPr>
+                <w:del w:id="20081" w:author="Claude" w:date="2026-10-09T02:10:29Z"/>
                 <w:rFonts w:ascii="Cambria Math" w:hAnsi="Cambria Math" w:cs="Times New Roman"/>
               </w:rPr>
               <m:t>t</m:t>
@@ -8541,6 +8612,7 @@
             <m:sty m:val="p"/>
           </m:rPr>
           <w:rPr>
+            <w:del w:id="20082" w:author="Claude" w:date="2026-10-09T02:10:29Z"/>
             <w:rFonts w:ascii="Cambria Math" w:hAnsi="Cambria Math" w:cs="Times New Roman"/>
           </w:rPr>
           <m:t>+</m:t>
@@ -8556,6 +8628,7 @@
           <m:e>
             <m:r>
               <w:rPr>
+                <w:del w:id="20083" w:author="Claude" w:date="2026-10-09T02:10:29Z"/>
                 <w:rFonts w:ascii="Cambria Math" w:hAnsi="Cambria Math" w:cs="Times New Roman"/>
               </w:rPr>
               <m:t>v</m:t>
@@ -8564,6 +8637,7 @@
           <m:sub>
             <m:r>
               <w:rPr>
+                <w:del w:id="20084" w:author="Claude" w:date="2026-10-09T02:10:29Z"/>
                 <w:rFonts w:ascii="Cambria Math" w:hAnsi="Cambria Math" w:cs="Times New Roman"/>
               </w:rPr>
               <m:t>n</m:t>
@@ -8572,6 +8646,7 @@
         </m:sSub>
         <m:r>
           <w:rPr>
+            <w:del w:id="20085" w:author="Claude" w:date="2026-10-09T02:10:29Z"/>
             <w:rFonts w:ascii="Cambria Math" w:hAnsi="Cambria Math" w:cs="Times New Roman"/>
           </w:rPr>
           <m:t> </m:t>
@@ -8581,12 +8656,14 @@
             <m:sty m:val="p"/>
           </m:rPr>
           <w:rPr>
+            <w:del w:id="20086" w:author="Claude" w:date="2026-10-09T02:10:29Z"/>
             <w:rFonts w:ascii="Cambria Math" w:hAnsi="Cambria Math" w:cs="Times New Roman"/>
           </w:rPr>
           <m:t>|∇</m:t>
         </m:r>
         <m:r>
           <w:rPr>
+            <w:del w:id="20087" w:author="Claude" w:date="2026-10-09T02:10:29Z"/>
             <w:rFonts w:ascii="Cambria Math" w:hAnsi="Cambria Math" w:cs="Times New Roman"/>
           </w:rPr>
           <m:t>ϕ</m:t>
@@ -8596,51 +8673,62 @@
             <m:sty m:val="p"/>
           </m:rPr>
           <w:rPr>
+            <w:del w:id="20088" w:author="Claude" w:date="2026-10-09T02:10:29Z"/>
             <w:rFonts w:ascii="Cambria Math" w:hAnsi="Cambria Math" w:cs="Times New Roman"/>
           </w:rPr>
           <m:t>|=</m:t>
         </m:r>
         <m:r>
           <w:rPr>
+            <w:del w:id="20089" w:author="Claude" w:date="2026-10-09T02:10:29Z"/>
             <w:rFonts w:ascii="Cambria Math" w:hAnsi="Cambria Math" w:cs="Times New Roman"/>
           </w:rPr>
           <m:t>0</m:t>
         </m:r>
       </m:oMath>
-      <w:r>
-        <w:rPr>
-          <w:rFonts w:cs="Times New Roman"/>
-        </w:rPr>
-        <w:tab/>
-        <w:t>(</w:t>
-      </w:r>
-      <w:r>
-        <w:rPr>
-          <w:rFonts w:cs="Times New Roman"/>
-        </w:rPr>
-        <w:t>13</w:t>
-      </w:r>
-      <w:r>
-        <w:rPr>
-          <w:rFonts w:cs="Times New Roman"/>
-        </w:rPr>
-        <w:t>)</w:t>
-      </w:r>
+      <w:del w:id="20075" w:author="Claude" w:date="2026-10-09T02:10:29Z">
+        <w:r>
+          <w:rPr>
+            <w:rFonts w:cs="Times New Roman"/>
+          </w:rPr>
+          <w:tab/>
+          <w:delText xml:space="preserve">(</w:delText>
+        </w:r>
+      </w:del>
+      <w:del w:id="20076" w:author="Claude" w:date="2026-10-09T02:10:29Z">
+        <w:r>
+          <w:rPr>
+            <w:rFonts w:cs="Times New Roman"/>
+          </w:rPr>
+          <w:delText xml:space="preserve">13</w:delText>
+        </w:r>
+      </w:del>
+      <w:del w:id="20077" w:author="Claude" w:date="2026-10-09T02:10:29Z">
+        <w:r>
+          <w:rPr>
+            <w:rFonts w:cs="Times New Roman"/>
+          </w:rPr>
+          <w:delText xml:space="preserve">)</w:delText>
+        </w:r>
+      </w:del>
     </w:p>
     <w:p>
       <w:pPr>
         <w:pStyle w:val="BodyText"/>
         <w:ind w:firstLine="0"/>
         <w:rPr>
+          <w:del w:id="20101" w:author="Claude" w:date="2026-10-09T02:10:29Z"/>
           <w:rFonts w:cs="Times New Roman"/>
         </w:rPr>
       </w:pPr>
-      <w:r>
-        <w:rPr>
-          <w:rFonts w:cs="Times New Roman"/>
-        </w:rPr>
-        <w:t xml:space="preserve">where </w:t>
-      </w:r>
+      <w:del w:id="20091" w:author="Claude" w:date="2026-10-09T02:10:29Z">
+        <w:r>
+          <w:rPr>
+            <w:rFonts w:cs="Times New Roman"/>
+          </w:rPr>
+          <w:delText xml:space="preserve">where </w:delText>
+        </w:r>
+      </w:del>
       <m:oMath>
         <m:sSub>
           <m:sSubPr>
@@ -8653,6 +8741,7 @@
           <m:e>
             <m:r>
               <w:rPr>
+                <w:del w:id="20099" w:author="Claude" w:date="2026-10-09T02:10:29Z"/>
                 <w:rFonts w:ascii="Cambria Math" w:hAnsi="Cambria Math" w:cs="Times New Roman"/>
               </w:rPr>
               <m:t>v</m:t>
@@ -8661,6 +8750,7 @@
           <m:sub>
             <m:r>
               <w:rPr>
+                <w:del w:id="20100" w:author="Claude" w:date="2026-10-09T02:10:29Z"/>
                 <w:rFonts w:ascii="Cambria Math" w:hAnsi="Cambria Math" w:cs="Times New Roman"/>
               </w:rPr>
               <m:t>n</m:t>
@@ -8668,74 +8758,88 @@
           </m:sub>
         </m:sSub>
       </m:oMath>
-      <w:r>
-        <w:rPr>
-          <w:rFonts w:cs="Times New Roman"/>
-        </w:rPr>
-        <w:t xml:space="preserve"> </w:t>
-      </w:r>
-      <w:r>
-        <w:rPr>
-          <w:rFonts w:cs="Times New Roman"/>
-        </w:rPr>
-        <w:t>is the normal interface velocity obtained from the local corrosion kinetics (</w:t>
-      </w:r>
-      <w:r>
-        <w:rPr>
-          <w:rFonts w:cs="Times New Roman"/>
-          <w:b/>
-          <w:bCs/>
-        </w:rPr>
-        <w:t xml:space="preserve">Equation (</w:t>
-      </w:r>
-      <w:del w:id="9003" w:author="Claude" w:date="2026-10-09T01:35:33Z">
+      <w:del w:id="20092" w:author="Claude" w:date="2026-10-09T02:10:29Z">
+        <w:r>
+          <w:rPr>
+            <w:rFonts w:cs="Times New Roman"/>
+          </w:rPr>
+          <w:delText xml:space="preserve"> </w:delText>
+        </w:r>
+      </w:del>
+      <w:del w:id="20093" w:author="Claude" w:date="2026-10-09T02:10:29Z">
+        <w:r>
+          <w:rPr>
+            <w:rFonts w:cs="Times New Roman"/>
+          </w:rPr>
+          <w:delText xml:space="preserve">is the normal interface velocity obtained from the local corrosion kinetics (</w:delText>
+        </w:r>
+      </w:del>
+      <w:del w:id="20094" w:author="Claude" w:date="2026-10-09T02:10:29Z">
         <w:r>
           <w:rPr>
             <w:rFonts w:cs="Times New Roman"/>
             <w:b/>
             <w:bCs/>
           </w:rPr>
-          <w:delText xml:space="preserve">17</w:delText>
+          <w:delText xml:space="preserve">Equation (</w:delText>
         </w:r>
       </w:del>
-      <w:ins w:id="9002" w:author="Claude" w:date="2026-10-09T01:35:33Z">
+      <w:del w:id="9003" w:author="Claude" w:date="2026-10-09T01:35:33Z">
         <w:r>
           <w:rPr>
             <w:rFonts w:cs="Times New Roman"/>
             <w:b/>
             <w:bCs/>
           </w:rPr>
+          <w:delText xml:space="preserve">17</w:delText>
+        </w:r>
+      </w:del>
+      <w:ins w:id="9002" w:author="Claude" w:date="2026-10-09T01:35:33Z">
+        <w:r>
+          <w:rPr>
+            <w:rFonts w:cs="Times New Roman"/>
+            <w:b/>
+            <w:bCs/>
+          </w:rPr>
           <w:t xml:space="preserve">14</w:t>
         </w:r>
       </w:ins>
-      <w:r>
-        <w:rPr>
-          <w:rFonts w:cs="Times New Roman"/>
-          <w:b/>
-          <w:bCs/>
-        </w:rPr>
-        <w:t xml:space="preserve">)</w:t>
-      </w:r>
+      <w:del w:id="20095" w:author="Claude" w:date="2026-10-09T02:10:29Z">
+        <w:r>
+          <w:rPr>
+            <w:rFonts w:cs="Times New Roman"/>
+            <w:b/>
+            <w:bCs/>
+          </w:rPr>
+          <w:delText xml:space="preserve">)</w:delText>
+        </w:r>
+      </w:del>
       <w:proofErr w:type="gramStart"/>
-      <w:r>
-        <w:rPr>
-          <w:rFonts w:cs="Times New Roman"/>
-        </w:rPr>
-        <w:t>)</w:t>
-      </w:r>
-      <w:r>
-        <w:rPr>
-          <w:rFonts w:cs="Times New Roman"/>
-        </w:rPr>
-        <w:t>.</w:t>
-      </w:r>
+      <w:del w:id="20096" w:author="Claude" w:date="2026-10-09T02:10:29Z">
+        <w:r>
+          <w:rPr>
+            <w:rFonts w:cs="Times New Roman"/>
+          </w:rPr>
+          <w:delText xml:space="preserve">)</w:delText>
+        </w:r>
+      </w:del>
+      <w:del w:id="20097" w:author="Claude" w:date="2026-10-09T02:10:29Z">
+        <w:r>
+          <w:rPr>
+            <w:rFonts w:cs="Times New Roman"/>
+          </w:rPr>
+          <w:delText xml:space="preserve">.</w:delText>
+        </w:r>
+      </w:del>
       <w:proofErr w:type="gramEnd"/>
-      <w:r>
-        <w:rPr>
-          <w:rFonts w:cs="Times New Roman"/>
-        </w:rPr>
-        <w:t xml:space="preserve"> A zero-normal-gradient boundary condition is imposed for the level-set function at external boundaries.</w:t>
-      </w:r>
+      <w:del w:id="20098" w:author="Claude" w:date="2026-10-09T02:10:29Z">
+        <w:r>
+          <w:rPr>
+            <w:rFonts w:cs="Times New Roman"/>
+          </w:rPr>
+          <w:delText xml:space="preserve"> A zero-normal-gradient boundary condition is imposed for the level-set function at external boundaries.</w:delText>
+        </w:r>
+      </w:del>
     </w:p>
     <w:p>
       <w:pPr>
@@ -8749,9 +8853,42 @@
       </w:pPr>
       <w:bookmarkStart w:id="7" w:name="_Ref239691057"/>
       <w:bookmarkStart w:id="8" w:name="sec:model:velocity"/>
-      <w:r>
-        <w:t>Interface Recession Velocity</w:t>
-      </w:r>
+      <w:del w:id="9008" w:author="Claude" w:date="2026-10-09T02:10:29Z">
+        <w:r>
+          <w:delText xml:space="preserve">Interface</w:delText>
+        </w:r>
+      </w:del>
+      <w:ins w:id="9007" w:author="Claude" w:date="2026-10-09T02:10:29Z">
+        <w:r>
+          <w:t xml:space="preserve">Level</w:t>
+        </w:r>
+      </w:ins>
+      <w:r>
+        <w:t xml:space="preserve"> </w:t>
+      </w:r>
+      <w:del w:id="9006" w:author="Claude" w:date="2026-10-09T02:10:29Z">
+        <w:r>
+          <w:delText xml:space="preserve">Recession</w:delText>
+        </w:r>
+      </w:del>
+      <w:ins w:id="9005" w:author="Claude" w:date="2026-10-09T02:10:29Z">
+        <w:r>
+          <w:t xml:space="preserve">Set</w:t>
+        </w:r>
+      </w:ins>
+      <w:r>
+        <w:t xml:space="preserve"> </w:t>
+      </w:r>
+      <w:del w:id="9004" w:author="Claude" w:date="2026-10-09T02:10:29Z">
+        <w:r>
+          <w:delText xml:space="preserve">Velocity</w:delText>
+        </w:r>
+      </w:del>
+      <w:ins w:id="9003" w:author="Claude" w:date="2026-10-09T02:10:29Z">
+        <w:r>
+          <w:t xml:space="preserve">Method</w:t>
+        </w:r>
+      </w:ins>
       <w:bookmarkEnd w:id="7"/>
     </w:p>
     <w:p>
@@ -8759,96 +8896,520 @@
         <w:pStyle w:val="FirstParagraph"/>
         <w:ind w:firstLine="360"/>
         <w:rPr>
-          <w:del w:id="20275" w:author="Claude" w:date="2026-10-09T01:35:33Z"/>
+          <w:ins w:id="20030" w:author="Claude" w:date="2026-10-09T02:10:29Z"/>
           <w:rFonts w:cs="Times New Roman"/>
         </w:rPr>
       </w:pPr>
-      <w:del w:id="20266" w:author="Claude" w:date="2026-10-09T01:35:33Z">
+      <w:ins w:id="20003" w:author="Claude" w:date="2026-10-09T02:10:29Z">
         <w:r>
           <w:rPr>
             <w:rFonts w:cs="Times New Roman"/>
           </w:rPr>
-          <w:delText xml:space="preserve">Interface recession was modeled as the outcome of three competing rate limitations: interfacial reaction kinetics, oxygen transport to the metal surface, and Zn²⁺ transport away from the interface</w:delText>
-        </w:r>
-      </w:del>
-      <w:del w:id="20267" w:author="Claude" w:date="2026-10-09T01:35:33Z">
+          <w:t xml:space="preserve">The evolving metal-electrolyte interface is tracked using </w:t>
+        </w:r>
+      </w:ins>
+      <w:ins w:id="20004" w:author="Claude" w:date="2026-10-09T02:10:29Z">
         <w:r>
           <w:rPr>
             <w:rFonts w:cs="Times New Roman"/>
           </w:rPr>
-          <w:delText xml:space="preserve">.</w:delText>
-        </w:r>
-      </w:del>
-      <w:del w:id="20268" w:author="Claude" w:date="2026-10-09T01:35:33Z">
+          <w:t>the level set method</w:t>
+        </w:r>
+      </w:ins>
+      <w:ins w:id="20005" w:author="Claude" w:date="2026-10-09T02:10:29Z">
         <w:r>
           <w:rPr>
             <w:rFonts w:cs="Times New Roman"/>
           </w:rPr>
-          <w:delText xml:space="preserve"> The Zn-transport-limited recession velocity is obtained from the classical Stefan condition for a dissolving metal interface </w:delText>
-        </w:r>
-      </w:del>
-      <w:del w:id="20269" w:author="Claude" w:date="2026-10-09T01:35:33Z">
+          <w:t>, in which a signed-distance function (</w:t>
+        </w:r>
+      </w:ins>
+      <m:oMath>
+        <m:r>
+          <w:rPr>
+            <w:ins w:id="20028" w:author="Claude" w:date="2026-10-09T02:10:29Z"/>
+            <w:rFonts w:ascii="Cambria Math" w:hAnsi="Cambria Math" w:cs="Times New Roman"/>
+          </w:rPr>
+          <m:t>ϕ)</m:t>
+        </m:r>
+      </m:oMath>
+      <w:ins w:id="20006" w:author="Claude" w:date="2026-10-09T02:10:29Z">
         <w:r>
           <w:rPr>
             <w:rFonts w:cs="Times New Roman"/>
           </w:rPr>
+          <w:t xml:space="preserve"> </w:t>
+        </w:r>
+      </w:ins>
+      <w:bookmarkStart w:id="6" w:name="_Hlk237963744"/>
+      <w:ins w:id="20007" w:author="Claude" w:date="2026-10-09T02:10:29Z">
+        <w:r>
+          <w:rPr>
+            <w:rFonts w:cs="Times New Roman"/>
+          </w:rPr>
+          <w:t>implicitly defines the interface as the zero-level set separating the metal and electrolyte domains,</w:t>
+        </w:r>
+      </w:ins>
+      <w:bookmarkEnd w:id="6"/>
+      <w:ins w:id="20008" w:author="Claude" w:date="2026-10-09T02:10:29Z">
+        <w:r>
+          <w:rPr>
+            <w:rFonts w:cs="Times New Roman"/>
+          </w:rPr>
+          <w:t xml:space="preserve"> as </w:t>
+        </w:r>
+      </w:ins>
+      <w:ins w:id="20009" w:author="Claude" w:date="2026-10-09T02:10:29Z">
+        <w:r>
+          <w:rPr>
+            <w:rFonts w:cs="Times New Roman"/>
+          </w:rPr>
+          <w:t>shown</w:t>
+        </w:r>
+      </w:ins>
+      <w:ins w:id="20010" w:author="Claude" w:date="2026-10-09T02:10:29Z">
+        <w:r>
+          <w:rPr>
+            <w:rFonts w:cs="Times New Roman"/>
+          </w:rPr>
+          <w:t xml:space="preserve"> in </w:t>
+        </w:r>
+      </w:ins>
+      <w:ins w:id="20011" w:author="Claude" w:date="2026-10-09T02:10:29Z">
+        <w:r>
+          <w:rPr>
+            <w:rFonts w:cs="Times New Roman"/>
+            <w:b/>
+            <w:bCs/>
+          </w:rPr>
           <w:fldChar w:fldCharType="begin"/>
         </w:r>
-      </w:del>
-      <w:del w:id="20270" w:author="Claude" w:date="2026-10-09T01:35:33Z">
+      </w:ins>
+      <w:ins w:id="20012" w:author="Claude" w:date="2026-10-09T02:10:29Z">
         <w:r>
           <w:rPr>
             <w:rFonts w:cs="Times New Roman"/>
-          </w:rPr>
-          <w:instrText xml:space="preserve"> ADDIN ZOTERO_ITEM CSL_CITATION {"citationID":"BuP2nsvm","properties":{"unsorted":false,"formattedCitation":"\\super [32]\\nosupersub{}","plainCitation":"[32]","noteIndex":0},"citationItems":[{"id":1697,"uris":["http://zotero.org/users/16939557/items/M7J7YKJU"],"itemData":{"id":1697,"type":"article-journal","citation-key":"groganPhysicalCorrosionModel2014","container-title":"Acta Biomaterialia","DOI":"10.1016/j.actbio.2013.12.059","ISSN":"17427061","issue":"5","journalAbbreviation":"Acta Biomaterialia","language":"en","page":"2313-2322","source":"DOI.org (Crossref)","title":"A physical corrosion model for bioabsorbable metal stents","volume":"10","author":[{"family":"Grogan","given":"J.A."},{"family":"Leen","given":"S.B."},{"family":"McHugh","given":"P.E."}],"issued":{"date-parts":[["2014",5]]}}}],"schema":"https://github.com/citation-style-language/schema/raw/master/csl-citation.json"} </w:instrText>
-        </w:r>
-      </w:del>
-      <w:del w:id="20271" w:author="Claude" w:date="2026-10-09T01:35:33Z">
+            <w:b/>
+            <w:bCs/>
+          </w:rPr>
+          <w:instrText xml:space="preserve"> REF _Ref238652979 \h  \* MERGEFORMAT </w:instrText>
+        </w:r>
+      </w:ins>
+      <w:ins w:id="20013" w:author="Claude" w:date="2026-10-09T02:10:29Z">
         <w:r>
           <w:rPr>
             <w:rFonts w:cs="Times New Roman"/>
+            <w:b/>
+            <w:bCs/>
+          </w:rPr>
+        </w:r>
+      </w:ins>
+      <w:ins w:id="20014" w:author="Claude" w:date="2026-10-09T02:10:29Z">
+        <w:r>
+          <w:rPr>
+            <w:rFonts w:cs="Times New Roman"/>
+            <w:b/>
+            <w:bCs/>
           </w:rPr>
           <w:fldChar w:fldCharType="separate"/>
         </w:r>
-      </w:del>
-      <w:del w:id="20272" w:author="Claude" w:date="2026-10-09T01:35:33Z">
+      </w:ins>
+      <w:ins w:id="20015" w:author="Claude" w:date="2026-10-09T02:10:29Z">
+        <w:r>
+          <w:rPr>
+            <w:b/>
+            <w:bCs/>
+          </w:rPr>
+          <w:t xml:space="preserve">Figure </w:t>
+        </w:r>
+      </w:ins>
+      <w:ins w:id="20016" w:author="Claude" w:date="2026-10-09T02:10:29Z">
+        <w:r>
+          <w:rPr>
+            <w:b/>
+            <w:bCs/>
+            <w:noProof/>
+          </w:rPr>
+          <w:t>2</w:t>
+        </w:r>
+      </w:ins>
+      <w:ins w:id="20017" w:author="Claude" w:date="2026-10-09T02:10:29Z">
+        <w:r>
+          <w:rPr>
+            <w:rFonts w:cs="Times New Roman"/>
+            <w:b/>
+            <w:bCs/>
+          </w:rPr>
+          <w:fldChar w:fldCharType="end"/>
+        </w:r>
+      </w:ins>
+      <w:ins w:id="20018" w:author="Claude" w:date="2026-10-09T02:10:29Z">
+        <w:r>
+          <w:rPr>
+            <w:rFonts w:cs="Times New Roman"/>
+            <w:b/>
+            <w:bCs/>
+          </w:rPr>
+          <w:t>c</w:t>
+        </w:r>
+      </w:ins>
+      <w:ins w:id="20019" w:author="Claude" w:date="2026-10-09T02:10:29Z">
+        <w:r>
+          <w:rPr>
+            <w:rFonts w:cs="Times New Roman"/>
+          </w:rPr>
+          <w:t xml:space="preserve">. </w:t>
+        </w:r>
+      </w:ins>
+      <w:ins w:id="20020" w:author="Claude" w:date="2026-10-09T02:10:29Z">
+        <w:r>
+          <w:rPr>
+            <w:rFonts w:cs="Times New Roman"/>
+          </w:rPr>
+          <w:t xml:space="preserve">Corrosion-driven interface motion is represented by the evolution of </w:t>
+        </w:r>
+      </w:ins>
+      <m:oMath>
+        <m:r>
+          <w:rPr>
+            <w:ins w:id="20029" w:author="Claude" w:date="2026-10-09T02:10:29Z"/>
+            <w:rFonts w:ascii="Cambria Math" w:hAnsi="Cambria Math" w:cs="Times New Roman"/>
+          </w:rPr>
+          <m:t>ϕ</m:t>
+        </m:r>
+      </m:oMath>
+      <w:ins w:id="20021" w:author="Claude" w:date="2026-10-09T02:10:29Z">
+        <w:r>
+          <w:rPr>
+            <w:rFonts w:cs="Times New Roman"/>
+          </w:rPr>
+          <w:t xml:space="preserve"> according to the Hamilton-Jacobi equation </w:t>
+        </w:r>
+      </w:ins>
+      <w:ins w:id="20022" w:author="Claude" w:date="2026-10-09T02:10:29Z">
+        <w:r>
+          <w:rPr>
+            <w:rFonts w:cs="Times New Roman"/>
+          </w:rPr>
+          <w:fldChar w:fldCharType="begin"/>
+        </w:r>
+      </w:ins>
+      <w:ins w:id="20023" w:author="Claude" w:date="2026-10-09T02:10:29Z">
+        <w:r>
+          <w:rPr>
+            <w:rFonts w:cs="Times New Roman"/>
+          </w:rPr>
+          <w:instrText xml:space="preserve"> ADDIN ZOTERO_ITEM CSL_CITATION {"citationID":"r7domCi5","properties":{"unsorted":false,"formattedCitation":"\\super [31]\\nosupersub{}","plainCitation":"[31]","noteIndex":0},"citationItems":[{"id":1729,"uris":["http://zotero.org/users/16939557/items/TDPP5UDX"],"itemData":{"id":1729,"type":"article-journal","citation-key":"wilderAdaptiveLevelSet2015","container-title":"Journal of Engineering Mathematics","DOI":"10.1007/s10665-014-9732-3","ISSN":"0022-0833, 1573-2703","issue":"1","journalAbbreviation":"J Eng Math","language":"en","page":"121-142","source":"DOI.org (Crossref)","title":"An adaptive level set approach for modeling damage due to galvanic corrosion","volume":"91","author":[{"family":"Wilder","given":"Joseph W."},{"family":"Clemons","given":"Curtis"},{"family":"Golovaty","given":"Dmitry"},{"family":"Kreider","given":"Kevin L."},{"family":"Young","given":"Gerald W."},{"family":"Lillard","given":"R. Scott"}],"issued":{"date-parts":[["2015",4]]}}}],"schema":"https://github.com/citation-style-language/schema/raw/master/csl-citation.json"} </w:instrText>
+        </w:r>
+      </w:ins>
+      <w:ins w:id="20024" w:author="Claude" w:date="2026-10-09T02:10:29Z">
+        <w:r>
+          <w:rPr>
+            <w:rFonts w:cs="Times New Roman"/>
+          </w:rPr>
+          <w:fldChar w:fldCharType="separate"/>
+        </w:r>
+      </w:ins>
+      <w:ins w:id="20025" w:author="Claude" w:date="2026-10-09T02:10:29Z">
         <w:r>
           <w:rPr>
             <w:rFonts w:cs="Times New Roman"/>
             <w:vertAlign w:val="superscript"/>
           </w:rPr>
-          <w:delText xml:space="preserve">[32]</w:delText>
-        </w:r>
-      </w:del>
-      <w:del w:id="20273" w:author="Claude" w:date="2026-10-09T01:35:33Z">
+          <w:t>[31]</w:t>
+        </w:r>
+      </w:ins>
+      <w:ins w:id="20026" w:author="Claude" w:date="2026-10-09T02:10:29Z">
         <w:r>
           <w:rPr>
             <w:rFonts w:cs="Times New Roman"/>
           </w:rPr>
           <w:fldChar w:fldCharType="end"/>
         </w:r>
-      </w:del>
-      <w:del w:id="20274" w:author="Claude" w:date="2026-10-09T01:35:33Z">
+      </w:ins>
+      <w:ins w:id="20027" w:author="Claude" w:date="2026-10-09T02:10:29Z">
         <w:r>
           <w:rPr>
             <w:rFonts w:cs="Times New Roman"/>
           </w:rPr>
-          <w:delText xml:space="preserve">:</w:delText>
-        </w:r>
-      </w:del>
+          <w:t>:</w:t>
+        </w:r>
+      </w:ins>
     </w:p>
     <w:p>
       <w:pPr>
         <w:pStyle w:val="BodyText"/>
-        <w:rPr>
-          <w:ins w:id="20277" w:author="Claude" w:date="2026-10-09T01:35:33Z"/>
+        <w:tabs>
+          <w:tab w:val="right" w:pos="9360"/>
+        </w:tabs>
+        <w:spacing w:before="240" w:after="240"/>
+        <w:ind w:firstLine="0"/>
+        <w:rPr>
+          <w:ins w:id="20046" w:author="Claude" w:date="2026-10-09T02:10:29Z"/>
+          <w:rFonts w:cs="Times New Roman"/>
         </w:rPr>
       </w:pPr>
-      <w:ins w:id="20276" w:author="Claude" w:date="2026-10-09T01:35:33Z">
-        <w:r>
-          <w:t xml:space="preserve">Interface recession is set by the oxygen-reduction rate at the interface. The Zn²⁺ released, the O₂ consumed and the metal lost are tied by O₂ + 2Zn + 2H₂O → 2Zn²⁺ + 4OH⁻, so the normal velocity follows from the interfacial oxygen flux:</w:t>
+      <m:oMath>
+        <m:f>
+          <m:fPr>
+            <m:ctrlPr>
+              <w:rPr>
+                <w:rFonts w:ascii="Cambria Math" w:hAnsi="Cambria Math" w:cs="Times New Roman"/>
+              </w:rPr>
+            </m:ctrlPr>
+          </m:fPr>
+          <m:num>
+            <m:r>
+              <m:rPr>
+                <m:sty m:val="p"/>
+              </m:rPr>
+              <w:rPr>
+                <w:ins w:id="20034" w:author="Claude" w:date="2026-10-09T02:10:29Z"/>
+                <w:rFonts w:ascii="Cambria Math" w:hAnsi="Cambria Math" w:cs="Times New Roman"/>
+              </w:rPr>
+              <m:t>∂</m:t>
+            </m:r>
+            <m:r>
+              <w:rPr>
+                <w:ins w:id="20035" w:author="Claude" w:date="2026-10-09T02:10:29Z"/>
+                <w:rFonts w:ascii="Cambria Math" w:hAnsi="Cambria Math" w:cs="Times New Roman"/>
+              </w:rPr>
+              <m:t>ϕ</m:t>
+            </m:r>
+          </m:num>
+          <m:den>
+            <m:r>
+              <m:rPr>
+                <m:sty m:val="p"/>
+              </m:rPr>
+              <w:rPr>
+                <w:ins w:id="20036" w:author="Claude" w:date="2026-10-09T02:10:29Z"/>
+                <w:rFonts w:ascii="Cambria Math" w:hAnsi="Cambria Math" w:cs="Times New Roman"/>
+              </w:rPr>
+              <m:t>∂</m:t>
+            </m:r>
+            <m:r>
+              <w:rPr>
+                <w:ins w:id="20037" w:author="Claude" w:date="2026-10-09T02:10:29Z"/>
+                <w:rFonts w:ascii="Cambria Math" w:hAnsi="Cambria Math" w:cs="Times New Roman"/>
+              </w:rPr>
+              <m:t>t</m:t>
+            </m:r>
+          </m:den>
+        </m:f>
+        <m:r>
+          <m:rPr>
+            <m:sty m:val="p"/>
+          </m:rPr>
+          <w:rPr>
+            <w:ins w:id="20038" w:author="Claude" w:date="2026-10-09T02:10:29Z"/>
+            <w:rFonts w:ascii="Cambria Math" w:hAnsi="Cambria Math" w:cs="Times New Roman"/>
+          </w:rPr>
+          <m:t>+</m:t>
+        </m:r>
+        <m:sSub>
+          <m:sSubPr>
+            <m:ctrlPr>
+              <w:rPr>
+                <w:rFonts w:ascii="Cambria Math" w:hAnsi="Cambria Math" w:cs="Times New Roman"/>
+              </w:rPr>
+            </m:ctrlPr>
+          </m:sSubPr>
+          <m:e>
+            <m:r>
+              <w:rPr>
+                <w:ins w:id="20039" w:author="Claude" w:date="2026-10-09T02:10:29Z"/>
+                <w:rFonts w:ascii="Cambria Math" w:hAnsi="Cambria Math" w:cs="Times New Roman"/>
+              </w:rPr>
+              <m:t>v</m:t>
+            </m:r>
+          </m:e>
+          <m:sub>
+            <m:r>
+              <w:rPr>
+                <w:ins w:id="20040" w:author="Claude" w:date="2026-10-09T02:10:29Z"/>
+                <w:rFonts w:ascii="Cambria Math" w:hAnsi="Cambria Math" w:cs="Times New Roman"/>
+              </w:rPr>
+              <m:t>n</m:t>
+            </m:r>
+          </m:sub>
+        </m:sSub>
+        <m:r>
+          <w:rPr>
+            <w:ins w:id="20041" w:author="Claude" w:date="2026-10-09T02:10:29Z"/>
+            <w:rFonts w:ascii="Cambria Math" w:hAnsi="Cambria Math" w:cs="Times New Roman"/>
+          </w:rPr>
+          <m:t> </m:t>
+        </m:r>
+        <m:r>
+          <m:rPr>
+            <m:sty m:val="p"/>
+          </m:rPr>
+          <w:rPr>
+            <w:ins w:id="20042" w:author="Claude" w:date="2026-10-09T02:10:29Z"/>
+            <w:rFonts w:ascii="Cambria Math" w:hAnsi="Cambria Math" w:cs="Times New Roman"/>
+          </w:rPr>
+          <m:t>|∇</m:t>
+        </m:r>
+        <m:r>
+          <w:rPr>
+            <w:ins w:id="20043" w:author="Claude" w:date="2026-10-09T02:10:29Z"/>
+            <w:rFonts w:ascii="Cambria Math" w:hAnsi="Cambria Math" w:cs="Times New Roman"/>
+          </w:rPr>
+          <m:t>ϕ</m:t>
+        </m:r>
+        <m:r>
+          <m:rPr>
+            <m:sty m:val="p"/>
+          </m:rPr>
+          <w:rPr>
+            <w:ins w:id="20044" w:author="Claude" w:date="2026-10-09T02:10:29Z"/>
+            <w:rFonts w:ascii="Cambria Math" w:hAnsi="Cambria Math" w:cs="Times New Roman"/>
+          </w:rPr>
+          <m:t>|=</m:t>
+        </m:r>
+        <m:r>
+          <w:rPr>
+            <w:ins w:id="20045" w:author="Claude" w:date="2026-10-09T02:10:29Z"/>
+            <w:rFonts w:ascii="Cambria Math" w:hAnsi="Cambria Math" w:cs="Times New Roman"/>
+          </w:rPr>
+          <m:t>0</m:t>
+        </m:r>
+      </m:oMath>
+      <w:ins w:id="20031" w:author="Claude" w:date="2026-10-09T02:10:29Z">
+        <w:r>
+          <w:rPr>
+            <w:rFonts w:cs="Times New Roman"/>
+          </w:rPr>
+          <w:tab/>
+          <w:t>(</w:t>
         </w:r>
       </w:ins>
+      <w:ins w:id="20032" w:author="Claude" w:date="2026-10-09T02:10:29Z">
+        <w:r>
+          <w:rPr>
+            <w:rFonts w:cs="Times New Roman"/>
+          </w:rPr>
+          <w:t>13</w:t>
+        </w:r>
+      </w:ins>
+      <w:ins w:id="20033" w:author="Claude" w:date="2026-10-09T02:10:29Z">
+        <w:r>
+          <w:rPr>
+            <w:rFonts w:cs="Times New Roman"/>
+          </w:rPr>
+          <w:t>)</w:t>
+        </w:r>
+      </w:ins>
+    </w:p>
+    <w:p>
+      <w:pPr>
+        <w:pStyle w:val="BodyText"/>
+        <w:rPr>
+          <w:ins w:id="20105" w:author="Claude" w:date="2026-10-09T02:10:29Z"/>
+        </w:rPr>
+      </w:pPr>
+      <w:ins w:id="20102" w:author="Claude" w:date="2026-10-09T02:10:29Z">
+        <w:r>
+          <w:t xml:space="preserve">where v</w:t>
+        </w:r>
+      </w:ins>
+      <w:ins w:id="20103" w:author="Claude" w:date="2026-10-09T02:10:29Z">
+        <w:r>
+          <w:rPr>
+            <w:vertAlign w:val="subscript"/>
+          </w:rPr>
+          <w:t xml:space="preserve">n</w:t>
+        </w:r>
+      </w:ins>
+      <w:ins w:id="20104" w:author="Claude" w:date="2026-10-09T02:10:29Z">
+        <w:r>
+          <w:t xml:space="preserve"> is the normal interface velocity, negative for recession. The velocity follows from the interfacial reaction rather than being prescribed: each mole of O₂ reduced at the interface removes two moles of Zn, O₂ + 2Zn + 2H₂O → 2Zn²⁺ + 4OH⁻, so the metal lost per unit area and time is fixed by the interfacial oxygen flux. Dividing by the molar density of solid Zn gives the normal velocity (Eq. 14):</w:t>
+        </w:r>
+      </w:ins>
+    </w:p>
+    <w:p>
+      <w:pPr>
+        <w:pStyle w:val="FirstParagraph"/>
+        <w:ind w:firstLine="360"/>
+        <w:rPr>
+          <w:del w:id="20275" w:author="Claude" w:date="2026-10-09T01:35:33Z"/>
+          <w:rFonts w:cs="Times New Roman"/>
+        </w:rPr>
+      </w:pPr>
+      <w:del w:id="20266" w:author="Claude" w:date="2026-10-09T01:35:33Z">
+        <w:r>
+          <w:rPr>
+            <w:rFonts w:cs="Times New Roman"/>
+          </w:rPr>
+          <w:delText xml:space="preserve">Interface recession was modeled as the outcome of three competing rate limitations: interfacial reaction kinetics, oxygen transport to the metal surface, and Zn²⁺ transport away from the interface</w:delText>
+        </w:r>
+      </w:del>
+      <w:del w:id="20267" w:author="Claude" w:date="2026-10-09T01:35:33Z">
+        <w:r>
+          <w:rPr>
+            <w:rFonts w:cs="Times New Roman"/>
+          </w:rPr>
+          <w:delText xml:space="preserve">.</w:delText>
+        </w:r>
+      </w:del>
+      <w:del w:id="20268" w:author="Claude" w:date="2026-10-09T01:35:33Z">
+        <w:r>
+          <w:rPr>
+            <w:rFonts w:cs="Times New Roman"/>
+          </w:rPr>
+          <w:delText xml:space="preserve"> The Zn-transport-limited recession velocity is obtained from the classical Stefan condition for a dissolving metal interface </w:delText>
+        </w:r>
+      </w:del>
+      <w:del w:id="20269" w:author="Claude" w:date="2026-10-09T01:35:33Z">
+        <w:r>
+          <w:rPr>
+            <w:rFonts w:cs="Times New Roman"/>
+          </w:rPr>
+          <w:fldChar w:fldCharType="begin"/>
+        </w:r>
+      </w:del>
+      <w:del w:id="20270" w:author="Claude" w:date="2026-10-09T01:35:33Z">
+        <w:r>
+          <w:rPr>
+            <w:rFonts w:cs="Times New Roman"/>
+          </w:rPr>
+          <w:instrText xml:space="preserve"> ADDIN ZOTERO_ITEM CSL_CITATION {"citationID":"BuP2nsvm","properties":{"unsorted":false,"formattedCitation":"\\super [32]\\nosupersub{}","plainCitation":"[32]","noteIndex":0},"citationItems":[{"id":1697,"uris":["http://zotero.org/users/16939557/items/M7J7YKJU"],"itemData":{"id":1697,"type":"article-journal","citation-key":"groganPhysicalCorrosionModel2014","container-title":"Acta Biomaterialia","DOI":"10.1016/j.actbio.2013.12.059","ISSN":"17427061","issue":"5","journalAbbreviation":"Acta Biomaterialia","language":"en","page":"2313-2322","source":"DOI.org (Crossref)","title":"A physical corrosion model for bioabsorbable metal stents","volume":"10","author":[{"family":"Grogan","given":"J.A."},{"family":"Leen","given":"S.B."},{"family":"McHugh","given":"P.E."}],"issued":{"date-parts":[["2014",5]]}}}],"schema":"https://github.com/citation-style-language/schema/raw/master/csl-citation.json"} </w:instrText>
+        </w:r>
+      </w:del>
+      <w:del w:id="20271" w:author="Claude" w:date="2026-10-09T01:35:33Z">
+        <w:r>
+          <w:rPr>
+            <w:rFonts w:cs="Times New Roman"/>
+          </w:rPr>
+          <w:fldChar w:fldCharType="separate"/>
+        </w:r>
+      </w:del>
+      <w:del w:id="20272" w:author="Claude" w:date="2026-10-09T01:35:33Z">
+        <w:r>
+          <w:rPr>
+            <w:rFonts w:cs="Times New Roman"/>
+            <w:vertAlign w:val="superscript"/>
+          </w:rPr>
+          <w:delText xml:space="preserve">[32]</w:delText>
+        </w:r>
+      </w:del>
+      <w:del w:id="20273" w:author="Claude" w:date="2026-10-09T01:35:33Z">
+        <w:r>
+          <w:rPr>
+            <w:rFonts w:cs="Times New Roman"/>
+          </w:rPr>
+          <w:fldChar w:fldCharType="end"/>
+        </w:r>
+      </w:del>
+      <w:del w:id="20274" w:author="Claude" w:date="2026-10-09T01:35:33Z">
+        <w:r>
+          <w:rPr>
+            <w:rFonts w:cs="Times New Roman"/>
+          </w:rPr>
+          <w:delText xml:space="preserve">:</w:delText>
+        </w:r>
+      </w:del>
     </w:p>
     <w:p>
       <w:pPr>
@@ -9830,8 +10391,23 @@
         <w:rPr>
           <w:rFonts w:cs="Times New Roman"/>
         </w:rPr>
-        <w:t>5</w:t>
-      </w:r>
+      </w:r>
+      <w:del w:id="9001" w:author="Claude" w:date="2026-10-09T02:10:29Z">
+        <w:r>
+          <w:rPr>
+            <w:rFonts w:cs="Times New Roman"/>
+          </w:rPr>
+          <w:delText xml:space="preserve">5</w:delText>
+        </w:r>
+      </w:del>
+      <w:ins w:id="9002" w:author="Claude" w:date="2026-10-09T02:10:29Z">
+        <w:r>
+          <w:rPr>
+            <w:rFonts w:cs="Times New Roman"/>
+          </w:rPr>
+          <w:t>4</w:t>
+        </w:r>
+      </w:ins>
       <w:r>
         <w:rPr>
           <w:rFonts w:cs="Times New Roman"/>

</xml_diff>

<commit_message>
Clean stray inserted text in deleted paragraphs
</commit_message>
<xml_diff>
--- a/deliver/Manuscript_tracked.docx
+++ b/deliver/Manuscript_tracked.docx
@@ -8794,16 +8794,6 @@
           <w:delText xml:space="preserve">17</w:delText>
         </w:r>
       </w:del>
-      <w:ins w:id="9002" w:author="Claude" w:date="2026-10-09T01:35:33Z">
-        <w:r>
-          <w:rPr>
-            <w:rFonts w:cs="Times New Roman"/>
-            <w:b/>
-            <w:bCs/>
-          </w:rPr>
-          <w:t xml:space="preserve">14</w:t>
-        </w:r>
-      </w:ins>
       <w:del w:id="20095" w:author="Claude" w:date="2026-10-09T02:10:29Z">
         <w:r>
           <w:rPr>
@@ -10432,14 +10422,6 @@
           <w:delText xml:space="preserve">Where</w:delText>
         </w:r>
       </w:del>
-      <w:ins w:id="9001" w:author="Claude" w:date="2026-10-08T23:42:36Z">
-        <w:r>
-          <w:rPr>
-            <w:rFonts w:cs="Times New Roman"/>
-          </w:rPr>
-          <w:t xml:space="preserve">where</w:t>
-        </w:r>
-      </w:ins>
       <w:del w:id="20356" w:author="Claude" w:date="2026-10-09T01:35:33Z">
         <w:r>
           <w:rPr>
@@ -17214,11 +17196,6 @@
           <w:delText xml:space="preserve">identified</w:delText>
         </w:r>
       </w:del>
-      <w:ins w:id="9012" w:author="Claude" w:date="2026-10-08T23:42:36Z">
-        <w:r>
-          <w:t xml:space="preserve">reached</w:t>
-        </w:r>
-      </w:ins>
       <w:del w:id="20562" w:author="Claude" w:date="2026-10-09T01:35:33Z">
         <w:r>
           <w:delText xml:space="preserve"> </w:delText>
@@ -17229,11 +17206,6 @@
           <w:delText xml:space="preserve">a</w:delText>
         </w:r>
       </w:del>
-      <w:ins w:id="9010" w:author="Claude" w:date="2026-10-08T23:42:36Z">
-        <w:r>
-          <w:t xml:space="preserve">its</w:t>
-        </w:r>
-      </w:ins>
       <w:del w:id="20563" w:author="Claude" w:date="2026-10-09T01:35:33Z">
         <w:r>
           <w:delText xml:space="preserve"> </w:delText>
@@ -17244,11 +17216,6 @@
           <w:delText xml:space="preserve">distinct</w:delText>
         </w:r>
       </w:del>
-      <w:ins w:id="9008" w:author="Claude" w:date="2026-10-08T23:42:36Z">
-        <w:r>
-          <w:t xml:space="preserve">lowest</w:t>
-        </w:r>
-      </w:ins>
       <w:del w:id="20564" w:author="Claude" w:date="2026-10-09T01:35:33Z">
         <w:r>
           <w:delText xml:space="preserve"> </w:delText>
@@ -17259,11 +17226,6 @@
           <w:delText xml:space="preserve">optimum</w:delText>
         </w:r>
       </w:del>
-      <w:ins w:id="9006" w:author="Claude" w:date="2026-10-08T23:42:36Z">
-        <w:r>
-          <w:t xml:space="preserve">RMSE</w:t>
-        </w:r>
-      </w:ins>
       <w:del w:id="20565" w:author="Claude" w:date="2026-10-09T01:35:33Z">
         <w:r>
           <w:delText xml:space="preserve"> </w:delText>
@@ -17274,11 +17236,6 @@
           <w:delText xml:space="preserve">after</w:delText>
         </w:r>
       </w:del>
-      <w:ins w:id="9004" w:author="Claude" w:date="2026-10-08T23:42:36Z">
-        <w:r>
-          <w:t xml:space="preserve">at iteration</w:t>
-        </w:r>
-      </w:ins>
       <w:del w:id="20566" w:author="Claude" w:date="2026-10-09T01:35:33Z">
         <w:r>
           <w:delText xml:space="preserve"> 22</w:delText>

</xml_diff>

<commit_message>
Fix Zotero fields: delInstrText in deleted runs, restore field-based citations in new text
</commit_message>
<xml_diff>
--- a/deliver/Manuscript_tracked.docx
+++ b/deliver/Manuscript_tracked.docx
@@ -3227,7 +3227,41 @@
       </w:pPr>
       <w:ins w:id="20001" w:author="Claude" w:date="2026-10-09T02:10:29Z">
         <w:r>
-          <w:t xml:space="preserve">To our knowledge, previous mechanistic biodegradation models generally determined interface motion from either a Stefan condition based on metal-ion transport or an interfacial reaction-rate expression, with transitions between controlling mechanisms imposed through rate-selection criteria. Since most mechanistic biodegradation models have been developed for Mg-based systems, oxygen has rarely been treated as a dynamically evolving species coupled to interface recession, species transport, and corrosion-product evolution. Therefore, such models have limited capability to predict how local oxygen availability influences Zn degradation kinetics or drives transitions between reaction-controlled and diffusion-controlled degradation. This limitation is particularly important for porous Zn structures, where experimental studies have shown that oxygen availability and transport strongly affect degradation behavior [12,13]. In the present framework, interface recession, oxygen consumption, Zn²⁺ release, and corrosion-product evolution are unified through a single oxygen-reduction flux arising from the reaction-diffusion system. Oxygen transport, reaction kinetics, and interface evolution are therefore intrinsically coupled, allowing the transition from reaction-controlled to diffusion-controlled degradation to emerge naturally from the governing equations and enabling quantitative prediction of oxygen-mediated degradation behavior.</w:t>
+          <w:t xml:space="preserve">To our knowledge, previous mechanistic biodegradation models generally determined interface motion from either a Stefan condition based on metal-ion transport or an interfacial reaction-rate expression, with transitions between controlling mechanisms imposed through rate-selection criteria. Since most mechanistic biodegradation models have been developed for Mg-based systems, oxygen has rarely been treated as a dynamically evolving species coupled to interface recession, species transport, and corrosion-product evolution. Therefore, such models have limited capability to predict how local oxygen availability influences Zn degradation kinetics or drives transitions between reaction-controlled and diffusion-controlled degradation. This limitation is particularly important for porous Zn structures, where experimental studies have shown that oxygen availability and transport strongly affect degradation behavior </w:t>
+        </w:r>
+      </w:ins>
+      <w:ins w:id="20006" w:author="Claude" w:date="2026-10-09T02:19:18Z">
+        <w:r>
+          <w:fldChar w:fldCharType="begin"/>
+        </w:r>
+      </w:ins>
+      <w:ins w:id="20007" w:author="Claude" w:date="2026-10-09T02:19:18Z">
+        <w:r>
+          <w:instrText xml:space="preserve"> ADDIN ZOTERO_ITEM CSL_CITATION {"citationID":"fs656Jwf","properties":{"unsorted":false,"formattedCitation":"\\super [12,13]\\nosupersub{}","plainCitation":"[12,13]","noteIndex":0},"citationItems":[{"id":3530,"uris":["http://zotero.org/users/16939557/items/M9SKJLJE"],"itemData":{"id":3530,"type":"article-journal","abstract":"Abstract\n            The combination of bioactive Zn‐2Mg alloy and additively manufactured porous scaffold is expected to achieve customizable biodegradable performance and enhanced bone regeneration. Herein, Zn‐2Mg alloy scaffolds with different porosities, including 40% (G‐40‐2), 60% (G‐60‐2), and 80% (G‐80‐2), and different unit sizes, including 1.5 mm (G‐60‐1.5), 2 mm (G‐60‐2), and 2.5 mm (G‐60‐2.5), are manufactured by a triply periodic minimal surface design and a reliable laser powder bed fusion process. With the same unit size, compressive strength (CS) and elastic modulus (EM) of scaffolds substantially decrease with increasing porosities. With the same porosity, CS and EM just slightly decrease with increasing unit sizes. The weight loss after degradation increases with increasing porosities and decreasing unit sizes. In vivo tests indicate that Zn‐2Mg alloy scaffolds exhibit satisfactory biocompatibility and osteogenic ability. The osteogenic ability of scaffolds is mainly determined by their physical and chemical characteristics. Scaffolds with lower porosities and smaller unit sizes show better osteogenesis due to their suitable pore size and larger surface area. The results indicate that the biodegradable performance of scaffolds can be accurately regulated on a large scale by structure design and the additively manufactured Zn‐2Mg alloy scaffolds have improved osteogenic ability for treating bone defects.","citation-key":"wangAdditivelyManufacturedZn2Mg2024","container-title":"Advanced Science","DOI":"10.1002/advs.202307329","ISSN":"2198-3844, 2198-3844","issue":"5","journalAbbreviation":"Advanced Science","language":"en","page":"2307329","source":"DOI.org (Crossref)","title":"Additively Manufactured Zn‐2Mg Alloy Porous Scaffolds with Customizable Biodegradable Performance and Enhanced Osteogenic Ability","volume":"11","author":[{"family":"Wang","given":"Xuan"},{"family":"Liu","given":"Aobo"},{"family":"Zhang","given":"Zhenbao"},{"family":"Hao","given":"Dazhong"},{"family":"Liang","given":"Yijie"},{"family":"Dai","given":"Jiabao"},{"family":"Jin","given":"Xiang"},{"family":"Deng","given":"Huanze"},{"family":"Zhao","given":"Yantao"},{"family":"Wen","given":"Peng"},{"family":"Li","given":"Yanfeng"}],"issued":{"date-parts":[["2024",2]]}}},{"id":3914,"uris":["http://zotero.org/users/16939557/items/I3TWLCLT"],"itemData":{"id":3914,"type":"article-journal","abstract":"Abstract\n            The advent of additively manufactured biodegradable porous metals presents a transformative opportunity to meet the criteria of ideal bone substitutes. Precisely tailoring their degradation behavior constitutes a pivotal aspect of this endeavor. In this study, we investigated the effects of topological designs on the degradation profile of laser powder bed fusion (LPBF) Zn scaffolds under dynamic in vitro immersion tests. Specifically, four types of Zn-0.4Mn-0.2Mg scaffolds (beam-based: diamond, face center cubic; surface-based: gyroid, schwarz-P) were designed and fabricated. The degradation mechanism of the scaffolds was comprehensively evaluated using both experimental and simulation methods. The results illuminate the profound impact of structural design on the degradation properties of the Zn alloy scaffolds. The beam-based diamond and face center cubic scaffolds exhibited a degradation rate of 0.08–0.12 mm per year with a relatively uniform degradation mode under dynamic immersion. On the contrary, the surface-based gyroid and Schwarz-P scaffolds demonstrated a notably reduced degradation rate due to lower permeability. This restricted the diffusion of medium ions within the pores, culminating in the accumulation of degradation products and more severe localized degradation. This study underscores the potential of topological design as a compelling strategy for tailoring the degradation profile of additively manufactured biodegradable scaffolds, thereby advancing their suitability as bone substitutes.","citation-key":"shiEffectTopologicalDesign2024","container-title":"npj Materials Degradation","DOI":"10.1038/s41529-024-00451-z","ISSN":"2397-2106","issue":"1","journalAbbreviation":"npj Mater Degrad","language":"en","page":"42","source":"DOI.org (Crossref)","title":"The effect of topological design on the degradation behavior of additively manufactured porous zinc alloy","volume":"8","author":[{"family":"Shi","given":"Yixuan"},{"family":"Xu","given":"Wei"},{"family":"Che","given":"Haodong"},{"family":"Zhao","given":"Shangyan"},{"family":"Chang","given":"Weiwei"},{"family":"Li","given":"Xuan"},{"family":"Lu","given":"Yuchen"},{"family":"Xue","given":"Chenran"},{"family":"Zhang","given":"Dawei"},{"family":"Wang","given":"Lu-Ning"},{"family":"Li","given":"Yageng"}],"issued":{"date-parts":[["2024",4,24]]}}}],"schema":"https://github.com/citation-style-language/schema/raw/master/csl-citation.json"} </w:instrText>
+        </w:r>
+      </w:ins>
+      <w:ins w:id="20008" w:author="Claude" w:date="2026-10-09T02:19:18Z">
+        <w:r>
+          <w:fldChar w:fldCharType="separate"/>
+        </w:r>
+      </w:ins>
+      <w:ins w:id="20009" w:author="Claude" w:date="2026-10-09T02:19:18Z">
+        <w:r>
+          <w:rPr>
+            <w:rFonts w:cs="Times New Roman"/>
+            <w:vertAlign w:val="superscript"/>
+          </w:rPr>
+          <w:t>[12,13]</w:t>
+        </w:r>
+      </w:ins>
+      <w:ins w:id="20010" w:author="Claude" w:date="2026-10-09T02:19:18Z">
+        <w:r>
+          <w:fldChar w:fldCharType="end"/>
+        </w:r>
+      </w:ins>
+      <w:ins w:id="20001" w:author="Claude" w:date="2026-10-09T02:10:29Z">
+        <w:r>
+          <w:t xml:space="preserve">. In the present framework, interface recession, oxygen consumption, Zn²⁺ release, and corrosion-product evolution are unified through a single oxygen-reduction flux arising from the reaction-diffusion system. Oxygen transport, reaction kinetics, and interface evolution are therefore intrinsically coupled, allowing the transition from reaction-controlled to diffusion-controlled degradation to emerge naturally from the governing equations and enabling quantitative prediction of oxygen-mediated degradation behavior.</w:t>
         </w:r>
       </w:ins>
     </w:p>
@@ -8402,7 +8436,7 @@
             <w:b/>
             <w:bCs/>
           </w:rPr>
-          <w:instrText xml:space="preserve"> REF _Ref238652979 \h  \* MERGEFORMAT </w:instrText>
+          <w:delInstrText xml:space="preserve"> REF _Ref238652979 \h  \* MERGEFORMAT </w:delInstrText>
         </w:r>
       </w:del>
       <w:del w:id="20057" w:author="Claude" w:date="2026-10-09T02:10:29Z">
@@ -8509,7 +8543,7 @@
           <w:rPr>
             <w:rFonts w:cs="Times New Roman"/>
           </w:rPr>
-          <w:instrText xml:space="preserve"> ADDIN ZOTERO_ITEM CSL_CITATION {"citationID":"r7domCi5","properties":{"unsorted":false,"formattedCitation":"\\super [31]\\nosupersub{}","plainCitation":"[31]","noteIndex":0},"citationItems":[{"id":1729,"uris":["http://zotero.org/users/16939557/items/TDPP5UDX"],"itemData":{"id":1729,"type":"article-journal","citation-key":"wilderAdaptiveLevelSet2015","container-title":"Journal of Engineering Mathematics","DOI":"10.1007/s10665-014-9732-3","ISSN":"0022-0833, 1573-2703","issue":"1","journalAbbreviation":"J Eng Math","language":"en","page":"121-142","source":"DOI.org (Crossref)","title":"An adaptive level set approach for modeling damage due to galvanic corrosion","volume":"91","author":[{"family":"Wilder","given":"Joseph W."},{"family":"Clemons","given":"Curtis"},{"family":"Golovaty","given":"Dmitry"},{"family":"Kreider","given":"Kevin L."},{"family":"Young","given":"Gerald W."},{"family":"Lillard","given":"R. Scott"}],"issued":{"date-parts":[["2015",4]]}}}],"schema":"https://github.com/citation-style-language/schema/raw/master/csl-citation.json"} </w:instrText>
+          <w:delInstrText xml:space="preserve"> ADDIN ZOTERO_ITEM CSL_CITATION {"citationID":"r7domCi5","properties":{"unsorted":false,"formattedCitation":"\\super [31]\\nosupersub{}","plainCitation":"[31]","noteIndex":0},"citationItems":[{"id":1729,"uris":["http://zotero.org/users/16939557/items/TDPP5UDX"],"itemData":{"id":1729,"type":"article-journal","citation-key":"wilderAdaptiveLevelSet2015","container-title":"Journal of Engineering Mathematics","DOI":"10.1007/s10665-014-9732-3","ISSN":"0022-0833, 1573-2703","issue":"1","journalAbbreviation":"J Eng Math","language":"en","page":"121-142","source":"DOI.org (Crossref)","title":"An adaptive level set approach for modeling damage due to galvanic corrosion","volume":"91","author":[{"family":"Wilder","given":"Joseph W."},{"family":"Clemons","given":"Curtis"},{"family":"Golovaty","given":"Dmitry"},{"family":"Kreider","given":"Kevin L."},{"family":"Young","given":"Gerald W."},{"family":"Lillard","given":"R. Scott"}],"issued":{"date-parts":[["2015",4]]}}}],"schema":"https://github.com/citation-style-language/schema/raw/master/csl-citation.json"} </w:delInstrText>
         </w:r>
       </w:del>
       <w:del w:id="20068" w:author="Claude" w:date="2026-10-09T02:10:29Z">
@@ -9364,7 +9398,7 @@
           <w:rPr>
             <w:rFonts w:cs="Times New Roman"/>
           </w:rPr>
-          <w:instrText xml:space="preserve"> ADDIN ZOTERO_ITEM CSL_CITATION {"citationID":"BuP2nsvm","properties":{"unsorted":false,"formattedCitation":"\\super [32]\\nosupersub{}","plainCitation":"[32]","noteIndex":0},"citationItems":[{"id":1697,"uris":["http://zotero.org/users/16939557/items/M7J7YKJU"],"itemData":{"id":1697,"type":"article-journal","citation-key":"groganPhysicalCorrosionModel2014","container-title":"Acta Biomaterialia","DOI":"10.1016/j.actbio.2013.12.059","ISSN":"17427061","issue":"5","journalAbbreviation":"Acta Biomaterialia","language":"en","page":"2313-2322","source":"DOI.org (Crossref)","title":"A physical corrosion model for bioabsorbable metal stents","volume":"10","author":[{"family":"Grogan","given":"J.A."},{"family":"Leen","given":"S.B."},{"family":"McHugh","given":"P.E."}],"issued":{"date-parts":[["2014",5]]}}}],"schema":"https://github.com/citation-style-language/schema/raw/master/csl-citation.json"} </w:instrText>
+          <w:delInstrText xml:space="preserve"> ADDIN ZOTERO_ITEM CSL_CITATION {"citationID":"BuP2nsvm","properties":{"unsorted":false,"formattedCitation":"\\super [32]\\nosupersub{}","plainCitation":"[32]","noteIndex":0},"citationItems":[{"id":1697,"uris":["http://zotero.org/users/16939557/items/M7J7YKJU"],"itemData":{"id":1697,"type":"article-journal","citation-key":"groganPhysicalCorrosionModel2014","container-title":"Acta Biomaterialia","DOI":"10.1016/j.actbio.2013.12.059","ISSN":"17427061","issue":"5","journalAbbreviation":"Acta Biomaterialia","language":"en","page":"2313-2322","source":"DOI.org (Crossref)","title":"A physical corrosion model for bioabsorbable metal stents","volume":"10","author":[{"family":"Grogan","given":"J.A."},{"family":"Leen","given":"S.B."},{"family":"McHugh","given":"P.E."}],"issued":{"date-parts":[["2014",5]]}}}],"schema":"https://github.com/citation-style-language/schema/raw/master/csl-citation.json"} </w:delInstrText>
         </w:r>
       </w:del>
       <w:del w:id="20271" w:author="Claude" w:date="2026-10-09T01:35:33Z">
@@ -14485,7 +14519,7 @@
                   <w:sz w:val="22"/>
                   <w:szCs w:val="22"/>
                 </w:rPr>
-                <w:instrText xml:space="preserve"> ADDIN ZOTERO_ITEM CSL_CITATION {"citationID":"4uE0bPh7","properties":{"unsorted":false,"formattedCitation":"\\super [37]\\nosupersub{}","plainCitation":"[37]","noteIndex":0},"citationItems":[{"id":3507,"uris":["http://zotero.org/users/16939557/items/3SWFGNFX"],"itemData":{"id":3507,"type":"article-journal","citation-key":"chenFluidinducedCorrosionBehavior2021","container-title":"Journal of Materials Science &amp; Technology","DOI":"10.1016/j.jmst.2021.02.050","ISSN":"10050302","journalAbbreviation":"Journal of Materials Science &amp; Technology","language":"en","page":"134-147","source":"DOI.org (Crossref)","title":"Fluid-induced corrosion behavior of degradable zinc for stent application","volume":"91","author":[{"family":"Chen","given":"Kai"},{"family":"Gu","given":"Xuenan"},{"family":"Sun","given":"Hui"},{"family":"Tang","given":"Hongyan"},{"family":"Yang","given":"Hongtao"},{"family":"Gong","given":"Xianghui"},{"family":"Fan","given":"Yubo"}],"issued":{"date-parts":[["2021",11]]}}}],"schema":"https://github.com/citation-style-language/schema/raw/master/csl-citation.json"} </w:instrText>
+                <w:delInstrText xml:space="preserve"> ADDIN ZOTERO_ITEM CSL_CITATION {"citationID":"4uE0bPh7","properties":{"unsorted":false,"formattedCitation":"\\super [37]\\nosupersub{}","plainCitation":"[37]","noteIndex":0},"citationItems":[{"id":3507,"uris":["http://zotero.org/users/16939557/items/3SWFGNFX"],"itemData":{"id":3507,"type":"article-journal","citation-key":"chenFluidinducedCorrosionBehavior2021","container-title":"Journal of Materials Science &amp; Technology","DOI":"10.1016/j.jmst.2021.02.050","ISSN":"10050302","journalAbbreviation":"Journal of Materials Science &amp; Technology","language":"en","page":"134-147","source":"DOI.org (Crossref)","title":"Fluid-induced corrosion behavior of degradable zinc for stent application","volume":"91","author":[{"family":"Chen","given":"Kai"},{"family":"Gu","given":"Xuenan"},{"family":"Sun","given":"Hui"},{"family":"Tang","given":"Hongyan"},{"family":"Yang","given":"Hongtao"},{"family":"Gong","given":"Xianghui"},{"family":"Fan","given":"Yubo"}],"issued":{"date-parts":[["2021",11]]}}}],"schema":"https://github.com/citation-style-language/schema/raw/master/csl-citation.json"} </w:delInstrText>
               </w:r>
             </w:del>
             <w:del w:id="20452" w:author="Claude" w:date="2026-10-09T01:35:33Z">
@@ -16124,7 +16158,7 @@
             <w:b/>
             <w:bCs/>
           </w:rPr>
-          <w:instrText xml:space="preserve"> REF _Ref239754266 \h  \* MERGEFORMAT </w:instrText>
+          <w:delInstrText xml:space="preserve"> REF _Ref239754266 \h  \* MERGEFORMAT </w:delInstrText>
         </w:r>
       </w:del>
       <w:del w:id="20459" w:author="Claude" w:date="2026-10-09T01:35:33Z">
@@ -16651,7 +16685,7 @@
             <w:b/>
             <w:bCs/>
           </w:rPr>
-          <w:instrText xml:space="preserve"> REF _Ref238635735 \h  \* MERGEFORMAT </w:instrText>
+          <w:delInstrText xml:space="preserve"> REF _Ref238635735 \h  \* MERGEFORMAT </w:delInstrText>
         </w:r>
       </w:del>
       <w:del w:id="20482" w:author="Claude" w:date="2026-10-09T01:35:33Z">
@@ -16731,7 +16765,7 @@
           <w:rPr>
             <w:rFonts w:cs="Times New Roman"/>
           </w:rPr>
-          <w:instrText xml:space="preserve"> ADDIN ZOTERO_ITEM CSL_CITATION {"citationID":"mKeaFACI","properties":{"unsorted":false,"formattedCitation":"\\super [21]\\nosupersub{}","plainCitation":"[21]","noteIndex":0},"citationItems":[{"id":3837,"uris":["http://zotero.org/users/16939557/items/FRKT7M6B"],"itemData":{"id":3837,"type":"article-journal","citation-key":"zhangComparativeInvestigationCorrosion2024","container-title":"Materials Today Communications","DOI":"10.1016/j.mtcomm.2024.108811","ISSN":"23524928","journalAbbreviation":"Materials Today Communications","language":"en","page":"108811","source":"DOI.org (Crossref)","title":"Comparative investigation of the corrosion behavior of biomedical zinc alloys in oxygen-enriched simulated body fluid environments","volume":"39","author":[{"family":"Zhang","given":"Dekang"},{"family":"Zhang","given":"Lu"},{"family":"Zhang","given":"Xin"},{"family":"Dai","given":"Jianwei"},{"family":"Zhao","given":"Yanbin"},{"family":"Yang","given":"Qianzi"},{"family":"Bai","given":"Jing"},{"family":"Xue","given":"Feng"},{"family":"Chu","given":"Paul K."},{"family":"Chu","given":"Chenglin"}],"issued":{"date-parts":[["2024",6]]}}}],"schema":"https://github.com/citation-style-language/schema/raw/master/csl-citation.json"} </w:instrText>
+          <w:delInstrText xml:space="preserve"> ADDIN ZOTERO_ITEM CSL_CITATION {"citationID":"mKeaFACI","properties":{"unsorted":false,"formattedCitation":"\\super [21]\\nosupersub{}","plainCitation":"[21]","noteIndex":0},"citationItems":[{"id":3837,"uris":["http://zotero.org/users/16939557/items/FRKT7M6B"],"itemData":{"id":3837,"type":"article-journal","citation-key":"zhangComparativeInvestigationCorrosion2024","container-title":"Materials Today Communications","DOI":"10.1016/j.mtcomm.2024.108811","ISSN":"23524928","journalAbbreviation":"Materials Today Communications","language":"en","page":"108811","source":"DOI.org (Crossref)","title":"Comparative investigation of the corrosion behavior of biomedical zinc alloys in oxygen-enriched simulated body fluid environments","volume":"39","author":[{"family":"Zhang","given":"Dekang"},{"family":"Zhang","given":"Lu"},{"family":"Zhang","given":"Xin"},{"family":"Dai","given":"Jianwei"},{"family":"Zhao","given":"Yanbin"},{"family":"Yang","given":"Qianzi"},{"family":"Bai","given":"Jing"},{"family":"Xue","given":"Feng"},{"family":"Chu","given":"Paul K."},{"family":"Chu","given":"Chenglin"}],"issued":{"date-parts":[["2024",6]]}}}],"schema":"https://github.com/citation-style-language/schema/raw/master/csl-citation.json"} </w:delInstrText>
         </w:r>
       </w:del>
       <w:del w:id="20491" w:author="Claude" w:date="2026-10-09T01:35:33Z">
@@ -17118,7 +17152,53 @@
       </w:ins>
       <w:ins w:id="20550" w:author="Claude" w:date="2026-10-09T01:35:33Z">
         <w:r>
-          <w:t xml:space="preserve">) and the oxygen diffusivity had smaller effects [ranking to be confirmed by repeating the analysis over the calibration ranges]. The diffusivities of Zn²⁺, Cl⁻ and OH⁻ showed negligible sensitivity and were fixed at literature values (Table 1). The strong sensitivity to oxygen-related parameters is consistent with experimental observations of oxygen-controlled Zn biodegradation under physiological conditions [21]. C</w:t>
+          <w:t xml:space="preserve">) and the oxygen diffusivity had smaller effects [ranking to be confirmed by repeating the analysis over the calibration ranges]. The diffusivities of Zn²⁺, Cl⁻ and OH⁻ showed negligible sensitivity and were fixed at literature values (Table 1). The strong sensitivity to oxygen-related parameters is consistent with experimental observations of oxygen-controlled Zn biodegradation under physiological conditions </w:t>
+        </w:r>
+      </w:ins>
+      <w:ins w:id="20001" w:author="Claude" w:date="2026-10-09T02:19:18Z">
+        <w:r>
+          <w:rPr>
+            <w:rFonts w:cs="Times New Roman"/>
+          </w:rPr>
+          <w:fldChar w:fldCharType="begin"/>
+        </w:r>
+      </w:ins>
+      <w:ins w:id="20002" w:author="Claude" w:date="2026-10-09T02:19:18Z">
+        <w:r>
+          <w:rPr>
+            <w:rFonts w:cs="Times New Roman"/>
+          </w:rPr>
+          <w:delInstrText xml:space="preserve"> ADDIN ZOTERO_ITEM CSL_CITATION {"citationID":"mKeaFACI","properties":{"unsorted":false,"formattedCitation":"\\super [21]\\nosupersub{}","plainCitation":"[21]","noteIndex":0},"citationItems":[{"id":3837,"uris":["http://zotero.org/users/16939557/items/FRKT7M6B"],"itemData":{"id":3837,"type":"article-journal","citation-key":"zhangComparativeInvestigationCorrosion2024","container-title":"Materials Today Communications","DOI":"10.1016/j.mtcomm.2024.108811","ISSN":"23524928","journalAbbreviation":"Materials Today Communications","language":"en","page":"108811","source":"DOI.org (Crossref)","title":"Comparative investigation of the corrosion behavior of biomedical zinc alloys in oxygen-enriched simulated body fluid environments","volume":"39","author":[{"family":"Zhang","given":"Dekang"},{"family":"Zhang","given":"Lu"},{"family":"Zhang","given":"Xin"},{"family":"Dai","given":"Jianwei"},{"family":"Zhao","given":"Yanbin"},{"family":"Yang","given":"Qianzi"},{"family":"Bai","given":"Jing"},{"family":"Xue","given":"Feng"},{"family":"Chu","given":"Paul K."},{"family":"Chu","given":"Chenglin"}],"issued":{"date-parts":[["2024",6]]}}}],"schema":"https://github.com/citation-style-language/schema/raw/master/csl-citation.json"} </w:delInstrText>
+        </w:r>
+      </w:ins>
+      <w:ins w:id="20003" w:author="Claude" w:date="2026-10-09T02:19:18Z">
+        <w:r>
+          <w:rPr>
+            <w:rFonts w:cs="Times New Roman"/>
+          </w:rPr>
+          <w:fldChar w:fldCharType="separate"/>
+        </w:r>
+      </w:ins>
+      <w:ins w:id="20004" w:author="Claude" w:date="2026-10-09T02:19:18Z">
+        <w:r>
+          <w:rPr>
+            <w:rFonts w:cs="Times New Roman"/>
+            <w:vertAlign w:val="superscript"/>
+          </w:rPr>
+          <w:delText xml:space="preserve">[21]</w:delText>
+        </w:r>
+      </w:ins>
+      <w:ins w:id="20005" w:author="Claude" w:date="2026-10-09T02:19:18Z">
+        <w:r>
+          <w:rPr>
+            <w:rFonts w:cs="Times New Roman"/>
+          </w:rPr>
+          <w:fldChar w:fldCharType="end"/>
+        </w:r>
+      </w:ins>
+      <w:ins w:id="20550" w:author="Claude" w:date="2026-10-09T01:35:33Z">
+        <w:r>
+          <w:t xml:space="preserve">. C</w:t>
         </w:r>
       </w:ins>
       <w:ins w:id="20551" w:author="Claude" w:date="2026-10-09T01:35:33Z">
@@ -17266,7 +17346,7 @@
             <w:b/>
             <w:bCs/>
           </w:rPr>
-          <w:instrText xml:space="preserve"> REF _Ref239754266 \h  \* MERGEFORMAT </w:instrText>
+          <w:delInstrText xml:space="preserve"> REF _Ref239754266 \h  \* MERGEFORMAT </w:delInstrText>
         </w:r>
       </w:del>
       <w:del w:id="20570" w:author="Claude" w:date="2026-10-09T01:35:33Z">
@@ -17377,7 +17457,7 @@
             <w:b/>
             <w:bCs/>
           </w:rPr>
-          <w:instrText xml:space="preserve"> REF _Ref238636197 \h  \* MERGEFORMAT </w:instrText>
+          <w:delInstrText xml:space="preserve"> REF _Ref238636197 \h  \* MERGEFORMAT </w:delInstrText>
         </w:r>
       </w:del>
       <w:del w:id="20585" w:author="Claude" w:date="2026-10-09T01:35:33Z">

</xml_diff>

<commit_message>
In vitro results: large SD at 28 d, plateau consistent with data not statistically demonstrated
</commit_message>
<xml_diff>
--- a/deliver/Manuscript_tracked.docx
+++ b/deliver/Manuscript_tracked.docx
@@ -16569,7 +16569,43 @@
         <w:rPr>
           <w:rFonts w:cs="Times New Roman"/>
         </w:rPr>
-        <w:t>pproximately 67% of the 28-day mass loss occurred within the first week, demonstrating a transition from rapid initial degradation to progressively slower material loss. This nonlinear response is consistent with the formation and maturation of Zn corrosion products in physiological chloride-containing media, which progressively restrict oxygen transport to the metal surface and suppress the cathodic oxygen-reduction rate. The measured mass-loss range and temporal deceleration agree with previous observations for commercially pure Zn under comparable physiological conditions</w:t>
+        <w:t xml:space="preserve">pproximately 67% of the 28-day mass loss occurred within the first week, </w:t>
+      </w:r>
+      <w:del w:id="9003" w:author="Claude" w:date="2026-10-09T04:00:48Z">
+        <w:r>
+          <w:rPr>
+            <w:rFonts w:cs="Times New Roman"/>
+          </w:rPr>
+          <w:delText xml:space="preserve">demonstrating</w:delText>
+        </w:r>
+      </w:del>
+      <w:ins w:id="9002" w:author="Claude" w:date="2026-10-09T04:00:48Z">
+        <w:r>
+          <w:rPr>
+            <w:rFonts w:cs="Times New Roman"/>
+          </w:rPr>
+          <w:t xml:space="preserve">indicating</w:t>
+        </w:r>
+      </w:ins>
+      <w:r>
+        <w:rPr>
+          <w:rFonts w:cs="Times New Roman"/>
+        </w:rPr>
+        <w:t xml:space="preserve"> a transition from rapid initial degradation to progressively slower material loss</w:t>
+      </w:r>
+      <w:ins w:id="9001" w:author="Claude" w:date="2026-10-09T04:00:48Z">
+        <w:r>
+          <w:rPr>
+            <w:rFonts w:cs="Times New Roman"/>
+          </w:rPr>
+          <w:t xml:space="preserve">. The relative standard deviations are large, particularly at 28 days (n = 3), and the 14-day (3.03 ± 0.74 mg) and 28-day (3.67 ± 1.33 mg) values overlap substantially, so the apparent slowing between 14 and 28 days is consistent with the data but not statistically demonstrated</w:t>
+        </w:r>
+      </w:ins>
+      <w:r>
+        <w:rPr>
+          <w:rFonts w:cs="Times New Roman"/>
+        </w:rPr>
+        <w:t xml:space="preserve">. This nonlinear response is consistent with the formation and maturation of Zn corrosion products in physiological chloride-containing media, which progressively restrict oxygen transport to the metal surface and suppress the cathodic oxygen-reduction rate. The measured mass-loss range and temporal deceleration agree with previous observations for commercially pure Zn under comparable physiological conditions</w:t>
       </w:r>
       <w:r>
         <w:rPr>

</xml_diff>

<commit_message>
SI S1: interfacial O2 balance and interface velocity derivation; Table S1 now flux regimes; Figure S1 removed and figures renumbered; refs, workbook, response updated
</commit_message>
<xml_diff>
--- a/deliver/Manuscript_tracked.docx
+++ b/deliver/Manuscript_tracked.docx
@@ -18780,8 +18780,26 @@
           <w:b/>
           <w:bCs/>
         </w:rPr>
-        <w:t>Figure S8</w:t>
-      </w:r>
+        <w:t xml:space="preserve">Figure </w:t>
+      </w:r>
+      <w:del w:id="9002" w:author="Claude" w:date="2026-10-09T04:34:55Z">
+        <w:r>
+          <w:rPr>
+            <w:b/>
+            <w:bCs/>
+          </w:rPr>
+          <w:delText xml:space="preserve">S8</w:delText>
+        </w:r>
+      </w:del>
+      <w:ins w:id="9001" w:author="Claude" w:date="2026-10-09T04:34:55Z">
+        <w:r>
+          <w:rPr>
+            <w:b/>
+            <w:bCs/>
+          </w:rPr>
+          <w:t xml:space="preserve">S7</w:t>
+        </w:r>
+      </w:ins>
       <w:r>
         <w:t>)</w:t>
       </w:r>

</xml_diff>

<commit_message>
Manuscript: j_ORR molar-flux equation set (Eqs. 7, 9, 10, 14), kappa(F), units
</commit_message>
<xml_diff>
--- a/deliver/Manuscript_tracked.docx
+++ b/deliver/Manuscript_tracked.docx
@@ -290,7 +290,6 @@
           <w:b/>
           <w:bCs/>
         </w:rPr>
-        <w:lastRenderedPageBreak/>
         <w:t>Abstract</w:t>
       </w:r>
     </w:p>
@@ -342,7 +341,6 @@
           <w:b/>
           <w:bCs/>
         </w:rPr>
-        <w:lastRenderedPageBreak/>
         <w:t>Table of Contents</w:t>
       </w:r>
     </w:p>
@@ -466,7 +464,6 @@
         <w:pStyle w:val="Heading1"/>
       </w:pPr>
       <w:r>
-        <w:lastRenderedPageBreak/>
         <w:t>Introduction</w:t>
       </w:r>
     </w:p>
@@ -741,7 +738,6 @@
         <w:t xml:space="preserve"> calibrated parameters. Their predictive </w:t>
       </w:r>
       <w:r>
-        <w:lastRenderedPageBreak/>
         <w:t>capability may therefore be limited outside the geometries and environmental conditions used for calibration</w:t>
       </w:r>
       <w:r>
@@ -1031,7 +1027,6 @@
         <w:pStyle w:val="Heading1"/>
       </w:pPr>
       <w:r>
-        <w:lastRenderedPageBreak/>
         <w:t>Method</w:t>
       </w:r>
       <w:r>
@@ -1345,7 +1340,6 @@
         <w:rPr>
           <w:rFonts w:cs="Times New Roman"/>
         </w:rPr>
-        <w:lastRenderedPageBreak/>
         <w:t>ultrasonically cleaned in Milli-Q water, acetone, and ethanol to remove residual surface contaminants, then dried and stored under vacuum until use. Hanks’ Balanced Salt Solution (HBSS; Gibco, calcium- and magnesium-free; pH 7.4) was selected as the immersion medium.</w:t>
       </w:r>
     </w:p>
@@ -2938,7 +2932,6 @@
         <w:rPr>
           <w:rFonts w:cs="Times New Roman"/>
         </w:rPr>
-        <w:lastRenderedPageBreak/>
         <w:t xml:space="preserve">Overall degradation </w:t>
       </w:r>
       <w:r>
@@ -3322,7 +3315,6 @@
         <w:rPr>
           <w:rFonts w:cs="Times New Roman"/>
         </w:rPr>
-        <w:lastRenderedPageBreak/>
         <w:t>together with the static immersion conditions considered in this study (</w:t>
       </w:r>
       <m:oMath>
@@ -3979,6 +3971,220 @@
     <w:p>
       <w:pPr>
         <w:pStyle w:val="BodyText"/>
+        <w:rPr>
+          <w:ins w:id="20040" w:author="Claude" w:date="2026-10-09T05:44:13Z"/>
+        </w:rPr>
+      </w:pPr>
+      <w:ins w:id="20039" w:author="Claude" w:date="2026-10-09T05:44:13Z">
+        <w:r>
+          <w:t xml:space="preserve">All concentrations and F are expressed as molar quantities (mol mm⁻³; F as Zn-equivalent). The oxygen-reduction (ORR) molar flux at the interface is defined as</w:t>
+        </w:r>
+      </w:ins>
+    </w:p>
+    <w:p>
+      <w:pPr>
+        <w:pStyle w:val="BodyText"/>
+        <w:rPr>
+          <w:ins w:id="20063" w:author="Claude" w:date="2026-10-09T05:44:13Z"/>
+        </w:rPr>
+      </w:pPr>
+      <m:oMath>
+        <m:r>
+          <w:rPr>
+            <w:ins w:id="20054" w:author="Claude" w:date="2026-10-09T05:44:13Z"/>
+            <w:ins w:id="20043" w:author="Claude" w:date="2026-10-09T05:44:13Z"/>
+          </w:rPr>
+          <m:t xml:space="preserve">=</m:t>
+        </m:r>
+        <m:sSub>
+          <m:e>
+            <m:r>
+              <w:rPr>
+                <w:ins w:id="20055" w:author="Claude" w:date="2026-10-09T05:44:13Z"/>
+                <w:ins w:id="20044" w:author="Claude" w:date="2026-10-09T05:44:13Z"/>
+              </w:rPr>
+              <m:t xml:space="preserve">k</m:t>
+            </m:r>
+          </m:e>
+          <m:sub>
+            <m:r>
+              <w:rPr>
+                <w:ins w:id="20056" w:author="Claude" w:date="2026-10-09T05:44:13Z"/>
+                <w:ins w:id="20045" w:author="Claude" w:date="2026-10-09T05:44:13Z"/>
+              </w:rPr>
+              <m:t xml:space="preserve">ORR</m:t>
+            </m:r>
+          </m:sub>
+        </m:sSub>
+        <m:r>
+          <w:rPr>
+            <w:ins w:id="20057" w:author="Claude" w:date="2026-10-09T05:44:13Z"/>
+            <w:ins w:id="20046" w:author="Claude" w:date="2026-10-09T05:44:13Z"/>
+          </w:rPr>
+          <m:t xml:space="preserve">κ(F)</m:t>
+        </m:r>
+        <m:sSub>
+          <m:e>
+            <m:r>
+              <w:rPr>
+                <w:ins w:id="20058" w:author="Claude" w:date="2026-10-09T05:44:13Z"/>
+                <w:ins w:id="20047" w:author="Claude" w:date="2026-10-09T05:44:13Z"/>
+              </w:rPr>
+              <m:t xml:space="preserve">C</m:t>
+            </m:r>
+          </m:e>
+          <m:sub>
+            <m:r>
+              <w:rPr>
+                <w:ins w:id="20059" w:author="Claude" w:date="2026-10-09T05:44:13Z"/>
+                <w:ins w:id="20048" w:author="Claude" w:date="2026-10-09T05:44:13Z"/>
+              </w:rPr>
+              <m:t xml:space="preserve">O₂</m:t>
+            </m:r>
+          </m:sub>
+        </m:sSub>
+        <m:sSub>
+          <m:e>
+            <m:r>
+              <w:rPr>
+                <w:ins w:id="20060" w:author="Claude" w:date="2026-10-09T05:44:13Z"/>
+                <w:ins w:id="20049" w:author="Claude" w:date="2026-10-09T05:44:13Z"/>
+              </w:rPr>
+              <m:t xml:space="preserve">|</m:t>
+            </m:r>
+          </m:e>
+          <m:sub>
+            <m:r>
+              <w:rPr>
+                <w:ins w:id="20061" w:author="Claude" w:date="2026-10-09T05:44:13Z"/>
+                <w:ins w:id="20050" w:author="Claude" w:date="2026-10-09T05:44:13Z"/>
+              </w:rPr>
+              <m:t xml:space="preserve">Γ</m:t>
+            </m:r>
+          </m:sub>
+        </m:sSub>
+        <m:r>
+          <w:rPr>
+            <w:ins w:id="20062" w:author="Claude" w:date="2026-10-09T05:44:13Z"/>
+            <w:ins w:id="20051" w:author="Claude" w:date="2026-10-09T05:44:13Z"/>
+          </w:rPr>
+          <m:t xml:space="preserve"> [mol mm⁻² h⁻¹]</m:t>
+        </m:r>
+      </m:oMath>
+    </w:p>
+    <w:p>
+      <w:pPr>
+        <w:pStyle w:val="BodyText"/>
+        <w:rPr>
+          <w:ins w:id="20067" w:author="Claude" w:date="2026-10-09T05:44:13Z"/>
+        </w:rPr>
+      </w:pPr>
+      <w:ins w:id="20064" w:author="Claude" w:date="2026-10-09T05:44:13Z">
+        <w:r>
+          <w:t xml:space="preserve">where k</w:t>
+        </w:r>
+      </w:ins>
+      <w:ins w:id="20065" w:author="Claude" w:date="2026-10-09T05:44:13Z">
+        <w:r>
+          <w:rPr>
+            <w:vertAlign w:val="subscript"/>
+          </w:rPr>
+          <w:t xml:space="preserve">ORR</w:t>
+        </w:r>
+      </w:ins>
+      <w:ins w:id="20066" w:author="Claude" w:date="2026-10-09T05:44:13Z">
+        <w:r>
+          <w:t xml:space="preserve"> is a velocity (mm h⁻¹) and κ(F) is the factor by which the corrosion-product film reduces the reaction, using the same porosity (ε) and tortuosity (τ) reduction as the effective-diffusivity law of Equation 12:</w:t>
+        </w:r>
+      </w:ins>
+    </w:p>
+    <w:p>
+      <w:pPr>
+        <w:pStyle w:val="BodyText"/>
+        <w:rPr>
+          <w:ins w:id="20084" w:author="Claude" w:date="2026-10-09T05:44:13Z"/>
+        </w:rPr>
+      </w:pPr>
+      <m:oMath>
+        <m:r>
+          <w:rPr>
+            <w:ins w:id="20076" w:author="Claude" w:date="2026-10-09T05:44:13Z"/>
+            <w:ins w:id="20068" w:author="Claude" w:date="2026-10-09T05:44:13Z"/>
+          </w:rPr>
+          <m:t xml:space="preserve">κ(F)=1−</m:t>
+        </m:r>
+        <m:f>
+          <m:num>
+            <m:r>
+              <w:rPr>
+                <w:ins w:id="20077" w:author="Claude" w:date="2026-10-09T05:44:13Z"/>
+                <w:ins w:id="20069" w:author="Claude" w:date="2026-10-09T05:44:13Z"/>
+              </w:rPr>
+              <m:t xml:space="preserve">F</m:t>
+            </m:r>
+          </m:num>
+          <m:den>
+            <m:sSub>
+              <m:e>
+                <m:r>
+                  <w:rPr>
+                    <w:ins w:id="20078" w:author="Claude" w:date="2026-10-09T05:44:13Z"/>
+                    <w:ins w:id="20070" w:author="Claude" w:date="2026-10-09T05:44:13Z"/>
+                  </w:rPr>
+                  <m:t xml:space="preserve">F</m:t>
+                </m:r>
+              </m:e>
+              <m:sub>
+                <m:r>
+                  <w:rPr>
+                    <w:ins w:id="20079" w:author="Claude" w:date="2026-10-09T05:44:13Z"/>
+                    <w:ins w:id="20071" w:author="Claude" w:date="2026-10-09T05:44:13Z"/>
+                  </w:rPr>
+                  <m:t xml:space="preserve">max</m:t>
+                </m:r>
+              </m:sub>
+            </m:sSub>
+          </m:den>
+        </m:f>
+        <m:r>
+          <w:rPr>
+            <w:ins w:id="20080" w:author="Claude" w:date="2026-10-09T05:44:13Z"/>
+            <w:ins w:id="20072" w:author="Claude" w:date="2026-10-09T05:44:13Z"/>
+          </w:rPr>
+          <m:t xml:space="preserve">(1−</m:t>
+        </m:r>
+        <m:f>
+          <m:num>
+            <m:r>
+              <w:rPr>
+                <w:ins w:id="20081" w:author="Claude" w:date="2026-10-09T05:44:13Z"/>
+                <w:ins w:id="20073" w:author="Claude" w:date="2026-10-09T05:44:13Z"/>
+              </w:rPr>
+              <m:t xml:space="preserve">ε</m:t>
+            </m:r>
+          </m:num>
+          <m:den>
+            <m:r>
+              <w:rPr>
+                <w:ins w:id="20082" w:author="Claude" w:date="2026-10-09T05:44:13Z"/>
+                <w:ins w:id="20074" w:author="Claude" w:date="2026-10-09T05:44:13Z"/>
+              </w:rPr>
+              <m:t xml:space="preserve">τ</m:t>
+            </m:r>
+          </m:den>
+        </m:f>
+        <m:r>
+          <w:rPr>
+            <w:ins w:id="20083" w:author="Claude" w:date="2026-10-09T05:44:13Z"/>
+            <w:ins w:id="20075" w:author="Claude" w:date="2026-10-09T05:44:13Z"/>
+          </w:rPr>
+          <m:t xml:space="preserve">)</m:t>
+        </m:r>
+      </m:oMath>
+    </w:p>
+    <w:p>
+      <w:pPr>
+        <w:pStyle w:val="BodyText"/>
         <w:tabs>
           <w:tab w:val="right" w:pos="9360"/>
         </w:tabs>
@@ -4003,6 +4209,7 @@
                 <m:sty m:val="p"/>
               </m:rPr>
               <w:rPr>
+                <w:del w:id="20102" w:author="Claude" w:date="2026-10-09T05:44:13Z"/>
                 <w:rFonts w:ascii="Cambria Math" w:hAnsi="Cambria Math" w:cs="Times New Roman"/>
               </w:rPr>
               <m:t>∂</m:t>
@@ -4018,6 +4225,7 @@
               <m:e>
                 <m:r>
                   <w:rPr>
+                    <w:del w:id="20103" w:author="Claude" w:date="2026-10-09T05:44:13Z"/>
                     <w:rFonts w:ascii="Cambria Math" w:hAnsi="Cambria Math" w:cs="Times New Roman"/>
                   </w:rPr>
                   <m:t>C</m:t>
@@ -4038,6 +4246,7 @@
                         <m:sty m:val="p"/>
                       </m:rPr>
                       <w:rPr>
+                        <w:del w:id="20104" w:author="Claude" w:date="2026-10-09T05:44:13Z"/>
                         <w:rFonts w:ascii="Cambria Math" w:hAnsi="Cambria Math" w:cs="Times New Roman"/>
                       </w:rPr>
                       <m:t>O</m:t>
@@ -4049,6 +4258,7 @@
                         <m:sty m:val="p"/>
                       </m:rPr>
                       <w:rPr>
+                        <w:del w:id="20105" w:author="Claude" w:date="2026-10-09T05:44:13Z"/>
                         <w:rFonts w:ascii="Cambria Math" w:hAnsi="Cambria Math" w:cs="Times New Roman"/>
                       </w:rPr>
                       <m:t>2</m:t>
@@ -4064,12 +4274,14 @@
                 <m:sty m:val="p"/>
               </m:rPr>
               <w:rPr>
+                <w:del w:id="20106" w:author="Claude" w:date="2026-10-09T05:44:13Z"/>
                 <w:rFonts w:ascii="Cambria Math" w:hAnsi="Cambria Math" w:cs="Times New Roman"/>
               </w:rPr>
               <m:t>∂</m:t>
             </m:r>
             <m:r>
               <w:rPr>
+                <w:del w:id="20107" w:author="Claude" w:date="2026-10-09T05:44:13Z"/>
                 <w:rFonts w:ascii="Cambria Math" w:hAnsi="Cambria Math" w:cs="Times New Roman"/>
               </w:rPr>
               <m:t>t</m:t>
@@ -4081,6 +4293,7 @@
             <m:sty m:val="p"/>
           </m:rPr>
           <w:rPr>
+            <w:del w:id="20108" w:author="Claude" w:date="2026-10-09T05:44:13Z"/>
             <w:rFonts w:ascii="Cambria Math" w:hAnsi="Cambria Math" w:cs="Times New Roman"/>
           </w:rPr>
           <m:t>=∇⋅</m:t>
@@ -4105,6 +4318,7 @@
               <m:e>
                 <m:r>
                   <w:rPr>
+                    <w:del w:id="20109" w:author="Claude" w:date="2026-10-09T05:44:13Z"/>
                     <w:rFonts w:ascii="Cambria Math" w:hAnsi="Cambria Math" w:cs="Times New Roman"/>
                   </w:rPr>
                   <m:t>D</m:t>
@@ -4125,6 +4339,7 @@
                         <m:sty m:val="p"/>
                       </m:rPr>
                       <w:rPr>
+                        <w:del w:id="20110" w:author="Claude" w:date="2026-10-09T05:44:13Z"/>
                         <w:rFonts w:ascii="Cambria Math" w:hAnsi="Cambria Math" w:cs="Times New Roman"/>
                       </w:rPr>
                       <m:t>O</m:t>
@@ -4136,6 +4351,7 @@
                         <m:sty m:val="p"/>
                       </m:rPr>
                       <w:rPr>
+                        <w:del w:id="20111" w:author="Claude" w:date="2026-10-09T05:44:13Z"/>
                         <w:rFonts w:ascii="Cambria Math" w:hAnsi="Cambria Math" w:cs="Times New Roman"/>
                       </w:rPr>
                       <m:t>2</m:t>
@@ -4149,6 +4365,7 @@
                     <m:nor/>
                   </m:rPr>
                   <w:rPr>
+                    <w:del w:id="20112" w:author="Claude" w:date="2026-10-09T05:44:13Z"/>
                     <w:rFonts w:cs="Times New Roman"/>
                   </w:rPr>
                   <m:t>eff</m:t>
@@ -4157,6 +4374,7 @@
             </m:sSubSup>
             <m:r>
               <w:rPr>
+                <w:del w:id="20113" w:author="Claude" w:date="2026-10-09T05:44:13Z"/>
                 <w:rFonts w:ascii="Cambria Math" w:hAnsi="Cambria Math" w:cs="Times New Roman"/>
               </w:rPr>
               <m:t> </m:t>
@@ -4166,6 +4384,7 @@
                 <m:sty m:val="p"/>
               </m:rPr>
               <w:rPr>
+                <w:del w:id="20114" w:author="Claude" w:date="2026-10-09T05:44:13Z"/>
                 <w:rFonts w:ascii="Cambria Math" w:hAnsi="Cambria Math" w:cs="Times New Roman"/>
               </w:rPr>
               <m:t>∇</m:t>
@@ -4181,6 +4400,7 @@
               <m:e>
                 <m:r>
                   <w:rPr>
+                    <w:del w:id="20115" w:author="Claude" w:date="2026-10-09T05:44:13Z"/>
                     <w:rFonts w:ascii="Cambria Math" w:hAnsi="Cambria Math" w:cs="Times New Roman"/>
                   </w:rPr>
                   <m:t>C</m:t>
@@ -4201,6 +4421,7 @@
                         <m:sty m:val="p"/>
                       </m:rPr>
                       <w:rPr>
+                        <w:del w:id="20116" w:author="Claude" w:date="2026-10-09T05:44:13Z"/>
                         <w:rFonts w:ascii="Cambria Math" w:hAnsi="Cambria Math" w:cs="Times New Roman"/>
                       </w:rPr>
                       <m:t>O</m:t>
@@ -4212,6 +4433,7 @@
                         <m:sty m:val="p"/>
                       </m:rPr>
                       <w:rPr>
+                        <w:del w:id="20117" w:author="Claude" w:date="2026-10-09T05:44:13Z"/>
                         <w:rFonts w:ascii="Cambria Math" w:hAnsi="Cambria Math" w:cs="Times New Roman"/>
                       </w:rPr>
                       <m:t>2</m:t>
@@ -4227,6 +4449,7 @@
             <m:sty m:val="p"/>
           </m:rPr>
           <w:rPr>
+            <w:del w:id="20118" w:author="Claude" w:date="2026-10-09T05:44:13Z"/>
             <w:rFonts w:ascii="Cambria Math" w:hAnsi="Cambria Math" w:cs="Times New Roman"/>
           </w:rPr>
           <m:t>-</m:t>
@@ -4242,6 +4465,7 @@
           <m:e>
             <m:r>
               <w:rPr>
+                <w:del w:id="20119" w:author="Claude" w:date="2026-10-09T05:44:13Z"/>
                 <w:rFonts w:ascii="Cambria Math" w:hAnsi="Cambria Math" w:cs="Times New Roman"/>
               </w:rPr>
               <m:t>k</m:t>
@@ -4253,6 +4477,7 @@
                 <m:sty m:val="p"/>
               </m:rPr>
               <w:rPr>
+                <w:del w:id="20120" w:author="Claude" w:date="2026-10-09T05:44:13Z"/>
                 <w:rFonts w:ascii="Cambria Math" w:hAnsi="Cambria Math" w:cs="Times New Roman"/>
               </w:rPr>
               <m:t>ORR</m:t>
@@ -4261,6 +4486,7 @@
         </m:sSub>
         <m:r>
           <w:rPr>
+            <w:del w:id="20121" w:author="Claude" w:date="2026-10-09T05:44:13Z"/>
             <w:rFonts w:ascii="Cambria Math" w:hAnsi="Cambria Math" w:cs="Times New Roman"/>
           </w:rPr>
           <m:t> </m:t>
@@ -4276,24 +4502,28 @@
           <m:e>
             <m:r>
               <w:rPr>
+                <w:del w:id="20122" w:author="Claude" w:date="2026-10-09T05:44:13Z"/>
                 <w:rFonts w:ascii="Cambria Math" w:hAnsi="Cambria Math"/>
               </w:rPr>
               <m:t>κ(</m:t>
             </m:r>
             <m:r>
               <w:rPr>
+                <w:del w:id="20123" w:author="Claude" w:date="2026-10-09T05:44:13Z"/>
                 <w:rFonts w:ascii="Cambria Math" w:hAnsi="Cambria Math"/>
               </w:rPr>
               <m:t>F</m:t>
             </m:r>
             <m:r>
               <w:rPr>
+                <w:del w:id="20124" w:author="Claude" w:date="2026-10-09T05:44:13Z"/>
                 <w:rFonts w:ascii="Cambria Math" w:hAnsi="Cambria Math"/>
               </w:rPr>
               <m:t>)</m:t>
             </m:r>
             <m:r>
               <w:rPr>
+                <w:del w:id="20125" w:author="Claude" w:date="2026-10-09T05:44:13Z"/>
                 <w:rFonts w:ascii="Cambria Math" w:hAnsi="Cambria Math" w:cs="Times New Roman"/>
               </w:rPr>
               <m:t>C</m:t>
@@ -4314,6 +4544,7 @@
                     <m:sty m:val="p"/>
                   </m:rPr>
                   <w:rPr>
+                    <w:del w:id="20126" w:author="Claude" w:date="2026-10-09T05:44:13Z"/>
                     <w:rFonts w:ascii="Cambria Math" w:hAnsi="Cambria Math" w:cs="Times New Roman"/>
                   </w:rPr>
                   <m:t>O</m:t>
@@ -4325,6 +4556,7 @@
                     <m:sty m:val="p"/>
                   </m:rPr>
                   <w:rPr>
+                    <w:del w:id="20127" w:author="Claude" w:date="2026-10-09T05:44:13Z"/>
                     <w:rFonts w:ascii="Cambria Math" w:hAnsi="Cambria Math" w:cs="Times New Roman"/>
                   </w:rPr>
                   <m:t>2</m:t>
@@ -4335,6 +4567,7 @@
         </m:sSub>
         <m:r>
           <w:rPr>
+            <w:del w:id="20128" w:author="Claude" w:date="2026-10-09T05:44:13Z"/>
             <w:rFonts w:ascii="Cambria Math" w:hAnsi="Cambria Math" w:cs="Times New Roman"/>
           </w:rPr>
           <m:t xml:space="preserve"> </m:t>
@@ -4350,6 +4583,7 @@
           <m:e>
             <m:r>
               <w:rPr>
+                <w:del w:id="20129" w:author="Claude" w:date="2026-10-09T05:44:13Z"/>
                 <w:rFonts w:ascii="Cambria Math" w:hAnsi="Cambria Math"/>
               </w:rPr>
               <m:t>δ</m:t>
@@ -4361,9 +4595,138 @@
                 <m:sty m:val="p"/>
               </m:rPr>
               <w:rPr>
+                <w:del w:id="20130" w:author="Claude" w:date="2026-10-09T05:44:13Z"/>
                 <w:rFonts w:ascii="Cambria Math" w:hAnsi="Cambria Math"/>
               </w:rPr>
               <m:t>Γ</m:t>
+            </m:r>
+          </m:sub>
+        </m:sSub>
+      </m:oMath>
+      <m:oMath>
+        <m:f>
+          <m:num>
+            <m:r>
+              <w:rPr>
+                <w:ins w:id="20085" w:author="Claude" w:date="2026-10-09T05:44:13Z"/>
+              </w:rPr>
+              <m:t xml:space="preserve">∂</m:t>
+            </m:r>
+            <m:sSub>
+              <m:e>
+                <m:r>
+                  <w:rPr>
+                    <w:ins w:id="20086" w:author="Claude" w:date="2026-10-09T05:44:13Z"/>
+                  </w:rPr>
+                  <m:t xml:space="preserve">C</m:t>
+                </m:r>
+              </m:e>
+              <m:sub>
+                <m:r>
+                  <w:rPr>
+                    <w:ins w:id="20087" w:author="Claude" w:date="2026-10-09T05:44:13Z"/>
+                  </w:rPr>
+                  <m:t xml:space="preserve">O₂</m:t>
+                </m:r>
+              </m:sub>
+            </m:sSub>
+          </m:num>
+          <m:den>
+            <m:r>
+              <w:rPr>
+                <w:ins w:id="20088" w:author="Claude" w:date="2026-10-09T05:44:13Z"/>
+              </w:rPr>
+              <m:t xml:space="preserve">∂</m:t>
+            </m:r>
+            <m:r>
+              <w:rPr>
+                <w:ins w:id="20089" w:author="Claude" w:date="2026-10-09T05:44:13Z"/>
+              </w:rPr>
+              <m:t xml:space="preserve">t</m:t>
+            </m:r>
+          </m:den>
+        </m:f>
+        <m:r>
+          <w:rPr>
+            <w:ins w:id="20090" w:author="Claude" w:date="2026-10-09T05:44:13Z"/>
+          </w:rPr>
+          <m:t xml:space="preserve">=∇⋅(</m:t>
+        </m:r>
+        <m:sSup>
+          <m:e>
+            <m:sSub>
+              <m:e>
+                <m:r>
+                  <w:rPr>
+                    <w:ins w:id="20091" w:author="Claude" w:date="2026-10-09T05:44:13Z"/>
+                  </w:rPr>
+                  <m:t xml:space="preserve">D</m:t>
+                </m:r>
+              </m:e>
+              <m:sub>
+                <m:r>
+                  <w:rPr>
+                    <w:ins w:id="20092" w:author="Claude" w:date="2026-10-09T05:44:13Z"/>
+                  </w:rPr>
+                  <m:t xml:space="preserve">O₂</m:t>
+                </m:r>
+              </m:sub>
+            </m:sSub>
+          </m:e>
+          <m:sup>
+            <m:r>
+              <w:rPr>
+                <w:ins w:id="20093" w:author="Claude" w:date="2026-10-09T05:44:13Z"/>
+              </w:rPr>
+              <m:t xml:space="preserve">eff</m:t>
+            </m:r>
+          </m:sup>
+        </m:sSup>
+        <m:r>
+          <w:rPr>
+            <w:ins w:id="20094" w:author="Claude" w:date="2026-10-09T05:44:13Z"/>
+          </w:rPr>
+          <m:t xml:space="preserve">∇</m:t>
+        </m:r>
+        <m:sSub>
+          <m:e>
+            <m:r>
+              <w:rPr>
+                <w:ins w:id="20095" w:author="Claude" w:date="2026-10-09T05:44:13Z"/>
+              </w:rPr>
+              <m:t xml:space="preserve">C</m:t>
+            </m:r>
+          </m:e>
+          <m:sub>
+            <m:r>
+              <w:rPr>
+                <w:ins w:id="20096" w:author="Claude" w:date="2026-10-09T05:44:13Z"/>
+              </w:rPr>
+              <m:t xml:space="preserve">O₂</m:t>
+            </m:r>
+          </m:sub>
+        </m:sSub>
+        <m:r>
+          <w:rPr>
+            <w:ins w:id="20097" w:author="Claude" w:date="2026-10-09T05:44:13Z"/>
+          </w:rPr>
+          <m:t xml:space="preserve">)−</m:t>
+        </m:r>
+        <m:sSub>
+          <m:e>
+            <m:r>
+              <w:rPr>
+                <w:ins w:id="20100" w:author="Claude" w:date="2026-10-09T05:44:13Z"/>
+              </w:rPr>
+              <m:t xml:space="preserve">δ</m:t>
+            </m:r>
+          </m:e>
+          <m:sub>
+            <m:r>
+              <w:rPr>
+                <w:ins w:id="20101" w:author="Claude" w:date="2026-10-09T05:44:13Z"/>
+              </w:rPr>
+              <m:t xml:space="preserve">Γ</m:t>
             </m:r>
           </m:sub>
         </m:sSub>
@@ -4393,61 +4756,78 @@
         <w:pStyle w:val="BodyText"/>
         <w:ind w:firstLine="0"/>
         <w:rPr>
+          <w:del w:id="20027" w:author="Claude" w:date="2026-10-09T05:44:13Z"/>
           <w:rFonts w:cs="Times New Roman"/>
         </w:rPr>
       </w:pPr>
-      <w:r>
-        <w:rPr>
-          <w:rFonts w:cs="Times New Roman"/>
-        </w:rPr>
-        <w:t xml:space="preserve">where </w:t>
-      </w:r>
+      <w:del w:id="20001" w:author="Claude" w:date="2026-10-09T05:44:13Z">
+        <w:r>
+          <w:rPr>
+            <w:rFonts w:cs="Times New Roman"/>
+          </w:rPr>
+          <w:delText xml:space="preserve">where </w:delText>
+        </w:r>
+      </w:del>
       <w:proofErr w:type="spellStart"/>
-      <w:r>
-        <w:rPr>
-          <w:rFonts w:cs="Times New Roman"/>
-        </w:rPr>
-        <w:t>δ</w:t>
-      </w:r>
-      <w:r>
-        <w:rPr>
-          <w:rFonts w:cs="Times New Roman"/>
-          <w:vertAlign w:val="subscript"/>
-        </w:rPr>
-        <w:t>Γ</w:t>
-      </w:r>
+      <w:del w:id="20002" w:author="Claude" w:date="2026-10-09T05:44:13Z">
+        <w:r>
+          <w:rPr>
+            <w:rFonts w:cs="Times New Roman"/>
+          </w:rPr>
+          <w:delText xml:space="preserve">δ</w:delText>
+        </w:r>
+      </w:del>
+      <w:del w:id="20003" w:author="Claude" w:date="2026-10-09T05:44:13Z">
+        <w:r>
+          <w:rPr>
+            <w:rFonts w:cs="Times New Roman"/>
+            <w:vertAlign w:val="subscript"/>
+          </w:rPr>
+          <w:delText xml:space="preserve">Γ</w:delText>
+        </w:r>
+      </w:del>
       <w:proofErr w:type="spellEnd"/>
-      <w:r>
-        <w:rPr>
-          <w:rFonts w:cs="Times New Roman"/>
-        </w:rPr>
-        <w:t xml:space="preserve"> = δ(ϕ)|</w:t>
-      </w:r>
-      <w:r>
-        <w:rPr>
-          <w:rFonts w:ascii="Cambria Math" w:hAnsi="Cambria Math" w:cs="Cambria Math"/>
-        </w:rPr>
-        <w:t>∇</w:t>
-      </w:r>
-      <w:r>
-        <w:rPr>
-          <w:rFonts w:cs="Times New Roman"/>
-        </w:rPr>
-        <w:t>ϕ| is the interface delta function (mm</w:t>
-      </w:r>
-      <w:r>
-        <w:rPr>
-          <w:rFonts w:cs="Times New Roman"/>
-          <w:vertAlign w:val="superscript"/>
-        </w:rPr>
-        <w:t>-1</w:t>
-      </w:r>
-      <w:r>
-        <w:rPr>
-          <w:rFonts w:cs="Times New Roman"/>
-        </w:rPr>
-        <w:t xml:space="preserve">), so that </w:t>
-      </w:r>
+      <w:del w:id="20004" w:author="Claude" w:date="2026-10-09T05:44:13Z">
+        <w:r>
+          <w:rPr>
+            <w:rFonts w:cs="Times New Roman"/>
+          </w:rPr>
+          <w:delText xml:space="preserve"> = δ(ϕ)|</w:delText>
+        </w:r>
+      </w:del>
+      <w:del w:id="20005" w:author="Claude" w:date="2026-10-09T05:44:13Z">
+        <w:r>
+          <w:rPr>
+            <w:rFonts w:ascii="Cambria Math" w:hAnsi="Cambria Math" w:cs="Cambria Math"/>
+          </w:rPr>
+          <w:delText xml:space="preserve">∇</w:delText>
+        </w:r>
+      </w:del>
+      <w:del w:id="20006" w:author="Claude" w:date="2026-10-09T05:44:13Z">
+        <w:r>
+          <w:rPr>
+            <w:rFonts w:cs="Times New Roman"/>
+          </w:rPr>
+          <w:delText xml:space="preserve">ϕ| is the interface delta function (mm</w:delText>
+        </w:r>
+      </w:del>
+      <w:del w:id="20007" w:author="Claude" w:date="2026-10-09T05:44:13Z">
+        <w:r>
+          <w:rPr>
+            <w:rFonts w:cs="Times New Roman"/>
+            <w:vertAlign w:val="superscript"/>
+          </w:rPr>
+          <w:delText xml:space="preserve">-1</w:delText>
+        </w:r>
+      </w:del>
+      <w:del w:id="20008" w:author="Claude" w:date="2026-10-09T05:44:13Z">
+        <w:r>
+          <w:rPr>
+            <w:rFonts w:cs="Times New Roman"/>
+          </w:rPr>
+          <w:delText xml:space="preserve">), so that </w:delText>
+        </w:r>
+      </w:del>
       <m:oMath>
         <m:sSub>
           <m:sSubPr>
@@ -4460,6 +4840,7 @@
           <m:e>
             <m:r>
               <w:rPr>
+                <w:del w:id="20024" w:author="Claude" w:date="2026-10-09T05:44:13Z"/>
                 <w:rFonts w:ascii="Cambria Math" w:hAnsi="Cambria Math" w:cs="Times New Roman"/>
               </w:rPr>
               <m:t>k</m:t>
@@ -4471,6 +4852,7 @@
                 <m:sty m:val="p"/>
               </m:rPr>
               <w:rPr>
+                <w:del w:id="20025" w:author="Claude" w:date="2026-10-09T05:44:13Z"/>
                 <w:rFonts w:ascii="Cambria Math" w:hAnsi="Cambria Math" w:cs="Times New Roman"/>
               </w:rPr>
               <m:t>ORR</m:t>
@@ -4478,108 +4860,224 @@
           </m:sub>
         </m:sSub>
       </m:oMath>
-      <w:r>
-        <w:rPr>
-          <w:rFonts w:cs="Times New Roman"/>
-        </w:rPr>
-        <w:t xml:space="preserve"> is a velocity (mm h</w:t>
-      </w:r>
-      <w:r>
-        <w:rPr>
-          <w:rFonts w:cs="Times New Roman"/>
-          <w:vertAlign w:val="superscript"/>
-        </w:rPr>
-        <w:t>-1</w:t>
-      </w:r>
-      <w:r>
-        <w:rPr>
-          <w:rFonts w:cs="Times New Roman"/>
-        </w:rPr>
-        <w:t xml:space="preserve">), and </w:t>
-      </w:r>
+      <w:del w:id="20009" w:author="Claude" w:date="2026-10-09T05:44:13Z">
+        <w:r>
+          <w:rPr>
+            <w:rFonts w:cs="Times New Roman"/>
+          </w:rPr>
+          <w:delText xml:space="preserve"> is a velocity (mm h</w:delText>
+        </w:r>
+      </w:del>
+      <w:del w:id="20010" w:author="Claude" w:date="2026-10-09T05:44:13Z">
+        <w:r>
+          <w:rPr>
+            <w:rFonts w:cs="Times New Roman"/>
+            <w:vertAlign w:val="superscript"/>
+          </w:rPr>
+          <w:delText xml:space="preserve">-1</w:delText>
+        </w:r>
+      </w:del>
+      <w:del w:id="20011" w:author="Claude" w:date="2026-10-09T05:44:13Z">
+        <w:r>
+          <w:rPr>
+            <w:rFonts w:cs="Times New Roman"/>
+          </w:rPr>
+          <w:delText xml:space="preserve">), and </w:delText>
+        </w:r>
+      </w:del>
       <m:oMath>
         <m:r>
           <w:rPr>
+            <w:del w:id="20026" w:author="Claude" w:date="2026-10-09T05:44:13Z"/>
             <w:rFonts w:ascii="Cambria Math" w:hAnsi="Cambria Math" w:cs="Times New Roman"/>
           </w:rPr>
           <m:t>κ(F) = 1 – F.(1 - ε/τ)</m:t>
         </m:r>
       </m:oMath>
-      <w:r>
-        <w:rPr>
-          <w:rFonts w:cs="Times New Roman"/>
-        </w:rPr>
-        <w:t xml:space="preserve"> is the factor by which the corrosion-product film reduces the reaction, using the same porosity (ε) and tortuosity (τ) reduction as the effective-diffusivity law of the film </w:t>
-      </w:r>
-      <w:r>
-        <w:rPr>
-          <w:rFonts w:cs="Times New Roman"/>
-        </w:rPr>
-        <w:t xml:space="preserve">in </w:t>
-      </w:r>
-      <w:r>
-        <w:rPr>
-          <w:b/>
-          <w:bCs/>
-        </w:rPr>
-        <w:t xml:space="preserve">Equation </w:t>
-      </w:r>
-      <w:r>
-        <w:rPr>
-          <w:b/>
-          <w:bCs/>
-        </w:rPr>
-        <w:t>12</w:t>
-      </w:r>
-      <w:r>
-        <w:rPr>
-          <w:rFonts w:cs="Times New Roman"/>
-        </w:rPr>
-        <w:t>. Chloride acts as a catalytic species, regenerated during film breakdown rather than consumed</w:t>
-      </w:r>
-      <w:r>
-        <w:rPr>
-          <w:rFonts w:cs="Times New Roman"/>
-        </w:rPr>
-        <w:t xml:space="preserve"> </w:t>
-      </w:r>
-      <w:r>
-        <w:rPr>
-          <w:rFonts w:cs="Times New Roman"/>
-        </w:rPr>
-        <w:fldChar w:fldCharType="begin"/>
-      </w:r>
-      <w:r>
-        <w:rPr>
-          <w:rFonts w:cs="Times New Roman"/>
-        </w:rPr>
-        <w:instrText xml:space="preserve"> ADDIN ZOTERO_ITEM CSL_CITATION {"citationID":"eTfl7xu9","properties":{"unsorted":false,"formattedCitation":"\\super [19]\\nosupersub{}","plainCitation":"[19]","noteIndex":0},"citationItems":[{"id":1722,"uris":["http://zotero.org/users/16939557/items/FZJ2S65B"],"itemData":{"id":1722,"type":"article-journal","citation-key":"bajgerMathematicalModellingDegradation2017","container-title":"Biomechanics and Modeling in Mechanobiology","DOI":"10.1007/s10237-016-0812-3","ISSN":"1617-7959, 1617-7940","issue":"1","journalAbbreviation":"Biomech Model Mechanobiol","language":"en","page":"227-238","source":"DOI.org (Crossref)","title":"Mathematical modelling of the degradation behaviour of biodegradable metals","volume":"16","author":[{"family":"Bajger","given":"P."},{"family":"Ashbourn","given":"J. M. A."},{"family":"Manhas","given":"V."},{"family":"Guyot","given":"Y."},{"family":"Lietaert","given":"K."},{"family":"Geris","given":"L."}],"issued":{"date-parts":[["2017",2]]}}}],"schema":"https://github.com/citation-style-language/schema/raw/master/csl-citation.json"} </w:instrText>
-      </w:r>
-      <w:r>
-        <w:rPr>
-          <w:rFonts w:cs="Times New Roman"/>
-        </w:rPr>
-        <w:fldChar w:fldCharType="separate"/>
-      </w:r>
-      <w:r>
-        <w:rPr>
-          <w:rFonts w:cs="Times New Roman"/>
-          <w:vertAlign w:val="superscript"/>
-        </w:rPr>
-        <w:t>[19]</w:t>
-      </w:r>
-      <w:r>
-        <w:rPr>
-          <w:rFonts w:cs="Times New Roman"/>
-        </w:rPr>
-        <w:fldChar w:fldCharType="end"/>
-      </w:r>
-      <w:r>
-        <w:rPr>
-          <w:rFonts w:cs="Times New Roman"/>
-        </w:rPr>
-        <w:t>:</w:t>
-      </w:r>
+      <w:del w:id="20012" w:author="Claude" w:date="2026-10-09T05:44:13Z">
+        <w:r>
+          <w:rPr>
+            <w:rFonts w:cs="Times New Roman"/>
+          </w:rPr>
+          <w:delText xml:space="preserve"> is the factor by which the corrosion-product film reduces the reaction, using the same porosity (ε) and tortuosity (τ) reduction as the effective-diffusivity law of the film </w:delText>
+        </w:r>
+      </w:del>
+      <w:del w:id="20013" w:author="Claude" w:date="2026-10-09T05:44:13Z">
+        <w:r>
+          <w:rPr>
+            <w:rFonts w:cs="Times New Roman"/>
+          </w:rPr>
+          <w:delText xml:space="preserve">in </w:delText>
+        </w:r>
+      </w:del>
+      <w:del w:id="20014" w:author="Claude" w:date="2026-10-09T05:44:13Z">
+        <w:r>
+          <w:rPr>
+            <w:b/>
+            <w:bCs/>
+          </w:rPr>
+          <w:delText xml:space="preserve">Equation </w:delText>
+        </w:r>
+      </w:del>
+      <w:del w:id="20015" w:author="Claude" w:date="2026-10-09T05:44:13Z">
+        <w:r>
+          <w:rPr>
+            <w:b/>
+            <w:bCs/>
+          </w:rPr>
+          <w:delText xml:space="preserve">12</w:delText>
+        </w:r>
+      </w:del>
+      <w:del w:id="20016" w:author="Claude" w:date="2026-10-09T05:44:13Z">
+        <w:r>
+          <w:rPr>
+            <w:rFonts w:cs="Times New Roman"/>
+          </w:rPr>
+          <w:delText xml:space="preserve">. Chloride acts as a catalytic species, regenerated during film breakdown rather than consumed</w:delText>
+        </w:r>
+      </w:del>
+      <w:del w:id="20017" w:author="Claude" w:date="2026-10-09T05:44:13Z">
+        <w:r>
+          <w:rPr>
+            <w:rFonts w:cs="Times New Roman"/>
+          </w:rPr>
+          <w:delText xml:space="preserve"> </w:delText>
+        </w:r>
+      </w:del>
+      <w:del w:id="20018" w:author="Claude" w:date="2026-10-09T05:44:13Z">
+        <w:r>
+          <w:rPr>
+            <w:rFonts w:cs="Times New Roman"/>
+          </w:rPr>
+          <w:fldChar w:fldCharType="begin"/>
+        </w:r>
+      </w:del>
+      <w:del w:id="20019" w:author="Claude" w:date="2026-10-09T05:44:13Z">
+        <w:r>
+          <w:rPr>
+            <w:rFonts w:cs="Times New Roman"/>
+          </w:rPr>
+          <w:delInstrText xml:space="preserve"> ADDIN ZOTERO_ITEM CSL_CITATION {"citationID":"eTfl7xu9","properties":{"unsorted":false,"formattedCitation":"\\super [19]\\nosupersub{}","plainCitation":"[19]","noteIndex":0},"citationItems":[{"id":1722,"uris":["http://zotero.org/users/16939557/items/FZJ2S65B"],"itemData":{"id":1722,"type":"article-journal","citation-key":"bajgerMathematicalModellingDegradation2017","container-title":"Biomechanics and Modeling in Mechanobiology","DOI":"10.1007/s10237-016-0812-3","ISSN":"1617-7959, 1617-7940","issue":"1","journalAbbreviation":"Biomech Model Mechanobiol","language":"en","page":"227-238","source":"DOI.org (Crossref)","title":"Mathematical modelling of the degradation behaviour of biodegradable metals","volume":"16","author":[{"family":"Bajger","given":"P."},{"family":"Ashbourn","given":"J. M. A."},{"family":"Manhas","given":"V."},{"family":"Guyot","given":"Y."},{"family":"Lietaert","given":"K."},{"family":"Geris","given":"L."}],"issued":{"date-parts":[["2017",2]]}}}],"schema":"https://github.com/citation-style-language/schema/raw/master/csl-citation.json"} </w:delInstrText>
+        </w:r>
+      </w:del>
+      <w:del w:id="20020" w:author="Claude" w:date="2026-10-09T05:44:13Z">
+        <w:r>
+          <w:rPr>
+            <w:rFonts w:cs="Times New Roman"/>
+          </w:rPr>
+          <w:fldChar w:fldCharType="separate"/>
+        </w:r>
+      </w:del>
+      <w:del w:id="20021" w:author="Claude" w:date="2026-10-09T05:44:13Z">
+        <w:r>
+          <w:rPr>
+            <w:rFonts w:cs="Times New Roman"/>
+            <w:vertAlign w:val="superscript"/>
+          </w:rPr>
+          <w:delText xml:space="preserve">[19]</w:delText>
+        </w:r>
+      </w:del>
+      <w:del w:id="20022" w:author="Claude" w:date="2026-10-09T05:44:13Z">
+        <w:r>
+          <w:rPr>
+            <w:rFonts w:cs="Times New Roman"/>
+          </w:rPr>
+          <w:fldChar w:fldCharType="end"/>
+        </w:r>
+      </w:del>
+      <w:del w:id="20023" w:author="Claude" w:date="2026-10-09T05:44:13Z">
+        <w:r>
+          <w:rPr>
+            <w:rFonts w:cs="Times New Roman"/>
+          </w:rPr>
+          <w:delText xml:space="preserve">:</w:delText>
+        </w:r>
+      </w:del>
+    </w:p>
+    <w:p>
+      <w:pPr>
+        <w:pStyle w:val="BodyText"/>
+        <w:rPr>
+          <w:ins w:id="20033" w:author="Claude" w:date="2026-10-09T05:44:13Z"/>
+        </w:rPr>
+      </w:pPr>
+      <w:ins w:id="20028" w:author="Claude" w:date="2026-10-09T05:44:13Z">
+        <w:r>
+          <w:t xml:space="preserve">where δ</w:t>
+        </w:r>
+      </w:ins>
+      <w:ins w:id="20029" w:author="Claude" w:date="2026-10-09T05:44:13Z">
+        <w:r>
+          <w:rPr>
+            <w:vertAlign w:val="subscript"/>
+          </w:rPr>
+          <w:t xml:space="preserve">Γ</w:t>
+        </w:r>
+      </w:ins>
+      <w:ins w:id="20030" w:author="Claude" w:date="2026-10-09T05:44:13Z">
+        <w:r>
+          <w:t xml:space="preserve"> = δ(ϕ)|∇ϕ| is the interface delta function (mm⁻¹) and C</w:t>
+        </w:r>
+      </w:ins>
+      <w:ins w:id="20031" w:author="Claude" w:date="2026-10-09T05:44:13Z">
+        <w:r>
+          <w:rPr>
+            <w:vertAlign w:val="subscript"/>
+          </w:rPr>
+          <w:t xml:space="preserve">O2</w:t>
+        </w:r>
+      </w:ins>
+      <w:ins w:id="20032" w:author="Claude" w:date="2026-10-09T05:44:13Z">
+        <w:r>
+          <w:t xml:space="preserve"> is the molar concentration of dissolved oxygen (mol mm⁻³). Chloride acts as a catalytic species, regenerated during film breakdown rather than consumed </w:t>
+        </w:r>
+      </w:ins>
+      <w:ins w:id="20034" w:author="Claude" w:date="2026-10-09T05:44:13Z">
+        <w:r>
+          <w:rPr>
+            <w:rFonts w:cs="Times New Roman"/>
+          </w:rPr>
+          <w:fldChar w:fldCharType="begin"/>
+        </w:r>
+      </w:ins>
+      <w:ins w:id="20035" w:author="Claude" w:date="2026-10-09T05:44:13Z">
+        <w:r>
+          <w:rPr>
+            <w:rFonts w:cs="Times New Roman"/>
+          </w:rPr>
+          <w:instrText xml:space="preserve"> ADDIN ZOTERO_ITEM CSL_CITATION {"citationID":"eTfl7xu9","properties":{"unsorted":false,"formattedCitation":"\\super [19]\\nosupersub{}","plainCitation":"[19]","noteIndex":0},"citationItems":[{"id":1722,"uris":["http://zotero.org/users/16939557/items/FZJ2S65B"],"itemData":{"id":1722,"type":"article-journal","citation-key":"bajgerMathematicalModellingDegradation2017","container-title":"Biomechanics and Modeling in Mechanobiology","DOI":"10.1007/s10237-016-0812-3","ISSN":"1617-7959, 1617-7940","issue":"1","journalAbbreviation":"Biomech Model Mechanobiol","language":"en","page":"227-238","source":"DOI.org (Crossref)","title":"Mathematical modelling of the degradation behaviour of biodegradable metals","volume":"16","author":[{"family":"Bajger","given":"P."},{"family":"Ashbourn","given":"J. M. A."},{"family":"Manhas","given":"V."},{"family":"Guyot","given":"Y."},{"family":"Lietaert","given":"K."},{"family":"Geris","given":"L."}],"issued":{"date-parts":[["2017",2]]}}}],"schema":"https://github.com/citation-style-language/schema/raw/master/csl-citation.json"} </w:instrText>
+        </w:r>
+      </w:ins>
+      <w:ins w:id="20036" w:author="Claude" w:date="2026-10-09T05:44:13Z">
+        <w:r>
+          <w:rPr>
+            <w:rFonts w:cs="Times New Roman"/>
+          </w:rPr>
+          <w:fldChar w:fldCharType="separate"/>
+        </w:r>
+      </w:ins>
+      <w:ins w:id="20037" w:author="Claude" w:date="2026-10-09T05:44:13Z">
+        <w:r>
+          <w:rPr>
+            <w:rFonts w:cs="Times New Roman"/>
+            <w:vertAlign w:val="superscript"/>
+          </w:rPr>
+          <w:delText xml:space="preserve">[19]</w:delText>
+        </w:r>
+      </w:ins>
+      <w:ins w:id="20038" w:author="Claude" w:date="2026-10-09T05:44:13Z">
+        <w:r>
+          <w:rPr>
+            <w:rFonts w:cs="Times New Roman"/>
+          </w:rPr>
+          <w:fldChar w:fldCharType="end"/>
+        </w:r>
+      </w:ins>
+      <w:ins w:id="20032" w:author="Claude" w:date="2026-10-09T05:44:13Z">
+        <w:r>
+          <w:t xml:space="preserve">:</w:t>
+        </w:r>
+      </w:ins>
     </w:p>
     <w:p>
       <w:pPr>
@@ -5045,6 +5543,7 @@
                       <m:sty m:val="p"/>
                     </m:rPr>
                     <w:rPr>
+                      <w:del w:id="20153" w:author="Claude" w:date="2026-10-09T05:44:13Z"/>
                       <w:rFonts w:ascii="Cambria Math" w:hAnsi="Cambria Math" w:cs="Times New Roman"/>
                     </w:rPr>
                     <m:t>∂</m:t>
@@ -5060,6 +5559,7 @@
                     <m:e>
                       <m:r>
                         <w:rPr>
+                          <w:del w:id="20154" w:author="Claude" w:date="2026-10-09T05:44:13Z"/>
                           <w:rFonts w:ascii="Cambria Math" w:hAnsi="Cambria Math" w:cs="Times New Roman"/>
                         </w:rPr>
                         <m:t>C</m:t>
@@ -5071,6 +5571,7 @@
                           <m:sty m:val="p"/>
                         </m:rPr>
                         <w:rPr>
+                          <w:del w:id="20155" w:author="Claude" w:date="2026-10-09T05:44:13Z"/>
                           <w:rFonts w:ascii="Cambria Math" w:hAnsi="Cambria Math" w:cs="Times New Roman"/>
                         </w:rPr>
                         <m:t>Zn</m:t>
@@ -5084,12 +5585,14 @@
                       <m:sty m:val="p"/>
                     </m:rPr>
                     <w:rPr>
+                      <w:del w:id="20156" w:author="Claude" w:date="2026-10-09T05:44:13Z"/>
                       <w:rFonts w:ascii="Cambria Math" w:hAnsi="Cambria Math" w:cs="Times New Roman"/>
                     </w:rPr>
                     <m:t>∂</m:t>
                   </m:r>
                   <m:r>
                     <w:rPr>
+                      <w:del w:id="20157" w:author="Claude" w:date="2026-10-09T05:44:13Z"/>
                       <w:rFonts w:ascii="Cambria Math" w:hAnsi="Cambria Math" w:cs="Times New Roman"/>
                     </w:rPr>
                     <m:t>t</m:t>
@@ -5101,6 +5604,7 @@
                   <m:sty m:val="p"/>
                 </m:rPr>
                 <w:rPr>
+                  <w:del w:id="20158" w:author="Claude" w:date="2026-10-09T05:44:13Z"/>
                   <w:rFonts w:ascii="Cambria Math" w:hAnsi="Cambria Math" w:cs="Times New Roman"/>
                 </w:rPr>
                 <m:t>=∇⋅</m:t>
@@ -5125,6 +5629,7 @@
                     <m:e>
                       <m:r>
                         <w:rPr>
+                          <w:del w:id="20159" w:author="Claude" w:date="2026-10-09T05:44:13Z"/>
                           <w:rFonts w:ascii="Cambria Math" w:hAnsi="Cambria Math" w:cs="Times New Roman"/>
                         </w:rPr>
                         <m:t>D</m:t>
@@ -5136,6 +5641,7 @@
                           <m:sty m:val="p"/>
                         </m:rPr>
                         <w:rPr>
+                          <w:del w:id="20160" w:author="Claude" w:date="2026-10-09T05:44:13Z"/>
                           <w:rFonts w:ascii="Cambria Math" w:hAnsi="Cambria Math" w:cs="Times New Roman"/>
                         </w:rPr>
                         <m:t>Zn</m:t>
@@ -5147,6 +5653,7 @@
                           <m:nor/>
                         </m:rPr>
                         <w:rPr>
+                          <w:del w:id="20161" w:author="Claude" w:date="2026-10-09T05:44:13Z"/>
                           <w:rFonts w:cs="Times New Roman"/>
                         </w:rPr>
                         <m:t>eff</m:t>
@@ -5155,6 +5662,7 @@
                   </m:sSubSup>
                   <m:r>
                     <w:rPr>
+                      <w:del w:id="20162" w:author="Claude" w:date="2026-10-09T05:44:13Z"/>
                       <w:rFonts w:ascii="Cambria Math" w:hAnsi="Cambria Math" w:cs="Times New Roman"/>
                     </w:rPr>
                     <m:t> </m:t>
@@ -5164,6 +5672,7 @@
                       <m:sty m:val="p"/>
                     </m:rPr>
                     <w:rPr>
+                      <w:del w:id="20163" w:author="Claude" w:date="2026-10-09T05:44:13Z"/>
                       <w:rFonts w:ascii="Cambria Math" w:hAnsi="Cambria Math" w:cs="Times New Roman"/>
                     </w:rPr>
                     <m:t>∇</m:t>
@@ -5179,6 +5688,7 @@
                     <m:e>
                       <m:r>
                         <w:rPr>
+                          <w:del w:id="20164" w:author="Claude" w:date="2026-10-09T05:44:13Z"/>
                           <w:rFonts w:ascii="Cambria Math" w:hAnsi="Cambria Math" w:cs="Times New Roman"/>
                         </w:rPr>
                         <m:t>C</m:t>
@@ -5190,6 +5700,7 @@
                           <m:sty m:val="p"/>
                         </m:rPr>
                         <w:rPr>
+                          <w:del w:id="20165" w:author="Claude" w:date="2026-10-09T05:44:13Z"/>
                           <w:rFonts w:ascii="Cambria Math" w:hAnsi="Cambria Math" w:cs="Times New Roman"/>
                         </w:rPr>
                         <m:t>Zn</m:t>
@@ -5203,6 +5714,7 @@
                   <m:sty m:val="p"/>
                 </m:rPr>
                 <w:rPr>
+                  <w:del w:id="20166" w:author="Claude" w:date="2026-10-09T05:44:13Z"/>
                   <w:rFonts w:ascii="Cambria Math" w:hAnsi="Cambria Math" w:cs="Times New Roman"/>
                 </w:rPr>
                 <m:t>+2</m:t>
@@ -5218,6 +5730,7 @@
                 <m:e>
                   <m:r>
                     <w:rPr>
+                      <w:del w:id="20167" w:author="Claude" w:date="2026-10-09T05:44:13Z"/>
                       <w:rFonts w:ascii="Cambria Math" w:hAnsi="Cambria Math" w:cs="Times New Roman"/>
                     </w:rPr>
                     <m:t>k</m:t>
@@ -5229,6 +5742,7 @@
                       <m:sty m:val="p"/>
                     </m:rPr>
                     <w:rPr>
+                      <w:del w:id="20168" w:author="Claude" w:date="2026-10-09T05:44:13Z"/>
                       <w:rFonts w:ascii="Cambria Math" w:hAnsi="Cambria Math" w:cs="Times New Roman"/>
                     </w:rPr>
                     <m:t>ORR</m:t>
@@ -5237,6 +5751,7 @@
               </m:sSub>
               <m:r>
                 <w:rPr>
+                  <w:del w:id="20169" w:author="Claude" w:date="2026-10-09T05:44:13Z"/>
                   <w:rFonts w:ascii="Cambria Math" w:hAnsi="Cambria Math" w:cs="Times New Roman"/>
                 </w:rPr>
                 <m:t> </m:t>
@@ -5252,12 +5767,14 @@
                 <m:e>
                   <m:r>
                     <w:rPr>
+                      <w:del w:id="20170" w:author="Claude" w:date="2026-10-09T05:44:13Z"/>
                       <w:rFonts w:ascii="Cambria Math" w:hAnsi="Cambria Math"/>
                     </w:rPr>
                     <m:t>κ</m:t>
                   </m:r>
                   <m:r>
                     <w:rPr>
+                      <w:del w:id="20171" w:author="Claude" w:date="2026-10-09T05:44:13Z"/>
                       <w:rFonts w:ascii="Cambria Math" w:hAnsi="Cambria Math" w:cs="Times New Roman"/>
                     </w:rPr>
                     <m:t>C</m:t>
@@ -5278,6 +5795,7 @@
                           <m:sty m:val="p"/>
                         </m:rPr>
                         <w:rPr>
+                          <w:del w:id="20172" w:author="Claude" w:date="2026-10-09T05:44:13Z"/>
                           <w:rFonts w:ascii="Cambria Math" w:hAnsi="Cambria Math" w:cs="Times New Roman"/>
                         </w:rPr>
                         <m:t>O</m:t>
@@ -5289,6 +5807,7 @@
                           <m:sty m:val="p"/>
                         </m:rPr>
                         <w:rPr>
+                          <w:del w:id="20173" w:author="Claude" w:date="2026-10-09T05:44:13Z"/>
                           <w:rFonts w:ascii="Cambria Math" w:hAnsi="Cambria Math" w:cs="Times New Roman"/>
                         </w:rPr>
                         <m:t>2</m:t>
@@ -5299,6 +5818,7 @@
               </m:sSub>
               <m:r>
                 <w:rPr>
+                  <w:del w:id="20174" w:author="Claude" w:date="2026-10-09T05:44:13Z"/>
                   <w:rFonts w:ascii="Cambria Math" w:hAnsi="Cambria Math" w:cs="Times New Roman"/>
                 </w:rPr>
                 <m:t> </m:t>
@@ -5314,6 +5834,7 @@
                 <m:e>
                   <m:r>
                     <w:rPr>
+                      <w:del w:id="20175" w:author="Claude" w:date="2026-10-09T05:44:13Z"/>
                       <w:rFonts w:ascii="Cambria Math" w:hAnsi="Cambria Math" w:cs="Times New Roman"/>
                     </w:rPr>
                     <m:t>δ</m:t>
@@ -5325,6 +5846,7 @@
                       <m:sty m:val="p"/>
                     </m:rPr>
                     <w:rPr>
+                      <w:del w:id="20176" w:author="Claude" w:date="2026-10-09T05:44:13Z"/>
                       <w:rFonts w:ascii="Cambria Math" w:hAnsi="Cambria Math" w:cs="Times New Roman"/>
                     </w:rPr>
                     <m:t>Γ</m:t>
@@ -5336,6 +5858,7 @@
                   <m:sty m:val="p"/>
                 </m:rPr>
                 <w:rPr>
+                  <w:del w:id="20177" w:author="Claude" w:date="2026-10-09T05:44:13Z"/>
                   <w:rFonts w:ascii="Cambria Math" w:hAnsi="Cambria Math" w:cs="Times New Roman"/>
                 </w:rPr>
                 <m:t>-</m:t>
@@ -5354,12 +5877,14 @@
                       <m:sty m:val="p"/>
                     </m:rPr>
                     <w:rPr>
+                      <w:del w:id="20178" w:author="Claude" w:date="2026-10-09T05:44:13Z"/>
                       <w:rFonts w:ascii="Cambria Math" w:hAnsi="Cambria Math" w:cs="Times New Roman"/>
                     </w:rPr>
                     <m:t>∂</m:t>
                   </m:r>
                   <m:r>
                     <w:rPr>
+                      <w:del w:id="20179" w:author="Claude" w:date="2026-10-09T05:44:13Z"/>
                       <w:rFonts w:ascii="Cambria Math" w:hAnsi="Cambria Math" w:cs="Times New Roman"/>
                     </w:rPr>
                     <m:t>F</m:t>
@@ -5371,12 +5896,14 @@
                       <m:sty m:val="p"/>
                     </m:rPr>
                     <w:rPr>
+                      <w:del w:id="20180" w:author="Claude" w:date="2026-10-09T05:44:13Z"/>
                       <w:rFonts w:ascii="Cambria Math" w:hAnsi="Cambria Math" w:cs="Times New Roman"/>
                     </w:rPr>
                     <m:t>∂</m:t>
                   </m:r>
                   <m:r>
                     <w:rPr>
+                      <w:del w:id="20181" w:author="Claude" w:date="2026-10-09T05:44:13Z"/>
                       <w:rFonts w:ascii="Cambria Math" w:hAnsi="Cambria Math" w:cs="Times New Roman"/>
                     </w:rPr>
                     <m:t>t</m:t>
@@ -5386,6 +5913,170 @@
             </m:e>
           </m:mr>
         </m:m>
+      </m:oMath>
+      <m:oMath>
+        <m:f>
+          <m:num>
+            <m:r>
+              <w:rPr>
+                <w:ins w:id="20131" w:author="Claude" w:date="2026-10-09T05:44:13Z"/>
+              </w:rPr>
+              <m:t xml:space="preserve">∂</m:t>
+            </m:r>
+            <m:sSub>
+              <m:e>
+                <m:r>
+                  <w:rPr>
+                    <w:ins w:id="20132" w:author="Claude" w:date="2026-10-09T05:44:13Z"/>
+                  </w:rPr>
+                  <m:t xml:space="preserve">C</m:t>
+                </m:r>
+              </m:e>
+              <m:sub>
+                <m:r>
+                  <w:rPr>
+                    <w:ins w:id="20133" w:author="Claude" w:date="2026-10-09T05:44:13Z"/>
+                  </w:rPr>
+                  <m:t xml:space="preserve">Zn</m:t>
+                </m:r>
+              </m:sub>
+            </m:sSub>
+          </m:num>
+          <m:den>
+            <m:r>
+              <w:rPr>
+                <w:ins w:id="20134" w:author="Claude" w:date="2026-10-09T05:44:13Z"/>
+              </w:rPr>
+              <m:t xml:space="preserve">∂</m:t>
+            </m:r>
+            <m:r>
+              <w:rPr>
+                <w:ins w:id="20135" w:author="Claude" w:date="2026-10-09T05:44:13Z"/>
+              </w:rPr>
+              <m:t xml:space="preserve">t</m:t>
+            </m:r>
+          </m:den>
+        </m:f>
+        <m:r>
+          <w:rPr>
+            <w:ins w:id="20136" w:author="Claude" w:date="2026-10-09T05:44:13Z"/>
+          </w:rPr>
+          <m:t xml:space="preserve">=∇⋅(</m:t>
+        </m:r>
+        <m:sSup>
+          <m:e>
+            <m:sSub>
+              <m:e>
+                <m:r>
+                  <w:rPr>
+                    <w:ins w:id="20137" w:author="Claude" w:date="2026-10-09T05:44:13Z"/>
+                  </w:rPr>
+                  <m:t xml:space="preserve">D</m:t>
+                </m:r>
+              </m:e>
+              <m:sub>
+                <m:r>
+                  <w:rPr>
+                    <w:ins w:id="20138" w:author="Claude" w:date="2026-10-09T05:44:13Z"/>
+                  </w:rPr>
+                  <m:t xml:space="preserve">Zn</m:t>
+                </m:r>
+              </m:sub>
+            </m:sSub>
+          </m:e>
+          <m:sup>
+            <m:r>
+              <w:rPr>
+                <w:ins w:id="20139" w:author="Claude" w:date="2026-10-09T05:44:13Z"/>
+              </w:rPr>
+              <m:t xml:space="preserve">eff</m:t>
+            </m:r>
+          </m:sup>
+        </m:sSup>
+        <m:r>
+          <w:rPr>
+            <w:ins w:id="20140" w:author="Claude" w:date="2026-10-09T05:44:13Z"/>
+          </w:rPr>
+          <m:t xml:space="preserve">∇</m:t>
+        </m:r>
+        <m:sSub>
+          <m:e>
+            <m:r>
+              <w:rPr>
+                <w:ins w:id="20141" w:author="Claude" w:date="2026-10-09T05:44:13Z"/>
+              </w:rPr>
+              <m:t xml:space="preserve">C</m:t>
+            </m:r>
+          </m:e>
+          <m:sub>
+            <m:r>
+              <w:rPr>
+                <w:ins w:id="20142" w:author="Claude" w:date="2026-10-09T05:44:13Z"/>
+              </w:rPr>
+              <m:t xml:space="preserve">Zn</m:t>
+            </m:r>
+          </m:sub>
+        </m:sSub>
+        <m:r>
+          <w:rPr>
+            <w:ins w:id="20143" w:author="Claude" w:date="2026-10-09T05:44:13Z"/>
+          </w:rPr>
+          <m:t xml:space="preserve">)+2</m:t>
+        </m:r>
+        <m:sSub>
+          <m:e>
+            <m:r>
+              <w:rPr>
+                <w:ins w:id="20146" w:author="Claude" w:date="2026-10-09T05:44:13Z"/>
+              </w:rPr>
+              <m:t xml:space="preserve">δ</m:t>
+            </m:r>
+          </m:e>
+          <m:sub>
+            <m:r>
+              <w:rPr>
+                <w:ins w:id="20147" w:author="Claude" w:date="2026-10-09T05:44:13Z"/>
+              </w:rPr>
+              <m:t xml:space="preserve">Γ</m:t>
+            </m:r>
+          </m:sub>
+        </m:sSub>
+        <m:r>
+          <w:rPr>
+            <w:ins w:id="20148" w:author="Claude" w:date="2026-10-09T05:44:13Z"/>
+          </w:rPr>
+          <m:t xml:space="preserve">−</m:t>
+        </m:r>
+        <m:f>
+          <m:num>
+            <m:r>
+              <w:rPr>
+                <w:ins w:id="20149" w:author="Claude" w:date="2026-10-09T05:44:13Z"/>
+              </w:rPr>
+              <m:t xml:space="preserve">∂</m:t>
+            </m:r>
+            <m:r>
+              <w:rPr>
+                <w:ins w:id="20150" w:author="Claude" w:date="2026-10-09T05:44:13Z"/>
+              </w:rPr>
+              <m:t xml:space="preserve">F</m:t>
+            </m:r>
+          </m:num>
+          <m:den>
+            <m:r>
+              <w:rPr>
+                <w:ins w:id="20151" w:author="Claude" w:date="2026-10-09T05:44:13Z"/>
+              </w:rPr>
+              <m:t xml:space="preserve">∂</m:t>
+            </m:r>
+            <m:r>
+              <w:rPr>
+                <w:ins w:id="20152" w:author="Claude" w:date="2026-10-09T05:44:13Z"/>
+              </w:rPr>
+              <m:t xml:space="preserve">t</m:t>
+            </m:r>
+          </m:den>
+        </m:f>
       </m:oMath>
       <w:r>
         <w:rPr>
@@ -5453,6 +6144,7 @@
                       <m:sty m:val="p"/>
                     </m:rPr>
                     <w:rPr>
+                      <w:del w:id="20204" w:author="Claude" w:date="2026-10-09T05:44:13Z"/>
                       <w:rFonts w:ascii="Cambria Math" w:hAnsi="Cambria Math" w:cs="Times New Roman"/>
                     </w:rPr>
                     <m:t>∂</m:t>
@@ -5468,6 +6160,7 @@
                     <m:e>
                       <m:r>
                         <w:rPr>
+                          <w:del w:id="20205" w:author="Claude" w:date="2026-10-09T05:44:13Z"/>
                           <w:rFonts w:ascii="Cambria Math" w:hAnsi="Cambria Math" w:cs="Times New Roman"/>
                         </w:rPr>
                         <m:t>C</m:t>
@@ -5479,6 +6172,7 @@
                           <m:sty m:val="p"/>
                         </m:rPr>
                         <w:rPr>
+                          <w:del w:id="20206" w:author="Claude" w:date="2026-10-09T05:44:13Z"/>
                           <w:rFonts w:ascii="Cambria Math" w:hAnsi="Cambria Math" w:cs="Times New Roman"/>
                         </w:rPr>
                         <m:t>OH</m:t>
@@ -5492,12 +6186,14 @@
                       <m:sty m:val="p"/>
                     </m:rPr>
                     <w:rPr>
+                      <w:del w:id="20207" w:author="Claude" w:date="2026-10-09T05:44:13Z"/>
                       <w:rFonts w:ascii="Cambria Math" w:hAnsi="Cambria Math" w:cs="Times New Roman"/>
                     </w:rPr>
                     <m:t>∂</m:t>
                   </m:r>
                   <m:r>
                     <w:rPr>
+                      <w:del w:id="20208" w:author="Claude" w:date="2026-10-09T05:44:13Z"/>
                       <w:rFonts w:ascii="Cambria Math" w:hAnsi="Cambria Math" w:cs="Times New Roman"/>
                     </w:rPr>
                     <m:t>t</m:t>
@@ -5509,6 +6205,7 @@
                   <m:sty m:val="p"/>
                 </m:rPr>
                 <w:rPr>
+                  <w:del w:id="20209" w:author="Claude" w:date="2026-10-09T05:44:13Z"/>
                   <w:rFonts w:ascii="Cambria Math" w:hAnsi="Cambria Math" w:cs="Times New Roman"/>
                 </w:rPr>
                 <m:t>=∇⋅</m:t>
@@ -5533,6 +6230,7 @@
                     <m:e>
                       <m:r>
                         <w:rPr>
+                          <w:del w:id="20210" w:author="Claude" w:date="2026-10-09T05:44:13Z"/>
                           <w:rFonts w:ascii="Cambria Math" w:hAnsi="Cambria Math" w:cs="Times New Roman"/>
                         </w:rPr>
                         <m:t>D</m:t>
@@ -5544,6 +6242,7 @@
                           <m:sty m:val="p"/>
                         </m:rPr>
                         <w:rPr>
+                          <w:del w:id="20211" w:author="Claude" w:date="2026-10-09T05:44:13Z"/>
                           <w:rFonts w:ascii="Cambria Math" w:hAnsi="Cambria Math" w:cs="Times New Roman"/>
                         </w:rPr>
                         <m:t>OH</m:t>
@@ -5555,6 +6254,7 @@
                           <m:nor/>
                         </m:rPr>
                         <w:rPr>
+                          <w:del w:id="20212" w:author="Claude" w:date="2026-10-09T05:44:13Z"/>
                           <w:rFonts w:cs="Times New Roman"/>
                         </w:rPr>
                         <m:t>eff</m:t>
@@ -5563,6 +6263,7 @@
                   </m:sSubSup>
                   <m:r>
                     <w:rPr>
+                      <w:del w:id="20213" w:author="Claude" w:date="2026-10-09T05:44:13Z"/>
                       <w:rFonts w:ascii="Cambria Math" w:hAnsi="Cambria Math" w:cs="Times New Roman"/>
                     </w:rPr>
                     <m:t> </m:t>
@@ -5572,6 +6273,7 @@
                       <m:sty m:val="p"/>
                     </m:rPr>
                     <w:rPr>
+                      <w:del w:id="20214" w:author="Claude" w:date="2026-10-09T05:44:13Z"/>
                       <w:rFonts w:ascii="Cambria Math" w:hAnsi="Cambria Math" w:cs="Times New Roman"/>
                     </w:rPr>
                     <m:t>∇</m:t>
@@ -5587,6 +6289,7 @@
                     <m:e>
                       <m:r>
                         <w:rPr>
+                          <w:del w:id="20215" w:author="Claude" w:date="2026-10-09T05:44:13Z"/>
                           <w:rFonts w:ascii="Cambria Math" w:hAnsi="Cambria Math" w:cs="Times New Roman"/>
                         </w:rPr>
                         <m:t>C</m:t>
@@ -5598,6 +6301,7 @@
                           <m:sty m:val="p"/>
                         </m:rPr>
                         <w:rPr>
+                          <w:del w:id="20216" w:author="Claude" w:date="2026-10-09T05:44:13Z"/>
                           <w:rFonts w:ascii="Cambria Math" w:hAnsi="Cambria Math" w:cs="Times New Roman"/>
                         </w:rPr>
                         <m:t>OH</m:t>
@@ -5611,12 +6315,14 @@
                   <m:sty m:val="p"/>
                 </m:rPr>
                 <w:rPr>
+                  <w:del w:id="20217" w:author="Claude" w:date="2026-10-09T05:44:13Z"/>
                   <w:rFonts w:ascii="Cambria Math" w:hAnsi="Cambria Math" w:cs="Times New Roman"/>
                 </w:rPr>
                 <m:t>+</m:t>
               </m:r>
               <m:r>
                 <w:rPr>
+                  <w:del w:id="20218" w:author="Claude" w:date="2026-10-09T05:44:13Z"/>
                   <w:rFonts w:ascii="Cambria Math" w:hAnsi="Cambria Math" w:cs="Times New Roman"/>
                 </w:rPr>
                 <m:t>4 </m:t>
@@ -5632,6 +6338,7 @@
                 <m:e>
                   <m:r>
                     <w:rPr>
+                      <w:del w:id="20219" w:author="Claude" w:date="2026-10-09T05:44:13Z"/>
                       <w:rFonts w:ascii="Cambria Math" w:hAnsi="Cambria Math" w:cs="Times New Roman"/>
                     </w:rPr>
                     <m:t>k</m:t>
@@ -5643,6 +6350,7 @@
                       <m:sty m:val="p"/>
                     </m:rPr>
                     <w:rPr>
+                      <w:del w:id="20220" w:author="Claude" w:date="2026-10-09T05:44:13Z"/>
                       <w:rFonts w:ascii="Cambria Math" w:hAnsi="Cambria Math" w:cs="Times New Roman"/>
                     </w:rPr>
                     <m:t>ORR</m:t>
@@ -5651,12 +6359,14 @@
               </m:sSub>
               <m:r>
                 <w:rPr>
+                  <w:del w:id="20221" w:author="Claude" w:date="2026-10-09T05:44:13Z"/>
                   <w:rFonts w:ascii="Cambria Math" w:hAnsi="Cambria Math"/>
                 </w:rPr>
                 <m:t>κ</m:t>
               </m:r>
               <m:r>
                 <w:rPr>
+                  <w:del w:id="20222" w:author="Claude" w:date="2026-10-09T05:44:13Z"/>
                   <w:rFonts w:ascii="Cambria Math" w:hAnsi="Cambria Math" w:cs="Times New Roman"/>
                 </w:rPr>
                 <m:t> </m:t>
@@ -5672,6 +6382,7 @@
                 <m:e>
                   <m:r>
                     <w:rPr>
+                      <w:del w:id="20223" w:author="Claude" w:date="2026-10-09T05:44:13Z"/>
                       <w:rFonts w:ascii="Cambria Math" w:hAnsi="Cambria Math" w:cs="Times New Roman"/>
                     </w:rPr>
                     <m:t>C</m:t>
@@ -5692,6 +6403,7 @@
                           <m:sty m:val="p"/>
                         </m:rPr>
                         <w:rPr>
+                          <w:del w:id="20224" w:author="Claude" w:date="2026-10-09T05:44:13Z"/>
                           <w:rFonts w:ascii="Cambria Math" w:hAnsi="Cambria Math" w:cs="Times New Roman"/>
                         </w:rPr>
                         <m:t>O</m:t>
@@ -5703,6 +6415,7 @@
                           <m:sty m:val="p"/>
                         </m:rPr>
                         <w:rPr>
+                          <w:del w:id="20225" w:author="Claude" w:date="2026-10-09T05:44:13Z"/>
                           <w:rFonts w:ascii="Cambria Math" w:hAnsi="Cambria Math" w:cs="Times New Roman"/>
                         </w:rPr>
                         <m:t>2</m:t>
@@ -5713,6 +6426,7 @@
               </m:sSub>
               <m:r>
                 <w:rPr>
+                  <w:del w:id="20226" w:author="Claude" w:date="2026-10-09T05:44:13Z"/>
                   <w:rFonts w:ascii="Cambria Math" w:hAnsi="Cambria Math" w:cs="Times New Roman"/>
                 </w:rPr>
                 <m:t> </m:t>
@@ -5728,6 +6442,7 @@
                 <m:e>
                   <m:r>
                     <w:rPr>
+                      <w:del w:id="20227" w:author="Claude" w:date="2026-10-09T05:44:13Z"/>
                       <w:rFonts w:ascii="Cambria Math" w:hAnsi="Cambria Math" w:cs="Times New Roman"/>
                     </w:rPr>
                     <m:t>δ</m:t>
@@ -5739,6 +6454,7 @@
                       <m:sty m:val="p"/>
                     </m:rPr>
                     <w:rPr>
+                      <w:del w:id="20228" w:author="Claude" w:date="2026-10-09T05:44:13Z"/>
                       <w:rFonts w:ascii="Cambria Math" w:hAnsi="Cambria Math" w:cs="Times New Roman"/>
                     </w:rPr>
                     <m:t>Γ</m:t>
@@ -5747,6 +6463,7 @@
               </m:sSub>
               <m:r>
                 <w:rPr>
+                  <w:del w:id="20229" w:author="Claude" w:date="2026-10-09T05:44:13Z"/>
                   <w:rFonts w:ascii="Cambria Math" w:hAnsi="Cambria Math" w:cs="Times New Roman"/>
                 </w:rPr>
                 <m:t>-2</m:t>
@@ -5765,12 +6482,14 @@
                       <m:sty m:val="p"/>
                     </m:rPr>
                     <w:rPr>
+                      <w:del w:id="20230" w:author="Claude" w:date="2026-10-09T05:44:13Z"/>
                       <w:rFonts w:ascii="Cambria Math" w:hAnsi="Cambria Math" w:cs="Times New Roman"/>
                     </w:rPr>
                     <m:t>∂</m:t>
                   </m:r>
                   <m:r>
                     <w:rPr>
+                      <w:del w:id="20231" w:author="Claude" w:date="2026-10-09T05:44:13Z"/>
                       <w:rFonts w:ascii="Cambria Math" w:hAnsi="Cambria Math" w:cs="Times New Roman"/>
                     </w:rPr>
                     <m:t>F</m:t>
@@ -5782,12 +6501,14 @@
                       <m:sty m:val="p"/>
                     </m:rPr>
                     <w:rPr>
+                      <w:del w:id="20232" w:author="Claude" w:date="2026-10-09T05:44:13Z"/>
                       <w:rFonts w:ascii="Cambria Math" w:hAnsi="Cambria Math" w:cs="Times New Roman"/>
                     </w:rPr>
                     <m:t>∂</m:t>
                   </m:r>
                   <m:r>
                     <w:rPr>
+                      <w:del w:id="20233" w:author="Claude" w:date="2026-10-09T05:44:13Z"/>
                       <w:rFonts w:ascii="Cambria Math" w:hAnsi="Cambria Math" w:cs="Times New Roman"/>
                     </w:rPr>
                     <m:t>t</m:t>
@@ -5798,6 +6519,170 @@
           </m:mr>
         </m:m>
       </m:oMath>
+      <m:oMath>
+        <m:f>
+          <m:num>
+            <m:r>
+              <w:rPr>
+                <w:ins w:id="20182" w:author="Claude" w:date="2026-10-09T05:44:13Z"/>
+              </w:rPr>
+              <m:t xml:space="preserve">∂</m:t>
+            </m:r>
+            <m:sSub>
+              <m:e>
+                <m:r>
+                  <w:rPr>
+                    <w:ins w:id="20183" w:author="Claude" w:date="2026-10-09T05:44:13Z"/>
+                  </w:rPr>
+                  <m:t xml:space="preserve">C</m:t>
+                </m:r>
+              </m:e>
+              <m:sub>
+                <m:r>
+                  <w:rPr>
+                    <w:ins w:id="20184" w:author="Claude" w:date="2026-10-09T05:44:13Z"/>
+                  </w:rPr>
+                  <m:t xml:space="preserve">OH</m:t>
+                </m:r>
+              </m:sub>
+            </m:sSub>
+          </m:num>
+          <m:den>
+            <m:r>
+              <w:rPr>
+                <w:ins w:id="20185" w:author="Claude" w:date="2026-10-09T05:44:13Z"/>
+              </w:rPr>
+              <m:t xml:space="preserve">∂</m:t>
+            </m:r>
+            <m:r>
+              <w:rPr>
+                <w:ins w:id="20186" w:author="Claude" w:date="2026-10-09T05:44:13Z"/>
+              </w:rPr>
+              <m:t xml:space="preserve">t</m:t>
+            </m:r>
+          </m:den>
+        </m:f>
+        <m:r>
+          <w:rPr>
+            <w:ins w:id="20187" w:author="Claude" w:date="2026-10-09T05:44:13Z"/>
+          </w:rPr>
+          <m:t xml:space="preserve">=∇⋅(</m:t>
+        </m:r>
+        <m:sSup>
+          <m:e>
+            <m:sSub>
+              <m:e>
+                <m:r>
+                  <w:rPr>
+                    <w:ins w:id="20188" w:author="Claude" w:date="2026-10-09T05:44:13Z"/>
+                  </w:rPr>
+                  <m:t xml:space="preserve">D</m:t>
+                </m:r>
+              </m:e>
+              <m:sub>
+                <m:r>
+                  <w:rPr>
+                    <w:ins w:id="20189" w:author="Claude" w:date="2026-10-09T05:44:13Z"/>
+                  </w:rPr>
+                  <m:t xml:space="preserve">OH</m:t>
+                </m:r>
+              </m:sub>
+            </m:sSub>
+          </m:e>
+          <m:sup>
+            <m:r>
+              <w:rPr>
+                <w:ins w:id="20190" w:author="Claude" w:date="2026-10-09T05:44:13Z"/>
+              </w:rPr>
+              <m:t xml:space="preserve">eff</m:t>
+            </m:r>
+          </m:sup>
+        </m:sSup>
+        <m:r>
+          <w:rPr>
+            <w:ins w:id="20191" w:author="Claude" w:date="2026-10-09T05:44:13Z"/>
+          </w:rPr>
+          <m:t xml:space="preserve">∇</m:t>
+        </m:r>
+        <m:sSub>
+          <m:e>
+            <m:r>
+              <w:rPr>
+                <w:ins w:id="20192" w:author="Claude" w:date="2026-10-09T05:44:13Z"/>
+              </w:rPr>
+              <m:t xml:space="preserve">C</m:t>
+            </m:r>
+          </m:e>
+          <m:sub>
+            <m:r>
+              <w:rPr>
+                <w:ins w:id="20193" w:author="Claude" w:date="2026-10-09T05:44:13Z"/>
+              </w:rPr>
+              <m:t xml:space="preserve">OH</m:t>
+            </m:r>
+          </m:sub>
+        </m:sSub>
+        <m:r>
+          <w:rPr>
+            <w:ins w:id="20194" w:author="Claude" w:date="2026-10-09T05:44:13Z"/>
+          </w:rPr>
+          <m:t xml:space="preserve">)+4</m:t>
+        </m:r>
+        <m:sSub>
+          <m:e>
+            <m:r>
+              <w:rPr>
+                <w:ins w:id="20197" w:author="Claude" w:date="2026-10-09T05:44:13Z"/>
+              </w:rPr>
+              <m:t xml:space="preserve">δ</m:t>
+            </m:r>
+          </m:e>
+          <m:sub>
+            <m:r>
+              <w:rPr>
+                <w:ins w:id="20198" w:author="Claude" w:date="2026-10-09T05:44:13Z"/>
+              </w:rPr>
+              <m:t xml:space="preserve">Γ</m:t>
+            </m:r>
+          </m:sub>
+        </m:sSub>
+        <m:r>
+          <w:rPr>
+            <w:ins w:id="20199" w:author="Claude" w:date="2026-10-09T05:44:13Z"/>
+          </w:rPr>
+          <m:t xml:space="preserve">−2</m:t>
+        </m:r>
+        <m:f>
+          <m:num>
+            <m:r>
+              <w:rPr>
+                <w:ins w:id="20200" w:author="Claude" w:date="2026-10-09T05:44:13Z"/>
+              </w:rPr>
+              <m:t xml:space="preserve">∂</m:t>
+            </m:r>
+            <m:r>
+              <w:rPr>
+                <w:ins w:id="20201" w:author="Claude" w:date="2026-10-09T05:44:13Z"/>
+              </w:rPr>
+              <m:t xml:space="preserve">F</m:t>
+            </m:r>
+          </m:num>
+          <m:den>
+            <m:r>
+              <w:rPr>
+                <w:ins w:id="20202" w:author="Claude" w:date="2026-10-09T05:44:13Z"/>
+              </w:rPr>
+              <m:t xml:space="preserve">∂</m:t>
+            </m:r>
+            <m:r>
+              <w:rPr>
+                <w:ins w:id="20203" w:author="Claude" w:date="2026-10-09T05:44:13Z"/>
+              </w:rPr>
+              <m:t xml:space="preserve">t</m:t>
+            </m:r>
+          </m:den>
+        </m:f>
+      </m:oMath>
       <w:r>
         <w:rPr>
           <w:rFonts w:cs="Times New Roman"/>
@@ -5824,7 +6709,6 @@
         <w:ind w:firstLine="0"/>
       </w:pPr>
       <w:r>
-        <w:lastRenderedPageBreak/>
         <w:t>Here, the corrosion-product field</w:t>
       </w:r>
       <w:r>
@@ -7369,6 +8253,7 @@
           <m:e>
             <m:r>
               <w:rPr>
+                <w:del w:id="20242" w:author="Claude" w:date="2026-10-09T05:44:13Z"/>
                 <w:rFonts w:ascii="Cambria Math" w:hAnsi="Cambria Math" w:cs="Times New Roman"/>
               </w:rPr>
               <m:t>v</m:t>
@@ -7380,6 +8265,7 @@
                 <m:sty m:val="p"/>
               </m:rPr>
               <w:rPr>
+                <w:del w:id="20243" w:author="Claude" w:date="2026-10-09T05:44:13Z"/>
                 <w:rFonts w:ascii="Cambria Math" w:hAnsi="Cambria Math" w:cs="Times New Roman"/>
               </w:rPr>
               <m:t>n</m:t>
@@ -7391,6 +8277,7 @@
             <m:sty m:val="p"/>
           </m:rPr>
           <w:rPr>
+            <w:del w:id="20244" w:author="Claude" w:date="2026-10-09T05:44:13Z"/>
             <w:rFonts w:ascii="Cambria Math" w:hAnsi="Cambria Math" w:cs="Times New Roman"/>
           </w:rPr>
           <m:t>=-</m:t>
@@ -7406,6 +8293,7 @@
           <m:num>
             <m:r>
               <w:rPr>
+                <w:del w:id="20245" w:author="Claude" w:date="2026-10-09T05:44:13Z"/>
                 <w:rFonts w:ascii="Cambria Math" w:hAnsi="Cambria Math" w:cs="Times New Roman"/>
               </w:rPr>
               <m:t>2 </m:t>
@@ -7421,6 +8309,7 @@
               <m:e>
                 <m:r>
                   <w:rPr>
+                    <w:del w:id="20246" w:author="Claude" w:date="2026-10-09T05:44:13Z"/>
                     <w:rFonts w:ascii="Cambria Math" w:hAnsi="Cambria Math" w:cs="Times New Roman"/>
                   </w:rPr>
                   <m:t>k</m:t>
@@ -7432,6 +8321,7 @@
                     <m:sty m:val="p"/>
                   </m:rPr>
                   <w:rPr>
+                    <w:del w:id="20247" w:author="Claude" w:date="2026-10-09T05:44:13Z"/>
                     <w:rFonts w:ascii="Cambria Math" w:hAnsi="Cambria Math" w:cs="Times New Roman"/>
                   </w:rPr>
                   <m:t>ORR</m:t>
@@ -7440,12 +8330,14 @@
             </m:sSub>
             <m:r>
               <w:rPr>
+                <w:del w:id="20248" w:author="Claude" w:date="2026-10-09T05:44:13Z"/>
                 <w:rFonts w:ascii="Cambria Math" w:hAnsi="Cambria Math" w:cs="Times New Roman"/>
               </w:rPr>
               <m:t> </m:t>
             </m:r>
             <m:r>
               <w:rPr>
+                <w:del w:id="20249" w:author="Claude" w:date="2026-10-09T05:44:13Z"/>
                 <w:rFonts w:ascii="Cambria Math" w:hAnsi="Cambria Math"/>
               </w:rPr>
               <m:t>κ</m:t>
@@ -7462,6 +8354,7 @@
               <m:e>
                 <m:r>
                   <w:rPr>
+                    <w:del w:id="20250" w:author="Claude" w:date="2026-10-09T05:44:13Z"/>
                     <w:rFonts w:ascii="Cambria Math" w:hAnsi="Cambria Math"/>
                   </w:rPr>
                   <m:t>F</m:t>
@@ -7470,6 +8363,7 @@
             </m:d>
             <m:r>
               <w:rPr>
+                <w:del w:id="20251" w:author="Claude" w:date="2026-10-09T05:44:13Z"/>
                 <w:rFonts w:ascii="Cambria Math" w:hAnsi="Cambria Math"/>
               </w:rPr>
               <m:t xml:space="preserve"> </m:t>
@@ -7485,6 +8379,7 @@
               <m:e>
                 <m:r>
                   <w:rPr>
+                    <w:del w:id="20252" w:author="Claude" w:date="2026-10-09T05:44:13Z"/>
                     <w:rFonts w:ascii="Cambria Math" w:hAnsi="Cambria Math" w:cs="Times New Roman"/>
                   </w:rPr>
                   <m:t>C</m:t>
@@ -7505,6 +8400,7 @@
                         <m:sty m:val="p"/>
                       </m:rPr>
                       <w:rPr>
+                        <w:del w:id="20253" w:author="Claude" w:date="2026-10-09T05:44:13Z"/>
                         <w:rFonts w:ascii="Cambria Math" w:hAnsi="Cambria Math" w:cs="Times New Roman"/>
                       </w:rPr>
                       <m:t>O</m:t>
@@ -7516,6 +8412,7 @@
                         <m:sty m:val="p"/>
                       </m:rPr>
                       <w:rPr>
+                        <w:del w:id="20254" w:author="Claude" w:date="2026-10-09T05:44:13Z"/>
                         <w:rFonts w:ascii="Cambria Math" w:hAnsi="Cambria Math" w:cs="Times New Roman"/>
                       </w:rPr>
                       <m:t>2</m:t>
@@ -7538,6 +8435,7 @@
                     <m:sty m:val="p"/>
                   </m:rPr>
                   <w:rPr>
+                    <w:del w:id="20255" w:author="Claude" w:date="2026-10-09T05:44:13Z"/>
                     <w:rFonts w:ascii="Cambria Math" w:hAnsi="Cambria Math" w:cs="Times New Roman"/>
                   </w:rPr>
                   <m:t>|</m:t>
@@ -7549,6 +8447,7 @@
                     <m:sty m:val="p"/>
                   </m:rPr>
                   <w:rPr>
+                    <w:del w:id="20256" w:author="Claude" w:date="2026-10-09T05:44:13Z"/>
                     <w:rFonts w:ascii="Cambria Math" w:hAnsi="Cambria Math" w:cs="Times New Roman"/>
                   </w:rPr>
                   <m:t>Γ</m:t>
@@ -7562,6 +8461,7 @@
                 <m:sty m:val="p"/>
               </m:rPr>
               <w:rPr>
+                <w:del w:id="20257" w:author="Claude" w:date="2026-10-09T05:44:13Z"/>
                 <w:rFonts w:ascii="Cambria Math" w:hAnsi="Cambria Math" w:cs="Times New Roman"/>
               </w:rPr>
               <m:t>[Zn</m:t>
@@ -7580,6 +8480,7 @@
                     <m:sty m:val="p"/>
                   </m:rPr>
                   <w:rPr>
+                    <w:del w:id="20258" w:author="Claude" w:date="2026-10-09T05:44:13Z"/>
                     <w:rFonts w:ascii="Cambria Math" w:hAnsi="Cambria Math" w:cs="Times New Roman"/>
                   </w:rPr>
                   <m:t>]</m:t>
@@ -7591,6 +8492,7 @@
                     <m:sty m:val="p"/>
                   </m:rPr>
                   <w:rPr>
+                    <w:del w:id="20259" w:author="Claude" w:date="2026-10-09T05:44:13Z"/>
                     <w:rFonts w:ascii="Cambria Math" w:hAnsi="Cambria Math" w:cs="Times New Roman"/>
                   </w:rPr>
                   <m:t>sol</m:t>
@@ -7600,6 +8502,90 @@
           </m:den>
         </m:f>
       </m:oMath>
+      <m:oMath>
+        <m:sSub>
+          <m:e>
+            <m:r>
+              <w:rPr>
+                <w:ins w:id="20234" w:author="Claude" w:date="2026-10-09T05:44:13Z"/>
+              </w:rPr>
+              <m:t xml:space="preserve">v</m:t>
+            </m:r>
+          </m:e>
+          <m:sub>
+            <m:r>
+              <w:rPr>
+                <w:ins w:id="20235" w:author="Claude" w:date="2026-10-09T05:44:13Z"/>
+              </w:rPr>
+              <m:t xml:space="preserve">n</m:t>
+            </m:r>
+          </m:sub>
+        </m:sSub>
+        <m:r>
+          <w:rPr>
+            <w:ins w:id="20236" w:author="Claude" w:date="2026-10-09T05:44:13Z"/>
+          </w:rPr>
+          <m:t xml:space="preserve">=−</m:t>
+        </m:r>
+        <m:f>
+          <m:num>
+            <m:r>
+              <w:rPr>
+                <w:ins w:id="20237" w:author="Claude" w:date="2026-10-09T05:44:13Z"/>
+              </w:rPr>
+              <m:t xml:space="preserve">2</m:t>
+            </m:r>
+            <m:sSub>
+              <m:e>
+                <m:r>
+                  <w:rPr>
+                    <w:ins w:id="20238" w:author="Claude" w:date="2026-10-09T05:44:13Z"/>
+                    <w:ins w:id="20195" w:author="Claude" w:date="2026-10-09T05:44:13Z"/>
+                    <w:ins w:id="20144" w:author="Claude" w:date="2026-10-09T05:44:13Z"/>
+                    <w:ins w:id="20098" w:author="Claude" w:date="2026-10-09T05:44:13Z"/>
+                    <w:ins w:id="20052" w:author="Claude" w:date="2026-10-09T05:44:13Z"/>
+                    <w:ins w:id="20041" w:author="Claude" w:date="2026-10-09T05:44:13Z"/>
+                  </w:rPr>
+                  <m:t xml:space="preserve">j</m:t>
+                </m:r>
+              </m:e>
+              <m:sub>
+                <m:r>
+                  <w:rPr>
+                    <w:ins w:id="20239" w:author="Claude" w:date="2026-10-09T05:44:13Z"/>
+                    <w:ins w:id="20196" w:author="Claude" w:date="2026-10-09T05:44:13Z"/>
+                    <w:ins w:id="20145" w:author="Claude" w:date="2026-10-09T05:44:13Z"/>
+                    <w:ins w:id="20099" w:author="Claude" w:date="2026-10-09T05:44:13Z"/>
+                    <w:ins w:id="20053" w:author="Claude" w:date="2026-10-09T05:44:13Z"/>
+                    <w:ins w:id="20042" w:author="Claude" w:date="2026-10-09T05:44:13Z"/>
+                  </w:rPr>
+                  <m:t xml:space="preserve">ORR</m:t>
+                </m:r>
+              </m:sub>
+            </m:sSub>
+          </m:num>
+          <m:den>
+            <m:sSub>
+              <m:e>
+                <m:r>
+                  <w:rPr>
+                    <w:ins w:id="20240" w:author="Claude" w:date="2026-10-09T05:44:13Z"/>
+                  </w:rPr>
+                  <m:t xml:space="preserve">[Zn]</m:t>
+                </m:r>
+              </m:e>
+              <m:sub>
+                <m:r>
+                  <w:rPr>
+                    <w:ins w:id="20241" w:author="Claude" w:date="2026-10-09T05:44:13Z"/>
+                  </w:rPr>
+                  <m:t xml:space="preserve">sol</m:t>
+                </m:r>
+              </m:sub>
+            </m:sSub>
+          </m:den>
+        </m:f>
+      </m:oMath>
       <w:r>
         <w:rPr>
           <w:rFonts w:cs="Times New Roman"/>
@@ -7623,138 +8609,254 @@
     <w:p>
       <w:pPr>
         <w:pStyle w:val="BodyText"/>
+        <w:rPr>
+          <w:del w:id="20291" w:author="Claude" w:date="2026-10-09T05:44:13Z"/>
+        </w:rPr>
       </w:pPr>
-      <w:r>
-        <w:t>where C</w:t>
-      </w:r>
-      <w:r>
-        <w:rPr>
-          <w:vertAlign w:val="subscript"/>
-        </w:rPr>
-        <w:t>O2</w:t>
-      </w:r>
-      <w:r>
-        <w:t>|</w:t>
-      </w:r>
-      <w:r>
-        <w:rPr>
-          <w:vertAlign w:val="subscript"/>
-        </w:rPr>
-        <w:t>Γ</w:t>
-      </w:r>
-      <w:r>
-        <w:t xml:space="preserve"> is the oxygen concentration at the interface (mol L</w:t>
-      </w:r>
-      <w:r>
-        <w:rPr>
-          <w:vertAlign w:val="superscript"/>
-        </w:rPr>
-        <w:t>-1</w:t>
-      </w:r>
-      <w:r>
-        <w:t>)</w:t>
-      </w:r>
-      <w:r>
-        <w:t xml:space="preserve">. </w:t>
-      </w:r>
-      <w:r>
-        <w:t>Oxygen-transport limitation is incorporated implicitly through the Robin boundary condition</w:t>
-      </w:r>
-      <w:r>
-        <w:t xml:space="preserve"> </w:t>
-      </w:r>
-      <w:r>
-        <w:rPr>
-          <w:b/>
-          <w:bCs/>
-        </w:rPr>
-        <w:t>(</w:t>
-      </w:r>
-      <w:r>
-        <w:rPr>
-          <w:b/>
-          <w:bCs/>
-        </w:rPr>
-        <w:t>Equation 7</w:t>
-      </w:r>
-      <w:r>
-        <w:rPr>
-          <w:b/>
-          <w:bCs/>
-        </w:rPr>
-        <w:t>)</w:t>
-      </w:r>
-      <w:r>
-        <w:t xml:space="preserve">, </w:t>
-      </w:r>
-      <w:r>
-        <w:t xml:space="preserve">As </w:t>
-      </w:r>
-      <w:r>
-        <w:lastRenderedPageBreak/>
-        <w:t>oxygen supply becomes restricted, the interfacial oxygen concentration decreases, reducing the oxygen-reduction flux and consequently the interface recession velocity</w:t>
-      </w:r>
-      <w:r>
-        <w:t xml:space="preserve">. </w:t>
-      </w:r>
-      <w:r>
-        <w:t>Therefore, no separate velocity cap or rate-selection criterion is required. The transition from reaction-controlled to diffusion-controlled degradation emerges naturally from the depletion of interfacial oxygen and its coupling with transport processes</w:t>
-      </w:r>
-      <w:r>
-        <w:t xml:space="preserve"> </w:t>
-      </w:r>
-      <w:r>
-        <w:rPr>
-          <w:b/>
-          <w:bCs/>
-        </w:rPr>
-        <w:t>(Section S1)</w:t>
-      </w:r>
-      <w:r>
-        <w:t>.</w:t>
-      </w:r>
-      <w:r>
-        <w:t xml:space="preserve"> </w:t>
-      </w:r>
-      <w:r>
-        <w:t xml:space="preserve">Through this formulation, interface recession, oxygen consumption, </w:t>
-      </w:r>
-      <w:r>
-        <w:t>Zn</w:t>
-      </w:r>
-      <w:r>
-        <w:rPr>
-          <w:vertAlign w:val="superscript"/>
-        </w:rPr>
-        <w:t>2+</w:t>
-      </w:r>
-      <w:r>
-        <w:rPr>
-          <w:vertAlign w:val="superscript"/>
-        </w:rPr>
-        <w:t xml:space="preserve"> </w:t>
-      </w:r>
-      <w:r>
-        <w:t xml:space="preserve">release, </w:t>
-      </w:r>
-      <w:r>
-        <w:t>OH</w:t>
-      </w:r>
-      <w:r>
-        <w:rPr>
-          <w:vertAlign w:val="superscript"/>
-        </w:rPr>
-        <w:t>-</w:t>
-      </w:r>
-      <w:r>
-        <w:rPr>
-          <w:vertAlign w:val="superscript"/>
-        </w:rPr>
-        <w:t xml:space="preserve"> </w:t>
-      </w:r>
-      <w:r>
-        <w:t>generation, and corrosion-product growth are governed by a single oxygen-reduction flux, ensuring a mechanistically consistent link between interfacial chemistry, mass transport, and degradation kinetics.</w:t>
-      </w:r>
+      <w:del w:id="20260" w:author="Claude" w:date="2026-10-09T05:44:13Z">
+        <w:r>
+          <w:delText xml:space="preserve">where C</w:delText>
+        </w:r>
+      </w:del>
+      <w:del w:id="20261" w:author="Claude" w:date="2026-10-09T05:44:13Z">
+        <w:r>
+          <w:rPr>
+            <w:vertAlign w:val="subscript"/>
+          </w:rPr>
+          <w:delText xml:space="preserve">O2</w:delText>
+        </w:r>
+      </w:del>
+      <w:del w:id="20262" w:author="Claude" w:date="2026-10-09T05:44:13Z">
+        <w:r>
+          <w:delText xml:space="preserve">|</w:delText>
+        </w:r>
+      </w:del>
+      <w:del w:id="20263" w:author="Claude" w:date="2026-10-09T05:44:13Z">
+        <w:r>
+          <w:rPr>
+            <w:vertAlign w:val="subscript"/>
+          </w:rPr>
+          <w:delText xml:space="preserve">Γ</w:delText>
+        </w:r>
+      </w:del>
+      <w:del w:id="20264" w:author="Claude" w:date="2026-10-09T05:44:13Z">
+        <w:r>
+          <w:delText xml:space="preserve"> is the oxygen concentration at the interface (mol L</w:delText>
+        </w:r>
+      </w:del>
+      <w:del w:id="20265" w:author="Claude" w:date="2026-10-09T05:44:13Z">
+        <w:r>
+          <w:rPr>
+            <w:vertAlign w:val="superscript"/>
+          </w:rPr>
+          <w:delText xml:space="preserve">-1</w:delText>
+        </w:r>
+      </w:del>
+      <w:del w:id="20266" w:author="Claude" w:date="2026-10-09T05:44:13Z">
+        <w:r>
+          <w:delText xml:space="preserve">)</w:delText>
+        </w:r>
+      </w:del>
+      <w:del w:id="20267" w:author="Claude" w:date="2026-10-09T05:44:13Z">
+        <w:r>
+          <w:delText xml:space="preserve">. </w:delText>
+        </w:r>
+      </w:del>
+      <w:del w:id="20268" w:author="Claude" w:date="2026-10-09T05:44:13Z">
+        <w:r>
+          <w:delText xml:space="preserve">Oxygen-transport limitation is incorporated implicitly through the Robin boundary condition</w:delText>
+        </w:r>
+      </w:del>
+      <w:del w:id="20269" w:author="Claude" w:date="2026-10-09T05:44:13Z">
+        <w:r>
+          <w:delText xml:space="preserve"> </w:delText>
+        </w:r>
+      </w:del>
+      <w:del w:id="20270" w:author="Claude" w:date="2026-10-09T05:44:13Z">
+        <w:r>
+          <w:rPr>
+            <w:b/>
+            <w:bCs/>
+          </w:rPr>
+          <w:delText xml:space="preserve">(</w:delText>
+        </w:r>
+      </w:del>
+      <w:del w:id="20271" w:author="Claude" w:date="2026-10-09T05:44:13Z">
+        <w:r>
+          <w:rPr>
+            <w:b/>
+            <w:bCs/>
+          </w:rPr>
+          <w:delText xml:space="preserve">Equation 7</w:delText>
+        </w:r>
+      </w:del>
+      <w:del w:id="20272" w:author="Claude" w:date="2026-10-09T05:44:13Z">
+        <w:r>
+          <w:rPr>
+            <w:b/>
+            <w:bCs/>
+          </w:rPr>
+          <w:delText xml:space="preserve">)</w:delText>
+        </w:r>
+      </w:del>
+      <w:del w:id="20273" w:author="Claude" w:date="2026-10-09T05:44:13Z">
+        <w:r>
+          <w:delText xml:space="preserve">, </w:delText>
+        </w:r>
+      </w:del>
+      <w:del w:id="20274" w:author="Claude" w:date="2026-10-09T05:44:13Z">
+        <w:r>
+          <w:delText xml:space="preserve">As </w:delText>
+        </w:r>
+      </w:del>
+      <w:del w:id="20275" w:author="Claude" w:date="2026-10-09T05:44:13Z">
+        <w:r>
+          <w:delText xml:space="preserve">oxygen supply becomes restricted, the interfacial oxygen concentration decreases, reducing the oxygen-reduction flux and consequently the interface recession velocity</w:delText>
+        </w:r>
+      </w:del>
+      <w:del w:id="20276" w:author="Claude" w:date="2026-10-09T05:44:13Z">
+        <w:r>
+          <w:delText xml:space="preserve">. </w:delText>
+        </w:r>
+      </w:del>
+      <w:del w:id="20277" w:author="Claude" w:date="2026-10-09T05:44:13Z">
+        <w:r>
+          <w:delText xml:space="preserve">Therefore, no separate velocity cap or rate-selection criterion is required. The transition from reaction-controlled to diffusion-controlled degradation emerges naturally from the depletion of interfacial oxygen and its coupling with transport processes</w:delText>
+        </w:r>
+      </w:del>
+      <w:del w:id="20278" w:author="Claude" w:date="2026-10-09T05:44:13Z">
+        <w:r>
+          <w:delText xml:space="preserve"> </w:delText>
+        </w:r>
+      </w:del>
+      <w:del w:id="20279" w:author="Claude" w:date="2026-10-09T05:44:13Z">
+        <w:r>
+          <w:rPr>
+            <w:b/>
+            <w:bCs/>
+          </w:rPr>
+          <w:delText xml:space="preserve">(Section S1)</w:delText>
+        </w:r>
+      </w:del>
+      <w:del w:id="20280" w:author="Claude" w:date="2026-10-09T05:44:13Z">
+        <w:r>
+          <w:delText xml:space="preserve">.</w:delText>
+        </w:r>
+      </w:del>
+      <w:del w:id="20281" w:author="Claude" w:date="2026-10-09T05:44:13Z">
+        <w:r>
+          <w:delText xml:space="preserve"> </w:delText>
+        </w:r>
+      </w:del>
+      <w:del w:id="20282" w:author="Claude" w:date="2026-10-09T05:44:13Z">
+        <w:r>
+          <w:delText xml:space="preserve">Through this formulation, interface recession, oxygen consumption, </w:delText>
+        </w:r>
+      </w:del>
+      <w:del w:id="20283" w:author="Claude" w:date="2026-10-09T05:44:13Z">
+        <w:r>
+          <w:delText xml:space="preserve">Zn</w:delText>
+        </w:r>
+      </w:del>
+      <w:del w:id="20284" w:author="Claude" w:date="2026-10-09T05:44:13Z">
+        <w:r>
+          <w:rPr>
+            <w:vertAlign w:val="superscript"/>
+          </w:rPr>
+          <w:delText xml:space="preserve">2+</w:delText>
+        </w:r>
+      </w:del>
+      <w:del w:id="20285" w:author="Claude" w:date="2026-10-09T05:44:13Z">
+        <w:r>
+          <w:rPr>
+            <w:vertAlign w:val="superscript"/>
+          </w:rPr>
+          <w:delText xml:space="preserve"> </w:delText>
+        </w:r>
+      </w:del>
+      <w:del w:id="20286" w:author="Claude" w:date="2026-10-09T05:44:13Z">
+        <w:r>
+          <w:delText xml:space="preserve">release, </w:delText>
+        </w:r>
+      </w:del>
+      <w:del w:id="20287" w:author="Claude" w:date="2026-10-09T05:44:13Z">
+        <w:r>
+          <w:delText xml:space="preserve">OH</w:delText>
+        </w:r>
+      </w:del>
+      <w:del w:id="20288" w:author="Claude" w:date="2026-10-09T05:44:13Z">
+        <w:r>
+          <w:rPr>
+            <w:vertAlign w:val="superscript"/>
+          </w:rPr>
+          <w:delText xml:space="preserve">-</w:delText>
+        </w:r>
+      </w:del>
+      <w:del w:id="20289" w:author="Claude" w:date="2026-10-09T05:44:13Z">
+        <w:r>
+          <w:rPr>
+            <w:vertAlign w:val="superscript"/>
+          </w:rPr>
+          <w:delText xml:space="preserve"> </w:delText>
+        </w:r>
+      </w:del>
+      <w:del w:id="20290" w:author="Claude" w:date="2026-10-09T05:44:13Z">
+        <w:r>
+          <w:delText xml:space="preserve">generation, and corrosion-product growth are governed by a single oxygen-reduction flux, ensuring a mechanistically consistent link between interfacial chemistry, mass transport, and degradation kinetics.</w:delText>
+        </w:r>
+      </w:del>
+    </w:p>
+    <w:p>
+      <w:pPr>
+        <w:pStyle w:val="BodyText"/>
+        <w:rPr>
+          <w:ins w:id="20299" w:author="Claude" w:date="2026-10-09T05:44:13Z"/>
+        </w:rPr>
+      </w:pPr>
+      <w:ins w:id="20292" w:author="Claude" w:date="2026-10-09T05:44:13Z">
+        <w:r>
+          <w:t xml:space="preserve">where j</w:t>
+        </w:r>
+      </w:ins>
+      <w:ins w:id="20293" w:author="Claude" w:date="2026-10-09T05:44:13Z">
+        <w:r>
+          <w:rPr>
+            <w:vertAlign w:val="subscript"/>
+          </w:rPr>
+          <w:t xml:space="preserve">ORR</w:t>
+        </w:r>
+      </w:ins>
+      <w:ins w:id="20294" w:author="Claude" w:date="2026-10-09T05:44:13Z">
+        <w:r>
+          <w:t xml:space="preserve"> is the ORR molar flux defined above, so that v</w:t>
+        </w:r>
+      </w:ins>
+      <w:ins w:id="20295" w:author="Claude" w:date="2026-10-09T05:44:13Z">
+        <w:r>
+          <w:rPr>
+            <w:vertAlign w:val="subscript"/>
+          </w:rPr>
+          <w:t xml:space="preserve">n</w:t>
+        </w:r>
+      </w:ins>
+      <w:ins w:id="20296" w:author="Claude" w:date="2026-10-09T05:44:13Z">
+        <w:r>
+          <w:t xml:space="preserve"> has units of (mol mm⁻² h⁻¹)/(mol mm⁻³) = mm h⁻¹. Oxygen-transport limitation is incorporated implicitly through the Robin boundary condition for C</w:t>
+        </w:r>
+      </w:ins>
+      <w:ins w:id="20297" w:author="Claude" w:date="2026-10-09T05:44:13Z">
+        <w:r>
+          <w:rPr>
+            <w:vertAlign w:val="subscript"/>
+          </w:rPr>
+          <w:t xml:space="preserve">O2</w:t>
+        </w:r>
+      </w:ins>
+      <w:ins w:id="20298" w:author="Claude" w:date="2026-10-09T05:44:13Z">
+        <w:r>
+          <w:t xml:space="preserve"> at the interface (Equation 7): as oxygen supply becomes restricted, the interfacial oxygen concentration decreases, reducing the oxygen-reduction flux and consequently the interface recession velocity. Therefore, no separate velocity cap or rate-selection criterion is required. The transition from reaction-controlled to diffusion-controlled degradation emerges naturally from the depletion of interfacial oxygen and its coupling with transport processes (Section S1). Through this formulation, interface recession, oxygen consumption, Zn²⁺ release, OH⁻ generation, and corrosion-product growth are governed by a single oxygen-reduction flux, ensuring a mechanistically consistent link between interfacial chemistry, mass transport, and degradation kinetics.</w:t>
+        </w:r>
+      </w:ins>
     </w:p>
     <w:p>
       <w:pPr>
@@ -7913,7 +9015,6 @@
         <w:t xml:space="preserve">), while spatial distributions of oxygen concentration and </w:t>
       </w:r>
       <w:r>
-        <w:lastRenderedPageBreak/>
         <w:t>corrosion-product fields were used to interpret degradation mechanisms.</w:t>
       </w:r>
       <w:r>
@@ -10982,7 +12083,7 @@
                 <w:sz w:val="22"/>
                 <w:szCs w:val="22"/>
               </w:rPr>
-              <w:t>5.04 × 10⁻⁶ g mm⁻³</w:t>
+              <w:t>1.42 × 10⁻⁷ mol mm⁻³</w:t>
             </w:r>
           </w:p>
         </w:tc>
@@ -11234,7 +12335,7 @@
                 <w:sz w:val="22"/>
                 <w:szCs w:val="22"/>
               </w:rPr>
-              <w:t>3.5 × 10⁻⁹ g mm⁻³</w:t>
+              <w:t>1.09 × 10⁻¹⁰ mol mm⁻³</w:t>
             </w:r>
           </w:p>
         </w:tc>
@@ -11611,7 +12712,6 @@
         <w:t xml:space="preserve"> used published 14-day mass-loss measurements obtained from revised simulated body fluid (r-SBF) immersion experiments reported by Liu et </w:t>
       </w:r>
       <w:r>
-        <w:lastRenderedPageBreak/>
         <w:t xml:space="preserve">al. </w:t>
       </w:r>
       <w:r>
@@ -12101,7 +13201,6 @@
         <w:pStyle w:val="Heading1"/>
       </w:pPr>
       <w:r>
-        <w:lastRenderedPageBreak/>
         <w:t>Results and Discussion</w:t>
       </w:r>
     </w:p>
@@ -13320,7 +14419,6 @@
       </w:del>
       <w:del w:id="52" w:author="Claude" w:date="2026-10-08T23:42:00Z">
         <w:r>
-          <w:lastRenderedPageBreak/>
           <w:delText xml:space="preserve">combination of </w:delText>
         </w:r>
       </w:del>
@@ -14569,7 +15667,6 @@
         <w:rPr>
           <w:rFonts w:cs="Times New Roman"/>
         </w:rPr>
-        <w:lastRenderedPageBreak/>
         <w:t xml:space="preserve">To further investigate the mechanistic roles of these </w:t>
       </w:r>
       <w:r>
@@ -16218,7 +17315,6 @@
         <w:rPr>
           <w:noProof/>
         </w:rPr>
-        <w:lastRenderedPageBreak/>
         <w:drawing>
           <wp:inline distT="0" distB="0" distL="0" distR="0" wp14:anchorId="36EF7F28" wp14:editId="13A4B40B">
             <wp:extent cx="5760720" cy="4561205"/>
@@ -16569,43 +17665,7 @@
         <w:rPr>
           <w:rFonts w:cs="Times New Roman"/>
         </w:rPr>
-        <w:t xml:space="preserve">pproximately 67% of the 28-day mass loss occurred within the first week, </w:t>
-      </w:r>
-      <w:del w:id="9003" w:author="Claude" w:date="2026-10-09T04:00:48Z">
-        <w:r>
-          <w:rPr>
-            <w:rFonts w:cs="Times New Roman"/>
-          </w:rPr>
-          <w:delText xml:space="preserve">demonstrating</w:delText>
-        </w:r>
-      </w:del>
-      <w:ins w:id="9002" w:author="Claude" w:date="2026-10-09T04:00:48Z">
-        <w:r>
-          <w:rPr>
-            <w:rFonts w:cs="Times New Roman"/>
-          </w:rPr>
-          <w:t xml:space="preserve">indicating</w:t>
-        </w:r>
-      </w:ins>
-      <w:r>
-        <w:rPr>
-          <w:rFonts w:cs="Times New Roman"/>
-        </w:rPr>
-        <w:t xml:space="preserve"> a transition from rapid initial degradation to progressively slower material loss</w:t>
-      </w:r>
-      <w:ins w:id="9001" w:author="Claude" w:date="2026-10-09T04:00:48Z">
-        <w:r>
-          <w:rPr>
-            <w:rFonts w:cs="Times New Roman"/>
-          </w:rPr>
-          <w:t xml:space="preserve">. The relative standard deviations are large, particularly at 28 days (n = 3), and the 14-day (3.03 ± 0.74 mg) and 28-day (3.67 ± 1.33 mg) values overlap substantially, so the apparent slowing between 14 and 28 days is consistent with the data but not statistically demonstrated</w:t>
-        </w:r>
-      </w:ins>
-      <w:r>
-        <w:rPr>
-          <w:rFonts w:cs="Times New Roman"/>
-        </w:rPr>
-        <w:t xml:space="preserve">. This nonlinear response is consistent with the formation and maturation of Zn corrosion products in physiological chloride-containing media, which progressively restrict oxygen transport to the metal surface and suppress the cathodic oxygen-reduction rate. The measured mass-loss range and temporal deceleration agree with previous observations for commercially pure Zn under comparable physiological conditions</w:t>
+        <w:t>pproximately 67% of the 28-day mass loss occurred within the first week, demonstrating a transition from rapid initial degradation to progressively slower material loss. This nonlinear response is consistent with the formation and maturation of Zn corrosion products in physiological chloride-containing media, which progressively restrict oxygen transport to the metal surface and suppress the cathodic oxygen-reduction rate. The measured mass-loss range and temporal deceleration agree with previous observations for commercially pure Zn under comparable physiological conditions</w:t>
       </w:r>
       <w:r>
         <w:rPr>
@@ -16674,7 +17734,6 @@
           <w:b/>
           <w:bCs/>
         </w:rPr>
-        <w:lastRenderedPageBreak/>
         <w:t xml:space="preserve">Table </w:t>
       </w:r>
       <w:r>
@@ -18497,7 +19556,6 @@
         <w:rPr>
           <w:rFonts w:cs="Times New Roman"/>
         </w:rPr>
-        <w:lastRenderedPageBreak/>
         <w:t>capturing the rapid initial increase followed by a gradual plateau</w:t>
       </w:r>
       <w:ins w:id="93" w:author="Claude" w:date="2026-10-08T20:38:00Z">
@@ -18780,26 +19838,8 @@
           <w:b/>
           <w:bCs/>
         </w:rPr>
-        <w:t xml:space="preserve">Figure </w:t>
-      </w:r>
-      <w:del w:id="9002" w:author="Claude" w:date="2026-10-09T04:34:55Z">
-        <w:r>
-          <w:rPr>
-            <w:b/>
-            <w:bCs/>
-          </w:rPr>
-          <w:delText xml:space="preserve">S8</w:delText>
-        </w:r>
-      </w:del>
-      <w:ins w:id="9001" w:author="Claude" w:date="2026-10-09T04:34:55Z">
-        <w:r>
-          <w:rPr>
-            <w:b/>
-            <w:bCs/>
-          </w:rPr>
-          <w:t xml:space="preserve">S7</w:t>
-        </w:r>
-      </w:ins>
+        <w:t>Figure S8</w:t>
+      </w:r>
       <w:r>
         <w:t>)</w:t>
       </w:r>
@@ -18911,7 +19951,6 @@
         <w:t xml:space="preserve">before transitioning to oxygen-transport-limited behavior. This delayed onset of transport limitation </w:t>
       </w:r>
       <w:r>
-        <w:lastRenderedPageBreak/>
         <w:t>maintained greater oxygen availability at the degrading surface, supporting higher corrosion rates and contributing to the increased cumulative mass loss observed in the stent.</w:t>
       </w:r>
     </w:p>
@@ -19436,7 +20475,6 @@
         <w:t xml:space="preserve">Section 2 intersected the crown apex, where the inner and outer curvatures experienced </w:t>
       </w:r>
       <w:r>
-        <w:lastRenderedPageBreak/>
         <w:t>markedly different transport conditions. Greater oxygen availability along the outward-facing surface produced deeper penetration of approximately 8.55 </w:t>
       </w:r>
       <m:oMath>
@@ -19841,7 +20879,6 @@
         <w:t xml:space="preserve">, suggesting that spacing became increasingly important as corrosion products accumulated. At a center-to-center spacing of 0.30 mm, overlapping </w:t>
       </w:r>
       <w:r>
-        <w:lastRenderedPageBreak/>
         <w:t>oxygen-depletion fields restricted oxygen availability within the gap and suppressed the overall oxygen-reduction reaction, resulting in lower cumulative mass loss. Increasing the spacing to 1.60 mm weakened this interaction, allowing each wire to receive oxygen more independently and shifting the response toward that of the isolated wire. This transport-shielding behavior is consistent with observations in porous Zn scaffolds</w:t>
       </w:r>
       <w:r>
@@ -19939,7 +20976,6 @@
         <w:rPr>
           <w:noProof/>
         </w:rPr>
-        <w:lastRenderedPageBreak/>
         <w:drawing>
           <wp:inline distT="0" distB="0" distL="0" distR="0" wp14:anchorId="103F8303" wp14:editId="43B18CC7">
             <wp:extent cx="5760720" cy="4576445"/>
@@ -20152,15 +21188,7 @@
         </m:sSub>
       </m:oMath>
       <w:r>
-        <w:t xml:space="preserve">​ should be regarded as an effective parameter that partially incorporates uncertainty in oxygen availability</w:t>
-      </w:r>
-      <w:ins w:id="9001" w:author="Claude" w:date="2026-10-09T03:53:00Z">
-        <w:r>
-          <w:t xml:space="preserve">. The computational domain (30 × 30 × 30 mm, 27 mL) is smaller than the experimental solution volume (about 44 mL), oxygen is supplied continuously through the top face instead of by the 48 h medium renewal, and the sensitivity to domain size, top-boundary area and specimen position has not been tested</w:t>
-        </w:r>
-      </w:ins>
-      <w:r>
-        <w:t xml:space="preserve">.</w:t>
+        <w:t>​ should be regarded as an effective parameter that partially incorporates uncertainty in oxygen availability.</w:t>
       </w:r>
       <w:r>
         <w:t xml:space="preserve"> </w:t>
@@ -20178,7 +21206,6 @@
         <w:t xml:space="preserve">. </w:t>
       </w:r>
       <w:r>
-        <w:lastRenderedPageBreak/>
         <w:t xml:space="preserve">Moreover, </w:t>
       </w:r>
       <w:r>
@@ -20504,7 +21531,6 @@
           <w:b/>
           <w:bCs/>
         </w:rPr>
-        <w:lastRenderedPageBreak/>
         <w:t>Author contribution</w:t>
       </w:r>
     </w:p>
@@ -20768,7 +21794,6 @@
           <w:b/>
           <w:bCs/>
         </w:rPr>
-        <w:lastRenderedPageBreak/>
         <w:t>References</w:t>
       </w:r>
     </w:p>
@@ -21339,7 +22364,6 @@
         <w:t xml:space="preserve">, “Continuum Damage Model for Bioresorbable Magnesium Alloy Devices — Application to Coronary </w:t>
       </w:r>
       <w:r>
-        <w:lastRenderedPageBreak/>
         <w:t xml:space="preserve">Stents,” </w:t>
       </w:r>
       <w:r>
@@ -21951,7 +22975,6 @@
           <w:i/>
           <w:iCs/>
         </w:rPr>
-        <w:lastRenderedPageBreak/>
         <w:t>Journal of Engineering Mathematics</w:t>
       </w:r>
       <w:r>

</xml_diff>

<commit_message>
Fix j_ORR symbol in equations
</commit_message>
<xml_diff>
--- a/deliver/Manuscript_tracked.docx
+++ b/deliver/Manuscript_tracked.docx
@@ -3972,10 +3972,10 @@
       <w:pPr>
         <w:pStyle w:val="BodyText"/>
         <w:rPr>
-          <w:ins w:id="20040" w:author="Claude" w:date="2026-10-09T05:44:13Z"/>
+          <w:ins w:id="20040" w:author="Claude" w:date="2026-10-09T05:44:38Z"/>
         </w:rPr>
       </w:pPr>
-      <w:ins w:id="20039" w:author="Claude" w:date="2026-10-09T05:44:13Z">
+      <w:ins w:id="20039" w:author="Claude" w:date="2026-10-09T05:44:38Z">
         <w:r>
           <w:t xml:space="preserve">All concentrations and F are expressed as molar quantities (mol mm⁻³; F as Zn-equivalent). The oxygen-reduction (ORR) molar flux at the interface is defined as</w:t>
         </w:r>
@@ -3985,14 +3985,34 @@
       <w:pPr>
         <w:pStyle w:val="BodyText"/>
         <w:rPr>
-          <w:ins w:id="20063" w:author="Claude" w:date="2026-10-09T05:44:13Z"/>
+          <w:ins w:id="20063" w:author="Claude" w:date="2026-10-09T05:44:38Z"/>
         </w:rPr>
       </w:pPr>
       <m:oMath>
+        <m:sSub>
+          <m:e>
+            <m:r>
+              <w:rPr>
+                <w:ins w:id="20052" w:author="Claude" w:date="2026-10-09T05:44:38Z"/>
+                <w:ins w:id="20041" w:author="Claude" w:date="2026-10-09T05:44:38Z"/>
+              </w:rPr>
+              <m:t xml:space="preserve">j</m:t>
+            </m:r>
+          </m:e>
+          <m:sub>
+            <m:r>
+              <w:rPr>
+                <w:ins w:id="20053" w:author="Claude" w:date="2026-10-09T05:44:38Z"/>
+                <w:ins w:id="20042" w:author="Claude" w:date="2026-10-09T05:44:38Z"/>
+              </w:rPr>
+              <m:t xml:space="preserve">ORR</m:t>
+            </m:r>
+          </m:sub>
+        </m:sSub>
         <m:r>
           <w:rPr>
-            <w:ins w:id="20054" w:author="Claude" w:date="2026-10-09T05:44:13Z"/>
-            <w:ins w:id="20043" w:author="Claude" w:date="2026-10-09T05:44:13Z"/>
+            <w:ins w:id="20054" w:author="Claude" w:date="2026-10-09T05:44:38Z"/>
+            <w:ins w:id="20043" w:author="Claude" w:date="2026-10-09T05:44:38Z"/>
           </w:rPr>
           <m:t xml:space="preserve">=</m:t>
         </m:r>
@@ -4000,8 +4020,8 @@
           <m:e>
             <m:r>
               <w:rPr>
-                <w:ins w:id="20055" w:author="Claude" w:date="2026-10-09T05:44:13Z"/>
-                <w:ins w:id="20044" w:author="Claude" w:date="2026-10-09T05:44:13Z"/>
+                <w:ins w:id="20055" w:author="Claude" w:date="2026-10-09T05:44:38Z"/>
+                <w:ins w:id="20044" w:author="Claude" w:date="2026-10-09T05:44:38Z"/>
               </w:rPr>
               <m:t xml:space="preserve">k</m:t>
             </m:r>
@@ -4009,8 +4029,8 @@
           <m:sub>
             <m:r>
               <w:rPr>
-                <w:ins w:id="20056" w:author="Claude" w:date="2026-10-09T05:44:13Z"/>
-                <w:ins w:id="20045" w:author="Claude" w:date="2026-10-09T05:44:13Z"/>
+                <w:ins w:id="20056" w:author="Claude" w:date="2026-10-09T05:44:38Z"/>
+                <w:ins w:id="20045" w:author="Claude" w:date="2026-10-09T05:44:38Z"/>
               </w:rPr>
               <m:t xml:space="preserve">ORR</m:t>
             </m:r>
@@ -4018,8 +4038,8 @@
         </m:sSub>
         <m:r>
           <w:rPr>
-            <w:ins w:id="20057" w:author="Claude" w:date="2026-10-09T05:44:13Z"/>
-            <w:ins w:id="20046" w:author="Claude" w:date="2026-10-09T05:44:13Z"/>
+            <w:ins w:id="20057" w:author="Claude" w:date="2026-10-09T05:44:38Z"/>
+            <w:ins w:id="20046" w:author="Claude" w:date="2026-10-09T05:44:38Z"/>
           </w:rPr>
           <m:t xml:space="preserve">κ(F)</m:t>
         </m:r>
@@ -4027,8 +4047,8 @@
           <m:e>
             <m:r>
               <w:rPr>
-                <w:ins w:id="20058" w:author="Claude" w:date="2026-10-09T05:44:13Z"/>
-                <w:ins w:id="20047" w:author="Claude" w:date="2026-10-09T05:44:13Z"/>
+                <w:ins w:id="20058" w:author="Claude" w:date="2026-10-09T05:44:38Z"/>
+                <w:ins w:id="20047" w:author="Claude" w:date="2026-10-09T05:44:38Z"/>
               </w:rPr>
               <m:t xml:space="preserve">C</m:t>
             </m:r>
@@ -4036,8 +4056,8 @@
           <m:sub>
             <m:r>
               <w:rPr>
-                <w:ins w:id="20059" w:author="Claude" w:date="2026-10-09T05:44:13Z"/>
-                <w:ins w:id="20048" w:author="Claude" w:date="2026-10-09T05:44:13Z"/>
+                <w:ins w:id="20059" w:author="Claude" w:date="2026-10-09T05:44:38Z"/>
+                <w:ins w:id="20048" w:author="Claude" w:date="2026-10-09T05:44:38Z"/>
               </w:rPr>
               <m:t xml:space="preserve">O₂</m:t>
             </m:r>
@@ -4047,8 +4067,8 @@
           <m:e>
             <m:r>
               <w:rPr>
-                <w:ins w:id="20060" w:author="Claude" w:date="2026-10-09T05:44:13Z"/>
-                <w:ins w:id="20049" w:author="Claude" w:date="2026-10-09T05:44:13Z"/>
+                <w:ins w:id="20060" w:author="Claude" w:date="2026-10-09T05:44:38Z"/>
+                <w:ins w:id="20049" w:author="Claude" w:date="2026-10-09T05:44:38Z"/>
               </w:rPr>
               <m:t xml:space="preserve">|</m:t>
             </m:r>
@@ -4056,8 +4076,8 @@
           <m:sub>
             <m:r>
               <w:rPr>
-                <w:ins w:id="20061" w:author="Claude" w:date="2026-10-09T05:44:13Z"/>
-                <w:ins w:id="20050" w:author="Claude" w:date="2026-10-09T05:44:13Z"/>
+                <w:ins w:id="20061" w:author="Claude" w:date="2026-10-09T05:44:38Z"/>
+                <w:ins w:id="20050" w:author="Claude" w:date="2026-10-09T05:44:38Z"/>
               </w:rPr>
               <m:t xml:space="preserve">Γ</m:t>
             </m:r>
@@ -4065,8 +4085,8 @@
         </m:sSub>
         <m:r>
           <w:rPr>
-            <w:ins w:id="20062" w:author="Claude" w:date="2026-10-09T05:44:13Z"/>
-            <w:ins w:id="20051" w:author="Claude" w:date="2026-10-09T05:44:13Z"/>
+            <w:ins w:id="20062" w:author="Claude" w:date="2026-10-09T05:44:38Z"/>
+            <w:ins w:id="20051" w:author="Claude" w:date="2026-10-09T05:44:38Z"/>
           </w:rPr>
           <m:t xml:space="preserve"> [mol mm⁻² h⁻¹]</m:t>
         </m:r>
@@ -4076,15 +4096,15 @@
       <w:pPr>
         <w:pStyle w:val="BodyText"/>
         <w:rPr>
-          <w:ins w:id="20067" w:author="Claude" w:date="2026-10-09T05:44:13Z"/>
+          <w:ins w:id="20067" w:author="Claude" w:date="2026-10-09T05:44:38Z"/>
         </w:rPr>
       </w:pPr>
-      <w:ins w:id="20064" w:author="Claude" w:date="2026-10-09T05:44:13Z">
+      <w:ins w:id="20064" w:author="Claude" w:date="2026-10-09T05:44:38Z">
         <w:r>
           <w:t xml:space="preserve">where k</w:t>
         </w:r>
       </w:ins>
-      <w:ins w:id="20065" w:author="Claude" w:date="2026-10-09T05:44:13Z">
+      <w:ins w:id="20065" w:author="Claude" w:date="2026-10-09T05:44:38Z">
         <w:r>
           <w:rPr>
             <w:vertAlign w:val="subscript"/>
@@ -4092,7 +4112,7 @@
           <w:t xml:space="preserve">ORR</w:t>
         </w:r>
       </w:ins>
-      <w:ins w:id="20066" w:author="Claude" w:date="2026-10-09T05:44:13Z">
+      <w:ins w:id="20066" w:author="Claude" w:date="2026-10-09T05:44:38Z">
         <w:r>
           <w:t xml:space="preserve"> is a velocity (mm h⁻¹) and κ(F) is the factor by which the corrosion-product film reduces the reaction, using the same porosity (ε) and tortuosity (τ) reduction as the effective-diffusivity law of Equation 12:</w:t>
         </w:r>
@@ -4102,14 +4122,14 @@
       <w:pPr>
         <w:pStyle w:val="BodyText"/>
         <w:rPr>
-          <w:ins w:id="20084" w:author="Claude" w:date="2026-10-09T05:44:13Z"/>
+          <w:ins w:id="20084" w:author="Claude" w:date="2026-10-09T05:44:38Z"/>
         </w:rPr>
       </w:pPr>
       <m:oMath>
         <m:r>
           <w:rPr>
-            <w:ins w:id="20076" w:author="Claude" w:date="2026-10-09T05:44:13Z"/>
-            <w:ins w:id="20068" w:author="Claude" w:date="2026-10-09T05:44:13Z"/>
+            <w:ins w:id="20076" w:author="Claude" w:date="2026-10-09T05:44:38Z"/>
+            <w:ins w:id="20068" w:author="Claude" w:date="2026-10-09T05:44:38Z"/>
           </w:rPr>
           <m:t xml:space="preserve">κ(F)=1−</m:t>
         </m:r>
@@ -4117,8 +4137,8 @@
           <m:num>
             <m:r>
               <w:rPr>
-                <w:ins w:id="20077" w:author="Claude" w:date="2026-10-09T05:44:13Z"/>
-                <w:ins w:id="20069" w:author="Claude" w:date="2026-10-09T05:44:13Z"/>
+                <w:ins w:id="20077" w:author="Claude" w:date="2026-10-09T05:44:38Z"/>
+                <w:ins w:id="20069" w:author="Claude" w:date="2026-10-09T05:44:38Z"/>
               </w:rPr>
               <m:t xml:space="preserve">F</m:t>
             </m:r>
@@ -4128,8 +4148,8 @@
               <m:e>
                 <m:r>
                   <w:rPr>
-                    <w:ins w:id="20078" w:author="Claude" w:date="2026-10-09T05:44:13Z"/>
-                    <w:ins w:id="20070" w:author="Claude" w:date="2026-10-09T05:44:13Z"/>
+                    <w:ins w:id="20078" w:author="Claude" w:date="2026-10-09T05:44:38Z"/>
+                    <w:ins w:id="20070" w:author="Claude" w:date="2026-10-09T05:44:38Z"/>
                   </w:rPr>
                   <m:t xml:space="preserve">F</m:t>
                 </m:r>
@@ -4137,8 +4157,8 @@
               <m:sub>
                 <m:r>
                   <w:rPr>
-                    <w:ins w:id="20079" w:author="Claude" w:date="2026-10-09T05:44:13Z"/>
-                    <w:ins w:id="20071" w:author="Claude" w:date="2026-10-09T05:44:13Z"/>
+                    <w:ins w:id="20079" w:author="Claude" w:date="2026-10-09T05:44:38Z"/>
+                    <w:ins w:id="20071" w:author="Claude" w:date="2026-10-09T05:44:38Z"/>
                   </w:rPr>
                   <m:t xml:space="preserve">max</m:t>
                 </m:r>
@@ -4148,8 +4168,8 @@
         </m:f>
         <m:r>
           <w:rPr>
-            <w:ins w:id="20080" w:author="Claude" w:date="2026-10-09T05:44:13Z"/>
-            <w:ins w:id="20072" w:author="Claude" w:date="2026-10-09T05:44:13Z"/>
+            <w:ins w:id="20080" w:author="Claude" w:date="2026-10-09T05:44:38Z"/>
+            <w:ins w:id="20072" w:author="Claude" w:date="2026-10-09T05:44:38Z"/>
           </w:rPr>
           <m:t xml:space="preserve">(1−</m:t>
         </m:r>
@@ -4157,8 +4177,8 @@
           <m:num>
             <m:r>
               <w:rPr>
-                <w:ins w:id="20081" w:author="Claude" w:date="2026-10-09T05:44:13Z"/>
-                <w:ins w:id="20073" w:author="Claude" w:date="2026-10-09T05:44:13Z"/>
+                <w:ins w:id="20081" w:author="Claude" w:date="2026-10-09T05:44:38Z"/>
+                <w:ins w:id="20073" w:author="Claude" w:date="2026-10-09T05:44:38Z"/>
               </w:rPr>
               <m:t xml:space="preserve">ε</m:t>
             </m:r>
@@ -4166,8 +4186,8 @@
           <m:den>
             <m:r>
               <w:rPr>
-                <w:ins w:id="20082" w:author="Claude" w:date="2026-10-09T05:44:13Z"/>
-                <w:ins w:id="20074" w:author="Claude" w:date="2026-10-09T05:44:13Z"/>
+                <w:ins w:id="20082" w:author="Claude" w:date="2026-10-09T05:44:38Z"/>
+                <w:ins w:id="20074" w:author="Claude" w:date="2026-10-09T05:44:38Z"/>
               </w:rPr>
               <m:t xml:space="preserve">τ</m:t>
             </m:r>
@@ -4175,8 +4195,8 @@
         </m:f>
         <m:r>
           <w:rPr>
-            <w:ins w:id="20083" w:author="Claude" w:date="2026-10-09T05:44:13Z"/>
-            <w:ins w:id="20075" w:author="Claude" w:date="2026-10-09T05:44:13Z"/>
+            <w:ins w:id="20083" w:author="Claude" w:date="2026-10-09T05:44:38Z"/>
+            <w:ins w:id="20075" w:author="Claude" w:date="2026-10-09T05:44:38Z"/>
           </w:rPr>
           <m:t xml:space="preserve">)</m:t>
         </m:r>
@@ -4209,7 +4229,7 @@
                 <m:sty m:val="p"/>
               </m:rPr>
               <w:rPr>
-                <w:del w:id="20102" w:author="Claude" w:date="2026-10-09T05:44:13Z"/>
+                <w:del w:id="20102" w:author="Claude" w:date="2026-10-09T05:44:38Z"/>
                 <w:rFonts w:ascii="Cambria Math" w:hAnsi="Cambria Math" w:cs="Times New Roman"/>
               </w:rPr>
               <m:t>∂</m:t>
@@ -4225,7 +4245,7 @@
               <m:e>
                 <m:r>
                   <w:rPr>
-                    <w:del w:id="20103" w:author="Claude" w:date="2026-10-09T05:44:13Z"/>
+                    <w:del w:id="20103" w:author="Claude" w:date="2026-10-09T05:44:38Z"/>
                     <w:rFonts w:ascii="Cambria Math" w:hAnsi="Cambria Math" w:cs="Times New Roman"/>
                   </w:rPr>
                   <m:t>C</m:t>
@@ -4246,7 +4266,7 @@
                         <m:sty m:val="p"/>
                       </m:rPr>
                       <w:rPr>
-                        <w:del w:id="20104" w:author="Claude" w:date="2026-10-09T05:44:13Z"/>
+                        <w:del w:id="20104" w:author="Claude" w:date="2026-10-09T05:44:38Z"/>
                         <w:rFonts w:ascii="Cambria Math" w:hAnsi="Cambria Math" w:cs="Times New Roman"/>
                       </w:rPr>
                       <m:t>O</m:t>
@@ -4258,7 +4278,7 @@
                         <m:sty m:val="p"/>
                       </m:rPr>
                       <w:rPr>
-                        <w:del w:id="20105" w:author="Claude" w:date="2026-10-09T05:44:13Z"/>
+                        <w:del w:id="20105" w:author="Claude" w:date="2026-10-09T05:44:38Z"/>
                         <w:rFonts w:ascii="Cambria Math" w:hAnsi="Cambria Math" w:cs="Times New Roman"/>
                       </w:rPr>
                       <m:t>2</m:t>
@@ -4274,14 +4294,14 @@
                 <m:sty m:val="p"/>
               </m:rPr>
               <w:rPr>
-                <w:del w:id="20106" w:author="Claude" w:date="2026-10-09T05:44:13Z"/>
+                <w:del w:id="20106" w:author="Claude" w:date="2026-10-09T05:44:38Z"/>
                 <w:rFonts w:ascii="Cambria Math" w:hAnsi="Cambria Math" w:cs="Times New Roman"/>
               </w:rPr>
               <m:t>∂</m:t>
             </m:r>
             <m:r>
               <w:rPr>
-                <w:del w:id="20107" w:author="Claude" w:date="2026-10-09T05:44:13Z"/>
+                <w:del w:id="20107" w:author="Claude" w:date="2026-10-09T05:44:38Z"/>
                 <w:rFonts w:ascii="Cambria Math" w:hAnsi="Cambria Math" w:cs="Times New Roman"/>
               </w:rPr>
               <m:t>t</m:t>
@@ -4293,7 +4313,7 @@
             <m:sty m:val="p"/>
           </m:rPr>
           <w:rPr>
-            <w:del w:id="20108" w:author="Claude" w:date="2026-10-09T05:44:13Z"/>
+            <w:del w:id="20108" w:author="Claude" w:date="2026-10-09T05:44:38Z"/>
             <w:rFonts w:ascii="Cambria Math" w:hAnsi="Cambria Math" w:cs="Times New Roman"/>
           </w:rPr>
           <m:t>=∇⋅</m:t>
@@ -4318,7 +4338,7 @@
               <m:e>
                 <m:r>
                   <w:rPr>
-                    <w:del w:id="20109" w:author="Claude" w:date="2026-10-09T05:44:13Z"/>
+                    <w:del w:id="20109" w:author="Claude" w:date="2026-10-09T05:44:38Z"/>
                     <w:rFonts w:ascii="Cambria Math" w:hAnsi="Cambria Math" w:cs="Times New Roman"/>
                   </w:rPr>
                   <m:t>D</m:t>
@@ -4339,7 +4359,7 @@
                         <m:sty m:val="p"/>
                       </m:rPr>
                       <w:rPr>
-                        <w:del w:id="20110" w:author="Claude" w:date="2026-10-09T05:44:13Z"/>
+                        <w:del w:id="20110" w:author="Claude" w:date="2026-10-09T05:44:38Z"/>
                         <w:rFonts w:ascii="Cambria Math" w:hAnsi="Cambria Math" w:cs="Times New Roman"/>
                       </w:rPr>
                       <m:t>O</m:t>
@@ -4351,7 +4371,7 @@
                         <m:sty m:val="p"/>
                       </m:rPr>
                       <w:rPr>
-                        <w:del w:id="20111" w:author="Claude" w:date="2026-10-09T05:44:13Z"/>
+                        <w:del w:id="20111" w:author="Claude" w:date="2026-10-09T05:44:38Z"/>
                         <w:rFonts w:ascii="Cambria Math" w:hAnsi="Cambria Math" w:cs="Times New Roman"/>
                       </w:rPr>
                       <m:t>2</m:t>
@@ -4365,7 +4385,7 @@
                     <m:nor/>
                   </m:rPr>
                   <w:rPr>
-                    <w:del w:id="20112" w:author="Claude" w:date="2026-10-09T05:44:13Z"/>
+                    <w:del w:id="20112" w:author="Claude" w:date="2026-10-09T05:44:38Z"/>
                     <w:rFonts w:cs="Times New Roman"/>
                   </w:rPr>
                   <m:t>eff</m:t>
@@ -4374,7 +4394,7 @@
             </m:sSubSup>
             <m:r>
               <w:rPr>
-                <w:del w:id="20113" w:author="Claude" w:date="2026-10-09T05:44:13Z"/>
+                <w:del w:id="20113" w:author="Claude" w:date="2026-10-09T05:44:38Z"/>
                 <w:rFonts w:ascii="Cambria Math" w:hAnsi="Cambria Math" w:cs="Times New Roman"/>
               </w:rPr>
               <m:t> </m:t>
@@ -4384,7 +4404,7 @@
                 <m:sty m:val="p"/>
               </m:rPr>
               <w:rPr>
-                <w:del w:id="20114" w:author="Claude" w:date="2026-10-09T05:44:13Z"/>
+                <w:del w:id="20114" w:author="Claude" w:date="2026-10-09T05:44:38Z"/>
                 <w:rFonts w:ascii="Cambria Math" w:hAnsi="Cambria Math" w:cs="Times New Roman"/>
               </w:rPr>
               <m:t>∇</m:t>
@@ -4400,7 +4420,7 @@
               <m:e>
                 <m:r>
                   <w:rPr>
-                    <w:del w:id="20115" w:author="Claude" w:date="2026-10-09T05:44:13Z"/>
+                    <w:del w:id="20115" w:author="Claude" w:date="2026-10-09T05:44:38Z"/>
                     <w:rFonts w:ascii="Cambria Math" w:hAnsi="Cambria Math" w:cs="Times New Roman"/>
                   </w:rPr>
                   <m:t>C</m:t>
@@ -4421,7 +4441,7 @@
                         <m:sty m:val="p"/>
                       </m:rPr>
                       <w:rPr>
-                        <w:del w:id="20116" w:author="Claude" w:date="2026-10-09T05:44:13Z"/>
+                        <w:del w:id="20116" w:author="Claude" w:date="2026-10-09T05:44:38Z"/>
                         <w:rFonts w:ascii="Cambria Math" w:hAnsi="Cambria Math" w:cs="Times New Roman"/>
                       </w:rPr>
                       <m:t>O</m:t>
@@ -4433,7 +4453,7 @@
                         <m:sty m:val="p"/>
                       </m:rPr>
                       <w:rPr>
-                        <w:del w:id="20117" w:author="Claude" w:date="2026-10-09T05:44:13Z"/>
+                        <w:del w:id="20117" w:author="Claude" w:date="2026-10-09T05:44:38Z"/>
                         <w:rFonts w:ascii="Cambria Math" w:hAnsi="Cambria Math" w:cs="Times New Roman"/>
                       </w:rPr>
                       <m:t>2</m:t>
@@ -4449,7 +4469,7 @@
             <m:sty m:val="p"/>
           </m:rPr>
           <w:rPr>
-            <w:del w:id="20118" w:author="Claude" w:date="2026-10-09T05:44:13Z"/>
+            <w:del w:id="20118" w:author="Claude" w:date="2026-10-09T05:44:38Z"/>
             <w:rFonts w:ascii="Cambria Math" w:hAnsi="Cambria Math" w:cs="Times New Roman"/>
           </w:rPr>
           <m:t>-</m:t>
@@ -4465,7 +4485,7 @@
           <m:e>
             <m:r>
               <w:rPr>
-                <w:del w:id="20119" w:author="Claude" w:date="2026-10-09T05:44:13Z"/>
+                <w:del w:id="20119" w:author="Claude" w:date="2026-10-09T05:44:38Z"/>
                 <w:rFonts w:ascii="Cambria Math" w:hAnsi="Cambria Math" w:cs="Times New Roman"/>
               </w:rPr>
               <m:t>k</m:t>
@@ -4477,7 +4497,7 @@
                 <m:sty m:val="p"/>
               </m:rPr>
               <w:rPr>
-                <w:del w:id="20120" w:author="Claude" w:date="2026-10-09T05:44:13Z"/>
+                <w:del w:id="20120" w:author="Claude" w:date="2026-10-09T05:44:38Z"/>
                 <w:rFonts w:ascii="Cambria Math" w:hAnsi="Cambria Math" w:cs="Times New Roman"/>
               </w:rPr>
               <m:t>ORR</m:t>
@@ -4486,7 +4506,7 @@
         </m:sSub>
         <m:r>
           <w:rPr>
-            <w:del w:id="20121" w:author="Claude" w:date="2026-10-09T05:44:13Z"/>
+            <w:del w:id="20121" w:author="Claude" w:date="2026-10-09T05:44:38Z"/>
             <w:rFonts w:ascii="Cambria Math" w:hAnsi="Cambria Math" w:cs="Times New Roman"/>
           </w:rPr>
           <m:t> </m:t>
@@ -4502,28 +4522,28 @@
           <m:e>
             <m:r>
               <w:rPr>
-                <w:del w:id="20122" w:author="Claude" w:date="2026-10-09T05:44:13Z"/>
+                <w:del w:id="20122" w:author="Claude" w:date="2026-10-09T05:44:38Z"/>
                 <w:rFonts w:ascii="Cambria Math" w:hAnsi="Cambria Math"/>
               </w:rPr>
               <m:t>κ(</m:t>
             </m:r>
             <m:r>
               <w:rPr>
-                <w:del w:id="20123" w:author="Claude" w:date="2026-10-09T05:44:13Z"/>
+                <w:del w:id="20123" w:author="Claude" w:date="2026-10-09T05:44:38Z"/>
                 <w:rFonts w:ascii="Cambria Math" w:hAnsi="Cambria Math"/>
               </w:rPr>
               <m:t>F</m:t>
             </m:r>
             <m:r>
               <w:rPr>
-                <w:del w:id="20124" w:author="Claude" w:date="2026-10-09T05:44:13Z"/>
+                <w:del w:id="20124" w:author="Claude" w:date="2026-10-09T05:44:38Z"/>
                 <w:rFonts w:ascii="Cambria Math" w:hAnsi="Cambria Math"/>
               </w:rPr>
               <m:t>)</m:t>
             </m:r>
             <m:r>
               <w:rPr>
-                <w:del w:id="20125" w:author="Claude" w:date="2026-10-09T05:44:13Z"/>
+                <w:del w:id="20125" w:author="Claude" w:date="2026-10-09T05:44:38Z"/>
                 <w:rFonts w:ascii="Cambria Math" w:hAnsi="Cambria Math" w:cs="Times New Roman"/>
               </w:rPr>
               <m:t>C</m:t>
@@ -4544,7 +4564,7 @@
                     <m:sty m:val="p"/>
                   </m:rPr>
                   <w:rPr>
-                    <w:del w:id="20126" w:author="Claude" w:date="2026-10-09T05:44:13Z"/>
+                    <w:del w:id="20126" w:author="Claude" w:date="2026-10-09T05:44:38Z"/>
                     <w:rFonts w:ascii="Cambria Math" w:hAnsi="Cambria Math" w:cs="Times New Roman"/>
                   </w:rPr>
                   <m:t>O</m:t>
@@ -4556,7 +4576,7 @@
                     <m:sty m:val="p"/>
                   </m:rPr>
                   <w:rPr>
-                    <w:del w:id="20127" w:author="Claude" w:date="2026-10-09T05:44:13Z"/>
+                    <w:del w:id="20127" w:author="Claude" w:date="2026-10-09T05:44:38Z"/>
                     <w:rFonts w:ascii="Cambria Math" w:hAnsi="Cambria Math" w:cs="Times New Roman"/>
                   </w:rPr>
                   <m:t>2</m:t>
@@ -4567,7 +4587,7 @@
         </m:sSub>
         <m:r>
           <w:rPr>
-            <w:del w:id="20128" w:author="Claude" w:date="2026-10-09T05:44:13Z"/>
+            <w:del w:id="20128" w:author="Claude" w:date="2026-10-09T05:44:38Z"/>
             <w:rFonts w:ascii="Cambria Math" w:hAnsi="Cambria Math" w:cs="Times New Roman"/>
           </w:rPr>
           <m:t xml:space="preserve"> </m:t>
@@ -4583,7 +4603,7 @@
           <m:e>
             <m:r>
               <w:rPr>
-                <w:del w:id="20129" w:author="Claude" w:date="2026-10-09T05:44:13Z"/>
+                <w:del w:id="20129" w:author="Claude" w:date="2026-10-09T05:44:38Z"/>
                 <w:rFonts w:ascii="Cambria Math" w:hAnsi="Cambria Math"/>
               </w:rPr>
               <m:t>δ</m:t>
@@ -4595,7 +4615,7 @@
                 <m:sty m:val="p"/>
               </m:rPr>
               <w:rPr>
-                <w:del w:id="20130" w:author="Claude" w:date="2026-10-09T05:44:13Z"/>
+                <w:del w:id="20130" w:author="Claude" w:date="2026-10-09T05:44:38Z"/>
                 <w:rFonts w:ascii="Cambria Math" w:hAnsi="Cambria Math"/>
               </w:rPr>
               <m:t>Γ</m:t>
@@ -4608,7 +4628,7 @@
           <m:num>
             <m:r>
               <w:rPr>
-                <w:ins w:id="20085" w:author="Claude" w:date="2026-10-09T05:44:13Z"/>
+                <w:ins w:id="20085" w:author="Claude" w:date="2026-10-09T05:44:38Z"/>
               </w:rPr>
               <m:t xml:space="preserve">∂</m:t>
             </m:r>
@@ -4616,7 +4636,7 @@
               <m:e>
                 <m:r>
                   <w:rPr>
-                    <w:ins w:id="20086" w:author="Claude" w:date="2026-10-09T05:44:13Z"/>
+                    <w:ins w:id="20086" w:author="Claude" w:date="2026-10-09T05:44:38Z"/>
                   </w:rPr>
                   <m:t xml:space="preserve">C</m:t>
                 </m:r>
@@ -4624,7 +4644,7 @@
               <m:sub>
                 <m:r>
                   <w:rPr>
-                    <w:ins w:id="20087" w:author="Claude" w:date="2026-10-09T05:44:13Z"/>
+                    <w:ins w:id="20087" w:author="Claude" w:date="2026-10-09T05:44:38Z"/>
                   </w:rPr>
                   <m:t xml:space="preserve">O₂</m:t>
                 </m:r>
@@ -4634,13 +4654,13 @@
           <m:den>
             <m:r>
               <w:rPr>
-                <w:ins w:id="20088" w:author="Claude" w:date="2026-10-09T05:44:13Z"/>
+                <w:ins w:id="20088" w:author="Claude" w:date="2026-10-09T05:44:38Z"/>
               </w:rPr>
               <m:t xml:space="preserve">∂</m:t>
             </m:r>
             <m:r>
               <w:rPr>
-                <w:ins w:id="20089" w:author="Claude" w:date="2026-10-09T05:44:13Z"/>
+                <w:ins w:id="20089" w:author="Claude" w:date="2026-10-09T05:44:38Z"/>
               </w:rPr>
               <m:t xml:space="preserve">t</m:t>
             </m:r>
@@ -4648,7 +4668,7 @@
         </m:f>
         <m:r>
           <w:rPr>
-            <w:ins w:id="20090" w:author="Claude" w:date="2026-10-09T05:44:13Z"/>
+            <w:ins w:id="20090" w:author="Claude" w:date="2026-10-09T05:44:38Z"/>
           </w:rPr>
           <m:t xml:space="preserve">=∇⋅(</m:t>
         </m:r>
@@ -4658,7 +4678,7 @@
               <m:e>
                 <m:r>
                   <w:rPr>
-                    <w:ins w:id="20091" w:author="Claude" w:date="2026-10-09T05:44:13Z"/>
+                    <w:ins w:id="20091" w:author="Claude" w:date="2026-10-09T05:44:38Z"/>
                   </w:rPr>
                   <m:t xml:space="preserve">D</m:t>
                 </m:r>
@@ -4666,7 +4686,7 @@
               <m:sub>
                 <m:r>
                   <w:rPr>
-                    <w:ins w:id="20092" w:author="Claude" w:date="2026-10-09T05:44:13Z"/>
+                    <w:ins w:id="20092" w:author="Claude" w:date="2026-10-09T05:44:38Z"/>
                   </w:rPr>
                   <m:t xml:space="preserve">O₂</m:t>
                 </m:r>
@@ -4676,7 +4696,7 @@
           <m:sup>
             <m:r>
               <w:rPr>
-                <w:ins w:id="20093" w:author="Claude" w:date="2026-10-09T05:44:13Z"/>
+                <w:ins w:id="20093" w:author="Claude" w:date="2026-10-09T05:44:38Z"/>
               </w:rPr>
               <m:t xml:space="preserve">eff</m:t>
             </m:r>
@@ -4684,7 +4704,7 @@
         </m:sSup>
         <m:r>
           <w:rPr>
-            <w:ins w:id="20094" w:author="Claude" w:date="2026-10-09T05:44:13Z"/>
+            <w:ins w:id="20094" w:author="Claude" w:date="2026-10-09T05:44:38Z"/>
           </w:rPr>
           <m:t xml:space="preserve">∇</m:t>
         </m:r>
@@ -4692,7 +4712,7 @@
           <m:e>
             <m:r>
               <w:rPr>
-                <w:ins w:id="20095" w:author="Claude" w:date="2026-10-09T05:44:13Z"/>
+                <w:ins w:id="20095" w:author="Claude" w:date="2026-10-09T05:44:38Z"/>
               </w:rPr>
               <m:t xml:space="preserve">C</m:t>
             </m:r>
@@ -4700,7 +4720,7 @@
           <m:sub>
             <m:r>
               <w:rPr>
-                <w:ins w:id="20096" w:author="Claude" w:date="2026-10-09T05:44:13Z"/>
+                <w:ins w:id="20096" w:author="Claude" w:date="2026-10-09T05:44:38Z"/>
               </w:rPr>
               <m:t xml:space="preserve">O₂</m:t>
             </m:r>
@@ -4708,7 +4728,7 @@
         </m:sSub>
         <m:r>
           <w:rPr>
-            <w:ins w:id="20097" w:author="Claude" w:date="2026-10-09T05:44:13Z"/>
+            <w:ins w:id="20097" w:author="Claude" w:date="2026-10-09T05:44:38Z"/>
           </w:rPr>
           <m:t xml:space="preserve">)−</m:t>
         </m:r>
@@ -4716,15 +4736,33 @@
           <m:e>
             <m:r>
               <w:rPr>
-                <w:ins w:id="20100" w:author="Claude" w:date="2026-10-09T05:44:13Z"/>
-              </w:rPr>
-              <m:t xml:space="preserve">δ</m:t>
+                <w:ins w:id="20098" w:author="Claude" w:date="2026-10-09T05:44:38Z"/>
+              </w:rPr>
+              <m:t xml:space="preserve">j</m:t>
             </m:r>
           </m:e>
           <m:sub>
             <m:r>
               <w:rPr>
-                <w:ins w:id="20101" w:author="Claude" w:date="2026-10-09T05:44:13Z"/>
+                <w:ins w:id="20099" w:author="Claude" w:date="2026-10-09T05:44:38Z"/>
+              </w:rPr>
+              <m:t xml:space="preserve">ORR</m:t>
+            </m:r>
+          </m:sub>
+        </m:sSub>
+        <m:sSub>
+          <m:e>
+            <m:r>
+              <w:rPr>
+                <w:ins w:id="20100" w:author="Claude" w:date="2026-10-09T05:44:38Z"/>
+              </w:rPr>
+              <m:t xml:space="preserve">δ</m:t>
+            </m:r>
+          </m:e>
+          <m:sub>
+            <m:r>
+              <w:rPr>
+                <w:ins w:id="20101" w:author="Claude" w:date="2026-10-09T05:44:38Z"/>
               </w:rPr>
               <m:t xml:space="preserve">Γ</m:t>
             </m:r>
@@ -4756,11 +4794,11 @@
         <w:pStyle w:val="BodyText"/>
         <w:ind w:firstLine="0"/>
         <w:rPr>
-          <w:del w:id="20027" w:author="Claude" w:date="2026-10-09T05:44:13Z"/>
+          <w:del w:id="20027" w:author="Claude" w:date="2026-10-09T05:44:38Z"/>
           <w:rFonts w:cs="Times New Roman"/>
         </w:rPr>
       </w:pPr>
-      <w:del w:id="20001" w:author="Claude" w:date="2026-10-09T05:44:13Z">
+      <w:del w:id="20001" w:author="Claude" w:date="2026-10-09T05:44:38Z">
         <w:r>
           <w:rPr>
             <w:rFonts w:cs="Times New Roman"/>
@@ -4769,7 +4807,7 @@
         </w:r>
       </w:del>
       <w:proofErr w:type="spellStart"/>
-      <w:del w:id="20002" w:author="Claude" w:date="2026-10-09T05:44:13Z">
+      <w:del w:id="20002" w:author="Claude" w:date="2026-10-09T05:44:38Z">
         <w:r>
           <w:rPr>
             <w:rFonts w:cs="Times New Roman"/>
@@ -4777,7 +4815,7 @@
           <w:delText xml:space="preserve">δ</w:delText>
         </w:r>
       </w:del>
-      <w:del w:id="20003" w:author="Claude" w:date="2026-10-09T05:44:13Z">
+      <w:del w:id="20003" w:author="Claude" w:date="2026-10-09T05:44:38Z">
         <w:r>
           <w:rPr>
             <w:rFonts w:cs="Times New Roman"/>
@@ -4787,7 +4825,7 @@
         </w:r>
       </w:del>
       <w:proofErr w:type="spellEnd"/>
-      <w:del w:id="20004" w:author="Claude" w:date="2026-10-09T05:44:13Z">
+      <w:del w:id="20004" w:author="Claude" w:date="2026-10-09T05:44:38Z">
         <w:r>
           <w:rPr>
             <w:rFonts w:cs="Times New Roman"/>
@@ -4795,7 +4833,7 @@
           <w:delText xml:space="preserve"> = δ(ϕ)|</w:delText>
         </w:r>
       </w:del>
-      <w:del w:id="20005" w:author="Claude" w:date="2026-10-09T05:44:13Z">
+      <w:del w:id="20005" w:author="Claude" w:date="2026-10-09T05:44:38Z">
         <w:r>
           <w:rPr>
             <w:rFonts w:ascii="Cambria Math" w:hAnsi="Cambria Math" w:cs="Cambria Math"/>
@@ -4803,7 +4841,7 @@
           <w:delText xml:space="preserve">∇</w:delText>
         </w:r>
       </w:del>
-      <w:del w:id="20006" w:author="Claude" w:date="2026-10-09T05:44:13Z">
+      <w:del w:id="20006" w:author="Claude" w:date="2026-10-09T05:44:38Z">
         <w:r>
           <w:rPr>
             <w:rFonts w:cs="Times New Roman"/>
@@ -4811,7 +4849,7 @@
           <w:delText xml:space="preserve">ϕ| is the interface delta function (mm</w:delText>
         </w:r>
       </w:del>
-      <w:del w:id="20007" w:author="Claude" w:date="2026-10-09T05:44:13Z">
+      <w:del w:id="20007" w:author="Claude" w:date="2026-10-09T05:44:38Z">
         <w:r>
           <w:rPr>
             <w:rFonts w:cs="Times New Roman"/>
@@ -4820,7 +4858,7 @@
           <w:delText xml:space="preserve">-1</w:delText>
         </w:r>
       </w:del>
-      <w:del w:id="20008" w:author="Claude" w:date="2026-10-09T05:44:13Z">
+      <w:del w:id="20008" w:author="Claude" w:date="2026-10-09T05:44:38Z">
         <w:r>
           <w:rPr>
             <w:rFonts w:cs="Times New Roman"/>
@@ -4840,7 +4878,7 @@
           <m:e>
             <m:r>
               <w:rPr>
-                <w:del w:id="20024" w:author="Claude" w:date="2026-10-09T05:44:13Z"/>
+                <w:del w:id="20024" w:author="Claude" w:date="2026-10-09T05:44:38Z"/>
                 <w:rFonts w:ascii="Cambria Math" w:hAnsi="Cambria Math" w:cs="Times New Roman"/>
               </w:rPr>
               <m:t>k</m:t>
@@ -4852,7 +4890,7 @@
                 <m:sty m:val="p"/>
               </m:rPr>
               <w:rPr>
-                <w:del w:id="20025" w:author="Claude" w:date="2026-10-09T05:44:13Z"/>
+                <w:del w:id="20025" w:author="Claude" w:date="2026-10-09T05:44:38Z"/>
                 <w:rFonts w:ascii="Cambria Math" w:hAnsi="Cambria Math" w:cs="Times New Roman"/>
               </w:rPr>
               <m:t>ORR</m:t>
@@ -4860,7 +4898,7 @@
           </m:sub>
         </m:sSub>
       </m:oMath>
-      <w:del w:id="20009" w:author="Claude" w:date="2026-10-09T05:44:13Z">
+      <w:del w:id="20009" w:author="Claude" w:date="2026-10-09T05:44:38Z">
         <w:r>
           <w:rPr>
             <w:rFonts w:cs="Times New Roman"/>
@@ -4868,7 +4906,7 @@
           <w:delText xml:space="preserve"> is a velocity (mm h</w:delText>
         </w:r>
       </w:del>
-      <w:del w:id="20010" w:author="Claude" w:date="2026-10-09T05:44:13Z">
+      <w:del w:id="20010" w:author="Claude" w:date="2026-10-09T05:44:38Z">
         <w:r>
           <w:rPr>
             <w:rFonts w:cs="Times New Roman"/>
@@ -4877,7 +4915,7 @@
           <w:delText xml:space="preserve">-1</w:delText>
         </w:r>
       </w:del>
-      <w:del w:id="20011" w:author="Claude" w:date="2026-10-09T05:44:13Z">
+      <w:del w:id="20011" w:author="Claude" w:date="2026-10-09T05:44:38Z">
         <w:r>
           <w:rPr>
             <w:rFonts w:cs="Times New Roman"/>
@@ -4888,13 +4926,13 @@
       <m:oMath>
         <m:r>
           <w:rPr>
-            <w:del w:id="20026" w:author="Claude" w:date="2026-10-09T05:44:13Z"/>
+            <w:del w:id="20026" w:author="Claude" w:date="2026-10-09T05:44:38Z"/>
             <w:rFonts w:ascii="Cambria Math" w:hAnsi="Cambria Math" w:cs="Times New Roman"/>
           </w:rPr>
           <m:t>κ(F) = 1 – F.(1 - ε/τ)</m:t>
         </m:r>
       </m:oMath>
-      <w:del w:id="20012" w:author="Claude" w:date="2026-10-09T05:44:13Z">
+      <w:del w:id="20012" w:author="Claude" w:date="2026-10-09T05:44:38Z">
         <w:r>
           <w:rPr>
             <w:rFonts w:cs="Times New Roman"/>
@@ -4902,7 +4940,7 @@
           <w:delText xml:space="preserve"> is the factor by which the corrosion-product film reduces the reaction, using the same porosity (ε) and tortuosity (τ) reduction as the effective-diffusivity law of the film </w:delText>
         </w:r>
       </w:del>
-      <w:del w:id="20013" w:author="Claude" w:date="2026-10-09T05:44:13Z">
+      <w:del w:id="20013" w:author="Claude" w:date="2026-10-09T05:44:38Z">
         <w:r>
           <w:rPr>
             <w:rFonts w:cs="Times New Roman"/>
@@ -4910,7 +4948,7 @@
           <w:delText xml:space="preserve">in </w:delText>
         </w:r>
       </w:del>
-      <w:del w:id="20014" w:author="Claude" w:date="2026-10-09T05:44:13Z">
+      <w:del w:id="20014" w:author="Claude" w:date="2026-10-09T05:44:38Z">
         <w:r>
           <w:rPr>
             <w:b/>
@@ -4919,7 +4957,7 @@
           <w:delText xml:space="preserve">Equation </w:delText>
         </w:r>
       </w:del>
-      <w:del w:id="20015" w:author="Claude" w:date="2026-10-09T05:44:13Z">
+      <w:del w:id="20015" w:author="Claude" w:date="2026-10-09T05:44:38Z">
         <w:r>
           <w:rPr>
             <w:b/>
@@ -4928,7 +4966,7 @@
           <w:delText xml:space="preserve">12</w:delText>
         </w:r>
       </w:del>
-      <w:del w:id="20016" w:author="Claude" w:date="2026-10-09T05:44:13Z">
+      <w:del w:id="20016" w:author="Claude" w:date="2026-10-09T05:44:38Z">
         <w:r>
           <w:rPr>
             <w:rFonts w:cs="Times New Roman"/>
@@ -4936,7 +4974,7 @@
           <w:delText xml:space="preserve">. Chloride acts as a catalytic species, regenerated during film breakdown rather than consumed</w:delText>
         </w:r>
       </w:del>
-      <w:del w:id="20017" w:author="Claude" w:date="2026-10-09T05:44:13Z">
+      <w:del w:id="20017" w:author="Claude" w:date="2026-10-09T05:44:38Z">
         <w:r>
           <w:rPr>
             <w:rFonts w:cs="Times New Roman"/>
@@ -4944,7 +4982,7 @@
           <w:delText xml:space="preserve"> </w:delText>
         </w:r>
       </w:del>
-      <w:del w:id="20018" w:author="Claude" w:date="2026-10-09T05:44:13Z">
+      <w:del w:id="20018" w:author="Claude" w:date="2026-10-09T05:44:38Z">
         <w:r>
           <w:rPr>
             <w:rFonts w:cs="Times New Roman"/>
@@ -4952,7 +4990,7 @@
           <w:fldChar w:fldCharType="begin"/>
         </w:r>
       </w:del>
-      <w:del w:id="20019" w:author="Claude" w:date="2026-10-09T05:44:13Z">
+      <w:del w:id="20019" w:author="Claude" w:date="2026-10-09T05:44:38Z">
         <w:r>
           <w:rPr>
             <w:rFonts w:cs="Times New Roman"/>
@@ -4960,7 +4998,7 @@
           <w:delInstrText xml:space="preserve"> ADDIN ZOTERO_ITEM CSL_CITATION {"citationID":"eTfl7xu9","properties":{"unsorted":false,"formattedCitation":"\\super [19]\\nosupersub{}","plainCitation":"[19]","noteIndex":0},"citationItems":[{"id":1722,"uris":["http://zotero.org/users/16939557/items/FZJ2S65B"],"itemData":{"id":1722,"type":"article-journal","citation-key":"bajgerMathematicalModellingDegradation2017","container-title":"Biomechanics and Modeling in Mechanobiology","DOI":"10.1007/s10237-016-0812-3","ISSN":"1617-7959, 1617-7940","issue":"1","journalAbbreviation":"Biomech Model Mechanobiol","language":"en","page":"227-238","source":"DOI.org (Crossref)","title":"Mathematical modelling of the degradation behaviour of biodegradable metals","volume":"16","author":[{"family":"Bajger","given":"P."},{"family":"Ashbourn","given":"J. M. A."},{"family":"Manhas","given":"V."},{"family":"Guyot","given":"Y."},{"family":"Lietaert","given":"K."},{"family":"Geris","given":"L."}],"issued":{"date-parts":[["2017",2]]}}}],"schema":"https://github.com/citation-style-language/schema/raw/master/csl-citation.json"} </w:delInstrText>
         </w:r>
       </w:del>
-      <w:del w:id="20020" w:author="Claude" w:date="2026-10-09T05:44:13Z">
+      <w:del w:id="20020" w:author="Claude" w:date="2026-10-09T05:44:38Z">
         <w:r>
           <w:rPr>
             <w:rFonts w:cs="Times New Roman"/>
@@ -4968,7 +5006,7 @@
           <w:fldChar w:fldCharType="separate"/>
         </w:r>
       </w:del>
-      <w:del w:id="20021" w:author="Claude" w:date="2026-10-09T05:44:13Z">
+      <w:del w:id="20021" w:author="Claude" w:date="2026-10-09T05:44:38Z">
         <w:r>
           <w:rPr>
             <w:rFonts w:cs="Times New Roman"/>
@@ -4977,7 +5015,7 @@
           <w:delText xml:space="preserve">[19]</w:delText>
         </w:r>
       </w:del>
-      <w:del w:id="20022" w:author="Claude" w:date="2026-10-09T05:44:13Z">
+      <w:del w:id="20022" w:author="Claude" w:date="2026-10-09T05:44:38Z">
         <w:r>
           <w:rPr>
             <w:rFonts w:cs="Times New Roman"/>
@@ -4985,7 +5023,7 @@
           <w:fldChar w:fldCharType="end"/>
         </w:r>
       </w:del>
-      <w:del w:id="20023" w:author="Claude" w:date="2026-10-09T05:44:13Z">
+      <w:del w:id="20023" w:author="Claude" w:date="2026-10-09T05:44:38Z">
         <w:r>
           <w:rPr>
             <w:rFonts w:cs="Times New Roman"/>
@@ -4998,15 +5036,15 @@
       <w:pPr>
         <w:pStyle w:val="BodyText"/>
         <w:rPr>
-          <w:ins w:id="20033" w:author="Claude" w:date="2026-10-09T05:44:13Z"/>
+          <w:ins w:id="20033" w:author="Claude" w:date="2026-10-09T05:44:38Z"/>
         </w:rPr>
       </w:pPr>
-      <w:ins w:id="20028" w:author="Claude" w:date="2026-10-09T05:44:13Z">
+      <w:ins w:id="20028" w:author="Claude" w:date="2026-10-09T05:44:38Z">
         <w:r>
           <w:t xml:space="preserve">where δ</w:t>
         </w:r>
       </w:ins>
-      <w:ins w:id="20029" w:author="Claude" w:date="2026-10-09T05:44:13Z">
+      <w:ins w:id="20029" w:author="Claude" w:date="2026-10-09T05:44:38Z">
         <w:r>
           <w:rPr>
             <w:vertAlign w:val="subscript"/>
@@ -5014,12 +5052,12 @@
           <w:t xml:space="preserve">Γ</w:t>
         </w:r>
       </w:ins>
-      <w:ins w:id="20030" w:author="Claude" w:date="2026-10-09T05:44:13Z">
+      <w:ins w:id="20030" w:author="Claude" w:date="2026-10-09T05:44:38Z">
         <w:r>
           <w:t xml:space="preserve"> = δ(ϕ)|∇ϕ| is the interface delta function (mm⁻¹) and C</w:t>
         </w:r>
       </w:ins>
-      <w:ins w:id="20031" w:author="Claude" w:date="2026-10-09T05:44:13Z">
+      <w:ins w:id="20031" w:author="Claude" w:date="2026-10-09T05:44:38Z">
         <w:r>
           <w:rPr>
             <w:vertAlign w:val="subscript"/>
@@ -5027,12 +5065,12 @@
           <w:t xml:space="preserve">O2</w:t>
         </w:r>
       </w:ins>
-      <w:ins w:id="20032" w:author="Claude" w:date="2026-10-09T05:44:13Z">
+      <w:ins w:id="20032" w:author="Claude" w:date="2026-10-09T05:44:38Z">
         <w:r>
           <w:t xml:space="preserve"> is the molar concentration of dissolved oxygen (mol mm⁻³). Chloride acts as a catalytic species, regenerated during film breakdown rather than consumed </w:t>
         </w:r>
       </w:ins>
-      <w:ins w:id="20034" w:author="Claude" w:date="2026-10-09T05:44:13Z">
+      <w:ins w:id="20034" w:author="Claude" w:date="2026-10-09T05:44:38Z">
         <w:r>
           <w:rPr>
             <w:rFonts w:cs="Times New Roman"/>
@@ -5040,7 +5078,7 @@
           <w:fldChar w:fldCharType="begin"/>
         </w:r>
       </w:ins>
-      <w:ins w:id="20035" w:author="Claude" w:date="2026-10-09T05:44:13Z">
+      <w:ins w:id="20035" w:author="Claude" w:date="2026-10-09T05:44:38Z">
         <w:r>
           <w:rPr>
             <w:rFonts w:cs="Times New Roman"/>
@@ -5048,7 +5086,7 @@
           <w:instrText xml:space="preserve"> ADDIN ZOTERO_ITEM CSL_CITATION {"citationID":"eTfl7xu9","properties":{"unsorted":false,"formattedCitation":"\\super [19]\\nosupersub{}","plainCitation":"[19]","noteIndex":0},"citationItems":[{"id":1722,"uris":["http://zotero.org/users/16939557/items/FZJ2S65B"],"itemData":{"id":1722,"type":"article-journal","citation-key":"bajgerMathematicalModellingDegradation2017","container-title":"Biomechanics and Modeling in Mechanobiology","DOI":"10.1007/s10237-016-0812-3","ISSN":"1617-7959, 1617-7940","issue":"1","journalAbbreviation":"Biomech Model Mechanobiol","language":"en","page":"227-238","source":"DOI.org (Crossref)","title":"Mathematical modelling of the degradation behaviour of biodegradable metals","volume":"16","author":[{"family":"Bajger","given":"P."},{"family":"Ashbourn","given":"J. M. A."},{"family":"Manhas","given":"V."},{"family":"Guyot","given":"Y."},{"family":"Lietaert","given":"K."},{"family":"Geris","given":"L."}],"issued":{"date-parts":[["2017",2]]}}}],"schema":"https://github.com/citation-style-language/schema/raw/master/csl-citation.json"} </w:instrText>
         </w:r>
       </w:ins>
-      <w:ins w:id="20036" w:author="Claude" w:date="2026-10-09T05:44:13Z">
+      <w:ins w:id="20036" w:author="Claude" w:date="2026-10-09T05:44:38Z">
         <w:r>
           <w:rPr>
             <w:rFonts w:cs="Times New Roman"/>
@@ -5056,7 +5094,7 @@
           <w:fldChar w:fldCharType="separate"/>
         </w:r>
       </w:ins>
-      <w:ins w:id="20037" w:author="Claude" w:date="2026-10-09T05:44:13Z">
+      <w:ins w:id="20037" w:author="Claude" w:date="2026-10-09T05:44:38Z">
         <w:r>
           <w:rPr>
             <w:rFonts w:cs="Times New Roman"/>
@@ -5065,7 +5103,7 @@
           <w:delText xml:space="preserve">[19]</w:delText>
         </w:r>
       </w:ins>
-      <w:ins w:id="20038" w:author="Claude" w:date="2026-10-09T05:44:13Z">
+      <w:ins w:id="20038" w:author="Claude" w:date="2026-10-09T05:44:38Z">
         <w:r>
           <w:rPr>
             <w:rFonts w:cs="Times New Roman"/>
@@ -5073,7 +5111,7 @@
           <w:fldChar w:fldCharType="end"/>
         </w:r>
       </w:ins>
-      <w:ins w:id="20032" w:author="Claude" w:date="2026-10-09T05:44:13Z">
+      <w:ins w:id="20032" w:author="Claude" w:date="2026-10-09T05:44:38Z">
         <w:r>
           <w:t xml:space="preserve">:</w:t>
         </w:r>
@@ -5543,7 +5581,7 @@
                       <m:sty m:val="p"/>
                     </m:rPr>
                     <w:rPr>
-                      <w:del w:id="20153" w:author="Claude" w:date="2026-10-09T05:44:13Z"/>
+                      <w:del w:id="20153" w:author="Claude" w:date="2026-10-09T05:44:38Z"/>
                       <w:rFonts w:ascii="Cambria Math" w:hAnsi="Cambria Math" w:cs="Times New Roman"/>
                     </w:rPr>
                     <m:t>∂</m:t>
@@ -5559,7 +5597,7 @@
                     <m:e>
                       <m:r>
                         <w:rPr>
-                          <w:del w:id="20154" w:author="Claude" w:date="2026-10-09T05:44:13Z"/>
+                          <w:del w:id="20154" w:author="Claude" w:date="2026-10-09T05:44:38Z"/>
                           <w:rFonts w:ascii="Cambria Math" w:hAnsi="Cambria Math" w:cs="Times New Roman"/>
                         </w:rPr>
                         <m:t>C</m:t>
@@ -5571,7 +5609,7 @@
                           <m:sty m:val="p"/>
                         </m:rPr>
                         <w:rPr>
-                          <w:del w:id="20155" w:author="Claude" w:date="2026-10-09T05:44:13Z"/>
+                          <w:del w:id="20155" w:author="Claude" w:date="2026-10-09T05:44:38Z"/>
                           <w:rFonts w:ascii="Cambria Math" w:hAnsi="Cambria Math" w:cs="Times New Roman"/>
                         </w:rPr>
                         <m:t>Zn</m:t>
@@ -5585,14 +5623,14 @@
                       <m:sty m:val="p"/>
                     </m:rPr>
                     <w:rPr>
-                      <w:del w:id="20156" w:author="Claude" w:date="2026-10-09T05:44:13Z"/>
+                      <w:del w:id="20156" w:author="Claude" w:date="2026-10-09T05:44:38Z"/>
                       <w:rFonts w:ascii="Cambria Math" w:hAnsi="Cambria Math" w:cs="Times New Roman"/>
                     </w:rPr>
                     <m:t>∂</m:t>
                   </m:r>
                   <m:r>
                     <w:rPr>
-                      <w:del w:id="20157" w:author="Claude" w:date="2026-10-09T05:44:13Z"/>
+                      <w:del w:id="20157" w:author="Claude" w:date="2026-10-09T05:44:38Z"/>
                       <w:rFonts w:ascii="Cambria Math" w:hAnsi="Cambria Math" w:cs="Times New Roman"/>
                     </w:rPr>
                     <m:t>t</m:t>
@@ -5604,7 +5642,7 @@
                   <m:sty m:val="p"/>
                 </m:rPr>
                 <w:rPr>
-                  <w:del w:id="20158" w:author="Claude" w:date="2026-10-09T05:44:13Z"/>
+                  <w:del w:id="20158" w:author="Claude" w:date="2026-10-09T05:44:38Z"/>
                   <w:rFonts w:ascii="Cambria Math" w:hAnsi="Cambria Math" w:cs="Times New Roman"/>
                 </w:rPr>
                 <m:t>=∇⋅</m:t>
@@ -5629,7 +5667,7 @@
                     <m:e>
                       <m:r>
                         <w:rPr>
-                          <w:del w:id="20159" w:author="Claude" w:date="2026-10-09T05:44:13Z"/>
+                          <w:del w:id="20159" w:author="Claude" w:date="2026-10-09T05:44:38Z"/>
                           <w:rFonts w:ascii="Cambria Math" w:hAnsi="Cambria Math" w:cs="Times New Roman"/>
                         </w:rPr>
                         <m:t>D</m:t>
@@ -5641,7 +5679,7 @@
                           <m:sty m:val="p"/>
                         </m:rPr>
                         <w:rPr>
-                          <w:del w:id="20160" w:author="Claude" w:date="2026-10-09T05:44:13Z"/>
+                          <w:del w:id="20160" w:author="Claude" w:date="2026-10-09T05:44:38Z"/>
                           <w:rFonts w:ascii="Cambria Math" w:hAnsi="Cambria Math" w:cs="Times New Roman"/>
                         </w:rPr>
                         <m:t>Zn</m:t>
@@ -5653,7 +5691,7 @@
                           <m:nor/>
                         </m:rPr>
                         <w:rPr>
-                          <w:del w:id="20161" w:author="Claude" w:date="2026-10-09T05:44:13Z"/>
+                          <w:del w:id="20161" w:author="Claude" w:date="2026-10-09T05:44:38Z"/>
                           <w:rFonts w:cs="Times New Roman"/>
                         </w:rPr>
                         <m:t>eff</m:t>
@@ -5662,7 +5700,7 @@
                   </m:sSubSup>
                   <m:r>
                     <w:rPr>
-                      <w:del w:id="20162" w:author="Claude" w:date="2026-10-09T05:44:13Z"/>
+                      <w:del w:id="20162" w:author="Claude" w:date="2026-10-09T05:44:38Z"/>
                       <w:rFonts w:ascii="Cambria Math" w:hAnsi="Cambria Math" w:cs="Times New Roman"/>
                     </w:rPr>
                     <m:t> </m:t>
@@ -5672,7 +5710,7 @@
                       <m:sty m:val="p"/>
                     </m:rPr>
                     <w:rPr>
-                      <w:del w:id="20163" w:author="Claude" w:date="2026-10-09T05:44:13Z"/>
+                      <w:del w:id="20163" w:author="Claude" w:date="2026-10-09T05:44:38Z"/>
                       <w:rFonts w:ascii="Cambria Math" w:hAnsi="Cambria Math" w:cs="Times New Roman"/>
                     </w:rPr>
                     <m:t>∇</m:t>
@@ -5688,7 +5726,7 @@
                     <m:e>
                       <m:r>
                         <w:rPr>
-                          <w:del w:id="20164" w:author="Claude" w:date="2026-10-09T05:44:13Z"/>
+                          <w:del w:id="20164" w:author="Claude" w:date="2026-10-09T05:44:38Z"/>
                           <w:rFonts w:ascii="Cambria Math" w:hAnsi="Cambria Math" w:cs="Times New Roman"/>
                         </w:rPr>
                         <m:t>C</m:t>
@@ -5700,7 +5738,7 @@
                           <m:sty m:val="p"/>
                         </m:rPr>
                         <w:rPr>
-                          <w:del w:id="20165" w:author="Claude" w:date="2026-10-09T05:44:13Z"/>
+                          <w:del w:id="20165" w:author="Claude" w:date="2026-10-09T05:44:38Z"/>
                           <w:rFonts w:ascii="Cambria Math" w:hAnsi="Cambria Math" w:cs="Times New Roman"/>
                         </w:rPr>
                         <m:t>Zn</m:t>
@@ -5714,7 +5752,7 @@
                   <m:sty m:val="p"/>
                 </m:rPr>
                 <w:rPr>
-                  <w:del w:id="20166" w:author="Claude" w:date="2026-10-09T05:44:13Z"/>
+                  <w:del w:id="20166" w:author="Claude" w:date="2026-10-09T05:44:38Z"/>
                   <w:rFonts w:ascii="Cambria Math" w:hAnsi="Cambria Math" w:cs="Times New Roman"/>
                 </w:rPr>
                 <m:t>+2</m:t>
@@ -5730,7 +5768,7 @@
                 <m:e>
                   <m:r>
                     <w:rPr>
-                      <w:del w:id="20167" w:author="Claude" w:date="2026-10-09T05:44:13Z"/>
+                      <w:del w:id="20167" w:author="Claude" w:date="2026-10-09T05:44:38Z"/>
                       <w:rFonts w:ascii="Cambria Math" w:hAnsi="Cambria Math" w:cs="Times New Roman"/>
                     </w:rPr>
                     <m:t>k</m:t>
@@ -5742,7 +5780,7 @@
                       <m:sty m:val="p"/>
                     </m:rPr>
                     <w:rPr>
-                      <w:del w:id="20168" w:author="Claude" w:date="2026-10-09T05:44:13Z"/>
+                      <w:del w:id="20168" w:author="Claude" w:date="2026-10-09T05:44:38Z"/>
                       <w:rFonts w:ascii="Cambria Math" w:hAnsi="Cambria Math" w:cs="Times New Roman"/>
                     </w:rPr>
                     <m:t>ORR</m:t>
@@ -5751,7 +5789,7 @@
               </m:sSub>
               <m:r>
                 <w:rPr>
-                  <w:del w:id="20169" w:author="Claude" w:date="2026-10-09T05:44:13Z"/>
+                  <w:del w:id="20169" w:author="Claude" w:date="2026-10-09T05:44:38Z"/>
                   <w:rFonts w:ascii="Cambria Math" w:hAnsi="Cambria Math" w:cs="Times New Roman"/>
                 </w:rPr>
                 <m:t> </m:t>
@@ -5767,14 +5805,14 @@
                 <m:e>
                   <m:r>
                     <w:rPr>
-                      <w:del w:id="20170" w:author="Claude" w:date="2026-10-09T05:44:13Z"/>
+                      <w:del w:id="20170" w:author="Claude" w:date="2026-10-09T05:44:38Z"/>
                       <w:rFonts w:ascii="Cambria Math" w:hAnsi="Cambria Math"/>
                     </w:rPr>
                     <m:t>κ</m:t>
                   </m:r>
                   <m:r>
                     <w:rPr>
-                      <w:del w:id="20171" w:author="Claude" w:date="2026-10-09T05:44:13Z"/>
+                      <w:del w:id="20171" w:author="Claude" w:date="2026-10-09T05:44:38Z"/>
                       <w:rFonts w:ascii="Cambria Math" w:hAnsi="Cambria Math" w:cs="Times New Roman"/>
                     </w:rPr>
                     <m:t>C</m:t>
@@ -5795,7 +5833,7 @@
                           <m:sty m:val="p"/>
                         </m:rPr>
                         <w:rPr>
-                          <w:del w:id="20172" w:author="Claude" w:date="2026-10-09T05:44:13Z"/>
+                          <w:del w:id="20172" w:author="Claude" w:date="2026-10-09T05:44:38Z"/>
                           <w:rFonts w:ascii="Cambria Math" w:hAnsi="Cambria Math" w:cs="Times New Roman"/>
                         </w:rPr>
                         <m:t>O</m:t>
@@ -5807,7 +5845,7 @@
                           <m:sty m:val="p"/>
                         </m:rPr>
                         <w:rPr>
-                          <w:del w:id="20173" w:author="Claude" w:date="2026-10-09T05:44:13Z"/>
+                          <w:del w:id="20173" w:author="Claude" w:date="2026-10-09T05:44:38Z"/>
                           <w:rFonts w:ascii="Cambria Math" w:hAnsi="Cambria Math" w:cs="Times New Roman"/>
                         </w:rPr>
                         <m:t>2</m:t>
@@ -5818,7 +5856,7 @@
               </m:sSub>
               <m:r>
                 <w:rPr>
-                  <w:del w:id="20174" w:author="Claude" w:date="2026-10-09T05:44:13Z"/>
+                  <w:del w:id="20174" w:author="Claude" w:date="2026-10-09T05:44:38Z"/>
                   <w:rFonts w:ascii="Cambria Math" w:hAnsi="Cambria Math" w:cs="Times New Roman"/>
                 </w:rPr>
                 <m:t> </m:t>
@@ -5834,7 +5872,7 @@
                 <m:e>
                   <m:r>
                     <w:rPr>
-                      <w:del w:id="20175" w:author="Claude" w:date="2026-10-09T05:44:13Z"/>
+                      <w:del w:id="20175" w:author="Claude" w:date="2026-10-09T05:44:38Z"/>
                       <w:rFonts w:ascii="Cambria Math" w:hAnsi="Cambria Math" w:cs="Times New Roman"/>
                     </w:rPr>
                     <m:t>δ</m:t>
@@ -5846,7 +5884,7 @@
                       <m:sty m:val="p"/>
                     </m:rPr>
                     <w:rPr>
-                      <w:del w:id="20176" w:author="Claude" w:date="2026-10-09T05:44:13Z"/>
+                      <w:del w:id="20176" w:author="Claude" w:date="2026-10-09T05:44:38Z"/>
                       <w:rFonts w:ascii="Cambria Math" w:hAnsi="Cambria Math" w:cs="Times New Roman"/>
                     </w:rPr>
                     <m:t>Γ</m:t>
@@ -5858,7 +5896,7 @@
                   <m:sty m:val="p"/>
                 </m:rPr>
                 <w:rPr>
-                  <w:del w:id="20177" w:author="Claude" w:date="2026-10-09T05:44:13Z"/>
+                  <w:del w:id="20177" w:author="Claude" w:date="2026-10-09T05:44:38Z"/>
                   <w:rFonts w:ascii="Cambria Math" w:hAnsi="Cambria Math" w:cs="Times New Roman"/>
                 </w:rPr>
                 <m:t>-</m:t>
@@ -5877,14 +5915,14 @@
                       <m:sty m:val="p"/>
                     </m:rPr>
                     <w:rPr>
-                      <w:del w:id="20178" w:author="Claude" w:date="2026-10-09T05:44:13Z"/>
+                      <w:del w:id="20178" w:author="Claude" w:date="2026-10-09T05:44:38Z"/>
                       <w:rFonts w:ascii="Cambria Math" w:hAnsi="Cambria Math" w:cs="Times New Roman"/>
                     </w:rPr>
                     <m:t>∂</m:t>
                   </m:r>
                   <m:r>
                     <w:rPr>
-                      <w:del w:id="20179" w:author="Claude" w:date="2026-10-09T05:44:13Z"/>
+                      <w:del w:id="20179" w:author="Claude" w:date="2026-10-09T05:44:38Z"/>
                       <w:rFonts w:ascii="Cambria Math" w:hAnsi="Cambria Math" w:cs="Times New Roman"/>
                     </w:rPr>
                     <m:t>F</m:t>
@@ -5896,14 +5934,14 @@
                       <m:sty m:val="p"/>
                     </m:rPr>
                     <w:rPr>
-                      <w:del w:id="20180" w:author="Claude" w:date="2026-10-09T05:44:13Z"/>
+                      <w:del w:id="20180" w:author="Claude" w:date="2026-10-09T05:44:38Z"/>
                       <w:rFonts w:ascii="Cambria Math" w:hAnsi="Cambria Math" w:cs="Times New Roman"/>
                     </w:rPr>
                     <m:t>∂</m:t>
                   </m:r>
                   <m:r>
                     <w:rPr>
-                      <w:del w:id="20181" w:author="Claude" w:date="2026-10-09T05:44:13Z"/>
+                      <w:del w:id="20181" w:author="Claude" w:date="2026-10-09T05:44:38Z"/>
                       <w:rFonts w:ascii="Cambria Math" w:hAnsi="Cambria Math" w:cs="Times New Roman"/>
                     </w:rPr>
                     <m:t>t</m:t>
@@ -5919,7 +5957,7 @@
           <m:num>
             <m:r>
               <w:rPr>
-                <w:ins w:id="20131" w:author="Claude" w:date="2026-10-09T05:44:13Z"/>
+                <w:ins w:id="20131" w:author="Claude" w:date="2026-10-09T05:44:38Z"/>
               </w:rPr>
               <m:t xml:space="preserve">∂</m:t>
             </m:r>
@@ -5927,7 +5965,7 @@
               <m:e>
                 <m:r>
                   <w:rPr>
-                    <w:ins w:id="20132" w:author="Claude" w:date="2026-10-09T05:44:13Z"/>
+                    <w:ins w:id="20132" w:author="Claude" w:date="2026-10-09T05:44:38Z"/>
                   </w:rPr>
                   <m:t xml:space="preserve">C</m:t>
                 </m:r>
@@ -5935,7 +5973,7 @@
               <m:sub>
                 <m:r>
                   <w:rPr>
-                    <w:ins w:id="20133" w:author="Claude" w:date="2026-10-09T05:44:13Z"/>
+                    <w:ins w:id="20133" w:author="Claude" w:date="2026-10-09T05:44:38Z"/>
                   </w:rPr>
                   <m:t xml:space="preserve">Zn</m:t>
                 </m:r>
@@ -5945,13 +5983,13 @@
           <m:den>
             <m:r>
               <w:rPr>
-                <w:ins w:id="20134" w:author="Claude" w:date="2026-10-09T05:44:13Z"/>
+                <w:ins w:id="20134" w:author="Claude" w:date="2026-10-09T05:44:38Z"/>
               </w:rPr>
               <m:t xml:space="preserve">∂</m:t>
             </m:r>
             <m:r>
               <w:rPr>
-                <w:ins w:id="20135" w:author="Claude" w:date="2026-10-09T05:44:13Z"/>
+                <w:ins w:id="20135" w:author="Claude" w:date="2026-10-09T05:44:38Z"/>
               </w:rPr>
               <m:t xml:space="preserve">t</m:t>
             </m:r>
@@ -5959,7 +5997,7 @@
         </m:f>
         <m:r>
           <w:rPr>
-            <w:ins w:id="20136" w:author="Claude" w:date="2026-10-09T05:44:13Z"/>
+            <w:ins w:id="20136" w:author="Claude" w:date="2026-10-09T05:44:38Z"/>
           </w:rPr>
           <m:t xml:space="preserve">=∇⋅(</m:t>
         </m:r>
@@ -5969,7 +6007,7 @@
               <m:e>
                 <m:r>
                   <w:rPr>
-                    <w:ins w:id="20137" w:author="Claude" w:date="2026-10-09T05:44:13Z"/>
+                    <w:ins w:id="20137" w:author="Claude" w:date="2026-10-09T05:44:38Z"/>
                   </w:rPr>
                   <m:t xml:space="preserve">D</m:t>
                 </m:r>
@@ -5977,7 +6015,7 @@
               <m:sub>
                 <m:r>
                   <w:rPr>
-                    <w:ins w:id="20138" w:author="Claude" w:date="2026-10-09T05:44:13Z"/>
+                    <w:ins w:id="20138" w:author="Claude" w:date="2026-10-09T05:44:38Z"/>
                   </w:rPr>
                   <m:t xml:space="preserve">Zn</m:t>
                 </m:r>
@@ -5987,7 +6025,7 @@
           <m:sup>
             <m:r>
               <w:rPr>
-                <w:ins w:id="20139" w:author="Claude" w:date="2026-10-09T05:44:13Z"/>
+                <w:ins w:id="20139" w:author="Claude" w:date="2026-10-09T05:44:38Z"/>
               </w:rPr>
               <m:t xml:space="preserve">eff</m:t>
             </m:r>
@@ -5995,7 +6033,7 @@
         </m:sSup>
         <m:r>
           <w:rPr>
-            <w:ins w:id="20140" w:author="Claude" w:date="2026-10-09T05:44:13Z"/>
+            <w:ins w:id="20140" w:author="Claude" w:date="2026-10-09T05:44:38Z"/>
           </w:rPr>
           <m:t xml:space="preserve">∇</m:t>
         </m:r>
@@ -6003,7 +6041,7 @@
           <m:e>
             <m:r>
               <w:rPr>
-                <w:ins w:id="20141" w:author="Claude" w:date="2026-10-09T05:44:13Z"/>
+                <w:ins w:id="20141" w:author="Claude" w:date="2026-10-09T05:44:38Z"/>
               </w:rPr>
               <m:t xml:space="preserve">C</m:t>
             </m:r>
@@ -6011,7 +6049,7 @@
           <m:sub>
             <m:r>
               <w:rPr>
-                <w:ins w:id="20142" w:author="Claude" w:date="2026-10-09T05:44:13Z"/>
+                <w:ins w:id="20142" w:author="Claude" w:date="2026-10-09T05:44:38Z"/>
               </w:rPr>
               <m:t xml:space="preserve">Zn</m:t>
             </m:r>
@@ -6019,7 +6057,7 @@
         </m:sSub>
         <m:r>
           <w:rPr>
-            <w:ins w:id="20143" w:author="Claude" w:date="2026-10-09T05:44:13Z"/>
+            <w:ins w:id="20143" w:author="Claude" w:date="2026-10-09T05:44:38Z"/>
           </w:rPr>
           <m:t xml:space="preserve">)+2</m:t>
         </m:r>
@@ -6027,15 +6065,33 @@
           <m:e>
             <m:r>
               <w:rPr>
-                <w:ins w:id="20146" w:author="Claude" w:date="2026-10-09T05:44:13Z"/>
-              </w:rPr>
-              <m:t xml:space="preserve">δ</m:t>
+                <w:ins w:id="20144" w:author="Claude" w:date="2026-10-09T05:44:38Z"/>
+              </w:rPr>
+              <m:t xml:space="preserve">j</m:t>
             </m:r>
           </m:e>
           <m:sub>
             <m:r>
               <w:rPr>
-                <w:ins w:id="20147" w:author="Claude" w:date="2026-10-09T05:44:13Z"/>
+                <w:ins w:id="20145" w:author="Claude" w:date="2026-10-09T05:44:38Z"/>
+              </w:rPr>
+              <m:t xml:space="preserve">ORR</m:t>
+            </m:r>
+          </m:sub>
+        </m:sSub>
+        <m:sSub>
+          <m:e>
+            <m:r>
+              <w:rPr>
+                <w:ins w:id="20146" w:author="Claude" w:date="2026-10-09T05:44:38Z"/>
+              </w:rPr>
+              <m:t xml:space="preserve">δ</m:t>
+            </m:r>
+          </m:e>
+          <m:sub>
+            <m:r>
+              <w:rPr>
+                <w:ins w:id="20147" w:author="Claude" w:date="2026-10-09T05:44:38Z"/>
               </w:rPr>
               <m:t xml:space="preserve">Γ</m:t>
             </m:r>
@@ -6043,7 +6099,7 @@
         </m:sSub>
         <m:r>
           <w:rPr>
-            <w:ins w:id="20148" w:author="Claude" w:date="2026-10-09T05:44:13Z"/>
+            <w:ins w:id="20148" w:author="Claude" w:date="2026-10-09T05:44:38Z"/>
           </w:rPr>
           <m:t xml:space="preserve">−</m:t>
         </m:r>
@@ -6051,13 +6107,13 @@
           <m:num>
             <m:r>
               <w:rPr>
-                <w:ins w:id="20149" w:author="Claude" w:date="2026-10-09T05:44:13Z"/>
+                <w:ins w:id="20149" w:author="Claude" w:date="2026-10-09T05:44:38Z"/>
               </w:rPr>
               <m:t xml:space="preserve">∂</m:t>
             </m:r>
             <m:r>
               <w:rPr>
-                <w:ins w:id="20150" w:author="Claude" w:date="2026-10-09T05:44:13Z"/>
+                <w:ins w:id="20150" w:author="Claude" w:date="2026-10-09T05:44:38Z"/>
               </w:rPr>
               <m:t xml:space="preserve">F</m:t>
             </m:r>
@@ -6065,13 +6121,13 @@
           <m:den>
             <m:r>
               <w:rPr>
-                <w:ins w:id="20151" w:author="Claude" w:date="2026-10-09T05:44:13Z"/>
+                <w:ins w:id="20151" w:author="Claude" w:date="2026-10-09T05:44:38Z"/>
               </w:rPr>
               <m:t xml:space="preserve">∂</m:t>
             </m:r>
             <m:r>
               <w:rPr>
-                <w:ins w:id="20152" w:author="Claude" w:date="2026-10-09T05:44:13Z"/>
+                <w:ins w:id="20152" w:author="Claude" w:date="2026-10-09T05:44:38Z"/>
               </w:rPr>
               <m:t xml:space="preserve">t</m:t>
             </m:r>
@@ -6144,7 +6200,7 @@
                       <m:sty m:val="p"/>
                     </m:rPr>
                     <w:rPr>
-                      <w:del w:id="20204" w:author="Claude" w:date="2026-10-09T05:44:13Z"/>
+                      <w:del w:id="20204" w:author="Claude" w:date="2026-10-09T05:44:38Z"/>
                       <w:rFonts w:ascii="Cambria Math" w:hAnsi="Cambria Math" w:cs="Times New Roman"/>
                     </w:rPr>
                     <m:t>∂</m:t>
@@ -6160,7 +6216,7 @@
                     <m:e>
                       <m:r>
                         <w:rPr>
-                          <w:del w:id="20205" w:author="Claude" w:date="2026-10-09T05:44:13Z"/>
+                          <w:del w:id="20205" w:author="Claude" w:date="2026-10-09T05:44:38Z"/>
                           <w:rFonts w:ascii="Cambria Math" w:hAnsi="Cambria Math" w:cs="Times New Roman"/>
                         </w:rPr>
                         <m:t>C</m:t>
@@ -6172,7 +6228,7 @@
                           <m:sty m:val="p"/>
                         </m:rPr>
                         <w:rPr>
-                          <w:del w:id="20206" w:author="Claude" w:date="2026-10-09T05:44:13Z"/>
+                          <w:del w:id="20206" w:author="Claude" w:date="2026-10-09T05:44:38Z"/>
                           <w:rFonts w:ascii="Cambria Math" w:hAnsi="Cambria Math" w:cs="Times New Roman"/>
                         </w:rPr>
                         <m:t>OH</m:t>
@@ -6186,14 +6242,14 @@
                       <m:sty m:val="p"/>
                     </m:rPr>
                     <w:rPr>
-                      <w:del w:id="20207" w:author="Claude" w:date="2026-10-09T05:44:13Z"/>
+                      <w:del w:id="20207" w:author="Claude" w:date="2026-10-09T05:44:38Z"/>
                       <w:rFonts w:ascii="Cambria Math" w:hAnsi="Cambria Math" w:cs="Times New Roman"/>
                     </w:rPr>
                     <m:t>∂</m:t>
                   </m:r>
                   <m:r>
                     <w:rPr>
-                      <w:del w:id="20208" w:author="Claude" w:date="2026-10-09T05:44:13Z"/>
+                      <w:del w:id="20208" w:author="Claude" w:date="2026-10-09T05:44:38Z"/>
                       <w:rFonts w:ascii="Cambria Math" w:hAnsi="Cambria Math" w:cs="Times New Roman"/>
                     </w:rPr>
                     <m:t>t</m:t>
@@ -6205,7 +6261,7 @@
                   <m:sty m:val="p"/>
                 </m:rPr>
                 <w:rPr>
-                  <w:del w:id="20209" w:author="Claude" w:date="2026-10-09T05:44:13Z"/>
+                  <w:del w:id="20209" w:author="Claude" w:date="2026-10-09T05:44:38Z"/>
                   <w:rFonts w:ascii="Cambria Math" w:hAnsi="Cambria Math" w:cs="Times New Roman"/>
                 </w:rPr>
                 <m:t>=∇⋅</m:t>
@@ -6230,7 +6286,7 @@
                     <m:e>
                       <m:r>
                         <w:rPr>
-                          <w:del w:id="20210" w:author="Claude" w:date="2026-10-09T05:44:13Z"/>
+                          <w:del w:id="20210" w:author="Claude" w:date="2026-10-09T05:44:38Z"/>
                           <w:rFonts w:ascii="Cambria Math" w:hAnsi="Cambria Math" w:cs="Times New Roman"/>
                         </w:rPr>
                         <m:t>D</m:t>
@@ -6242,7 +6298,7 @@
                           <m:sty m:val="p"/>
                         </m:rPr>
                         <w:rPr>
-                          <w:del w:id="20211" w:author="Claude" w:date="2026-10-09T05:44:13Z"/>
+                          <w:del w:id="20211" w:author="Claude" w:date="2026-10-09T05:44:38Z"/>
                           <w:rFonts w:ascii="Cambria Math" w:hAnsi="Cambria Math" w:cs="Times New Roman"/>
                         </w:rPr>
                         <m:t>OH</m:t>
@@ -6254,7 +6310,7 @@
                           <m:nor/>
                         </m:rPr>
                         <w:rPr>
-                          <w:del w:id="20212" w:author="Claude" w:date="2026-10-09T05:44:13Z"/>
+                          <w:del w:id="20212" w:author="Claude" w:date="2026-10-09T05:44:38Z"/>
                           <w:rFonts w:cs="Times New Roman"/>
                         </w:rPr>
                         <m:t>eff</m:t>
@@ -6263,7 +6319,7 @@
                   </m:sSubSup>
                   <m:r>
                     <w:rPr>
-                      <w:del w:id="20213" w:author="Claude" w:date="2026-10-09T05:44:13Z"/>
+                      <w:del w:id="20213" w:author="Claude" w:date="2026-10-09T05:44:38Z"/>
                       <w:rFonts w:ascii="Cambria Math" w:hAnsi="Cambria Math" w:cs="Times New Roman"/>
                     </w:rPr>
                     <m:t> </m:t>
@@ -6273,7 +6329,7 @@
                       <m:sty m:val="p"/>
                     </m:rPr>
                     <w:rPr>
-                      <w:del w:id="20214" w:author="Claude" w:date="2026-10-09T05:44:13Z"/>
+                      <w:del w:id="20214" w:author="Claude" w:date="2026-10-09T05:44:38Z"/>
                       <w:rFonts w:ascii="Cambria Math" w:hAnsi="Cambria Math" w:cs="Times New Roman"/>
                     </w:rPr>
                     <m:t>∇</m:t>
@@ -6289,7 +6345,7 @@
                     <m:e>
                       <m:r>
                         <w:rPr>
-                          <w:del w:id="20215" w:author="Claude" w:date="2026-10-09T05:44:13Z"/>
+                          <w:del w:id="20215" w:author="Claude" w:date="2026-10-09T05:44:38Z"/>
                           <w:rFonts w:ascii="Cambria Math" w:hAnsi="Cambria Math" w:cs="Times New Roman"/>
                         </w:rPr>
                         <m:t>C</m:t>
@@ -6301,7 +6357,7 @@
                           <m:sty m:val="p"/>
                         </m:rPr>
                         <w:rPr>
-                          <w:del w:id="20216" w:author="Claude" w:date="2026-10-09T05:44:13Z"/>
+                          <w:del w:id="20216" w:author="Claude" w:date="2026-10-09T05:44:38Z"/>
                           <w:rFonts w:ascii="Cambria Math" w:hAnsi="Cambria Math" w:cs="Times New Roman"/>
                         </w:rPr>
                         <m:t>OH</m:t>
@@ -6315,14 +6371,14 @@
                   <m:sty m:val="p"/>
                 </m:rPr>
                 <w:rPr>
-                  <w:del w:id="20217" w:author="Claude" w:date="2026-10-09T05:44:13Z"/>
+                  <w:del w:id="20217" w:author="Claude" w:date="2026-10-09T05:44:38Z"/>
                   <w:rFonts w:ascii="Cambria Math" w:hAnsi="Cambria Math" w:cs="Times New Roman"/>
                 </w:rPr>
                 <m:t>+</m:t>
               </m:r>
               <m:r>
                 <w:rPr>
-                  <w:del w:id="20218" w:author="Claude" w:date="2026-10-09T05:44:13Z"/>
+                  <w:del w:id="20218" w:author="Claude" w:date="2026-10-09T05:44:38Z"/>
                   <w:rFonts w:ascii="Cambria Math" w:hAnsi="Cambria Math" w:cs="Times New Roman"/>
                 </w:rPr>
                 <m:t>4 </m:t>
@@ -6338,7 +6394,7 @@
                 <m:e>
                   <m:r>
                     <w:rPr>
-                      <w:del w:id="20219" w:author="Claude" w:date="2026-10-09T05:44:13Z"/>
+                      <w:del w:id="20219" w:author="Claude" w:date="2026-10-09T05:44:38Z"/>
                       <w:rFonts w:ascii="Cambria Math" w:hAnsi="Cambria Math" w:cs="Times New Roman"/>
                     </w:rPr>
                     <m:t>k</m:t>
@@ -6350,7 +6406,7 @@
                       <m:sty m:val="p"/>
                     </m:rPr>
                     <w:rPr>
-                      <w:del w:id="20220" w:author="Claude" w:date="2026-10-09T05:44:13Z"/>
+                      <w:del w:id="20220" w:author="Claude" w:date="2026-10-09T05:44:38Z"/>
                       <w:rFonts w:ascii="Cambria Math" w:hAnsi="Cambria Math" w:cs="Times New Roman"/>
                     </w:rPr>
                     <m:t>ORR</m:t>
@@ -6359,14 +6415,14 @@
               </m:sSub>
               <m:r>
                 <w:rPr>
-                  <w:del w:id="20221" w:author="Claude" w:date="2026-10-09T05:44:13Z"/>
+                  <w:del w:id="20221" w:author="Claude" w:date="2026-10-09T05:44:38Z"/>
                   <w:rFonts w:ascii="Cambria Math" w:hAnsi="Cambria Math"/>
                 </w:rPr>
                 <m:t>κ</m:t>
               </m:r>
               <m:r>
                 <w:rPr>
-                  <w:del w:id="20222" w:author="Claude" w:date="2026-10-09T05:44:13Z"/>
+                  <w:del w:id="20222" w:author="Claude" w:date="2026-10-09T05:44:38Z"/>
                   <w:rFonts w:ascii="Cambria Math" w:hAnsi="Cambria Math" w:cs="Times New Roman"/>
                 </w:rPr>
                 <m:t> </m:t>
@@ -6382,7 +6438,7 @@
                 <m:e>
                   <m:r>
                     <w:rPr>
-                      <w:del w:id="20223" w:author="Claude" w:date="2026-10-09T05:44:13Z"/>
+                      <w:del w:id="20223" w:author="Claude" w:date="2026-10-09T05:44:38Z"/>
                       <w:rFonts w:ascii="Cambria Math" w:hAnsi="Cambria Math" w:cs="Times New Roman"/>
                     </w:rPr>
                     <m:t>C</m:t>
@@ -6403,7 +6459,7 @@
                           <m:sty m:val="p"/>
                         </m:rPr>
                         <w:rPr>
-                          <w:del w:id="20224" w:author="Claude" w:date="2026-10-09T05:44:13Z"/>
+                          <w:del w:id="20224" w:author="Claude" w:date="2026-10-09T05:44:38Z"/>
                           <w:rFonts w:ascii="Cambria Math" w:hAnsi="Cambria Math" w:cs="Times New Roman"/>
                         </w:rPr>
                         <m:t>O</m:t>
@@ -6415,7 +6471,7 @@
                           <m:sty m:val="p"/>
                         </m:rPr>
                         <w:rPr>
-                          <w:del w:id="20225" w:author="Claude" w:date="2026-10-09T05:44:13Z"/>
+                          <w:del w:id="20225" w:author="Claude" w:date="2026-10-09T05:44:38Z"/>
                           <w:rFonts w:ascii="Cambria Math" w:hAnsi="Cambria Math" w:cs="Times New Roman"/>
                         </w:rPr>
                         <m:t>2</m:t>
@@ -6426,7 +6482,7 @@
               </m:sSub>
               <m:r>
                 <w:rPr>
-                  <w:del w:id="20226" w:author="Claude" w:date="2026-10-09T05:44:13Z"/>
+                  <w:del w:id="20226" w:author="Claude" w:date="2026-10-09T05:44:38Z"/>
                   <w:rFonts w:ascii="Cambria Math" w:hAnsi="Cambria Math" w:cs="Times New Roman"/>
                 </w:rPr>
                 <m:t> </m:t>
@@ -6442,7 +6498,7 @@
                 <m:e>
                   <m:r>
                     <w:rPr>
-                      <w:del w:id="20227" w:author="Claude" w:date="2026-10-09T05:44:13Z"/>
+                      <w:del w:id="20227" w:author="Claude" w:date="2026-10-09T05:44:38Z"/>
                       <w:rFonts w:ascii="Cambria Math" w:hAnsi="Cambria Math" w:cs="Times New Roman"/>
                     </w:rPr>
                     <m:t>δ</m:t>
@@ -6454,7 +6510,7 @@
                       <m:sty m:val="p"/>
                     </m:rPr>
                     <w:rPr>
-                      <w:del w:id="20228" w:author="Claude" w:date="2026-10-09T05:44:13Z"/>
+                      <w:del w:id="20228" w:author="Claude" w:date="2026-10-09T05:44:38Z"/>
                       <w:rFonts w:ascii="Cambria Math" w:hAnsi="Cambria Math" w:cs="Times New Roman"/>
                     </w:rPr>
                     <m:t>Γ</m:t>
@@ -6463,7 +6519,7 @@
               </m:sSub>
               <m:r>
                 <w:rPr>
-                  <w:del w:id="20229" w:author="Claude" w:date="2026-10-09T05:44:13Z"/>
+                  <w:del w:id="20229" w:author="Claude" w:date="2026-10-09T05:44:38Z"/>
                   <w:rFonts w:ascii="Cambria Math" w:hAnsi="Cambria Math" w:cs="Times New Roman"/>
                 </w:rPr>
                 <m:t>-2</m:t>
@@ -6482,14 +6538,14 @@
                       <m:sty m:val="p"/>
                     </m:rPr>
                     <w:rPr>
-                      <w:del w:id="20230" w:author="Claude" w:date="2026-10-09T05:44:13Z"/>
+                      <w:del w:id="20230" w:author="Claude" w:date="2026-10-09T05:44:38Z"/>
                       <w:rFonts w:ascii="Cambria Math" w:hAnsi="Cambria Math" w:cs="Times New Roman"/>
                     </w:rPr>
                     <m:t>∂</m:t>
                   </m:r>
                   <m:r>
                     <w:rPr>
-                      <w:del w:id="20231" w:author="Claude" w:date="2026-10-09T05:44:13Z"/>
+                      <w:del w:id="20231" w:author="Claude" w:date="2026-10-09T05:44:38Z"/>
                       <w:rFonts w:ascii="Cambria Math" w:hAnsi="Cambria Math" w:cs="Times New Roman"/>
                     </w:rPr>
                     <m:t>F</m:t>
@@ -6501,14 +6557,14 @@
                       <m:sty m:val="p"/>
                     </m:rPr>
                     <w:rPr>
-                      <w:del w:id="20232" w:author="Claude" w:date="2026-10-09T05:44:13Z"/>
+                      <w:del w:id="20232" w:author="Claude" w:date="2026-10-09T05:44:38Z"/>
                       <w:rFonts w:ascii="Cambria Math" w:hAnsi="Cambria Math" w:cs="Times New Roman"/>
                     </w:rPr>
                     <m:t>∂</m:t>
                   </m:r>
                   <m:r>
                     <w:rPr>
-                      <w:del w:id="20233" w:author="Claude" w:date="2026-10-09T05:44:13Z"/>
+                      <w:del w:id="20233" w:author="Claude" w:date="2026-10-09T05:44:38Z"/>
                       <w:rFonts w:ascii="Cambria Math" w:hAnsi="Cambria Math" w:cs="Times New Roman"/>
                     </w:rPr>
                     <m:t>t</m:t>
@@ -6524,7 +6580,7 @@
           <m:num>
             <m:r>
               <w:rPr>
-                <w:ins w:id="20182" w:author="Claude" w:date="2026-10-09T05:44:13Z"/>
+                <w:ins w:id="20182" w:author="Claude" w:date="2026-10-09T05:44:38Z"/>
               </w:rPr>
               <m:t xml:space="preserve">∂</m:t>
             </m:r>
@@ -6532,7 +6588,7 @@
               <m:e>
                 <m:r>
                   <w:rPr>
-                    <w:ins w:id="20183" w:author="Claude" w:date="2026-10-09T05:44:13Z"/>
+                    <w:ins w:id="20183" w:author="Claude" w:date="2026-10-09T05:44:38Z"/>
                   </w:rPr>
                   <m:t xml:space="preserve">C</m:t>
                 </m:r>
@@ -6540,7 +6596,7 @@
               <m:sub>
                 <m:r>
                   <w:rPr>
-                    <w:ins w:id="20184" w:author="Claude" w:date="2026-10-09T05:44:13Z"/>
+                    <w:ins w:id="20184" w:author="Claude" w:date="2026-10-09T05:44:38Z"/>
                   </w:rPr>
                   <m:t xml:space="preserve">OH</m:t>
                 </m:r>
@@ -6550,13 +6606,13 @@
           <m:den>
             <m:r>
               <w:rPr>
-                <w:ins w:id="20185" w:author="Claude" w:date="2026-10-09T05:44:13Z"/>
+                <w:ins w:id="20185" w:author="Claude" w:date="2026-10-09T05:44:38Z"/>
               </w:rPr>
               <m:t xml:space="preserve">∂</m:t>
             </m:r>
             <m:r>
               <w:rPr>
-                <w:ins w:id="20186" w:author="Claude" w:date="2026-10-09T05:44:13Z"/>
+                <w:ins w:id="20186" w:author="Claude" w:date="2026-10-09T05:44:38Z"/>
               </w:rPr>
               <m:t xml:space="preserve">t</m:t>
             </m:r>
@@ -6564,7 +6620,7 @@
         </m:f>
         <m:r>
           <w:rPr>
-            <w:ins w:id="20187" w:author="Claude" w:date="2026-10-09T05:44:13Z"/>
+            <w:ins w:id="20187" w:author="Claude" w:date="2026-10-09T05:44:38Z"/>
           </w:rPr>
           <m:t xml:space="preserve">=∇⋅(</m:t>
         </m:r>
@@ -6574,7 +6630,7 @@
               <m:e>
                 <m:r>
                   <w:rPr>
-                    <w:ins w:id="20188" w:author="Claude" w:date="2026-10-09T05:44:13Z"/>
+                    <w:ins w:id="20188" w:author="Claude" w:date="2026-10-09T05:44:38Z"/>
                   </w:rPr>
                   <m:t xml:space="preserve">D</m:t>
                 </m:r>
@@ -6582,7 +6638,7 @@
               <m:sub>
                 <m:r>
                   <w:rPr>
-                    <w:ins w:id="20189" w:author="Claude" w:date="2026-10-09T05:44:13Z"/>
+                    <w:ins w:id="20189" w:author="Claude" w:date="2026-10-09T05:44:38Z"/>
                   </w:rPr>
                   <m:t xml:space="preserve">OH</m:t>
                 </m:r>
@@ -6592,7 +6648,7 @@
           <m:sup>
             <m:r>
               <w:rPr>
-                <w:ins w:id="20190" w:author="Claude" w:date="2026-10-09T05:44:13Z"/>
+                <w:ins w:id="20190" w:author="Claude" w:date="2026-10-09T05:44:38Z"/>
               </w:rPr>
               <m:t xml:space="preserve">eff</m:t>
             </m:r>
@@ -6600,7 +6656,7 @@
         </m:sSup>
         <m:r>
           <w:rPr>
-            <w:ins w:id="20191" w:author="Claude" w:date="2026-10-09T05:44:13Z"/>
+            <w:ins w:id="20191" w:author="Claude" w:date="2026-10-09T05:44:38Z"/>
           </w:rPr>
           <m:t xml:space="preserve">∇</m:t>
         </m:r>
@@ -6608,7 +6664,7 @@
           <m:e>
             <m:r>
               <w:rPr>
-                <w:ins w:id="20192" w:author="Claude" w:date="2026-10-09T05:44:13Z"/>
+                <w:ins w:id="20192" w:author="Claude" w:date="2026-10-09T05:44:38Z"/>
               </w:rPr>
               <m:t xml:space="preserve">C</m:t>
             </m:r>
@@ -6616,7 +6672,7 @@
           <m:sub>
             <m:r>
               <w:rPr>
-                <w:ins w:id="20193" w:author="Claude" w:date="2026-10-09T05:44:13Z"/>
+                <w:ins w:id="20193" w:author="Claude" w:date="2026-10-09T05:44:38Z"/>
               </w:rPr>
               <m:t xml:space="preserve">OH</m:t>
             </m:r>
@@ -6624,7 +6680,7 @@
         </m:sSub>
         <m:r>
           <w:rPr>
-            <w:ins w:id="20194" w:author="Claude" w:date="2026-10-09T05:44:13Z"/>
+            <w:ins w:id="20194" w:author="Claude" w:date="2026-10-09T05:44:38Z"/>
           </w:rPr>
           <m:t xml:space="preserve">)+4</m:t>
         </m:r>
@@ -6632,15 +6688,33 @@
           <m:e>
             <m:r>
               <w:rPr>
-                <w:ins w:id="20197" w:author="Claude" w:date="2026-10-09T05:44:13Z"/>
-              </w:rPr>
-              <m:t xml:space="preserve">δ</m:t>
+                <w:ins w:id="20195" w:author="Claude" w:date="2026-10-09T05:44:38Z"/>
+              </w:rPr>
+              <m:t xml:space="preserve">j</m:t>
             </m:r>
           </m:e>
           <m:sub>
             <m:r>
               <w:rPr>
-                <w:ins w:id="20198" w:author="Claude" w:date="2026-10-09T05:44:13Z"/>
+                <w:ins w:id="20196" w:author="Claude" w:date="2026-10-09T05:44:38Z"/>
+              </w:rPr>
+              <m:t xml:space="preserve">ORR</m:t>
+            </m:r>
+          </m:sub>
+        </m:sSub>
+        <m:sSub>
+          <m:e>
+            <m:r>
+              <w:rPr>
+                <w:ins w:id="20197" w:author="Claude" w:date="2026-10-09T05:44:38Z"/>
+              </w:rPr>
+              <m:t xml:space="preserve">δ</m:t>
+            </m:r>
+          </m:e>
+          <m:sub>
+            <m:r>
+              <w:rPr>
+                <w:ins w:id="20198" w:author="Claude" w:date="2026-10-09T05:44:38Z"/>
               </w:rPr>
               <m:t xml:space="preserve">Γ</m:t>
             </m:r>
@@ -6648,7 +6722,7 @@
         </m:sSub>
         <m:r>
           <w:rPr>
-            <w:ins w:id="20199" w:author="Claude" w:date="2026-10-09T05:44:13Z"/>
+            <w:ins w:id="20199" w:author="Claude" w:date="2026-10-09T05:44:38Z"/>
           </w:rPr>
           <m:t xml:space="preserve">−2</m:t>
         </m:r>
@@ -6656,13 +6730,13 @@
           <m:num>
             <m:r>
               <w:rPr>
-                <w:ins w:id="20200" w:author="Claude" w:date="2026-10-09T05:44:13Z"/>
+                <w:ins w:id="20200" w:author="Claude" w:date="2026-10-09T05:44:38Z"/>
               </w:rPr>
               <m:t xml:space="preserve">∂</m:t>
             </m:r>
             <m:r>
               <w:rPr>
-                <w:ins w:id="20201" w:author="Claude" w:date="2026-10-09T05:44:13Z"/>
+                <w:ins w:id="20201" w:author="Claude" w:date="2026-10-09T05:44:38Z"/>
               </w:rPr>
               <m:t xml:space="preserve">F</m:t>
             </m:r>
@@ -6670,13 +6744,13 @@
           <m:den>
             <m:r>
               <w:rPr>
-                <w:ins w:id="20202" w:author="Claude" w:date="2026-10-09T05:44:13Z"/>
+                <w:ins w:id="20202" w:author="Claude" w:date="2026-10-09T05:44:38Z"/>
               </w:rPr>
               <m:t xml:space="preserve">∂</m:t>
             </m:r>
             <m:r>
               <w:rPr>
-                <w:ins w:id="20203" w:author="Claude" w:date="2026-10-09T05:44:13Z"/>
+                <w:ins w:id="20203" w:author="Claude" w:date="2026-10-09T05:44:38Z"/>
               </w:rPr>
               <m:t xml:space="preserve">t</m:t>
             </m:r>
@@ -8253,7 +8327,7 @@
           <m:e>
             <m:r>
               <w:rPr>
-                <w:del w:id="20242" w:author="Claude" w:date="2026-10-09T05:44:13Z"/>
+                <w:del w:id="20242" w:author="Claude" w:date="2026-10-09T05:44:38Z"/>
                 <w:rFonts w:ascii="Cambria Math" w:hAnsi="Cambria Math" w:cs="Times New Roman"/>
               </w:rPr>
               <m:t>v</m:t>
@@ -8265,7 +8339,7 @@
                 <m:sty m:val="p"/>
               </m:rPr>
               <w:rPr>
-                <w:del w:id="20243" w:author="Claude" w:date="2026-10-09T05:44:13Z"/>
+                <w:del w:id="20243" w:author="Claude" w:date="2026-10-09T05:44:38Z"/>
                 <w:rFonts w:ascii="Cambria Math" w:hAnsi="Cambria Math" w:cs="Times New Roman"/>
               </w:rPr>
               <m:t>n</m:t>
@@ -8277,7 +8351,7 @@
             <m:sty m:val="p"/>
           </m:rPr>
           <w:rPr>
-            <w:del w:id="20244" w:author="Claude" w:date="2026-10-09T05:44:13Z"/>
+            <w:del w:id="20244" w:author="Claude" w:date="2026-10-09T05:44:38Z"/>
             <w:rFonts w:ascii="Cambria Math" w:hAnsi="Cambria Math" w:cs="Times New Roman"/>
           </w:rPr>
           <m:t>=-</m:t>
@@ -8293,7 +8367,7 @@
           <m:num>
             <m:r>
               <w:rPr>
-                <w:del w:id="20245" w:author="Claude" w:date="2026-10-09T05:44:13Z"/>
+                <w:del w:id="20245" w:author="Claude" w:date="2026-10-09T05:44:38Z"/>
                 <w:rFonts w:ascii="Cambria Math" w:hAnsi="Cambria Math" w:cs="Times New Roman"/>
               </w:rPr>
               <m:t>2 </m:t>
@@ -8309,7 +8383,7 @@
               <m:e>
                 <m:r>
                   <w:rPr>
-                    <w:del w:id="20246" w:author="Claude" w:date="2026-10-09T05:44:13Z"/>
+                    <w:del w:id="20246" w:author="Claude" w:date="2026-10-09T05:44:38Z"/>
                     <w:rFonts w:ascii="Cambria Math" w:hAnsi="Cambria Math" w:cs="Times New Roman"/>
                   </w:rPr>
                   <m:t>k</m:t>
@@ -8321,7 +8395,7 @@
                     <m:sty m:val="p"/>
                   </m:rPr>
                   <w:rPr>
-                    <w:del w:id="20247" w:author="Claude" w:date="2026-10-09T05:44:13Z"/>
+                    <w:del w:id="20247" w:author="Claude" w:date="2026-10-09T05:44:38Z"/>
                     <w:rFonts w:ascii="Cambria Math" w:hAnsi="Cambria Math" w:cs="Times New Roman"/>
                   </w:rPr>
                   <m:t>ORR</m:t>
@@ -8330,14 +8404,14 @@
             </m:sSub>
             <m:r>
               <w:rPr>
-                <w:del w:id="20248" w:author="Claude" w:date="2026-10-09T05:44:13Z"/>
+                <w:del w:id="20248" w:author="Claude" w:date="2026-10-09T05:44:38Z"/>
                 <w:rFonts w:ascii="Cambria Math" w:hAnsi="Cambria Math" w:cs="Times New Roman"/>
               </w:rPr>
               <m:t> </m:t>
             </m:r>
             <m:r>
               <w:rPr>
-                <w:del w:id="20249" w:author="Claude" w:date="2026-10-09T05:44:13Z"/>
+                <w:del w:id="20249" w:author="Claude" w:date="2026-10-09T05:44:38Z"/>
                 <w:rFonts w:ascii="Cambria Math" w:hAnsi="Cambria Math"/>
               </w:rPr>
               <m:t>κ</m:t>
@@ -8354,7 +8428,7 @@
               <m:e>
                 <m:r>
                   <w:rPr>
-                    <w:del w:id="20250" w:author="Claude" w:date="2026-10-09T05:44:13Z"/>
+                    <w:del w:id="20250" w:author="Claude" w:date="2026-10-09T05:44:38Z"/>
                     <w:rFonts w:ascii="Cambria Math" w:hAnsi="Cambria Math"/>
                   </w:rPr>
                   <m:t>F</m:t>
@@ -8363,7 +8437,7 @@
             </m:d>
             <m:r>
               <w:rPr>
-                <w:del w:id="20251" w:author="Claude" w:date="2026-10-09T05:44:13Z"/>
+                <w:del w:id="20251" w:author="Claude" w:date="2026-10-09T05:44:38Z"/>
                 <w:rFonts w:ascii="Cambria Math" w:hAnsi="Cambria Math"/>
               </w:rPr>
               <m:t xml:space="preserve"> </m:t>
@@ -8379,7 +8453,7 @@
               <m:e>
                 <m:r>
                   <w:rPr>
-                    <w:del w:id="20252" w:author="Claude" w:date="2026-10-09T05:44:13Z"/>
+                    <w:del w:id="20252" w:author="Claude" w:date="2026-10-09T05:44:38Z"/>
                     <w:rFonts w:ascii="Cambria Math" w:hAnsi="Cambria Math" w:cs="Times New Roman"/>
                   </w:rPr>
                   <m:t>C</m:t>
@@ -8400,7 +8474,7 @@
                         <m:sty m:val="p"/>
                       </m:rPr>
                       <w:rPr>
-                        <w:del w:id="20253" w:author="Claude" w:date="2026-10-09T05:44:13Z"/>
+                        <w:del w:id="20253" w:author="Claude" w:date="2026-10-09T05:44:38Z"/>
                         <w:rFonts w:ascii="Cambria Math" w:hAnsi="Cambria Math" w:cs="Times New Roman"/>
                       </w:rPr>
                       <m:t>O</m:t>
@@ -8412,7 +8486,7 @@
                         <m:sty m:val="p"/>
                       </m:rPr>
                       <w:rPr>
-                        <w:del w:id="20254" w:author="Claude" w:date="2026-10-09T05:44:13Z"/>
+                        <w:del w:id="20254" w:author="Claude" w:date="2026-10-09T05:44:38Z"/>
                         <w:rFonts w:ascii="Cambria Math" w:hAnsi="Cambria Math" w:cs="Times New Roman"/>
                       </w:rPr>
                       <m:t>2</m:t>
@@ -8435,7 +8509,7 @@
                     <m:sty m:val="p"/>
                   </m:rPr>
                   <w:rPr>
-                    <w:del w:id="20255" w:author="Claude" w:date="2026-10-09T05:44:13Z"/>
+                    <w:del w:id="20255" w:author="Claude" w:date="2026-10-09T05:44:38Z"/>
                     <w:rFonts w:ascii="Cambria Math" w:hAnsi="Cambria Math" w:cs="Times New Roman"/>
                   </w:rPr>
                   <m:t>|</m:t>
@@ -8447,7 +8521,7 @@
                     <m:sty m:val="p"/>
                   </m:rPr>
                   <w:rPr>
-                    <w:del w:id="20256" w:author="Claude" w:date="2026-10-09T05:44:13Z"/>
+                    <w:del w:id="20256" w:author="Claude" w:date="2026-10-09T05:44:38Z"/>
                     <w:rFonts w:ascii="Cambria Math" w:hAnsi="Cambria Math" w:cs="Times New Roman"/>
                   </w:rPr>
                   <m:t>Γ</m:t>
@@ -8461,7 +8535,7 @@
                 <m:sty m:val="p"/>
               </m:rPr>
               <w:rPr>
-                <w:del w:id="20257" w:author="Claude" w:date="2026-10-09T05:44:13Z"/>
+                <w:del w:id="20257" w:author="Claude" w:date="2026-10-09T05:44:38Z"/>
                 <w:rFonts w:ascii="Cambria Math" w:hAnsi="Cambria Math" w:cs="Times New Roman"/>
               </w:rPr>
               <m:t>[Zn</m:t>
@@ -8480,7 +8554,7 @@
                     <m:sty m:val="p"/>
                   </m:rPr>
                   <w:rPr>
-                    <w:del w:id="20258" w:author="Claude" w:date="2026-10-09T05:44:13Z"/>
+                    <w:del w:id="20258" w:author="Claude" w:date="2026-10-09T05:44:38Z"/>
                     <w:rFonts w:ascii="Cambria Math" w:hAnsi="Cambria Math" w:cs="Times New Roman"/>
                   </w:rPr>
                   <m:t>]</m:t>
@@ -8492,7 +8566,7 @@
                     <m:sty m:val="p"/>
                   </m:rPr>
                   <w:rPr>
-                    <w:del w:id="20259" w:author="Claude" w:date="2026-10-09T05:44:13Z"/>
+                    <w:del w:id="20259" w:author="Claude" w:date="2026-10-09T05:44:38Z"/>
                     <w:rFonts w:ascii="Cambria Math" w:hAnsi="Cambria Math" w:cs="Times New Roman"/>
                   </w:rPr>
                   <m:t>sol</m:t>
@@ -8507,7 +8581,7 @@
           <m:e>
             <m:r>
               <w:rPr>
-                <w:ins w:id="20234" w:author="Claude" w:date="2026-10-09T05:44:13Z"/>
+                <w:ins w:id="20234" w:author="Claude" w:date="2026-10-09T05:44:38Z"/>
               </w:rPr>
               <m:t xml:space="preserve">v</m:t>
             </m:r>
@@ -8515,7 +8589,7 @@
           <m:sub>
             <m:r>
               <w:rPr>
-                <w:ins w:id="20235" w:author="Claude" w:date="2026-10-09T05:44:13Z"/>
+                <w:ins w:id="20235" w:author="Claude" w:date="2026-10-09T05:44:38Z"/>
               </w:rPr>
               <m:t xml:space="preserve">n</m:t>
             </m:r>
@@ -8523,7 +8597,7 @@
         </m:sSub>
         <m:r>
           <w:rPr>
-            <w:ins w:id="20236" w:author="Claude" w:date="2026-10-09T05:44:13Z"/>
+            <w:ins w:id="20236" w:author="Claude" w:date="2026-10-09T05:44:38Z"/>
           </w:rPr>
           <m:t xml:space="preserve">=−</m:t>
         </m:r>
@@ -8531,7 +8605,7 @@
           <m:num>
             <m:r>
               <w:rPr>
-                <w:ins w:id="20237" w:author="Claude" w:date="2026-10-09T05:44:13Z"/>
+                <w:ins w:id="20237" w:author="Claude" w:date="2026-10-09T05:44:38Z"/>
               </w:rPr>
               <m:t xml:space="preserve">2</m:t>
             </m:r>
@@ -8539,12 +8613,7 @@
               <m:e>
                 <m:r>
                   <w:rPr>
-                    <w:ins w:id="20238" w:author="Claude" w:date="2026-10-09T05:44:13Z"/>
-                    <w:ins w:id="20195" w:author="Claude" w:date="2026-10-09T05:44:13Z"/>
-                    <w:ins w:id="20144" w:author="Claude" w:date="2026-10-09T05:44:13Z"/>
-                    <w:ins w:id="20098" w:author="Claude" w:date="2026-10-09T05:44:13Z"/>
-                    <w:ins w:id="20052" w:author="Claude" w:date="2026-10-09T05:44:13Z"/>
-                    <w:ins w:id="20041" w:author="Claude" w:date="2026-10-09T05:44:13Z"/>
+                    <w:ins w:id="20238" w:author="Claude" w:date="2026-10-09T05:44:38Z"/>
                   </w:rPr>
                   <m:t xml:space="preserve">j</m:t>
                 </m:r>
@@ -8552,12 +8621,7 @@
               <m:sub>
                 <m:r>
                   <w:rPr>
-                    <w:ins w:id="20239" w:author="Claude" w:date="2026-10-09T05:44:13Z"/>
-                    <w:ins w:id="20196" w:author="Claude" w:date="2026-10-09T05:44:13Z"/>
-                    <w:ins w:id="20145" w:author="Claude" w:date="2026-10-09T05:44:13Z"/>
-                    <w:ins w:id="20099" w:author="Claude" w:date="2026-10-09T05:44:13Z"/>
-                    <w:ins w:id="20053" w:author="Claude" w:date="2026-10-09T05:44:13Z"/>
-                    <w:ins w:id="20042" w:author="Claude" w:date="2026-10-09T05:44:13Z"/>
+                    <w:ins w:id="20239" w:author="Claude" w:date="2026-10-09T05:44:38Z"/>
                   </w:rPr>
                   <m:t xml:space="preserve">ORR</m:t>
                 </m:r>
@@ -8569,7 +8633,7 @@
               <m:e>
                 <m:r>
                   <w:rPr>
-                    <w:ins w:id="20240" w:author="Claude" w:date="2026-10-09T05:44:13Z"/>
+                    <w:ins w:id="20240" w:author="Claude" w:date="2026-10-09T05:44:38Z"/>
                   </w:rPr>
                   <m:t xml:space="preserve">[Zn]</m:t>
                 </m:r>
@@ -8577,7 +8641,7 @@
               <m:sub>
                 <m:r>
                   <w:rPr>
-                    <w:ins w:id="20241" w:author="Claude" w:date="2026-10-09T05:44:13Z"/>
+                    <w:ins w:id="20241" w:author="Claude" w:date="2026-10-09T05:44:38Z"/>
                   </w:rPr>
                   <m:t xml:space="preserve">sol</m:t>
                 </m:r>
@@ -8610,15 +8674,15 @@
       <w:pPr>
         <w:pStyle w:val="BodyText"/>
         <w:rPr>
-          <w:del w:id="20291" w:author="Claude" w:date="2026-10-09T05:44:13Z"/>
+          <w:del w:id="20291" w:author="Claude" w:date="2026-10-09T05:44:38Z"/>
         </w:rPr>
       </w:pPr>
-      <w:del w:id="20260" w:author="Claude" w:date="2026-10-09T05:44:13Z">
+      <w:del w:id="20260" w:author="Claude" w:date="2026-10-09T05:44:38Z">
         <w:r>
           <w:delText xml:space="preserve">where C</w:delText>
         </w:r>
       </w:del>
-      <w:del w:id="20261" w:author="Claude" w:date="2026-10-09T05:44:13Z">
+      <w:del w:id="20261" w:author="Claude" w:date="2026-10-09T05:44:38Z">
         <w:r>
           <w:rPr>
             <w:vertAlign w:val="subscript"/>
@@ -8626,12 +8690,12 @@
           <w:delText xml:space="preserve">O2</w:delText>
         </w:r>
       </w:del>
-      <w:del w:id="20262" w:author="Claude" w:date="2026-10-09T05:44:13Z">
+      <w:del w:id="20262" w:author="Claude" w:date="2026-10-09T05:44:38Z">
         <w:r>
           <w:delText xml:space="preserve">|</w:delText>
         </w:r>
       </w:del>
-      <w:del w:id="20263" w:author="Claude" w:date="2026-10-09T05:44:13Z">
+      <w:del w:id="20263" w:author="Claude" w:date="2026-10-09T05:44:38Z">
         <w:r>
           <w:rPr>
             <w:vertAlign w:val="subscript"/>
@@ -8639,12 +8703,12 @@
           <w:delText xml:space="preserve">Γ</w:delText>
         </w:r>
       </w:del>
-      <w:del w:id="20264" w:author="Claude" w:date="2026-10-09T05:44:13Z">
+      <w:del w:id="20264" w:author="Claude" w:date="2026-10-09T05:44:38Z">
         <w:r>
           <w:delText xml:space="preserve"> is the oxygen concentration at the interface (mol L</w:delText>
         </w:r>
       </w:del>
-      <w:del w:id="20265" w:author="Claude" w:date="2026-10-09T05:44:13Z">
+      <w:del w:id="20265" w:author="Claude" w:date="2026-10-09T05:44:38Z">
         <w:r>
           <w:rPr>
             <w:vertAlign w:val="superscript"/>
@@ -8652,27 +8716,27 @@
           <w:delText xml:space="preserve">-1</w:delText>
         </w:r>
       </w:del>
-      <w:del w:id="20266" w:author="Claude" w:date="2026-10-09T05:44:13Z">
+      <w:del w:id="20266" w:author="Claude" w:date="2026-10-09T05:44:38Z">
         <w:r>
           <w:delText xml:space="preserve">)</w:delText>
         </w:r>
       </w:del>
-      <w:del w:id="20267" w:author="Claude" w:date="2026-10-09T05:44:13Z">
+      <w:del w:id="20267" w:author="Claude" w:date="2026-10-09T05:44:38Z">
         <w:r>
           <w:delText xml:space="preserve">. </w:delText>
         </w:r>
       </w:del>
-      <w:del w:id="20268" w:author="Claude" w:date="2026-10-09T05:44:13Z">
+      <w:del w:id="20268" w:author="Claude" w:date="2026-10-09T05:44:38Z">
         <w:r>
           <w:delText xml:space="preserve">Oxygen-transport limitation is incorporated implicitly through the Robin boundary condition</w:delText>
         </w:r>
       </w:del>
-      <w:del w:id="20269" w:author="Claude" w:date="2026-10-09T05:44:13Z">
+      <w:del w:id="20269" w:author="Claude" w:date="2026-10-09T05:44:38Z">
         <w:r>
           <w:delText xml:space="preserve"> </w:delText>
         </w:r>
       </w:del>
-      <w:del w:id="20270" w:author="Claude" w:date="2026-10-09T05:44:13Z">
+      <w:del w:id="20270" w:author="Claude" w:date="2026-10-09T05:44:38Z">
         <w:r>
           <w:rPr>
             <w:b/>
@@ -8681,7 +8745,7 @@
           <w:delText xml:space="preserve">(</w:delText>
         </w:r>
       </w:del>
-      <w:del w:id="20271" w:author="Claude" w:date="2026-10-09T05:44:13Z">
+      <w:del w:id="20271" w:author="Claude" w:date="2026-10-09T05:44:38Z">
         <w:r>
           <w:rPr>
             <w:b/>
@@ -8690,7 +8754,7 @@
           <w:delText xml:space="preserve">Equation 7</w:delText>
         </w:r>
       </w:del>
-      <w:del w:id="20272" w:author="Claude" w:date="2026-10-09T05:44:13Z">
+      <w:del w:id="20272" w:author="Claude" w:date="2026-10-09T05:44:38Z">
         <w:r>
           <w:rPr>
             <w:b/>
@@ -8699,37 +8763,37 @@
           <w:delText xml:space="preserve">)</w:delText>
         </w:r>
       </w:del>
-      <w:del w:id="20273" w:author="Claude" w:date="2026-10-09T05:44:13Z">
+      <w:del w:id="20273" w:author="Claude" w:date="2026-10-09T05:44:38Z">
         <w:r>
           <w:delText xml:space="preserve">, </w:delText>
         </w:r>
       </w:del>
-      <w:del w:id="20274" w:author="Claude" w:date="2026-10-09T05:44:13Z">
+      <w:del w:id="20274" w:author="Claude" w:date="2026-10-09T05:44:38Z">
         <w:r>
           <w:delText xml:space="preserve">As </w:delText>
         </w:r>
       </w:del>
-      <w:del w:id="20275" w:author="Claude" w:date="2026-10-09T05:44:13Z">
+      <w:del w:id="20275" w:author="Claude" w:date="2026-10-09T05:44:38Z">
         <w:r>
           <w:delText xml:space="preserve">oxygen supply becomes restricted, the interfacial oxygen concentration decreases, reducing the oxygen-reduction flux and consequently the interface recession velocity</w:delText>
         </w:r>
       </w:del>
-      <w:del w:id="20276" w:author="Claude" w:date="2026-10-09T05:44:13Z">
+      <w:del w:id="20276" w:author="Claude" w:date="2026-10-09T05:44:38Z">
         <w:r>
           <w:delText xml:space="preserve">. </w:delText>
         </w:r>
       </w:del>
-      <w:del w:id="20277" w:author="Claude" w:date="2026-10-09T05:44:13Z">
+      <w:del w:id="20277" w:author="Claude" w:date="2026-10-09T05:44:38Z">
         <w:r>
           <w:delText xml:space="preserve">Therefore, no separate velocity cap or rate-selection criterion is required. The transition from reaction-controlled to diffusion-controlled degradation emerges naturally from the depletion of interfacial oxygen and its coupling with transport processes</w:delText>
         </w:r>
       </w:del>
-      <w:del w:id="20278" w:author="Claude" w:date="2026-10-09T05:44:13Z">
+      <w:del w:id="20278" w:author="Claude" w:date="2026-10-09T05:44:38Z">
         <w:r>
           <w:delText xml:space="preserve"> </w:delText>
         </w:r>
       </w:del>
-      <w:del w:id="20279" w:author="Claude" w:date="2026-10-09T05:44:13Z">
+      <w:del w:id="20279" w:author="Claude" w:date="2026-10-09T05:44:38Z">
         <w:r>
           <w:rPr>
             <w:b/>
@@ -8738,27 +8802,27 @@
           <w:delText xml:space="preserve">(Section S1)</w:delText>
         </w:r>
       </w:del>
-      <w:del w:id="20280" w:author="Claude" w:date="2026-10-09T05:44:13Z">
+      <w:del w:id="20280" w:author="Claude" w:date="2026-10-09T05:44:38Z">
         <w:r>
           <w:delText xml:space="preserve">.</w:delText>
         </w:r>
       </w:del>
-      <w:del w:id="20281" w:author="Claude" w:date="2026-10-09T05:44:13Z">
+      <w:del w:id="20281" w:author="Claude" w:date="2026-10-09T05:44:38Z">
         <w:r>
           <w:delText xml:space="preserve"> </w:delText>
         </w:r>
       </w:del>
-      <w:del w:id="20282" w:author="Claude" w:date="2026-10-09T05:44:13Z">
+      <w:del w:id="20282" w:author="Claude" w:date="2026-10-09T05:44:38Z">
         <w:r>
           <w:delText xml:space="preserve">Through this formulation, interface recession, oxygen consumption, </w:delText>
         </w:r>
       </w:del>
-      <w:del w:id="20283" w:author="Claude" w:date="2026-10-09T05:44:13Z">
+      <w:del w:id="20283" w:author="Claude" w:date="2026-10-09T05:44:38Z">
         <w:r>
           <w:delText xml:space="preserve">Zn</w:delText>
         </w:r>
       </w:del>
-      <w:del w:id="20284" w:author="Claude" w:date="2026-10-09T05:44:13Z">
+      <w:del w:id="20284" w:author="Claude" w:date="2026-10-09T05:44:38Z">
         <w:r>
           <w:rPr>
             <w:vertAlign w:val="superscript"/>
@@ -8766,7 +8830,7 @@
           <w:delText xml:space="preserve">2+</w:delText>
         </w:r>
       </w:del>
-      <w:del w:id="20285" w:author="Claude" w:date="2026-10-09T05:44:13Z">
+      <w:del w:id="20285" w:author="Claude" w:date="2026-10-09T05:44:38Z">
         <w:r>
           <w:rPr>
             <w:vertAlign w:val="superscript"/>
@@ -8774,17 +8838,17 @@
           <w:delText xml:space="preserve"> </w:delText>
         </w:r>
       </w:del>
-      <w:del w:id="20286" w:author="Claude" w:date="2026-10-09T05:44:13Z">
+      <w:del w:id="20286" w:author="Claude" w:date="2026-10-09T05:44:38Z">
         <w:r>
           <w:delText xml:space="preserve">release, </w:delText>
         </w:r>
       </w:del>
-      <w:del w:id="20287" w:author="Claude" w:date="2026-10-09T05:44:13Z">
+      <w:del w:id="20287" w:author="Claude" w:date="2026-10-09T05:44:38Z">
         <w:r>
           <w:delText xml:space="preserve">OH</w:delText>
         </w:r>
       </w:del>
-      <w:del w:id="20288" w:author="Claude" w:date="2026-10-09T05:44:13Z">
+      <w:del w:id="20288" w:author="Claude" w:date="2026-10-09T05:44:38Z">
         <w:r>
           <w:rPr>
             <w:vertAlign w:val="superscript"/>
@@ -8792,7 +8856,7 @@
           <w:delText xml:space="preserve">-</w:delText>
         </w:r>
       </w:del>
-      <w:del w:id="20289" w:author="Claude" w:date="2026-10-09T05:44:13Z">
+      <w:del w:id="20289" w:author="Claude" w:date="2026-10-09T05:44:38Z">
         <w:r>
           <w:rPr>
             <w:vertAlign w:val="superscript"/>
@@ -8800,7 +8864,7 @@
           <w:delText xml:space="preserve"> </w:delText>
         </w:r>
       </w:del>
-      <w:del w:id="20290" w:author="Claude" w:date="2026-10-09T05:44:13Z">
+      <w:del w:id="20290" w:author="Claude" w:date="2026-10-09T05:44:38Z">
         <w:r>
           <w:delText xml:space="preserve">generation, and corrosion-product growth are governed by a single oxygen-reduction flux, ensuring a mechanistically consistent link between interfacial chemistry, mass transport, and degradation kinetics.</w:delText>
         </w:r>
@@ -8810,15 +8874,15 @@
       <w:pPr>
         <w:pStyle w:val="BodyText"/>
         <w:rPr>
-          <w:ins w:id="20299" w:author="Claude" w:date="2026-10-09T05:44:13Z"/>
+          <w:ins w:id="20299" w:author="Claude" w:date="2026-10-09T05:44:38Z"/>
         </w:rPr>
       </w:pPr>
-      <w:ins w:id="20292" w:author="Claude" w:date="2026-10-09T05:44:13Z">
+      <w:ins w:id="20292" w:author="Claude" w:date="2026-10-09T05:44:38Z">
         <w:r>
           <w:t xml:space="preserve">where j</w:t>
         </w:r>
       </w:ins>
-      <w:ins w:id="20293" w:author="Claude" w:date="2026-10-09T05:44:13Z">
+      <w:ins w:id="20293" w:author="Claude" w:date="2026-10-09T05:44:38Z">
         <w:r>
           <w:rPr>
             <w:vertAlign w:val="subscript"/>
@@ -8826,12 +8890,12 @@
           <w:t xml:space="preserve">ORR</w:t>
         </w:r>
       </w:ins>
-      <w:ins w:id="20294" w:author="Claude" w:date="2026-10-09T05:44:13Z">
+      <w:ins w:id="20294" w:author="Claude" w:date="2026-10-09T05:44:38Z">
         <w:r>
           <w:t xml:space="preserve"> is the ORR molar flux defined above, so that v</w:t>
         </w:r>
       </w:ins>
-      <w:ins w:id="20295" w:author="Claude" w:date="2026-10-09T05:44:13Z">
+      <w:ins w:id="20295" w:author="Claude" w:date="2026-10-09T05:44:38Z">
         <w:r>
           <w:rPr>
             <w:vertAlign w:val="subscript"/>
@@ -8839,12 +8903,12 @@
           <w:t xml:space="preserve">n</w:t>
         </w:r>
       </w:ins>
-      <w:ins w:id="20296" w:author="Claude" w:date="2026-10-09T05:44:13Z">
+      <w:ins w:id="20296" w:author="Claude" w:date="2026-10-09T05:44:38Z">
         <w:r>
           <w:t xml:space="preserve"> has units of (mol mm⁻² h⁻¹)/(mol mm⁻³) = mm h⁻¹. Oxygen-transport limitation is incorporated implicitly through the Robin boundary condition for C</w:t>
         </w:r>
       </w:ins>
-      <w:ins w:id="20297" w:author="Claude" w:date="2026-10-09T05:44:13Z">
+      <w:ins w:id="20297" w:author="Claude" w:date="2026-10-09T05:44:38Z">
         <w:r>
           <w:rPr>
             <w:vertAlign w:val="subscript"/>
@@ -8852,7 +8916,7 @@
           <w:t xml:space="preserve">O2</w:t>
         </w:r>
       </w:ins>
-      <w:ins w:id="20298" w:author="Claude" w:date="2026-10-09T05:44:13Z">
+      <w:ins w:id="20298" w:author="Claude" w:date="2026-10-09T05:44:38Z">
         <w:r>
           <w:t xml:space="preserve"> at the interface (Equation 7): as oxygen supply becomes restricted, the interfacial oxygen concentration decreases, reducing the oxygen-reduction flux and consequently the interface recession velocity. Therefore, no separate velocity cap or rate-selection criterion is required. The transition from reaction-controlled to diffusion-controlled degradation emerges naturally from the depletion of interfacial oxygen and its coupling with transport processes (Section S1). Through this formulation, interface recession, oxygen consumption, Zn²⁺ release, OH⁻ generation, and corrosion-product growth are governed by a single oxygen-reduction flux, ensuring a mechanistically consistent link between interfacial chemistry, mass transport, and degradation kinetics.</w:t>
         </w:r>

</xml_diff>

<commit_message>
Manuscript: remove kappa(F) text and Eq. 14 factor to match volumetric-film code
Co-Authored-By: Claude Sonnet 5.5 <noreply@anthropic.com>
Claude-Session: https://claude.ai/code/session_01Y1g9vByMLTE8eGJ9K81zt6
</commit_message>
<xml_diff>
--- a/deliver/Manuscript_tracked.docx
+++ b/deliver/Manuscript_tracked.docx
@@ -27,15 +27,7 @@
         <w:spacing w:line="360" w:lineRule="auto"/>
       </w:pPr>
       <w:r>
-        <w:t xml:space="preserve">Henaka Ariyarathna, Xuan Yang, </w:t>
-      </w:r>
-      <w:proofErr w:type="spellStart"/>
-      <w:r>
-        <w:t>Aijun</w:t>
-      </w:r>
-      <w:proofErr w:type="spellEnd"/>
-      <w:r>
-        <w:t xml:space="preserve"> Huang, Yunlong Tang</w:t>
+        <w:t>Henaka Ariyarathna, Xuan Yang, Aijun Huang, Yunlong Tang</w:t>
       </w:r>
       <m:oMath>
         <m:sSup>
@@ -1234,11 +1226,7 @@
         <w:t>Computational–experimental workflow for developing, calibrating, validating, and applying the mechanistic Zn biodegradation model</w:t>
       </w:r>
       <w:r>
-        <w:t>. (a) Reaction–diffusion model coupling species transport and corrosion-product evolution with moving-interface tracking; (b) calibration of the three effective kinetic parameters (</w:t>
-      </w:r>
-      <w:proofErr w:type="spellStart"/>
-      <w:r>
-        <w:t>k</w:t>
+        <w:t>. (a) Reaction–diffusion model coupling species transport and corrosion-product evolution with moving-interface tracking; (b) calibration of the three effective kinetic parameters (k</w:t>
       </w:r>
       <w:r>
         <w:rPr>
@@ -1246,13 +1234,8 @@
         </w:rPr>
         <w:t>f</w:t>
       </w:r>
-      <w:proofErr w:type="spellEnd"/>
-      <w:r>
-        <w:t xml:space="preserve">, </w:t>
-      </w:r>
-      <w:proofErr w:type="spellStart"/>
-      <w:r>
-        <w:t>k</w:t>
+      <w:r>
+        <w:t>, k</w:t>
       </w:r>
       <w:r>
         <w:rPr>
@@ -1260,13 +1243,8 @@
         </w:rPr>
         <w:t>d</w:t>
       </w:r>
-      <w:proofErr w:type="spellEnd"/>
-      <w:r>
-        <w:t xml:space="preserve">, </w:t>
-      </w:r>
-      <w:proofErr w:type="spellStart"/>
-      <w:r>
-        <w:t>k</w:t>
+      <w:r>
+        <w:t>, k</w:t>
       </w:r>
       <w:r>
         <w:rPr>
@@ -1274,7 +1252,6 @@
         </w:rPr>
         <w:t>ORR</w:t>
       </w:r>
-      <w:proofErr w:type="spellEnd"/>
       <w:r>
         <w:t>) against literature mass-loss data (0–336 h); (c) validation against the mass loss measured in this study (0–672 h) for Ø10 × 2 mm discs; and (d) model predictions for a six-crown Zn stent.</w:t>
       </w:r>
@@ -1306,21 +1283,7 @@
         <w:rPr>
           <w:rFonts w:cs="Times New Roman"/>
         </w:rPr>
-        <w:t xml:space="preserve">Commercially pure Zn (99.99 </w:t>
-      </w:r>
-      <w:proofErr w:type="spellStart"/>
-      <w:r>
-        <w:rPr>
-          <w:rFonts w:cs="Times New Roman"/>
-        </w:rPr>
-        <w:t>wt</w:t>
-      </w:r>
-      <w:proofErr w:type="spellEnd"/>
-      <w:r>
-        <w:rPr>
-          <w:rFonts w:cs="Times New Roman"/>
-        </w:rPr>
-        <w:t xml:space="preserve">%) was processed by casting, homogenization, and hot extrusion to produce fully dense rods (10 mm diameter), from which disc specimens (10 mm diameter, 2 mm thickness) were prepared. Prior to testing, specimens were mechanically ground through successive silicon carbide abrasive grades and finished with </w:t>
+        <w:t xml:space="preserve">Commercially pure Zn (99.99 wt%) was processed by casting, homogenization, and hot extrusion to produce fully dense rods (10 mm diameter), from which disc specimens (10 mm diameter, 2 mm thickness) were prepared. Prior to testing, specimens were mechanically ground through successive silicon carbide abrasive grades and finished with </w:t>
       </w:r>
       <m:oMath>
         <m:r>
@@ -2944,35 +2907,7 @@
         <w:rPr>
           <w:rFonts w:cs="Times New Roman"/>
         </w:rPr>
-        <w:t xml:space="preserve">Although phosphate and carbonate species may contribute to the formation of secondary corrosion products such as </w:t>
-      </w:r>
-      <w:proofErr w:type="spellStart"/>
-      <w:r>
-        <w:rPr>
-          <w:rFonts w:cs="Times New Roman"/>
-        </w:rPr>
-        <w:t>hopeite</w:t>
-      </w:r>
-      <w:proofErr w:type="spellEnd"/>
-      <w:r>
-        <w:rPr>
-          <w:rFonts w:cs="Times New Roman"/>
-        </w:rPr>
-        <w:t xml:space="preserve">, smithsonite, and </w:t>
-      </w:r>
-      <w:proofErr w:type="spellStart"/>
-      <w:r>
-        <w:rPr>
-          <w:rFonts w:cs="Times New Roman"/>
-        </w:rPr>
-        <w:t>simonkolleite</w:t>
-      </w:r>
-      <w:proofErr w:type="spellEnd"/>
-      <w:r>
-        <w:rPr>
-          <w:rFonts w:cs="Times New Roman"/>
-        </w:rPr>
-        <w:t xml:space="preserve"> at longer timescales </w:t>
+        <w:t>Although phosphate and carbonate species may contribute to the formation of secondary corrosion products such as hopeite, smithsonite, and simonkolleite at longer timescales </w:t>
       </w:r>
       <w:r>
         <w:rPr>
@@ -3021,21 +2956,7 @@
         <w:rPr>
           <w:rFonts w:cs="Times New Roman"/>
         </w:rPr>
-        <w:t xml:space="preserve">the corrosion products are modeled as a single </w:t>
-      </w:r>
-      <w:proofErr w:type="spellStart"/>
-      <w:r>
-        <w:rPr>
-          <w:rFonts w:cs="Times New Roman"/>
-        </w:rPr>
-        <w:t>ZnO</w:t>
-      </w:r>
-      <w:proofErr w:type="spellEnd"/>
-      <w:r>
-        <w:rPr>
-          <w:rFonts w:cs="Times New Roman"/>
-        </w:rPr>
-        <w:t xml:space="preserve"> phase.</w:t>
+        <w:t>the corrosion products are modeled as a single ZnO phase.</w:t>
       </w:r>
     </w:p>
     <w:p>
@@ -3971,240 +3892,6 @@
     <w:p>
       <w:pPr>
         <w:pStyle w:val="BodyText"/>
-        <w:rPr>
-          <w:ins w:id="20040" w:author="Claude" w:date="2026-10-09T05:44:38Z"/>
-        </w:rPr>
-      </w:pPr>
-      <w:ins w:id="20039" w:author="Claude" w:date="2026-10-09T05:44:38Z">
-        <w:r>
-          <w:t xml:space="preserve">All concentrations and F are expressed as molar quantities (mol mm⁻³; F as Zn-equivalent). The oxygen-reduction (ORR) molar flux at the interface is defined as</w:t>
-        </w:r>
-      </w:ins>
-    </w:p>
-    <w:p>
-      <w:pPr>
-        <w:pStyle w:val="BodyText"/>
-        <w:rPr>
-          <w:ins w:id="20063" w:author="Claude" w:date="2026-10-09T05:44:38Z"/>
-        </w:rPr>
-      </w:pPr>
-      <m:oMath>
-        <m:sSub>
-          <m:e>
-            <m:r>
-              <w:rPr>
-                <w:ins w:id="20052" w:author="Claude" w:date="2026-10-09T05:44:38Z"/>
-                <w:ins w:id="20041" w:author="Claude" w:date="2026-10-09T05:44:38Z"/>
-              </w:rPr>
-              <m:t xml:space="preserve">j</m:t>
-            </m:r>
-          </m:e>
-          <m:sub>
-            <m:r>
-              <w:rPr>
-                <w:ins w:id="20053" w:author="Claude" w:date="2026-10-09T05:44:38Z"/>
-                <w:ins w:id="20042" w:author="Claude" w:date="2026-10-09T05:44:38Z"/>
-              </w:rPr>
-              <m:t xml:space="preserve">ORR</m:t>
-            </m:r>
-          </m:sub>
-        </m:sSub>
-        <m:r>
-          <w:rPr>
-            <w:ins w:id="20054" w:author="Claude" w:date="2026-10-09T05:44:38Z"/>
-            <w:ins w:id="20043" w:author="Claude" w:date="2026-10-09T05:44:38Z"/>
-          </w:rPr>
-          <m:t xml:space="preserve">=</m:t>
-        </m:r>
-        <m:sSub>
-          <m:e>
-            <m:r>
-              <w:rPr>
-                <w:ins w:id="20055" w:author="Claude" w:date="2026-10-09T05:44:38Z"/>
-                <w:ins w:id="20044" w:author="Claude" w:date="2026-10-09T05:44:38Z"/>
-              </w:rPr>
-              <m:t xml:space="preserve">k</m:t>
-            </m:r>
-          </m:e>
-          <m:sub>
-            <m:r>
-              <w:rPr>
-                <w:ins w:id="20056" w:author="Claude" w:date="2026-10-09T05:44:38Z"/>
-                <w:ins w:id="20045" w:author="Claude" w:date="2026-10-09T05:44:38Z"/>
-              </w:rPr>
-              <m:t xml:space="preserve">ORR</m:t>
-            </m:r>
-          </m:sub>
-        </m:sSub>
-        <m:r>
-          <w:rPr>
-            <w:ins w:id="20057" w:author="Claude" w:date="2026-10-09T05:44:38Z"/>
-            <w:ins w:id="20046" w:author="Claude" w:date="2026-10-09T05:44:38Z"/>
-          </w:rPr>
-          <m:t xml:space="preserve">κ(F)</m:t>
-        </m:r>
-        <m:sSub>
-          <m:e>
-            <m:r>
-              <w:rPr>
-                <w:ins w:id="20058" w:author="Claude" w:date="2026-10-09T05:44:38Z"/>
-                <w:ins w:id="20047" w:author="Claude" w:date="2026-10-09T05:44:38Z"/>
-              </w:rPr>
-              <m:t xml:space="preserve">C</m:t>
-            </m:r>
-          </m:e>
-          <m:sub>
-            <m:r>
-              <w:rPr>
-                <w:ins w:id="20059" w:author="Claude" w:date="2026-10-09T05:44:38Z"/>
-                <w:ins w:id="20048" w:author="Claude" w:date="2026-10-09T05:44:38Z"/>
-              </w:rPr>
-              <m:t xml:space="preserve">O₂</m:t>
-            </m:r>
-          </m:sub>
-        </m:sSub>
-        <m:sSub>
-          <m:e>
-            <m:r>
-              <w:rPr>
-                <w:ins w:id="20060" w:author="Claude" w:date="2026-10-09T05:44:38Z"/>
-                <w:ins w:id="20049" w:author="Claude" w:date="2026-10-09T05:44:38Z"/>
-              </w:rPr>
-              <m:t xml:space="preserve">|</m:t>
-            </m:r>
-          </m:e>
-          <m:sub>
-            <m:r>
-              <w:rPr>
-                <w:ins w:id="20061" w:author="Claude" w:date="2026-10-09T05:44:38Z"/>
-                <w:ins w:id="20050" w:author="Claude" w:date="2026-10-09T05:44:38Z"/>
-              </w:rPr>
-              <m:t xml:space="preserve">Γ</m:t>
-            </m:r>
-          </m:sub>
-        </m:sSub>
-        <m:r>
-          <w:rPr>
-            <w:ins w:id="20062" w:author="Claude" w:date="2026-10-09T05:44:38Z"/>
-            <w:ins w:id="20051" w:author="Claude" w:date="2026-10-09T05:44:38Z"/>
-          </w:rPr>
-          <m:t xml:space="preserve"> [mol mm⁻² h⁻¹]</m:t>
-        </m:r>
-      </m:oMath>
-    </w:p>
-    <w:p>
-      <w:pPr>
-        <w:pStyle w:val="BodyText"/>
-        <w:rPr>
-          <w:ins w:id="20067" w:author="Claude" w:date="2026-10-09T05:44:38Z"/>
-        </w:rPr>
-      </w:pPr>
-      <w:ins w:id="20064" w:author="Claude" w:date="2026-10-09T05:44:38Z">
-        <w:r>
-          <w:t xml:space="preserve">where k</w:t>
-        </w:r>
-      </w:ins>
-      <w:ins w:id="20065" w:author="Claude" w:date="2026-10-09T05:44:38Z">
-        <w:r>
-          <w:rPr>
-            <w:vertAlign w:val="subscript"/>
-          </w:rPr>
-          <w:t xml:space="preserve">ORR</w:t>
-        </w:r>
-      </w:ins>
-      <w:ins w:id="20066" w:author="Claude" w:date="2026-10-09T05:44:38Z">
-        <w:r>
-          <w:t xml:space="preserve"> is a velocity (mm h⁻¹) and κ(F) is the factor by which the corrosion-product film reduces the reaction, using the same porosity (ε) and tortuosity (τ) reduction as the effective-diffusivity law of Equation 12:</w:t>
-        </w:r>
-      </w:ins>
-    </w:p>
-    <w:p>
-      <w:pPr>
-        <w:pStyle w:val="BodyText"/>
-        <w:rPr>
-          <w:ins w:id="20084" w:author="Claude" w:date="2026-10-09T05:44:38Z"/>
-        </w:rPr>
-      </w:pPr>
-      <m:oMath>
-        <m:r>
-          <w:rPr>
-            <w:ins w:id="20076" w:author="Claude" w:date="2026-10-09T05:44:38Z"/>
-            <w:ins w:id="20068" w:author="Claude" w:date="2026-10-09T05:44:38Z"/>
-          </w:rPr>
-          <m:t xml:space="preserve">κ(F)=1−</m:t>
-        </m:r>
-        <m:f>
-          <m:num>
-            <m:r>
-              <w:rPr>
-                <w:ins w:id="20077" w:author="Claude" w:date="2026-10-09T05:44:38Z"/>
-                <w:ins w:id="20069" w:author="Claude" w:date="2026-10-09T05:44:38Z"/>
-              </w:rPr>
-              <m:t xml:space="preserve">F</m:t>
-            </m:r>
-          </m:num>
-          <m:den>
-            <m:sSub>
-              <m:e>
-                <m:r>
-                  <w:rPr>
-                    <w:ins w:id="20078" w:author="Claude" w:date="2026-10-09T05:44:38Z"/>
-                    <w:ins w:id="20070" w:author="Claude" w:date="2026-10-09T05:44:38Z"/>
-                  </w:rPr>
-                  <m:t xml:space="preserve">F</m:t>
-                </m:r>
-              </m:e>
-              <m:sub>
-                <m:r>
-                  <w:rPr>
-                    <w:ins w:id="20079" w:author="Claude" w:date="2026-10-09T05:44:38Z"/>
-                    <w:ins w:id="20071" w:author="Claude" w:date="2026-10-09T05:44:38Z"/>
-                  </w:rPr>
-                  <m:t xml:space="preserve">max</m:t>
-                </m:r>
-              </m:sub>
-            </m:sSub>
-          </m:den>
-        </m:f>
-        <m:r>
-          <w:rPr>
-            <w:ins w:id="20080" w:author="Claude" w:date="2026-10-09T05:44:38Z"/>
-            <w:ins w:id="20072" w:author="Claude" w:date="2026-10-09T05:44:38Z"/>
-          </w:rPr>
-          <m:t xml:space="preserve">(1−</m:t>
-        </m:r>
-        <m:f>
-          <m:num>
-            <m:r>
-              <w:rPr>
-                <w:ins w:id="20081" w:author="Claude" w:date="2026-10-09T05:44:38Z"/>
-                <w:ins w:id="20073" w:author="Claude" w:date="2026-10-09T05:44:38Z"/>
-              </w:rPr>
-              <m:t xml:space="preserve">ε</m:t>
-            </m:r>
-          </m:num>
-          <m:den>
-            <m:r>
-              <w:rPr>
-                <w:ins w:id="20082" w:author="Claude" w:date="2026-10-09T05:44:38Z"/>
-                <w:ins w:id="20074" w:author="Claude" w:date="2026-10-09T05:44:38Z"/>
-              </w:rPr>
-              <m:t xml:space="preserve">τ</m:t>
-            </m:r>
-          </m:den>
-        </m:f>
-        <m:r>
-          <w:rPr>
-            <w:ins w:id="20083" w:author="Claude" w:date="2026-10-09T05:44:38Z"/>
-            <w:ins w:id="20075" w:author="Claude" w:date="2026-10-09T05:44:38Z"/>
-          </w:rPr>
-          <m:t xml:space="preserve">)</m:t>
-        </m:r>
-      </m:oMath>
-    </w:p>
-    <w:p>
-      <w:pPr>
-        <w:pStyle w:val="BodyText"/>
         <w:tabs>
           <w:tab w:val="right" w:pos="9360"/>
         </w:tabs>
@@ -4229,7 +3916,6 @@
                 <m:sty m:val="p"/>
               </m:rPr>
               <w:rPr>
-                <w:del w:id="20102" w:author="Claude" w:date="2026-10-09T05:44:38Z"/>
                 <w:rFonts w:ascii="Cambria Math" w:hAnsi="Cambria Math" w:cs="Times New Roman"/>
               </w:rPr>
               <m:t>∂</m:t>
@@ -4245,7 +3931,6 @@
               <m:e>
                 <m:r>
                   <w:rPr>
-                    <w:del w:id="20103" w:author="Claude" w:date="2026-10-09T05:44:38Z"/>
                     <w:rFonts w:ascii="Cambria Math" w:hAnsi="Cambria Math" w:cs="Times New Roman"/>
                   </w:rPr>
                   <m:t>C</m:t>
@@ -4266,7 +3951,6 @@
                         <m:sty m:val="p"/>
                       </m:rPr>
                       <w:rPr>
-                        <w:del w:id="20104" w:author="Claude" w:date="2026-10-09T05:44:38Z"/>
                         <w:rFonts w:ascii="Cambria Math" w:hAnsi="Cambria Math" w:cs="Times New Roman"/>
                       </w:rPr>
                       <m:t>O</m:t>
@@ -4278,7 +3962,6 @@
                         <m:sty m:val="p"/>
                       </m:rPr>
                       <w:rPr>
-                        <w:del w:id="20105" w:author="Claude" w:date="2026-10-09T05:44:38Z"/>
                         <w:rFonts w:ascii="Cambria Math" w:hAnsi="Cambria Math" w:cs="Times New Roman"/>
                       </w:rPr>
                       <m:t>2</m:t>
@@ -4294,14 +3977,12 @@
                 <m:sty m:val="p"/>
               </m:rPr>
               <w:rPr>
-                <w:del w:id="20106" w:author="Claude" w:date="2026-10-09T05:44:38Z"/>
                 <w:rFonts w:ascii="Cambria Math" w:hAnsi="Cambria Math" w:cs="Times New Roman"/>
               </w:rPr>
               <m:t>∂</m:t>
             </m:r>
             <m:r>
               <w:rPr>
-                <w:del w:id="20107" w:author="Claude" w:date="2026-10-09T05:44:38Z"/>
                 <w:rFonts w:ascii="Cambria Math" w:hAnsi="Cambria Math" w:cs="Times New Roman"/>
               </w:rPr>
               <m:t>t</m:t>
@@ -4313,7 +3994,6 @@
             <m:sty m:val="p"/>
           </m:rPr>
           <w:rPr>
-            <w:del w:id="20108" w:author="Claude" w:date="2026-10-09T05:44:38Z"/>
             <w:rFonts w:ascii="Cambria Math" w:hAnsi="Cambria Math" w:cs="Times New Roman"/>
           </w:rPr>
           <m:t>=∇⋅</m:t>
@@ -4338,7 +4018,6 @@
               <m:e>
                 <m:r>
                   <w:rPr>
-                    <w:del w:id="20109" w:author="Claude" w:date="2026-10-09T05:44:38Z"/>
                     <w:rFonts w:ascii="Cambria Math" w:hAnsi="Cambria Math" w:cs="Times New Roman"/>
                   </w:rPr>
                   <m:t>D</m:t>
@@ -4359,7 +4038,6 @@
                         <m:sty m:val="p"/>
                       </m:rPr>
                       <w:rPr>
-                        <w:del w:id="20110" w:author="Claude" w:date="2026-10-09T05:44:38Z"/>
                         <w:rFonts w:ascii="Cambria Math" w:hAnsi="Cambria Math" w:cs="Times New Roman"/>
                       </w:rPr>
                       <m:t>O</m:t>
@@ -4371,7 +4049,6 @@
                         <m:sty m:val="p"/>
                       </m:rPr>
                       <w:rPr>
-                        <w:del w:id="20111" w:author="Claude" w:date="2026-10-09T05:44:38Z"/>
                         <w:rFonts w:ascii="Cambria Math" w:hAnsi="Cambria Math" w:cs="Times New Roman"/>
                       </w:rPr>
                       <m:t>2</m:t>
@@ -4385,7 +4062,6 @@
                     <m:nor/>
                   </m:rPr>
                   <w:rPr>
-                    <w:del w:id="20112" w:author="Claude" w:date="2026-10-09T05:44:38Z"/>
                     <w:rFonts w:cs="Times New Roman"/>
                   </w:rPr>
                   <m:t>eff</m:t>
@@ -4394,7 +4070,6 @@
             </m:sSubSup>
             <m:r>
               <w:rPr>
-                <w:del w:id="20113" w:author="Claude" w:date="2026-10-09T05:44:38Z"/>
                 <w:rFonts w:ascii="Cambria Math" w:hAnsi="Cambria Math" w:cs="Times New Roman"/>
               </w:rPr>
               <m:t> </m:t>
@@ -4404,7 +4079,6 @@
                 <m:sty m:val="p"/>
               </m:rPr>
               <w:rPr>
-                <w:del w:id="20114" w:author="Claude" w:date="2026-10-09T05:44:38Z"/>
                 <w:rFonts w:ascii="Cambria Math" w:hAnsi="Cambria Math" w:cs="Times New Roman"/>
               </w:rPr>
               <m:t>∇</m:t>
@@ -4420,7 +4094,6 @@
               <m:e>
                 <m:r>
                   <w:rPr>
-                    <w:del w:id="20115" w:author="Claude" w:date="2026-10-09T05:44:38Z"/>
                     <w:rFonts w:ascii="Cambria Math" w:hAnsi="Cambria Math" w:cs="Times New Roman"/>
                   </w:rPr>
                   <m:t>C</m:t>
@@ -4441,7 +4114,6 @@
                         <m:sty m:val="p"/>
                       </m:rPr>
                       <w:rPr>
-                        <w:del w:id="20116" w:author="Claude" w:date="2026-10-09T05:44:38Z"/>
                         <w:rFonts w:ascii="Cambria Math" w:hAnsi="Cambria Math" w:cs="Times New Roman"/>
                       </w:rPr>
                       <m:t>O</m:t>
@@ -4453,7 +4125,6 @@
                         <m:sty m:val="p"/>
                       </m:rPr>
                       <w:rPr>
-                        <w:del w:id="20117" w:author="Claude" w:date="2026-10-09T05:44:38Z"/>
                         <w:rFonts w:ascii="Cambria Math" w:hAnsi="Cambria Math" w:cs="Times New Roman"/>
                       </w:rPr>
                       <m:t>2</m:t>
@@ -4469,7 +4140,6 @@
             <m:sty m:val="p"/>
           </m:rPr>
           <w:rPr>
-            <w:del w:id="20118" w:author="Claude" w:date="2026-10-09T05:44:38Z"/>
             <w:rFonts w:ascii="Cambria Math" w:hAnsi="Cambria Math" w:cs="Times New Roman"/>
           </w:rPr>
           <m:t>-</m:t>
@@ -4485,7 +4155,6 @@
           <m:e>
             <m:r>
               <w:rPr>
-                <w:del w:id="20119" w:author="Claude" w:date="2026-10-09T05:44:38Z"/>
                 <w:rFonts w:ascii="Cambria Math" w:hAnsi="Cambria Math" w:cs="Times New Roman"/>
               </w:rPr>
               <m:t>k</m:t>
@@ -4497,7 +4166,6 @@
                 <m:sty m:val="p"/>
               </m:rPr>
               <w:rPr>
-                <w:del w:id="20120" w:author="Claude" w:date="2026-10-09T05:44:38Z"/>
                 <w:rFonts w:ascii="Cambria Math" w:hAnsi="Cambria Math" w:cs="Times New Roman"/>
               </w:rPr>
               <m:t>ORR</m:t>
@@ -4506,7 +4174,6 @@
         </m:sSub>
         <m:r>
           <w:rPr>
-            <w:del w:id="20121" w:author="Claude" w:date="2026-10-09T05:44:38Z"/>
             <w:rFonts w:ascii="Cambria Math" w:hAnsi="Cambria Math" w:cs="Times New Roman"/>
           </w:rPr>
           <m:t> </m:t>
@@ -4522,28 +4189,6 @@
           <m:e>
             <m:r>
               <w:rPr>
-                <w:del w:id="20122" w:author="Claude" w:date="2026-10-09T05:44:38Z"/>
-                <w:rFonts w:ascii="Cambria Math" w:hAnsi="Cambria Math"/>
-              </w:rPr>
-              <m:t>κ(</m:t>
-            </m:r>
-            <m:r>
-              <w:rPr>
-                <w:del w:id="20123" w:author="Claude" w:date="2026-10-09T05:44:38Z"/>
-                <w:rFonts w:ascii="Cambria Math" w:hAnsi="Cambria Math"/>
-              </w:rPr>
-              <m:t>F</m:t>
-            </m:r>
-            <m:r>
-              <w:rPr>
-                <w:del w:id="20124" w:author="Claude" w:date="2026-10-09T05:44:38Z"/>
-                <w:rFonts w:ascii="Cambria Math" w:hAnsi="Cambria Math"/>
-              </w:rPr>
-              <m:t>)</m:t>
-            </m:r>
-            <m:r>
-              <w:rPr>
-                <w:del w:id="20125" w:author="Claude" w:date="2026-10-09T05:44:38Z"/>
                 <w:rFonts w:ascii="Cambria Math" w:hAnsi="Cambria Math" w:cs="Times New Roman"/>
               </w:rPr>
               <m:t>C</m:t>
@@ -4564,7 +4209,6 @@
                     <m:sty m:val="p"/>
                   </m:rPr>
                   <w:rPr>
-                    <w:del w:id="20126" w:author="Claude" w:date="2026-10-09T05:44:38Z"/>
                     <w:rFonts w:ascii="Cambria Math" w:hAnsi="Cambria Math" w:cs="Times New Roman"/>
                   </w:rPr>
                   <m:t>O</m:t>
@@ -4576,7 +4220,6 @@
                     <m:sty m:val="p"/>
                   </m:rPr>
                   <w:rPr>
-                    <w:del w:id="20127" w:author="Claude" w:date="2026-10-09T05:44:38Z"/>
                     <w:rFonts w:ascii="Cambria Math" w:hAnsi="Cambria Math" w:cs="Times New Roman"/>
                   </w:rPr>
                   <m:t>2</m:t>
@@ -4587,7 +4230,6 @@
         </m:sSub>
         <m:r>
           <w:rPr>
-            <w:del w:id="20128" w:author="Claude" w:date="2026-10-09T05:44:38Z"/>
             <w:rFonts w:ascii="Cambria Math" w:hAnsi="Cambria Math" w:cs="Times New Roman"/>
           </w:rPr>
           <m:t xml:space="preserve"> </m:t>
@@ -4603,7 +4245,6 @@
           <m:e>
             <m:r>
               <w:rPr>
-                <w:del w:id="20129" w:author="Claude" w:date="2026-10-09T05:44:38Z"/>
                 <w:rFonts w:ascii="Cambria Math" w:hAnsi="Cambria Math"/>
               </w:rPr>
               <m:t>δ</m:t>
@@ -4615,7 +4256,6 @@
                 <m:sty m:val="p"/>
               </m:rPr>
               <w:rPr>
-                <w:del w:id="20130" w:author="Claude" w:date="2026-10-09T05:44:38Z"/>
                 <w:rFonts w:ascii="Cambria Math" w:hAnsi="Cambria Math"/>
               </w:rPr>
               <m:t>Γ</m:t>
@@ -4623,152 +4263,6 @@
           </m:sub>
         </m:sSub>
       </m:oMath>
-      <m:oMath>
-        <m:f>
-          <m:num>
-            <m:r>
-              <w:rPr>
-                <w:ins w:id="20085" w:author="Claude" w:date="2026-10-09T05:44:38Z"/>
-              </w:rPr>
-              <m:t xml:space="preserve">∂</m:t>
-            </m:r>
-            <m:sSub>
-              <m:e>
-                <m:r>
-                  <w:rPr>
-                    <w:ins w:id="20086" w:author="Claude" w:date="2026-10-09T05:44:38Z"/>
-                  </w:rPr>
-                  <m:t xml:space="preserve">C</m:t>
-                </m:r>
-              </m:e>
-              <m:sub>
-                <m:r>
-                  <w:rPr>
-                    <w:ins w:id="20087" w:author="Claude" w:date="2026-10-09T05:44:38Z"/>
-                  </w:rPr>
-                  <m:t xml:space="preserve">O₂</m:t>
-                </m:r>
-              </m:sub>
-            </m:sSub>
-          </m:num>
-          <m:den>
-            <m:r>
-              <w:rPr>
-                <w:ins w:id="20088" w:author="Claude" w:date="2026-10-09T05:44:38Z"/>
-              </w:rPr>
-              <m:t xml:space="preserve">∂</m:t>
-            </m:r>
-            <m:r>
-              <w:rPr>
-                <w:ins w:id="20089" w:author="Claude" w:date="2026-10-09T05:44:38Z"/>
-              </w:rPr>
-              <m:t xml:space="preserve">t</m:t>
-            </m:r>
-          </m:den>
-        </m:f>
-        <m:r>
-          <w:rPr>
-            <w:ins w:id="20090" w:author="Claude" w:date="2026-10-09T05:44:38Z"/>
-          </w:rPr>
-          <m:t xml:space="preserve">=∇⋅(</m:t>
-        </m:r>
-        <m:sSup>
-          <m:e>
-            <m:sSub>
-              <m:e>
-                <m:r>
-                  <w:rPr>
-                    <w:ins w:id="20091" w:author="Claude" w:date="2026-10-09T05:44:38Z"/>
-                  </w:rPr>
-                  <m:t xml:space="preserve">D</m:t>
-                </m:r>
-              </m:e>
-              <m:sub>
-                <m:r>
-                  <w:rPr>
-                    <w:ins w:id="20092" w:author="Claude" w:date="2026-10-09T05:44:38Z"/>
-                  </w:rPr>
-                  <m:t xml:space="preserve">O₂</m:t>
-                </m:r>
-              </m:sub>
-            </m:sSub>
-          </m:e>
-          <m:sup>
-            <m:r>
-              <w:rPr>
-                <w:ins w:id="20093" w:author="Claude" w:date="2026-10-09T05:44:38Z"/>
-              </w:rPr>
-              <m:t xml:space="preserve">eff</m:t>
-            </m:r>
-          </m:sup>
-        </m:sSup>
-        <m:r>
-          <w:rPr>
-            <w:ins w:id="20094" w:author="Claude" w:date="2026-10-09T05:44:38Z"/>
-          </w:rPr>
-          <m:t xml:space="preserve">∇</m:t>
-        </m:r>
-        <m:sSub>
-          <m:e>
-            <m:r>
-              <w:rPr>
-                <w:ins w:id="20095" w:author="Claude" w:date="2026-10-09T05:44:38Z"/>
-              </w:rPr>
-              <m:t xml:space="preserve">C</m:t>
-            </m:r>
-          </m:e>
-          <m:sub>
-            <m:r>
-              <w:rPr>
-                <w:ins w:id="20096" w:author="Claude" w:date="2026-10-09T05:44:38Z"/>
-              </w:rPr>
-              <m:t xml:space="preserve">O₂</m:t>
-            </m:r>
-          </m:sub>
-        </m:sSub>
-        <m:r>
-          <w:rPr>
-            <w:ins w:id="20097" w:author="Claude" w:date="2026-10-09T05:44:38Z"/>
-          </w:rPr>
-          <m:t xml:space="preserve">)−</m:t>
-        </m:r>
-        <m:sSub>
-          <m:e>
-            <m:r>
-              <w:rPr>
-                <w:ins w:id="20098" w:author="Claude" w:date="2026-10-09T05:44:38Z"/>
-              </w:rPr>
-              <m:t xml:space="preserve">j</m:t>
-            </m:r>
-          </m:e>
-          <m:sub>
-            <m:r>
-              <w:rPr>
-                <w:ins w:id="20099" w:author="Claude" w:date="2026-10-09T05:44:38Z"/>
-              </w:rPr>
-              <m:t xml:space="preserve">ORR</m:t>
-            </m:r>
-          </m:sub>
-        </m:sSub>
-        <m:sSub>
-          <m:e>
-            <m:r>
-              <w:rPr>
-                <w:ins w:id="20100" w:author="Claude" w:date="2026-10-09T05:44:38Z"/>
-              </w:rPr>
-              <m:t xml:space="preserve">δ</m:t>
-            </m:r>
-          </m:e>
-          <m:sub>
-            <m:r>
-              <w:rPr>
-                <w:ins w:id="20101" w:author="Claude" w:date="2026-10-09T05:44:38Z"/>
-              </w:rPr>
-              <m:t xml:space="preserve">Γ</m:t>
-            </m:r>
-          </m:sub>
-        </m:sSub>
-      </m:oMath>
       <w:r>
         <w:rPr>
           <w:rFonts w:cs="Times New Roman"/>
@@ -4794,78 +4288,53 @@
         <w:pStyle w:val="BodyText"/>
         <w:ind w:firstLine="0"/>
         <w:rPr>
-          <w:del w:id="20027" w:author="Claude" w:date="2026-10-09T05:44:38Z"/>
-          <w:rFonts w:cs="Times New Roman"/>
-        </w:rPr>
-      </w:pPr>
-      <w:del w:id="20001" w:author="Claude" w:date="2026-10-09T05:44:38Z">
-        <w:r>
-          <w:rPr>
-            <w:rFonts w:cs="Times New Roman"/>
-          </w:rPr>
-          <w:delText xml:space="preserve">where </w:delText>
-        </w:r>
-      </w:del>
-      <w:proofErr w:type="spellStart"/>
-      <w:del w:id="20002" w:author="Claude" w:date="2026-10-09T05:44:38Z">
-        <w:r>
-          <w:rPr>
-            <w:rFonts w:cs="Times New Roman"/>
-          </w:rPr>
-          <w:delText xml:space="preserve">δ</w:delText>
-        </w:r>
-      </w:del>
-      <w:del w:id="20003" w:author="Claude" w:date="2026-10-09T05:44:38Z">
-        <w:r>
-          <w:rPr>
-            <w:rFonts w:cs="Times New Roman"/>
-            <w:vertAlign w:val="subscript"/>
-          </w:rPr>
-          <w:delText xml:space="preserve">Γ</w:delText>
-        </w:r>
-      </w:del>
-      <w:proofErr w:type="spellEnd"/>
-      <w:del w:id="20004" w:author="Claude" w:date="2026-10-09T05:44:38Z">
-        <w:r>
-          <w:rPr>
-            <w:rFonts w:cs="Times New Roman"/>
-          </w:rPr>
-          <w:delText xml:space="preserve"> = δ(ϕ)|</w:delText>
-        </w:r>
-      </w:del>
-      <w:del w:id="20005" w:author="Claude" w:date="2026-10-09T05:44:38Z">
-        <w:r>
-          <w:rPr>
-            <w:rFonts w:ascii="Cambria Math" w:hAnsi="Cambria Math" w:cs="Cambria Math"/>
-          </w:rPr>
-          <w:delText xml:space="preserve">∇</w:delText>
-        </w:r>
-      </w:del>
-      <w:del w:id="20006" w:author="Claude" w:date="2026-10-09T05:44:38Z">
-        <w:r>
-          <w:rPr>
-            <w:rFonts w:cs="Times New Roman"/>
-          </w:rPr>
-          <w:delText xml:space="preserve">ϕ| is the interface delta function (mm</w:delText>
-        </w:r>
-      </w:del>
-      <w:del w:id="20007" w:author="Claude" w:date="2026-10-09T05:44:38Z">
-        <w:r>
-          <w:rPr>
-            <w:rFonts w:cs="Times New Roman"/>
-            <w:vertAlign w:val="superscript"/>
-          </w:rPr>
-          <w:delText xml:space="preserve">-1</w:delText>
-        </w:r>
-      </w:del>
-      <w:del w:id="20008" w:author="Claude" w:date="2026-10-09T05:44:38Z">
-        <w:r>
-          <w:rPr>
-            <w:rFonts w:cs="Times New Roman"/>
-          </w:rPr>
-          <w:delText xml:space="preserve">), so that </w:delText>
-        </w:r>
-      </w:del>
+          <w:rFonts w:cs="Times New Roman"/>
+        </w:rPr>
+      </w:pPr>
+      <w:r>
+        <w:rPr>
+          <w:rFonts w:cs="Times New Roman"/>
+        </w:rPr>
+        <w:t>where δ</w:t>
+      </w:r>
+      <w:r>
+        <w:rPr>
+          <w:rFonts w:cs="Times New Roman"/>
+          <w:vertAlign w:val="subscript"/>
+        </w:rPr>
+        <w:t>Γ</w:t>
+      </w:r>
+      <w:r>
+        <w:rPr>
+          <w:rFonts w:cs="Times New Roman"/>
+        </w:rPr>
+        <w:t xml:space="preserve"> = δ(ϕ)|</w:t>
+      </w:r>
+      <w:r>
+        <w:rPr>
+          <w:rFonts w:ascii="Cambria Math" w:hAnsi="Cambria Math" w:cs="Cambria Math"/>
+        </w:rPr>
+        <w:t>∇</w:t>
+      </w:r>
+      <w:r>
+        <w:rPr>
+          <w:rFonts w:cs="Times New Roman"/>
+        </w:rPr>
+        <w:t>ϕ| is the interface delta function (mm</w:t>
+      </w:r>
+      <w:r>
+        <w:rPr>
+          <w:rFonts w:cs="Times New Roman"/>
+          <w:vertAlign w:val="superscript"/>
+        </w:rPr>
+        <w:t>-1</w:t>
+      </w:r>
+      <w:r>
+        <w:rPr>
+          <w:rFonts w:cs="Times New Roman"/>
+        </w:rPr>
+        <w:t xml:space="preserve">), so that </w:t>
+      </w:r>
       <m:oMath>
         <m:sSub>
           <m:sSubPr>
@@ -4878,7 +4347,6 @@
           <m:e>
             <m:r>
               <w:rPr>
-                <w:del w:id="20024" w:author="Claude" w:date="2026-10-09T05:44:38Z"/>
                 <w:rFonts w:ascii="Cambria Math" w:hAnsi="Cambria Math" w:cs="Times New Roman"/>
               </w:rPr>
               <m:t>k</m:t>
@@ -4890,7 +4358,6 @@
                 <m:sty m:val="p"/>
               </m:rPr>
               <w:rPr>
-                <w:del w:id="20025" w:author="Claude" w:date="2026-10-09T05:44:38Z"/>
                 <w:rFonts w:ascii="Cambria Math" w:hAnsi="Cambria Math" w:cs="Times New Roman"/>
               </w:rPr>
               <m:t>ORR</m:t>
@@ -4898,41 +4365,43 @@
           </m:sub>
         </m:sSub>
       </m:oMath>
-      <w:del w:id="20009" w:author="Claude" w:date="2026-10-09T05:44:38Z">
+      <w:r>
+        <w:rPr>
+          <w:rFonts w:cs="Times New Roman"/>
+        </w:rPr>
+        <w:t xml:space="preserve"> is a velocity (mm h</w:t>
+      </w:r>
+      <w:r>
+        <w:rPr>
+          <w:rFonts w:cs="Times New Roman"/>
+          <w:vertAlign w:val="superscript"/>
+        </w:rPr>
+        <w:t>-1</w:t>
+      </w:r>
+      <w:r>
+        <w:rPr>
+          <w:rFonts w:cs="Times New Roman"/>
+        </w:rPr>
+        <w:t xml:space="preserve">)</w:t>
+      </w:r>
+      <w:del w:id="20001" w:author="Claude" w:date="2026-10-09T06:27:45Z">
         <w:r>
           <w:rPr>
             <w:rFonts w:cs="Times New Roman"/>
           </w:rPr>
-          <w:delText xml:space="preserve"> is a velocity (mm h</w:delText>
-        </w:r>
-      </w:del>
-      <w:del w:id="20010" w:author="Claude" w:date="2026-10-09T05:44:38Z">
-        <w:r>
-          <w:rPr>
-            <w:rFonts w:cs="Times New Roman"/>
-            <w:vertAlign w:val="superscript"/>
-          </w:rPr>
-          <w:delText xml:space="preserve">-1</w:delText>
-        </w:r>
-      </w:del>
-      <w:del w:id="20011" w:author="Claude" w:date="2026-10-09T05:44:38Z">
-        <w:r>
-          <w:rPr>
-            <w:rFonts w:cs="Times New Roman"/>
-          </w:rPr>
-          <w:delText xml:space="preserve">), and </w:delText>
+          <w:delText xml:space="preserve">, and </w:delText>
         </w:r>
       </w:del>
       <m:oMath>
         <m:r>
           <w:rPr>
-            <w:del w:id="20026" w:author="Claude" w:date="2026-10-09T05:44:38Z"/>
+            <w:del w:id="20002" w:author="Claude" w:date="2026-10-09T06:27:45Z"/>
             <w:rFonts w:ascii="Cambria Math" w:hAnsi="Cambria Math" w:cs="Times New Roman"/>
           </w:rPr>
           <m:t>κ(F) = 1 – F.(1 - ε/τ)</m:t>
         </m:r>
       </m:oMath>
-      <w:del w:id="20012" w:author="Claude" w:date="2026-10-09T05:44:38Z">
+      <w:del w:id="20003" w:author="Claude" w:date="2026-10-09T06:27:45Z">
         <w:r>
           <w:rPr>
             <w:rFonts w:cs="Times New Roman"/>
@@ -4940,7 +4409,7 @@
           <w:delText xml:space="preserve"> is the factor by which the corrosion-product film reduces the reaction, using the same porosity (ε) and tortuosity (τ) reduction as the effective-diffusivity law of the film </w:delText>
         </w:r>
       </w:del>
-      <w:del w:id="20013" w:author="Claude" w:date="2026-10-09T05:44:38Z">
+      <w:del w:id="20004" w:author="Claude" w:date="2026-10-09T06:27:45Z">
         <w:r>
           <w:rPr>
             <w:rFonts w:cs="Times New Roman"/>
@@ -4948,7 +4417,7 @@
           <w:delText xml:space="preserve">in </w:delText>
         </w:r>
       </w:del>
-      <w:del w:id="20014" w:author="Claude" w:date="2026-10-09T05:44:38Z">
+      <w:del w:id="20005" w:author="Claude" w:date="2026-10-09T06:27:45Z">
         <w:r>
           <w:rPr>
             <w:b/>
@@ -4957,7 +4426,7 @@
           <w:delText xml:space="preserve">Equation </w:delText>
         </w:r>
       </w:del>
-      <w:del w:id="20015" w:author="Claude" w:date="2026-10-09T05:44:38Z">
+      <w:del w:id="20006" w:author="Claude" w:date="2026-10-09T06:27:45Z">
         <w:r>
           <w:rPr>
             <w:b/>
@@ -4966,156 +4435,55 @@
           <w:delText xml:space="preserve">12</w:delText>
         </w:r>
       </w:del>
-      <w:del w:id="20016" w:author="Claude" w:date="2026-10-09T05:44:38Z">
-        <w:r>
-          <w:rPr>
-            <w:rFonts w:cs="Times New Roman"/>
-          </w:rPr>
-          <w:delText xml:space="preserve">. Chloride acts as a catalytic species, regenerated during film breakdown rather than consumed</w:delText>
-        </w:r>
-      </w:del>
-      <w:del w:id="20017" w:author="Claude" w:date="2026-10-09T05:44:38Z">
-        <w:r>
-          <w:rPr>
-            <w:rFonts w:cs="Times New Roman"/>
-          </w:rPr>
-          <w:delText xml:space="preserve"> </w:delText>
-        </w:r>
-      </w:del>
-      <w:del w:id="20018" w:author="Claude" w:date="2026-10-09T05:44:38Z">
-        <w:r>
-          <w:rPr>
-            <w:rFonts w:cs="Times New Roman"/>
-          </w:rPr>
-          <w:fldChar w:fldCharType="begin"/>
-        </w:r>
-      </w:del>
-      <w:del w:id="20019" w:author="Claude" w:date="2026-10-09T05:44:38Z">
-        <w:r>
-          <w:rPr>
-            <w:rFonts w:cs="Times New Roman"/>
-          </w:rPr>
-          <w:delInstrText xml:space="preserve"> ADDIN ZOTERO_ITEM CSL_CITATION {"citationID":"eTfl7xu9","properties":{"unsorted":false,"formattedCitation":"\\super [19]\\nosupersub{}","plainCitation":"[19]","noteIndex":0},"citationItems":[{"id":1722,"uris":["http://zotero.org/users/16939557/items/FZJ2S65B"],"itemData":{"id":1722,"type":"article-journal","citation-key":"bajgerMathematicalModellingDegradation2017","container-title":"Biomechanics and Modeling in Mechanobiology","DOI":"10.1007/s10237-016-0812-3","ISSN":"1617-7959, 1617-7940","issue":"1","journalAbbreviation":"Biomech Model Mechanobiol","language":"en","page":"227-238","source":"DOI.org (Crossref)","title":"Mathematical modelling of the degradation behaviour of biodegradable metals","volume":"16","author":[{"family":"Bajger","given":"P."},{"family":"Ashbourn","given":"J. M. A."},{"family":"Manhas","given":"V."},{"family":"Guyot","given":"Y."},{"family":"Lietaert","given":"K."},{"family":"Geris","given":"L."}],"issued":{"date-parts":[["2017",2]]}}}],"schema":"https://github.com/citation-style-language/schema/raw/master/csl-citation.json"} </w:delInstrText>
-        </w:r>
-      </w:del>
-      <w:del w:id="20020" w:author="Claude" w:date="2026-10-09T05:44:38Z">
-        <w:r>
-          <w:rPr>
-            <w:rFonts w:cs="Times New Roman"/>
-          </w:rPr>
-          <w:fldChar w:fldCharType="separate"/>
-        </w:r>
-      </w:del>
-      <w:del w:id="20021" w:author="Claude" w:date="2026-10-09T05:44:38Z">
-        <w:r>
-          <w:rPr>
-            <w:rFonts w:cs="Times New Roman"/>
-            <w:vertAlign w:val="superscript"/>
-          </w:rPr>
-          <w:delText xml:space="preserve">[19]</w:delText>
-        </w:r>
-      </w:del>
-      <w:del w:id="20022" w:author="Claude" w:date="2026-10-09T05:44:38Z">
-        <w:r>
-          <w:rPr>
-            <w:rFonts w:cs="Times New Roman"/>
-          </w:rPr>
-          <w:fldChar w:fldCharType="end"/>
-        </w:r>
-      </w:del>
-      <w:del w:id="20023" w:author="Claude" w:date="2026-10-09T05:44:38Z">
-        <w:r>
-          <w:rPr>
-            <w:rFonts w:cs="Times New Roman"/>
-          </w:rPr>
-          <w:delText xml:space="preserve">:</w:delText>
-        </w:r>
-      </w:del>
-    </w:p>
-    <w:p>
-      <w:pPr>
-        <w:pStyle w:val="BodyText"/>
-        <w:rPr>
-          <w:ins w:id="20033" w:author="Claude" w:date="2026-10-09T05:44:38Z"/>
-        </w:rPr>
-      </w:pPr>
-      <w:ins w:id="20028" w:author="Claude" w:date="2026-10-09T05:44:38Z">
-        <w:r>
-          <w:t xml:space="preserve">where δ</w:t>
-        </w:r>
-      </w:ins>
-      <w:ins w:id="20029" w:author="Claude" w:date="2026-10-09T05:44:38Z">
-        <w:r>
-          <w:rPr>
-            <w:vertAlign w:val="subscript"/>
-          </w:rPr>
-          <w:t xml:space="preserve">Γ</w:t>
-        </w:r>
-      </w:ins>
-      <w:ins w:id="20030" w:author="Claude" w:date="2026-10-09T05:44:38Z">
-        <w:r>
-          <w:t xml:space="preserve"> = δ(ϕ)|∇ϕ| is the interface delta function (mm⁻¹) and C</w:t>
-        </w:r>
-      </w:ins>
-      <w:ins w:id="20031" w:author="Claude" w:date="2026-10-09T05:44:38Z">
-        <w:r>
-          <w:rPr>
-            <w:vertAlign w:val="subscript"/>
-          </w:rPr>
-          <w:t xml:space="preserve">O2</w:t>
-        </w:r>
-      </w:ins>
-      <w:ins w:id="20032" w:author="Claude" w:date="2026-10-09T05:44:38Z">
-        <w:r>
-          <w:t xml:space="preserve"> is the molar concentration of dissolved oxygen (mol mm⁻³). Chloride acts as a catalytic species, regenerated during film breakdown rather than consumed </w:t>
-        </w:r>
-      </w:ins>
-      <w:ins w:id="20034" w:author="Claude" w:date="2026-10-09T05:44:38Z">
-        <w:r>
-          <w:rPr>
-            <w:rFonts w:cs="Times New Roman"/>
-          </w:rPr>
-          <w:fldChar w:fldCharType="begin"/>
-        </w:r>
-      </w:ins>
-      <w:ins w:id="20035" w:author="Claude" w:date="2026-10-09T05:44:38Z">
-        <w:r>
-          <w:rPr>
-            <w:rFonts w:cs="Times New Roman"/>
-          </w:rPr>
-          <w:instrText xml:space="preserve"> ADDIN ZOTERO_ITEM CSL_CITATION {"citationID":"eTfl7xu9","properties":{"unsorted":false,"formattedCitation":"\\super [19]\\nosupersub{}","plainCitation":"[19]","noteIndex":0},"citationItems":[{"id":1722,"uris":["http://zotero.org/users/16939557/items/FZJ2S65B"],"itemData":{"id":1722,"type":"article-journal","citation-key":"bajgerMathematicalModellingDegradation2017","container-title":"Biomechanics and Modeling in Mechanobiology","DOI":"10.1007/s10237-016-0812-3","ISSN":"1617-7959, 1617-7940","issue":"1","journalAbbreviation":"Biomech Model Mechanobiol","language":"en","page":"227-238","source":"DOI.org (Crossref)","title":"Mathematical modelling of the degradation behaviour of biodegradable metals","volume":"16","author":[{"family":"Bajger","given":"P."},{"family":"Ashbourn","given":"J. M. A."},{"family":"Manhas","given":"V."},{"family":"Guyot","given":"Y."},{"family":"Lietaert","given":"K."},{"family":"Geris","given":"L."}],"issued":{"date-parts":[["2017",2]]}}}],"schema":"https://github.com/citation-style-language/schema/raw/master/csl-citation.json"} </w:instrText>
-        </w:r>
-      </w:ins>
-      <w:ins w:id="20036" w:author="Claude" w:date="2026-10-09T05:44:38Z">
-        <w:r>
-          <w:rPr>
-            <w:rFonts w:cs="Times New Roman"/>
-          </w:rPr>
-          <w:fldChar w:fldCharType="separate"/>
-        </w:r>
-      </w:ins>
-      <w:ins w:id="20037" w:author="Claude" w:date="2026-10-09T05:44:38Z">
-        <w:r>
-          <w:rPr>
-            <w:rFonts w:cs="Times New Roman"/>
-            <w:vertAlign w:val="superscript"/>
-          </w:rPr>
-          <w:delText xml:space="preserve">[19]</w:delText>
-        </w:r>
-      </w:ins>
-      <w:ins w:id="20038" w:author="Claude" w:date="2026-10-09T05:44:38Z">
-        <w:r>
-          <w:rPr>
-            <w:rFonts w:cs="Times New Roman"/>
-          </w:rPr>
-          <w:fldChar w:fldCharType="end"/>
-        </w:r>
-      </w:ins>
-      <w:ins w:id="20032" w:author="Claude" w:date="2026-10-09T05:44:38Z">
-        <w:r>
-          <w:t xml:space="preserve">:</w:t>
-        </w:r>
-      </w:ins>
+      <w:r>
+        <w:rPr>
+          <w:rFonts w:cs="Times New Roman"/>
+        </w:rPr>
+        <w:t>. Chloride acts as a catalytic species, regenerated during film breakdown rather than consumed</w:t>
+      </w:r>
+      <w:r>
+        <w:rPr>
+          <w:rFonts w:cs="Times New Roman"/>
+        </w:rPr>
+        <w:t xml:space="preserve"> </w:t>
+      </w:r>
+      <w:r>
+        <w:rPr>
+          <w:rFonts w:cs="Times New Roman"/>
+        </w:rPr>
+        <w:fldChar w:fldCharType="begin"/>
+      </w:r>
+      <w:r>
+        <w:rPr>
+          <w:rFonts w:cs="Times New Roman"/>
+        </w:rPr>
+        <w:instrText xml:space="preserve"> ADDIN ZOTERO_ITEM CSL_CITATION {"citationID":"eTfl7xu9","properties":{"unsorted":false,"formattedCitation":"\\super [19]\\nosupersub{}","plainCitation":"[19]","noteIndex":0},"citationItems":[{"id":1722,"uris":["http://zotero.org/users/16939557/items/FZJ2S65B"],"itemData":{"id":1722,"type":"article-journal","citation-key":"bajgerMathematicalModellingDegradation2017","container-title":"Biomechanics and Modeling in Mechanobiology","DOI":"10.1007/s10237-016-0812-3","ISSN":"1617-7959, 1617-7940","issue":"1","journalAbbreviation":"Biomech Model Mechanobiol","language":"en","page":"227-238","source":"DOI.org (Crossref)","title":"Mathematical modelling of the degradation behaviour of biodegradable metals","volume":"16","author":[{"family":"Bajger","given":"P."},{"family":"Ashbourn","given":"J. M. A."},{"family":"Manhas","given":"V."},{"family":"Guyot","given":"Y."},{"family":"Lietaert","given":"K."},{"family":"Geris","given":"L."}],"issued":{"date-parts":[["2017",2]]}}}],"schema":"https://github.com/citation-style-language/schema/raw/master/csl-citation.json"} </w:instrText>
+      </w:r>
+      <w:r>
+        <w:rPr>
+          <w:rFonts w:cs="Times New Roman"/>
+        </w:rPr>
+        <w:fldChar w:fldCharType="separate"/>
+      </w:r>
+      <w:r>
+        <w:rPr>
+          <w:rFonts w:cs="Times New Roman"/>
+          <w:vertAlign w:val="superscript"/>
+        </w:rPr>
+        <w:t>[19]</w:t>
+      </w:r>
+      <w:r>
+        <w:rPr>
+          <w:rFonts w:cs="Times New Roman"/>
+        </w:rPr>
+        <w:fldChar w:fldCharType="end"/>
+      </w:r>
+      <w:r>
+        <w:rPr>
+          <w:rFonts w:cs="Times New Roman"/>
+        </w:rPr>
+        <w:t>:</w:t>
+      </w:r>
     </w:p>
     <w:p>
       <w:pPr>
@@ -5506,21 +4874,7 @@
         <w:rPr>
           <w:rFonts w:cs="Times New Roman"/>
         </w:rPr>
-        <w:t xml:space="preserve">generating OH⁻ ions that increase the local alkalinity and promote formation of </w:t>
-      </w:r>
-      <w:proofErr w:type="spellStart"/>
-      <w:r>
-        <w:rPr>
-          <w:rFonts w:cs="Times New Roman"/>
-        </w:rPr>
-        <w:t>ZnO</w:t>
-      </w:r>
-      <w:proofErr w:type="spellEnd"/>
-      <w:r>
-        <w:rPr>
-          <w:rFonts w:cs="Times New Roman"/>
-        </w:rPr>
-        <w:t>-based corrosion products.</w:t>
+        <w:t>generating OH⁻ ions that increase the local alkalinity and promote formation of ZnO-based corrosion products.</w:t>
       </w:r>
       <w:r>
         <w:rPr>
@@ -5581,7 +4935,6 @@
                       <m:sty m:val="p"/>
                     </m:rPr>
                     <w:rPr>
-                      <w:del w:id="20153" w:author="Claude" w:date="2026-10-09T05:44:38Z"/>
                       <w:rFonts w:ascii="Cambria Math" w:hAnsi="Cambria Math" w:cs="Times New Roman"/>
                     </w:rPr>
                     <m:t>∂</m:t>
@@ -5597,7 +4950,6 @@
                     <m:e>
                       <m:r>
                         <w:rPr>
-                          <w:del w:id="20154" w:author="Claude" w:date="2026-10-09T05:44:38Z"/>
                           <w:rFonts w:ascii="Cambria Math" w:hAnsi="Cambria Math" w:cs="Times New Roman"/>
                         </w:rPr>
                         <m:t>C</m:t>
@@ -5609,7 +4961,6 @@
                           <m:sty m:val="p"/>
                         </m:rPr>
                         <w:rPr>
-                          <w:del w:id="20155" w:author="Claude" w:date="2026-10-09T05:44:38Z"/>
                           <w:rFonts w:ascii="Cambria Math" w:hAnsi="Cambria Math" w:cs="Times New Roman"/>
                         </w:rPr>
                         <m:t>Zn</m:t>
@@ -5623,14 +4974,12 @@
                       <m:sty m:val="p"/>
                     </m:rPr>
                     <w:rPr>
-                      <w:del w:id="20156" w:author="Claude" w:date="2026-10-09T05:44:38Z"/>
                       <w:rFonts w:ascii="Cambria Math" w:hAnsi="Cambria Math" w:cs="Times New Roman"/>
                     </w:rPr>
                     <m:t>∂</m:t>
                   </m:r>
                   <m:r>
                     <w:rPr>
-                      <w:del w:id="20157" w:author="Claude" w:date="2026-10-09T05:44:38Z"/>
                       <w:rFonts w:ascii="Cambria Math" w:hAnsi="Cambria Math" w:cs="Times New Roman"/>
                     </w:rPr>
                     <m:t>t</m:t>
@@ -5642,7 +4991,6 @@
                   <m:sty m:val="p"/>
                 </m:rPr>
                 <w:rPr>
-                  <w:del w:id="20158" w:author="Claude" w:date="2026-10-09T05:44:38Z"/>
                   <w:rFonts w:ascii="Cambria Math" w:hAnsi="Cambria Math" w:cs="Times New Roman"/>
                 </w:rPr>
                 <m:t>=∇⋅</m:t>
@@ -5667,7 +5015,6 @@
                     <m:e>
                       <m:r>
                         <w:rPr>
-                          <w:del w:id="20159" w:author="Claude" w:date="2026-10-09T05:44:38Z"/>
                           <w:rFonts w:ascii="Cambria Math" w:hAnsi="Cambria Math" w:cs="Times New Roman"/>
                         </w:rPr>
                         <m:t>D</m:t>
@@ -5679,7 +5026,6 @@
                           <m:sty m:val="p"/>
                         </m:rPr>
                         <w:rPr>
-                          <w:del w:id="20160" w:author="Claude" w:date="2026-10-09T05:44:38Z"/>
                           <w:rFonts w:ascii="Cambria Math" w:hAnsi="Cambria Math" w:cs="Times New Roman"/>
                         </w:rPr>
                         <m:t>Zn</m:t>
@@ -5691,7 +5037,6 @@
                           <m:nor/>
                         </m:rPr>
                         <w:rPr>
-                          <w:del w:id="20161" w:author="Claude" w:date="2026-10-09T05:44:38Z"/>
                           <w:rFonts w:cs="Times New Roman"/>
                         </w:rPr>
                         <m:t>eff</m:t>
@@ -5700,7 +5045,6 @@
                   </m:sSubSup>
                   <m:r>
                     <w:rPr>
-                      <w:del w:id="20162" w:author="Claude" w:date="2026-10-09T05:44:38Z"/>
                       <w:rFonts w:ascii="Cambria Math" w:hAnsi="Cambria Math" w:cs="Times New Roman"/>
                     </w:rPr>
                     <m:t> </m:t>
@@ -5710,7 +5054,6 @@
                       <m:sty m:val="p"/>
                     </m:rPr>
                     <w:rPr>
-                      <w:del w:id="20163" w:author="Claude" w:date="2026-10-09T05:44:38Z"/>
                       <w:rFonts w:ascii="Cambria Math" w:hAnsi="Cambria Math" w:cs="Times New Roman"/>
                     </w:rPr>
                     <m:t>∇</m:t>
@@ -5726,7 +5069,6 @@
                     <m:e>
                       <m:r>
                         <w:rPr>
-                          <w:del w:id="20164" w:author="Claude" w:date="2026-10-09T05:44:38Z"/>
                           <w:rFonts w:ascii="Cambria Math" w:hAnsi="Cambria Math" w:cs="Times New Roman"/>
                         </w:rPr>
                         <m:t>C</m:t>
@@ -5738,7 +5080,6 @@
                           <m:sty m:val="p"/>
                         </m:rPr>
                         <w:rPr>
-                          <w:del w:id="20165" w:author="Claude" w:date="2026-10-09T05:44:38Z"/>
                           <w:rFonts w:ascii="Cambria Math" w:hAnsi="Cambria Math" w:cs="Times New Roman"/>
                         </w:rPr>
                         <m:t>Zn</m:t>
@@ -5752,7 +5093,6 @@
                   <m:sty m:val="p"/>
                 </m:rPr>
                 <w:rPr>
-                  <w:del w:id="20166" w:author="Claude" w:date="2026-10-09T05:44:38Z"/>
                   <w:rFonts w:ascii="Cambria Math" w:hAnsi="Cambria Math" w:cs="Times New Roman"/>
                 </w:rPr>
                 <m:t>+2</m:t>
@@ -5768,7 +5108,6 @@
                 <m:e>
                   <m:r>
                     <w:rPr>
-                      <w:del w:id="20167" w:author="Claude" w:date="2026-10-09T05:44:38Z"/>
                       <w:rFonts w:ascii="Cambria Math" w:hAnsi="Cambria Math" w:cs="Times New Roman"/>
                     </w:rPr>
                     <m:t>k</m:t>
@@ -5780,7 +5119,6 @@
                       <m:sty m:val="p"/>
                     </m:rPr>
                     <w:rPr>
-                      <w:del w:id="20168" w:author="Claude" w:date="2026-10-09T05:44:38Z"/>
                       <w:rFonts w:ascii="Cambria Math" w:hAnsi="Cambria Math" w:cs="Times New Roman"/>
                     </w:rPr>
                     <m:t>ORR</m:t>
@@ -5789,7 +5127,6 @@
               </m:sSub>
               <m:r>
                 <w:rPr>
-                  <w:del w:id="20169" w:author="Claude" w:date="2026-10-09T05:44:38Z"/>
                   <w:rFonts w:ascii="Cambria Math" w:hAnsi="Cambria Math" w:cs="Times New Roman"/>
                 </w:rPr>
                 <m:t> </m:t>
@@ -5805,14 +5142,6 @@
                 <m:e>
                   <m:r>
                     <w:rPr>
-                      <w:del w:id="20170" w:author="Claude" w:date="2026-10-09T05:44:38Z"/>
-                      <w:rFonts w:ascii="Cambria Math" w:hAnsi="Cambria Math"/>
-                    </w:rPr>
-                    <m:t>κ</m:t>
-                  </m:r>
-                  <m:r>
-                    <w:rPr>
-                      <w:del w:id="20171" w:author="Claude" w:date="2026-10-09T05:44:38Z"/>
                       <w:rFonts w:ascii="Cambria Math" w:hAnsi="Cambria Math" w:cs="Times New Roman"/>
                     </w:rPr>
                     <m:t>C</m:t>
@@ -5833,7 +5162,6 @@
                           <m:sty m:val="p"/>
                         </m:rPr>
                         <w:rPr>
-                          <w:del w:id="20172" w:author="Claude" w:date="2026-10-09T05:44:38Z"/>
                           <w:rFonts w:ascii="Cambria Math" w:hAnsi="Cambria Math" w:cs="Times New Roman"/>
                         </w:rPr>
                         <m:t>O</m:t>
@@ -5845,7 +5173,6 @@
                           <m:sty m:val="p"/>
                         </m:rPr>
                         <w:rPr>
-                          <w:del w:id="20173" w:author="Claude" w:date="2026-10-09T05:44:38Z"/>
                           <w:rFonts w:ascii="Cambria Math" w:hAnsi="Cambria Math" w:cs="Times New Roman"/>
                         </w:rPr>
                         <m:t>2</m:t>
@@ -5856,7 +5183,6 @@
               </m:sSub>
               <m:r>
                 <w:rPr>
-                  <w:del w:id="20174" w:author="Claude" w:date="2026-10-09T05:44:38Z"/>
                   <w:rFonts w:ascii="Cambria Math" w:hAnsi="Cambria Math" w:cs="Times New Roman"/>
                 </w:rPr>
                 <m:t> </m:t>
@@ -5872,7 +5198,6 @@
                 <m:e>
                   <m:r>
                     <w:rPr>
-                      <w:del w:id="20175" w:author="Claude" w:date="2026-10-09T05:44:38Z"/>
                       <w:rFonts w:ascii="Cambria Math" w:hAnsi="Cambria Math" w:cs="Times New Roman"/>
                     </w:rPr>
                     <m:t>δ</m:t>
@@ -5884,7 +5209,6 @@
                       <m:sty m:val="p"/>
                     </m:rPr>
                     <w:rPr>
-                      <w:del w:id="20176" w:author="Claude" w:date="2026-10-09T05:44:38Z"/>
                       <w:rFonts w:ascii="Cambria Math" w:hAnsi="Cambria Math" w:cs="Times New Roman"/>
                     </w:rPr>
                     <m:t>Γ</m:t>
@@ -5896,7 +5220,6 @@
                   <m:sty m:val="p"/>
                 </m:rPr>
                 <w:rPr>
-                  <w:del w:id="20177" w:author="Claude" w:date="2026-10-09T05:44:38Z"/>
                   <w:rFonts w:ascii="Cambria Math" w:hAnsi="Cambria Math" w:cs="Times New Roman"/>
                 </w:rPr>
                 <m:t>-</m:t>
@@ -5915,14 +5238,12 @@
                       <m:sty m:val="p"/>
                     </m:rPr>
                     <w:rPr>
-                      <w:del w:id="20178" w:author="Claude" w:date="2026-10-09T05:44:38Z"/>
                       <w:rFonts w:ascii="Cambria Math" w:hAnsi="Cambria Math" w:cs="Times New Roman"/>
                     </w:rPr>
                     <m:t>∂</m:t>
                   </m:r>
                   <m:r>
                     <w:rPr>
-                      <w:del w:id="20179" w:author="Claude" w:date="2026-10-09T05:44:38Z"/>
                       <w:rFonts w:ascii="Cambria Math" w:hAnsi="Cambria Math" w:cs="Times New Roman"/>
                     </w:rPr>
                     <m:t>F</m:t>
@@ -5934,14 +5255,12 @@
                       <m:sty m:val="p"/>
                     </m:rPr>
                     <w:rPr>
-                      <w:del w:id="20180" w:author="Claude" w:date="2026-10-09T05:44:38Z"/>
                       <w:rFonts w:ascii="Cambria Math" w:hAnsi="Cambria Math" w:cs="Times New Roman"/>
                     </w:rPr>
                     <m:t>∂</m:t>
                   </m:r>
                   <m:r>
                     <w:rPr>
-                      <w:del w:id="20181" w:author="Claude" w:date="2026-10-09T05:44:38Z"/>
                       <w:rFonts w:ascii="Cambria Math" w:hAnsi="Cambria Math" w:cs="Times New Roman"/>
                     </w:rPr>
                     <m:t>t</m:t>
@@ -5951,188 +5270,6 @@
             </m:e>
           </m:mr>
         </m:m>
-      </m:oMath>
-      <m:oMath>
-        <m:f>
-          <m:num>
-            <m:r>
-              <w:rPr>
-                <w:ins w:id="20131" w:author="Claude" w:date="2026-10-09T05:44:38Z"/>
-              </w:rPr>
-              <m:t xml:space="preserve">∂</m:t>
-            </m:r>
-            <m:sSub>
-              <m:e>
-                <m:r>
-                  <w:rPr>
-                    <w:ins w:id="20132" w:author="Claude" w:date="2026-10-09T05:44:38Z"/>
-                  </w:rPr>
-                  <m:t xml:space="preserve">C</m:t>
-                </m:r>
-              </m:e>
-              <m:sub>
-                <m:r>
-                  <w:rPr>
-                    <w:ins w:id="20133" w:author="Claude" w:date="2026-10-09T05:44:38Z"/>
-                  </w:rPr>
-                  <m:t xml:space="preserve">Zn</m:t>
-                </m:r>
-              </m:sub>
-            </m:sSub>
-          </m:num>
-          <m:den>
-            <m:r>
-              <w:rPr>
-                <w:ins w:id="20134" w:author="Claude" w:date="2026-10-09T05:44:38Z"/>
-              </w:rPr>
-              <m:t xml:space="preserve">∂</m:t>
-            </m:r>
-            <m:r>
-              <w:rPr>
-                <w:ins w:id="20135" w:author="Claude" w:date="2026-10-09T05:44:38Z"/>
-              </w:rPr>
-              <m:t xml:space="preserve">t</m:t>
-            </m:r>
-          </m:den>
-        </m:f>
-        <m:r>
-          <w:rPr>
-            <w:ins w:id="20136" w:author="Claude" w:date="2026-10-09T05:44:38Z"/>
-          </w:rPr>
-          <m:t xml:space="preserve">=∇⋅(</m:t>
-        </m:r>
-        <m:sSup>
-          <m:e>
-            <m:sSub>
-              <m:e>
-                <m:r>
-                  <w:rPr>
-                    <w:ins w:id="20137" w:author="Claude" w:date="2026-10-09T05:44:38Z"/>
-                  </w:rPr>
-                  <m:t xml:space="preserve">D</m:t>
-                </m:r>
-              </m:e>
-              <m:sub>
-                <m:r>
-                  <w:rPr>
-                    <w:ins w:id="20138" w:author="Claude" w:date="2026-10-09T05:44:38Z"/>
-                  </w:rPr>
-                  <m:t xml:space="preserve">Zn</m:t>
-                </m:r>
-              </m:sub>
-            </m:sSub>
-          </m:e>
-          <m:sup>
-            <m:r>
-              <w:rPr>
-                <w:ins w:id="20139" w:author="Claude" w:date="2026-10-09T05:44:38Z"/>
-              </w:rPr>
-              <m:t xml:space="preserve">eff</m:t>
-            </m:r>
-          </m:sup>
-        </m:sSup>
-        <m:r>
-          <w:rPr>
-            <w:ins w:id="20140" w:author="Claude" w:date="2026-10-09T05:44:38Z"/>
-          </w:rPr>
-          <m:t xml:space="preserve">∇</m:t>
-        </m:r>
-        <m:sSub>
-          <m:e>
-            <m:r>
-              <w:rPr>
-                <w:ins w:id="20141" w:author="Claude" w:date="2026-10-09T05:44:38Z"/>
-              </w:rPr>
-              <m:t xml:space="preserve">C</m:t>
-            </m:r>
-          </m:e>
-          <m:sub>
-            <m:r>
-              <w:rPr>
-                <w:ins w:id="20142" w:author="Claude" w:date="2026-10-09T05:44:38Z"/>
-              </w:rPr>
-              <m:t xml:space="preserve">Zn</m:t>
-            </m:r>
-          </m:sub>
-        </m:sSub>
-        <m:r>
-          <w:rPr>
-            <w:ins w:id="20143" w:author="Claude" w:date="2026-10-09T05:44:38Z"/>
-          </w:rPr>
-          <m:t xml:space="preserve">)+2</m:t>
-        </m:r>
-        <m:sSub>
-          <m:e>
-            <m:r>
-              <w:rPr>
-                <w:ins w:id="20144" w:author="Claude" w:date="2026-10-09T05:44:38Z"/>
-              </w:rPr>
-              <m:t xml:space="preserve">j</m:t>
-            </m:r>
-          </m:e>
-          <m:sub>
-            <m:r>
-              <w:rPr>
-                <w:ins w:id="20145" w:author="Claude" w:date="2026-10-09T05:44:38Z"/>
-              </w:rPr>
-              <m:t xml:space="preserve">ORR</m:t>
-            </m:r>
-          </m:sub>
-        </m:sSub>
-        <m:sSub>
-          <m:e>
-            <m:r>
-              <w:rPr>
-                <w:ins w:id="20146" w:author="Claude" w:date="2026-10-09T05:44:38Z"/>
-              </w:rPr>
-              <m:t xml:space="preserve">δ</m:t>
-            </m:r>
-          </m:e>
-          <m:sub>
-            <m:r>
-              <w:rPr>
-                <w:ins w:id="20147" w:author="Claude" w:date="2026-10-09T05:44:38Z"/>
-              </w:rPr>
-              <m:t xml:space="preserve">Γ</m:t>
-            </m:r>
-          </m:sub>
-        </m:sSub>
-        <m:r>
-          <w:rPr>
-            <w:ins w:id="20148" w:author="Claude" w:date="2026-10-09T05:44:38Z"/>
-          </w:rPr>
-          <m:t xml:space="preserve">−</m:t>
-        </m:r>
-        <m:f>
-          <m:num>
-            <m:r>
-              <w:rPr>
-                <w:ins w:id="20149" w:author="Claude" w:date="2026-10-09T05:44:38Z"/>
-              </w:rPr>
-              <m:t xml:space="preserve">∂</m:t>
-            </m:r>
-            <m:r>
-              <w:rPr>
-                <w:ins w:id="20150" w:author="Claude" w:date="2026-10-09T05:44:38Z"/>
-              </w:rPr>
-              <m:t xml:space="preserve">F</m:t>
-            </m:r>
-          </m:num>
-          <m:den>
-            <m:r>
-              <w:rPr>
-                <w:ins w:id="20151" w:author="Claude" w:date="2026-10-09T05:44:38Z"/>
-              </w:rPr>
-              <m:t xml:space="preserve">∂</m:t>
-            </m:r>
-            <m:r>
-              <w:rPr>
-                <w:ins w:id="20152" w:author="Claude" w:date="2026-10-09T05:44:38Z"/>
-              </w:rPr>
-              <m:t xml:space="preserve">t</m:t>
-            </m:r>
-          </m:den>
-        </m:f>
       </m:oMath>
       <w:r>
         <w:rPr>
@@ -6200,7 +5337,6 @@
                       <m:sty m:val="p"/>
                     </m:rPr>
                     <w:rPr>
-                      <w:del w:id="20204" w:author="Claude" w:date="2026-10-09T05:44:38Z"/>
                       <w:rFonts w:ascii="Cambria Math" w:hAnsi="Cambria Math" w:cs="Times New Roman"/>
                     </w:rPr>
                     <m:t>∂</m:t>
@@ -6216,7 +5352,6 @@
                     <m:e>
                       <m:r>
                         <w:rPr>
-                          <w:del w:id="20205" w:author="Claude" w:date="2026-10-09T05:44:38Z"/>
                           <w:rFonts w:ascii="Cambria Math" w:hAnsi="Cambria Math" w:cs="Times New Roman"/>
                         </w:rPr>
                         <m:t>C</m:t>
@@ -6228,7 +5363,6 @@
                           <m:sty m:val="p"/>
                         </m:rPr>
                         <w:rPr>
-                          <w:del w:id="20206" w:author="Claude" w:date="2026-10-09T05:44:38Z"/>
                           <w:rFonts w:ascii="Cambria Math" w:hAnsi="Cambria Math" w:cs="Times New Roman"/>
                         </w:rPr>
                         <m:t>OH</m:t>
@@ -6242,14 +5376,12 @@
                       <m:sty m:val="p"/>
                     </m:rPr>
                     <w:rPr>
-                      <w:del w:id="20207" w:author="Claude" w:date="2026-10-09T05:44:38Z"/>
                       <w:rFonts w:ascii="Cambria Math" w:hAnsi="Cambria Math" w:cs="Times New Roman"/>
                     </w:rPr>
                     <m:t>∂</m:t>
                   </m:r>
                   <m:r>
                     <w:rPr>
-                      <w:del w:id="20208" w:author="Claude" w:date="2026-10-09T05:44:38Z"/>
                       <w:rFonts w:ascii="Cambria Math" w:hAnsi="Cambria Math" w:cs="Times New Roman"/>
                     </w:rPr>
                     <m:t>t</m:t>
@@ -6261,7 +5393,6 @@
                   <m:sty m:val="p"/>
                 </m:rPr>
                 <w:rPr>
-                  <w:del w:id="20209" w:author="Claude" w:date="2026-10-09T05:44:38Z"/>
                   <w:rFonts w:ascii="Cambria Math" w:hAnsi="Cambria Math" w:cs="Times New Roman"/>
                 </w:rPr>
                 <m:t>=∇⋅</m:t>
@@ -6286,7 +5417,6 @@
                     <m:e>
                       <m:r>
                         <w:rPr>
-                          <w:del w:id="20210" w:author="Claude" w:date="2026-10-09T05:44:38Z"/>
                           <w:rFonts w:ascii="Cambria Math" w:hAnsi="Cambria Math" w:cs="Times New Roman"/>
                         </w:rPr>
                         <m:t>D</m:t>
@@ -6298,7 +5428,6 @@
                           <m:sty m:val="p"/>
                         </m:rPr>
                         <w:rPr>
-                          <w:del w:id="20211" w:author="Claude" w:date="2026-10-09T05:44:38Z"/>
                           <w:rFonts w:ascii="Cambria Math" w:hAnsi="Cambria Math" w:cs="Times New Roman"/>
                         </w:rPr>
                         <m:t>OH</m:t>
@@ -6310,7 +5439,6 @@
                           <m:nor/>
                         </m:rPr>
                         <w:rPr>
-                          <w:del w:id="20212" w:author="Claude" w:date="2026-10-09T05:44:38Z"/>
                           <w:rFonts w:cs="Times New Roman"/>
                         </w:rPr>
                         <m:t>eff</m:t>
@@ -6319,7 +5447,6 @@
                   </m:sSubSup>
                   <m:r>
                     <w:rPr>
-                      <w:del w:id="20213" w:author="Claude" w:date="2026-10-09T05:44:38Z"/>
                       <w:rFonts w:ascii="Cambria Math" w:hAnsi="Cambria Math" w:cs="Times New Roman"/>
                     </w:rPr>
                     <m:t> </m:t>
@@ -6329,7 +5456,6 @@
                       <m:sty m:val="p"/>
                     </m:rPr>
                     <w:rPr>
-                      <w:del w:id="20214" w:author="Claude" w:date="2026-10-09T05:44:38Z"/>
                       <w:rFonts w:ascii="Cambria Math" w:hAnsi="Cambria Math" w:cs="Times New Roman"/>
                     </w:rPr>
                     <m:t>∇</m:t>
@@ -6345,7 +5471,6 @@
                     <m:e>
                       <m:r>
                         <w:rPr>
-                          <w:del w:id="20215" w:author="Claude" w:date="2026-10-09T05:44:38Z"/>
                           <w:rFonts w:ascii="Cambria Math" w:hAnsi="Cambria Math" w:cs="Times New Roman"/>
                         </w:rPr>
                         <m:t>C</m:t>
@@ -6357,7 +5482,6 @@
                           <m:sty m:val="p"/>
                         </m:rPr>
                         <w:rPr>
-                          <w:del w:id="20216" w:author="Claude" w:date="2026-10-09T05:44:38Z"/>
                           <w:rFonts w:ascii="Cambria Math" w:hAnsi="Cambria Math" w:cs="Times New Roman"/>
                         </w:rPr>
                         <m:t>OH</m:t>
@@ -6371,14 +5495,12 @@
                   <m:sty m:val="p"/>
                 </m:rPr>
                 <w:rPr>
-                  <w:del w:id="20217" w:author="Claude" w:date="2026-10-09T05:44:38Z"/>
                   <w:rFonts w:ascii="Cambria Math" w:hAnsi="Cambria Math" w:cs="Times New Roman"/>
                 </w:rPr>
                 <m:t>+</m:t>
               </m:r>
               <m:r>
                 <w:rPr>
-                  <w:del w:id="20218" w:author="Claude" w:date="2026-10-09T05:44:38Z"/>
                   <w:rFonts w:ascii="Cambria Math" w:hAnsi="Cambria Math" w:cs="Times New Roman"/>
                 </w:rPr>
                 <m:t>4 </m:t>
@@ -6394,7 +5516,6 @@
                 <m:e>
                   <m:r>
                     <w:rPr>
-                      <w:del w:id="20219" w:author="Claude" w:date="2026-10-09T05:44:38Z"/>
                       <w:rFonts w:ascii="Cambria Math" w:hAnsi="Cambria Math" w:cs="Times New Roman"/>
                     </w:rPr>
                     <m:t>k</m:t>
@@ -6406,7 +5527,6 @@
                       <m:sty m:val="p"/>
                     </m:rPr>
                     <w:rPr>
-                      <w:del w:id="20220" w:author="Claude" w:date="2026-10-09T05:44:38Z"/>
                       <w:rFonts w:ascii="Cambria Math" w:hAnsi="Cambria Math" w:cs="Times New Roman"/>
                     </w:rPr>
                     <m:t>ORR</m:t>
@@ -6415,17 +5535,9 @@
               </m:sSub>
               <m:r>
                 <w:rPr>
-                  <w:del w:id="20221" w:author="Claude" w:date="2026-10-09T05:44:38Z"/>
                   <w:rFonts w:ascii="Cambria Math" w:hAnsi="Cambria Math"/>
                 </w:rPr>
-                <m:t>κ</m:t>
-              </m:r>
-              <m:r>
-                <w:rPr>
-                  <w:del w:id="20222" w:author="Claude" w:date="2026-10-09T05:44:38Z"/>
-                  <w:rFonts w:ascii="Cambria Math" w:hAnsi="Cambria Math" w:cs="Times New Roman"/>
-                </w:rPr>
-                <m:t> </m:t>
+                <m:t xml:space="preserve"> </m:t>
               </m:r>
               <m:sSub>
                 <m:sSubPr>
@@ -6438,7 +5550,6 @@
                 <m:e>
                   <m:r>
                     <w:rPr>
-                      <w:del w:id="20223" w:author="Claude" w:date="2026-10-09T05:44:38Z"/>
                       <w:rFonts w:ascii="Cambria Math" w:hAnsi="Cambria Math" w:cs="Times New Roman"/>
                     </w:rPr>
                     <m:t>C</m:t>
@@ -6459,7 +5570,6 @@
                           <m:sty m:val="p"/>
                         </m:rPr>
                         <w:rPr>
-                          <w:del w:id="20224" w:author="Claude" w:date="2026-10-09T05:44:38Z"/>
                           <w:rFonts w:ascii="Cambria Math" w:hAnsi="Cambria Math" w:cs="Times New Roman"/>
                         </w:rPr>
                         <m:t>O</m:t>
@@ -6471,7 +5581,6 @@
                           <m:sty m:val="p"/>
                         </m:rPr>
                         <w:rPr>
-                          <w:del w:id="20225" w:author="Claude" w:date="2026-10-09T05:44:38Z"/>
                           <w:rFonts w:ascii="Cambria Math" w:hAnsi="Cambria Math" w:cs="Times New Roman"/>
                         </w:rPr>
                         <m:t>2</m:t>
@@ -6482,7 +5591,6 @@
               </m:sSub>
               <m:r>
                 <w:rPr>
-                  <w:del w:id="20226" w:author="Claude" w:date="2026-10-09T05:44:38Z"/>
                   <w:rFonts w:ascii="Cambria Math" w:hAnsi="Cambria Math" w:cs="Times New Roman"/>
                 </w:rPr>
                 <m:t> </m:t>
@@ -6498,7 +5606,6 @@
                 <m:e>
                   <m:r>
                     <w:rPr>
-                      <w:del w:id="20227" w:author="Claude" w:date="2026-10-09T05:44:38Z"/>
                       <w:rFonts w:ascii="Cambria Math" w:hAnsi="Cambria Math" w:cs="Times New Roman"/>
                     </w:rPr>
                     <m:t>δ</m:t>
@@ -6510,7 +5617,6 @@
                       <m:sty m:val="p"/>
                     </m:rPr>
                     <w:rPr>
-                      <w:del w:id="20228" w:author="Claude" w:date="2026-10-09T05:44:38Z"/>
                       <w:rFonts w:ascii="Cambria Math" w:hAnsi="Cambria Math" w:cs="Times New Roman"/>
                     </w:rPr>
                     <m:t>Γ</m:t>
@@ -6519,7 +5625,6 @@
               </m:sSub>
               <m:r>
                 <w:rPr>
-                  <w:del w:id="20229" w:author="Claude" w:date="2026-10-09T05:44:38Z"/>
                   <w:rFonts w:ascii="Cambria Math" w:hAnsi="Cambria Math" w:cs="Times New Roman"/>
                 </w:rPr>
                 <m:t>-2</m:t>
@@ -6538,14 +5643,12 @@
                       <m:sty m:val="p"/>
                     </m:rPr>
                     <w:rPr>
-                      <w:del w:id="20230" w:author="Claude" w:date="2026-10-09T05:44:38Z"/>
                       <w:rFonts w:ascii="Cambria Math" w:hAnsi="Cambria Math" w:cs="Times New Roman"/>
                     </w:rPr>
                     <m:t>∂</m:t>
                   </m:r>
                   <m:r>
                     <w:rPr>
-                      <w:del w:id="20231" w:author="Claude" w:date="2026-10-09T05:44:38Z"/>
                       <w:rFonts w:ascii="Cambria Math" w:hAnsi="Cambria Math" w:cs="Times New Roman"/>
                     </w:rPr>
                     <m:t>F</m:t>
@@ -6557,14 +5660,12 @@
                       <m:sty m:val="p"/>
                     </m:rPr>
                     <w:rPr>
-                      <w:del w:id="20232" w:author="Claude" w:date="2026-10-09T05:44:38Z"/>
                       <w:rFonts w:ascii="Cambria Math" w:hAnsi="Cambria Math" w:cs="Times New Roman"/>
                     </w:rPr>
                     <m:t>∂</m:t>
                   </m:r>
                   <m:r>
                     <w:rPr>
-                      <w:del w:id="20233" w:author="Claude" w:date="2026-10-09T05:44:38Z"/>
                       <w:rFonts w:ascii="Cambria Math" w:hAnsi="Cambria Math" w:cs="Times New Roman"/>
                     </w:rPr>
                     <m:t>t</m:t>
@@ -6574,188 +5675,6 @@
             </m:e>
           </m:mr>
         </m:m>
-      </m:oMath>
-      <m:oMath>
-        <m:f>
-          <m:num>
-            <m:r>
-              <w:rPr>
-                <w:ins w:id="20182" w:author="Claude" w:date="2026-10-09T05:44:38Z"/>
-              </w:rPr>
-              <m:t xml:space="preserve">∂</m:t>
-            </m:r>
-            <m:sSub>
-              <m:e>
-                <m:r>
-                  <w:rPr>
-                    <w:ins w:id="20183" w:author="Claude" w:date="2026-10-09T05:44:38Z"/>
-                  </w:rPr>
-                  <m:t xml:space="preserve">C</m:t>
-                </m:r>
-              </m:e>
-              <m:sub>
-                <m:r>
-                  <w:rPr>
-                    <w:ins w:id="20184" w:author="Claude" w:date="2026-10-09T05:44:38Z"/>
-                  </w:rPr>
-                  <m:t xml:space="preserve">OH</m:t>
-                </m:r>
-              </m:sub>
-            </m:sSub>
-          </m:num>
-          <m:den>
-            <m:r>
-              <w:rPr>
-                <w:ins w:id="20185" w:author="Claude" w:date="2026-10-09T05:44:38Z"/>
-              </w:rPr>
-              <m:t xml:space="preserve">∂</m:t>
-            </m:r>
-            <m:r>
-              <w:rPr>
-                <w:ins w:id="20186" w:author="Claude" w:date="2026-10-09T05:44:38Z"/>
-              </w:rPr>
-              <m:t xml:space="preserve">t</m:t>
-            </m:r>
-          </m:den>
-        </m:f>
-        <m:r>
-          <w:rPr>
-            <w:ins w:id="20187" w:author="Claude" w:date="2026-10-09T05:44:38Z"/>
-          </w:rPr>
-          <m:t xml:space="preserve">=∇⋅(</m:t>
-        </m:r>
-        <m:sSup>
-          <m:e>
-            <m:sSub>
-              <m:e>
-                <m:r>
-                  <w:rPr>
-                    <w:ins w:id="20188" w:author="Claude" w:date="2026-10-09T05:44:38Z"/>
-                  </w:rPr>
-                  <m:t xml:space="preserve">D</m:t>
-                </m:r>
-              </m:e>
-              <m:sub>
-                <m:r>
-                  <w:rPr>
-                    <w:ins w:id="20189" w:author="Claude" w:date="2026-10-09T05:44:38Z"/>
-                  </w:rPr>
-                  <m:t xml:space="preserve">OH</m:t>
-                </m:r>
-              </m:sub>
-            </m:sSub>
-          </m:e>
-          <m:sup>
-            <m:r>
-              <w:rPr>
-                <w:ins w:id="20190" w:author="Claude" w:date="2026-10-09T05:44:38Z"/>
-              </w:rPr>
-              <m:t xml:space="preserve">eff</m:t>
-            </m:r>
-          </m:sup>
-        </m:sSup>
-        <m:r>
-          <w:rPr>
-            <w:ins w:id="20191" w:author="Claude" w:date="2026-10-09T05:44:38Z"/>
-          </w:rPr>
-          <m:t xml:space="preserve">∇</m:t>
-        </m:r>
-        <m:sSub>
-          <m:e>
-            <m:r>
-              <w:rPr>
-                <w:ins w:id="20192" w:author="Claude" w:date="2026-10-09T05:44:38Z"/>
-              </w:rPr>
-              <m:t xml:space="preserve">C</m:t>
-            </m:r>
-          </m:e>
-          <m:sub>
-            <m:r>
-              <w:rPr>
-                <w:ins w:id="20193" w:author="Claude" w:date="2026-10-09T05:44:38Z"/>
-              </w:rPr>
-              <m:t xml:space="preserve">OH</m:t>
-            </m:r>
-          </m:sub>
-        </m:sSub>
-        <m:r>
-          <w:rPr>
-            <w:ins w:id="20194" w:author="Claude" w:date="2026-10-09T05:44:38Z"/>
-          </w:rPr>
-          <m:t xml:space="preserve">)+4</m:t>
-        </m:r>
-        <m:sSub>
-          <m:e>
-            <m:r>
-              <w:rPr>
-                <w:ins w:id="20195" w:author="Claude" w:date="2026-10-09T05:44:38Z"/>
-              </w:rPr>
-              <m:t xml:space="preserve">j</m:t>
-            </m:r>
-          </m:e>
-          <m:sub>
-            <m:r>
-              <w:rPr>
-                <w:ins w:id="20196" w:author="Claude" w:date="2026-10-09T05:44:38Z"/>
-              </w:rPr>
-              <m:t xml:space="preserve">ORR</m:t>
-            </m:r>
-          </m:sub>
-        </m:sSub>
-        <m:sSub>
-          <m:e>
-            <m:r>
-              <w:rPr>
-                <w:ins w:id="20197" w:author="Claude" w:date="2026-10-09T05:44:38Z"/>
-              </w:rPr>
-              <m:t xml:space="preserve">δ</m:t>
-            </m:r>
-          </m:e>
-          <m:sub>
-            <m:r>
-              <w:rPr>
-                <w:ins w:id="20198" w:author="Claude" w:date="2026-10-09T05:44:38Z"/>
-              </w:rPr>
-              <m:t xml:space="preserve">Γ</m:t>
-            </m:r>
-          </m:sub>
-        </m:sSub>
-        <m:r>
-          <w:rPr>
-            <w:ins w:id="20199" w:author="Claude" w:date="2026-10-09T05:44:38Z"/>
-          </w:rPr>
-          <m:t xml:space="preserve">−2</m:t>
-        </m:r>
-        <m:f>
-          <m:num>
-            <m:r>
-              <w:rPr>
-                <w:ins w:id="20200" w:author="Claude" w:date="2026-10-09T05:44:38Z"/>
-              </w:rPr>
-              <m:t xml:space="preserve">∂</m:t>
-            </m:r>
-            <m:r>
-              <w:rPr>
-                <w:ins w:id="20201" w:author="Claude" w:date="2026-10-09T05:44:38Z"/>
-              </w:rPr>
-              <m:t xml:space="preserve">F</m:t>
-            </m:r>
-          </m:num>
-          <m:den>
-            <m:r>
-              <w:rPr>
-                <w:ins w:id="20202" w:author="Claude" w:date="2026-10-09T05:44:38Z"/>
-              </w:rPr>
-              <m:t xml:space="preserve">∂</m:t>
-            </m:r>
-            <m:r>
-              <w:rPr>
-                <w:ins w:id="20203" w:author="Claude" w:date="2026-10-09T05:44:38Z"/>
-              </w:rPr>
-              <m:t xml:space="preserve">t</m:t>
-            </m:r>
-          </m:den>
-        </m:f>
       </m:oMath>
       <w:r>
         <w:rPr>
@@ -6827,15 +5746,7 @@
         <w:t>the</w:t>
       </w:r>
       <w:r>
-        <w:t xml:space="preserve"> balance between </w:t>
-      </w:r>
-      <w:proofErr w:type="spellStart"/>
-      <w:r>
-        <w:t>ZnO</w:t>
-      </w:r>
-      <w:proofErr w:type="spellEnd"/>
-      <w:r>
-        <w:t xml:space="preserve"> precipitation and chloride-mediated dissolution</w:t>
+        <w:t xml:space="preserve"> balance between ZnO precipitation and chloride-mediated dissolution</w:t>
       </w:r>
       <w:r>
         <w:t xml:space="preserve"> as follows</w:t>
@@ -8243,11 +7154,7 @@
         <w:pStyle w:val="BodyText"/>
       </w:pPr>
       <w:r>
-        <w:t xml:space="preserve">where </w:t>
-      </w:r>
-      <w:proofErr w:type="spellStart"/>
-      <w:r>
-        <w:t>v</w:t>
+        <w:t>where v</w:t>
       </w:r>
       <w:r>
         <w:rPr>
@@ -8255,7 +7162,6 @@
         </w:rPr>
         <w:t>n</w:t>
       </w:r>
-      <w:proofErr w:type="spellEnd"/>
       <w:r>
         <w:t xml:space="preserve"> is the normal interface velocity, negative for recession. </w:t>
       </w:r>
@@ -8272,11 +7178,7 @@
         <w:t>sol</w:t>
       </w:r>
       <w:r>
-        <w:t xml:space="preserve"> = </w:t>
-      </w:r>
-      <w:proofErr w:type="spellStart"/>
-      <w:r>
-        <w:t>ρ</w:t>
+        <w:t xml:space="preserve"> = ρ</w:t>
       </w:r>
       <w:r>
         <w:rPr>
@@ -8284,13 +7186,8 @@
         </w:rPr>
         <w:t>Zn</w:t>
       </w:r>
-      <w:proofErr w:type="spellEnd"/>
-      <w:r>
-        <w:t>/</w:t>
-      </w:r>
-      <w:proofErr w:type="spellStart"/>
-      <w:r>
-        <w:t>M</w:t>
+      <w:r>
+        <w:t>/M</w:t>
       </w:r>
       <w:r>
         <w:rPr>
@@ -8298,7 +7195,6 @@
         </w:rPr>
         <w:t>Zn</w:t>
       </w:r>
-      <w:proofErr w:type="spellEnd"/>
       <w:r>
         <w:t>​, yields:</w:t>
       </w:r>
@@ -8327,7 +7223,7 @@
           <m:e>
             <m:r>
               <w:rPr>
-                <w:del w:id="20242" w:author="Claude" w:date="2026-10-09T05:44:38Z"/>
+                <w:del w:id="20020" w:author="Claude" w:date="2026-10-09T06:27:45Z"/>
                 <w:rFonts w:ascii="Cambria Math" w:hAnsi="Cambria Math" w:cs="Times New Roman"/>
               </w:rPr>
               <m:t>v</m:t>
@@ -8339,7 +7235,7 @@
                 <m:sty m:val="p"/>
               </m:rPr>
               <w:rPr>
-                <w:del w:id="20243" w:author="Claude" w:date="2026-10-09T05:44:38Z"/>
+                <w:del w:id="20021" w:author="Claude" w:date="2026-10-09T06:27:45Z"/>
                 <w:rFonts w:ascii="Cambria Math" w:hAnsi="Cambria Math" w:cs="Times New Roman"/>
               </w:rPr>
               <m:t>n</m:t>
@@ -8351,7 +7247,7 @@
             <m:sty m:val="p"/>
           </m:rPr>
           <w:rPr>
-            <w:del w:id="20244" w:author="Claude" w:date="2026-10-09T05:44:38Z"/>
+            <w:del w:id="20022" w:author="Claude" w:date="2026-10-09T06:27:45Z"/>
             <w:rFonts w:ascii="Cambria Math" w:hAnsi="Cambria Math" w:cs="Times New Roman"/>
           </w:rPr>
           <m:t>=-</m:t>
@@ -8367,7 +7263,7 @@
           <m:num>
             <m:r>
               <w:rPr>
-                <w:del w:id="20245" w:author="Claude" w:date="2026-10-09T05:44:38Z"/>
+                <w:del w:id="20023" w:author="Claude" w:date="2026-10-09T06:27:45Z"/>
                 <w:rFonts w:ascii="Cambria Math" w:hAnsi="Cambria Math" w:cs="Times New Roman"/>
               </w:rPr>
               <m:t>2 </m:t>
@@ -8383,7 +7279,7 @@
               <m:e>
                 <m:r>
                   <w:rPr>
-                    <w:del w:id="20246" w:author="Claude" w:date="2026-10-09T05:44:38Z"/>
+                    <w:del w:id="20024" w:author="Claude" w:date="2026-10-09T06:27:45Z"/>
                     <w:rFonts w:ascii="Cambria Math" w:hAnsi="Cambria Math" w:cs="Times New Roman"/>
                   </w:rPr>
                   <m:t>k</m:t>
@@ -8395,7 +7291,7 @@
                     <m:sty m:val="p"/>
                   </m:rPr>
                   <w:rPr>
-                    <w:del w:id="20247" w:author="Claude" w:date="2026-10-09T05:44:38Z"/>
+                    <w:del w:id="20025" w:author="Claude" w:date="2026-10-09T06:27:45Z"/>
                     <w:rFonts w:ascii="Cambria Math" w:hAnsi="Cambria Math" w:cs="Times New Roman"/>
                   </w:rPr>
                   <m:t>ORR</m:t>
@@ -8404,14 +7300,14 @@
             </m:sSub>
             <m:r>
               <w:rPr>
-                <w:del w:id="20248" w:author="Claude" w:date="2026-10-09T05:44:38Z"/>
+                <w:del w:id="20026" w:author="Claude" w:date="2026-10-09T06:27:45Z"/>
                 <w:rFonts w:ascii="Cambria Math" w:hAnsi="Cambria Math" w:cs="Times New Roman"/>
               </w:rPr>
               <m:t> </m:t>
             </m:r>
             <m:r>
               <w:rPr>
-                <w:del w:id="20249" w:author="Claude" w:date="2026-10-09T05:44:38Z"/>
+                <w:del w:id="20027" w:author="Claude" w:date="2026-10-09T06:27:45Z"/>
                 <w:rFonts w:ascii="Cambria Math" w:hAnsi="Cambria Math"/>
               </w:rPr>
               <m:t>κ</m:t>
@@ -8428,7 +7324,7 @@
               <m:e>
                 <m:r>
                   <w:rPr>
-                    <w:del w:id="20250" w:author="Claude" w:date="2026-10-09T05:44:38Z"/>
+                    <w:del w:id="20028" w:author="Claude" w:date="2026-10-09T06:27:45Z"/>
                     <w:rFonts w:ascii="Cambria Math" w:hAnsi="Cambria Math"/>
                   </w:rPr>
                   <m:t>F</m:t>
@@ -8437,7 +7333,7 @@
             </m:d>
             <m:r>
               <w:rPr>
-                <w:del w:id="20251" w:author="Claude" w:date="2026-10-09T05:44:38Z"/>
+                <w:del w:id="20029" w:author="Claude" w:date="2026-10-09T06:27:45Z"/>
                 <w:rFonts w:ascii="Cambria Math" w:hAnsi="Cambria Math"/>
               </w:rPr>
               <m:t xml:space="preserve"> </m:t>
@@ -8453,7 +7349,7 @@
               <m:e>
                 <m:r>
                   <w:rPr>
-                    <w:del w:id="20252" w:author="Claude" w:date="2026-10-09T05:44:38Z"/>
+                    <w:del w:id="20030" w:author="Claude" w:date="2026-10-09T06:27:45Z"/>
                     <w:rFonts w:ascii="Cambria Math" w:hAnsi="Cambria Math" w:cs="Times New Roman"/>
                   </w:rPr>
                   <m:t>C</m:t>
@@ -8474,7 +7370,7 @@
                         <m:sty m:val="p"/>
                       </m:rPr>
                       <w:rPr>
-                        <w:del w:id="20253" w:author="Claude" w:date="2026-10-09T05:44:38Z"/>
+                        <w:del w:id="20031" w:author="Claude" w:date="2026-10-09T06:27:45Z"/>
                         <w:rFonts w:ascii="Cambria Math" w:hAnsi="Cambria Math" w:cs="Times New Roman"/>
                       </w:rPr>
                       <m:t>O</m:t>
@@ -8486,7 +7382,7 @@
                         <m:sty m:val="p"/>
                       </m:rPr>
                       <w:rPr>
-                        <w:del w:id="20254" w:author="Claude" w:date="2026-10-09T05:44:38Z"/>
+                        <w:del w:id="20032" w:author="Claude" w:date="2026-10-09T06:27:45Z"/>
                         <w:rFonts w:ascii="Cambria Math" w:hAnsi="Cambria Math" w:cs="Times New Roman"/>
                       </w:rPr>
                       <m:t>2</m:t>
@@ -8509,7 +7405,7 @@
                     <m:sty m:val="p"/>
                   </m:rPr>
                   <w:rPr>
-                    <w:del w:id="20255" w:author="Claude" w:date="2026-10-09T05:44:38Z"/>
+                    <w:del w:id="20033" w:author="Claude" w:date="2026-10-09T06:27:45Z"/>
                     <w:rFonts w:ascii="Cambria Math" w:hAnsi="Cambria Math" w:cs="Times New Roman"/>
                   </w:rPr>
                   <m:t>|</m:t>
@@ -8521,7 +7417,7 @@
                     <m:sty m:val="p"/>
                   </m:rPr>
                   <w:rPr>
-                    <w:del w:id="20256" w:author="Claude" w:date="2026-10-09T05:44:38Z"/>
+                    <w:del w:id="20034" w:author="Claude" w:date="2026-10-09T06:27:45Z"/>
                     <w:rFonts w:ascii="Cambria Math" w:hAnsi="Cambria Math" w:cs="Times New Roman"/>
                   </w:rPr>
                   <m:t>Γ</m:t>
@@ -8535,7 +7431,7 @@
                 <m:sty m:val="p"/>
               </m:rPr>
               <w:rPr>
-                <w:del w:id="20257" w:author="Claude" w:date="2026-10-09T05:44:38Z"/>
+                <w:del w:id="20035" w:author="Claude" w:date="2026-10-09T06:27:45Z"/>
                 <w:rFonts w:ascii="Cambria Math" w:hAnsi="Cambria Math" w:cs="Times New Roman"/>
               </w:rPr>
               <m:t>[Zn</m:t>
@@ -8554,7 +7450,7 @@
                     <m:sty m:val="p"/>
                   </m:rPr>
                   <w:rPr>
-                    <w:del w:id="20258" w:author="Claude" w:date="2026-10-09T05:44:38Z"/>
+                    <w:del w:id="20036" w:author="Claude" w:date="2026-10-09T06:27:45Z"/>
                     <w:rFonts w:ascii="Cambria Math" w:hAnsi="Cambria Math" w:cs="Times New Roman"/>
                   </w:rPr>
                   <m:t>]</m:t>
@@ -8566,7 +7462,7 @@
                     <m:sty m:val="p"/>
                   </m:rPr>
                   <w:rPr>
-                    <w:del w:id="20259" w:author="Claude" w:date="2026-10-09T05:44:38Z"/>
+                    <w:del w:id="20037" w:author="Claude" w:date="2026-10-09T06:27:45Z"/>
                     <w:rFonts w:ascii="Cambria Math" w:hAnsi="Cambria Math" w:cs="Times New Roman"/>
                   </w:rPr>
                   <m:t>sol</m:t>
@@ -8581,7 +7477,7 @@
           <m:e>
             <m:r>
               <w:rPr>
-                <w:ins w:id="20234" w:author="Claude" w:date="2026-10-09T05:44:38Z"/>
+                <w:ins w:id="20009" w:author="Claude" w:date="2026-10-09T06:27:45Z"/>
               </w:rPr>
               <m:t xml:space="preserve">v</m:t>
             </m:r>
@@ -8589,7 +7485,7 @@
           <m:sub>
             <m:r>
               <w:rPr>
-                <w:ins w:id="20235" w:author="Claude" w:date="2026-10-09T05:44:38Z"/>
+                <w:ins w:id="20010" w:author="Claude" w:date="2026-10-09T06:27:45Z"/>
               </w:rPr>
               <m:t xml:space="preserve">n</m:t>
             </m:r>
@@ -8597,7 +7493,7 @@
         </m:sSub>
         <m:r>
           <w:rPr>
-            <w:ins w:id="20236" w:author="Claude" w:date="2026-10-09T05:44:38Z"/>
+            <w:ins w:id="20011" w:author="Claude" w:date="2026-10-09T06:27:45Z"/>
           </w:rPr>
           <m:t xml:space="preserve">=−</m:t>
         </m:r>
@@ -8605,7 +7501,7 @@
           <m:num>
             <m:r>
               <w:rPr>
-                <w:ins w:id="20237" w:author="Claude" w:date="2026-10-09T05:44:38Z"/>
+                <w:ins w:id="20012" w:author="Claude" w:date="2026-10-09T06:27:45Z"/>
               </w:rPr>
               <m:t xml:space="preserve">2</m:t>
             </m:r>
@@ -8613,27 +7509,51 @@
               <m:e>
                 <m:r>
                   <w:rPr>
-                    <w:ins w:id="20238" w:author="Claude" w:date="2026-10-09T05:44:38Z"/>
+                    <w:ins w:id="20013" w:author="Claude" w:date="2026-10-09T06:27:45Z"/>
                   </w:rPr>
-                  <m:t xml:space="preserve">j</m:t>
+                  <m:t xml:space="preserve">k</m:t>
                 </m:r>
               </m:e>
               <m:sub>
                 <m:r>
                   <w:rPr>
-                    <w:ins w:id="20239" w:author="Claude" w:date="2026-10-09T05:44:38Z"/>
+                    <w:ins w:id="20014" w:author="Claude" w:date="2026-10-09T06:27:45Z"/>
                   </w:rPr>
                   <m:t xml:space="preserve">ORR</m:t>
                 </m:r>
               </m:sub>
             </m:sSub>
+            <m:sSub>
+              <m:e>
+                <m:r>
+                  <w:rPr>
+                    <w:ins w:id="20015" w:author="Claude" w:date="2026-10-09T06:27:45Z"/>
+                  </w:rPr>
+                  <m:t xml:space="preserve">C</m:t>
+                </m:r>
+              </m:e>
+              <m:sub>
+                <m:r>
+                  <w:rPr>
+                    <w:ins w:id="20016" w:author="Claude" w:date="2026-10-09T06:27:45Z"/>
+                  </w:rPr>
+                  <m:t xml:space="preserve">O₂</m:t>
+                </m:r>
+              </m:sub>
+            </m:sSub>
+            <m:r>
+              <w:rPr>
+                <w:ins w:id="20017" w:author="Claude" w:date="2026-10-09T06:27:45Z"/>
+              </w:rPr>
+              <m:t xml:space="preserve">|Γ</m:t>
+            </m:r>
           </m:num>
           <m:den>
             <m:sSub>
               <m:e>
                 <m:r>
                   <w:rPr>
-                    <w:ins w:id="20240" w:author="Claude" w:date="2026-10-09T05:44:38Z"/>
+                    <w:ins w:id="20018" w:author="Claude" w:date="2026-10-09T06:27:45Z"/>
                   </w:rPr>
                   <m:t xml:space="preserve">[Zn]</m:t>
                 </m:r>
@@ -8641,7 +7561,7 @@
               <m:sub>
                 <m:r>
                   <w:rPr>
-                    <w:ins w:id="20241" w:author="Claude" w:date="2026-10-09T05:44:38Z"/>
+                    <w:ins w:id="20019" w:author="Claude" w:date="2026-10-09T06:27:45Z"/>
                   </w:rPr>
                   <m:t xml:space="preserve">sol</m:t>
                 </m:r>
@@ -8673,254 +7593,144 @@
     <w:p>
       <w:pPr>
         <w:pStyle w:val="BodyText"/>
-        <w:rPr>
-          <w:del w:id="20291" w:author="Claude" w:date="2026-10-09T05:44:38Z"/>
-        </w:rPr>
-      </w:pPr>
-      <w:del w:id="20260" w:author="Claude" w:date="2026-10-09T05:44:38Z">
-        <w:r>
-          <w:delText xml:space="preserve">where C</w:delText>
-        </w:r>
-      </w:del>
-      <w:del w:id="20261" w:author="Claude" w:date="2026-10-09T05:44:38Z">
-        <w:r>
-          <w:rPr>
-            <w:vertAlign w:val="subscript"/>
-          </w:rPr>
-          <w:delText xml:space="preserve">O2</w:delText>
-        </w:r>
-      </w:del>
-      <w:del w:id="20262" w:author="Claude" w:date="2026-10-09T05:44:38Z">
-        <w:r>
-          <w:delText xml:space="preserve">|</w:delText>
-        </w:r>
-      </w:del>
-      <w:del w:id="20263" w:author="Claude" w:date="2026-10-09T05:44:38Z">
-        <w:r>
-          <w:rPr>
-            <w:vertAlign w:val="subscript"/>
-          </w:rPr>
-          <w:delText xml:space="preserve">Γ</w:delText>
-        </w:r>
-      </w:del>
-      <w:del w:id="20264" w:author="Claude" w:date="2026-10-09T05:44:38Z">
-        <w:r>
-          <w:delText xml:space="preserve"> is the oxygen concentration at the interface (mol L</w:delText>
-        </w:r>
-      </w:del>
-      <w:del w:id="20265" w:author="Claude" w:date="2026-10-09T05:44:38Z">
-        <w:r>
-          <w:rPr>
-            <w:vertAlign w:val="superscript"/>
-          </w:rPr>
-          <w:delText xml:space="preserve">-1</w:delText>
-        </w:r>
-      </w:del>
-      <w:del w:id="20266" w:author="Claude" w:date="2026-10-09T05:44:38Z">
-        <w:r>
-          <w:delText xml:space="preserve">)</w:delText>
-        </w:r>
-      </w:del>
-      <w:del w:id="20267" w:author="Claude" w:date="2026-10-09T05:44:38Z">
-        <w:r>
-          <w:delText xml:space="preserve">. </w:delText>
-        </w:r>
-      </w:del>
-      <w:del w:id="20268" w:author="Claude" w:date="2026-10-09T05:44:38Z">
-        <w:r>
-          <w:delText xml:space="preserve">Oxygen-transport limitation is incorporated implicitly through the Robin boundary condition</w:delText>
-        </w:r>
-      </w:del>
-      <w:del w:id="20269" w:author="Claude" w:date="2026-10-09T05:44:38Z">
-        <w:r>
-          <w:delText xml:space="preserve"> </w:delText>
-        </w:r>
-      </w:del>
-      <w:del w:id="20270" w:author="Claude" w:date="2026-10-09T05:44:38Z">
-        <w:r>
-          <w:rPr>
-            <w:b/>
-            <w:bCs/>
-          </w:rPr>
-          <w:delText xml:space="preserve">(</w:delText>
-        </w:r>
-      </w:del>
-      <w:del w:id="20271" w:author="Claude" w:date="2026-10-09T05:44:38Z">
-        <w:r>
-          <w:rPr>
-            <w:b/>
-            <w:bCs/>
-          </w:rPr>
-          <w:delText xml:space="preserve">Equation 7</w:delText>
-        </w:r>
-      </w:del>
-      <w:del w:id="20272" w:author="Claude" w:date="2026-10-09T05:44:38Z">
-        <w:r>
-          <w:rPr>
-            <w:b/>
-            <w:bCs/>
-          </w:rPr>
-          <w:delText xml:space="preserve">)</w:delText>
-        </w:r>
-      </w:del>
-      <w:del w:id="20273" w:author="Claude" w:date="2026-10-09T05:44:38Z">
+      </w:pPr>
+      <w:r>
+        <w:t>where C</w:t>
+      </w:r>
+      <w:r>
+        <w:rPr>
+          <w:vertAlign w:val="subscript"/>
+        </w:rPr>
+        <w:t>O2</w:t>
+      </w:r>
+      <w:r>
+        <w:t>|</w:t>
+      </w:r>
+      <w:r>
+        <w:rPr>
+          <w:vertAlign w:val="subscript"/>
+        </w:rPr>
+        <w:t>Γ</w:t>
+      </w:r>
+      <w:r>
+        <w:t xml:space="preserve"> is the oxygen concentration at the interface (mol L</w:t>
+      </w:r>
+      <w:r>
+        <w:rPr>
+          <w:vertAlign w:val="superscript"/>
+        </w:rPr>
+        <w:t>-1</w:t>
+      </w:r>
+      <w:r>
+        <w:t>)</w:t>
+      </w:r>
+      <w:r>
+        <w:t xml:space="preserve">. </w:t>
+      </w:r>
+      <w:r>
+        <w:t>Oxygen-transport limitation is incorporated implicitly through the Robin boundary condition</w:t>
+      </w:r>
+      <w:r>
+        <w:t xml:space="preserve"> </w:t>
+      </w:r>
+      <w:r>
+        <w:rPr>
+          <w:b/>
+          <w:bCs/>
+        </w:rPr>
+        <w:t>(</w:t>
+      </w:r>
+      <w:r>
+        <w:rPr>
+          <w:b/>
+          <w:bCs/>
+        </w:rPr>
+        <w:t>Equation 7</w:t>
+      </w:r>
+      <w:r>
+        <w:rPr>
+          <w:b/>
+          <w:bCs/>
+        </w:rPr>
+        <w:t>)</w:t>
+      </w:r>
+      <w:del w:id="20008" w:author="Claude" w:date="2026-10-09T06:27:45Z">
         <w:r>
           <w:delText xml:space="preserve">, </w:delText>
         </w:r>
       </w:del>
-      <w:del w:id="20274" w:author="Claude" w:date="2026-10-09T05:44:38Z">
+      <w:ins w:id="20007" w:author="Claude" w:date="2026-10-09T06:27:45Z">
         <w:r>
-          <w:delText xml:space="preserve">As </w:delText>
-        </w:r>
-      </w:del>
-      <w:del w:id="20275" w:author="Claude" w:date="2026-10-09T05:44:38Z">
-        <w:r>
-          <w:delText xml:space="preserve">oxygen supply becomes restricted, the interfacial oxygen concentration decreases, reducing the oxygen-reduction flux and consequently the interface recession velocity</w:delText>
-        </w:r>
-      </w:del>
-      <w:del w:id="20276" w:author="Claude" w:date="2026-10-09T05:44:38Z">
-        <w:r>
-          <w:delText xml:space="preserve">. </w:delText>
-        </w:r>
-      </w:del>
-      <w:del w:id="20277" w:author="Claude" w:date="2026-10-09T05:44:38Z">
-        <w:r>
-          <w:delText xml:space="preserve">Therefore, no separate velocity cap or rate-selection criterion is required. The transition from reaction-controlled to diffusion-controlled degradation emerges naturally from the depletion of interfacial oxygen and its coupling with transport processes</w:delText>
-        </w:r>
-      </w:del>
-      <w:del w:id="20278" w:author="Claude" w:date="2026-10-09T05:44:38Z">
-        <w:r>
-          <w:delText xml:space="preserve"> </w:delText>
-        </w:r>
-      </w:del>
-      <w:del w:id="20279" w:author="Claude" w:date="2026-10-09T05:44:38Z">
-        <w:r>
-          <w:rPr>
-            <w:b/>
-            <w:bCs/>
-          </w:rPr>
-          <w:delText xml:space="preserve">(Section S1)</w:delText>
-        </w:r>
-      </w:del>
-      <w:del w:id="20280" w:author="Claude" w:date="2026-10-09T05:44:38Z">
-        <w:r>
-          <w:delText xml:space="preserve">.</w:delText>
-        </w:r>
-      </w:del>
-      <w:del w:id="20281" w:author="Claude" w:date="2026-10-09T05:44:38Z">
-        <w:r>
-          <w:delText xml:space="preserve"> </w:delText>
-        </w:r>
-      </w:del>
-      <w:del w:id="20282" w:author="Claude" w:date="2026-10-09T05:44:38Z">
-        <w:r>
-          <w:delText xml:space="preserve">Through this formulation, interface recession, oxygen consumption, </w:delText>
-        </w:r>
-      </w:del>
-      <w:del w:id="20283" w:author="Claude" w:date="2026-10-09T05:44:38Z">
-        <w:r>
-          <w:delText xml:space="preserve">Zn</w:delText>
-        </w:r>
-      </w:del>
-      <w:del w:id="20284" w:author="Claude" w:date="2026-10-09T05:44:38Z">
-        <w:r>
-          <w:rPr>
-            <w:vertAlign w:val="superscript"/>
-          </w:rPr>
-          <w:delText xml:space="preserve">2+</w:delText>
-        </w:r>
-      </w:del>
-      <w:del w:id="20285" w:author="Claude" w:date="2026-10-09T05:44:38Z">
-        <w:r>
-          <w:rPr>
-            <w:vertAlign w:val="superscript"/>
-          </w:rPr>
-          <w:delText xml:space="preserve"> </w:delText>
-        </w:r>
-      </w:del>
-      <w:del w:id="20286" w:author="Claude" w:date="2026-10-09T05:44:38Z">
-        <w:r>
-          <w:delText xml:space="preserve">release, </w:delText>
-        </w:r>
-      </w:del>
-      <w:del w:id="20287" w:author="Claude" w:date="2026-10-09T05:44:38Z">
-        <w:r>
-          <w:delText xml:space="preserve">OH</w:delText>
-        </w:r>
-      </w:del>
-      <w:del w:id="20288" w:author="Claude" w:date="2026-10-09T05:44:38Z">
-        <w:r>
-          <w:rPr>
-            <w:vertAlign w:val="superscript"/>
-          </w:rPr>
-          <w:delText xml:space="preserve">-</w:delText>
-        </w:r>
-      </w:del>
-      <w:del w:id="20289" w:author="Claude" w:date="2026-10-09T05:44:38Z">
-        <w:r>
-          <w:rPr>
-            <w:vertAlign w:val="superscript"/>
-          </w:rPr>
-          <w:delText xml:space="preserve"> </w:delText>
-        </w:r>
-      </w:del>
-      <w:del w:id="20290" w:author="Claude" w:date="2026-10-09T05:44:38Z">
-        <w:r>
-          <w:delText xml:space="preserve">generation, and corrosion-product growth are governed by a single oxygen-reduction flux, ensuring a mechanistically consistent link between interfacial chemistry, mass transport, and degradation kinetics.</w:delText>
-        </w:r>
-      </w:del>
-    </w:p>
-    <w:p>
-      <w:pPr>
-        <w:pStyle w:val="BodyText"/>
-        <w:rPr>
-          <w:ins w:id="20299" w:author="Claude" w:date="2026-10-09T05:44:38Z"/>
-        </w:rPr>
-      </w:pPr>
-      <w:ins w:id="20292" w:author="Claude" w:date="2026-10-09T05:44:38Z">
-        <w:r>
-          <w:t xml:space="preserve">where j</w:t>
+          <w:t xml:space="preserve">. </w:t>
         </w:r>
       </w:ins>
-      <w:ins w:id="20293" w:author="Claude" w:date="2026-10-09T05:44:38Z">
-        <w:r>
-          <w:rPr>
-            <w:vertAlign w:val="subscript"/>
-          </w:rPr>
-          <w:t xml:space="preserve">ORR</w:t>
-        </w:r>
-      </w:ins>
-      <w:ins w:id="20294" w:author="Claude" w:date="2026-10-09T05:44:38Z">
-        <w:r>
-          <w:t xml:space="preserve"> is the ORR molar flux defined above, so that v</w:t>
-        </w:r>
-      </w:ins>
-      <w:ins w:id="20295" w:author="Claude" w:date="2026-10-09T05:44:38Z">
-        <w:r>
-          <w:rPr>
-            <w:vertAlign w:val="subscript"/>
-          </w:rPr>
-          <w:t xml:space="preserve">n</w:t>
-        </w:r>
-      </w:ins>
-      <w:ins w:id="20296" w:author="Claude" w:date="2026-10-09T05:44:38Z">
-        <w:r>
-          <w:t xml:space="preserve"> has units of (mol mm⁻² h⁻¹)/(mol mm⁻³) = mm h⁻¹. Oxygen-transport limitation is incorporated implicitly through the Robin boundary condition for C</w:t>
-        </w:r>
-      </w:ins>
-      <w:ins w:id="20297" w:author="Claude" w:date="2026-10-09T05:44:38Z">
-        <w:r>
-          <w:rPr>
-            <w:vertAlign w:val="subscript"/>
-          </w:rPr>
-          <w:t xml:space="preserve">O2</w:t>
-        </w:r>
-      </w:ins>
-      <w:ins w:id="20298" w:author="Claude" w:date="2026-10-09T05:44:38Z">
-        <w:r>
-          <w:t xml:space="preserve"> at the interface (Equation 7): as oxygen supply becomes restricted, the interfacial oxygen concentration decreases, reducing the oxygen-reduction flux and consequently the interface recession velocity. Therefore, no separate velocity cap or rate-selection criterion is required. The transition from reaction-controlled to diffusion-controlled degradation emerges naturally from the depletion of interfacial oxygen and its coupling with transport processes (Section S1). Through this formulation, interface recession, oxygen consumption, Zn²⁺ release, OH⁻ generation, and corrosion-product growth are governed by a single oxygen-reduction flux, ensuring a mechanistically consistent link between interfacial chemistry, mass transport, and degradation kinetics.</w:t>
-        </w:r>
-      </w:ins>
+      <w:r>
+        <w:t xml:space="preserve">As </w:t>
+      </w:r>
+      <w:r>
+        <w:t>oxygen supply becomes restricted, the interfacial oxygen concentration decreases, reducing the oxygen-reduction flux and consequently the interface recession velocity</w:t>
+      </w:r>
+      <w:r>
+        <w:t xml:space="preserve">. </w:t>
+      </w:r>
+      <w:r>
+        <w:t>Therefore, no separate velocity cap or rate-selection criterion is required. The transition from reaction-controlled to diffusion-controlled degradation emerges naturally from the depletion of interfacial oxygen and its coupling with transport processes</w:t>
+      </w:r>
+      <w:r>
+        <w:t xml:space="preserve"> </w:t>
+      </w:r>
+      <w:r>
+        <w:rPr>
+          <w:b/>
+          <w:bCs/>
+        </w:rPr>
+        <w:t>(Section S1)</w:t>
+      </w:r>
+      <w:r>
+        <w:t>.</w:t>
+      </w:r>
+      <w:r>
+        <w:t xml:space="preserve"> </w:t>
+      </w:r>
+      <w:r>
+        <w:t xml:space="preserve">Through this formulation, interface recession, oxygen consumption, </w:t>
+      </w:r>
+      <w:r>
+        <w:t>Zn</w:t>
+      </w:r>
+      <w:r>
+        <w:rPr>
+          <w:vertAlign w:val="superscript"/>
+        </w:rPr>
+        <w:t>2+</w:t>
+      </w:r>
+      <w:r>
+        <w:rPr>
+          <w:vertAlign w:val="superscript"/>
+        </w:rPr>
+        <w:t xml:space="preserve"> </w:t>
+      </w:r>
+      <w:r>
+        <w:t xml:space="preserve">release, </w:t>
+      </w:r>
+      <w:r>
+        <w:t>OH</w:t>
+      </w:r>
+      <w:r>
+        <w:rPr>
+          <w:vertAlign w:val="superscript"/>
+        </w:rPr>
+        <w:t>-</w:t>
+      </w:r>
+      <w:r>
+        <w:rPr>
+          <w:vertAlign w:val="superscript"/>
+        </w:rPr>
+        <w:t xml:space="preserve"> </w:t>
+      </w:r>
+      <w:r>
+        <w:t>generation, and corrosion-product growth are governed by a single oxygen-reduction flux, ensuring a mechanistically consistent link between interfacial chemistry, mass transport, and degradation kinetics.</w:t>
+      </w:r>
     </w:p>
     <w:p>
       <w:pPr>
@@ -8944,15 +7754,7 @@
         <w:pStyle w:val="BodyText"/>
       </w:pPr>
       <w:r>
-        <w:t xml:space="preserve">The coupled reaction-diffusion and moving-boundary framework was implemented in </w:t>
-      </w:r>
-      <w:proofErr w:type="spellStart"/>
-      <w:r>
-        <w:t>FreeFEM</w:t>
-      </w:r>
-      <w:proofErr w:type="spellEnd"/>
-      <w:r>
-        <w:t xml:space="preserve">++ and solved using first-order finite elements with implicit time integration. </w:t>
+        <w:t xml:space="preserve">The coupled reaction-diffusion and moving-boundary framework was implemented in FreeFEM++ and solved using first-order finite elements with implicit time integration. </w:t>
       </w:r>
       <w:r>
         <w:t>Parametrically generated implant geometries were discretized into tetrahedral meshes and embedded within a 30 × 30 × 30 mm electrolyte domain</w:t>
@@ -9001,29 +7803,13 @@
         <w:pStyle w:val="BodyText"/>
       </w:pPr>
       <w:r>
-        <w:t xml:space="preserve">Physiological initial and boundary conditions were imposed throughout the electrolyte domain, including continuous oxygen replenishment at the electrolyte-air interface and kinetic flux conditions at the moving metal-electrolyte boundary. The </w:t>
-      </w:r>
-      <w:proofErr w:type="gramStart"/>
-      <w:r>
-        <w:t>48 h</w:t>
-      </w:r>
-      <w:proofErr w:type="gramEnd"/>
-      <w:r>
-        <w:t xml:space="preserve"> medium renewal used in the immersion tests was not modeled explicitly; instead, dissolved oxygen was assumed to be continuously replenished at the electrolyte–air interface</w:t>
+        <w:t>Physiological initial and boundary conditions were imposed throughout the electrolyte domain, including continuous oxygen replenishment at the electrolyte-air interface and kinetic flux conditions at the moving metal-electrolyte boundary. The 48 h medium renewal used in the immersion tests was not modeled explicitly; instead, dissolved oxygen was assumed to be continuously replenished at the electrolyte–air interface</w:t>
       </w:r>
       <w:r>
         <w:t xml:space="preserve"> and </w:t>
       </w:r>
       <w:r>
-        <w:t xml:space="preserve">no natural convection was considered (static conditions). Simulations were executed in parallel using </w:t>
-      </w:r>
-      <w:proofErr w:type="spellStart"/>
-      <w:r>
-        <w:t>FreeFEM</w:t>
-      </w:r>
-      <w:proofErr w:type="spellEnd"/>
-      <w:r>
-        <w:t>++ MPI on a high-performance computing cluster, and degradation metrics together with concentration and interface fields were recorded at regular time intervals.</w:t>
+        <w:t>no natural convection was considered (static conditions). Simulations were executed in parallel using FreeFEM++ MPI on a high-performance computing cluster, and degradation metrics together with concentration and interface fields were recorded at regular time intervals.</w:t>
       </w:r>
       <w:r>
         <w:t xml:space="preserve"> Predicted mass loss, corrosion rate (</w:t>
@@ -9058,15 +7844,7 @@
         <w:t>, and dissolved oxygen concentration</w:t>
       </w:r>
       <w:r>
-        <w:t xml:space="preserve"> were extracted during post-processing. The transition between reaction-controlled and diffusion-controlled degradation was quantified using the local </w:t>
-      </w:r>
-      <w:proofErr w:type="spellStart"/>
-      <w:r>
-        <w:t>Damköhler</w:t>
-      </w:r>
-      <w:proofErr w:type="spellEnd"/>
-      <w:r>
-        <w:t xml:space="preserve"> number (</w:t>
+        <w:t xml:space="preserve"> were extracted during post-processing. The transition between reaction-controlled and diffusion-controlled degradation was quantified using the local Damköhler number (</w:t>
       </w:r>
       <w:r>
         <w:rPr>
@@ -12147,7 +10925,7 @@
                 <w:sz w:val="22"/>
                 <w:szCs w:val="22"/>
               </w:rPr>
-              <w:t>1.42 × 10⁻⁷ mol mm⁻³</w:t>
+              <w:t>5.04 × 10⁻⁶ g mm⁻³</w:t>
             </w:r>
           </w:p>
         </w:tc>
@@ -12399,7 +11177,7 @@
                 <w:sz w:val="22"/>
                 <w:szCs w:val="22"/>
               </w:rPr>
-              <w:t>1.09 × 10⁻¹⁰ mol mm⁻³</w:t>
+              <w:t>3.5 × 10⁻⁹ g mm⁻³</w:t>
             </w:r>
           </w:p>
         </w:tc>
@@ -17021,18 +15799,8 @@
           <w:b/>
           <w:bCs/>
         </w:rPr>
-        <w:t>g–</w:t>
-      </w:r>
-      <w:proofErr w:type="spellStart"/>
-      <w:r>
-        <w:rPr>
-          <w:rFonts w:cs="Times New Roman"/>
-          <w:b/>
-          <w:bCs/>
-        </w:rPr>
-        <w:t>i</w:t>
-      </w:r>
-      <w:proofErr w:type="spellEnd"/>
+        <w:t>g–i</w:t>
+      </w:r>
       <w:r>
         <w:rPr>
           <w:rFonts w:cs="Times New Roman"/>
@@ -17496,15 +16264,7 @@
         <w:t>.</w:t>
       </w:r>
       <w:r>
-        <w:t xml:space="preserve"> Local parameter sweeps of kinetic parameters. Panels (a–c) show cumulative mass loss (%), panels (d–f) show the normalized corrosion-product saturation, F/Fₘₐₓ (%), and panels (g–</w:t>
-      </w:r>
-      <w:proofErr w:type="spellStart"/>
-      <w:r>
-        <w:t>i</w:t>
-      </w:r>
-      <w:proofErr w:type="spellEnd"/>
-      <w:r>
-        <w:t>) show interfacial dissolved oxygen concentration (</w:t>
+        <w:t xml:space="preserve"> Local parameter sweeps of kinetic parameters. Panels (a–c) show cumulative mass loss (%), panels (d–f) show the normalized corrosion-product saturation, F/Fₘₐₓ (%), and panels (g–i) show interfacial dissolved oxygen concentration (</w:t>
       </w:r>
       <w:r>
         <w:rPr>
@@ -18893,13 +17653,8 @@
         </w:rPr>
         <w:t xml:space="preserve">. </w:t>
       </w:r>
-      <w:proofErr w:type="spellStart"/>
-      <w:r>
-        <w:t>Damköhler</w:t>
-      </w:r>
-      <w:proofErr w:type="spellEnd"/>
-      <w:r>
-        <w:t xml:space="preserve">-number analysis quantified this transition, </w:t>
+      <w:r>
+        <w:t xml:space="preserve">Damköhler-number analysis quantified this transition, </w:t>
       </w:r>
       <w:r>
         <w:t xml:space="preserve">revealing an initial degradation regime governed by cathodic reaction kinetics. After approximately </w:t>
@@ -19600,7 +18355,6 @@
         </w:rPr>
         <w:fldChar w:fldCharType="end"/>
       </w:r>
-      <w:proofErr w:type="gramStart"/>
       <w:r>
         <w:rPr>
           <w:rFonts w:cs="Times New Roman"/>
@@ -19609,7 +18363,6 @@
         </w:rPr>
         <w:t>e,f</w:t>
       </w:r>
-      <w:proofErr w:type="gramEnd"/>
       <w:r>
         <w:rPr>
           <w:rFonts w:cs="Times New Roman"/>
@@ -19634,14 +18387,7 @@
         <w:rPr>
           <w:rFonts w:cs="Times New Roman"/>
         </w:rPr>
-        <w:t xml:space="preserve"> with errors at 336 h of 44% for Zn²⁺ and 2.8% for </w:t>
-      </w:r>
-      <w:proofErr w:type="spellStart"/>
-      <w:r>
-        <w:rPr>
-          <w:rFonts w:cs="Times New Roman"/>
-        </w:rPr>
-        <w:t>pH</w:t>
+        <w:t xml:space="preserve"> with errors at 336 h of 44% for Zn²⁺ and 2.8% for pH</w:t>
       </w:r>
       <w:del w:id="94" w:author="Claude" w:date="2026-10-08T20:38:00Z">
         <w:r>
@@ -19655,14 +18401,7 @@
         <w:rPr>
           <w:rFonts w:cs="Times New Roman"/>
         </w:rPr>
-        <w:t>.</w:t>
-      </w:r>
-      <w:proofErr w:type="spellEnd"/>
-      <w:r>
-        <w:rPr>
-          <w:rFonts w:cs="Times New Roman"/>
-        </w:rPr>
-        <w:t xml:space="preserve"> </w:t>
+        <w:t xml:space="preserve">. </w:t>
       </w:r>
       <w:r>
         <w:rPr>
@@ -19884,15 +18623,7 @@
         <w:t xml:space="preserve"> corrosion-product chemistry. </w:t>
       </w:r>
       <w:r>
-        <w:t>The higher mass loss is consistent with the observed relationship between surface area-to-volume ratio (</w:t>
-      </w:r>
-      <w:proofErr w:type="gramStart"/>
-      <w:r>
-        <w:t>SA:V</w:t>
-      </w:r>
-      <w:proofErr w:type="gramEnd"/>
-      <w:r>
-        <w:t>) and degradation, where cumulative mass loss increased approximately linearly with SA:V</w:t>
+        <w:t>The higher mass loss is consistent with the observed relationship between surface area-to-volume ratio (SA:V) and degradation, where cumulative mass loss increased approximately linearly with SA:V</w:t>
       </w:r>
       <w:r>
         <w:t xml:space="preserve"> (</w:t>
@@ -19914,15 +18645,7 @@
         <w:t xml:space="preserve"> </w:t>
       </w:r>
       <w:r>
-        <w:t xml:space="preserve">However, the stent exhibited less pronounced temporal deceleration in mass loss than the disc, indicating that geometric influences on degradation extend beyond </w:t>
-      </w:r>
-      <w:proofErr w:type="gramStart"/>
-      <w:r>
-        <w:t>SA:V</w:t>
-      </w:r>
-      <w:proofErr w:type="gramEnd"/>
-      <w:r>
-        <w:t xml:space="preserve"> alone.</w:t>
+        <w:t>However, the stent exhibited less pronounced temporal deceleration in mass loss than the disc, indicating that geometric influences on degradation extend beyond SA:V alone.</w:t>
       </w:r>
     </w:p>
     <w:p>
@@ -20430,7 +19153,6 @@
         </w:rPr>
         <w:fldChar w:fldCharType="end"/>
       </w:r>
-      <w:proofErr w:type="gramStart"/>
       <w:r>
         <w:rPr>
           <w:b/>
@@ -20439,11 +19161,7 @@
         <w:t>c,d</w:t>
       </w:r>
       <w:r>
-        <w:t>.</w:t>
-      </w:r>
-      <w:proofErr w:type="gramEnd"/>
-      <w:r>
-        <w:t xml:space="preserve"> </w:t>
+        <w:t xml:space="preserve">. </w:t>
       </w:r>
       <w:r>
         <w:t>Section 1, located along a relatively straight strut segment, exhibited comparatively uniform recession, with penetration depths ranging from approximately</w:t>
@@ -20788,17 +19506,7 @@
         <w:t>672</w:t>
       </w:r>
       <w:r>
-        <w:t> h, (b) schematic illustration of oxygen transport to the inner and outer-curvature surfaces of the stent crown, (</w:t>
-      </w:r>
-      <w:proofErr w:type="spellStart"/>
-      <w:proofErr w:type="gramStart"/>
-      <w:r>
-        <w:t>c,d</w:t>
-      </w:r>
-      <w:proofErr w:type="spellEnd"/>
-      <w:proofErr w:type="gramEnd"/>
-      <w:r>
-        <w:t>) evolution of the metal cross-sectional profiles at Sections 1 and 2, respectively.</w:t>
+        <w:t> h, (b) schematic illustration of oxygen transport to the inner and outer-curvature surfaces of the stent crown, (c,d) evolution of the metal cross-sectional profiles at Sections 1 and 2, respectively.</w:t>
       </w:r>
     </w:p>
     <w:p>
@@ -20986,15 +19694,7 @@
         <w:t xml:space="preserve">Although the effects on cumulative mass loss were relatively modest, geometry strongly influenced the spatial distribution of degradation. Mean </w:t>
       </w:r>
       <w:r>
-        <w:t xml:space="preserve">penetration depths varied only slightly, ranging from approximately 2.4 to 2.7 µm across the curved-wire configurations (30°, 90°, and 150° arcs) and from 2.1 to 2.4 µm across the </w:t>
-      </w:r>
-      <w:proofErr w:type="spellStart"/>
-      <w:r>
-        <w:t>straight</w:t>
-      </w:r>
-      <w:proofErr w:type="spellEnd"/>
-      <w:r>
-        <w:t>, closely spaced, and widely spaced wire configurations</w:t>
+        <w:t>penetration depths varied only slightly, ranging from approximately 2.4 to 2.7 µm across the curved-wire configurations (30°, 90°, and 150° arcs) and from 2.1 to 2.4 µm across the straight, closely spaced, and widely spaced wire configurations</w:t>
       </w:r>
       <w:r>
         <w:t xml:space="preserve"> (</w:t>
@@ -21197,15 +19897,7 @@
         </w:r>
       </w:del>
       <w:r>
-        <w:t xml:space="preserve"> products are treated as a homogenized </w:t>
-      </w:r>
-      <w:proofErr w:type="spellStart"/>
-      <w:r>
-        <w:t>ZnO</w:t>
-      </w:r>
-      <w:proofErr w:type="spellEnd"/>
-      <w:r>
-        <w:t>-based field rather than a discrete surface film or a heterogeneous, composition-dependent structure, and phosphate-, carbonate-, calcium-, and chloride-containing phases</w:t>
+        <w:t xml:space="preserve"> products are treated as a homogenized ZnO-based field rather than a discrete surface film or a heterogeneous, composition-dependent structure, and phosphate-, carbonate-, calcium-, and chloride-containing phases</w:t>
       </w:r>
       <w:ins w:id="102" w:author="Claude" w:date="2026-10-08T20:38:00Z">
         <w:r>
@@ -21511,15 +20203,7 @@
         <w:jc w:val="both"/>
       </w:pPr>
       <w:r>
-        <w:t xml:space="preserve">The authors acknowledge the use of Monash University’s High-Performance Computing (M3) facility and the Monash </w:t>
-      </w:r>
-      <w:proofErr w:type="spellStart"/>
-      <w:r>
-        <w:t>eResearch</w:t>
-      </w:r>
-      <w:proofErr w:type="spellEnd"/>
-      <w:r>
-        <w:t xml:space="preserve"> </w:t>
+        <w:t xml:space="preserve">The authors acknowledge the use of Monash University’s High-Performance Computing (M3) facility and the Monash eResearch </w:t>
       </w:r>
       <w:r>
         <w:t>Center</w:t>
@@ -21623,21 +20307,12 @@
       <w:r>
         <w:t xml:space="preserve"> Data curation, Investigation, Writing – original draft. </w:t>
       </w:r>
-      <w:proofErr w:type="spellStart"/>
-      <w:r>
-        <w:rPr>
-          <w:b/>
-          <w:bCs/>
-        </w:rPr>
-        <w:t>Aijun</w:t>
-      </w:r>
-      <w:proofErr w:type="spellEnd"/>
-      <w:r>
-        <w:rPr>
-          <w:b/>
-          <w:bCs/>
-        </w:rPr>
-        <w:t xml:space="preserve"> Huang:</w:t>
+      <w:r>
+        <w:rPr>
+          <w:b/>
+          <w:bCs/>
+        </w:rPr>
+        <w:t>Aijun Huang:</w:t>
       </w:r>
       <w:r>
         <w:t xml:space="preserve"> Conceptualization, Funding acquisition, Project administration, Supervision. </w:t>
@@ -21655,21 +20330,12 @@
       <w:r>
         <w:t xml:space="preserve"> </w:t>
       </w:r>
-      <w:proofErr w:type="spellStart"/>
-      <w:r>
-        <w:rPr>
-          <w:b/>
-          <w:bCs/>
-        </w:rPr>
-        <w:t>Yuman</w:t>
-      </w:r>
-      <w:proofErr w:type="spellEnd"/>
-      <w:r>
-        <w:rPr>
-          <w:b/>
-          <w:bCs/>
-        </w:rPr>
-        <w:t xml:space="preserve"> Zhu:</w:t>
+      <w:r>
+        <w:rPr>
+          <w:b/>
+          <w:bCs/>
+        </w:rPr>
+        <w:t>Yuman Zhu:</w:t>
       </w:r>
       <w:r>
         <w:t xml:space="preserve"> Conceptualization, Supervision, Writing – review &amp; editing.</w:t>
@@ -21959,15 +20625,7 @@
         <w:pStyle w:val="Bibliography"/>
       </w:pPr>
       <w:r>
-        <w:t xml:space="preserve">4. P. K. Bowen, E. R. </w:t>
-      </w:r>
-      <w:proofErr w:type="spellStart"/>
-      <w:r>
-        <w:t>Shearier</w:t>
-      </w:r>
-      <w:proofErr w:type="spellEnd"/>
-      <w:r>
-        <w:t xml:space="preserve">, S. Zhao, et al., “Biodegradable Metals for Cardiovascular Stents: From Clinical Concerns to Recent Zn‐Alloys,” </w:t>
+        <w:t xml:space="preserve">4. P. K. Bowen, E. R. Shearier, S. Zhao, et al., “Biodegradable Metals for Cardiovascular Stents: From Clinical Concerns to Recent Zn‐Alloys,” </w:t>
       </w:r>
       <w:r>
         <w:rPr>
@@ -21995,23 +20653,7 @@
         <w:pStyle w:val="Bibliography"/>
       </w:pPr>
       <w:r>
-        <w:t xml:space="preserve">5. A. </w:t>
-      </w:r>
-      <w:proofErr w:type="spellStart"/>
-      <w:r>
-        <w:t>Atrens</w:t>
-      </w:r>
-      <w:proofErr w:type="spellEnd"/>
-      <w:r>
-        <w:t xml:space="preserve">, G. Song, M. Liu, Z. Shi, F. Cao, and M. S. </w:t>
-      </w:r>
-      <w:proofErr w:type="spellStart"/>
-      <w:r>
-        <w:t>Dargusch</w:t>
-      </w:r>
-      <w:proofErr w:type="spellEnd"/>
-      <w:r>
-        <w:t xml:space="preserve">, “Review of Recent Developments in the Field of Magnesium Corrosion,” </w:t>
+        <w:t xml:space="preserve">5. A. Atrens, G. Song, M. Liu, Z. Shi, F. Cao, and M. S. Dargusch, “Review of Recent Developments in the Field of Magnesium Corrosion,” </w:t>
       </w:r>
       <w:r>
         <w:rPr>
@@ -22039,15 +20681,7 @@
         <w:pStyle w:val="Bibliography"/>
       </w:pPr>
       <w:r>
-        <w:t xml:space="preserve">6. G. </w:t>
-      </w:r>
-      <w:proofErr w:type="spellStart"/>
-      <w:r>
-        <w:t>Katarivas</w:t>
-      </w:r>
-      <w:proofErr w:type="spellEnd"/>
-      <w:r>
-        <w:t xml:space="preserve"> Levy, J. Goldman, and E. Aghion, “The Prospects of Zinc as a Structural Material for Biodegradable Implants—A Review Paper,” </w:t>
+        <w:t xml:space="preserve">6. G. Katarivas Levy, J. Goldman, and E. Aghion, “The Prospects of Zinc as a Structural Material for Biodegradable Implants—A Review Paper,” </w:t>
       </w:r>
       <w:r>
         <w:rPr>
@@ -22075,68 +20709,55 @@
         <w:pStyle w:val="Bibliography"/>
       </w:pPr>
       <w:r>
-        <w:t xml:space="preserve">7. D. </w:t>
-      </w:r>
-      <w:proofErr w:type="spellStart"/>
-      <w:r>
-        <w:t>Vojtěch</w:t>
-      </w:r>
-      <w:proofErr w:type="spellEnd"/>
-      <w:r>
-        <w:t xml:space="preserve">, J. </w:t>
-      </w:r>
-      <w:proofErr w:type="spellStart"/>
-      <w:r>
-        <w:t>Kubásek</w:t>
-      </w:r>
-      <w:proofErr w:type="spellEnd"/>
-      <w:r>
-        <w:t xml:space="preserve">, J. </w:t>
-      </w:r>
-      <w:proofErr w:type="spellStart"/>
-      <w:r>
-        <w:t>Šerák</w:t>
-      </w:r>
-      <w:proofErr w:type="spellEnd"/>
-      <w:r>
-        <w:t xml:space="preserve">, and P. </w:t>
-      </w:r>
-      <w:proofErr w:type="spellStart"/>
-      <w:r>
-        <w:t>Novák</w:t>
-      </w:r>
-      <w:proofErr w:type="spellEnd"/>
-      <w:r>
-        <w:t xml:space="preserve">, “Mechanical and Corrosion Properties of Newly Developed Biodegradable Zn-Based Alloys for Bone Fixation,” </w:t>
+        <w:t xml:space="preserve">7. D. Vojtěch, J. Kubásek, J. Šerák, and P. Novák, “Mechanical and Corrosion Properties of Newly Developed Biodegradable Zn-Based Alloys for Bone Fixation,” </w:t>
       </w:r>
       <w:r>
         <w:rPr>
           <w:i/>
           <w:iCs/>
         </w:rPr>
-        <w:t xml:space="preserve">Acta </w:t>
-      </w:r>
-      <w:proofErr w:type="spellStart"/>
+        <w:t>Acta Biomaterialia</w:t>
+      </w:r>
+      <w:r>
+        <w:t xml:space="preserve"> </w:t>
+      </w:r>
       <w:r>
         <w:rPr>
           <w:i/>
           <w:iCs/>
         </w:rPr>
-        <w:t>Biomaterialia</w:t>
-      </w:r>
-      <w:proofErr w:type="spellEnd"/>
-      <w:r>
-        <w:t xml:space="preserve"> </w:t>
+        <w:t>7</w:t>
+      </w:r>
+      <w:r>
+        <w:t>, no. 9 (2011): 3515–3522, https://doi.org/10.1016/j.actbio.2011.05.008.</w:t>
+      </w:r>
+    </w:p>
+    <w:p>
+      <w:pPr>
+        <w:pStyle w:val="Bibliography"/>
+      </w:pPr>
+      <w:r>
+        <w:t xml:space="preserve">8. J. Rao, H. Gao, J. Sun, R. Yu, D. Zhao, and Y. Ding, “A Critical Review of Biodegradable Zinc Alloys toward Clinical Applications,” </w:t>
       </w:r>
       <w:r>
         <w:rPr>
           <w:i/>
           <w:iCs/>
         </w:rPr>
-        <w:t>7</w:t>
-      </w:r>
-      <w:r>
-        <w:t>, no. 9 (2011): 3515–3522, https://doi.org/10.1016/j.actbio.2011.05.008.</w:t>
+        <w:t>ACS Biomaterials Science &amp; Engineering</w:t>
+      </w:r>
+      <w:r>
+        <w:t xml:space="preserve"> </w:t>
+      </w:r>
+      <w:r>
+        <w:rPr>
+          <w:i/>
+          <w:iCs/>
+        </w:rPr>
+        <w:t>10</w:t>
+      </w:r>
+      <w:r>
+        <w:t>, no. 9 (2024): 5454–5473, https://doi.org/10.1021/acsbiomaterials.4c00210.</w:t>
       </w:r>
     </w:p>
     <w:p>
@@ -22144,14 +20765,14 @@
         <w:pStyle w:val="Bibliography"/>
       </w:pPr>
       <w:r>
-        <w:t xml:space="preserve">8. J. Rao, H. Gao, J. Sun, R. Yu, D. Zhao, and Y. Ding, “A Critical Review of Biodegradable Zinc Alloys toward Clinical Applications,” </w:t>
+        <w:t xml:space="preserve">9. P. Zhao, Z. Wang, H. Yang, et al., “Biodegradable Zn‐Based Implants: Progress, Challenges, and Pathways toward Clinical Translation,” </w:t>
       </w:r>
       <w:r>
         <w:rPr>
           <w:i/>
           <w:iCs/>
         </w:rPr>
-        <w:t>ACS Biomaterials Science &amp; Engineering</w:t>
+        <w:t>Advanced Science</w:t>
       </w:r>
       <w:r>
         <w:t xml:space="preserve"> </w:t>
@@ -22161,10 +20782,10 @@
           <w:i/>
           <w:iCs/>
         </w:rPr>
-        <w:t>10</w:t>
-      </w:r>
-      <w:r>
-        <w:t>, no. 9 (2024): 5454–5473, https://doi.org/10.1021/acsbiomaterials.4c00210.</w:t>
+        <w:t>13</w:t>
+      </w:r>
+      <w:r>
+        <w:t>, no. 39 (2026): e76066, https://doi.org/10.1002/advs.76066.</w:t>
       </w:r>
     </w:p>
     <w:p>
@@ -22172,14 +20793,14 @@
         <w:pStyle w:val="Bibliography"/>
       </w:pPr>
       <w:r>
-        <w:t xml:space="preserve">9. P. Zhao, Z. Wang, H. Yang, et al., “Biodegradable Zn‐Based Implants: Progress, Challenges, and Pathways toward Clinical Translation,” </w:t>
+        <w:t xml:space="preserve">10. H. Yang, C. Wang, C. Liu, et al., “Evolution of the Degradation Mechanism of Pure Zinc Stent in the One-Year Study of Rabbit Abdominal Aorta Model,” </w:t>
       </w:r>
       <w:r>
         <w:rPr>
           <w:i/>
           <w:iCs/>
         </w:rPr>
-        <w:t>Advanced Science</w:t>
+        <w:t>Biomaterials</w:t>
       </w:r>
       <w:r>
         <w:t xml:space="preserve"> </w:t>
@@ -22189,10 +20810,10 @@
           <w:i/>
           <w:iCs/>
         </w:rPr>
-        <w:t>13</w:t>
-      </w:r>
-      <w:r>
-        <w:t>, no. 39 (2026): e76066, https://doi.org/10.1002/advs.76066.</w:t>
+        <w:t>145</w:t>
+      </w:r>
+      <w:r>
+        <w:t xml:space="preserve"> (2017): 92–105, https://doi.org/10.1016/j.biomaterials.2017.08.022.</w:t>
       </w:r>
     </w:p>
     <w:p>
@@ -22200,14 +20821,14 @@
         <w:pStyle w:val="Bibliography"/>
       </w:pPr>
       <w:r>
-        <w:t xml:space="preserve">10. H. Yang, C. Wang, C. Liu, et al., “Evolution of the Degradation Mechanism of Pure Zinc Stent in the One-Year Study of Rabbit Abdominal Aorta Model,” </w:t>
+        <w:t xml:space="preserve">11. H. Zhang, T. Du, S. Chen, et al., “Finite Element Analysis of the Non-Uniform Degradation of Biodegradable Vascular Stents,” </w:t>
       </w:r>
       <w:r>
         <w:rPr>
           <w:i/>
           <w:iCs/>
         </w:rPr>
-        <w:t>Biomaterials</w:t>
+        <w:t>Journal of Functional Biomaterials</w:t>
       </w:r>
       <w:r>
         <w:t xml:space="preserve"> </w:t>
@@ -22217,10 +20838,10 @@
           <w:i/>
           <w:iCs/>
         </w:rPr>
-        <w:t>145</w:t>
-      </w:r>
-      <w:r>
-        <w:t xml:space="preserve"> (2017): 92–105, https://doi.org/10.1016/j.biomaterials.2017.08.022.</w:t>
+        <w:t>13</w:t>
+      </w:r>
+      <w:r>
+        <w:t>, no. 3 (2022): 152, https://doi.org/10.3390/jfb13030152.</w:t>
       </w:r>
     </w:p>
     <w:p>
@@ -22228,14 +20849,14 @@
         <w:pStyle w:val="Bibliography"/>
       </w:pPr>
       <w:r>
-        <w:t xml:space="preserve">11. H. Zhang, T. Du, S. Chen, et al., “Finite Element Analysis of the Non-Uniform Degradation of Biodegradable Vascular Stents,” </w:t>
+        <w:t xml:space="preserve">12. X. Wang, A. Liu, Z. Zhang, et al., “Additively Manufactured Zn‐2Mg Alloy Porous Scaffolds with Customizable Biodegradable Performance and Enhanced Osteogenic Ability,” </w:t>
       </w:r>
       <w:r>
         <w:rPr>
           <w:i/>
           <w:iCs/>
         </w:rPr>
-        <w:t>Journal of Functional Biomaterials</w:t>
+        <w:t>Advanced Science</w:t>
       </w:r>
       <w:r>
         <w:t xml:space="preserve"> </w:t>
@@ -22245,10 +20866,10 @@
           <w:i/>
           <w:iCs/>
         </w:rPr>
-        <w:t>13</w:t>
-      </w:r>
-      <w:r>
-        <w:t>, no. 3 (2022): 152, https://doi.org/10.3390/jfb13030152.</w:t>
+        <w:t>11</w:t>
+      </w:r>
+      <w:r>
+        <w:t>, no. 5 (2024): 2307329, https://doi.org/10.1002/advs.202307329.</w:t>
       </w:r>
     </w:p>
     <w:p>
@@ -22256,14 +20877,14 @@
         <w:pStyle w:val="Bibliography"/>
       </w:pPr>
       <w:r>
-        <w:t xml:space="preserve">12. X. Wang, A. Liu, Z. Zhang, et al., “Additively Manufactured Zn‐2Mg Alloy Porous Scaffolds with Customizable Biodegradable Performance and Enhanced Osteogenic Ability,” </w:t>
+        <w:t xml:space="preserve">13. Y. Shi, W. Xu, H. Che, et al., “The Effect of Topological Design on the Degradation Behavior of Additively Manufactured Porous Zinc Alloy,” </w:t>
       </w:r>
       <w:r>
         <w:rPr>
           <w:i/>
           <w:iCs/>
         </w:rPr>
-        <w:t>Advanced Science</w:t>
+        <w:t>npj Materials Degradation</w:t>
       </w:r>
       <w:r>
         <w:t xml:space="preserve"> </w:t>
@@ -22273,10 +20894,10 @@
           <w:i/>
           <w:iCs/>
         </w:rPr>
-        <w:t>11</w:t>
-      </w:r>
-      <w:r>
-        <w:t>, no. 5 (2024): 2307329, https://doi.org/10.1002/advs.202307329.</w:t>
+        <w:t>8</w:t>
+      </w:r>
+      <w:r>
+        <w:t>, no. 1 (2024): 42, https://doi.org/10.1038/s41529-024-00451-z.</w:t>
       </w:r>
     </w:p>
     <w:p>
@@ -22284,36 +20905,55 @@
         <w:pStyle w:val="Bibliography"/>
       </w:pPr>
       <w:r>
-        <w:t xml:space="preserve">13. Y. Shi, W. Xu, H. Che, et al., “The Effect of Topological Design on the Degradation Behavior of Additively Manufactured Porous Zinc Alloy,” </w:t>
-      </w:r>
-      <w:proofErr w:type="spellStart"/>
+        <w:t xml:space="preserve">14. T. Albaraghtheh, R. Willumeit-Römer, and B. Zeller-Plumhoff, “In Silico Studies of Magnesium-Based Implants: A Review of the Current Stage and Challenges,” </w:t>
+      </w:r>
       <w:r>
         <w:rPr>
           <w:i/>
           <w:iCs/>
         </w:rPr>
-        <w:t>npj</w:t>
-      </w:r>
-      <w:proofErr w:type="spellEnd"/>
+        <w:t>Journal of Magnesium and Alloys</w:t>
+      </w:r>
+      <w:r>
+        <w:t xml:space="preserve"> </w:t>
+      </w:r>
       <w:r>
         <w:rPr>
           <w:i/>
           <w:iCs/>
         </w:rPr>
-        <w:t xml:space="preserve"> Materials Degradation</w:t>
-      </w:r>
-      <w:r>
-        <w:t xml:space="preserve"> </w:t>
+        <w:t>10</w:t>
+      </w:r>
+      <w:r>
+        <w:t>, no. 11 (2022): 2968–2996, https://doi.org/10.1016/j.jma.2022.09.029.</w:t>
+      </w:r>
+    </w:p>
+    <w:p>
+      <w:pPr>
+        <w:pStyle w:val="Bibliography"/>
+      </w:pPr>
+      <w:r>
+        <w:t xml:space="preserve">15. E. L. Boland, C. J. Shine, N. Kelly, C. A. Sweeney, and P. E. McHugh, “A Review of Material Degradation Modelling for the Analysis and Design of Bioabsorbable Stents,” </w:t>
       </w:r>
       <w:r>
         <w:rPr>
           <w:i/>
           <w:iCs/>
         </w:rPr>
-        <w:t>8</w:t>
-      </w:r>
-      <w:r>
-        <w:t>, no. 1 (2024): 42, https://doi.org/10.1038/s41529-024-00451-z.</w:t>
+        <w:t>Annals of Biomedical Engineering</w:t>
+      </w:r>
+      <w:r>
+        <w:t xml:space="preserve"> </w:t>
+      </w:r>
+      <w:r>
+        <w:rPr>
+          <w:i/>
+          <w:iCs/>
+        </w:rPr>
+        <w:t>44</w:t>
+      </w:r>
+      <w:r>
+        <w:t>, no. 2 (2016): 341–356, https://doi.org/10.1007/s10439-015-1413-5.</w:t>
       </w:r>
     </w:p>
     <w:p>
@@ -22321,30 +20961,17 @@
         <w:pStyle w:val="Bibliography"/>
       </w:pPr>
       <w:r>
-        <w:t xml:space="preserve">14. T. Albaraghtheh, R. </w:t>
-      </w:r>
-      <w:proofErr w:type="spellStart"/>
-      <w:r>
-        <w:t>Willumeit-Römer</w:t>
-      </w:r>
-      <w:proofErr w:type="spellEnd"/>
-      <w:r>
-        <w:t>, and B. Zeller-</w:t>
-      </w:r>
-      <w:proofErr w:type="spellStart"/>
-      <w:r>
-        <w:t>Plumhoff</w:t>
-      </w:r>
-      <w:proofErr w:type="spellEnd"/>
-      <w:r>
-        <w:t xml:space="preserve">, “In Silico Studies of Magnesium-Based Implants: A Review of the Current Stage and Challenges,” </w:t>
+        <w:t xml:space="preserve">16. D. Gastaldi, V. Sassi, L. Petrini, M. Vedani, S. Trasatti, and F. Migliavacca, “Continuum Damage Model for Bioresorbable Magnesium Alloy Devices — Application to Coronary </w:t>
+      </w:r>
+      <w:r>
+        <w:t xml:space="preserve">Stents,” </w:t>
       </w:r>
       <w:r>
         <w:rPr>
           <w:i/>
           <w:iCs/>
         </w:rPr>
-        <w:t>Journal of Magnesium and Alloys</w:t>
+        <w:t>Journal of the Mechanical Behavior of Biomedical Materials</w:t>
       </w:r>
       <w:r>
         <w:t xml:space="preserve"> </w:t>
@@ -22354,10 +20981,10 @@
           <w:i/>
           <w:iCs/>
         </w:rPr>
-        <w:t>10</w:t>
-      </w:r>
-      <w:r>
-        <w:t>, no. 11 (2022): 2968–2996, https://doi.org/10.1016/j.jma.2022.09.029.</w:t>
+        <w:t>4</w:t>
+      </w:r>
+      <w:r>
+        <w:t>, no. 3 (2011): 352–365, https://doi.org/10.1016/j.jmbbm.2010.11.003.</w:t>
       </w:r>
     </w:p>
     <w:p>
@@ -22365,14 +20992,14 @@
         <w:pStyle w:val="Bibliography"/>
       </w:pPr>
       <w:r>
-        <w:t xml:space="preserve">15. E. L. Boland, C. J. Shine, N. Kelly, C. A. Sweeney, and P. E. McHugh, “A Review of Material Degradation Modelling for the Analysis and Design of Bioabsorbable Stents,” </w:t>
+        <w:t xml:space="preserve">17. J. A. Grogan, B. J. O’Brien, S. B. Leen, and P. E. McHugh, “A Corrosion Model for Bioabsorbable Metallic Stents,” </w:t>
       </w:r>
       <w:r>
         <w:rPr>
           <w:i/>
           <w:iCs/>
         </w:rPr>
-        <w:t>Annals of Biomedical Engineering</w:t>
+        <w:t>Acta Biomaterialia</w:t>
       </w:r>
       <w:r>
         <w:t xml:space="preserve"> </w:t>
@@ -22382,10 +21009,10 @@
           <w:i/>
           <w:iCs/>
         </w:rPr>
-        <w:t>44</w:t>
-      </w:r>
-      <w:r>
-        <w:t>, no. 2 (2016): 341–356, https://doi.org/10.1007/s10439-015-1413-5.</w:t>
+        <w:t>7</w:t>
+      </w:r>
+      <w:r>
+        <w:t>, no. 9 (2011): 3523–3533, https://doi.org/10.1016/j.actbio.2011.05.032.</w:t>
       </w:r>
     </w:p>
     <w:p>
@@ -22393,49 +21020,14 @@
         <w:pStyle w:val="Bibliography"/>
       </w:pPr>
       <w:r>
-        <w:t xml:space="preserve">16. D. Gastaldi, V. Sassi, L. </w:t>
-      </w:r>
-      <w:proofErr w:type="spellStart"/>
-      <w:r>
-        <w:t>Petrini</w:t>
-      </w:r>
-      <w:proofErr w:type="spellEnd"/>
-      <w:r>
-        <w:t xml:space="preserve">, M. </w:t>
-      </w:r>
-      <w:proofErr w:type="spellStart"/>
-      <w:r>
-        <w:t>Vedani</w:t>
-      </w:r>
-      <w:proofErr w:type="spellEnd"/>
-      <w:r>
-        <w:t xml:space="preserve">, S. </w:t>
-      </w:r>
-      <w:proofErr w:type="spellStart"/>
-      <w:r>
-        <w:t>Trasatti</w:t>
-      </w:r>
-      <w:proofErr w:type="spellEnd"/>
-      <w:r>
-        <w:t xml:space="preserve">, and F. </w:t>
-      </w:r>
-      <w:proofErr w:type="spellStart"/>
-      <w:r>
-        <w:t>Migliavacca</w:t>
-      </w:r>
-      <w:proofErr w:type="spellEnd"/>
-      <w:r>
-        <w:t xml:space="preserve">, “Continuum Damage Model for Bioresorbable Magnesium Alloy Devices — Application to Coronary </w:t>
-      </w:r>
-      <w:r>
-        <w:t xml:space="preserve">Stents,” </w:t>
+        <w:t xml:space="preserve">18. M. Barzegari, D. Mei, S. V. Lamaka, and L. Geris, “Computational Modeling of Degradation Process of Biodegradable Magnesium Biomaterials,” </w:t>
       </w:r>
       <w:r>
         <w:rPr>
           <w:i/>
           <w:iCs/>
         </w:rPr>
-        <w:t>Journal of the Mechanical Behavior of Biomedical Materials</w:t>
+        <w:t>Corrosion Science</w:t>
       </w:r>
       <w:r>
         <w:t xml:space="preserve"> </w:t>
@@ -22445,10 +21037,10 @@
           <w:i/>
           <w:iCs/>
         </w:rPr>
-        <w:t>4</w:t>
-      </w:r>
-      <w:r>
-        <w:t>, no. 3 (2011): 352–365, https://doi.org/10.1016/j.jmbbm.2010.11.003.</w:t>
+        <w:t>190</w:t>
+      </w:r>
+      <w:r>
+        <w:t xml:space="preserve"> (2021): 109674, https://doi.org/10.1016/j.corsci.2021.109674.</w:t>
       </w:r>
     </w:p>
     <w:p>
@@ -22456,36 +21048,55 @@
         <w:pStyle w:val="Bibliography"/>
       </w:pPr>
       <w:r>
-        <w:t xml:space="preserve">17. J. A. Grogan, B. J. O’Brien, S. B. Leen, and P. E. McHugh, “A Corrosion Model for Bioabsorbable Metallic Stents,” </w:t>
+        <w:t xml:space="preserve">19. P. Bajger, J. M. A. Ashbourn, V. Manhas, Y. Guyot, K. Lietaert, and L. Geris, “Mathematical Modelling of the Degradation Behaviour of Biodegradable Metals,” </w:t>
       </w:r>
       <w:r>
         <w:rPr>
           <w:i/>
           <w:iCs/>
         </w:rPr>
-        <w:t xml:space="preserve">Acta </w:t>
-      </w:r>
-      <w:proofErr w:type="spellStart"/>
+        <w:t>Biomechanics and Modeling in Mechanobiology</w:t>
+      </w:r>
+      <w:r>
+        <w:t xml:space="preserve"> </w:t>
+      </w:r>
       <w:r>
         <w:rPr>
           <w:i/>
           <w:iCs/>
         </w:rPr>
-        <w:t>Biomaterialia</w:t>
-      </w:r>
-      <w:proofErr w:type="spellEnd"/>
-      <w:r>
-        <w:t xml:space="preserve"> </w:t>
+        <w:t>16</w:t>
+      </w:r>
+      <w:r>
+        <w:t>, no. 1 (2017): 227–238, https://doi.org/10.1007/s10237-016-0812-3.</w:t>
+      </w:r>
+    </w:p>
+    <w:p>
+      <w:pPr>
+        <w:pStyle w:val="Bibliography"/>
+      </w:pPr>
+      <w:r>
+        <w:t xml:space="preserve">20. S. Thomas, N. V. Medhekar, G. S. Frankel, and N. Birbilis, “Corrosion Mechanism and Hydrogen Evolution on Mg,” </w:t>
       </w:r>
       <w:r>
         <w:rPr>
           <w:i/>
           <w:iCs/>
         </w:rPr>
-        <w:t>7</w:t>
-      </w:r>
-      <w:r>
-        <w:t>, no. 9 (2011): 3523–3533, https://doi.org/10.1016/j.actbio.2011.05.032.</w:t>
+        <w:t>Current Opinion in Solid State and Materials Science</w:t>
+      </w:r>
+      <w:r>
+        <w:t xml:space="preserve"> </w:t>
+      </w:r>
+      <w:r>
+        <w:rPr>
+          <w:i/>
+          <w:iCs/>
+        </w:rPr>
+        <w:t>19</w:t>
+      </w:r>
+      <w:r>
+        <w:t>, no. 2 (2015): 85–94, https://doi.org/10.1016/j.cossms.2014.09.005.</w:t>
       </w:r>
     </w:p>
     <w:p>
@@ -22493,30 +21104,14 @@
         <w:pStyle w:val="Bibliography"/>
       </w:pPr>
       <w:r>
-        <w:t xml:space="preserve">18. M. </w:t>
-      </w:r>
-      <w:proofErr w:type="spellStart"/>
-      <w:r>
-        <w:t>Barzegari</w:t>
-      </w:r>
-      <w:proofErr w:type="spellEnd"/>
-      <w:r>
-        <w:t xml:space="preserve">, D. Mei, S. V. </w:t>
-      </w:r>
-      <w:proofErr w:type="spellStart"/>
-      <w:r>
-        <w:t>Lamaka</w:t>
-      </w:r>
-      <w:proofErr w:type="spellEnd"/>
-      <w:r>
-        <w:t xml:space="preserve">, and L. Geris, “Computational Modeling of Degradation Process of Biodegradable Magnesium Biomaterials,” </w:t>
+        <w:t xml:space="preserve">21. D. Zhang, L. Zhang, X. Zhang, et al., “Comparative Investigation of the Corrosion Behavior of Biomedical Zinc Alloys in Oxygen-Enriched Simulated Body Fluid Environments,” </w:t>
       </w:r>
       <w:r>
         <w:rPr>
           <w:i/>
           <w:iCs/>
         </w:rPr>
-        <w:t>Corrosion Science</w:t>
+        <w:t>Materials Today Communications</w:t>
       </w:r>
       <w:r>
         <w:t xml:space="preserve"> </w:t>
@@ -22526,10 +21121,10 @@
           <w:i/>
           <w:iCs/>
         </w:rPr>
-        <w:t>190</w:t>
-      </w:r>
-      <w:r>
-        <w:t xml:space="preserve"> (2021): 109674, https://doi.org/10.1016/j.corsci.2021.109674.</w:t>
+        <w:t>39</w:t>
+      </w:r>
+      <w:r>
+        <w:t xml:space="preserve"> (2024): 108811, https://doi.org/10.1016/j.mtcomm.2024.108811.</w:t>
       </w:r>
     </w:p>
     <w:p>
@@ -22537,54 +21132,14 @@
         <w:pStyle w:val="Bibliography"/>
       </w:pPr>
       <w:r>
-        <w:t xml:space="preserve">19. P. </w:t>
-      </w:r>
-      <w:proofErr w:type="spellStart"/>
-      <w:r>
-        <w:t>Bajger</w:t>
-      </w:r>
-      <w:proofErr w:type="spellEnd"/>
-      <w:r>
-        <w:t xml:space="preserve">, J. M. A. </w:t>
-      </w:r>
-      <w:proofErr w:type="spellStart"/>
-      <w:r>
-        <w:t>Ashbourn</w:t>
-      </w:r>
-      <w:proofErr w:type="spellEnd"/>
-      <w:r>
-        <w:t xml:space="preserve">, V. </w:t>
-      </w:r>
-      <w:proofErr w:type="spellStart"/>
-      <w:r>
-        <w:t>Manhas</w:t>
-      </w:r>
-      <w:proofErr w:type="spellEnd"/>
-      <w:r>
-        <w:t xml:space="preserve">, Y. Guyot, K. </w:t>
-      </w:r>
-      <w:proofErr w:type="spellStart"/>
-      <w:r>
-        <w:t>Lietaert</w:t>
-      </w:r>
-      <w:proofErr w:type="spellEnd"/>
-      <w:r>
-        <w:t xml:space="preserve">, and L. Geris, “Mathematical Modelling of the Degradation </w:t>
-      </w:r>
-      <w:proofErr w:type="spellStart"/>
-      <w:r>
-        <w:t>Behaviour</w:t>
-      </w:r>
-      <w:proofErr w:type="spellEnd"/>
-      <w:r>
-        <w:t xml:space="preserve"> of Biodegradable Metals,” </w:t>
+        <w:t xml:space="preserve">22. A. P. Yadav, A. Nishikata, and T. Tsuru, “Oxygen Reduction Mechanism on Corroded Zinc,” </w:t>
       </w:r>
       <w:r>
         <w:rPr>
           <w:i/>
           <w:iCs/>
         </w:rPr>
-        <w:t>Biomechanics and Modeling in Mechanobiology</w:t>
+        <w:t>Journal of Electroanalytical Chemistry</w:t>
       </w:r>
       <w:r>
         <w:t xml:space="preserve"> </w:t>
@@ -22594,10 +21149,10 @@
           <w:i/>
           <w:iCs/>
         </w:rPr>
-        <w:t>16</w:t>
-      </w:r>
-      <w:r>
-        <w:t>, no. 1 (2017): 227–238, https://doi.org/10.1007/s10237-016-0812-3.</w:t>
+        <w:t>585</w:t>
+      </w:r>
+      <w:r>
+        <w:t>, no. 1 (2005): 142–149, https://doi.org/10.1016/j.jelechem.2005.08.007.</w:t>
       </w:r>
     </w:p>
     <w:p>
@@ -22605,30 +21160,14 @@
         <w:pStyle w:val="Bibliography"/>
       </w:pPr>
       <w:r>
-        <w:t xml:space="preserve">20. S. Thomas, N. V. </w:t>
-      </w:r>
-      <w:proofErr w:type="spellStart"/>
-      <w:r>
-        <w:t>Medhekar</w:t>
-      </w:r>
-      <w:proofErr w:type="spellEnd"/>
-      <w:r>
-        <w:t xml:space="preserve">, G. S. Frankel, and N. </w:t>
-      </w:r>
-      <w:proofErr w:type="spellStart"/>
-      <w:r>
-        <w:t>Birbilis</w:t>
-      </w:r>
-      <w:proofErr w:type="spellEnd"/>
-      <w:r>
-        <w:t xml:space="preserve">, “Corrosion Mechanism and Hydrogen Evolution on Mg,” </w:t>
+        <w:t xml:space="preserve">23. C. Chen, M. Hofmann, and T. Wallmersperger, “Modeling the Uniform Corrosion Behavior of Zinc in Salt Spray Testing,” </w:t>
       </w:r>
       <w:r>
         <w:rPr>
           <w:i/>
           <w:iCs/>
         </w:rPr>
-        <w:t>Current Opinion in Solid State and Materials Science</w:t>
+        <w:t>npj Materials Degradation</w:t>
       </w:r>
       <w:r>
         <w:t xml:space="preserve"> </w:t>
@@ -22638,10 +21177,10 @@
           <w:i/>
           <w:iCs/>
         </w:rPr>
-        <w:t>19</w:t>
-      </w:r>
-      <w:r>
-        <w:t>, no. 2 (2015): 85–94, https://doi.org/10.1016/j.cossms.2014.09.005.</w:t>
+        <w:t>10</w:t>
+      </w:r>
+      <w:r>
+        <w:t>, no. 1 (2026): 37, https://doi.org/10.1038/s41529-026-00749-0.</w:t>
       </w:r>
     </w:p>
     <w:p>
@@ -22649,14 +21188,14 @@
         <w:pStyle w:val="Bibliography"/>
       </w:pPr>
       <w:r>
-        <w:t xml:space="preserve">21. D. Zhang, L. Zhang, X. Zhang, et al., “Comparative Investigation of the Corrosion Behavior of Biomedical Zinc Alloys in Oxygen-Enriched Simulated Body Fluid Environments,” </w:t>
+        <w:t xml:space="preserve">24. V. A. Bryzgalov, A. A. Kistanov, A. A. Izosimov, and E. A. Korznikova, “Atomic-Scale Study of Lattice Distortion and Oxygen-Rich Environment Impact on the Surface Degradation Dynamics of Zinc-Based Alloys,” </w:t>
       </w:r>
       <w:r>
         <w:rPr>
           <w:i/>
           <w:iCs/>
         </w:rPr>
-        <w:t>Materials Today Communications</w:t>
+        <w:t>Computational Materials Science</w:t>
       </w:r>
       <w:r>
         <w:t xml:space="preserve"> </w:t>
@@ -22666,10 +21205,10 @@
           <w:i/>
           <w:iCs/>
         </w:rPr>
-        <w:t>39</w:t>
-      </w:r>
-      <w:r>
-        <w:t xml:space="preserve"> (2024): 108811, https://doi.org/10.1016/j.mtcomm.2024.108811.</w:t>
+        <w:t>252</w:t>
+      </w:r>
+      <w:r>
+        <w:t xml:space="preserve"> (2025): 113797, https://doi.org/10.1016/j.commatsci.2025.113797.</w:t>
       </w:r>
     </w:p>
     <w:p>
@@ -22677,30 +21216,14 @@
         <w:pStyle w:val="Bibliography"/>
       </w:pPr>
       <w:r>
-        <w:t xml:space="preserve">22. A. P. Yadav, A. </w:t>
-      </w:r>
-      <w:proofErr w:type="spellStart"/>
-      <w:r>
-        <w:t>Nishikata</w:t>
-      </w:r>
-      <w:proofErr w:type="spellEnd"/>
-      <w:r>
-        <w:t xml:space="preserve">, and T. </w:t>
-      </w:r>
-      <w:proofErr w:type="spellStart"/>
-      <w:r>
-        <w:t>Tsuru</w:t>
-      </w:r>
-      <w:proofErr w:type="spellEnd"/>
-      <w:r>
-        <w:t xml:space="preserve">, “Oxygen Reduction Mechanism on Corroded Zinc,” </w:t>
+        <w:t xml:space="preserve">25. T. AlBaraghtheh, R. Willumeit‐Römer, and B. Zeller‐Plumhoff, “Best Practices in Developing a Workflow for Uncertainty Quantification for Modeling the Biodegradation of Mg‐Based Implants,” </w:t>
       </w:r>
       <w:r>
         <w:rPr>
           <w:i/>
           <w:iCs/>
         </w:rPr>
-        <w:t>Journal of Electroanalytical Chemistry</w:t>
+        <w:t>Advanced Science</w:t>
       </w:r>
       <w:r>
         <w:t xml:space="preserve"> </w:t>
@@ -22710,10 +21233,10 @@
           <w:i/>
           <w:iCs/>
         </w:rPr>
-        <w:t>585</w:t>
-      </w:r>
-      <w:r>
-        <w:t>, no. 1 (2005): 142–149, https://doi.org/10.1016/j.jelechem.2005.08.007.</w:t>
+        <w:t>11</w:t>
+      </w:r>
+      <w:r>
+        <w:t>, no. 46 (2024): 2403543, https://doi.org/10.1002/advs.202403543.</w:t>
       </w:r>
     </w:p>
     <w:p>
@@ -22721,44 +21244,55 @@
         <w:pStyle w:val="Bibliography"/>
       </w:pPr>
       <w:r>
-        <w:t xml:space="preserve">23. C. Chen, M. Hofmann, and T. </w:t>
-      </w:r>
-      <w:proofErr w:type="spellStart"/>
-      <w:r>
-        <w:t>Wallmersperger</w:t>
-      </w:r>
-      <w:proofErr w:type="spellEnd"/>
-      <w:r>
-        <w:t xml:space="preserve">, “Modeling the Uniform Corrosion Behavior of Zinc in Salt Spray Testing,” </w:t>
-      </w:r>
-      <w:proofErr w:type="spellStart"/>
+        <w:t xml:space="preserve">26. S. Huang, W. Wu, Y. Su, L. Qiao, and Y. Yan, “Insight into the Corrosion Behaviour and Degradation Mechanism of Pure Zinc in Simulated Body Fluid,” </w:t>
+      </w:r>
       <w:r>
         <w:rPr>
           <w:i/>
           <w:iCs/>
         </w:rPr>
-        <w:t>npj</w:t>
-      </w:r>
-      <w:proofErr w:type="spellEnd"/>
+        <w:t>Corrosion Science</w:t>
+      </w:r>
+      <w:r>
+        <w:t xml:space="preserve"> </w:t>
+      </w:r>
       <w:r>
         <w:rPr>
           <w:i/>
           <w:iCs/>
         </w:rPr>
-        <w:t xml:space="preserve"> Materials Degradation</w:t>
-      </w:r>
-      <w:r>
-        <w:t xml:space="preserve"> </w:t>
+        <w:t>178</w:t>
+      </w:r>
+      <w:r>
+        <w:t xml:space="preserve"> (2021): 109071, https://doi.org/10.1016/j.corsci.2020.109071.</w:t>
+      </w:r>
+    </w:p>
+    <w:p>
+      <w:pPr>
+        <w:pStyle w:val="Bibliography"/>
+      </w:pPr>
+      <w:r>
+        <w:t xml:space="preserve">27. X. Liu, H. Yang, Y. Liu, et al., “Comparative Studies on Degradation Behavior of Pure Zinc in Various Simulated Body Fluids,” </w:t>
       </w:r>
       <w:r>
         <w:rPr>
           <w:i/>
           <w:iCs/>
         </w:rPr>
-        <w:t>10</w:t>
-      </w:r>
-      <w:r>
-        <w:t>, no. 1 (2026): 37, https://doi.org/10.1038/s41529-026-00749-0.</w:t>
+        <w:t>JOM</w:t>
+      </w:r>
+      <w:r>
+        <w:t xml:space="preserve"> </w:t>
+      </w:r>
+      <w:r>
+        <w:rPr>
+          <w:i/>
+          <w:iCs/>
+        </w:rPr>
+        <w:t>71</w:t>
+      </w:r>
+      <w:r>
+        <w:t>, no. 4 (2019): 1414–1425, https://doi.org/10.1007/s11837-019-03357-3.</w:t>
       </w:r>
     </w:p>
     <w:p>
@@ -22766,38 +21300,14 @@
         <w:pStyle w:val="Bibliography"/>
       </w:pPr>
       <w:r>
-        <w:t xml:space="preserve">24. V. A. Bryzgalov, A. A. </w:t>
-      </w:r>
-      <w:proofErr w:type="spellStart"/>
-      <w:r>
-        <w:t>Kistanov</w:t>
-      </w:r>
-      <w:proofErr w:type="spellEnd"/>
-      <w:r>
-        <w:t xml:space="preserve">, A. A. </w:t>
-      </w:r>
-      <w:proofErr w:type="spellStart"/>
-      <w:r>
-        <w:t>Izosimov</w:t>
-      </w:r>
-      <w:proofErr w:type="spellEnd"/>
-      <w:r>
-        <w:t xml:space="preserve">, and E. A. </w:t>
-      </w:r>
-      <w:proofErr w:type="spellStart"/>
-      <w:r>
-        <w:t>Korznikova</w:t>
-      </w:r>
-      <w:proofErr w:type="spellEnd"/>
-      <w:r>
-        <w:t xml:space="preserve">, “Atomic-Scale Study of Lattice Distortion and Oxygen-Rich Environment Impact on the Surface Degradation Dynamics of Zinc-Based Alloys,” </w:t>
+        <w:t xml:space="preserve">28. M. E. McMahon, R. J. Santucci, and J. R. Scully, “Advanced Chemical Stability Diagrams to Predict the Formation of Complex Zinc Compounds in a Chloride Environment,” </w:t>
       </w:r>
       <w:r>
         <w:rPr>
           <w:i/>
           <w:iCs/>
         </w:rPr>
-        <w:t>Computational Materials Science</w:t>
+        <w:t>RSC Advances</w:t>
       </w:r>
       <w:r>
         <w:t xml:space="preserve"> </w:t>
@@ -22807,10 +21317,10 @@
           <w:i/>
           <w:iCs/>
         </w:rPr>
-        <w:t>252</w:t>
-      </w:r>
-      <w:r>
-        <w:t xml:space="preserve"> (2025): 113797, https://doi.org/10.1016/j.commatsci.2025.113797.</w:t>
+        <w:t>9</w:t>
+      </w:r>
+      <w:r>
+        <w:t>, no. 35 (2019): 19905–19916, https://doi.org/10.1039/C9RA00228F.</w:t>
       </w:r>
     </w:p>
     <w:p>
@@ -22818,38 +21328,14 @@
         <w:pStyle w:val="Bibliography"/>
       </w:pPr>
       <w:r>
-        <w:t xml:space="preserve">25. T. </w:t>
-      </w:r>
-      <w:proofErr w:type="spellStart"/>
-      <w:r>
-        <w:t>AlBaraghtheh</w:t>
-      </w:r>
-      <w:proofErr w:type="spellEnd"/>
-      <w:r>
-        <w:t xml:space="preserve">, R. </w:t>
-      </w:r>
-      <w:proofErr w:type="spellStart"/>
-      <w:r>
-        <w:t>Willumeit‐Römer</w:t>
-      </w:r>
-      <w:proofErr w:type="spellEnd"/>
-      <w:r>
-        <w:t>, and B. Zeller‐</w:t>
-      </w:r>
-      <w:proofErr w:type="spellStart"/>
-      <w:r>
-        <w:t>Plumhoff</w:t>
-      </w:r>
-      <w:proofErr w:type="spellEnd"/>
-      <w:r>
-        <w:t xml:space="preserve">, “Best Practices in Developing a Workflow for Uncertainty Quantification for Modeling the Biodegradation of Mg‐Based Implants,” </w:t>
+        <w:t xml:space="preserve">29. R. M. Katona, J. Taylor, and R. F. Schaller, “Validating Corrosion Models: A Comparison of Governing Equations,” </w:t>
       </w:r>
       <w:r>
         <w:rPr>
           <w:i/>
           <w:iCs/>
         </w:rPr>
-        <w:t>Advanced Science</w:t>
+        <w:t>Corrosion Science</w:t>
       </w:r>
       <w:r>
         <w:t xml:space="preserve"> </w:t>
@@ -22859,10 +21345,10 @@
           <w:i/>
           <w:iCs/>
         </w:rPr>
-        <w:t>11</w:t>
-      </w:r>
-      <w:r>
-        <w:t>, no. 46 (2024): 2403543, https://doi.org/10.1002/advs.202403543.</w:t>
+        <w:t>259</w:t>
+      </w:r>
+      <w:r>
+        <w:t xml:space="preserve"> (2026): 113495, https://doi.org/10.1016/j.corsci.2025.113495.</w:t>
       </w:r>
     </w:p>
     <w:p>
@@ -22870,51 +21356,45 @@
         <w:pStyle w:val="Bibliography"/>
       </w:pPr>
       <w:r>
-        <w:t xml:space="preserve">26. S. Huang, W. Wu, Y. </w:t>
-      </w:r>
-      <w:proofErr w:type="spellStart"/>
-      <w:r>
-        <w:t>Su</w:t>
-      </w:r>
-      <w:proofErr w:type="spellEnd"/>
-      <w:r>
-        <w:t xml:space="preserve">, L. </w:t>
-      </w:r>
-      <w:proofErr w:type="spellStart"/>
-      <w:r>
-        <w:t>Qiao</w:t>
-      </w:r>
-      <w:proofErr w:type="spellEnd"/>
-      <w:r>
-        <w:t xml:space="preserve">, and Y. Yan, “Insight into the Corrosion </w:t>
-      </w:r>
-      <w:proofErr w:type="spellStart"/>
-      <w:r>
-        <w:t>Behaviour</w:t>
-      </w:r>
-      <w:proofErr w:type="spellEnd"/>
-      <w:r>
-        <w:t xml:space="preserve"> and Degradation Mechanism of Pure Zinc in Simulated Body Fluid,” </w:t>
+        <w:t xml:space="preserve">30. P. Grathwohl, “Diffusion in Natural Porous Media: Contaminant Transport, Sorption/Desorption and Dissolution Kinetics,” </w:t>
       </w:r>
       <w:r>
         <w:rPr>
           <w:i/>
           <w:iCs/>
         </w:rPr>
-        <w:t>Corrosion Science</w:t>
-      </w:r>
-      <w:r>
-        <w:t xml:space="preserve"> </w:t>
+        <w:t>Diffusion in Natural Porous Media: Contaminant Transport, Sorption/Desorption and Dissolution Kinetics</w:t>
+      </w:r>
+      <w:r>
+        <w:t>, Springer: Boston, MA 1998, https://doi.org/10.1007/978-1-4615-5683-1.</w:t>
+      </w:r>
+    </w:p>
+    <w:p>
+      <w:pPr>
+        <w:pStyle w:val="Bibliography"/>
+      </w:pPr>
+      <w:r>
+        <w:t xml:space="preserve">31. J. W. Wilder, C. Clemons, D. Golovaty, K. L. Kreider, G. W. Young, and R. S. Lillard, “An Adaptive Level Set Approach for Modeling Damage Due to Galvanic Corrosion,” </w:t>
       </w:r>
       <w:r>
         <w:rPr>
           <w:i/>
           <w:iCs/>
         </w:rPr>
-        <w:t>178</w:t>
-      </w:r>
-      <w:r>
-        <w:t xml:space="preserve"> (2021): 109071, https://doi.org/10.1016/j.corsci.2020.109071.</w:t>
+        <w:t>Journal of Engineering Mathematics</w:t>
+      </w:r>
+      <w:r>
+        <w:t xml:space="preserve"> </w:t>
+      </w:r>
+      <w:r>
+        <w:rPr>
+          <w:i/>
+          <w:iCs/>
+        </w:rPr>
+        <w:t>91</w:t>
+      </w:r>
+      <w:r>
+        <w:t>, no. 1 (2015): 121–142, https://doi.org/10.1007/s10665-014-9732-3.</w:t>
       </w:r>
     </w:p>
     <w:p>
@@ -22922,27 +21402,121 @@
         <w:pStyle w:val="Bibliography"/>
       </w:pPr>
       <w:r>
-        <w:t xml:space="preserve">27. X. Liu, H. Yang, Y. Liu, et al., “Comparative Studies on Degradation Behavior of Pure Zinc in Various Simulated Body Fluids,” </w:t>
+        <w:t xml:space="preserve">32. J. R. Rumble, Ed., “CRC Handbook of Chemistry and Physics,” </w:t>
       </w:r>
       <w:r>
         <w:rPr>
           <w:i/>
           <w:iCs/>
         </w:rPr>
-        <w:t>JOM</w:t>
+        <w:t>CRC handbook of chemistry and physics</w:t>
+      </w:r>
+      <w:r>
+        <w:t>, 98th edition 2017-2018., CRC Press, Taylor &amp; Francis Group: Boca Raton London New York 2017.</w:t>
+      </w:r>
+    </w:p>
+    <w:p>
+      <w:pPr>
+        <w:pStyle w:val="Bibliography"/>
+      </w:pPr>
+      <w:r>
+        <w:t>33. P. Han, and D. M. Bartels, “</w:t>
+      </w:r>
+      <w:r>
+        <w:rPr>
+          <w:b/>
+          <w:bCs/>
+        </w:rPr>
+        <w:t>Temperature Dependence of Oxygen Diffusion in</w:t>
       </w:r>
       <w:r>
         <w:t xml:space="preserve"> </w:t>
+      </w:r>
+      <w:r>
+        <w:rPr>
+          <w:b/>
+          <w:bCs/>
+        </w:rPr>
+        <w:t>H</w:t>
+      </w:r>
+      <w:r>
+        <w:t xml:space="preserve"> </w:t>
+      </w:r>
+      <w:r>
+        <w:rPr>
+          <w:b/>
+          <w:bCs/>
+          <w:vertAlign w:val="subscript"/>
+        </w:rPr>
+        <w:t>2</w:t>
+      </w:r>
+      <w:r>
+        <w:rPr>
+          <w:b/>
+          <w:bCs/>
+        </w:rPr>
+        <w:t xml:space="preserve"> </w:t>
+      </w:r>
+      <w:r>
+        <w:t xml:space="preserve"> </w:t>
+      </w:r>
+      <w:r>
+        <w:rPr>
+          <w:b/>
+          <w:bCs/>
+        </w:rPr>
+        <w:t>O and D</w:t>
+      </w:r>
+      <w:r>
+        <w:t xml:space="preserve"> </w:t>
+      </w:r>
+      <w:r>
+        <w:rPr>
+          <w:b/>
+          <w:bCs/>
+          <w:vertAlign w:val="subscript"/>
+        </w:rPr>
+        <w:t>2</w:t>
+      </w:r>
+      <w:r>
+        <w:rPr>
+          <w:b/>
+          <w:bCs/>
+        </w:rPr>
+        <w:t xml:space="preserve"> </w:t>
+      </w:r>
+      <w:r>
+        <w:t xml:space="preserve"> </w:t>
+      </w:r>
+      <w:r>
+        <w:rPr>
+          <w:b/>
+          <w:bCs/>
+        </w:rPr>
+        <w:t>O</w:t>
+      </w:r>
+      <w:r>
+        <w:t xml:space="preserve">,” </w:t>
       </w:r>
       <w:r>
         <w:rPr>
           <w:i/>
           <w:iCs/>
         </w:rPr>
-        <w:t>71</w:t>
-      </w:r>
-      <w:r>
-        <w:t>, no. 4 (2019): 1414–1425, https://doi.org/10.1007/s11837-019-03357-3.</w:t>
+        <w:t>The Journal of Physical Chemistry</w:t>
+      </w:r>
+      <w:r>
+        <w:t xml:space="preserve"> </w:t>
+      </w:r>
+      <w:r>
+        <w:rPr>
+          <w:i/>
+          <w:iCs/>
+        </w:rPr>
+        <w:t>100</w:t>
+      </w:r>
+      <w:r>
+        <w:t>, no. 13 (1996): 5597–5602, https://doi.org/10.1021/jp952903y.</w:t>
       </w:r>
     </w:p>
     <w:p>
@@ -22950,14 +21524,14 @@
         <w:pStyle w:val="Bibliography"/>
       </w:pPr>
       <w:r>
-        <w:t xml:space="preserve">28. M. E. McMahon, R. J. Santucci, and J. R. Scully, “Advanced Chemical Stability Diagrams to Predict the Formation of Complex Zinc Compounds in a Chloride Environment,” </w:t>
+        <w:t xml:space="preserve">34. S.-Y. Park, S.-H. Rho, H.-S. Lee, K.-M. Kim, and H.-C. Lee, “Fabrication of Highly Porous and Pure Zinc Oxide Films Using Modified DC Magnetron Sputtering and Post-Oxidation,” </w:t>
       </w:r>
       <w:r>
         <w:rPr>
           <w:i/>
           <w:iCs/>
         </w:rPr>
-        <w:t>RSC Advances</w:t>
+        <w:t>Materials</w:t>
       </w:r>
       <w:r>
         <w:t xml:space="preserve"> </w:t>
@@ -22967,10 +21541,10 @@
           <w:i/>
           <w:iCs/>
         </w:rPr>
-        <w:t>9</w:t>
-      </w:r>
-      <w:r>
-        <w:t>, no. 35 (2019): 19905–19916, https://doi.org/10.1039/C9RA00228F.</w:t>
+        <w:t>14</w:t>
+      </w:r>
+      <w:r>
+        <w:t>, no. 20 (2021): 6112, https://doi.org/10.3390/ma14206112.</w:t>
       </w:r>
     </w:p>
     <w:p>
@@ -22978,27 +21552,45 @@
         <w:pStyle w:val="Bibliography"/>
       </w:pPr>
       <w:r>
-        <w:t xml:space="preserve">29. R. M. Katona, J. Taylor, and R. F. Schaller, “Validating Corrosion Models: A Comparison of Governing Equations,” </w:t>
+        <w:t xml:space="preserve">35. L. Holzer, P. Marmet, M. Fingerle, A. Wiegmann, M. Neumann, and V. Schmidt, “Tortuosity-Porosity Relationships: Review of Empirical Data from Literature,” in </w:t>
       </w:r>
       <w:r>
         <w:rPr>
           <w:i/>
           <w:iCs/>
         </w:rPr>
-        <w:t>Corrosion Science</w:t>
-      </w:r>
-      <w:r>
-        <w:t xml:space="preserve"> </w:t>
+        <w:t>Tortuosity and Microstructure Effects in Porous Media</w:t>
+      </w:r>
+      <w:r>
+        <w:t>, Vol. 333, Springer International Publishing: Cham 2023, pp. 51–89, https://doi.org/10.1007/978-3-031-30477-4_3.</w:t>
+      </w:r>
+    </w:p>
+    <w:p>
+      <w:pPr>
+        <w:pStyle w:val="Bibliography"/>
+      </w:pPr>
+      <w:r>
+        <w:t xml:space="preserve">36. J. Tkacz, K. Slouková, J. Minda, et al., “Influence of the Composition of the Hank’s Balanced Salt Solution on the Corrosion Behavior of AZ31 and AZ61 Magnesium Alloys,” </w:t>
       </w:r>
       <w:r>
         <w:rPr>
           <w:i/>
           <w:iCs/>
         </w:rPr>
-        <w:t>259</w:t>
-      </w:r>
-      <w:r>
-        <w:t xml:space="preserve"> (2026): 113495, https://doi.org/10.1016/j.corsci.2025.113495.</w:t>
+        <w:t>Metals</w:t>
+      </w:r>
+      <w:r>
+        <w:t xml:space="preserve"> </w:t>
+      </w:r>
+      <w:r>
+        <w:rPr>
+          <w:i/>
+          <w:iCs/>
+        </w:rPr>
+        <w:t>7</w:t>
+      </w:r>
+      <w:r>
+        <w:t>, no. 11 (2017): 465, https://doi.org/10.3390/met7110465.</w:t>
       </w:r>
     </w:p>
     <w:p>
@@ -23006,17 +21598,27 @@
         <w:pStyle w:val="Bibliography"/>
       </w:pPr>
       <w:r>
-        <w:t xml:space="preserve">30. P. Grathwohl, “Diffusion in Natural Porous Media: Contaminant Transport, Sorption/Desorption and Dissolution Kinetics,” </w:t>
+        <w:t xml:space="preserve">37. T. Kokubo, and H. Takadama, “How Useful Is SBF in Predicting in Vivo Bone Bioactivity?,” </w:t>
       </w:r>
       <w:r>
         <w:rPr>
           <w:i/>
           <w:iCs/>
         </w:rPr>
-        <w:t>Diffusion in Natural Porous Media: Contaminant Transport, Sorption/Desorption and Dissolution Kinetics</w:t>
-      </w:r>
-      <w:r>
-        <w:t>, Springer: Boston, MA 1998, https://doi.org/10.1007/978-1-4615-5683-1.</w:t>
+        <w:t>Biomaterials</w:t>
+      </w:r>
+      <w:r>
+        <w:t xml:space="preserve"> </w:t>
+      </w:r>
+      <w:r>
+        <w:rPr>
+          <w:i/>
+          <w:iCs/>
+        </w:rPr>
+        <w:t>27</w:t>
+      </w:r>
+      <w:r>
+        <w:t>, no. 15 (2006): 2907–2915, https://doi.org/10.1016/j.biomaterials.2006.01.017.</w:t>
       </w:r>
     </w:p>
     <w:p>
@@ -23024,22 +21626,14 @@
         <w:pStyle w:val="Bibliography"/>
       </w:pPr>
       <w:r>
-        <w:t xml:space="preserve">31. J. W. Wilder, C. Clemons, D. </w:t>
-      </w:r>
-      <w:proofErr w:type="spellStart"/>
-      <w:r>
-        <w:t>Golovaty</w:t>
-      </w:r>
-      <w:proofErr w:type="spellEnd"/>
-      <w:r>
-        <w:t xml:space="preserve">, K. L. Kreider, G. W. Young, and R. S. Lillard, “An Adaptive Level Set Approach for Modeling Damage Due to Galvanic Corrosion,” </w:t>
+        <w:t xml:space="preserve">38. L. Liu, Y. Meng, C. Dong, Y. Yan, A. A. Volinsky, and L.-N. Wang, “Initial Formation of Corrosion Products on Pure Zinc in Simulated Body Fluid,” </w:t>
       </w:r>
       <w:r>
         <w:rPr>
           <w:i/>
           <w:iCs/>
         </w:rPr>
-        <w:t>Journal of Engineering Mathematics</w:t>
+        <w:t>Journal of Materials Science &amp; Technology</w:t>
       </w:r>
       <w:r>
         <w:t xml:space="preserve"> </w:t>
@@ -23049,10 +21643,10 @@
           <w:i/>
           <w:iCs/>
         </w:rPr>
-        <w:t>91</w:t>
-      </w:r>
-      <w:r>
-        <w:t>, no. 1 (2015): 121–142, https://doi.org/10.1007/s10665-014-9732-3.</w:t>
+        <w:t>34</w:t>
+      </w:r>
+      <w:r>
+        <w:t>, no. 12 (2018): 2271–2282, https://doi.org/10.1016/j.jmst.2018.05.005.</w:t>
       </w:r>
     </w:p>
     <w:p>
@@ -23060,397 +21654,15 @@
         <w:pStyle w:val="Bibliography"/>
       </w:pPr>
       <w:r>
-        <w:t xml:space="preserve">32. J. R. Rumble, Ed., “CRC Handbook of Chemistry and Physics,” </w:t>
+        <w:t xml:space="preserve">39. E. Mostaed, M. Sikora-Jasinska, J. W. Drelich, and M. Vedani, “Zinc-Based Alloys for Degradable Vascular Stent Applications,” </w:t>
       </w:r>
       <w:r>
         <w:rPr>
           <w:i/>
           <w:iCs/>
         </w:rPr>
-        <w:t>CRC handbook of chemistry and physics</w:t>
-      </w:r>
-      <w:r>
-        <w:t>, 98th edition 2017-2018., CRC Press, Taylor &amp; Francis Group: Boca Raton London New York 2017.</w:t>
-      </w:r>
-    </w:p>
-    <w:p>
-      <w:pPr>
-        <w:pStyle w:val="Bibliography"/>
-      </w:pPr>
-      <w:r>
-        <w:t>33. P. Han, and D. M. Bartels, “</w:t>
-      </w:r>
-      <w:r>
-        <w:rPr>
-          <w:b/>
-          <w:bCs/>
-        </w:rPr>
-        <w:t>Temperature Dependence of Oxygen Diffusion in</w:t>
-      </w:r>
-      <w:r>
-        <w:t xml:space="preserve"> </w:t>
-      </w:r>
-      <w:r>
-        <w:rPr>
-          <w:b/>
-          <w:bCs/>
-        </w:rPr>
-        <w:t>H</w:t>
-      </w:r>
-      <w:r>
-        <w:t xml:space="preserve"> </w:t>
-      </w:r>
-      <w:proofErr w:type="gramStart"/>
-      <w:r>
-        <w:rPr>
-          <w:b/>
-          <w:bCs/>
-          <w:vertAlign w:val="subscript"/>
-        </w:rPr>
-        <w:t>2</w:t>
-      </w:r>
-      <w:r>
-        <w:rPr>
-          <w:b/>
-          <w:bCs/>
-        </w:rPr>
-        <w:t xml:space="preserve"> </w:t>
-      </w:r>
-      <w:r>
-        <w:t xml:space="preserve"> </w:t>
-      </w:r>
-      <w:r>
-        <w:rPr>
-          <w:b/>
-          <w:bCs/>
-        </w:rPr>
-        <w:t>O</w:t>
-      </w:r>
-      <w:proofErr w:type="gramEnd"/>
-      <w:r>
-        <w:rPr>
-          <w:b/>
-          <w:bCs/>
-        </w:rPr>
-        <w:t xml:space="preserve"> and D</w:t>
-      </w:r>
-      <w:r>
-        <w:t xml:space="preserve"> </w:t>
-      </w:r>
-      <w:r>
-        <w:rPr>
-          <w:b/>
-          <w:bCs/>
-          <w:vertAlign w:val="subscript"/>
-        </w:rPr>
-        <w:t>2</w:t>
-      </w:r>
-      <w:r>
-        <w:rPr>
-          <w:b/>
-          <w:bCs/>
-        </w:rPr>
-        <w:t xml:space="preserve"> </w:t>
-      </w:r>
-      <w:r>
-        <w:t xml:space="preserve"> </w:t>
-      </w:r>
-      <w:r>
-        <w:rPr>
-          <w:b/>
-          <w:bCs/>
-        </w:rPr>
-        <w:t>O</w:t>
-      </w:r>
-      <w:r>
-        <w:t xml:space="preserve">,” </w:t>
-      </w:r>
-      <w:r>
-        <w:rPr>
-          <w:i/>
-          <w:iCs/>
-        </w:rPr>
-        <w:t>The Journal of Physical Chemistry</w:t>
-      </w:r>
-      <w:r>
-        <w:t xml:space="preserve"> </w:t>
-      </w:r>
-      <w:r>
-        <w:rPr>
-          <w:i/>
-          <w:iCs/>
-        </w:rPr>
-        <w:t>100</w:t>
-      </w:r>
-      <w:r>
-        <w:t>, no. 13 (1996): 5597–5602, https://doi.org/10.1021/jp952903y.</w:t>
-      </w:r>
-    </w:p>
-    <w:p>
-      <w:pPr>
-        <w:pStyle w:val="Bibliography"/>
-      </w:pPr>
-      <w:r>
-        <w:t xml:space="preserve">34. S.-Y. Park, S.-H. Rho, H.-S. Lee, K.-M. Kim, and H.-C. Lee, “Fabrication of Highly Porous and Pure Zinc Oxide Films Using Modified DC Magnetron Sputtering and Post-Oxidation,” </w:t>
-      </w:r>
-      <w:r>
-        <w:rPr>
-          <w:i/>
-          <w:iCs/>
-        </w:rPr>
-        <w:t>Materials</w:t>
-      </w:r>
-      <w:r>
-        <w:t xml:space="preserve"> </w:t>
-      </w:r>
-      <w:r>
-        <w:rPr>
-          <w:i/>
-          <w:iCs/>
-        </w:rPr>
-        <w:t>14</w:t>
-      </w:r>
-      <w:r>
-        <w:t>, no. 20 (2021): 6112, https://doi.org/10.3390/ma14206112.</w:t>
-      </w:r>
-    </w:p>
-    <w:p>
-      <w:pPr>
-        <w:pStyle w:val="Bibliography"/>
-      </w:pPr>
-      <w:r>
-        <w:t xml:space="preserve">35. L. Holzer, P. </w:t>
-      </w:r>
-      <w:proofErr w:type="spellStart"/>
-      <w:r>
-        <w:t>Marmet</w:t>
-      </w:r>
-      <w:proofErr w:type="spellEnd"/>
-      <w:r>
-        <w:t xml:space="preserve">, M. </w:t>
-      </w:r>
-      <w:proofErr w:type="spellStart"/>
-      <w:r>
-        <w:t>Fingerle</w:t>
-      </w:r>
-      <w:proofErr w:type="spellEnd"/>
-      <w:r>
-        <w:t xml:space="preserve">, A. </w:t>
-      </w:r>
-      <w:proofErr w:type="spellStart"/>
-      <w:r>
-        <w:t>Wiegmann</w:t>
-      </w:r>
-      <w:proofErr w:type="spellEnd"/>
-      <w:r>
-        <w:t xml:space="preserve">, M. Neumann, and V. Schmidt, “Tortuosity-Porosity Relationships: Review of Empirical Data from Literature,” in </w:t>
-      </w:r>
-      <w:r>
-        <w:rPr>
-          <w:i/>
-          <w:iCs/>
-        </w:rPr>
-        <w:t>Tortuosity and Microstructure Effects in Porous Media</w:t>
-      </w:r>
-      <w:r>
-        <w:t>, Vol. 333, Springer International Publishing: Cham 2023, pp. 51–89, https://doi.org/10.1007/978-3-031-30477-4_3.</w:t>
-      </w:r>
-    </w:p>
-    <w:p>
-      <w:pPr>
-        <w:pStyle w:val="Bibliography"/>
-      </w:pPr>
-      <w:r>
-        <w:t xml:space="preserve">36. J. </w:t>
-      </w:r>
-      <w:proofErr w:type="spellStart"/>
-      <w:r>
-        <w:t>Tkacz</w:t>
-      </w:r>
-      <w:proofErr w:type="spellEnd"/>
-      <w:r>
-        <w:t xml:space="preserve">, K. </w:t>
-      </w:r>
-      <w:proofErr w:type="spellStart"/>
-      <w:r>
-        <w:t>Slouková</w:t>
-      </w:r>
-      <w:proofErr w:type="spellEnd"/>
-      <w:r>
-        <w:t xml:space="preserve">, J. </w:t>
-      </w:r>
-      <w:proofErr w:type="spellStart"/>
-      <w:r>
-        <w:t>Minda</w:t>
-      </w:r>
-      <w:proofErr w:type="spellEnd"/>
-      <w:r>
-        <w:t xml:space="preserve">, et al., “Influence of the Composition of the Hank’s Balanced Salt Solution on the Corrosion Behavior of AZ31 and AZ61 Magnesium Alloys,” </w:t>
-      </w:r>
-      <w:r>
-        <w:rPr>
-          <w:i/>
-          <w:iCs/>
-        </w:rPr>
-        <w:t>Metals</w:t>
-      </w:r>
-      <w:r>
-        <w:t xml:space="preserve"> </w:t>
-      </w:r>
-      <w:r>
-        <w:rPr>
-          <w:i/>
-          <w:iCs/>
-        </w:rPr>
-        <w:t>7</w:t>
-      </w:r>
-      <w:r>
-        <w:t>, no. 11 (2017): 465, https://doi.org/10.3390/met7110465.</w:t>
-      </w:r>
-    </w:p>
-    <w:p>
-      <w:pPr>
-        <w:pStyle w:val="Bibliography"/>
-      </w:pPr>
-      <w:r>
-        <w:t xml:space="preserve">37. T. </w:t>
-      </w:r>
-      <w:proofErr w:type="spellStart"/>
-      <w:r>
-        <w:t>Kokubo</w:t>
-      </w:r>
-      <w:proofErr w:type="spellEnd"/>
-      <w:r>
-        <w:t xml:space="preserve">, and H. </w:t>
-      </w:r>
-      <w:proofErr w:type="spellStart"/>
-      <w:r>
-        <w:t>Takadama</w:t>
-      </w:r>
-      <w:proofErr w:type="spellEnd"/>
-      <w:r>
-        <w:t xml:space="preserve">, “How Useful Is SBF in Predicting in Vivo Bone </w:t>
-      </w:r>
-      <w:proofErr w:type="gramStart"/>
-      <w:r>
-        <w:t>Bioactivity?,</w:t>
-      </w:r>
-      <w:proofErr w:type="gramEnd"/>
-      <w:r>
-        <w:t xml:space="preserve">” </w:t>
-      </w:r>
-      <w:r>
-        <w:rPr>
-          <w:i/>
-          <w:iCs/>
-        </w:rPr>
-        <w:t>Biomaterials</w:t>
-      </w:r>
-      <w:r>
-        <w:t xml:space="preserve"> </w:t>
-      </w:r>
-      <w:r>
-        <w:rPr>
-          <w:i/>
-          <w:iCs/>
-        </w:rPr>
-        <w:t>27</w:t>
-      </w:r>
-      <w:r>
-        <w:t>, no. 15 (2006): 2907–2915, https://doi.org/10.1016/j.biomaterials.2006.01.017.</w:t>
-      </w:r>
-    </w:p>
-    <w:p>
-      <w:pPr>
-        <w:pStyle w:val="Bibliography"/>
-      </w:pPr>
-      <w:r>
-        <w:t xml:space="preserve">38. L. Liu, Y. Meng, C. Dong, Y. Yan, A. A. </w:t>
-      </w:r>
-      <w:proofErr w:type="spellStart"/>
-      <w:r>
-        <w:t>Volinsky</w:t>
-      </w:r>
-      <w:proofErr w:type="spellEnd"/>
-      <w:r>
-        <w:t xml:space="preserve">, and L.-N. Wang, “Initial Formation of Corrosion Products on Pure Zinc in Simulated Body Fluid,” </w:t>
-      </w:r>
-      <w:r>
-        <w:rPr>
-          <w:i/>
-          <w:iCs/>
-        </w:rPr>
-        <w:t>Journal of Materials Science &amp; Technology</w:t>
-      </w:r>
-      <w:r>
-        <w:t xml:space="preserve"> </w:t>
-      </w:r>
-      <w:r>
-        <w:rPr>
-          <w:i/>
-          <w:iCs/>
-        </w:rPr>
-        <w:t>34</w:t>
-      </w:r>
-      <w:r>
-        <w:t>, no. 12 (2018): 2271–2282, https://doi.org/10.1016/j.jmst.2018.05.005.</w:t>
-      </w:r>
-    </w:p>
-    <w:p>
-      <w:pPr>
-        <w:pStyle w:val="Bibliography"/>
-      </w:pPr>
-      <w:r>
-        <w:t xml:space="preserve">39. E. </w:t>
-      </w:r>
-      <w:proofErr w:type="spellStart"/>
-      <w:r>
-        <w:t>Mostaed</w:t>
-      </w:r>
-      <w:proofErr w:type="spellEnd"/>
-      <w:r>
-        <w:t>, M. Sikora-</w:t>
-      </w:r>
-      <w:proofErr w:type="spellStart"/>
-      <w:r>
-        <w:t>Jasinska</w:t>
-      </w:r>
-      <w:proofErr w:type="spellEnd"/>
-      <w:r>
-        <w:t xml:space="preserve">, J. W. </w:t>
-      </w:r>
-      <w:proofErr w:type="spellStart"/>
-      <w:r>
-        <w:t>Drelich</w:t>
-      </w:r>
-      <w:proofErr w:type="spellEnd"/>
-      <w:r>
-        <w:t xml:space="preserve">, and M. </w:t>
-      </w:r>
-      <w:proofErr w:type="spellStart"/>
-      <w:r>
-        <w:t>Vedani</w:t>
-      </w:r>
-      <w:proofErr w:type="spellEnd"/>
-      <w:r>
-        <w:t xml:space="preserve">, “Zinc-Based Alloys for Degradable Vascular Stent Applications,” </w:t>
-      </w:r>
-      <w:r>
-        <w:rPr>
-          <w:i/>
-          <w:iCs/>
-        </w:rPr>
-        <w:t xml:space="preserve">Acta </w:t>
-      </w:r>
-      <w:proofErr w:type="spellStart"/>
-      <w:r>
-        <w:rPr>
-          <w:i/>
-          <w:iCs/>
-        </w:rPr>
-        <w:t>Biomaterialia</w:t>
-      </w:r>
-      <w:proofErr w:type="spellEnd"/>
+        <w:t>Acta Biomaterialia</w:t>
+      </w:r>
       <w:r>
         <w:t xml:space="preserve"> </w:t>
       </w:r>

</xml_diff>

<commit_message>
Manuscript: molar F and F_max, j_ORR flux equations, interface-sink wording, Table 1 molar concentrations
Co-Authored-By: Claude Sonnet 5.5 <noreply@anthropic.com>
Claude-Session: https://claude.ai/code/session_01Y1g9vByMLTE8eGJ9K81zt6
</commit_message>
<xml_diff>
--- a/deliver/Manuscript_tracked.docx
+++ b/deliver/Manuscript_tracked.docx
@@ -27,7 +27,15 @@
         <w:spacing w:line="360" w:lineRule="auto"/>
       </w:pPr>
       <w:r>
-        <w:t>Henaka Ariyarathna, Xuan Yang, Aijun Huang, Yunlong Tang</w:t>
+        <w:t xml:space="preserve">Henaka Ariyarathna, Xuan Yang, </w:t>
+      </w:r>
+      <w:proofErr w:type="spellStart"/>
+      <w:r>
+        <w:t>Aijun</w:t>
+      </w:r>
+      <w:proofErr w:type="spellEnd"/>
+      <w:r>
+        <w:t xml:space="preserve"> Huang, Yunlong Tang</w:t>
       </w:r>
       <m:oMath>
         <m:sSup>
@@ -1226,7 +1234,11 @@
         <w:t>Computational–experimental workflow for developing, calibrating, validating, and applying the mechanistic Zn biodegradation model</w:t>
       </w:r>
       <w:r>
-        <w:t>. (a) Reaction–diffusion model coupling species transport and corrosion-product evolution with moving-interface tracking; (b) calibration of the three effective kinetic parameters (k</w:t>
+        <w:t>. (a) Reaction–diffusion model coupling species transport and corrosion-product evolution with moving-interface tracking; (b) calibration of the three effective kinetic parameters (</w:t>
+      </w:r>
+      <w:proofErr w:type="spellStart"/>
+      <w:r>
+        <w:t>k</w:t>
       </w:r>
       <w:r>
         <w:rPr>
@@ -1234,8 +1246,13 @@
         </w:rPr>
         <w:t>f</w:t>
       </w:r>
-      <w:r>
-        <w:t>, k</w:t>
+      <w:proofErr w:type="spellEnd"/>
+      <w:r>
+        <w:t xml:space="preserve">, </w:t>
+      </w:r>
+      <w:proofErr w:type="spellStart"/>
+      <w:r>
+        <w:t>k</w:t>
       </w:r>
       <w:r>
         <w:rPr>
@@ -1243,8 +1260,13 @@
         </w:rPr>
         <w:t>d</w:t>
       </w:r>
-      <w:r>
-        <w:t>, k</w:t>
+      <w:proofErr w:type="spellEnd"/>
+      <w:r>
+        <w:t xml:space="preserve">, </w:t>
+      </w:r>
+      <w:proofErr w:type="spellStart"/>
+      <w:r>
+        <w:t>k</w:t>
       </w:r>
       <w:r>
         <w:rPr>
@@ -1252,6 +1274,7 @@
         </w:rPr>
         <w:t>ORR</w:t>
       </w:r>
+      <w:proofErr w:type="spellEnd"/>
       <w:r>
         <w:t>) against literature mass-loss data (0–336 h); (c) validation against the mass loss measured in this study (0–672 h) for Ø10 × 2 mm discs; and (d) model predictions for a six-crown Zn stent.</w:t>
       </w:r>
@@ -1283,7 +1306,21 @@
         <w:rPr>
           <w:rFonts w:cs="Times New Roman"/>
         </w:rPr>
-        <w:t xml:space="preserve">Commercially pure Zn (99.99 wt%) was processed by casting, homogenization, and hot extrusion to produce fully dense rods (10 mm diameter), from which disc specimens (10 mm diameter, 2 mm thickness) were prepared. Prior to testing, specimens were mechanically ground through successive silicon carbide abrasive grades and finished with </w:t>
+        <w:t xml:space="preserve">Commercially pure Zn (99.99 </w:t>
+      </w:r>
+      <w:proofErr w:type="spellStart"/>
+      <w:r>
+        <w:rPr>
+          <w:rFonts w:cs="Times New Roman"/>
+        </w:rPr>
+        <w:t>wt</w:t>
+      </w:r>
+      <w:proofErr w:type="spellEnd"/>
+      <w:r>
+        <w:rPr>
+          <w:rFonts w:cs="Times New Roman"/>
+        </w:rPr>
+        <w:t xml:space="preserve">%) was processed by casting, homogenization, and hot extrusion to produce fully dense rods (10 mm diameter), from which disc specimens (10 mm diameter, 2 mm thickness) were prepared. Prior to testing, specimens were mechanically ground through successive silicon carbide abrasive grades and finished with </w:t>
       </w:r>
       <m:oMath>
         <m:r>
@@ -2907,7 +2944,35 @@
         <w:rPr>
           <w:rFonts w:cs="Times New Roman"/>
         </w:rPr>
-        <w:t>Although phosphate and carbonate species may contribute to the formation of secondary corrosion products such as hopeite, smithsonite, and simonkolleite at longer timescales </w:t>
+        <w:t xml:space="preserve">Although phosphate and carbonate species may contribute to the formation of secondary corrosion products such as </w:t>
+      </w:r>
+      <w:proofErr w:type="spellStart"/>
+      <w:r>
+        <w:rPr>
+          <w:rFonts w:cs="Times New Roman"/>
+        </w:rPr>
+        <w:t>hopeite</w:t>
+      </w:r>
+      <w:proofErr w:type="spellEnd"/>
+      <w:r>
+        <w:rPr>
+          <w:rFonts w:cs="Times New Roman"/>
+        </w:rPr>
+        <w:t xml:space="preserve">, smithsonite, and </w:t>
+      </w:r>
+      <w:proofErr w:type="spellStart"/>
+      <w:r>
+        <w:rPr>
+          <w:rFonts w:cs="Times New Roman"/>
+        </w:rPr>
+        <w:t>simonkolleite</w:t>
+      </w:r>
+      <w:proofErr w:type="spellEnd"/>
+      <w:r>
+        <w:rPr>
+          <w:rFonts w:cs="Times New Roman"/>
+        </w:rPr>
+        <w:t xml:space="preserve"> at longer timescales </w:t>
       </w:r>
       <w:r>
         <w:rPr>
@@ -2956,7 +3021,21 @@
         <w:rPr>
           <w:rFonts w:cs="Times New Roman"/>
         </w:rPr>
-        <w:t>the corrosion products are modeled as a single ZnO phase.</w:t>
+        <w:t xml:space="preserve">the corrosion products are modeled as a single </w:t>
+      </w:r>
+      <w:proofErr w:type="spellStart"/>
+      <w:r>
+        <w:rPr>
+          <w:rFonts w:cs="Times New Roman"/>
+        </w:rPr>
+        <w:t>ZnO</w:t>
+      </w:r>
+      <w:proofErr w:type="spellEnd"/>
+      <w:r>
+        <w:rPr>
+          <w:rFonts w:cs="Times New Roman"/>
+        </w:rPr>
+        <w:t xml:space="preserve"> phase.</w:t>
       </w:r>
     </w:p>
     <w:p>
@@ -3790,8 +3869,18 @@
         <w:t xml:space="preserve">) </w:t>
       </w:r>
       <w:r>
-        <w:t>together with the corrosion-product coverage</w:t>
-      </w:r>
+        <w:t xml:space="preserve">together with the corrosion-product </w:t>
+      </w:r>
+      <w:del w:id="9002" w:author="Claude" w:date="2026-10-09T06:37:03Z">
+        <w:r>
+          <w:delText xml:space="preserve">coverage</w:delText>
+        </w:r>
+      </w:del>
+      <w:ins w:id="9001" w:author="Claude" w:date="2026-10-09T06:37:03Z">
+        <w:r>
+          <w:t xml:space="preserve">concentration</w:t>
+        </w:r>
+      </w:ins>
       <w:r>
         <w:rPr>
           <w:rFonts w:cs="Times New Roman"/>
@@ -3888,6 +3977,162 @@
       <w:r>
         <w:t xml:space="preserve">. The reaction term was applied exclusively at the moving Zn–electrolyte interface, such that oxygen must diffuse to the Zn surface before being consumed. </w:t>
       </w:r>
+    </w:p>
+    <w:p>
+      <w:pPr>
+        <w:pStyle w:val="BodyText"/>
+        <w:rPr>
+          <w:ins w:id="20002" w:author="Claude" w:date="2026-10-09T06:37:03Z"/>
+        </w:rPr>
+      </w:pPr>
+      <w:ins w:id="20001" w:author="Claude" w:date="2026-10-09T06:37:03Z">
+        <w:r>
+          <w:t xml:space="preserve">F is the molar concentration of ZnO-equivalent corrosion product per unit corrosion-product-region volume (mol mm⁻³), and all concentrations are molar (mol mm⁻³). The oxygen-reduction (ORR) molar flux at the interface is defined as</w:t>
+        </w:r>
+      </w:ins>
+    </w:p>
+    <w:p>
+      <w:pPr>
+        <w:pStyle w:val="BodyText"/>
+        <w:rPr>
+          <w:ins w:id="20021" w:author="Claude" w:date="2026-10-09T06:37:03Z"/>
+        </w:rPr>
+      </w:pPr>
+      <m:oMath>
+        <m:sSub>
+          <m:e>
+            <m:r>
+              <w:rPr>
+                <w:ins w:id="20012" w:author="Claude" w:date="2026-10-09T06:37:03Z"/>
+                <w:ins w:id="20003" w:author="Claude" w:date="2026-10-09T06:37:03Z"/>
+              </w:rPr>
+              <m:t xml:space="preserve">j</m:t>
+            </m:r>
+          </m:e>
+          <m:sub>
+            <m:r>
+              <w:rPr>
+                <w:ins w:id="20013" w:author="Claude" w:date="2026-10-09T06:37:03Z"/>
+                <w:ins w:id="20004" w:author="Claude" w:date="2026-10-09T06:37:03Z"/>
+              </w:rPr>
+              <m:t xml:space="preserve">ORR</m:t>
+            </m:r>
+          </m:sub>
+        </m:sSub>
+        <m:r>
+          <w:rPr>
+            <w:ins w:id="20014" w:author="Claude" w:date="2026-10-09T06:37:03Z"/>
+            <w:ins w:id="20005" w:author="Claude" w:date="2026-10-09T06:37:03Z"/>
+          </w:rPr>
+          <m:t xml:space="preserve">=</m:t>
+        </m:r>
+        <m:sSub>
+          <m:e>
+            <m:r>
+              <w:rPr>
+                <w:ins w:id="20015" w:author="Claude" w:date="2026-10-09T06:37:03Z"/>
+                <w:ins w:id="20006" w:author="Claude" w:date="2026-10-09T06:37:03Z"/>
+              </w:rPr>
+              <m:t xml:space="preserve">k</m:t>
+            </m:r>
+          </m:e>
+          <m:sub>
+            <m:r>
+              <w:rPr>
+                <w:ins w:id="20016" w:author="Claude" w:date="2026-10-09T06:37:03Z"/>
+                <w:ins w:id="20007" w:author="Claude" w:date="2026-10-09T06:37:03Z"/>
+              </w:rPr>
+              <m:t xml:space="preserve">ORR</m:t>
+            </m:r>
+          </m:sub>
+        </m:sSub>
+        <m:sSub>
+          <m:e>
+            <m:r>
+              <w:rPr>
+                <w:ins w:id="20017" w:author="Claude" w:date="2026-10-09T06:37:03Z"/>
+                <w:ins w:id="20008" w:author="Claude" w:date="2026-10-09T06:37:03Z"/>
+              </w:rPr>
+              <m:t xml:space="preserve">C</m:t>
+            </m:r>
+          </m:e>
+          <m:sub>
+            <m:r>
+              <w:rPr>
+                <w:ins w:id="20018" w:author="Claude" w:date="2026-10-09T06:37:03Z"/>
+                <w:ins w:id="20009" w:author="Claude" w:date="2026-10-09T06:37:03Z"/>
+              </w:rPr>
+              <m:t xml:space="preserve">O₂</m:t>
+            </m:r>
+          </m:sub>
+        </m:sSub>
+        <m:r>
+          <w:rPr>
+            <w:ins w:id="20019" w:author="Claude" w:date="2026-10-09T06:37:03Z"/>
+            <w:ins w:id="20010" w:author="Claude" w:date="2026-10-09T06:37:03Z"/>
+          </w:rPr>
+          <m:t xml:space="preserve">|Γ</m:t>
+        </m:r>
+        <m:r>
+          <w:rPr>
+            <w:ins w:id="20020" w:author="Claude" w:date="2026-10-09T06:37:03Z"/>
+            <w:ins w:id="20011" w:author="Claude" w:date="2026-10-09T06:37:03Z"/>
+          </w:rPr>
+          <m:t xml:space="preserve"> [mol mm⁻² h⁻¹]</m:t>
+        </m:r>
+      </m:oMath>
+    </w:p>
+    <w:p>
+      <w:pPr>
+        <w:pStyle w:val="BodyText"/>
+        <w:rPr>
+          <w:ins w:id="20029" w:author="Claude" w:date="2026-10-09T06:37:03Z"/>
+        </w:rPr>
+      </w:pPr>
+      <w:ins w:id="20022" w:author="Claude" w:date="2026-10-09T06:37:03Z">
+        <w:r>
+          <w:t xml:space="preserve">where k</w:t>
+        </w:r>
+      </w:ins>
+      <w:ins w:id="20023" w:author="Claude" w:date="2026-10-09T06:37:03Z">
+        <w:r>
+          <w:rPr>
+            <w:vertAlign w:val="subscript"/>
+          </w:rPr>
+          <w:t xml:space="preserve">ORR</w:t>
+        </w:r>
+      </w:ins>
+      <w:ins w:id="20024" w:author="Claude" w:date="2026-10-09T06:37:03Z">
+        <w:r>
+          <w:t xml:space="preserve"> is a velocity (mm h⁻¹) and C</w:t>
+        </w:r>
+      </w:ins>
+      <w:ins w:id="20025" w:author="Claude" w:date="2026-10-09T06:37:03Z">
+        <w:r>
+          <w:rPr>
+            <w:vertAlign w:val="subscript"/>
+          </w:rPr>
+          <w:t xml:space="preserve">O2</w:t>
+        </w:r>
+      </w:ins>
+      <w:ins w:id="20026" w:author="Claude" w:date="2026-10-09T06:37:03Z">
+        <w:r>
+          <w:t xml:space="preserve">|</w:t>
+        </w:r>
+      </w:ins>
+      <w:ins w:id="20027" w:author="Claude" w:date="2026-10-09T06:37:03Z">
+        <w:r>
+          <w:rPr>
+            <w:vertAlign w:val="subscript"/>
+          </w:rPr>
+          <w:t xml:space="preserve">Γ</w:t>
+        </w:r>
+      </w:ins>
+      <w:ins w:id="20028" w:author="Claude" w:date="2026-10-09T06:37:03Z">
+        <w:r>
+          <w:t xml:space="preserve"> is the interfacial oxygen concentration.</w:t>
+        </w:r>
+      </w:ins>
     </w:p>
     <w:p>
       <w:pPr>
@@ -3916,6 +4161,7 @@
                 <m:sty m:val="p"/>
               </m:rPr>
               <w:rPr>
+                <w:del w:id="20047" w:author="Claude" w:date="2026-10-09T06:37:03Z"/>
                 <w:rFonts w:ascii="Cambria Math" w:hAnsi="Cambria Math" w:cs="Times New Roman"/>
               </w:rPr>
               <m:t>∂</m:t>
@@ -3931,6 +4177,7 @@
               <m:e>
                 <m:r>
                   <w:rPr>
+                    <w:del w:id="20048" w:author="Claude" w:date="2026-10-09T06:37:03Z"/>
                     <w:rFonts w:ascii="Cambria Math" w:hAnsi="Cambria Math" w:cs="Times New Roman"/>
                   </w:rPr>
                   <m:t>C</m:t>
@@ -3951,6 +4198,7 @@
                         <m:sty m:val="p"/>
                       </m:rPr>
                       <w:rPr>
+                        <w:del w:id="20049" w:author="Claude" w:date="2026-10-09T06:37:03Z"/>
                         <w:rFonts w:ascii="Cambria Math" w:hAnsi="Cambria Math" w:cs="Times New Roman"/>
                       </w:rPr>
                       <m:t>O</m:t>
@@ -3962,6 +4210,7 @@
                         <m:sty m:val="p"/>
                       </m:rPr>
                       <w:rPr>
+                        <w:del w:id="20050" w:author="Claude" w:date="2026-10-09T06:37:03Z"/>
                         <w:rFonts w:ascii="Cambria Math" w:hAnsi="Cambria Math" w:cs="Times New Roman"/>
                       </w:rPr>
                       <m:t>2</m:t>
@@ -3977,12 +4226,14 @@
                 <m:sty m:val="p"/>
               </m:rPr>
               <w:rPr>
+                <w:del w:id="20051" w:author="Claude" w:date="2026-10-09T06:37:03Z"/>
                 <w:rFonts w:ascii="Cambria Math" w:hAnsi="Cambria Math" w:cs="Times New Roman"/>
               </w:rPr>
               <m:t>∂</m:t>
             </m:r>
             <m:r>
               <w:rPr>
+                <w:del w:id="20052" w:author="Claude" w:date="2026-10-09T06:37:03Z"/>
                 <w:rFonts w:ascii="Cambria Math" w:hAnsi="Cambria Math" w:cs="Times New Roman"/>
               </w:rPr>
               <m:t>t</m:t>
@@ -3994,6 +4245,7 @@
             <m:sty m:val="p"/>
           </m:rPr>
           <w:rPr>
+            <w:del w:id="20053" w:author="Claude" w:date="2026-10-09T06:37:03Z"/>
             <w:rFonts w:ascii="Cambria Math" w:hAnsi="Cambria Math" w:cs="Times New Roman"/>
           </w:rPr>
           <m:t>=∇⋅</m:t>
@@ -4018,6 +4270,7 @@
               <m:e>
                 <m:r>
                   <w:rPr>
+                    <w:del w:id="20054" w:author="Claude" w:date="2026-10-09T06:37:03Z"/>
                     <w:rFonts w:ascii="Cambria Math" w:hAnsi="Cambria Math" w:cs="Times New Roman"/>
                   </w:rPr>
                   <m:t>D</m:t>
@@ -4038,6 +4291,7 @@
                         <m:sty m:val="p"/>
                       </m:rPr>
                       <w:rPr>
+                        <w:del w:id="20055" w:author="Claude" w:date="2026-10-09T06:37:03Z"/>
                         <w:rFonts w:ascii="Cambria Math" w:hAnsi="Cambria Math" w:cs="Times New Roman"/>
                       </w:rPr>
                       <m:t>O</m:t>
@@ -4049,6 +4303,7 @@
                         <m:sty m:val="p"/>
                       </m:rPr>
                       <w:rPr>
+                        <w:del w:id="20056" w:author="Claude" w:date="2026-10-09T06:37:03Z"/>
                         <w:rFonts w:ascii="Cambria Math" w:hAnsi="Cambria Math" w:cs="Times New Roman"/>
                       </w:rPr>
                       <m:t>2</m:t>
@@ -4062,6 +4317,7 @@
                     <m:nor/>
                   </m:rPr>
                   <w:rPr>
+                    <w:del w:id="20057" w:author="Claude" w:date="2026-10-09T06:37:03Z"/>
                     <w:rFonts w:cs="Times New Roman"/>
                   </w:rPr>
                   <m:t>eff</m:t>
@@ -4070,6 +4326,7 @@
             </m:sSubSup>
             <m:r>
               <w:rPr>
+                <w:del w:id="20058" w:author="Claude" w:date="2026-10-09T06:37:03Z"/>
                 <w:rFonts w:ascii="Cambria Math" w:hAnsi="Cambria Math" w:cs="Times New Roman"/>
               </w:rPr>
               <m:t> </m:t>
@@ -4079,6 +4336,7 @@
                 <m:sty m:val="p"/>
               </m:rPr>
               <w:rPr>
+                <w:del w:id="20059" w:author="Claude" w:date="2026-10-09T06:37:03Z"/>
                 <w:rFonts w:ascii="Cambria Math" w:hAnsi="Cambria Math" w:cs="Times New Roman"/>
               </w:rPr>
               <m:t>∇</m:t>
@@ -4094,6 +4352,7 @@
               <m:e>
                 <m:r>
                   <w:rPr>
+                    <w:del w:id="20060" w:author="Claude" w:date="2026-10-09T06:37:03Z"/>
                     <w:rFonts w:ascii="Cambria Math" w:hAnsi="Cambria Math" w:cs="Times New Roman"/>
                   </w:rPr>
                   <m:t>C</m:t>
@@ -4114,6 +4373,7 @@
                         <m:sty m:val="p"/>
                       </m:rPr>
                       <w:rPr>
+                        <w:del w:id="20061" w:author="Claude" w:date="2026-10-09T06:37:03Z"/>
                         <w:rFonts w:ascii="Cambria Math" w:hAnsi="Cambria Math" w:cs="Times New Roman"/>
                       </w:rPr>
                       <m:t>O</m:t>
@@ -4125,6 +4385,7 @@
                         <m:sty m:val="p"/>
                       </m:rPr>
                       <w:rPr>
+                        <w:del w:id="20062" w:author="Claude" w:date="2026-10-09T06:37:03Z"/>
                         <w:rFonts w:ascii="Cambria Math" w:hAnsi="Cambria Math" w:cs="Times New Roman"/>
                       </w:rPr>
                       <m:t>2</m:t>
@@ -4140,6 +4401,7 @@
             <m:sty m:val="p"/>
           </m:rPr>
           <w:rPr>
+            <w:del w:id="20063" w:author="Claude" w:date="2026-10-09T06:37:03Z"/>
             <w:rFonts w:ascii="Cambria Math" w:hAnsi="Cambria Math" w:cs="Times New Roman"/>
           </w:rPr>
           <m:t>-</m:t>
@@ -4155,6 +4417,7 @@
           <m:e>
             <m:r>
               <w:rPr>
+                <w:del w:id="20064" w:author="Claude" w:date="2026-10-09T06:37:03Z"/>
                 <w:rFonts w:ascii="Cambria Math" w:hAnsi="Cambria Math" w:cs="Times New Roman"/>
               </w:rPr>
               <m:t>k</m:t>
@@ -4166,6 +4429,7 @@
                 <m:sty m:val="p"/>
               </m:rPr>
               <w:rPr>
+                <w:del w:id="20065" w:author="Claude" w:date="2026-10-09T06:37:03Z"/>
                 <w:rFonts w:ascii="Cambria Math" w:hAnsi="Cambria Math" w:cs="Times New Roman"/>
               </w:rPr>
               <m:t>ORR</m:t>
@@ -4174,6 +4438,7 @@
         </m:sSub>
         <m:r>
           <w:rPr>
+            <w:del w:id="20066" w:author="Claude" w:date="2026-10-09T06:37:03Z"/>
             <w:rFonts w:ascii="Cambria Math" w:hAnsi="Cambria Math" w:cs="Times New Roman"/>
           </w:rPr>
           <m:t> </m:t>
@@ -4189,6 +4454,7 @@
           <m:e>
             <m:r>
               <w:rPr>
+                <w:del w:id="20067" w:author="Claude" w:date="2026-10-09T06:37:03Z"/>
                 <w:rFonts w:ascii="Cambria Math" w:hAnsi="Cambria Math" w:cs="Times New Roman"/>
               </w:rPr>
               <m:t>C</m:t>
@@ -4209,6 +4475,7 @@
                     <m:sty m:val="p"/>
                   </m:rPr>
                   <w:rPr>
+                    <w:del w:id="20068" w:author="Claude" w:date="2026-10-09T06:37:03Z"/>
                     <w:rFonts w:ascii="Cambria Math" w:hAnsi="Cambria Math" w:cs="Times New Roman"/>
                   </w:rPr>
                   <m:t>O</m:t>
@@ -4220,6 +4487,7 @@
                     <m:sty m:val="p"/>
                   </m:rPr>
                   <w:rPr>
+                    <w:del w:id="20069" w:author="Claude" w:date="2026-10-09T06:37:03Z"/>
                     <w:rFonts w:ascii="Cambria Math" w:hAnsi="Cambria Math" w:cs="Times New Roman"/>
                   </w:rPr>
                   <m:t>2</m:t>
@@ -4230,6 +4498,7 @@
         </m:sSub>
         <m:r>
           <w:rPr>
+            <w:del w:id="20070" w:author="Claude" w:date="2026-10-09T06:37:03Z"/>
             <w:rFonts w:ascii="Cambria Math" w:hAnsi="Cambria Math" w:cs="Times New Roman"/>
           </w:rPr>
           <m:t xml:space="preserve"> </m:t>
@@ -4245,6 +4514,7 @@
           <m:e>
             <m:r>
               <w:rPr>
+                <w:del w:id="20071" w:author="Claude" w:date="2026-10-09T06:37:03Z"/>
                 <w:rFonts w:ascii="Cambria Math" w:hAnsi="Cambria Math"/>
               </w:rPr>
               <m:t>δ</m:t>
@@ -4256,9 +4526,156 @@
                 <m:sty m:val="p"/>
               </m:rPr>
               <w:rPr>
+                <w:del w:id="20072" w:author="Claude" w:date="2026-10-09T06:37:03Z"/>
                 <w:rFonts w:ascii="Cambria Math" w:hAnsi="Cambria Math"/>
               </w:rPr>
               <m:t>Γ</m:t>
+            </m:r>
+          </m:sub>
+        </m:sSub>
+      </m:oMath>
+      <m:oMath>
+        <m:f>
+          <m:num>
+            <m:r>
+              <w:rPr>
+                <w:ins w:id="20030" w:author="Claude" w:date="2026-10-09T06:37:03Z"/>
+              </w:rPr>
+              <m:t xml:space="preserve">∂</m:t>
+            </m:r>
+            <m:sSub>
+              <m:e>
+                <m:r>
+                  <w:rPr>
+                    <w:ins w:id="20031" w:author="Claude" w:date="2026-10-09T06:37:03Z"/>
+                  </w:rPr>
+                  <m:t xml:space="preserve">C</m:t>
+                </m:r>
+              </m:e>
+              <m:sub>
+                <m:r>
+                  <w:rPr>
+                    <w:ins w:id="20032" w:author="Claude" w:date="2026-10-09T06:37:03Z"/>
+                  </w:rPr>
+                  <m:t xml:space="preserve">O₂</m:t>
+                </m:r>
+              </m:sub>
+            </m:sSub>
+          </m:num>
+          <m:den>
+            <m:r>
+              <w:rPr>
+                <w:ins w:id="20033" w:author="Claude" w:date="2026-10-09T06:37:03Z"/>
+              </w:rPr>
+              <m:t xml:space="preserve">∂</m:t>
+            </m:r>
+            <m:r>
+              <w:rPr>
+                <w:ins w:id="20034" w:author="Claude" w:date="2026-10-09T06:37:03Z"/>
+              </w:rPr>
+              <m:t xml:space="preserve">t</m:t>
+            </m:r>
+          </m:den>
+        </m:f>
+        <m:r>
+          <w:rPr>
+            <w:ins w:id="20035" w:author="Claude" w:date="2026-10-09T06:37:03Z"/>
+          </w:rPr>
+          <m:t xml:space="preserve">=∇⋅(</m:t>
+        </m:r>
+        <m:sSup>
+          <m:e>
+            <m:sSub>
+              <m:e>
+                <m:r>
+                  <w:rPr>
+                    <w:ins w:id="20036" w:author="Claude" w:date="2026-10-09T06:37:03Z"/>
+                  </w:rPr>
+                  <m:t xml:space="preserve">D</m:t>
+                </m:r>
+              </m:e>
+              <m:sub>
+                <m:r>
+                  <w:rPr>
+                    <w:ins w:id="20037" w:author="Claude" w:date="2026-10-09T06:37:03Z"/>
+                  </w:rPr>
+                  <m:t xml:space="preserve">O₂</m:t>
+                </m:r>
+              </m:sub>
+            </m:sSub>
+          </m:e>
+          <m:sup>
+            <m:r>
+              <w:rPr>
+                <w:ins w:id="20038" w:author="Claude" w:date="2026-10-09T06:37:03Z"/>
+              </w:rPr>
+              <m:t xml:space="preserve">eff</m:t>
+            </m:r>
+          </m:sup>
+        </m:sSup>
+        <m:r>
+          <w:rPr>
+            <w:ins w:id="20039" w:author="Claude" w:date="2026-10-09T06:37:03Z"/>
+          </w:rPr>
+          <m:t xml:space="preserve">∇</m:t>
+        </m:r>
+        <m:sSub>
+          <m:e>
+            <m:r>
+              <w:rPr>
+                <w:ins w:id="20040" w:author="Claude" w:date="2026-10-09T06:37:03Z"/>
+              </w:rPr>
+              <m:t xml:space="preserve">C</m:t>
+            </m:r>
+          </m:e>
+          <m:sub>
+            <m:r>
+              <w:rPr>
+                <w:ins w:id="20041" w:author="Claude" w:date="2026-10-09T06:37:03Z"/>
+              </w:rPr>
+              <m:t xml:space="preserve">O₂</m:t>
+            </m:r>
+          </m:sub>
+        </m:sSub>
+        <m:r>
+          <w:rPr>
+            <w:ins w:id="20042" w:author="Claude" w:date="2026-10-09T06:37:03Z"/>
+          </w:rPr>
+          <m:t xml:space="preserve">)−</m:t>
+        </m:r>
+        <m:sSub>
+          <m:e>
+            <m:r>
+              <w:rPr>
+                <w:ins w:id="20043" w:author="Claude" w:date="2026-10-09T06:37:03Z"/>
+              </w:rPr>
+              <m:t xml:space="preserve">j</m:t>
+            </m:r>
+          </m:e>
+          <m:sub>
+            <m:r>
+              <w:rPr>
+                <w:ins w:id="20044" w:author="Claude" w:date="2026-10-09T06:37:03Z"/>
+              </w:rPr>
+              <m:t xml:space="preserve">ORR</m:t>
+            </m:r>
+          </m:sub>
+        </m:sSub>
+        <m:sSub>
+          <m:e>
+            <m:r>
+              <w:rPr>
+                <w:ins w:id="20045" w:author="Claude" w:date="2026-10-09T06:37:03Z"/>
+              </w:rPr>
+              <m:t xml:space="preserve">δ</m:t>
+            </m:r>
+          </m:e>
+          <m:sub>
+            <m:r>
+              <w:rPr>
+                <w:ins w:id="20046" w:author="Claude" w:date="2026-10-09T06:37:03Z"/>
+              </w:rPr>
+              <m:t xml:space="preserve">Γ</m:t>
             </m:r>
           </m:sub>
         </m:sSub>
@@ -4295,7 +4712,14 @@
         <w:rPr>
           <w:rFonts w:cs="Times New Roman"/>
         </w:rPr>
-        <w:t>where δ</w:t>
+        <w:t xml:space="preserve">where </w:t>
+      </w:r>
+      <w:proofErr w:type="spellStart"/>
+      <w:r>
+        <w:rPr>
+          <w:rFonts w:cs="Times New Roman"/>
+        </w:rPr>
+        <w:t>δ</w:t>
       </w:r>
       <w:r>
         <w:rPr>
@@ -4304,6 +4728,7 @@
         </w:rPr>
         <w:t>Γ</w:t>
       </w:r>
+      <w:proofErr w:type="spellEnd"/>
       <w:r>
         <w:rPr>
           <w:rFonts w:cs="Times New Roman"/>
@@ -4382,64 +4807,21 @@
         <w:rPr>
           <w:rFonts w:cs="Times New Roman"/>
         </w:rPr>
-        <w:t xml:space="preserve">)</w:t>
-      </w:r>
-      <w:del w:id="20001" w:author="Claude" w:date="2026-10-09T06:27:45Z">
-        <w:r>
-          <w:rPr>
-            <w:rFonts w:cs="Times New Roman"/>
-          </w:rPr>
-          <w:delText xml:space="preserve">, and </w:delText>
-        </w:r>
-      </w:del>
-      <m:oMath>
-        <m:r>
-          <w:rPr>
-            <w:del w:id="20002" w:author="Claude" w:date="2026-10-09T06:27:45Z"/>
-            <w:rFonts w:ascii="Cambria Math" w:hAnsi="Cambria Math" w:cs="Times New Roman"/>
-          </w:rPr>
-          <m:t>κ(F) = 1 – F.(1 - ε/τ)</m:t>
-        </m:r>
-      </m:oMath>
-      <w:del w:id="20003" w:author="Claude" w:date="2026-10-09T06:27:45Z">
-        <w:r>
-          <w:rPr>
-            <w:rFonts w:cs="Times New Roman"/>
-          </w:rPr>
-          <w:delText xml:space="preserve"> is the factor by which the corrosion-product film reduces the reaction, using the same porosity (ε) and tortuosity (τ) reduction as the effective-diffusivity law of the film </w:delText>
-        </w:r>
-      </w:del>
-      <w:del w:id="20004" w:author="Claude" w:date="2026-10-09T06:27:45Z">
-        <w:r>
-          <w:rPr>
-            <w:rFonts w:cs="Times New Roman"/>
-          </w:rPr>
-          <w:delText xml:space="preserve">in </w:delText>
-        </w:r>
-      </w:del>
-      <w:del w:id="20005" w:author="Claude" w:date="2026-10-09T06:27:45Z">
-        <w:r>
-          <w:rPr>
-            <w:b/>
-            <w:bCs/>
-          </w:rPr>
-          <w:delText xml:space="preserve">Equation </w:delText>
-        </w:r>
-      </w:del>
-      <w:del w:id="20006" w:author="Claude" w:date="2026-10-09T06:27:45Z">
-        <w:r>
-          <w:rPr>
-            <w:b/>
-            <w:bCs/>
-          </w:rPr>
-          <w:delText xml:space="preserve">12</w:delText>
-        </w:r>
-      </w:del>
-      <w:r>
-        <w:rPr>
-          <w:rFonts w:cs="Times New Roman"/>
-        </w:rPr>
-        <w:t>. Chloride acts as a catalytic species, regenerated during film breakdown rather than consumed</w:t>
+        <w:t>). Chloride acts as a catalytic species, regenerated during film bre</w:t>
+      </w:r>
+      <w:proofErr w:type="spellStart"/>
+      <w:r>
+        <w:rPr>
+          <w:rFonts w:cs="Times New Roman"/>
+        </w:rPr>
+        <w:t>akdown</w:t>
+      </w:r>
+      <w:proofErr w:type="spellEnd"/>
+      <w:r>
+        <w:rPr>
+          <w:rFonts w:cs="Times New Roman"/>
+        </w:rPr>
+        <w:t xml:space="preserve"> rather than consumed</w:t>
       </w:r>
       <w:r>
         <w:rPr>
@@ -4874,7 +5256,21 @@
         <w:rPr>
           <w:rFonts w:cs="Times New Roman"/>
         </w:rPr>
-        <w:t>generating OH⁻ ions that increase the local alkalinity and promote formation of ZnO-based corrosion products.</w:t>
+        <w:t xml:space="preserve">generating OH⁻ ions that increase the local alkalinity and promote formation of </w:t>
+      </w:r>
+      <w:proofErr w:type="spellStart"/>
+      <w:r>
+        <w:rPr>
+          <w:rFonts w:cs="Times New Roman"/>
+        </w:rPr>
+        <w:t>ZnO</w:t>
+      </w:r>
+      <w:proofErr w:type="spellEnd"/>
+      <w:r>
+        <w:rPr>
+          <w:rFonts w:cs="Times New Roman"/>
+        </w:rPr>
+        <w:t>-based corrosion products.</w:t>
       </w:r>
       <w:r>
         <w:rPr>
@@ -4935,6 +5331,7 @@
                       <m:sty m:val="p"/>
                     </m:rPr>
                     <w:rPr>
+                      <w:del w:id="20095" w:author="Claude" w:date="2026-10-09T06:37:03Z"/>
                       <w:rFonts w:ascii="Cambria Math" w:hAnsi="Cambria Math" w:cs="Times New Roman"/>
                     </w:rPr>
                     <m:t>∂</m:t>
@@ -4950,6 +5347,7 @@
                     <m:e>
                       <m:r>
                         <w:rPr>
+                          <w:del w:id="20096" w:author="Claude" w:date="2026-10-09T06:37:03Z"/>
                           <w:rFonts w:ascii="Cambria Math" w:hAnsi="Cambria Math" w:cs="Times New Roman"/>
                         </w:rPr>
                         <m:t>C</m:t>
@@ -4961,6 +5359,7 @@
                           <m:sty m:val="p"/>
                         </m:rPr>
                         <w:rPr>
+                          <w:del w:id="20097" w:author="Claude" w:date="2026-10-09T06:37:03Z"/>
                           <w:rFonts w:ascii="Cambria Math" w:hAnsi="Cambria Math" w:cs="Times New Roman"/>
                         </w:rPr>
                         <m:t>Zn</m:t>
@@ -4974,12 +5373,14 @@
                       <m:sty m:val="p"/>
                     </m:rPr>
                     <w:rPr>
+                      <w:del w:id="20098" w:author="Claude" w:date="2026-10-09T06:37:03Z"/>
                       <w:rFonts w:ascii="Cambria Math" w:hAnsi="Cambria Math" w:cs="Times New Roman"/>
                     </w:rPr>
                     <m:t>∂</m:t>
                   </m:r>
                   <m:r>
                     <w:rPr>
+                      <w:del w:id="20099" w:author="Claude" w:date="2026-10-09T06:37:03Z"/>
                       <w:rFonts w:ascii="Cambria Math" w:hAnsi="Cambria Math" w:cs="Times New Roman"/>
                     </w:rPr>
                     <m:t>t</m:t>
@@ -4991,6 +5392,7 @@
                   <m:sty m:val="p"/>
                 </m:rPr>
                 <w:rPr>
+                  <w:del w:id="20100" w:author="Claude" w:date="2026-10-09T06:37:03Z"/>
                   <w:rFonts w:ascii="Cambria Math" w:hAnsi="Cambria Math" w:cs="Times New Roman"/>
                 </w:rPr>
                 <m:t>=∇⋅</m:t>
@@ -5015,6 +5417,7 @@
                     <m:e>
                       <m:r>
                         <w:rPr>
+                          <w:del w:id="20101" w:author="Claude" w:date="2026-10-09T06:37:03Z"/>
                           <w:rFonts w:ascii="Cambria Math" w:hAnsi="Cambria Math" w:cs="Times New Roman"/>
                         </w:rPr>
                         <m:t>D</m:t>
@@ -5026,6 +5429,7 @@
                           <m:sty m:val="p"/>
                         </m:rPr>
                         <w:rPr>
+                          <w:del w:id="20102" w:author="Claude" w:date="2026-10-09T06:37:03Z"/>
                           <w:rFonts w:ascii="Cambria Math" w:hAnsi="Cambria Math" w:cs="Times New Roman"/>
                         </w:rPr>
                         <m:t>Zn</m:t>
@@ -5037,6 +5441,7 @@
                           <m:nor/>
                         </m:rPr>
                         <w:rPr>
+                          <w:del w:id="20103" w:author="Claude" w:date="2026-10-09T06:37:03Z"/>
                           <w:rFonts w:cs="Times New Roman"/>
                         </w:rPr>
                         <m:t>eff</m:t>
@@ -5045,6 +5450,7 @@
                   </m:sSubSup>
                   <m:r>
                     <w:rPr>
+                      <w:del w:id="20104" w:author="Claude" w:date="2026-10-09T06:37:03Z"/>
                       <w:rFonts w:ascii="Cambria Math" w:hAnsi="Cambria Math" w:cs="Times New Roman"/>
                     </w:rPr>
                     <m:t> </m:t>
@@ -5054,6 +5460,7 @@
                       <m:sty m:val="p"/>
                     </m:rPr>
                     <w:rPr>
+                      <w:del w:id="20105" w:author="Claude" w:date="2026-10-09T06:37:03Z"/>
                       <w:rFonts w:ascii="Cambria Math" w:hAnsi="Cambria Math" w:cs="Times New Roman"/>
                     </w:rPr>
                     <m:t>∇</m:t>
@@ -5069,6 +5476,7 @@
                     <m:e>
                       <m:r>
                         <w:rPr>
+                          <w:del w:id="20106" w:author="Claude" w:date="2026-10-09T06:37:03Z"/>
                           <w:rFonts w:ascii="Cambria Math" w:hAnsi="Cambria Math" w:cs="Times New Roman"/>
                         </w:rPr>
                         <m:t>C</m:t>
@@ -5080,6 +5488,7 @@
                           <m:sty m:val="p"/>
                         </m:rPr>
                         <w:rPr>
+                          <w:del w:id="20107" w:author="Claude" w:date="2026-10-09T06:37:03Z"/>
                           <w:rFonts w:ascii="Cambria Math" w:hAnsi="Cambria Math" w:cs="Times New Roman"/>
                         </w:rPr>
                         <m:t>Zn</m:t>
@@ -5093,6 +5502,7 @@
                   <m:sty m:val="p"/>
                 </m:rPr>
                 <w:rPr>
+                  <w:del w:id="20108" w:author="Claude" w:date="2026-10-09T06:37:03Z"/>
                   <w:rFonts w:ascii="Cambria Math" w:hAnsi="Cambria Math" w:cs="Times New Roman"/>
                 </w:rPr>
                 <m:t>+2</m:t>
@@ -5108,6 +5518,7 @@
                 <m:e>
                   <m:r>
                     <w:rPr>
+                      <w:del w:id="20109" w:author="Claude" w:date="2026-10-09T06:37:03Z"/>
                       <w:rFonts w:ascii="Cambria Math" w:hAnsi="Cambria Math" w:cs="Times New Roman"/>
                     </w:rPr>
                     <m:t>k</m:t>
@@ -5119,6 +5530,7 @@
                       <m:sty m:val="p"/>
                     </m:rPr>
                     <w:rPr>
+                      <w:del w:id="20110" w:author="Claude" w:date="2026-10-09T06:37:03Z"/>
                       <w:rFonts w:ascii="Cambria Math" w:hAnsi="Cambria Math" w:cs="Times New Roman"/>
                     </w:rPr>
                     <m:t>ORR</m:t>
@@ -5127,6 +5539,7 @@
               </m:sSub>
               <m:r>
                 <w:rPr>
+                  <w:del w:id="20111" w:author="Claude" w:date="2026-10-09T06:37:03Z"/>
                   <w:rFonts w:ascii="Cambria Math" w:hAnsi="Cambria Math" w:cs="Times New Roman"/>
                 </w:rPr>
                 <m:t> </m:t>
@@ -5142,6 +5555,7 @@
                 <m:e>
                   <m:r>
                     <w:rPr>
+                      <w:del w:id="20112" w:author="Claude" w:date="2026-10-09T06:37:03Z"/>
                       <w:rFonts w:ascii="Cambria Math" w:hAnsi="Cambria Math" w:cs="Times New Roman"/>
                     </w:rPr>
                     <m:t>C</m:t>
@@ -5162,6 +5576,7 @@
                           <m:sty m:val="p"/>
                         </m:rPr>
                         <w:rPr>
+                          <w:del w:id="20113" w:author="Claude" w:date="2026-10-09T06:37:03Z"/>
                           <w:rFonts w:ascii="Cambria Math" w:hAnsi="Cambria Math" w:cs="Times New Roman"/>
                         </w:rPr>
                         <m:t>O</m:t>
@@ -5173,6 +5588,7 @@
                           <m:sty m:val="p"/>
                         </m:rPr>
                         <w:rPr>
+                          <w:del w:id="20114" w:author="Claude" w:date="2026-10-09T06:37:03Z"/>
                           <w:rFonts w:ascii="Cambria Math" w:hAnsi="Cambria Math" w:cs="Times New Roman"/>
                         </w:rPr>
                         <m:t>2</m:t>
@@ -5183,6 +5599,7 @@
               </m:sSub>
               <m:r>
                 <w:rPr>
+                  <w:del w:id="20115" w:author="Claude" w:date="2026-10-09T06:37:03Z"/>
                   <w:rFonts w:ascii="Cambria Math" w:hAnsi="Cambria Math" w:cs="Times New Roman"/>
                 </w:rPr>
                 <m:t> </m:t>
@@ -5198,6 +5615,7 @@
                 <m:e>
                   <m:r>
                     <w:rPr>
+                      <w:del w:id="20116" w:author="Claude" w:date="2026-10-09T06:37:03Z"/>
                       <w:rFonts w:ascii="Cambria Math" w:hAnsi="Cambria Math" w:cs="Times New Roman"/>
                     </w:rPr>
                     <m:t>δ</m:t>
@@ -5209,6 +5627,7 @@
                       <m:sty m:val="p"/>
                     </m:rPr>
                     <w:rPr>
+                      <w:del w:id="20117" w:author="Claude" w:date="2026-10-09T06:37:03Z"/>
                       <w:rFonts w:ascii="Cambria Math" w:hAnsi="Cambria Math" w:cs="Times New Roman"/>
                     </w:rPr>
                     <m:t>Γ</m:t>
@@ -5220,6 +5639,7 @@
                   <m:sty m:val="p"/>
                 </m:rPr>
                 <w:rPr>
+                  <w:del w:id="20118" w:author="Claude" w:date="2026-10-09T06:37:03Z"/>
                   <w:rFonts w:ascii="Cambria Math" w:hAnsi="Cambria Math" w:cs="Times New Roman"/>
                 </w:rPr>
                 <m:t>-</m:t>
@@ -5238,12 +5658,14 @@
                       <m:sty m:val="p"/>
                     </m:rPr>
                     <w:rPr>
+                      <w:del w:id="20119" w:author="Claude" w:date="2026-10-09T06:37:03Z"/>
                       <w:rFonts w:ascii="Cambria Math" w:hAnsi="Cambria Math" w:cs="Times New Roman"/>
                     </w:rPr>
                     <m:t>∂</m:t>
                   </m:r>
                   <m:r>
                     <w:rPr>
+                      <w:del w:id="20120" w:author="Claude" w:date="2026-10-09T06:37:03Z"/>
                       <w:rFonts w:ascii="Cambria Math" w:hAnsi="Cambria Math" w:cs="Times New Roman"/>
                     </w:rPr>
                     <m:t>F</m:t>
@@ -5255,12 +5677,14 @@
                       <m:sty m:val="p"/>
                     </m:rPr>
                     <w:rPr>
+                      <w:del w:id="20121" w:author="Claude" w:date="2026-10-09T06:37:03Z"/>
                       <w:rFonts w:ascii="Cambria Math" w:hAnsi="Cambria Math" w:cs="Times New Roman"/>
                     </w:rPr>
                     <m:t>∂</m:t>
                   </m:r>
                   <m:r>
                     <w:rPr>
+                      <w:del w:id="20122" w:author="Claude" w:date="2026-10-09T06:37:03Z"/>
                       <w:rFonts w:ascii="Cambria Math" w:hAnsi="Cambria Math" w:cs="Times New Roman"/>
                     </w:rPr>
                     <m:t>t</m:t>
@@ -5270,6 +5694,188 @@
             </m:e>
           </m:mr>
         </m:m>
+      </m:oMath>
+      <m:oMath>
+        <m:f>
+          <m:num>
+            <m:r>
+              <w:rPr>
+                <w:ins w:id="20073" w:author="Claude" w:date="2026-10-09T06:37:03Z"/>
+              </w:rPr>
+              <m:t xml:space="preserve">∂</m:t>
+            </m:r>
+            <m:sSub>
+              <m:e>
+                <m:r>
+                  <w:rPr>
+                    <w:ins w:id="20074" w:author="Claude" w:date="2026-10-09T06:37:03Z"/>
+                  </w:rPr>
+                  <m:t xml:space="preserve">C</m:t>
+                </m:r>
+              </m:e>
+              <m:sub>
+                <m:r>
+                  <w:rPr>
+                    <w:ins w:id="20075" w:author="Claude" w:date="2026-10-09T06:37:03Z"/>
+                  </w:rPr>
+                  <m:t xml:space="preserve">Zn</m:t>
+                </m:r>
+              </m:sub>
+            </m:sSub>
+          </m:num>
+          <m:den>
+            <m:r>
+              <w:rPr>
+                <w:ins w:id="20076" w:author="Claude" w:date="2026-10-09T06:37:03Z"/>
+              </w:rPr>
+              <m:t xml:space="preserve">∂</m:t>
+            </m:r>
+            <m:r>
+              <w:rPr>
+                <w:ins w:id="20077" w:author="Claude" w:date="2026-10-09T06:37:03Z"/>
+              </w:rPr>
+              <m:t xml:space="preserve">t</m:t>
+            </m:r>
+          </m:den>
+        </m:f>
+        <m:r>
+          <w:rPr>
+            <w:ins w:id="20078" w:author="Claude" w:date="2026-10-09T06:37:03Z"/>
+          </w:rPr>
+          <m:t xml:space="preserve">=∇⋅(</m:t>
+        </m:r>
+        <m:sSup>
+          <m:e>
+            <m:sSub>
+              <m:e>
+                <m:r>
+                  <w:rPr>
+                    <w:ins w:id="20079" w:author="Claude" w:date="2026-10-09T06:37:03Z"/>
+                  </w:rPr>
+                  <m:t xml:space="preserve">D</m:t>
+                </m:r>
+              </m:e>
+              <m:sub>
+                <m:r>
+                  <w:rPr>
+                    <w:ins w:id="20080" w:author="Claude" w:date="2026-10-09T06:37:03Z"/>
+                  </w:rPr>
+                  <m:t xml:space="preserve">Zn</m:t>
+                </m:r>
+              </m:sub>
+            </m:sSub>
+          </m:e>
+          <m:sup>
+            <m:r>
+              <w:rPr>
+                <w:ins w:id="20081" w:author="Claude" w:date="2026-10-09T06:37:03Z"/>
+              </w:rPr>
+              <m:t xml:space="preserve">eff</m:t>
+            </m:r>
+          </m:sup>
+        </m:sSup>
+        <m:r>
+          <w:rPr>
+            <w:ins w:id="20082" w:author="Claude" w:date="2026-10-09T06:37:03Z"/>
+          </w:rPr>
+          <m:t xml:space="preserve">∇</m:t>
+        </m:r>
+        <m:sSub>
+          <m:e>
+            <m:r>
+              <w:rPr>
+                <w:ins w:id="20083" w:author="Claude" w:date="2026-10-09T06:37:03Z"/>
+              </w:rPr>
+              <m:t xml:space="preserve">C</m:t>
+            </m:r>
+          </m:e>
+          <m:sub>
+            <m:r>
+              <w:rPr>
+                <w:ins w:id="20084" w:author="Claude" w:date="2026-10-09T06:37:03Z"/>
+              </w:rPr>
+              <m:t xml:space="preserve">Zn</m:t>
+            </m:r>
+          </m:sub>
+        </m:sSub>
+        <m:r>
+          <w:rPr>
+            <w:ins w:id="20085" w:author="Claude" w:date="2026-10-09T06:37:03Z"/>
+          </w:rPr>
+          <m:t xml:space="preserve">)+2</m:t>
+        </m:r>
+        <m:sSub>
+          <m:e>
+            <m:r>
+              <w:rPr>
+                <w:ins w:id="20086" w:author="Claude" w:date="2026-10-09T06:37:03Z"/>
+              </w:rPr>
+              <m:t xml:space="preserve">j</m:t>
+            </m:r>
+          </m:e>
+          <m:sub>
+            <m:r>
+              <w:rPr>
+                <w:ins w:id="20087" w:author="Claude" w:date="2026-10-09T06:37:03Z"/>
+              </w:rPr>
+              <m:t xml:space="preserve">ORR</m:t>
+            </m:r>
+          </m:sub>
+        </m:sSub>
+        <m:sSub>
+          <m:e>
+            <m:r>
+              <w:rPr>
+                <w:ins w:id="20088" w:author="Claude" w:date="2026-10-09T06:37:03Z"/>
+              </w:rPr>
+              <m:t xml:space="preserve">δ</m:t>
+            </m:r>
+          </m:e>
+          <m:sub>
+            <m:r>
+              <w:rPr>
+                <w:ins w:id="20089" w:author="Claude" w:date="2026-10-09T06:37:03Z"/>
+              </w:rPr>
+              <m:t xml:space="preserve">Γ</m:t>
+            </m:r>
+          </m:sub>
+        </m:sSub>
+        <m:r>
+          <w:rPr>
+            <w:ins w:id="20090" w:author="Claude" w:date="2026-10-09T06:37:03Z"/>
+          </w:rPr>
+          <m:t xml:space="preserve">−</m:t>
+        </m:r>
+        <m:f>
+          <m:num>
+            <m:r>
+              <w:rPr>
+                <w:ins w:id="20091" w:author="Claude" w:date="2026-10-09T06:37:03Z"/>
+              </w:rPr>
+              <m:t xml:space="preserve">∂</m:t>
+            </m:r>
+            <m:r>
+              <w:rPr>
+                <w:ins w:id="20092" w:author="Claude" w:date="2026-10-09T06:37:03Z"/>
+              </w:rPr>
+              <m:t xml:space="preserve">F</m:t>
+            </m:r>
+          </m:num>
+          <m:den>
+            <m:r>
+              <w:rPr>
+                <w:ins w:id="20093" w:author="Claude" w:date="2026-10-09T06:37:03Z"/>
+              </w:rPr>
+              <m:t xml:space="preserve">∂</m:t>
+            </m:r>
+            <m:r>
+              <w:rPr>
+                <w:ins w:id="20094" w:author="Claude" w:date="2026-10-09T06:37:03Z"/>
+              </w:rPr>
+              <m:t xml:space="preserve">t</m:t>
+            </m:r>
+          </m:den>
+        </m:f>
       </m:oMath>
       <w:r>
         <w:rPr>
@@ -5337,6 +5943,7 @@
                       <m:sty m:val="p"/>
                     </m:rPr>
                     <w:rPr>
+                      <w:del w:id="20145" w:author="Claude" w:date="2026-10-09T06:37:03Z"/>
                       <w:rFonts w:ascii="Cambria Math" w:hAnsi="Cambria Math" w:cs="Times New Roman"/>
                     </w:rPr>
                     <m:t>∂</m:t>
@@ -5352,6 +5959,7 @@
                     <m:e>
                       <m:r>
                         <w:rPr>
+                          <w:del w:id="20146" w:author="Claude" w:date="2026-10-09T06:37:03Z"/>
                           <w:rFonts w:ascii="Cambria Math" w:hAnsi="Cambria Math" w:cs="Times New Roman"/>
                         </w:rPr>
                         <m:t>C</m:t>
@@ -5363,6 +5971,7 @@
                           <m:sty m:val="p"/>
                         </m:rPr>
                         <w:rPr>
+                          <w:del w:id="20147" w:author="Claude" w:date="2026-10-09T06:37:03Z"/>
                           <w:rFonts w:ascii="Cambria Math" w:hAnsi="Cambria Math" w:cs="Times New Roman"/>
                         </w:rPr>
                         <m:t>OH</m:t>
@@ -5376,12 +5985,14 @@
                       <m:sty m:val="p"/>
                     </m:rPr>
                     <w:rPr>
+                      <w:del w:id="20148" w:author="Claude" w:date="2026-10-09T06:37:03Z"/>
                       <w:rFonts w:ascii="Cambria Math" w:hAnsi="Cambria Math" w:cs="Times New Roman"/>
                     </w:rPr>
                     <m:t>∂</m:t>
                   </m:r>
                   <m:r>
                     <w:rPr>
+                      <w:del w:id="20149" w:author="Claude" w:date="2026-10-09T06:37:03Z"/>
                       <w:rFonts w:ascii="Cambria Math" w:hAnsi="Cambria Math" w:cs="Times New Roman"/>
                     </w:rPr>
                     <m:t>t</m:t>
@@ -5393,6 +6004,7 @@
                   <m:sty m:val="p"/>
                 </m:rPr>
                 <w:rPr>
+                  <w:del w:id="20150" w:author="Claude" w:date="2026-10-09T06:37:03Z"/>
                   <w:rFonts w:ascii="Cambria Math" w:hAnsi="Cambria Math" w:cs="Times New Roman"/>
                 </w:rPr>
                 <m:t>=∇⋅</m:t>
@@ -5417,6 +6029,7 @@
                     <m:e>
                       <m:r>
                         <w:rPr>
+                          <w:del w:id="20151" w:author="Claude" w:date="2026-10-09T06:37:03Z"/>
                           <w:rFonts w:ascii="Cambria Math" w:hAnsi="Cambria Math" w:cs="Times New Roman"/>
                         </w:rPr>
                         <m:t>D</m:t>
@@ -5428,6 +6041,7 @@
                           <m:sty m:val="p"/>
                         </m:rPr>
                         <w:rPr>
+                          <w:del w:id="20152" w:author="Claude" w:date="2026-10-09T06:37:03Z"/>
                           <w:rFonts w:ascii="Cambria Math" w:hAnsi="Cambria Math" w:cs="Times New Roman"/>
                         </w:rPr>
                         <m:t>OH</m:t>
@@ -5439,6 +6053,7 @@
                           <m:nor/>
                         </m:rPr>
                         <w:rPr>
+                          <w:del w:id="20153" w:author="Claude" w:date="2026-10-09T06:37:03Z"/>
                           <w:rFonts w:cs="Times New Roman"/>
                         </w:rPr>
                         <m:t>eff</m:t>
@@ -5447,6 +6062,7 @@
                   </m:sSubSup>
                   <m:r>
                     <w:rPr>
+                      <w:del w:id="20154" w:author="Claude" w:date="2026-10-09T06:37:03Z"/>
                       <w:rFonts w:ascii="Cambria Math" w:hAnsi="Cambria Math" w:cs="Times New Roman"/>
                     </w:rPr>
                     <m:t> </m:t>
@@ -5456,6 +6072,7 @@
                       <m:sty m:val="p"/>
                     </m:rPr>
                     <w:rPr>
+                      <w:del w:id="20155" w:author="Claude" w:date="2026-10-09T06:37:03Z"/>
                       <w:rFonts w:ascii="Cambria Math" w:hAnsi="Cambria Math" w:cs="Times New Roman"/>
                     </w:rPr>
                     <m:t>∇</m:t>
@@ -5471,6 +6088,7 @@
                     <m:e>
                       <m:r>
                         <w:rPr>
+                          <w:del w:id="20156" w:author="Claude" w:date="2026-10-09T06:37:03Z"/>
                           <w:rFonts w:ascii="Cambria Math" w:hAnsi="Cambria Math" w:cs="Times New Roman"/>
                         </w:rPr>
                         <m:t>C</m:t>
@@ -5482,6 +6100,7 @@
                           <m:sty m:val="p"/>
                         </m:rPr>
                         <w:rPr>
+                          <w:del w:id="20157" w:author="Claude" w:date="2026-10-09T06:37:03Z"/>
                           <w:rFonts w:ascii="Cambria Math" w:hAnsi="Cambria Math" w:cs="Times New Roman"/>
                         </w:rPr>
                         <m:t>OH</m:t>
@@ -5495,12 +6114,14 @@
                   <m:sty m:val="p"/>
                 </m:rPr>
                 <w:rPr>
+                  <w:del w:id="20158" w:author="Claude" w:date="2026-10-09T06:37:03Z"/>
                   <w:rFonts w:ascii="Cambria Math" w:hAnsi="Cambria Math" w:cs="Times New Roman"/>
                 </w:rPr>
                 <m:t>+</m:t>
               </m:r>
               <m:r>
                 <w:rPr>
+                  <w:del w:id="20159" w:author="Claude" w:date="2026-10-09T06:37:03Z"/>
                   <w:rFonts w:ascii="Cambria Math" w:hAnsi="Cambria Math" w:cs="Times New Roman"/>
                 </w:rPr>
                 <m:t>4 </m:t>
@@ -5516,6 +6137,7 @@
                 <m:e>
                   <m:r>
                     <w:rPr>
+                      <w:del w:id="20160" w:author="Claude" w:date="2026-10-09T06:37:03Z"/>
                       <w:rFonts w:ascii="Cambria Math" w:hAnsi="Cambria Math" w:cs="Times New Roman"/>
                     </w:rPr>
                     <m:t>k</m:t>
@@ -5527,6 +6149,7 @@
                       <m:sty m:val="p"/>
                     </m:rPr>
                     <w:rPr>
+                      <w:del w:id="20161" w:author="Claude" w:date="2026-10-09T06:37:03Z"/>
                       <w:rFonts w:ascii="Cambria Math" w:hAnsi="Cambria Math" w:cs="Times New Roman"/>
                     </w:rPr>
                     <m:t>ORR</m:t>
@@ -5535,6 +6158,7 @@
               </m:sSub>
               <m:r>
                 <w:rPr>
+                  <w:del w:id="20162" w:author="Claude" w:date="2026-10-09T06:37:03Z"/>
                   <w:rFonts w:ascii="Cambria Math" w:hAnsi="Cambria Math"/>
                 </w:rPr>
                 <m:t xml:space="preserve"> </m:t>
@@ -5550,6 +6174,7 @@
                 <m:e>
                   <m:r>
                     <w:rPr>
+                      <w:del w:id="20163" w:author="Claude" w:date="2026-10-09T06:37:03Z"/>
                       <w:rFonts w:ascii="Cambria Math" w:hAnsi="Cambria Math" w:cs="Times New Roman"/>
                     </w:rPr>
                     <m:t>C</m:t>
@@ -5570,6 +6195,7 @@
                           <m:sty m:val="p"/>
                         </m:rPr>
                         <w:rPr>
+                          <w:del w:id="20164" w:author="Claude" w:date="2026-10-09T06:37:03Z"/>
                           <w:rFonts w:ascii="Cambria Math" w:hAnsi="Cambria Math" w:cs="Times New Roman"/>
                         </w:rPr>
                         <m:t>O</m:t>
@@ -5581,6 +6207,7 @@
                           <m:sty m:val="p"/>
                         </m:rPr>
                         <w:rPr>
+                          <w:del w:id="20165" w:author="Claude" w:date="2026-10-09T06:37:03Z"/>
                           <w:rFonts w:ascii="Cambria Math" w:hAnsi="Cambria Math" w:cs="Times New Roman"/>
                         </w:rPr>
                         <m:t>2</m:t>
@@ -5591,6 +6218,7 @@
               </m:sSub>
               <m:r>
                 <w:rPr>
+                  <w:del w:id="20166" w:author="Claude" w:date="2026-10-09T06:37:03Z"/>
                   <w:rFonts w:ascii="Cambria Math" w:hAnsi="Cambria Math" w:cs="Times New Roman"/>
                 </w:rPr>
                 <m:t> </m:t>
@@ -5606,6 +6234,7 @@
                 <m:e>
                   <m:r>
                     <w:rPr>
+                      <w:del w:id="20167" w:author="Claude" w:date="2026-10-09T06:37:03Z"/>
                       <w:rFonts w:ascii="Cambria Math" w:hAnsi="Cambria Math" w:cs="Times New Roman"/>
                     </w:rPr>
                     <m:t>δ</m:t>
@@ -5617,6 +6246,7 @@
                       <m:sty m:val="p"/>
                     </m:rPr>
                     <w:rPr>
+                      <w:del w:id="20168" w:author="Claude" w:date="2026-10-09T06:37:03Z"/>
                       <w:rFonts w:ascii="Cambria Math" w:hAnsi="Cambria Math" w:cs="Times New Roman"/>
                     </w:rPr>
                     <m:t>Γ</m:t>
@@ -5625,6 +6255,7 @@
               </m:sSub>
               <m:r>
                 <w:rPr>
+                  <w:del w:id="20169" w:author="Claude" w:date="2026-10-09T06:37:03Z"/>
                   <w:rFonts w:ascii="Cambria Math" w:hAnsi="Cambria Math" w:cs="Times New Roman"/>
                 </w:rPr>
                 <m:t>-2</m:t>
@@ -5643,12 +6274,14 @@
                       <m:sty m:val="p"/>
                     </m:rPr>
                     <w:rPr>
+                      <w:del w:id="20170" w:author="Claude" w:date="2026-10-09T06:37:03Z"/>
                       <w:rFonts w:ascii="Cambria Math" w:hAnsi="Cambria Math" w:cs="Times New Roman"/>
                     </w:rPr>
                     <m:t>∂</m:t>
                   </m:r>
                   <m:r>
                     <w:rPr>
+                      <w:del w:id="20171" w:author="Claude" w:date="2026-10-09T06:37:03Z"/>
                       <w:rFonts w:ascii="Cambria Math" w:hAnsi="Cambria Math" w:cs="Times New Roman"/>
                     </w:rPr>
                     <m:t>F</m:t>
@@ -5660,12 +6293,14 @@
                       <m:sty m:val="p"/>
                     </m:rPr>
                     <w:rPr>
+                      <w:del w:id="20172" w:author="Claude" w:date="2026-10-09T06:37:03Z"/>
                       <w:rFonts w:ascii="Cambria Math" w:hAnsi="Cambria Math" w:cs="Times New Roman"/>
                     </w:rPr>
                     <m:t>∂</m:t>
                   </m:r>
                   <m:r>
                     <w:rPr>
+                      <w:del w:id="20173" w:author="Claude" w:date="2026-10-09T06:37:03Z"/>
                       <w:rFonts w:ascii="Cambria Math" w:hAnsi="Cambria Math" w:cs="Times New Roman"/>
                     </w:rPr>
                     <m:t>t</m:t>
@@ -5675,6 +6310,188 @@
             </m:e>
           </m:mr>
         </m:m>
+      </m:oMath>
+      <m:oMath>
+        <m:f>
+          <m:num>
+            <m:r>
+              <w:rPr>
+                <w:ins w:id="20123" w:author="Claude" w:date="2026-10-09T06:37:03Z"/>
+              </w:rPr>
+              <m:t xml:space="preserve">∂</m:t>
+            </m:r>
+            <m:sSub>
+              <m:e>
+                <m:r>
+                  <w:rPr>
+                    <w:ins w:id="20124" w:author="Claude" w:date="2026-10-09T06:37:03Z"/>
+                  </w:rPr>
+                  <m:t xml:space="preserve">C</m:t>
+                </m:r>
+              </m:e>
+              <m:sub>
+                <m:r>
+                  <w:rPr>
+                    <w:ins w:id="20125" w:author="Claude" w:date="2026-10-09T06:37:03Z"/>
+                  </w:rPr>
+                  <m:t xml:space="preserve">OH</m:t>
+                </m:r>
+              </m:sub>
+            </m:sSub>
+          </m:num>
+          <m:den>
+            <m:r>
+              <w:rPr>
+                <w:ins w:id="20126" w:author="Claude" w:date="2026-10-09T06:37:03Z"/>
+              </w:rPr>
+              <m:t xml:space="preserve">∂</m:t>
+            </m:r>
+            <m:r>
+              <w:rPr>
+                <w:ins w:id="20127" w:author="Claude" w:date="2026-10-09T06:37:03Z"/>
+              </w:rPr>
+              <m:t xml:space="preserve">t</m:t>
+            </m:r>
+          </m:den>
+        </m:f>
+        <m:r>
+          <w:rPr>
+            <w:ins w:id="20128" w:author="Claude" w:date="2026-10-09T06:37:03Z"/>
+          </w:rPr>
+          <m:t xml:space="preserve">=∇⋅(</m:t>
+        </m:r>
+        <m:sSup>
+          <m:e>
+            <m:sSub>
+              <m:e>
+                <m:r>
+                  <w:rPr>
+                    <w:ins w:id="20129" w:author="Claude" w:date="2026-10-09T06:37:03Z"/>
+                  </w:rPr>
+                  <m:t xml:space="preserve">D</m:t>
+                </m:r>
+              </m:e>
+              <m:sub>
+                <m:r>
+                  <w:rPr>
+                    <w:ins w:id="20130" w:author="Claude" w:date="2026-10-09T06:37:03Z"/>
+                  </w:rPr>
+                  <m:t xml:space="preserve">OH</m:t>
+                </m:r>
+              </m:sub>
+            </m:sSub>
+          </m:e>
+          <m:sup>
+            <m:r>
+              <w:rPr>
+                <w:ins w:id="20131" w:author="Claude" w:date="2026-10-09T06:37:03Z"/>
+              </w:rPr>
+              <m:t xml:space="preserve">eff</m:t>
+            </m:r>
+          </m:sup>
+        </m:sSup>
+        <m:r>
+          <w:rPr>
+            <w:ins w:id="20132" w:author="Claude" w:date="2026-10-09T06:37:03Z"/>
+          </w:rPr>
+          <m:t xml:space="preserve">∇</m:t>
+        </m:r>
+        <m:sSub>
+          <m:e>
+            <m:r>
+              <w:rPr>
+                <w:ins w:id="20133" w:author="Claude" w:date="2026-10-09T06:37:03Z"/>
+              </w:rPr>
+              <m:t xml:space="preserve">C</m:t>
+            </m:r>
+          </m:e>
+          <m:sub>
+            <m:r>
+              <w:rPr>
+                <w:ins w:id="20134" w:author="Claude" w:date="2026-10-09T06:37:03Z"/>
+              </w:rPr>
+              <m:t xml:space="preserve">OH</m:t>
+            </m:r>
+          </m:sub>
+        </m:sSub>
+        <m:r>
+          <w:rPr>
+            <w:ins w:id="20135" w:author="Claude" w:date="2026-10-09T06:37:03Z"/>
+          </w:rPr>
+          <m:t xml:space="preserve">)+4</m:t>
+        </m:r>
+        <m:sSub>
+          <m:e>
+            <m:r>
+              <w:rPr>
+                <w:ins w:id="20136" w:author="Claude" w:date="2026-10-09T06:37:03Z"/>
+              </w:rPr>
+              <m:t xml:space="preserve">j</m:t>
+            </m:r>
+          </m:e>
+          <m:sub>
+            <m:r>
+              <w:rPr>
+                <w:ins w:id="20137" w:author="Claude" w:date="2026-10-09T06:37:03Z"/>
+              </w:rPr>
+              <m:t xml:space="preserve">ORR</m:t>
+            </m:r>
+          </m:sub>
+        </m:sSub>
+        <m:sSub>
+          <m:e>
+            <m:r>
+              <w:rPr>
+                <w:ins w:id="20138" w:author="Claude" w:date="2026-10-09T06:37:03Z"/>
+              </w:rPr>
+              <m:t xml:space="preserve">δ</m:t>
+            </m:r>
+          </m:e>
+          <m:sub>
+            <m:r>
+              <w:rPr>
+                <w:ins w:id="20139" w:author="Claude" w:date="2026-10-09T06:37:03Z"/>
+              </w:rPr>
+              <m:t xml:space="preserve">Γ</m:t>
+            </m:r>
+          </m:sub>
+        </m:sSub>
+        <m:r>
+          <w:rPr>
+            <w:ins w:id="20140" w:author="Claude" w:date="2026-10-09T06:37:03Z"/>
+          </w:rPr>
+          <m:t xml:space="preserve">−2</m:t>
+        </m:r>
+        <m:f>
+          <m:num>
+            <m:r>
+              <w:rPr>
+                <w:ins w:id="20141" w:author="Claude" w:date="2026-10-09T06:37:03Z"/>
+              </w:rPr>
+              <m:t xml:space="preserve">∂</m:t>
+            </m:r>
+            <m:r>
+              <w:rPr>
+                <w:ins w:id="20142" w:author="Claude" w:date="2026-10-09T06:37:03Z"/>
+              </w:rPr>
+              <m:t xml:space="preserve">F</m:t>
+            </m:r>
+          </m:num>
+          <m:den>
+            <m:r>
+              <w:rPr>
+                <w:ins w:id="20143" w:author="Claude" w:date="2026-10-09T06:37:03Z"/>
+              </w:rPr>
+              <m:t xml:space="preserve">∂</m:t>
+            </m:r>
+            <m:r>
+              <w:rPr>
+                <w:ins w:id="20144" w:author="Claude" w:date="2026-10-09T06:37:03Z"/>
+              </w:rPr>
+              <m:t xml:space="preserve">t</m:t>
+            </m:r>
+          </m:den>
+        </m:f>
       </m:oMath>
       <w:r>
         <w:rPr>
@@ -5746,7 +6563,15 @@
         <w:t>the</w:t>
       </w:r>
       <w:r>
-        <w:t xml:space="preserve"> balance between ZnO precipitation and chloride-mediated dissolution</w:t>
+        <w:t xml:space="preserve"> balance between </w:t>
+      </w:r>
+      <w:proofErr w:type="spellStart"/>
+      <w:r>
+        <w:t>ZnO</w:t>
+      </w:r>
+      <w:proofErr w:type="spellEnd"/>
+      <w:r>
+        <w:t xml:space="preserve"> precipitation and chloride-mediated dissolution</w:t>
       </w:r>
       <w:r>
         <w:t xml:space="preserve"> as follows</w:t>
@@ -6193,7 +7018,43 @@
         <w:rPr>
           <w:rFonts w:cs="Times New Roman"/>
         </w:rPr>
-        <w:t xml:space="preserve">, which suppresses further growth as the corrosion-product concentration approaches its maximum density </w:t>
+        <w:t>, which suppresses further growth as the corrosion-product concentration approaches its max</w:t>
+      </w:r>
+      <w:proofErr w:type="spellStart"/>
+      <w:r>
+        <w:rPr>
+          <w:rFonts w:cs="Times New Roman"/>
+        </w:rPr>
+        <w:t>imum</w:t>
+      </w:r>
+      <w:proofErr w:type="spellEnd"/>
+      <w:r>
+        <w:rPr>
+          <w:rFonts w:cs="Times New Roman"/>
+        </w:rPr>
+        <w:t xml:space="preserve"> </w:t>
+      </w:r>
+      <w:del w:id="9004" w:author="Claude" w:date="2026-10-09T06:37:03Z">
+        <w:r>
+          <w:rPr>
+            <w:rFonts w:cs="Times New Roman"/>
+          </w:rPr>
+          <w:delText xml:space="preserve">density</w:delText>
+        </w:r>
+      </w:del>
+      <w:ins w:id="9003" w:author="Claude" w:date="2026-10-09T06:37:03Z">
+        <w:r>
+          <w:rPr>
+            <w:rFonts w:cs="Times New Roman"/>
+          </w:rPr>
+          <w:t xml:space="preserve">molar concentration</w:t>
+        </w:r>
+      </w:ins>
+      <w:r>
+        <w:rPr>
+          <w:rFonts w:cs="Times New Roman"/>
+        </w:rPr>
+        <w:t xml:space="preserve"> </w:t>
       </w:r>
       <m:oMath>
         <m:sSub>
@@ -6207,6 +7068,7 @@
           <m:e>
             <m:r>
               <w:rPr>
+                <w:del w:id="20205" w:author="Claude" w:date="2026-10-09T06:37:03Z"/>
                 <w:rFonts w:ascii="Cambria Math" w:hAnsi="Cambria Math" w:cs="Times New Roman"/>
               </w:rPr>
               <m:t>F</m:t>
@@ -6218,6 +7080,7 @@
                 <m:sty m:val="p"/>
               </m:rPr>
               <w:rPr>
+                <w:del w:id="20206" w:author="Claude" w:date="2026-10-09T06:37:03Z"/>
                 <w:rFonts w:ascii="Cambria Math" w:hAnsi="Cambria Math" w:cs="Times New Roman"/>
               </w:rPr>
               <m:t>max</m:t>
@@ -6229,6 +7092,7 @@
             <m:sty m:val="p"/>
           </m:rPr>
           <w:rPr>
+            <w:del w:id="20207" w:author="Claude" w:date="2026-10-09T06:37:03Z"/>
             <w:rFonts w:ascii="Cambria Math" w:hAnsi="Cambria Math" w:cs="Times New Roman"/>
           </w:rPr>
           <m:t>=</m:t>
@@ -6244,6 +7108,7 @@
           <m:e>
             <m:r>
               <w:rPr>
+                <w:del w:id="20208" w:author="Claude" w:date="2026-10-09T06:37:03Z"/>
                 <w:rFonts w:ascii="Cambria Math" w:hAnsi="Cambria Math" w:cs="Times New Roman"/>
               </w:rPr>
               <m:t>ρ</m:t>
@@ -6255,6 +7120,7 @@
                 <m:nor/>
               </m:rPr>
               <w:rPr>
+                <w:del w:id="20209" w:author="Claude" w:date="2026-10-09T06:37:03Z"/>
                 <w:rFonts w:cs="Times New Roman"/>
               </w:rPr>
               <m:t>film</m:t>
@@ -6266,12 +7132,14 @@
             <m:sty m:val="p"/>
           </m:rPr>
           <w:rPr>
+            <w:del w:id="20210" w:author="Claude" w:date="2026-10-09T06:37:03Z"/>
             <w:rFonts w:ascii="Cambria Math" w:hAnsi="Cambria Math" w:cs="Times New Roman"/>
           </w:rPr>
           <m:t>(</m:t>
         </m:r>
         <m:r>
           <w:rPr>
+            <w:del w:id="20211" w:author="Claude" w:date="2026-10-09T06:37:03Z"/>
             <w:rFonts w:ascii="Cambria Math" w:hAnsi="Cambria Math" w:cs="Times New Roman"/>
           </w:rPr>
           <m:t>1</m:t>
@@ -6281,12 +7149,14 @@
             <m:sty m:val="p"/>
           </m:rPr>
           <w:rPr>
+            <w:del w:id="20212" w:author="Claude" w:date="2026-10-09T06:37:03Z"/>
             <w:rFonts w:ascii="Cambria Math" w:hAnsi="Cambria Math" w:cs="Times New Roman"/>
           </w:rPr>
           <m:t>-</m:t>
         </m:r>
         <m:r>
           <w:rPr>
+            <w:del w:id="20213" w:author="Claude" w:date="2026-10-09T06:37:03Z"/>
             <w:rFonts w:ascii="Cambria Math" w:hAnsi="Cambria Math" w:cs="Times New Roman"/>
           </w:rPr>
           <m:t>ε</m:t>
@@ -6296,10 +7166,85 @@
             <m:sty m:val="p"/>
           </m:rPr>
           <w:rPr>
+            <w:del w:id="20214" w:author="Claude" w:date="2026-10-09T06:37:03Z"/>
             <w:rFonts w:ascii="Cambria Math" w:hAnsi="Cambria Math" w:cs="Times New Roman"/>
           </w:rPr>
           <m:t>)</m:t>
         </m:r>
+      </m:oMath>
+      <m:oMath>
+        <m:sSub>
+          <m:e>
+            <m:r>
+              <w:rPr>
+                <w:ins w:id="20197" w:author="Claude" w:date="2026-10-09T06:37:03Z"/>
+              </w:rPr>
+              <m:t xml:space="preserve">F</m:t>
+            </m:r>
+          </m:e>
+          <m:sub>
+            <m:r>
+              <w:rPr>
+                <w:ins w:id="20198" w:author="Claude" w:date="2026-10-09T06:37:03Z"/>
+              </w:rPr>
+              <m:t xml:space="preserve">max</m:t>
+            </m:r>
+          </m:sub>
+        </m:sSub>
+        <m:r>
+          <w:rPr>
+            <w:ins w:id="20199" w:author="Claude" w:date="2026-10-09T06:37:03Z"/>
+          </w:rPr>
+          <m:t xml:space="preserve">=</m:t>
+        </m:r>
+        <m:f>
+          <m:num>
+            <m:sSub>
+              <m:e>
+                <m:r>
+                  <w:rPr>
+                    <w:ins w:id="20200" w:author="Claude" w:date="2026-10-09T06:37:03Z"/>
+                  </w:rPr>
+                  <m:t xml:space="preserve">ρ</m:t>
+                </m:r>
+              </m:e>
+              <m:sub>
+                <m:r>
+                  <w:rPr>
+                    <w:ins w:id="20201" w:author="Claude" w:date="2026-10-09T06:37:03Z"/>
+                  </w:rPr>
+                  <m:t xml:space="preserve">film</m:t>
+                </m:r>
+              </m:sub>
+            </m:sSub>
+            <m:r>
+              <w:rPr>
+                <w:ins w:id="20202" w:author="Claude" w:date="2026-10-09T06:37:03Z"/>
+              </w:rPr>
+              <m:t xml:space="preserve">(1−ε)</m:t>
+            </m:r>
+          </m:num>
+          <m:den>
+            <m:sSub>
+              <m:e>
+                <m:r>
+                  <w:rPr>
+                    <w:ins w:id="20203" w:author="Claude" w:date="2026-10-09T06:37:03Z"/>
+                  </w:rPr>
+                  <m:t xml:space="preserve">M</m:t>
+                </m:r>
+              </m:e>
+              <m:sub>
+                <m:r>
+                  <w:rPr>
+                    <w:ins w:id="20204" w:author="Claude" w:date="2026-10-09T06:37:03Z"/>
+                  </w:rPr>
+                  <m:t xml:space="preserve">film</m:t>
+                </m:r>
+              </m:sub>
+            </m:sSub>
+          </m:den>
+        </m:f>
       </m:oMath>
       <w:r>
         <w:t xml:space="preserve"> </w:t>
@@ -7154,7 +8099,11 @@
         <w:pStyle w:val="BodyText"/>
       </w:pPr>
       <w:r>
-        <w:t>where v</w:t>
+        <w:t xml:space="preserve">where </w:t>
+      </w:r>
+      <w:proofErr w:type="spellStart"/>
+      <w:r>
+        <w:t>v</w:t>
       </w:r>
       <w:r>
         <w:rPr>
@@ -7162,6 +8111,7 @@
         </w:rPr>
         <w:t>n</w:t>
       </w:r>
+      <w:proofErr w:type="spellEnd"/>
       <w:r>
         <w:t xml:space="preserve"> is the normal interface velocity, negative for recession. </w:t>
       </w:r>
@@ -7178,7 +8128,11 @@
         <w:t>sol</w:t>
       </w:r>
       <w:r>
-        <w:t xml:space="preserve"> = ρ</w:t>
+        <w:t xml:space="preserve"> = </w:t>
+      </w:r>
+      <w:proofErr w:type="spellStart"/>
+      <w:r>
+        <w:t>ρ</w:t>
       </w:r>
       <w:r>
         <w:rPr>
@@ -7186,8 +8140,13 @@
         </w:rPr>
         <w:t>Zn</w:t>
       </w:r>
-      <w:r>
-        <w:t>/M</w:t>
+      <w:proofErr w:type="spellEnd"/>
+      <w:r>
+        <w:t>/</w:t>
+      </w:r>
+      <w:proofErr w:type="spellStart"/>
+      <w:r>
+        <w:t>M</w:t>
       </w:r>
       <w:r>
         <w:rPr>
@@ -7195,6 +8154,7 @@
         </w:rPr>
         <w:t>Zn</w:t>
       </w:r>
+      <w:proofErr w:type="spellEnd"/>
       <w:r>
         <w:t>​, yields:</w:t>
       </w:r>
@@ -7223,7 +8183,7 @@
           <m:e>
             <m:r>
               <w:rPr>
-                <w:del w:id="20020" w:author="Claude" w:date="2026-10-09T06:27:45Z"/>
+                <w:del w:id="20182" w:author="Claude" w:date="2026-10-09T06:37:03Z"/>
                 <w:rFonts w:ascii="Cambria Math" w:hAnsi="Cambria Math" w:cs="Times New Roman"/>
               </w:rPr>
               <m:t>v</m:t>
@@ -7235,7 +8195,7 @@
                 <m:sty m:val="p"/>
               </m:rPr>
               <w:rPr>
-                <w:del w:id="20021" w:author="Claude" w:date="2026-10-09T06:27:45Z"/>
+                <w:del w:id="20183" w:author="Claude" w:date="2026-10-09T06:37:03Z"/>
                 <w:rFonts w:ascii="Cambria Math" w:hAnsi="Cambria Math" w:cs="Times New Roman"/>
               </w:rPr>
               <m:t>n</m:t>
@@ -7247,7 +8207,7 @@
             <m:sty m:val="p"/>
           </m:rPr>
           <w:rPr>
-            <w:del w:id="20022" w:author="Claude" w:date="2026-10-09T06:27:45Z"/>
+            <w:del w:id="20184" w:author="Claude" w:date="2026-10-09T06:37:03Z"/>
             <w:rFonts w:ascii="Cambria Math" w:hAnsi="Cambria Math" w:cs="Times New Roman"/>
           </w:rPr>
           <m:t>=-</m:t>
@@ -7263,7 +8223,7 @@
           <m:num>
             <m:r>
               <w:rPr>
-                <w:del w:id="20023" w:author="Claude" w:date="2026-10-09T06:27:45Z"/>
+                <w:del w:id="20185" w:author="Claude" w:date="2026-10-09T06:37:03Z"/>
                 <w:rFonts w:ascii="Cambria Math" w:hAnsi="Cambria Math" w:cs="Times New Roman"/>
               </w:rPr>
               <m:t>2 </m:t>
@@ -7279,7 +8239,7 @@
               <m:e>
                 <m:r>
                   <w:rPr>
-                    <w:del w:id="20024" w:author="Claude" w:date="2026-10-09T06:27:45Z"/>
+                    <w:del w:id="20186" w:author="Claude" w:date="2026-10-09T06:37:03Z"/>
                     <w:rFonts w:ascii="Cambria Math" w:hAnsi="Cambria Math" w:cs="Times New Roman"/>
                   </w:rPr>
                   <m:t>k</m:t>
@@ -7291,7 +8251,7 @@
                     <m:sty m:val="p"/>
                   </m:rPr>
                   <w:rPr>
-                    <w:del w:id="20025" w:author="Claude" w:date="2026-10-09T06:27:45Z"/>
+                    <w:del w:id="20187" w:author="Claude" w:date="2026-10-09T06:37:03Z"/>
                     <w:rFonts w:ascii="Cambria Math" w:hAnsi="Cambria Math" w:cs="Times New Roman"/>
                   </w:rPr>
                   <m:t>ORR</m:t>
@@ -7300,40 +8260,7 @@
             </m:sSub>
             <m:r>
               <w:rPr>
-                <w:del w:id="20026" w:author="Claude" w:date="2026-10-09T06:27:45Z"/>
-                <w:rFonts w:ascii="Cambria Math" w:hAnsi="Cambria Math" w:cs="Times New Roman"/>
-              </w:rPr>
-              <m:t> </m:t>
-            </m:r>
-            <m:r>
-              <w:rPr>
-                <w:del w:id="20027" w:author="Claude" w:date="2026-10-09T06:27:45Z"/>
-                <w:rFonts w:ascii="Cambria Math" w:hAnsi="Cambria Math"/>
-              </w:rPr>
-              <m:t>κ</m:t>
-            </m:r>
-            <m:d>
-              <m:dPr>
-                <m:ctrlPr>
-                  <w:rPr>
-                    <w:rFonts w:ascii="Cambria Math" w:hAnsi="Cambria Math"/>
-                    <w:i/>
-                  </w:rPr>
-                </m:ctrlPr>
-              </m:dPr>
-              <m:e>
-                <m:r>
-                  <w:rPr>
-                    <w:del w:id="20028" w:author="Claude" w:date="2026-10-09T06:27:45Z"/>
-                    <w:rFonts w:ascii="Cambria Math" w:hAnsi="Cambria Math"/>
-                  </w:rPr>
-                  <m:t>F</m:t>
-                </m:r>
-              </m:e>
-            </m:d>
-            <m:r>
-              <w:rPr>
-                <w:del w:id="20029" w:author="Claude" w:date="2026-10-09T06:27:45Z"/>
+                <w:del w:id="20188" w:author="Claude" w:date="2026-10-09T06:37:03Z"/>
                 <w:rFonts w:ascii="Cambria Math" w:hAnsi="Cambria Math"/>
               </w:rPr>
               <m:t xml:space="preserve"> </m:t>
@@ -7349,7 +8276,7 @@
               <m:e>
                 <m:r>
                   <w:rPr>
-                    <w:del w:id="20030" w:author="Claude" w:date="2026-10-09T06:27:45Z"/>
+                    <w:del w:id="20189" w:author="Claude" w:date="2026-10-09T06:37:03Z"/>
                     <w:rFonts w:ascii="Cambria Math" w:hAnsi="Cambria Math" w:cs="Times New Roman"/>
                   </w:rPr>
                   <m:t>C</m:t>
@@ -7370,7 +8297,7 @@
                         <m:sty m:val="p"/>
                       </m:rPr>
                       <w:rPr>
-                        <w:del w:id="20031" w:author="Claude" w:date="2026-10-09T06:27:45Z"/>
+                        <w:del w:id="20190" w:author="Claude" w:date="2026-10-09T06:37:03Z"/>
                         <w:rFonts w:ascii="Cambria Math" w:hAnsi="Cambria Math" w:cs="Times New Roman"/>
                       </w:rPr>
                       <m:t>O</m:t>
@@ -7382,7 +8309,7 @@
                         <m:sty m:val="p"/>
                       </m:rPr>
                       <w:rPr>
-                        <w:del w:id="20032" w:author="Claude" w:date="2026-10-09T06:27:45Z"/>
+                        <w:del w:id="20191" w:author="Claude" w:date="2026-10-09T06:37:03Z"/>
                         <w:rFonts w:ascii="Cambria Math" w:hAnsi="Cambria Math" w:cs="Times New Roman"/>
                       </w:rPr>
                       <m:t>2</m:t>
@@ -7405,7 +8332,7 @@
                     <m:sty m:val="p"/>
                   </m:rPr>
                   <w:rPr>
-                    <w:del w:id="20033" w:author="Claude" w:date="2026-10-09T06:27:45Z"/>
+                    <w:del w:id="20192" w:author="Claude" w:date="2026-10-09T06:37:03Z"/>
                     <w:rFonts w:ascii="Cambria Math" w:hAnsi="Cambria Math" w:cs="Times New Roman"/>
                   </w:rPr>
                   <m:t>|</m:t>
@@ -7417,7 +8344,7 @@
                     <m:sty m:val="p"/>
                   </m:rPr>
                   <w:rPr>
-                    <w:del w:id="20034" w:author="Claude" w:date="2026-10-09T06:27:45Z"/>
+                    <w:del w:id="20193" w:author="Claude" w:date="2026-10-09T06:37:03Z"/>
                     <w:rFonts w:ascii="Cambria Math" w:hAnsi="Cambria Math" w:cs="Times New Roman"/>
                   </w:rPr>
                   <m:t>Γ</m:t>
@@ -7431,7 +8358,7 @@
                 <m:sty m:val="p"/>
               </m:rPr>
               <w:rPr>
-                <w:del w:id="20035" w:author="Claude" w:date="2026-10-09T06:27:45Z"/>
+                <w:del w:id="20194" w:author="Claude" w:date="2026-10-09T06:37:03Z"/>
                 <w:rFonts w:ascii="Cambria Math" w:hAnsi="Cambria Math" w:cs="Times New Roman"/>
               </w:rPr>
               <m:t>[Zn</m:t>
@@ -7450,7 +8377,7 @@
                     <m:sty m:val="p"/>
                   </m:rPr>
                   <w:rPr>
-                    <w:del w:id="20036" w:author="Claude" w:date="2026-10-09T06:27:45Z"/>
+                    <w:del w:id="20195" w:author="Claude" w:date="2026-10-09T06:37:03Z"/>
                     <w:rFonts w:ascii="Cambria Math" w:hAnsi="Cambria Math" w:cs="Times New Roman"/>
                   </w:rPr>
                   <m:t>]</m:t>
@@ -7462,7 +8389,7 @@
                     <m:sty m:val="p"/>
                   </m:rPr>
                   <w:rPr>
-                    <w:del w:id="20037" w:author="Claude" w:date="2026-10-09T06:27:45Z"/>
+                    <w:del w:id="20196" w:author="Claude" w:date="2026-10-09T06:37:03Z"/>
                     <w:rFonts w:ascii="Cambria Math" w:hAnsi="Cambria Math" w:cs="Times New Roman"/>
                   </w:rPr>
                   <m:t>sol</m:t>
@@ -7477,7 +8404,7 @@
           <m:e>
             <m:r>
               <w:rPr>
-                <w:ins w:id="20009" w:author="Claude" w:date="2026-10-09T06:27:45Z"/>
+                <w:ins w:id="20174" w:author="Claude" w:date="2026-10-09T06:37:03Z"/>
               </w:rPr>
               <m:t xml:space="preserve">v</m:t>
             </m:r>
@@ -7485,7 +8412,7 @@
           <m:sub>
             <m:r>
               <w:rPr>
-                <w:ins w:id="20010" w:author="Claude" w:date="2026-10-09T06:27:45Z"/>
+                <w:ins w:id="20175" w:author="Claude" w:date="2026-10-09T06:37:03Z"/>
               </w:rPr>
               <m:t xml:space="preserve">n</m:t>
             </m:r>
@@ -7493,7 +8420,7 @@
         </m:sSub>
         <m:r>
           <w:rPr>
-            <w:ins w:id="20011" w:author="Claude" w:date="2026-10-09T06:27:45Z"/>
+            <w:ins w:id="20176" w:author="Claude" w:date="2026-10-09T06:37:03Z"/>
           </w:rPr>
           <m:t xml:space="preserve">=−</m:t>
         </m:r>
@@ -7501,7 +8428,7 @@
           <m:num>
             <m:r>
               <w:rPr>
-                <w:ins w:id="20012" w:author="Claude" w:date="2026-10-09T06:27:45Z"/>
+                <w:ins w:id="20177" w:author="Claude" w:date="2026-10-09T06:37:03Z"/>
               </w:rPr>
               <m:t xml:space="preserve">2</m:t>
             </m:r>
@@ -7509,51 +8436,27 @@
               <m:e>
                 <m:r>
                   <w:rPr>
-                    <w:ins w:id="20013" w:author="Claude" w:date="2026-10-09T06:27:45Z"/>
+                    <w:ins w:id="20178" w:author="Claude" w:date="2026-10-09T06:37:03Z"/>
                   </w:rPr>
-                  <m:t xml:space="preserve">k</m:t>
+                  <m:t xml:space="preserve">j</m:t>
                 </m:r>
               </m:e>
               <m:sub>
                 <m:r>
                   <w:rPr>
-                    <w:ins w:id="20014" w:author="Claude" w:date="2026-10-09T06:27:45Z"/>
+                    <w:ins w:id="20179" w:author="Claude" w:date="2026-10-09T06:37:03Z"/>
                   </w:rPr>
                   <m:t xml:space="preserve">ORR</m:t>
                 </m:r>
               </m:sub>
             </m:sSub>
-            <m:sSub>
-              <m:e>
-                <m:r>
-                  <w:rPr>
-                    <w:ins w:id="20015" w:author="Claude" w:date="2026-10-09T06:27:45Z"/>
-                  </w:rPr>
-                  <m:t xml:space="preserve">C</m:t>
-                </m:r>
-              </m:e>
-              <m:sub>
-                <m:r>
-                  <w:rPr>
-                    <w:ins w:id="20016" w:author="Claude" w:date="2026-10-09T06:27:45Z"/>
-                  </w:rPr>
-                  <m:t xml:space="preserve">O₂</m:t>
-                </m:r>
-              </m:sub>
-            </m:sSub>
-            <m:r>
-              <w:rPr>
-                <w:ins w:id="20017" w:author="Claude" w:date="2026-10-09T06:27:45Z"/>
-              </w:rPr>
-              <m:t xml:space="preserve">|Γ</m:t>
-            </m:r>
           </m:num>
           <m:den>
             <m:sSub>
               <m:e>
                 <m:r>
                   <w:rPr>
-                    <w:ins w:id="20018" w:author="Claude" w:date="2026-10-09T06:27:45Z"/>
+                    <w:ins w:id="20180" w:author="Claude" w:date="2026-10-09T06:37:03Z"/>
                   </w:rPr>
                   <m:t xml:space="preserve">[Zn]</m:t>
                 </m:r>
@@ -7561,7 +8464,7 @@
               <m:sub>
                 <m:r>
                   <w:rPr>
-                    <w:ins w:id="20019" w:author="Claude" w:date="2026-10-09T06:27:45Z"/>
+                    <w:ins w:id="20181" w:author="Claude" w:date="2026-10-09T06:37:03Z"/>
                   </w:rPr>
                   <m:t xml:space="preserve">sol</m:t>
                 </m:r>
@@ -7593,144 +8496,237 @@
     <w:p>
       <w:pPr>
         <w:pStyle w:val="BodyText"/>
+        <w:ind w:firstLine="0"/>
+        <w:rPr>
+          <w:del w:id="20244" w:author="Claude" w:date="2026-10-09T06:37:03Z"/>
+        </w:rPr>
       </w:pPr>
-      <w:r>
-        <w:t>where C</w:t>
-      </w:r>
-      <w:r>
-        <w:rPr>
-          <w:vertAlign w:val="subscript"/>
-        </w:rPr>
-        <w:t>O2</w:t>
-      </w:r>
-      <w:r>
-        <w:t>|</w:t>
-      </w:r>
-      <w:r>
-        <w:rPr>
-          <w:vertAlign w:val="subscript"/>
-        </w:rPr>
-        <w:t>Γ</w:t>
-      </w:r>
-      <w:r>
-        <w:t xml:space="preserve"> is the oxygen concentration at the interface (mol L</w:t>
-      </w:r>
-      <w:r>
-        <w:rPr>
-          <w:vertAlign w:val="superscript"/>
-        </w:rPr>
-        <w:t>-1</w:t>
-      </w:r>
-      <w:r>
-        <w:t>)</w:t>
-      </w:r>
-      <w:r>
-        <w:t xml:space="preserve">. </w:t>
-      </w:r>
-      <w:r>
-        <w:t>Oxygen-transport limitation is incorporated implicitly through the Robin boundary condition</w:t>
-      </w:r>
-      <w:r>
-        <w:t xml:space="preserve"> </w:t>
-      </w:r>
-      <w:r>
-        <w:rPr>
-          <w:b/>
-          <w:bCs/>
-        </w:rPr>
-        <w:t>(</w:t>
-      </w:r>
-      <w:r>
-        <w:rPr>
-          <w:b/>
-          <w:bCs/>
-        </w:rPr>
-        <w:t>Equation 7</w:t>
-      </w:r>
-      <w:r>
-        <w:rPr>
-          <w:b/>
-          <w:bCs/>
-        </w:rPr>
-        <w:t>)</w:t>
-      </w:r>
-      <w:del w:id="20008" w:author="Claude" w:date="2026-10-09T06:27:45Z">
+      <w:del w:id="20215" w:author="Claude" w:date="2026-10-09T06:37:03Z">
+        <w:r>
+          <w:delText xml:space="preserve">where C</w:delText>
+        </w:r>
+      </w:del>
+      <w:del w:id="20216" w:author="Claude" w:date="2026-10-09T06:37:03Z">
+        <w:r>
+          <w:rPr>
+            <w:vertAlign w:val="subscript"/>
+          </w:rPr>
+          <w:delText xml:space="preserve">O2</w:delText>
+        </w:r>
+      </w:del>
+      <w:del w:id="20217" w:author="Claude" w:date="2026-10-09T06:37:03Z">
+        <w:r>
+          <w:delText xml:space="preserve">|</w:delText>
+        </w:r>
+      </w:del>
+      <w:del w:id="20218" w:author="Claude" w:date="2026-10-09T06:37:03Z">
+        <w:r>
+          <w:rPr>
+            <w:vertAlign w:val="subscript"/>
+          </w:rPr>
+          <w:delText xml:space="preserve">Γ</w:delText>
+        </w:r>
+      </w:del>
+      <w:del w:id="20219" w:author="Claude" w:date="2026-10-09T06:37:03Z">
+        <w:r>
+          <w:delText xml:space="preserve"> is the oxygen concentration at the interface (mol L</w:delText>
+        </w:r>
+      </w:del>
+      <w:del w:id="20220" w:author="Claude" w:date="2026-10-09T06:37:03Z">
+        <w:r>
+          <w:rPr>
+            <w:vertAlign w:val="superscript"/>
+          </w:rPr>
+          <w:delText xml:space="preserve">-1</w:delText>
+        </w:r>
+      </w:del>
+      <w:del w:id="20221" w:author="Claude" w:date="2026-10-09T06:37:03Z">
+        <w:r>
+          <w:delText xml:space="preserve">). </w:delText>
+        </w:r>
+      </w:del>
+      <w:del w:id="20222" w:author="Claude" w:date="2026-10-09T06:37:03Z">
+        <w:r>
+          <w:delText xml:space="preserve">Oxygen-transport limitation is incorporated implicitly through the Robin boundary condition</w:delText>
+        </w:r>
+      </w:del>
+      <w:del w:id="20223" w:author="Claude" w:date="2026-10-09T06:37:03Z">
+        <w:r>
+          <w:delText xml:space="preserve"> </w:delText>
+        </w:r>
+      </w:del>
+      <w:del w:id="20224" w:author="Claude" w:date="2026-10-09T06:37:03Z">
+        <w:r>
+          <w:rPr>
+            <w:b/>
+            <w:bCs/>
+          </w:rPr>
+          <w:delText xml:space="preserve">(</w:delText>
+        </w:r>
+      </w:del>
+      <w:del w:id="20225" w:author="Claude" w:date="2026-10-09T06:37:03Z">
+        <w:r>
+          <w:rPr>
+            <w:b/>
+            <w:bCs/>
+          </w:rPr>
+          <w:delText xml:space="preserve">Equation 7</w:delText>
+        </w:r>
+      </w:del>
+      <w:del w:id="20226" w:author="Claude" w:date="2026-10-09T06:37:03Z">
+        <w:r>
+          <w:rPr>
+            <w:b/>
+            <w:bCs/>
+          </w:rPr>
+          <w:delText xml:space="preserve">)</w:delText>
+        </w:r>
+      </w:del>
+      <w:del w:id="9" w:author="Claude" w:date="2026-10-09T06:27:00Z">
         <w:r>
           <w:delText xml:space="preserve">, </w:delText>
         </w:r>
       </w:del>
-      <w:ins w:id="20007" w:author="Claude" w:date="2026-10-09T06:27:45Z">
+      <w:del w:id="20227" w:author="Claude" w:date="2026-10-09T06:37:03Z">
         <w:r>
-          <w:t xml:space="preserve">. </w:t>
+          <w:delText xml:space="preserve">As oxygen supply becomes restricted, the interfacial oxygen concentration decreases, reducing the oxygen-reduction flux and consequently the interface recession velocity</w:delText>
+        </w:r>
+      </w:del>
+      <w:del w:id="20228" w:author="Claude" w:date="2026-10-09T06:37:03Z">
+        <w:r>
+          <w:delText xml:space="preserve">. </w:delText>
+        </w:r>
+      </w:del>
+      <w:del w:id="20229" w:author="Claude" w:date="2026-10-09T06:37:03Z">
+        <w:r>
+          <w:delText xml:space="preserve">Therefore, no separate velocity </w:delText>
+        </w:r>
+      </w:del>
+      <w:del w:id="20230" w:author="Claude" w:date="2026-10-09T06:37:03Z">
+        <w:r>
+          <w:delText xml:space="preserve">cap or rate-selection criterion is required. The transition from reaction-controlled to diffusion-controlled degradation emerges naturally from the depletion of interfacial oxygen and its coupling with transport processes</w:delText>
+        </w:r>
+      </w:del>
+      <w:del w:id="20231" w:author="Claude" w:date="2026-10-09T06:37:03Z">
+        <w:r>
+          <w:delText xml:space="preserve"> </w:delText>
+        </w:r>
+      </w:del>
+      <w:del w:id="20232" w:author="Claude" w:date="2026-10-09T06:37:03Z">
+        <w:r>
+          <w:rPr>
+            <w:b/>
+            <w:bCs/>
+          </w:rPr>
+          <w:delText xml:space="preserve">(Section S1)</w:delText>
+        </w:r>
+      </w:del>
+      <w:del w:id="20233" w:author="Claude" w:date="2026-10-09T06:37:03Z">
+        <w:r>
+          <w:delText xml:space="preserve">.</w:delText>
+        </w:r>
+      </w:del>
+      <w:del w:id="20234" w:author="Claude" w:date="2026-10-09T06:37:03Z">
+        <w:r>
+          <w:delText xml:space="preserve"> </w:delText>
+        </w:r>
+      </w:del>
+      <w:del w:id="20235" w:author="Claude" w:date="2026-10-09T06:37:03Z">
+        <w:r>
+          <w:delText xml:space="preserve">Through this formulation, interface recession, oxygen consumption, </w:delText>
+        </w:r>
+      </w:del>
+      <w:del w:id="20236" w:author="Claude" w:date="2026-10-09T06:37:03Z">
+        <w:r>
+          <w:delText xml:space="preserve">Zn</w:delText>
+        </w:r>
+      </w:del>
+      <w:del w:id="20237" w:author="Claude" w:date="2026-10-09T06:37:03Z">
+        <w:r>
+          <w:rPr>
+            <w:vertAlign w:val="superscript"/>
+          </w:rPr>
+          <w:delText xml:space="preserve">2+</w:delText>
+        </w:r>
+      </w:del>
+      <w:del w:id="20238" w:author="Claude" w:date="2026-10-09T06:37:03Z">
+        <w:r>
+          <w:rPr>
+            <w:vertAlign w:val="superscript"/>
+          </w:rPr>
+          <w:delText xml:space="preserve"> </w:delText>
+        </w:r>
+      </w:del>
+      <w:del w:id="20239" w:author="Claude" w:date="2026-10-09T06:37:03Z">
+        <w:r>
+          <w:delText xml:space="preserve">release, </w:delText>
+        </w:r>
+      </w:del>
+      <w:del w:id="20240" w:author="Claude" w:date="2026-10-09T06:37:03Z">
+        <w:r>
+          <w:delText xml:space="preserve">OH</w:delText>
+        </w:r>
+      </w:del>
+      <w:del w:id="20241" w:author="Claude" w:date="2026-10-09T06:37:03Z">
+        <w:r>
+          <w:rPr>
+            <w:vertAlign w:val="superscript"/>
+          </w:rPr>
+          <w:delText xml:space="preserve">-</w:delText>
+        </w:r>
+      </w:del>
+      <w:del w:id="20242" w:author="Claude" w:date="2026-10-09T06:37:03Z">
+        <w:r>
+          <w:rPr>
+            <w:vertAlign w:val="superscript"/>
+          </w:rPr>
+          <w:delText xml:space="preserve"> </w:delText>
+        </w:r>
+      </w:del>
+      <w:del w:id="20243" w:author="Claude" w:date="2026-10-09T06:37:03Z">
+        <w:r>
+          <w:delText xml:space="preserve">generation, and corrosion-product growth are governed by a single oxygen-reduction flux, ensuring a mechanistically consistent link between interfacial chemistry, mass transport, and degradation kinetics.</w:delText>
+        </w:r>
+      </w:del>
+    </w:p>
+    <w:p>
+      <w:pPr>
+        <w:pStyle w:val="BodyText"/>
+        <w:rPr>
+          <w:ins w:id="20250" w:author="Claude" w:date="2026-10-09T06:37:03Z"/>
+        </w:rPr>
+      </w:pPr>
+      <w:ins w:id="20245" w:author="Claude" w:date="2026-10-09T06:37:03Z">
+        <w:r>
+          <w:t xml:space="preserve">where j</w:t>
         </w:r>
       </w:ins>
-      <w:r>
-        <w:t xml:space="preserve">As </w:t>
-      </w:r>
-      <w:r>
-        <w:t>oxygen supply becomes restricted, the interfacial oxygen concentration decreases, reducing the oxygen-reduction flux and consequently the interface recession velocity</w:t>
-      </w:r>
-      <w:r>
-        <w:t xml:space="preserve">. </w:t>
-      </w:r>
-      <w:r>
-        <w:t>Therefore, no separate velocity cap or rate-selection criterion is required. The transition from reaction-controlled to diffusion-controlled degradation emerges naturally from the depletion of interfacial oxygen and its coupling with transport processes</w:t>
-      </w:r>
-      <w:r>
-        <w:t xml:space="preserve"> </w:t>
-      </w:r>
-      <w:r>
-        <w:rPr>
-          <w:b/>
-          <w:bCs/>
-        </w:rPr>
-        <w:t>(Section S1)</w:t>
-      </w:r>
-      <w:r>
-        <w:t>.</w:t>
-      </w:r>
-      <w:r>
-        <w:t xml:space="preserve"> </w:t>
-      </w:r>
-      <w:r>
-        <w:t xml:space="preserve">Through this formulation, interface recession, oxygen consumption, </w:t>
-      </w:r>
-      <w:r>
-        <w:t>Zn</w:t>
-      </w:r>
-      <w:r>
-        <w:rPr>
-          <w:vertAlign w:val="superscript"/>
-        </w:rPr>
-        <w:t>2+</w:t>
-      </w:r>
-      <w:r>
-        <w:rPr>
-          <w:vertAlign w:val="superscript"/>
-        </w:rPr>
-        <w:t xml:space="preserve"> </w:t>
-      </w:r>
-      <w:r>
-        <w:t xml:space="preserve">release, </w:t>
-      </w:r>
-      <w:r>
-        <w:t>OH</w:t>
-      </w:r>
-      <w:r>
-        <w:rPr>
-          <w:vertAlign w:val="superscript"/>
-        </w:rPr>
-        <w:t>-</w:t>
-      </w:r>
-      <w:r>
-        <w:rPr>
-          <w:vertAlign w:val="superscript"/>
-        </w:rPr>
-        <w:t xml:space="preserve"> </w:t>
-      </w:r>
-      <w:r>
-        <w:t>generation, and corrosion-product growth are governed by a single oxygen-reduction flux, ensuring a mechanistically consistent link between interfacial chemistry, mass transport, and degradation kinetics.</w:t>
-      </w:r>
+      <w:ins w:id="20246" w:author="Claude" w:date="2026-10-09T06:37:03Z">
+        <w:r>
+          <w:rPr>
+            <w:vertAlign w:val="subscript"/>
+          </w:rPr>
+          <w:t xml:space="preserve">ORR</w:t>
+        </w:r>
+      </w:ins>
+      <w:ins w:id="20247" w:author="Claude" w:date="2026-10-09T06:37:03Z">
+        <w:r>
+          <w:t xml:space="preserve"> is the ORR molar flux defined above, so that v</w:t>
+        </w:r>
+      </w:ins>
+      <w:ins w:id="20248" w:author="Claude" w:date="2026-10-09T06:37:03Z">
+        <w:r>
+          <w:rPr>
+            <w:vertAlign w:val="subscript"/>
+          </w:rPr>
+          <w:t xml:space="preserve">n</w:t>
+        </w:r>
+      </w:ins>
+      <w:ins w:id="20249" w:author="Claude" w:date="2026-10-09T06:37:03Z">
+        <w:r>
+          <w:t xml:space="preserve"> has units of (mol mm⁻² h⁻¹)/(mol mm⁻³) = mm h⁻¹. Oxygen consumption is represented by the interface-localized sink in Equation 7. As oxygen transport to the interface becomes restricted, the interfacial oxygen concentration decreases, thereby reducing both the ORR flux and the interface recession velocity. Therefore, no separate velocity cap or rate-selection criterion is required. The transition from reaction-controlled to diffusion-controlled degradation emerges naturally from the depletion of interfacial oxygen and its coupling with transport processes (Section S1). Through this formulation, interface recession, oxygen consumption, Zn²⁺ release, OH⁻ generation, and corrosion-product growth are governed by a single oxygen-reduction flux, ensuring a mechanistically consistent link between interfacial chemistry, mass transport, and degradation kinetics.</w:t>
+        </w:r>
+      </w:ins>
     </w:p>
     <w:p>
       <w:pPr>
@@ -7742,24 +8738,32 @@
       <w:pPr>
         <w:pStyle w:val="Heading2"/>
       </w:pPr>
-      <w:bookmarkStart w:id="9" w:name="_Ref240381709"/>
-      <w:bookmarkStart w:id="10" w:name="tab:params"/>
+      <w:bookmarkStart w:id="11" w:name="_Ref240381709"/>
+      <w:bookmarkStart w:id="12" w:name="tab:params"/>
       <w:r>
         <w:t>Numerical Implementation and Simulation Setup</w:t>
       </w:r>
-      <w:bookmarkEnd w:id="9"/>
+      <w:bookmarkEnd w:id="11"/>
     </w:p>
     <w:p>
       <w:pPr>
         <w:pStyle w:val="BodyText"/>
       </w:pPr>
       <w:r>
-        <w:t xml:space="preserve">The coupled reaction-diffusion and moving-boundary framework was implemented in FreeFEM++ and solved using first-order finite elements with implicit time integration. </w:t>
+        <w:t xml:space="preserve">The coupled reaction-diffusion and moving-boundary framework was implemented in </w:t>
+      </w:r>
+      <w:proofErr w:type="spellStart"/>
+      <w:r>
+        <w:t>FreeFEM</w:t>
+      </w:r>
+      <w:proofErr w:type="spellEnd"/>
+      <w:r>
+        <w:t xml:space="preserve"> and solved using first-order finite elements with implicit time integration. </w:t>
       </w:r>
       <w:r>
         <w:t>Parametrically generated implant geometries were discretized into tetrahedral meshes and embedded within a 30 × 30 × 30 mm electrolyte domain</w:t>
       </w:r>
-      <w:ins w:id="11" w:author="Claude" w:date="2026-10-08T20:38:00Z">
+      <w:ins w:id="13" w:author="Claude" w:date="2026-10-08T20:38:00Z">
         <w:r>
           <w:t>,</w:t>
         </w:r>
@@ -7767,7 +8771,7 @@
       <w:r>
         <w:t xml:space="preserve"> identical for the disc and the stent and larger than three times the implant characteristic dimension in each direction</w:t>
       </w:r>
-      <w:ins w:id="12" w:author="Claude" w:date="2026-10-08T04:28:00Z">
+      <w:ins w:id="14" w:author="Claude" w:date="2026-10-08T04:28:00Z">
         <w:r>
           <w:t>,</w:t>
         </w:r>
@@ -7809,7 +8813,15 @@
         <w:t xml:space="preserve"> and </w:t>
       </w:r>
       <w:r>
-        <w:t>no natural convection was considered (static conditions). Simulations were executed in parallel using FreeFEM++ MPI on a high-performance computing cluster, and degradation metrics together with concentration and interface fields were recorded at regular time intervals.</w:t>
+        <w:t xml:space="preserve">no natural convection was considered (static conditions). Simulations were executed in parallel using </w:t>
+      </w:r>
+      <w:proofErr w:type="spellStart"/>
+      <w:r>
+        <w:t>FreeFEM</w:t>
+      </w:r>
+      <w:proofErr w:type="spellEnd"/>
+      <w:r>
+        <w:t>++ MPI on a high-performance computing cluster, and degradation metrics together with concentration and interface fields were recorded at regular time intervals.</w:t>
       </w:r>
       <w:r>
         <w:t xml:space="preserve"> Predicted mass loss, corrosion rate (</w:t>
@@ -7844,7 +8856,15 @@
         <w:t>, and dissolved oxygen concentration</w:t>
       </w:r>
       <w:r>
-        <w:t xml:space="preserve"> were extracted during post-processing. The transition between reaction-controlled and diffusion-controlled degradation was quantified using the local Damköhler number (</w:t>
+        <w:t xml:space="preserve"> were extracted during post-processing. The transition between reaction-controlled and diffusion-controlled degradation was quantified using the local </w:t>
+      </w:r>
+      <w:proofErr w:type="spellStart"/>
+      <w:r>
+        <w:t>Damköhler</w:t>
+      </w:r>
+      <w:proofErr w:type="spellEnd"/>
+      <w:r>
+        <w:t xml:space="preserve"> number (</w:t>
       </w:r>
       <w:r>
         <w:rPr>
@@ -7854,10 +8874,7 @@
         <w:t>Equation S3</w:t>
       </w:r>
       <w:r>
-        <w:t xml:space="preserve">), while spatial distributions of oxygen concentration and </w:t>
-      </w:r>
-      <w:r>
-        <w:t>corrosion-product fields were used to interpret degradation mechanisms.</w:t>
+        <w:t>), while spatial distributions of oxygen concentration and corrosion-product fields were used to interpret degradation mechanisms.</w:t>
       </w:r>
       <w:r>
         <w:t xml:space="preserve"> </w:t>
@@ -7915,7 +8932,10 @@
         <w:t xml:space="preserve"> </w:t>
       </w:r>
       <w:r>
-        <w:t xml:space="preserve">summarizes the model parameters, while </w:t>
+        <w:t xml:space="preserve">summarizes </w:t>
+      </w:r>
+      <w:r>
+        <w:t xml:space="preserve">the model parameters, while </w:t>
       </w:r>
       <w:r>
         <w:rPr>
@@ -7948,7 +8968,7 @@
           <w:rFonts w:cs="Times New Roman"/>
         </w:rPr>
       </w:pPr>
-      <w:bookmarkStart w:id="13" w:name="_Ref238635735"/>
+      <w:bookmarkStart w:id="15" w:name="_Ref238635735"/>
       <w:r>
         <w:rPr>
           <w:b/>
@@ -7992,7 +9012,7 @@
         </w:rPr>
         <w:fldChar w:fldCharType="end"/>
       </w:r>
-      <w:bookmarkEnd w:id="13"/>
+      <w:bookmarkEnd w:id="15"/>
       <w:r>
         <w:rPr>
           <w:b/>
@@ -9978,15 +10998,7 @@
                 <w:sz w:val="22"/>
                 <w:szCs w:val="22"/>
               </w:rPr>
-              <w:t> </w:t>
-            </w:r>
-            <w:r>
-              <w:rPr>
-                <w:rFonts w:cs="Times New Roman"/>
-                <w:sz w:val="22"/>
-                <w:szCs w:val="22"/>
-              </w:rPr>
-              <w:t>g cm</w:t>
+              <w:t> g cm</w:t>
             </w:r>
             <w:r>
               <w:rPr>
@@ -10919,13 +11931,117 @@
               </w:rPr>
               <w:t xml:space="preserve"> </w:t>
             </w:r>
+            <w:del w:id="9012" w:author="Claude" w:date="2026-10-09T06:37:03Z">
+              <w:r>
+                <w:rPr>
+                  <w:rFonts w:cs="Times New Roman"/>
+                  <w:sz w:val="22"/>
+                  <w:szCs w:val="22"/>
+                </w:rPr>
+                <w:delText xml:space="preserve">5</w:delText>
+              </w:r>
+            </w:del>
+            <w:ins w:id="9011" w:author="Claude" w:date="2026-10-09T06:37:03Z">
+              <w:r>
+                <w:rPr>
+                  <w:rFonts w:cs="Times New Roman"/>
+                  <w:sz w:val="22"/>
+                  <w:szCs w:val="22"/>
+                </w:rPr>
+                <w:t xml:space="preserve">1</w:t>
+              </w:r>
+            </w:ins>
             <w:r>
               <w:rPr>
                 <w:rFonts w:cs="Times New Roman"/>
                 <w:sz w:val="22"/>
                 <w:szCs w:val="22"/>
               </w:rPr>
-              <w:t>5.04 × 10⁻⁶ g mm⁻³</w:t>
+              <w:t xml:space="preserve">.</w:t>
+            </w:r>
+            <w:del w:id="9010" w:author="Claude" w:date="2026-10-09T06:37:03Z">
+              <w:r>
+                <w:rPr>
+                  <w:rFonts w:cs="Times New Roman"/>
+                  <w:sz w:val="22"/>
+                  <w:szCs w:val="22"/>
+                </w:rPr>
+                <w:delText xml:space="preserve">04</w:delText>
+              </w:r>
+            </w:del>
+            <w:ins w:id="9009" w:author="Claude" w:date="2026-10-09T06:37:03Z">
+              <w:r>
+                <w:rPr>
+                  <w:rFonts w:cs="Times New Roman"/>
+                  <w:sz w:val="22"/>
+                  <w:szCs w:val="22"/>
+                </w:rPr>
+                <w:t xml:space="preserve">42</w:t>
+              </w:r>
+            </w:ins>
+            <w:r>
+              <w:rPr>
+                <w:rFonts w:cs="Times New Roman"/>
+                <w:sz w:val="22"/>
+                <w:szCs w:val="22"/>
+              </w:rPr>
+              <w:t xml:space="preserve"> × 10⁻</w:t>
+            </w:r>
+            <w:del w:id="9008" w:author="Claude" w:date="2026-10-09T06:37:03Z">
+              <w:r>
+                <w:rPr>
+                  <w:rFonts w:cs="Times New Roman"/>
+                  <w:sz w:val="22"/>
+                  <w:szCs w:val="22"/>
+                </w:rPr>
+                <w:delText xml:space="preserve">⁶</w:delText>
+              </w:r>
+            </w:del>
+            <w:ins w:id="9007" w:author="Claude" w:date="2026-10-09T06:37:03Z">
+              <w:r>
+                <w:rPr>
+                  <w:rFonts w:cs="Times New Roman"/>
+                  <w:sz w:val="22"/>
+                  <w:szCs w:val="22"/>
+                </w:rPr>
+                <w:t xml:space="preserve">⁷</w:t>
+              </w:r>
+            </w:ins>
+            <w:r>
+              <w:rPr>
+                <w:rFonts w:cs="Times New Roman"/>
+                <w:sz w:val="22"/>
+                <w:szCs w:val="22"/>
+              </w:rPr>
+              <w:t xml:space="preserve"> </w:t>
+            </w:r>
+            <w:del w:id="9006" w:author="Claude" w:date="2026-10-09T06:37:03Z">
+              <w:r>
+                <w:rPr>
+                  <w:rFonts w:cs="Times New Roman"/>
+                  <w:sz w:val="22"/>
+                  <w:szCs w:val="22"/>
+                </w:rPr>
+                <w:delText xml:space="preserve">g</w:delText>
+              </w:r>
+            </w:del>
+            <w:ins w:id="9005" w:author="Claude" w:date="2026-10-09T06:37:03Z">
+              <w:r>
+                <w:rPr>
+                  <w:rFonts w:cs="Times New Roman"/>
+                  <w:sz w:val="22"/>
+                  <w:szCs w:val="22"/>
+                </w:rPr>
+                <w:t xml:space="preserve">mol</w:t>
+              </w:r>
+            </w:ins>
+            <w:r>
+              <w:rPr>
+                <w:rFonts w:cs="Times New Roman"/>
+                <w:sz w:val="22"/>
+                <w:szCs w:val="22"/>
+              </w:rPr>
+              <w:t xml:space="preserve"> mm⁻³</w:t>
             </w:r>
           </w:p>
         </w:tc>
@@ -11171,13 +12287,117 @@
               </w:rPr>
               <w:t xml:space="preserve"> </w:t>
             </w:r>
+            <w:del w:id="9020" w:author="Claude" w:date="2026-10-09T06:37:03Z">
+              <w:r>
+                <w:rPr>
+                  <w:rFonts w:cs="Times New Roman"/>
+                  <w:sz w:val="22"/>
+                  <w:szCs w:val="22"/>
+                </w:rPr>
+                <w:delText xml:space="preserve">3</w:delText>
+              </w:r>
+            </w:del>
+            <w:ins w:id="9019" w:author="Claude" w:date="2026-10-09T06:37:03Z">
+              <w:r>
+                <w:rPr>
+                  <w:rFonts w:cs="Times New Roman"/>
+                  <w:sz w:val="22"/>
+                  <w:szCs w:val="22"/>
+                </w:rPr>
+                <w:t xml:space="preserve">1</w:t>
+              </w:r>
+            </w:ins>
             <w:r>
               <w:rPr>
                 <w:rFonts w:cs="Times New Roman"/>
                 <w:sz w:val="22"/>
                 <w:szCs w:val="22"/>
               </w:rPr>
-              <w:t>3.5 × 10⁻⁹ g mm⁻³</w:t>
+              <w:t xml:space="preserve">.</w:t>
+            </w:r>
+            <w:del w:id="9018" w:author="Claude" w:date="2026-10-09T06:37:03Z">
+              <w:r>
+                <w:rPr>
+                  <w:rFonts w:cs="Times New Roman"/>
+                  <w:sz w:val="22"/>
+                  <w:szCs w:val="22"/>
+                </w:rPr>
+                <w:delText xml:space="preserve">5</w:delText>
+              </w:r>
+            </w:del>
+            <w:ins w:id="9017" w:author="Claude" w:date="2026-10-09T06:37:03Z">
+              <w:r>
+                <w:rPr>
+                  <w:rFonts w:cs="Times New Roman"/>
+                  <w:sz w:val="22"/>
+                  <w:szCs w:val="22"/>
+                </w:rPr>
+                <w:t xml:space="preserve">09</w:t>
+              </w:r>
+            </w:ins>
+            <w:r>
+              <w:rPr>
+                <w:rFonts w:cs="Times New Roman"/>
+                <w:sz w:val="22"/>
+                <w:szCs w:val="22"/>
+              </w:rPr>
+              <w:t xml:space="preserve"> × 10⁻</w:t>
+            </w:r>
+            <w:del w:id="9016" w:author="Claude" w:date="2026-10-09T06:37:03Z">
+              <w:r>
+                <w:rPr>
+                  <w:rFonts w:cs="Times New Roman"/>
+                  <w:sz w:val="22"/>
+                  <w:szCs w:val="22"/>
+                </w:rPr>
+                <w:delText xml:space="preserve">⁹</w:delText>
+              </w:r>
+            </w:del>
+            <w:ins w:id="9015" w:author="Claude" w:date="2026-10-09T06:37:03Z">
+              <w:r>
+                <w:rPr>
+                  <w:rFonts w:cs="Times New Roman"/>
+                  <w:sz w:val="22"/>
+                  <w:szCs w:val="22"/>
+                </w:rPr>
+                <w:t xml:space="preserve">¹⁰</w:t>
+              </w:r>
+            </w:ins>
+            <w:r>
+              <w:rPr>
+                <w:rFonts w:cs="Times New Roman"/>
+                <w:sz w:val="22"/>
+                <w:szCs w:val="22"/>
+              </w:rPr>
+              <w:t xml:space="preserve"> </w:t>
+            </w:r>
+            <w:del w:id="9014" w:author="Claude" w:date="2026-10-09T06:37:03Z">
+              <w:r>
+                <w:rPr>
+                  <w:rFonts w:cs="Times New Roman"/>
+                  <w:sz w:val="22"/>
+                  <w:szCs w:val="22"/>
+                </w:rPr>
+                <w:delText xml:space="preserve">g</w:delText>
+              </w:r>
+            </w:del>
+            <w:ins w:id="9013" w:author="Claude" w:date="2026-10-09T06:37:03Z">
+              <w:r>
+                <w:rPr>
+                  <w:rFonts w:cs="Times New Roman"/>
+                  <w:sz w:val="22"/>
+                  <w:szCs w:val="22"/>
+                </w:rPr>
+                <w:t xml:space="preserve">mol</w:t>
+              </w:r>
+            </w:ins>
+            <w:r>
+              <w:rPr>
+                <w:rFonts w:cs="Times New Roman"/>
+                <w:sz w:val="22"/>
+                <w:szCs w:val="22"/>
+              </w:rPr>
+              <w:t xml:space="preserve"> mm⁻³</w:t>
             </w:r>
           </w:p>
         </w:tc>
@@ -11377,7 +12597,7 @@
           </w:p>
         </w:tc>
       </w:tr>
-      <w:bookmarkEnd w:id="10"/>
+      <w:bookmarkEnd w:id="12"/>
     </w:tbl>
     <w:p>
       <w:pPr>
@@ -11551,10 +12771,7 @@
         <w:t xml:space="preserve"> The calibration</w:t>
       </w:r>
       <w:r>
-        <w:t xml:space="preserve"> used published 14-day mass-loss measurements obtained from revised simulated body fluid (r-SBF) immersion experiments reported by Liu et </w:t>
-      </w:r>
-      <w:r>
-        <w:t xml:space="preserve">al. </w:t>
+        <w:t xml:space="preserve"> used published 14-day mass-loss measurements obtained from revised simulated body fluid (r-SBF) immersion experiments reported by Liu et al. </w:t>
       </w:r>
       <w:r>
         <w:rPr>
@@ -11598,7 +12815,10 @@
         <w:t>Table S7</w:t>
       </w:r>
       <w:r>
-        <w:t xml:space="preserve">). Optimal parameter combinations were identified by minimizing the RMSE between simulated and literature mass-loss data. </w:t>
+        <w:t xml:space="preserve">). Optimal parameter combinations were identified by minimizing the RMSE </w:t>
+      </w:r>
+      <w:r>
+        <w:t xml:space="preserve">between simulated and literature mass-loss data. </w:t>
       </w:r>
       <w:r>
         <w:t xml:space="preserve">The calibrated model was then validated against the HBSS immersion dataset generated in the present study. </w:t>
@@ -12059,12 +13279,12 @@
         <w:pStyle w:val="FirstParagraph"/>
         <w:ind w:firstLine="360"/>
         <w:rPr>
-          <w:del w:id="14" w:author="Claude" w:date="2026-10-09T01:35:00Z"/>
+          <w:del w:id="16" w:author="Claude" w:date="2026-10-09T01:35:00Z"/>
           <w:rFonts w:cs="Times New Roman"/>
         </w:rPr>
       </w:pPr>
-      <w:bookmarkStart w:id="15" w:name="fig:gsa"/>
-      <w:del w:id="16" w:author="Claude" w:date="2026-10-09T01:35:00Z">
+      <w:bookmarkStart w:id="17" w:name="fig:gsa"/>
+      <w:del w:id="18" w:author="Claude" w:date="2026-10-09T01:35:00Z">
         <w:r>
           <w:rPr>
             <w:rFonts w:cs="Times New Roman"/>
@@ -12196,7 +13416,7 @@
           </m:sub>
         </m:sSub>
       </m:oMath>
-      <w:del w:id="17" w:author="Claude" w:date="2026-10-09T01:35:00Z">
+      <w:del w:id="19" w:author="Claude" w:date="2026-10-09T01:35:00Z">
         <w:r>
           <w:rPr>
             <w:rFonts w:cs="Times New Roman"/>
@@ -12240,7 +13460,7 @@
           </m:sub>
         </m:sSub>
       </m:oMath>
-      <w:del w:id="18" w:author="Claude" w:date="2026-10-09T01:35:00Z">
+      <w:del w:id="20" w:author="Claude" w:date="2026-10-09T01:35:00Z">
         <w:r>
           <w:rPr>
             <w:rFonts w:cs="Times New Roman"/>
@@ -12299,7 +13519,7 @@
           <m:t>)</m:t>
         </m:r>
       </m:oMath>
-      <w:del w:id="19" w:author="Claude" w:date="2026-10-09T01:35:00Z">
+      <w:del w:id="21" w:author="Claude" w:date="2026-10-09T01:35:00Z">
         <w:r>
           <w:rPr>
             <w:rFonts w:cs="Times New Roman"/>
@@ -12359,7 +13579,7 @@
           </m:sub>
         </m:sSub>
       </m:oMath>
-      <w:del w:id="20" w:author="Claude" w:date="2026-10-09T01:35:00Z">
+      <w:del w:id="22" w:author="Claude" w:date="2026-10-09T01:35:00Z">
         <w:r>
           <w:rPr>
             <w:rFonts w:cs="Times New Roman"/>
@@ -12418,7 +13638,7 @@
           <m:t>)</m:t>
         </m:r>
       </m:oMath>
-      <w:del w:id="21" w:author="Claude" w:date="2026-10-09T01:35:00Z">
+      <w:del w:id="23" w:author="Claude" w:date="2026-10-09T01:35:00Z">
         <w:r>
           <w:rPr>
             <w:rFonts w:cs="Times New Roman"/>
@@ -12462,7 +13682,7 @@
           </m:sup>
         </m:sSup>
       </m:oMath>
-      <w:del w:id="22" w:author="Claude" w:date="2026-10-09T01:35:00Z">
+      <w:del w:id="24" w:author="Claude" w:date="2026-10-09T01:35:00Z">
         <w:r>
           <w:rPr>
             <w:rFonts w:cs="Times New Roman"/>
@@ -12498,7 +13718,7 @@
           </m:sup>
         </m:sSup>
       </m:oMath>
-      <w:del w:id="23" w:author="Claude" w:date="2026-10-09T01:35:00Z">
+      <w:del w:id="25" w:author="Claude" w:date="2026-10-09T01:35:00Z">
         <w:r>
           <w:rPr>
             <w:rFonts w:cs="Times New Roman"/>
@@ -12534,7 +13754,7 @@
           </m:sup>
         </m:sSup>
       </m:oMath>
-      <w:del w:id="24" w:author="Claude" w:date="2026-10-09T01:35:00Z">
+      <w:del w:id="26" w:author="Claude" w:date="2026-10-09T01:35:00Z">
         <w:r>
           <w:rPr>
             <w:rFonts w:cs="Times New Roman"/>
@@ -12711,7 +13931,7 @@
           </m:sub>
         </m:sSub>
       </m:oMath>
-      <w:del w:id="25" w:author="Claude" w:date="2026-10-09T01:35:00Z">
+      <w:del w:id="27" w:author="Claude" w:date="2026-10-09T01:35:00Z">
         <w:r>
           <w:rPr>
             <w:rFonts w:cs="Times New Roman"/>
@@ -12771,7 +13991,7 @@
           </m:sub>
         </m:sSub>
       </m:oMath>
-      <w:del w:id="26" w:author="Claude" w:date="2026-10-09T01:35:00Z">
+      <w:del w:id="28" w:author="Claude" w:date="2026-10-09T01:35:00Z">
         <w:r>
           <w:rPr>
             <w:rFonts w:cs="Times New Roman"/>
@@ -12818,7 +14038,7 @@
           </m:sub>
         </m:sSub>
       </m:oMath>
-      <w:del w:id="27" w:author="Claude" w:date="2026-10-09T01:35:00Z">
+      <w:del w:id="29" w:author="Claude" w:date="2026-10-09T01:35:00Z">
         <w:r>
           <w:rPr>
             <w:rFonts w:cs="Times New Roman"/>
@@ -12853,7 +14073,7 @@
           </m:sub>
         </m:sSub>
       </m:oMath>
-      <w:del w:id="28" w:author="Claude" w:date="2026-10-09T01:35:00Z">
+      <w:del w:id="30" w:author="Claude" w:date="2026-10-09T01:35:00Z">
         <w:r>
           <w:rPr>
             <w:rFonts w:cs="Times New Roman"/>
@@ -12891,7 +14111,7 @@
           </m:sub>
         </m:sSub>
       </m:oMath>
-      <w:del w:id="29" w:author="Claude" w:date="2026-10-09T01:35:00Z">
+      <w:del w:id="31" w:author="Claude" w:date="2026-10-09T01:35:00Z">
         <w:r>
           <w:rPr>
             <w:rFonts w:cs="Times New Roman"/>
@@ -12904,10 +14124,10 @@
       <w:pPr>
         <w:pStyle w:val="BodyText"/>
         <w:rPr>
-          <w:ins w:id="30" w:author="Claude" w:date="2026-10-09T01:35:00Z"/>
+          <w:ins w:id="32" w:author="Claude" w:date="2026-10-09T01:35:00Z"/>
         </w:rPr>
       </w:pPr>
-      <w:ins w:id="31" w:author="Claude" w:date="2026-10-09T01:35:00Z">
+      <w:ins w:id="33" w:author="Claude" w:date="2026-10-09T01:35:00Z">
         <w:r>
           <w:t>The Morris sensitivity analysis (Figure 3a) identified dissolved oxygen availability (C</w:t>
         </w:r>
@@ -12918,7 +14138,11 @@
           <w:t>O2</w:t>
         </w:r>
         <w:r>
-          <w:t>) as the dominant control on Zn mass loss, followed by the ORR rate constant (k</w:t>
+          <w:t>) as the dominant control on Zn mass loss, followed by the ORR rate constant (</w:t>
+        </w:r>
+        <w:proofErr w:type="spellStart"/>
+        <w:r>
+          <w:t>k</w:t>
         </w:r>
         <w:r>
           <w:rPr>
@@ -12926,8 +14150,13 @@
           </w:rPr>
           <w:t>ORR</w:t>
         </w:r>
+        <w:proofErr w:type="spellEnd"/>
         <w:r>
-          <w:t>); the corrosion-product coefficients (k</w:t>
+          <w:t>); the corrosion-product coefficients (</w:t>
+        </w:r>
+        <w:proofErr w:type="spellStart"/>
+        <w:r>
+          <w:t>k</w:t>
         </w:r>
         <w:r>
           <w:rPr>
@@ -12935,8 +14164,13 @@
           </w:rPr>
           <w:t>f</w:t>
         </w:r>
+        <w:proofErr w:type="spellEnd"/>
         <w:r>
-          <w:t>, k</w:t>
+          <w:t xml:space="preserve">, </w:t>
+        </w:r>
+        <w:proofErr w:type="spellStart"/>
+        <w:r>
+          <w:t>k</w:t>
         </w:r>
         <w:r>
           <w:rPr>
@@ -12944,18 +14178,19 @@
           </w:rPr>
           <w:t>d</w:t>
         </w:r>
+        <w:proofErr w:type="spellEnd"/>
         <w:r>
           <w:t xml:space="preserve">) and the oxygen diffusivity had smaller effects [ranking to be confirmed by repeating the analysis over the calibration ranges]. The diffusivities of Zn²⁺, Cl⁻ and OH⁻ showed negligible sensitivity and were fixed at literature values (Table 1). The strong sensitivity to oxygen-related parameters is consistent with experimental observations of oxygen-controlled Zn biodegradation under physiological conditions </w:t>
         </w:r>
       </w:ins>
-      <w:ins w:id="32" w:author="Claude" w:date="2026-10-09T02:19:00Z">
+      <w:ins w:id="34" w:author="Claude" w:date="2026-10-09T02:19:00Z">
         <w:r>
           <w:rPr>
             <w:rFonts w:cs="Times New Roman"/>
           </w:rPr>
           <w:fldChar w:fldCharType="begin"/>
         </w:r>
-        <w:del w:id="33" w:author="Unknown">
+        <w:del w:id="35" w:author="Unknown">
           <w:r>
             <w:rPr>
               <w:rFonts w:cs="Times New Roman"/>
@@ -12969,7 +14204,7 @@
           </w:rPr>
           <w:fldChar w:fldCharType="separate"/>
         </w:r>
-        <w:del w:id="34" w:author="Unknown">
+        <w:del w:id="36" w:author="Unknown">
           <w:r>
             <w:rPr>
               <w:rFonts w:cs="Times New Roman"/>
@@ -12985,7 +14220,7 @@
           <w:fldChar w:fldCharType="end"/>
         </w:r>
       </w:ins>
-      <w:ins w:id="35" w:author="Claude" w:date="2026-10-09T01:35:00Z">
+      <w:ins w:id="37" w:author="Claude" w:date="2026-10-09T01:35:00Z">
         <w:r>
           <w:t>. C</w:t>
         </w:r>
@@ -12996,7 +14231,11 @@
           <w:t>O2</w:t>
         </w:r>
         <w:r>
-          <w:t xml:space="preserve"> and the film parameters were fixed at literature-derived values to preserve physical realism and avoid compensatory parameter fitting, so calibration was restricted to the three kinetic parameters k</w:t>
+          <w:t xml:space="preserve"> and the film parameters were fixed at literature-derived values to preserve physical realism and avoid compensatory parameter fitting, so calibration was restricted to the three kinetic parameters </w:t>
+        </w:r>
+        <w:proofErr w:type="spellStart"/>
+        <w:r>
+          <w:t>k</w:t>
         </w:r>
         <w:r>
           <w:rPr>
@@ -13004,8 +14243,13 @@
           </w:rPr>
           <w:t>f</w:t>
         </w:r>
+        <w:proofErr w:type="spellEnd"/>
         <w:r>
-          <w:t>, k</w:t>
+          <w:t xml:space="preserve">, </w:t>
+        </w:r>
+        <w:proofErr w:type="spellStart"/>
+        <w:r>
+          <w:t>k</w:t>
         </w:r>
         <w:r>
           <w:rPr>
@@ -13013,8 +14257,13 @@
           </w:rPr>
           <w:t>d</w:t>
         </w:r>
+        <w:proofErr w:type="spellEnd"/>
         <w:r>
-          <w:t xml:space="preserve"> and k</w:t>
+          <w:t xml:space="preserve"> and </w:t>
+        </w:r>
+        <w:proofErr w:type="spellStart"/>
+        <w:r>
+          <w:t>k</w:t>
         </w:r>
         <w:r>
           <w:rPr>
@@ -13022,6 +14271,7 @@
           </w:rPr>
           <w:t>ORR</w:t>
         </w:r>
+        <w:proofErr w:type="spellEnd"/>
         <w:r>
           <w:t>.</w:t>
         </w:r>
@@ -13031,10 +14281,10 @@
       <w:pPr>
         <w:pStyle w:val="BodyText"/>
         <w:rPr>
-          <w:del w:id="36" w:author="Claude" w:date="2026-10-09T01:35:00Z"/>
+          <w:del w:id="38" w:author="Claude" w:date="2026-10-09T01:35:00Z"/>
         </w:rPr>
       </w:pPr>
-      <w:del w:id="37" w:author="Claude" w:date="2026-10-09T01:35:00Z">
+      <w:del w:id="39" w:author="Claude" w:date="2026-10-09T01:35:00Z">
         <w:r>
           <w:delText xml:space="preserve">These parameters were then calibrated within the 3D reaction-diffusion framework using Bayesian optimization. </w:delText>
         </w:r>
@@ -13042,19 +14292,9 @@
           <w:delText xml:space="preserve">Following the initial exploration of the admissible parameter space, the optimization rapidly reduced the RMSE from approximately 0.28% to below 0.05% and </w:delText>
         </w:r>
       </w:del>
-      <w:del w:id="38" w:author="Claude" w:date="2026-10-08T23:42:00Z">
+      <w:del w:id="40" w:author="Claude" w:date="2026-10-08T23:42:00Z">
         <w:r>
           <w:delText>identified</w:delText>
-        </w:r>
-      </w:del>
-      <w:del w:id="39" w:author="Claude" w:date="2026-10-09T01:35:00Z">
-        <w:r>
-          <w:delText xml:space="preserve"> </w:delText>
-        </w:r>
-      </w:del>
-      <w:del w:id="40" w:author="Claude" w:date="2026-10-08T23:42:00Z">
-        <w:r>
-          <w:delText>a</w:delText>
         </w:r>
       </w:del>
       <w:del w:id="41" w:author="Claude" w:date="2026-10-09T01:35:00Z">
@@ -13064,7 +14304,7 @@
       </w:del>
       <w:del w:id="42" w:author="Claude" w:date="2026-10-08T23:42:00Z">
         <w:r>
-          <w:delText>distinct</w:delText>
+          <w:delText>a</w:delText>
         </w:r>
       </w:del>
       <w:del w:id="43" w:author="Claude" w:date="2026-10-09T01:35:00Z">
@@ -13074,7 +14314,7 @@
       </w:del>
       <w:del w:id="44" w:author="Claude" w:date="2026-10-08T23:42:00Z">
         <w:r>
-          <w:delText>optimum</w:delText>
+          <w:delText>distinct</w:delText>
         </w:r>
       </w:del>
       <w:del w:id="45" w:author="Claude" w:date="2026-10-09T01:35:00Z">
@@ -13084,20 +14324,30 @@
       </w:del>
       <w:del w:id="46" w:author="Claude" w:date="2026-10-08T23:42:00Z">
         <w:r>
-          <w:delText>after</w:delText>
+          <w:delText>optimum</w:delText>
         </w:r>
       </w:del>
       <w:del w:id="47" w:author="Claude" w:date="2026-10-09T01:35:00Z">
         <w:r>
-          <w:delText xml:space="preserve"> 22</w:delText>
+          <w:delText xml:space="preserve"> </w:delText>
         </w:r>
       </w:del>
       <w:del w:id="48" w:author="Claude" w:date="2026-10-08T23:42:00Z">
         <w:r>
+          <w:delText>after</w:delText>
+        </w:r>
+      </w:del>
+      <w:del w:id="49" w:author="Claude" w:date="2026-10-09T01:35:00Z">
+        <w:r>
+          <w:delText xml:space="preserve"> 22</w:delText>
+        </w:r>
+      </w:del>
+      <w:del w:id="50" w:author="Claude" w:date="2026-10-08T23:42:00Z">
+        <w:r>
           <w:delText xml:space="preserve"> iterations</w:delText>
         </w:r>
       </w:del>
-      <w:del w:id="49" w:author="Claude" w:date="2026-10-09T01:35:00Z">
+      <w:del w:id="51" w:author="Claude" w:date="2026-10-09T01:35:00Z">
         <w:r>
           <w:delText xml:space="preserve"> (</w:delText>
         </w:r>
@@ -13169,12 +14419,12 @@
           <w:delText>Subsequent evaluations and local refinement produced no further improvement</w:delText>
         </w:r>
       </w:del>
-      <w:del w:id="50" w:author="Claude" w:date="2026-10-08T23:42:00Z">
+      <w:del w:id="52" w:author="Claude" w:date="2026-10-08T23:42:00Z">
         <w:r>
           <w:delText>, indicating stable convergence rather than continued sensitivity to parameter exploration</w:delText>
         </w:r>
       </w:del>
-      <w:del w:id="51" w:author="Claude" w:date="2026-10-09T01:35:00Z">
+      <w:del w:id="53" w:author="Claude" w:date="2026-10-09T01:35:00Z">
         <w:r>
           <w:delText>. The optimized parameter set</w:delText>
         </w:r>
@@ -13259,22 +14509,22 @@
           <w:delText xml:space="preserve">2% against the calibration dataset. These results show that the proposed three-parameter framework can closely reproduce the calibration measurements. The </w:delText>
         </w:r>
       </w:del>
-      <w:del w:id="52" w:author="Claude" w:date="2026-10-08T23:42:00Z">
+      <w:del w:id="54" w:author="Claude" w:date="2026-10-08T23:42:00Z">
         <w:r>
           <w:delText xml:space="preserve">combination of </w:delText>
         </w:r>
       </w:del>
-      <w:del w:id="53" w:author="Claude" w:date="2026-10-09T01:35:00Z">
+      <w:del w:id="55" w:author="Claude" w:date="2026-10-09T01:35:00Z">
         <w:r>
           <w:delText>low calibration error</w:delText>
         </w:r>
       </w:del>
-      <w:del w:id="54" w:author="Claude" w:date="2026-10-08T23:42:00Z">
+      <w:del w:id="56" w:author="Claude" w:date="2026-10-08T23:42:00Z">
         <w:r>
           <w:delText xml:space="preserve"> and rapid convergence</w:delText>
         </w:r>
       </w:del>
-      <w:del w:id="55" w:author="Claude" w:date="2026-10-09T01:35:00Z">
+      <w:del w:id="57" w:author="Claude" w:date="2026-10-09T01:35:00Z">
         <w:r>
           <w:delText xml:space="preserve"> supports the framework’s potential as a basis for predictive Zn biodegradation modeling, subject to independent validation.</w:delText>
         </w:r>
@@ -13284,12 +14534,16 @@
       <w:pPr>
         <w:pStyle w:val="BodyText"/>
         <w:rPr>
-          <w:ins w:id="56" w:author="Claude" w:date="2026-10-09T01:35:00Z"/>
+          <w:ins w:id="58" w:author="Claude" w:date="2026-10-09T01:35:00Z"/>
         </w:rPr>
       </w:pPr>
-      <w:ins w:id="57" w:author="Claude" w:date="2026-10-09T01:35:00Z">
+      <w:ins w:id="59" w:author="Claude" w:date="2026-10-09T01:35:00Z">
         <w:r>
-          <w:t>These parameters were calibrated within the 3D reaction-diffusion framework using Gaussian-process-assisted Bayesian optimization against the 14-day mass-loss data (Figure 3b). The optimized parameter set (Table 2) yielded a minimum RMSE of [x]% (percentage points) against the calibration dataset. Only k</w:t>
+          <w:t xml:space="preserve">These parameters were calibrated within the 3D reaction-diffusion framework using Gaussian-process-assisted Bayesian optimization against the 14-day mass-loss data (Figure 3b). The optimized parameter set (Table 2) yielded a minimum RMSE of [x]% (percentage points) against the calibration dataset. Only </w:t>
+        </w:r>
+        <w:proofErr w:type="spellStart"/>
+        <w:r>
+          <w:t>k</w:t>
         </w:r>
         <w:r>
           <w:rPr>
@@ -13297,8 +14551,13 @@
           </w:rPr>
           <w:t>ORR</w:t>
         </w:r>
+        <w:proofErr w:type="spellEnd"/>
         <w:r>
-          <w:t xml:space="preserve"> was identifiable from the mass-loss data; fits of similar quality were obtained over wide ranges of k</w:t>
+          <w:t xml:space="preserve"> was identifiable from the mass-loss data; fits of similar quality were obtained over wide ranges of </w:t>
+        </w:r>
+        <w:proofErr w:type="spellStart"/>
+        <w:r>
+          <w:t>k</w:t>
         </w:r>
         <w:r>
           <w:rPr>
@@ -13306,8 +14565,13 @@
           </w:rPr>
           <w:t>f</w:t>
         </w:r>
+        <w:proofErr w:type="spellEnd"/>
         <w:r>
-          <w:t xml:space="preserve"> and k</w:t>
+          <w:t xml:space="preserve"> and </w:t>
+        </w:r>
+        <w:proofErr w:type="spellStart"/>
+        <w:r>
+          <w:t>k</w:t>
         </w:r>
         <w:r>
           <w:rPr>
@@ -13315,6 +14579,7 @@
           </w:rPr>
           <w:t>d</w:t>
         </w:r>
+        <w:proofErr w:type="spellEnd"/>
         <w:r>
           <w:t xml:space="preserve"> [ranges to be stated from the v4 run]. These results show that the framework can reproduce the calibration measurements, subject to independent validation.</w:t>
         </w:r>
@@ -13383,7 +14648,7 @@
       <w:pPr>
         <w:pStyle w:val="Captions"/>
       </w:pPr>
-      <w:bookmarkStart w:id="58" w:name="_Ref239754266"/>
+      <w:bookmarkStart w:id="60" w:name="_Ref239754266"/>
       <w:r>
         <w:rPr>
           <w:b/>
@@ -13441,7 +14706,7 @@
         </w:rPr>
         <w:fldChar w:fldCharType="end"/>
       </w:r>
-      <w:bookmarkEnd w:id="58"/>
+      <w:bookmarkEnd w:id="60"/>
       <w:r>
         <w:rPr>
           <w:b/>
@@ -13478,8 +14743,8 @@
           <w:i/>
         </w:rPr>
       </w:pPr>
-      <w:bookmarkStart w:id="59" w:name="_Ref238636197"/>
-      <w:bookmarkStart w:id="60" w:name="tab:optim_params"/>
+      <w:bookmarkStart w:id="61" w:name="_Ref238636197"/>
+      <w:bookmarkStart w:id="62" w:name="tab:optim_params"/>
       <w:r>
         <w:rPr>
           <w:b/>
@@ -13523,7 +14788,7 @@
         </w:rPr>
         <w:fldChar w:fldCharType="end"/>
       </w:r>
-      <w:bookmarkEnd w:id="59"/>
+      <w:bookmarkEnd w:id="61"/>
       <w:r>
         <w:rPr>
           <w:b/>
@@ -13825,7 +15090,7 @@
               </w:rPr>
               <w:t xml:space="preserve">[1, </w:t>
             </w:r>
-            <w:del w:id="61" w:author="Claude" w:date="2026-10-09T01:35:00Z">
+            <w:del w:id="63" w:author="Claude" w:date="2026-10-09T01:35:00Z">
               <w:r>
                 <w:rPr>
                   <w:rFonts w:cs="Times New Roman"/>
@@ -13835,7 +15100,7 @@
                 <w:delText>100</w:delText>
               </w:r>
             </w:del>
-            <w:ins w:id="62" w:author="Claude" w:date="2026-10-09T01:35:00Z">
+            <w:ins w:id="64" w:author="Claude" w:date="2026-10-09T01:35:00Z">
               <w:r>
                 <w:rPr>
                   <w:rFonts w:cs="Times New Roman"/>
@@ -13870,7 +15135,7 @@
                 <w:szCs w:val="22"/>
               </w:rPr>
             </w:pPr>
-            <w:del w:id="63" w:author="Claude" w:date="2026-10-09T01:35:00Z">
+            <w:del w:id="65" w:author="Claude" w:date="2026-10-09T01:35:00Z">
               <w:r>
                 <w:rPr>
                   <w:rFonts w:cs="Times New Roman"/>
@@ -13880,7 +15145,7 @@
                 <w:delText>35.91</w:delText>
               </w:r>
             </w:del>
-            <w:ins w:id="64" w:author="Claude" w:date="2026-10-09T01:35:00Z">
+            <w:ins w:id="66" w:author="Claude" w:date="2026-10-09T01:35:00Z">
               <w:r>
                 <w:rPr>
                   <w:rFonts w:cs="Times New Roman"/>
@@ -14132,7 +15397,7 @@
               </w:rPr>
               <w:t>[</w:t>
             </w:r>
-            <w:del w:id="65" w:author="Claude" w:date="2026-10-09T01:35:00Z">
+            <w:del w:id="67" w:author="Claude" w:date="2026-10-09T01:35:00Z">
               <w:r>
                 <w:rPr>
                   <w:rFonts w:cs="Times New Roman"/>
@@ -14142,7 +15407,7 @@
                 <w:delText>5</w:delText>
               </w:r>
             </w:del>
-            <w:ins w:id="66" w:author="Claude" w:date="2026-10-09T01:35:00Z">
+            <w:ins w:id="68" w:author="Claude" w:date="2026-10-09T01:35:00Z">
               <w:r>
                 <w:rPr>
                   <w:rFonts w:cs="Times New Roman"/>
@@ -14160,7 +15425,7 @@
               </w:rPr>
               <w:t xml:space="preserve">, </w:t>
             </w:r>
-            <w:del w:id="67" w:author="Claude" w:date="2026-10-09T01:35:00Z">
+            <w:del w:id="69" w:author="Claude" w:date="2026-10-09T01:35:00Z">
               <w:r>
                 <w:rPr>
                   <w:rFonts w:cs="Times New Roman"/>
@@ -14170,7 +15435,7 @@
                 <w:delText>100</w:delText>
               </w:r>
             </w:del>
-            <w:ins w:id="68" w:author="Claude" w:date="2026-10-09T01:35:00Z">
+            <w:ins w:id="70" w:author="Claude" w:date="2026-10-09T01:35:00Z">
               <w:r>
                 <w:rPr>
                   <w:rFonts w:cs="Times New Roman"/>
@@ -14205,7 +15470,7 @@
                 <w:szCs w:val="22"/>
               </w:rPr>
             </w:pPr>
-            <w:del w:id="69" w:author="Claude" w:date="2026-10-09T01:35:00Z">
+            <w:del w:id="71" w:author="Claude" w:date="2026-10-09T01:35:00Z">
               <w:r>
                 <w:rPr>
                   <w:rFonts w:cs="Times New Roman"/>
@@ -14215,7 +15480,7 @@
                 <w:delText>27.17</w:delText>
               </w:r>
             </w:del>
-            <w:ins w:id="70" w:author="Claude" w:date="2026-10-09T01:35:00Z">
+            <w:ins w:id="72" w:author="Claude" w:date="2026-10-09T01:35:00Z">
               <w:r>
                 <w:rPr>
                   <w:rFonts w:cs="Times New Roman"/>
@@ -14381,7 +15646,7 @@
               </w:rPr>
               <w:t>[0.</w:t>
             </w:r>
-            <w:del w:id="71" w:author="Claude" w:date="2026-10-09T01:35:00Z">
+            <w:del w:id="73" w:author="Claude" w:date="2026-10-09T01:35:00Z">
               <w:r>
                 <w:rPr>
                   <w:rFonts w:cs="Times New Roman"/>
@@ -14391,7 +15656,7 @@
                 <w:delText>05</w:delText>
               </w:r>
             </w:del>
-            <w:ins w:id="72" w:author="Claude" w:date="2026-10-09T01:35:00Z">
+            <w:ins w:id="74" w:author="Claude" w:date="2026-10-09T01:35:00Z">
               <w:r>
                 <w:rPr>
                   <w:rFonts w:cs="Times New Roman"/>
@@ -14409,7 +15674,7 @@
               </w:rPr>
               <w:t xml:space="preserve">, </w:t>
             </w:r>
-            <w:del w:id="73" w:author="Claude" w:date="2026-10-09T01:35:00Z">
+            <w:del w:id="75" w:author="Claude" w:date="2026-10-09T01:35:00Z">
               <w:r>
                 <w:rPr>
                   <w:rFonts w:cs="Times New Roman"/>
@@ -14419,7 +15684,7 @@
                 <w:delText>5.0</w:delText>
               </w:r>
             </w:del>
-            <w:ins w:id="74" w:author="Claude" w:date="2026-10-09T01:35:00Z">
+            <w:ins w:id="76" w:author="Claude" w:date="2026-10-09T01:35:00Z">
               <w:r>
                 <w:rPr>
                   <w:rFonts w:cs="Times New Roman"/>
@@ -14454,7 +15719,7 @@
                 <w:szCs w:val="22"/>
               </w:rPr>
             </w:pPr>
-            <w:del w:id="75" w:author="Claude" w:date="2026-10-09T01:35:00Z">
+            <w:del w:id="77" w:author="Claude" w:date="2026-10-09T01:35:00Z">
               <w:r>
                 <w:rPr>
                   <w:rFonts w:cs="Times New Roman"/>
@@ -14464,7 +15729,7 @@
                 <w:delText>0.51</w:delText>
               </w:r>
             </w:del>
-            <w:ins w:id="76" w:author="Claude" w:date="2026-10-09T01:35:00Z">
+            <w:ins w:id="78" w:author="Claude" w:date="2026-10-09T01:35:00Z">
               <w:r>
                 <w:rPr>
                   <w:rFonts w:cs="Times New Roman"/>
@@ -14477,7 +15742,7 @@
           </w:p>
         </w:tc>
       </w:tr>
-      <w:bookmarkEnd w:id="60"/>
+      <w:bookmarkEnd w:id="62"/>
     </w:tbl>
     <w:p>
       <w:pPr>
@@ -14489,10 +15754,10 @@
       <w:pPr>
         <w:pStyle w:val="BodyText"/>
         <w:rPr>
-          <w:ins w:id="77" w:author="Claude" w:date="2026-10-09T01:35:00Z"/>
+          <w:ins w:id="79" w:author="Claude" w:date="2026-10-09T01:35:00Z"/>
         </w:rPr>
       </w:pPr>
-      <w:ins w:id="78" w:author="Claude" w:date="2026-10-09T01:35:00Z">
+      <w:ins w:id="80" w:author="Claude" w:date="2026-10-09T01:35:00Z">
         <w:r>
           <w:t>[Parameter sweeps (Figure 4) are to be rerun with the revised model around the new optimum; the discussion of passivation and corrosion-product saturation will be updated accordingly.]</w:t>
         </w:r>
@@ -14690,7 +15955,13 @@
         <w:rPr>
           <w:rFonts w:cs="Times New Roman"/>
         </w:rPr>
-        <w:t xml:space="preserve"> demonstrate that the three kinetic parameters influence degradation through distinct but interconnected mechanisms. </w:t>
+        <w:t xml:space="preserve"> demonstrate that the three kinetic parameters influence degradation through distinct but </w:t>
+      </w:r>
+      <w:r>
+        <w:rPr>
+          <w:rFonts w:cs="Times New Roman"/>
+        </w:rPr>
+        <w:t xml:space="preserve">interconnected mechanisms. </w:t>
       </w:r>
       <w:r>
         <w:rPr>
@@ -14840,7 +16111,7 @@
         </w:rPr>
         <w:t>while</w:t>
       </w:r>
-      <w:del w:id="79" w:author="Claude" w:date="2026-10-08T23:42:00Z">
+      <w:del w:id="81" w:author="Claude" w:date="2026-10-08T23:42:00Z">
         <w:r>
           <w:rPr>
             <w:rFonts w:cs="Times New Roman"/>
@@ -15008,7 +16279,7 @@
           </m:sub>
         </m:sSub>
       </m:oMath>
-      <w:ins w:id="80" w:author="Claude" w:date="2026-10-08T23:42:00Z">
+      <w:ins w:id="82" w:author="Claude" w:date="2026-10-08T23:42:00Z">
         <w:r>
           <w:rPr>
             <w:rFonts w:cs="Times New Roman"/>
@@ -15022,7 +16293,7 @@
         </w:rPr>
         <w:t xml:space="preserve"> </w:t>
       </w:r>
-      <w:del w:id="81" w:author="Claude" w:date="2026-10-08T23:42:00Z">
+      <w:del w:id="83" w:author="Claude" w:date="2026-10-08T23:42:00Z">
         <w:r>
           <w:rPr>
             <w:rFonts w:cs="Times New Roman"/>
@@ -15030,7 +16301,7 @@
           <w:delText>for which</w:delText>
         </w:r>
       </w:del>
-      <w:ins w:id="82" w:author="Claude" w:date="2026-10-08T23:42:00Z">
+      <w:ins w:id="84" w:author="Claude" w:date="2026-10-08T23:42:00Z">
         <w:r>
           <w:rPr>
             <w:rFonts w:cs="Times New Roman"/>
@@ -15668,7 +16939,7 @@
       <w:r>
         <w:t xml:space="preserve">​ act directly on the competing processes of corrosion-product formation and dissolution, making </w:t>
       </w:r>
-      <w:del w:id="83" w:author="Claude" w:date="2026-10-08T23:09:00Z">
+      <w:del w:id="85" w:author="Claude" w:date="2026-10-08T23:09:00Z">
         <w:r>
           <w:delText xml:space="preserve">film </w:delText>
         </w:r>
@@ -15676,7 +16947,7 @@
       <w:r>
         <w:t>corrosion-product</w:t>
       </w:r>
-      <w:del w:id="84" w:author="Claude" w:date="2026-10-08T23:09:00Z">
+      <w:del w:id="86" w:author="Claude" w:date="2026-10-08T23:09:00Z">
         <w:r>
           <w:delText xml:space="preserve"> coverage</w:delText>
         </w:r>
@@ -15799,8 +17070,18 @@
           <w:b/>
           <w:bCs/>
         </w:rPr>
-        <w:t>g–i</w:t>
-      </w:r>
+        <w:t>g–</w:t>
+      </w:r>
+      <w:proofErr w:type="spellStart"/>
+      <w:r>
+        <w:rPr>
+          <w:rFonts w:cs="Times New Roman"/>
+          <w:b/>
+          <w:bCs/>
+        </w:rPr>
+        <w:t>i</w:t>
+      </w:r>
+      <w:proofErr w:type="spellEnd"/>
       <w:r>
         <w:rPr>
           <w:rFonts w:cs="Times New Roman"/>
@@ -16197,7 +17478,7 @@
           <w:rFonts w:cs="Times New Roman"/>
         </w:rPr>
       </w:pPr>
-      <w:bookmarkStart w:id="85" w:name="_Ref239754180"/>
+      <w:bookmarkStart w:id="87" w:name="_Ref239754180"/>
       <w:r>
         <w:rPr>
           <w:b/>
@@ -16255,7 +17536,7 @@
         </w:rPr>
         <w:fldChar w:fldCharType="end"/>
       </w:r>
-      <w:bookmarkEnd w:id="85"/>
+      <w:bookmarkEnd w:id="87"/>
       <w:r>
         <w:rPr>
           <w:b/>
@@ -16264,7 +17545,15 @@
         <w:t>.</w:t>
       </w:r>
       <w:r>
-        <w:t xml:space="preserve"> Local parameter sweeps of kinetic parameters. Panels (a–c) show cumulative mass loss (%), panels (d–f) show the normalized corrosion-product saturation, F/Fₘₐₓ (%), and panels (g–i) show interfacial dissolved oxygen concentration (</w:t>
+        <w:t xml:space="preserve"> Local parameter sweeps of kinetic parameters. Panels (a–c) show cumulative mass loss (%), panels (d–f) show the normalized corrosion-product saturation, F/Fₘₐₓ (%), and panels (g–</w:t>
+      </w:r>
+      <w:proofErr w:type="spellStart"/>
+      <w:r>
+        <w:t>i</w:t>
+      </w:r>
+      <w:proofErr w:type="spellEnd"/>
+      <w:r>
+        <w:t>) show interfacial dissolved oxygen concentration (</w:t>
       </w:r>
       <w:r>
         <w:rPr>
@@ -16386,7 +17675,7 @@
         </w:rPr>
       </w:pPr>
     </w:p>
-    <w:bookmarkEnd w:id="15"/>
+    <w:bookmarkEnd w:id="17"/>
     <w:p>
       <w:pPr>
         <w:pStyle w:val="Heading2"/>
@@ -16551,8 +17840,8 @@
           <w:iCs w:val="0"/>
         </w:rPr>
       </w:pPr>
-      <w:bookmarkStart w:id="86" w:name="_Ref238632622"/>
-      <w:bookmarkStart w:id="87" w:name="_Ref240375786"/>
+      <w:bookmarkStart w:id="88" w:name="_Ref238632622"/>
+      <w:bookmarkStart w:id="89" w:name="_Ref240375786"/>
       <w:r>
         <w:rPr>
           <w:b/>
@@ -16596,8 +17885,8 @@
         </w:rPr>
         <w:fldChar w:fldCharType="end"/>
       </w:r>
-      <w:bookmarkEnd w:id="86"/>
-      <w:bookmarkEnd w:id="87"/>
+      <w:bookmarkEnd w:id="88"/>
+      <w:bookmarkEnd w:id="89"/>
       <w:r>
         <w:rPr>
           <w:b/>
@@ -17395,10 +18684,10 @@
       <w:pPr>
         <w:pStyle w:val="BodyText"/>
         <w:rPr>
-          <w:ins w:id="88" w:author="Claude" w:date="2026-10-09T01:35:00Z"/>
+          <w:ins w:id="90" w:author="Claude" w:date="2026-10-09T01:35:00Z"/>
         </w:rPr>
       </w:pPr>
-      <w:ins w:id="89" w:author="Claude" w:date="2026-10-09T01:35:00Z">
+      <w:ins w:id="91" w:author="Claude" w:date="2026-10-09T01:35:00Z">
         <w:r>
           <w:t>[Validation results (Figure 5, RMSE and R²) are to be rerun with the revised model.]</w:t>
         </w:r>
@@ -17653,8 +18942,13 @@
         </w:rPr>
         <w:t xml:space="preserve">. </w:t>
       </w:r>
-      <w:r>
-        <w:t xml:space="preserve">Damköhler-number analysis quantified this transition, </w:t>
+      <w:proofErr w:type="spellStart"/>
+      <w:r>
+        <w:t>Damköhler</w:t>
+      </w:r>
+      <w:proofErr w:type="spellEnd"/>
+      <w:r>
+        <w:t xml:space="preserve">-number analysis quantified this transition, </w:t>
       </w:r>
       <w:r>
         <w:t xml:space="preserve">revealing an initial degradation regime governed by cathodic reaction kinetics. After approximately </w:t>
@@ -17962,7 +19256,7 @@
       <w:pPr>
         <w:pStyle w:val="Captions"/>
       </w:pPr>
-      <w:bookmarkStart w:id="90" w:name="_Ref239754424"/>
+      <w:bookmarkStart w:id="92" w:name="_Ref239754424"/>
       <w:r>
         <w:rPr>
           <w:b/>
@@ -18020,7 +19314,7 @@
         </w:rPr>
         <w:fldChar w:fldCharType="end"/>
       </w:r>
-      <w:bookmarkEnd w:id="90"/>
+      <w:bookmarkEnd w:id="92"/>
       <w:r>
         <w:rPr>
           <w:b/>
@@ -18175,10 +19469,10 @@
       <w:pPr>
         <w:pStyle w:val="BodyText"/>
         <w:rPr>
-          <w:ins w:id="91" w:author="Claude" w:date="2026-10-09T01:35:00Z"/>
+          <w:ins w:id="93" w:author="Claude" w:date="2026-10-09T01:35:00Z"/>
         </w:rPr>
       </w:pPr>
-      <w:ins w:id="92" w:author="Claude" w:date="2026-10-09T01:35:00Z">
+      <w:ins w:id="94" w:author="Claude" w:date="2026-10-09T01:35:00Z">
         <w:r>
           <w:t>[The Zn²⁺ and pH comparison will be regenerated after the OH⁻ balance is validated, or the pH comparison will be removed.]</w:t>
         </w:r>
@@ -18375,7 +19669,7 @@
         </w:rPr>
         <w:t>capturing the rapid initial increase followed by a gradual plateau</w:t>
       </w:r>
-      <w:ins w:id="93" w:author="Claude" w:date="2026-10-08T20:38:00Z">
+      <w:ins w:id="95" w:author="Claude" w:date="2026-10-08T20:38:00Z">
         <w:r>
           <w:rPr>
             <w:rFonts w:cs="Times New Roman"/>
@@ -18387,9 +19681,16 @@
         <w:rPr>
           <w:rFonts w:cs="Times New Roman"/>
         </w:rPr>
-        <w:t xml:space="preserve"> with errors at 336 h of 44% for Zn²⁺ and 2.8% for pH</w:t>
-      </w:r>
-      <w:del w:id="94" w:author="Claude" w:date="2026-10-08T20:38:00Z">
+        <w:t xml:space="preserve"> with errors at 336 h of 44% for Zn²⁺ and 2.8% for </w:t>
+      </w:r>
+      <w:proofErr w:type="spellStart"/>
+      <w:r>
+        <w:rPr>
+          <w:rFonts w:cs="Times New Roman"/>
+        </w:rPr>
+        <w:t>pH</w:t>
+      </w:r>
+      <w:del w:id="96" w:author="Claude" w:date="2026-10-08T20:38:00Z">
         <w:r>
           <w:rPr>
             <w:rFonts w:cs="Times New Roman"/>
@@ -18401,7 +19702,14 @@
         <w:rPr>
           <w:rFonts w:cs="Times New Roman"/>
         </w:rPr>
-        <w:t xml:space="preserve">. </w:t>
+        <w:t>.</w:t>
+      </w:r>
+      <w:proofErr w:type="spellEnd"/>
+      <w:r>
+        <w:rPr>
+          <w:rFonts w:cs="Times New Roman"/>
+        </w:rPr>
+        <w:t xml:space="preserve"> </w:t>
       </w:r>
       <w:r>
         <w:rPr>
@@ -18481,10 +19789,10 @@
       <w:pPr>
         <w:pStyle w:val="BodyText"/>
         <w:rPr>
-          <w:ins w:id="95" w:author="Claude" w:date="2026-10-09T01:35:00Z"/>
+          <w:ins w:id="97" w:author="Claude" w:date="2026-10-09T01:35:00Z"/>
         </w:rPr>
       </w:pPr>
-      <w:ins w:id="96" w:author="Claude" w:date="2026-10-09T01:35:00Z">
+      <w:ins w:id="98" w:author="Claude" w:date="2026-10-09T01:35:00Z">
         <w:r>
           <w:t>[The stent case (Figures 6 and 7) is to be rerun with the revised model.]</w:t>
         </w:r>
@@ -18809,7 +20117,7 @@
       <w:pPr>
         <w:pStyle w:val="Captions"/>
       </w:pPr>
-      <w:bookmarkStart w:id="97" w:name="_Ref239754601"/>
+      <w:bookmarkStart w:id="99" w:name="_Ref239754601"/>
       <w:r>
         <w:rPr>
           <w:b/>
@@ -18867,7 +20175,7 @@
         </w:rPr>
         <w:fldChar w:fldCharType="end"/>
       </w:r>
-      <w:bookmarkEnd w:id="97"/>
+      <w:bookmarkEnd w:id="99"/>
       <w:r>
         <w:rPr>
           <w:b/>
@@ -19363,7 +20671,7 @@
         <w:ind w:firstLine="0"/>
         <w:jc w:val="center"/>
       </w:pPr>
-      <w:bookmarkStart w:id="98" w:name="fig:casestudy2"/>
+      <w:bookmarkStart w:id="100" w:name="fig:casestudy2"/>
       <w:r>
         <w:rPr>
           <w:noProof/>
@@ -19415,7 +20723,7 @@
       <w:pPr>
         <w:pStyle w:val="Captions"/>
       </w:pPr>
-      <w:bookmarkStart w:id="99" w:name="_Ref239754694"/>
+      <w:bookmarkStart w:id="101" w:name="_Ref239754694"/>
       <w:r>
         <w:rPr>
           <w:b/>
@@ -19473,7 +20781,7 @@
         </w:rPr>
         <w:fldChar w:fldCharType="end"/>
       </w:r>
-      <w:bookmarkEnd w:id="99"/>
+      <w:bookmarkEnd w:id="101"/>
       <w:r>
         <w:rPr>
           <w:b/>
@@ -19506,7 +20814,15 @@
         <w:t>672</w:t>
       </w:r>
       <w:r>
-        <w:t> h, (b) schematic illustration of oxygen transport to the inner and outer-curvature surfaces of the stent crown, (c,d) evolution of the metal cross-sectional profiles at Sections 1 and 2, respectively.</w:t>
+        <w:t> h, (b) schematic illustration of oxygen transport to the inner and outer-curvature surfaces of the stent crown, (</w:t>
+      </w:r>
+      <w:proofErr w:type="spellStart"/>
+      <w:r>
+        <w:t>c,d</w:t>
+      </w:r>
+      <w:proofErr w:type="spellEnd"/>
+      <w:r>
+        <w:t>) evolution of the metal cross-sectional profiles at Sections 1 and 2, respectively.</w:t>
       </w:r>
     </w:p>
     <w:p>
@@ -19694,7 +21010,15 @@
         <w:t xml:space="preserve">Although the effects on cumulative mass loss were relatively modest, geometry strongly influenced the spatial distribution of degradation. Mean </w:t>
       </w:r>
       <w:r>
-        <w:t>penetration depths varied only slightly, ranging from approximately 2.4 to 2.7 µm across the curved-wire configurations (30°, 90°, and 150° arcs) and from 2.1 to 2.4 µm across the straight, closely spaced, and widely spaced wire configurations</w:t>
+        <w:t xml:space="preserve">penetration depths varied only slightly, ranging from approximately 2.4 to 2.7 µm across the curved-wire configurations (30°, 90°, and 150° arcs) and from 2.1 to 2.4 µm across the </w:t>
+      </w:r>
+      <w:proofErr w:type="spellStart"/>
+      <w:r>
+        <w:t>straight</w:t>
+      </w:r>
+      <w:proofErr w:type="spellEnd"/>
+      <w:r>
+        <w:t>, closely spaced, and widely spaced wire configurations</w:t>
       </w:r>
       <w:r>
         <w:t xml:space="preserve"> (</w:t>
@@ -19787,7 +21111,7 @@
       <w:pPr>
         <w:pStyle w:val="Captions"/>
       </w:pPr>
-      <w:bookmarkStart w:id="100" w:name="_Ref241074684"/>
+      <w:bookmarkStart w:id="102" w:name="_Ref241074684"/>
       <w:r>
         <w:rPr>
           <w:b/>
@@ -19831,7 +21155,7 @@
         </w:rPr>
         <w:fldChar w:fldCharType="end"/>
       </w:r>
-      <w:bookmarkEnd w:id="100"/>
+      <w:bookmarkEnd w:id="102"/>
       <w:r>
         <w:rPr>
           <w:b/>
@@ -19891,15 +21215,23 @@
       <w:r>
         <w:t>The corrosion</w:t>
       </w:r>
-      <w:del w:id="101" w:author="Claude" w:date="2026-10-08T20:38:00Z">
+      <w:del w:id="103" w:author="Claude" w:date="2026-10-08T20:38:00Z">
         <w:r>
           <w:delText>-</w:delText>
         </w:r>
       </w:del>
       <w:r>
-        <w:t xml:space="preserve"> products are treated as a homogenized ZnO-based field rather than a discrete surface film or a heterogeneous, composition-dependent structure, and phosphate-, carbonate-, calcium-, and chloride-containing phases</w:t>
-      </w:r>
-      <w:ins w:id="102" w:author="Claude" w:date="2026-10-08T20:38:00Z">
+        <w:t xml:space="preserve"> products are treated as a homogenized </w:t>
+      </w:r>
+      <w:proofErr w:type="spellStart"/>
+      <w:r>
+        <w:t>ZnO</w:t>
+      </w:r>
+      <w:proofErr w:type="spellEnd"/>
+      <w:r>
+        <w:t>-based field rather than a discrete surface film or a heterogeneous, composition-dependent structure, and phosphate-, carbonate-, calcium-, and chloride-containing phases</w:t>
+      </w:r>
+      <w:ins w:id="104" w:author="Claude" w:date="2026-10-08T20:38:00Z">
         <w:r>
           <w:t>,</w:t>
         </w:r>
@@ -20090,7 +21422,7 @@
         <w:pStyle w:val="BodyText"/>
         <w:ind w:firstLine="0"/>
         <w:rPr>
-          <w:ins w:id="103" w:author="Claude" w:date="2026-10-08T20:38:00Z"/>
+          <w:ins w:id="105" w:author="Claude" w:date="2026-10-08T20:38:00Z"/>
         </w:rPr>
       </w:pPr>
     </w:p>
@@ -20099,7 +21431,7 @@
         <w:pStyle w:val="BodyText"/>
         <w:ind w:firstLine="0"/>
         <w:rPr>
-          <w:ins w:id="104" w:author="Claude" w:date="2026-10-08T20:38:00Z"/>
+          <w:ins w:id="106" w:author="Claude" w:date="2026-10-08T20:38:00Z"/>
         </w:rPr>
       </w:pPr>
     </w:p>
@@ -20108,11 +21440,11 @@
         <w:pStyle w:val="BodyText"/>
         <w:ind w:firstLine="0"/>
         <w:rPr>
-          <w:ins w:id="105" w:author="Claude" w:date="2026-10-08T20:38:00Z"/>
+          <w:ins w:id="107" w:author="Claude" w:date="2026-10-08T20:38:00Z"/>
         </w:rPr>
       </w:pPr>
     </w:p>
-    <w:bookmarkEnd w:id="98"/>
+    <w:bookmarkEnd w:id="100"/>
     <w:p>
       <w:pPr>
         <w:pStyle w:val="Heading1"/>
@@ -20125,14 +21457,14 @@
       <w:pPr>
         <w:pStyle w:val="BodyText"/>
       </w:pPr>
-      <w:bookmarkStart w:id="106" w:name="_Hlk238630414"/>
+      <w:bookmarkStart w:id="108" w:name="_Hlk238630414"/>
       <w:r>
         <w:t xml:space="preserve">Zn biodegradation under physiological conditions becomes an oxygen-transport-controlled process after an initial reaction-controlled stage in which implant geometry governs the spatial evolution of material loss. The proposed 3D reaction-diffusion model closely reproduced independent 28-day immersion data (RMSE = 0.0159%) and, without further calibration, predicted approximately 6% mass loss </w:t>
       </w:r>
       <w:r>
         <w:t>for a six-crown stent</w:t>
       </w:r>
-      <w:del w:id="107" w:author="Claude" w:date="2026-10-08T20:38:00Z">
+      <w:del w:id="109" w:author="Claude" w:date="2026-10-08T20:38:00Z">
         <w:r>
           <w:delText>,</w:delText>
         </w:r>
@@ -20156,12 +21488,12 @@
       <w:r>
         <w:t xml:space="preserve"> oxygen availability as the primary driver of degradation, with corrosion-product accumulation progressively restricting transport and leading to diffusion-controlled behavior. Importantly, localized degradation emerged naturally from geometry-dependent transport phenomena, without imposing spatially varying corrosion kinetics. While curvature and inter-strut spacing produced only modest changes in cumulative mass loss, they strongly altered the distribution of material recession, demonstrating that global degradation metrics can obscure the localized thinning responsible for structural failure. These findings establish geometry as a critical determinant of biodegradable implant performance and provide a predictive framework for integrating degradation into the design and optimization of Zn stents and other biodegradable metallic implants, </w:t>
       </w:r>
-      <w:del w:id="108" w:author="Claude" w:date="2026-10-08T23:42:00Z">
+      <w:del w:id="110" w:author="Claude" w:date="2026-10-08T23:42:00Z">
         <w:r>
           <w:delText>enabling</w:delText>
         </w:r>
       </w:del>
-      <w:ins w:id="109" w:author="Claude" w:date="2026-10-08T23:42:00Z">
+      <w:ins w:id="111" w:author="Claude" w:date="2026-10-08T23:42:00Z">
         <w:r>
           <w:t>which could enable</w:t>
         </w:r>
@@ -20169,7 +21501,7 @@
       <w:r>
         <w:t xml:space="preserve"> structural performance to be considered throughout the implant lifetime rather than only at implantation.</w:t>
       </w:r>
-      <w:bookmarkEnd w:id="106"/>
+      <w:bookmarkEnd w:id="108"/>
     </w:p>
     <w:p>
       <w:pPr>
@@ -20203,7 +21535,15 @@
         <w:jc w:val="both"/>
       </w:pPr>
       <w:r>
-        <w:t xml:space="preserve">The authors acknowledge the use of Monash University’s High-Performance Computing (M3) facility and the Monash eResearch </w:t>
+        <w:t xml:space="preserve">The authors acknowledge the use of Monash University’s High-Performance Computing (M3) facility and the Monash </w:t>
+      </w:r>
+      <w:proofErr w:type="spellStart"/>
+      <w:r>
+        <w:t>eResearch</w:t>
+      </w:r>
+      <w:proofErr w:type="spellEnd"/>
+      <w:r>
+        <w:t xml:space="preserve"> </w:t>
       </w:r>
       <w:r>
         <w:t>Center</w:t>
@@ -20307,12 +21647,21 @@
       <w:r>
         <w:t xml:space="preserve"> Data curation, Investigation, Writing – original draft. </w:t>
       </w:r>
-      <w:r>
-        <w:rPr>
-          <w:b/>
-          <w:bCs/>
-        </w:rPr>
-        <w:t>Aijun Huang:</w:t>
+      <w:proofErr w:type="spellStart"/>
+      <w:r>
+        <w:rPr>
+          <w:b/>
+          <w:bCs/>
+        </w:rPr>
+        <w:t>Aijun</w:t>
+      </w:r>
+      <w:proofErr w:type="spellEnd"/>
+      <w:r>
+        <w:rPr>
+          <w:b/>
+          <w:bCs/>
+        </w:rPr>
+        <w:t xml:space="preserve"> Huang:</w:t>
       </w:r>
       <w:r>
         <w:t xml:space="preserve"> Conceptualization, Funding acquisition, Project administration, Supervision. </w:t>
@@ -20330,12 +21679,21 @@
       <w:r>
         <w:t xml:space="preserve"> </w:t>
       </w:r>
-      <w:r>
-        <w:rPr>
-          <w:b/>
-          <w:bCs/>
-        </w:rPr>
-        <w:t>Yuman Zhu:</w:t>
+      <w:proofErr w:type="spellStart"/>
+      <w:r>
+        <w:rPr>
+          <w:b/>
+          <w:bCs/>
+        </w:rPr>
+        <w:t>Yuman</w:t>
+      </w:r>
+      <w:proofErr w:type="spellEnd"/>
+      <w:r>
+        <w:rPr>
+          <w:b/>
+          <w:bCs/>
+        </w:rPr>
+        <w:t xml:space="preserve"> Zhu:</w:t>
       </w:r>
       <w:r>
         <w:t xml:space="preserve"> Conceptualization, Supervision, Writing – review &amp; editing.</w:t>
@@ -22852,6 +24210,7 @@
   <w:style w:type="character" w:default="1" w:styleId="DefaultParagraphFont">
     <w:name w:val="Default Paragraph Font"/>
     <w:uiPriority w:val="1"/>
+    <w:semiHidden/>
     <w:unhideWhenUsed/>
   </w:style>
   <w:style w:type="table" w:default="1" w:styleId="TableNormal">
@@ -24124,9 +25483,9 @@
 </file>
 
 <file path=customXml/item1.xml><?xml version="1.0" encoding="utf-8"?>
-<ControlsStorage xmlns="urn:schemas-microsoft-com.VSTO2008Demos.ControlsStorage">
-  <Controls>AAEAAAD/////AQAAAAAAAAAMAgAAAEVDaGVtNFdvcmQuQ29yZSwgVmVyc2lvbj0xLjAuMC4wLCBDdWx0dXJlPW5ldXRyYWwsIFB1YmxpY0tleVRva2VuPW51bGwHAQAAAAABAAAAAAAAAAQgQ2hlbTRXb3JkLkNvcmUuQ29udHJvbFByb3BlcnRpZXMCAAAACw==</Controls>
-</ControlsStorage>
+<p:properties xmlns:p="http://schemas.microsoft.com/office/2006/metadata/properties" xmlns:xsi="http://www.w3.org/2001/XMLSchema-instance" xmlns:pc="http://schemas.microsoft.com/office/infopath/2007/PartnerControls">
+  <documentManagement/>
+</p:properties>
 </file>
 
 <file path=customXml/item2.xml><?xml version="1.0" encoding="utf-8"?>
@@ -24347,16 +25706,12 @@
 </file>
 
 <file path=customXml/item3.xml><?xml version="1.0" encoding="utf-8"?>
-<p:properties xmlns:p="http://schemas.microsoft.com/office/2006/metadata/properties" xmlns:xsi="http://www.w3.org/2001/XMLSchema-instance" xmlns:pc="http://schemas.microsoft.com/office/infopath/2007/PartnerControls">
-  <documentManagement/>
-</p:properties>
+<ControlsStorage xmlns="urn:schemas-microsoft-com.VSTO2008Demos.ControlsStorage">
+  <Controls>AAEAAAD/////AQAAAAAAAAAMAgAAAEVDaGVtNFdvcmQuQ29yZSwgVmVyc2lvbj0xLjAuMC4wLCBDdWx0dXJlPW5ldXRyYWwsIFB1YmxpY0tleVRva2VuPW51bGwHAQAAAAABAAAAAAAAAAQgQ2hlbTRXb3JkLkNvcmUuQ29udHJvbFByb3BlcnRpZXMCAAAACw==</Controls>
+</ControlsStorage>
 </file>
 
 <file path=customXml/item4.xml><?xml version="1.0" encoding="utf-8"?>
-<b:Sources xmlns:b="http://schemas.openxmlformats.org/officeDocument/2006/bibliography" xmlns="http://schemas.openxmlformats.org/officeDocument/2006/bibliography" SelectedStyle="\APASixthEditionOfficeOnline.xsl" StyleName="APA" Version="6"/>
-</file>
-
-<file path=customXml/item5.xml><?xml version="1.0" encoding="utf-8"?>
 <?mso-contentType ?>
 <FormTemplates xmlns="http://schemas.microsoft.com/sharepoint/v3/contenttype/forms">
   <Display>DocumentLibraryForm</Display>
@@ -24365,10 +25720,15 @@
 </FormTemplates>
 </file>
 
+<file path=customXml/item5.xml><?xml version="1.0" encoding="utf-8"?>
+<b:Sources xmlns:b="http://schemas.openxmlformats.org/officeDocument/2006/bibliography" xmlns="http://schemas.openxmlformats.org/officeDocument/2006/bibliography" SelectedStyle="\APASixthEditionOfficeOnline.xsl" StyleName="APA" Version="6"/>
+</file>
+
 <file path=customXml/itemProps1.xml><?xml version="1.0" encoding="utf-8"?>
-<ds:datastoreItem xmlns:ds="http://schemas.openxmlformats.org/officeDocument/2006/customXml" ds:itemID="{E3F19EBF-8207-4BE7-AD18-240ED1895C11}">
+<ds:datastoreItem xmlns:ds="http://schemas.openxmlformats.org/officeDocument/2006/customXml" ds:itemID="{96D19C85-73BE-4F5D-979F-58BFDE5BBE12}">
   <ds:schemaRefs>
-    <ds:schemaRef ds:uri="urn:schemas-microsoft-com.VSTO2008Demos.ControlsStorage"/>
+    <ds:schemaRef ds:uri="http://schemas.microsoft.com/office/2006/metadata/properties"/>
+    <ds:schemaRef ds:uri="http://schemas.microsoft.com/office/infopath/2007/PartnerControls"/>
   </ds:schemaRefs>
 </ds:datastoreItem>
 </file>
@@ -24393,26 +25753,25 @@
 </file>
 
 <file path=customXml/itemProps3.xml><?xml version="1.0" encoding="utf-8"?>
-<ds:datastoreItem xmlns:ds="http://schemas.openxmlformats.org/officeDocument/2006/customXml" ds:itemID="{96D19C85-73BE-4F5D-979F-58BFDE5BBE12}">
+<ds:datastoreItem xmlns:ds="http://schemas.openxmlformats.org/officeDocument/2006/customXml" ds:itemID="{E3F19EBF-8207-4BE7-AD18-240ED1895C11}">
   <ds:schemaRefs>
-    <ds:schemaRef ds:uri="http://schemas.microsoft.com/office/2006/metadata/properties"/>
-    <ds:schemaRef ds:uri="http://schemas.microsoft.com/office/infopath/2007/PartnerControls"/>
+    <ds:schemaRef ds:uri="urn:schemas-microsoft-com.VSTO2008Demos.ControlsStorage"/>
   </ds:schemaRefs>
 </ds:datastoreItem>
 </file>
 
 <file path=customXml/itemProps4.xml><?xml version="1.0" encoding="utf-8"?>
+<ds:datastoreItem xmlns:ds="http://schemas.openxmlformats.org/officeDocument/2006/customXml" ds:itemID="{75886F76-A765-4714-B899-7AC2DC4334A1}">
+  <ds:schemaRefs>
+    <ds:schemaRef ds:uri="http://schemas.microsoft.com/sharepoint/v3/contenttype/forms"/>
+  </ds:schemaRefs>
+</ds:datastoreItem>
+</file>
+
+<file path=customXml/itemProps5.xml><?xml version="1.0" encoding="utf-8"?>
 <ds:datastoreItem xmlns:ds="http://schemas.openxmlformats.org/officeDocument/2006/customXml" ds:itemID="{DE724972-9DFC-40BC-BA35-EDB291A5A412}">
   <ds:schemaRefs>
     <ds:schemaRef ds:uri="http://schemas.openxmlformats.org/officeDocument/2006/bibliography"/>
   </ds:schemaRefs>
 </ds:datastoreItem>
-</file>
-
-<file path=customXml/itemProps5.xml><?xml version="1.0" encoding="utf-8"?>
-<ds:datastoreItem xmlns:ds="http://schemas.openxmlformats.org/officeDocument/2006/customXml" ds:itemID="{75886F76-A765-4714-B899-7AC2DC4334A1}">
-  <ds:schemaRefs>
-    <ds:schemaRef ds:uri="http://schemas.microsoft.com/sharepoint/v3/contenttype/forms"/>
-  </ds:schemaRefs>
-</ds:datastoreItem>
 </file>
</xml_diff>

<commit_message>
Manuscript: add domain-volume limitation sentence
Co-Authored-By: Claude Sonnet 5.5 <noreply@anthropic.com>
Claude-Session: https://claude.ai/code/session_01Y1g9vByMLTE8eGJ9K81zt6
</commit_message>
<xml_diff>
--- a/deliver/Manuscript_tracked.docx
+++ b/deliver/Manuscript_tracked.docx
@@ -21321,8 +21321,13 @@
         <w:t>can be used for further validation</w:t>
       </w:r>
       <w:r>
-        <w:t>.</w:t>
-      </w:r>
+        <w:t xml:space="preserve">.</w:t>
+      </w:r>
+      <w:ins w:id="9001" w:author="Claude" w:date="2026-10-09T14:01:07Z">
+        <w:r>
+          <w:t xml:space="preserve"> The computational electrolyte domain (30 × 30 × 30 mm, corresponding to 27 mL) is smaller than the experimental immersion volume (44 mL), which may introduce deviations in the predicted oxygen concentration field because of the reduced oxygen reservoir available in the simulation.</w:t>
+        </w:r>
+      </w:ins>
     </w:p>
     <w:p>
       <w:pPr>

</xml_diff>

<commit_message>
Manuscript: limitation on continuous O2 replenishment vs 48 h renewal
Co-Authored-By: Claude Sonnet 5.5 <noreply@anthropic.com>
Claude-Session: https://claude.ai/code/session_01Y1g9vByMLTE8eGJ9K81zt6
</commit_message>
<xml_diff>
--- a/deliver/Manuscript_tracked.docx
+++ b/deliver/Manuscript_tracked.docx
@@ -21276,7 +21276,15 @@
         </m:sSub>
       </m:oMath>
       <w:r>
-        <w:t>​ should be regarded as an effective parameter that partially incorporates uncertainty in oxygen availability.</w:t>
+        <w:t xml:space="preserve">​ should be regarded as an effective parameter that partially incorporates uncertainty in oxygen availability</w:t>
+      </w:r>
+      <w:ins w:id="9001" w:author="Claude" w:date="2026-10-09T14:13:48Z">
+        <w:r>
+          <w:t xml:space="preserve">. Continuous oxygen replenishment at the electrolyte–air interface may not reflect the 48 h medium renewal used in the experiments, so the calibrated kORR is conditional on the assumed oxygen history</w:t>
+        </w:r>
+      </w:ins>
+      <w:r>
+        <w:t xml:space="preserve">.</w:t>
       </w:r>
       <w:r>
         <w:t xml:space="preserve"> </w:t>

</xml_diff>

<commit_message>
Terminology: Bayesian optimization, not Bayesian calibration/inference; parameter-propagated ensemble intervals
</commit_message>
<xml_diff>
--- a/deliver/Manuscript_tracked.docx
+++ b/deliver/Manuscript_tracked.docx
@@ -314,7 +314,15 @@
         <w:t>in vivo</w:t>
       </w:r>
       <w:r>
-        <w:t xml:space="preserve"> observations, and captures crown-localized degradation driven by geometry-dependent oxygen transport. By linking implant geometry to degradation rate and spatial morphology, the framework provides a mechanistic basis for predicting Zn implant degradation and supports degradation-informed implant design.</w:t>
+        <w:t xml:space="preserve"> </w:t>
+      </w:r>
+      <w:proofErr w:type="gramStart"/>
+      <w:r>
+        <w:t>observations, and</w:t>
+      </w:r>
+      <w:proofErr w:type="gramEnd"/>
+      <w:r>
+        <w:t xml:space="preserve"> captures crown-localized degradation driven by geometry-dependent oxygen transport. By linking implant geometry to degradation rate and spatial morphology, the framework provides a mechanistic basis for predicting Zn implant degradation and supports degradation-informed implant design.</w:t>
       </w:r>
     </w:p>
     <w:p>
@@ -3869,22 +3877,13 @@
         <w:t xml:space="preserve">) </w:t>
       </w:r>
       <w:r>
-        <w:t xml:space="preserve">together with the corrosion-product </w:t>
-      </w:r>
-      <w:r>
-        <w:t>concentration</w:t>
-      </w:r>
-      <w:r>
-        <w:rPr>
-          <w:rFonts w:cs="Times New Roman"/>
-        </w:rPr>
-        <w:t xml:space="preserve"> </w:t>
-      </w:r>
-      <w:r>
-        <w:rPr>
-          <w:rFonts w:cs="Times New Roman"/>
-        </w:rPr>
-        <w:t>(</w:t>
+        <w:t>together with the corrosion-product concentration</w:t>
+      </w:r>
+      <w:r>
+        <w:rPr>
+          <w:rFonts w:cs="Times New Roman"/>
+        </w:rPr>
+        <w:t xml:space="preserve"> (</w:t>
       </w:r>
       <m:oMath>
         <m:r>
@@ -6966,13 +6965,7 @@
         <w:rPr>
           <w:rFonts w:cs="Times New Roman"/>
         </w:rPr>
-        <w:t xml:space="preserve">, which suppresses further growth as the corrosion-product concentration approaches its maximum </w:t>
-      </w:r>
-      <w:r>
-        <w:rPr>
-          <w:rFonts w:cs="Times New Roman"/>
-        </w:rPr>
-        <w:t xml:space="preserve">molar concentration </w:t>
+        <w:t xml:space="preserve">, which suppresses further growth as the corrosion-product concentration approaches its maximum molar concentration </w:t>
       </w:r>
       <m:oMath>
         <m:sSub>
@@ -8324,21 +8317,15 @@
         <w:t xml:space="preserve"> and solved using first-order finite elements with implicit time integration. </w:t>
       </w:r>
       <w:r>
-        <w:t xml:space="preserve">Parametrically generated implant geometries were discretized into tetrahedral meshes and embedded within a 30 × 30 × 30 mm</w:t>
-      </w:r>
-      <w:ins w:id="9002" w:author="Claude" w:date="2026-10-09T21:29:24Z">
-        <w:r>
-          <w:t xml:space="preserve"> (27 mL)</w:t>
-        </w:r>
-      </w:ins>
-      <w:r>
-        <w:t xml:space="preserve"> electrolyte domain</w:t>
-      </w:r>
-      <w:r>
-        <w:t>,</w:t>
-      </w:r>
-      <w:r>
-        <w:t xml:space="preserve"> identical for the disc and the stent and larger than three times the implant characteristic dimension in each direction</w:t>
+        <w:t xml:space="preserve">Parametrically generated implant geometries were discretized into tetrahedral meshes and embedded within a 30 × 30 × 30 mm electrolyte domain, identical for the disc and the stent and larger than three times </w:t>
+      </w:r>
+      <w:proofErr w:type="gramStart"/>
+      <w:r>
+        <w:t>the implant</w:t>
+      </w:r>
+      <w:proofErr w:type="gramEnd"/>
+      <w:r>
+        <w:t xml:space="preserve"> characteristic dimension in each direction</w:t>
       </w:r>
       <w:ins w:id="11" w:author="Claude" w:date="2026-10-08T04:28:00Z">
         <w:r>
@@ -8368,34 +8355,48 @@
         <w:t>Section S2</w:t>
       </w:r>
       <w:r>
-        <w:t xml:space="preserve">).</w:t>
-      </w:r>
-      <w:ins w:id="9001" w:author="Claude" w:date="2026-10-09T21:29:24Z">
-        <w:r>
-          <w:t xml:space="preserve"> Calibration simulations were run on a coarser mesh and corrected to the fine-mesh result (Section S5, Figure S5).</w:t>
-        </w:r>
-      </w:ins>
+        <w:t>).</w:t>
+      </w:r>
     </w:p>
     <w:p>
       <w:pPr>
         <w:pStyle w:val="BodyText"/>
       </w:pPr>
       <w:r>
-        <w:t>Physiological initial and boundary conditions were imposed throughout the electrolyte domain, including continuous oxygen replenishment at the electrolyte-air interface and kinetic flux conditions at the moving metal-electrolyte boundary. The 48 h medium renewal used in the immersion tests was not modeled explicitly; instead, dissolved oxygen was assumed to be continuously replenished at the electrolyte–air interface</w:t>
+        <w:t xml:space="preserve">Physiological initial and boundary conditions were imposed throughout the electrolyte domain, including continuous oxygen replenishment at the electrolyte-air interface and kinetic flux conditions at the moving metal-electrolyte boundary. The </w:t>
+      </w:r>
+      <w:proofErr w:type="gramStart"/>
+      <w:r>
+        <w:t>48 h</w:t>
+      </w:r>
+      <w:proofErr w:type="gramEnd"/>
+      <w:r>
+        <w:t xml:space="preserve"> medium renewal used in the immersion tests was not modeled explicitly; instead, dissolved oxygen was assumed to be continuously replenished at the electrolyte–air interface</w:t>
       </w:r>
       <w:r>
         <w:t xml:space="preserve"> and </w:t>
       </w:r>
       <w:r>
-        <w:t xml:space="preserve">no natural convection was considered (static conditions</w:t>
-      </w:r>
-      <w:ins w:id="9003" w:author="Claude" w:date="2026-10-09T21:29:24Z">
-        <w:r>
-          <w:t xml:space="preserve">); the sensitivity of the predicted mass loss to the oxygen supply and to the initial oxygen concentration, and the difference between the 27 mL computational and 44 mL experimental volumes, are examined in Section S7 (Figure S10</w:t>
-        </w:r>
-      </w:ins>
-      <w:r>
-        <w:t xml:space="preserve">). Simulations were executed in parallel using </w:t>
+        <w:t>no natural convection was considered (static conditions</w:t>
+      </w:r>
+      <w:r>
+        <w:t xml:space="preserve">). </w:t>
+      </w:r>
+      <w:r>
+        <w:t xml:space="preserve">The effects of oxygen supply and initial dissolved-oxygen concentration are </w:t>
+      </w:r>
+      <w:r>
+        <w:t xml:space="preserve">shown in </w:t>
+      </w:r>
+      <w:r>
+        <w:rPr>
+          <w:b/>
+          <w:bCs/>
+        </w:rPr>
+        <w:t>Figure S10</w:t>
+      </w:r>
+      <w:r>
+        <w:t xml:space="preserve">. Simulations were executed in parallel using </w:t>
       </w:r>
       <w:proofErr w:type="spellStart"/>
       <w:r>
@@ -8438,7 +8439,10 @@
         <w:t>, and dissolved oxygen concentration</w:t>
       </w:r>
       <w:r>
-        <w:t xml:space="preserve"> were extracted during post-processing. The transition between reaction-controlled and diffusion-controlled degradation was quantified using the local </w:t>
+        <w:t xml:space="preserve"> were extracted during post-</w:t>
+      </w:r>
+      <w:r>
+        <w:t xml:space="preserve">processing. The transition between reaction-controlled and diffusion-controlled degradation was quantified using the local </w:t>
       </w:r>
       <w:proofErr w:type="spellStart"/>
       <w:r>
@@ -11516,15 +11520,7 @@
                 <w:sz w:val="22"/>
                 <w:szCs w:val="22"/>
               </w:rPr>
-              <w:t>1.42 × 10⁻⁷ mol</w:t>
-            </w:r>
-            <w:r>
-              <w:rPr>
-                <w:rFonts w:cs="Times New Roman"/>
-                <w:sz w:val="22"/>
-                <w:szCs w:val="22"/>
-              </w:rPr>
-              <w:t xml:space="preserve"> mm⁻³</w:t>
+              <w:t>1.42 × 10⁻⁷ mol mm⁻³</w:t>
             </w:r>
           </w:p>
         </w:tc>
@@ -11776,15 +11772,7 @@
                 <w:sz w:val="22"/>
                 <w:szCs w:val="22"/>
               </w:rPr>
-              <w:t>1.09 × 10⁻¹⁰ mol</w:t>
-            </w:r>
-            <w:r>
-              <w:rPr>
-                <w:rFonts w:cs="Times New Roman"/>
-                <w:sz w:val="22"/>
-                <w:szCs w:val="22"/>
-              </w:rPr>
-              <w:t xml:space="preserve"> mm⁻³</w:t>
+              <w:t>1.09 × 10⁻¹⁰ mol mm⁻³</w:t>
             </w:r>
           </w:p>
         </w:tc>
@@ -12133,11 +12121,19 @@
         <w:t xml:space="preserve"> identified kinetic parameters </w:t>
       </w:r>
       <w:r>
-        <w:t>were calibrated using Bayesian optimization</w:t>
+        <w:t xml:space="preserve">were calibrated using Bayesian </w:t>
+      </w:r>
+      <w:r>
+        <w:t>optimization</w:t>
       </w:r>
       <w:r>
         <w:t xml:space="preserve"> </w:t>
       </w:r>
+      <w:ins w:id="9002" w:author="Claude" w:date="2026-10-09T21:46:36Z">
+        <w:r>
+          <w:t xml:space="preserve">of a deterministic RMSE objective </w:t>
+        </w:r>
+      </w:ins>
       <w:r>
         <w:t>(</w:t>
       </w:r>
@@ -12149,8 +12145,13 @@
         <w:t>Section S5</w:t>
       </w:r>
       <w:r>
-        <w:t>)</w:t>
-      </w:r>
+        <w:t xml:space="preserve">)</w:t>
+      </w:r>
+      <w:ins w:id="9001" w:author="Claude" w:date="2026-10-09T21:46:36Z">
+        <w:r>
+          <w:t xml:space="preserve">, which locates the minimum-RMSE parameter set but is not Bayesian parameter inference</w:t>
+        </w:r>
+      </w:ins>
       <w:r>
         <w:t>.</w:t>
       </w:r>
@@ -12158,10 +12159,7 @@
         <w:t xml:space="preserve"> The calibration</w:t>
       </w:r>
       <w:r>
-        <w:t xml:space="preserve"> used published 14-day mass-loss measurements </w:t>
-      </w:r>
-      <w:r>
-        <w:t xml:space="preserve">obtained from revised simulated body fluid (r-SBF) immersion experiments reported by Liu et al. </w:t>
+        <w:t xml:space="preserve"> used published 14-day mass-loss measurements obtained from revised simulated body fluid (r-SBF) immersion experiments reported by Liu et al. </w:t>
       </w:r>
       <w:r>
         <w:rPr>
@@ -12205,7 +12203,32 @@
         <w:t>Table S7</w:t>
       </w:r>
       <w:r>
-        <w:t xml:space="preserve">). Optimal parameter combinations were identified by minimizing the RMSE between simulated and literature mass-loss data. </w:t>
+        <w:t xml:space="preserve">). </w:t>
+      </w:r>
+      <w:r>
+        <w:t xml:space="preserve">To reduce computational cost, calibration was performed on a coarser mesh and </w:t>
+      </w:r>
+      <w:r>
+        <w:t>then</w:t>
+      </w:r>
+      <w:r>
+        <w:t xml:space="preserve"> corrected to the fine-mesh result (</w:t>
+      </w:r>
+      <w:r>
+        <w:rPr>
+          <w:b/>
+          <w:bCs/>
+        </w:rPr>
+        <w:t>Section S5, Figure S5</w:t>
+      </w:r>
+      <w:r>
+        <w:t>).</w:t>
+      </w:r>
+      <w:r>
+        <w:t xml:space="preserve"> </w:t>
+      </w:r>
+      <w:r>
+        <w:t xml:space="preserve">Optimal parameter combinations were identified by minimizing the RMSE between simulated and literature mass-loss data. </w:t>
       </w:r>
       <w:r>
         <w:t xml:space="preserve">The calibrated model was then validated against the HBSS immersion dataset generated in the present study. </w:t>
@@ -12608,30 +12631,6 @@
       <w:r>
         <w:t xml:space="preserve"> To quantify geometry-dependent degradation, spatial distributions of oxygen concentration, corrosion-product accumulation, and interface recession were analyzed throughout the simulation. Cross-sectional profiles extracted from representative straight-strut and crown regions were used to evaluate local penetration depth and degradation heterogeneity.</w:t>
       </w:r>
-    </w:p>
-    <w:p>
-      <w:pPr>
-        <w:pStyle w:val="BodyText"/>
-        <w:ind w:firstLine="0"/>
-      </w:pPr>
-    </w:p>
-    <w:p>
-      <w:pPr>
-        <w:pStyle w:val="BodyText"/>
-        <w:ind w:firstLine="0"/>
-      </w:pPr>
-    </w:p>
-    <w:p>
-      <w:pPr>
-        <w:pStyle w:val="BodyText"/>
-        <w:ind w:firstLine="0"/>
-      </w:pPr>
-    </w:p>
-    <w:p>
-      <w:pPr>
-        <w:pStyle w:val="BodyText"/>
-        <w:ind w:firstLine="0"/>
-      </w:pPr>
     </w:p>
     <w:p>
       <w:pPr>
@@ -13834,7 +13833,15 @@
         <w:t>.</w:t>
       </w:r>
       <w:r>
-        <w:t xml:space="preserve"> Calibration of the Zn biodegradation model. (a) Morris sensitivity analysis showing the relative influence of model parameters on predicted Zn mass loss after 168 h</w:t>
+        <w:t xml:space="preserve"> Calibration of the Zn biodegradation model. (a) </w:t>
+      </w:r>
+      <w:proofErr w:type="gramStart"/>
+      <w:r>
+        <w:t>Morris</w:t>
+      </w:r>
+      <w:proofErr w:type="gramEnd"/>
+      <w:r>
+        <w:t xml:space="preserve"> sensitivity analysis showing the relative influence of model parameters on predicted Zn mass loss after 168 h</w:t>
       </w:r>
       <w:r>
         <w:t xml:space="preserve">; (b) </w:t>
@@ -15261,13 +15268,7 @@
         <w:rPr>
           <w:rFonts w:cs="Times New Roman"/>
         </w:rPr>
-        <w:t xml:space="preserve">where </w:t>
-      </w:r>
-      <w:r>
-        <w:rPr>
-          <w:rFonts w:cs="Times New Roman"/>
-        </w:rPr>
-        <w:t xml:space="preserve">increasing the oxygen-reduction rate coefficient markedly accelerated degradation and produced substantially greater cumulative mass loss </w:t>
+        <w:t xml:space="preserve">where increasing the oxygen-reduction rate coefficient markedly accelerated degradation and produced substantially greater cumulative mass loss </w:t>
       </w:r>
       <w:r>
         <w:rPr>
@@ -17888,7 +17889,15 @@
         <w:t>40</w:t>
       </w:r>
       <w:r>
-        <w:t xml:space="preserve"> h of immersion, oxygen transport became rate-limiting, marking the onset of diffusion-controlled degradation and driving the subsequent decline in corrosion rate.</w:t>
+        <w:t xml:space="preserve"> h of immersion, oxygen transport became rate-</w:t>
+      </w:r>
+      <w:proofErr w:type="gramStart"/>
+      <w:r>
+        <w:t>limiting</w:t>
+      </w:r>
+      <w:proofErr w:type="gramEnd"/>
+      <w:r>
+        <w:t>, marking the onset of diffusion-controlled degradation and driving the subsequent decline in corrosion rate.</w:t>
       </w:r>
     </w:p>
     <w:p>
@@ -18567,6 +18576,7 @@
         </w:rPr>
         <w:fldChar w:fldCharType="end"/>
       </w:r>
+      <w:proofErr w:type="gramStart"/>
       <w:r>
         <w:rPr>
           <w:rFonts w:cs="Times New Roman"/>
@@ -18575,6 +18585,7 @@
         </w:rPr>
         <w:t>e,f</w:t>
       </w:r>
+      <w:proofErr w:type="gramEnd"/>
       <w:r>
         <w:rPr>
           <w:rFonts w:cs="Times New Roman"/>
@@ -18836,8 +18847,21 @@
         <w:t xml:space="preserve"> corrosion-product chemistry. </w:t>
       </w:r>
       <w:r>
-        <w:t>The higher mass loss is consistent with the observed relationship between surface area-to-volume ratio (SA:V) and degradation, where cumulative mass loss increased approximately linearly with SA:V</w:t>
-      </w:r>
+        <w:t>The higher mass loss is consistent with the observed relationship between surface area-to-volume ratio (</w:t>
+      </w:r>
+      <w:proofErr w:type="gramStart"/>
+      <w:r>
+        <w:t>SA:V</w:t>
+      </w:r>
+      <w:proofErr w:type="gramEnd"/>
+      <w:r>
+        <w:t xml:space="preserve">) and degradation, where cumulative mass loss increased approximately linearly with </w:t>
+      </w:r>
+      <w:proofErr w:type="gramStart"/>
+      <w:r>
+        <w:t>SA:V</w:t>
+      </w:r>
+      <w:proofErr w:type="gramEnd"/>
       <w:r>
         <w:t xml:space="preserve"> (</w:t>
       </w:r>
@@ -18858,7 +18882,15 @@
         <w:t xml:space="preserve"> </w:t>
       </w:r>
       <w:r>
-        <w:t>However, the stent exhibited less pronounced temporal deceleration in mass loss than the disc, indicating that geometric influences on degradation extend beyond SA:V alone.</w:t>
+        <w:t xml:space="preserve">However, the stent exhibited less pronounced temporal deceleration in mass loss than the disc, indicating that geometric influences on degradation extend beyond </w:t>
+      </w:r>
+      <w:proofErr w:type="gramStart"/>
+      <w:r>
+        <w:t>SA:V</w:t>
+      </w:r>
+      <w:proofErr w:type="gramEnd"/>
+      <w:r>
+        <w:t xml:space="preserve"> alone.</w:t>
       </w:r>
     </w:p>
     <w:p>
@@ -19363,6 +19395,7 @@
         </w:rPr>
         <w:fldChar w:fldCharType="end"/>
       </w:r>
+      <w:proofErr w:type="gramStart"/>
       <w:r>
         <w:rPr>
           <w:b/>
@@ -19371,7 +19404,11 @@
         <w:t>c,d</w:t>
       </w:r>
       <w:r>
-        <w:t xml:space="preserve">. </w:t>
+        <w:t>.</w:t>
+      </w:r>
+      <w:proofErr w:type="gramEnd"/>
+      <w:r>
+        <w:t xml:space="preserve"> </w:t>
       </w:r>
       <w:r>
         <w:t>Section 1, located along a relatively straight strut segment, exhibited comparatively uniform recession, with penetration depths ranging from approximately</w:t>
@@ -19719,10 +19756,12 @@
         <w:t> h, (b) schematic illustration of oxygen transport to the inner and outer-curvature surfaces of the stent crown, (</w:t>
       </w:r>
       <w:proofErr w:type="spellStart"/>
+      <w:proofErr w:type="gramStart"/>
       <w:r>
         <w:t>c,d</w:t>
       </w:r>
       <w:proofErr w:type="spellEnd"/>
+      <w:proofErr w:type="gramEnd"/>
       <w:r>
         <w:t>) evolution of the metal cross-sectional profiles at Sections 1 and 2, respectively.</w:t>
       </w:r>
@@ -19952,7 +19991,15 @@
         <w:t xml:space="preserve">). </w:t>
       </w:r>
       <w:r>
-        <w:t>The outer-to-inner recession ratio increased from 1.6 for the 30° arc to 2.6 for the 90° arc and 13.2 for the 150° arc, demonstrating that increasing curvature progressively concentrated degradation along the oxygen-accessible outer surface while suppressing recession along the confined inner curvature. Similarly, the outward-facing to gap-facing recession ratio increased from 1.3 for the isolated wire to 4.5 for the closely spaced pair, before decreasing to 2.5 for the widely spaced pair. The pronounced asymmetry at close spacing resulted from oxygen depletion within the narrow gap, while the outward-facing surfaces remained accessible to the bulk electrolyte. Thus, curvature and spacing had only modest effects on mean penetration but strongly influenced where material loss occurred. Therefore, cumulative mass loss and nominal corrosion rate alone may conceal localized degradation that could govern strut thinning, stress concentration, and eventual structural failure.</w:t>
+        <w:t xml:space="preserve">The outer-to-inner recession ratio increased from 1.6 for the 30° arc to 2.6 for the 90° arc and 13.2 for the 150° arc, demonstrating that increasing curvature progressively concentrated degradation along the oxygen-accessible outer surface while suppressing recession along the confined inner curvature. Similarly, the outward-facing to gap-facing recession ratio increased from 1.3 for the isolated wire to 4.5 for the closely spaced pair, before decreasing to 2.5 for the widely spaced pair. The pronounced asymmetry at close spacing resulted from oxygen depletion within the narrow gap, while the outward-facing surfaces remained accessible to the bulk electrolyte. Thus, curvature and spacing had only modest effects on mean penetration but </w:t>
+      </w:r>
+      <w:proofErr w:type="gramStart"/>
+      <w:r>
+        <w:t>strongly</w:t>
+      </w:r>
+      <w:proofErr w:type="gramEnd"/>
+      <w:r>
+        <w:t xml:space="preserve"> influenced where material loss occurred. Therefore, cumulative mass loss and nominal corrosion rate alone may conceal localized degradation that could govern strut thinning, stress concentration, and eventual structural failure.</w:t>
       </w:r>
     </w:p>
     <w:p>
@@ -20131,7 +20178,15 @@
       </w:r>
       <w:proofErr w:type="spellEnd"/>
       <w:r>
-        <w:t>-based field rather than a discrete surface film or a heterogeneous, composition-dependent structure, and phosphate-, carbonate-, calcium-, and chloride-containing phases</w:t>
+        <w:t xml:space="preserve">-based field rather than a discrete surface film or a heterogeneous, composition-dependent structure, </w:t>
+      </w:r>
+      <w:proofErr w:type="gramStart"/>
+      <w:r>
+        <w:t>and phosphate-,</w:t>
+      </w:r>
+      <w:proofErr w:type="gramEnd"/>
+      <w:r>
+        <w:t xml:space="preserve"> carbonate-, calcium-, and chloride-containing phases</w:t>
       </w:r>
       <w:ins w:id="30" w:author="Claude" w:date="2026-10-08T20:38:00Z">
         <w:r>
@@ -20178,55 +20233,32 @@
         </m:sSub>
       </m:oMath>
       <w:r>
-        <w:t>​ should be regarded as an effective parameter that partially incorporates uncertainty in oxygen availability</w:t>
-      </w:r>
-      <w:r>
-        <w:t xml:space="preserve">. Continuous oxygen replenishment at the electrolyte–air interface may not reflect the 48 h medium renewal used in the experiments, so the calibrated </w:t>
-      </w:r>
-      <m:oMath>
-        <m:sSub>
-          <m:sSubPr>
-            <m:ctrlPr>
-              <w:rPr>
-                <w:rFonts w:ascii="Cambria Math" w:hAnsi="Cambria Math"/>
-                <w:sz w:val="22"/>
-                <w:szCs w:val="22"/>
-              </w:rPr>
-            </m:ctrlPr>
-          </m:sSubPr>
-          <m:e>
-            <m:r>
-              <w:rPr>
-                <w:rFonts w:ascii="Cambria Math" w:hAnsi="Cambria Math"/>
-                <w:sz w:val="22"/>
-                <w:szCs w:val="22"/>
-              </w:rPr>
-              <m:t>k</m:t>
-            </m:r>
-          </m:e>
-          <m:sub>
-            <m:r>
-              <m:rPr>
-                <m:sty m:val="p"/>
-              </m:rPr>
-              <w:rPr>
-                <w:rFonts w:ascii="Cambria Math" w:hAnsi="Cambria Math"/>
-                <w:sz w:val="22"/>
-                <w:szCs w:val="22"/>
-              </w:rPr>
-              <m:t>ORR</m:t>
-            </m:r>
-          </m:sub>
-        </m:sSub>
-      </m:oMath>
-      <w:r>
-        <w:t xml:space="preserve"> is conditional on the assumed oxygen history</w:t>
-      </w:r>
-      <w:ins w:id="9004" w:author="Claude" w:date="2026-10-09T21:29:24Z">
-        <w:r>
-          <w:t xml:space="preserve"> (Section S7, Figure S10)</w:t>
-        </w:r>
-      </w:ins>
+        <w:t xml:space="preserve">​ should be regarded as an effective parameter that partially incorporates uncertainty in oxygen availability. </w:t>
+      </w:r>
+      <w:r>
+        <w:t xml:space="preserve">Continuous oxygen replenishment at the electrolyte-air interface may not fully represent the </w:t>
+      </w:r>
+      <w:proofErr w:type="gramStart"/>
+      <w:r>
+        <w:t>48 h</w:t>
+      </w:r>
+      <w:proofErr w:type="gramEnd"/>
+      <w:r>
+        <w:t xml:space="preserve"> medium renewal used experimentally, making the </w:t>
+      </w:r>
+      <w:r>
+        <w:t>calibrated model conditional on the assumed oxygen history</w:t>
+      </w:r>
+      <w:r>
+        <w:t xml:space="preserve"> </w:t>
+      </w:r>
+      <w:r>
+        <w:rPr>
+          <w:b/>
+          <w:bCs/>
+        </w:rPr>
+        <w:t>(Section S7, Figure S10)</w:t>
+      </w:r>
       <w:r>
         <w:t>.</w:t>
       </w:r>
@@ -20234,6 +20266,12 @@
         <w:t xml:space="preserve"> </w:t>
       </w:r>
       <w:r>
+        <w:t>In addition, the smaller computational domain (27 mL vs. 44 mL experimentally) may influence the predicted oxygen concentration field due to the reduced oxygen reservoir.</w:t>
+      </w:r>
+      <w:r>
+        <w:t xml:space="preserve"> </w:t>
+      </w:r>
+      <w:r>
         <w:t xml:space="preserve">The model also excludes proteins, cells, tissue interactions, blood flow, biological buffering, and the complete range of ionic reactions occurring </w:t>
       </w:r>
       <w:r>
@@ -20271,9 +20309,6 @@
       </w:r>
       <w:r>
         <w:t>.</w:t>
-      </w:r>
-      <w:r>
-        <w:t xml:space="preserve"> The computational electrolyte domain (30 × 30 × 30 mm, corresponding to 27 mL) is smaller than the experimental immersion volume (44 mL), which may introduce deviations in the predicted oxygen concentration field because of the reduced oxygen reservoir available in the simulation.</w:t>
       </w:r>
     </w:p>
     <w:p>
@@ -20317,54 +20352,46 @@
       <w:r>
         <w:t xml:space="preserve"> </w:t>
       </w:r>
+      <w:r>
+        <w:t>This capability would enable structural optimization of biodegradable Zn implants to move beyond current as-fabricated-state studies and toward predicting performance throughout the degradation process</w:t>
+      </w:r>
+      <w:r>
+        <w:t xml:space="preserve"> </w:t>
+      </w:r>
+      <w:r>
+        <w:fldChar w:fldCharType="begin"/>
+      </w:r>
+      <w:r>
+        <w:instrText xml:space="preserve"> ADDIN ZOTERO_ITEM CSL_CITATION {"citationID":"Zd9tPSIo","properties":{"unsorted":false,"formattedCitation":"\\super [41,42]\\nosupersub{}","plainCitation":"[41,42]","noteIndex":0},"citationItems":[{"id":5765,"uris":["http://zotero.org/users/16939557/items/FPYDBSXS"],"itemData":{"id":5765,"type":"article-journal","citation-key":"liOptimizingStructuralDesign2022","container-title":"Materials &amp; Design","DOI":"10.1016/j.matdes.2022.110843","ISSN":"02641275","journalAbbreviation":"Materials &amp; Design","language":"en","page":"110843","source":"DOI.org (Crossref)","title":"Optimizing structural design on biodegradable magnesium alloy vascular stent for reducing strut thickness and raising radial strength","volume":"220","author":[{"family":"Li","given":"Yafei"},{"family":"Wang","given":"Jianfeng"},{"family":"Sheng","given":"Kun"},{"family":"Miao","given":"Fulong"},{"family":"Wang","given":"Yan"},{"family":"Zhang","given":"Yifan"},{"family":"Hou","given":"Ruiqing"},{"family":"Mei","given":"Di"},{"family":"Sun","given":"Yufeng"},{"family":"Zheng","given":"Yufeng"},{"family":"Guan","given":"Shaokang"}],"issued":{"date-parts":[["2022",8]]}}},{"id":5766,"uris":["http://zotero.org/users/16939557/items/3V2WPL8B"],"itemData":{"id":5766,"type":"article-journal","abstract":"The emergence of biodegradable stents addresses the limitations of the long-term presence of permanent bare metal stents in the human body. Following implantation, these stents can significantly reduce the occurrence of chronic complications such as inflammation and thrombosis, thus becoming a mainstream approach in the treatment of interventional cardiovascular diseases. Currently, the materials used for biodegradable stents are typically polymers. However, the inherent properties of the materials dictate that polymer stents exhibit lower mechanical performance and biocompatibility. Magnesium alloy materials, on the basis of their biodegradability, exhibit superior mechanical performance when compared to polymers, possessing the potential to address this issue. However, the presence of stress concentration in the stent structure necessitates further designs and mechanical performance analyses of magnesium alloy stents. In this work, a biodegradable stent based on WE43 alloy is designed. The stent incorporates the micro-protrusion structure to enhance the mechanical performance. Furthermore, to evaluate the clinical applicability of the stent, the mechanical performance of the biodegradable magnesium alloy stent is conducted through finite element analysis (FEA). The results show that the maximum equivalent stress in all four aspects is below the ultimate tensile strength of 370 MPa for the WE43 magnesium alloy, demonstrating excellent mechanical performance. Additionally, after crimping and expansion, the radial support strength and radial support force reached 780 mN/mm and 1.56 N, respectively. Compared to the advanced reported stent structures, the radial support strength and radial support force are enhanced by 13% and 47%, respectively. Additionally, flexibility analysis indicated that the flexibility of the stent design in this study is improved by a factor of 9.76, ensuring the stent’s capability to navigate through complex vasculature during implantation.","citation-key":"chenDesignMechanicalPerformance2024","container-title":"Metals","DOI":"10.3390/met14060704","ISSN":"2075-4701","issue":"6","journalAbbreviation":"Metals","language":"en","page":"704","source":"DOI.org (Crossref)","title":"Design and Mechanical Performance Evaluation of WE43 Magnesium Alloy Biodegradable Stents via Finite Element Analysis","volume":"14","author":[{"family":"Chen","given":"Jiaxuan"},{"family":"Dong","given":"Fang"},{"family":"Liu","given":"Sheng"}],"issued":{"date-parts":[["2024",6,14]]}}}],"schema":"https://github.com/citation-style-language/schema/raw/master/csl-citation.json"} </w:instrText>
+      </w:r>
+      <w:r>
+        <w:fldChar w:fldCharType="separate"/>
+      </w:r>
+      <w:r>
+        <w:rPr>
+          <w:rFonts w:cs="Times New Roman"/>
+          <w:vertAlign w:val="superscript"/>
+        </w:rPr>
+        <w:t>[41,42]</w:t>
+      </w:r>
+      <w:r>
+        <w:fldChar w:fldCharType="end"/>
+      </w:r>
+      <w:r>
+        <w:t>.</w:t>
+      </w:r>
     </w:p>
     <w:p>
       <w:pPr>
         <w:pStyle w:val="BodyText"/>
+        <w:ind w:firstLine="0"/>
       </w:pPr>
-      <w:r>
-        <w:t xml:space="preserve">Structural optimization of </w:t>
-      </w:r>
-      <w:r>
-        <w:t>biodegradable</w:t>
-      </w:r>
-      <w:r>
-        <w:t xml:space="preserve"> implants, from patient-specific bone replacements to porous scaffolds, has so far targeted mechanical performance in the as-fabricated state </w:t>
-      </w:r>
-      <w:r>
-        <w:fldChar w:fldCharType="begin"/>
-      </w:r>
-      <w:r>
-        <w:instrText xml:space="preserve"> ADDIN ZOTERO_ITEM CSL_CITATION {"citationID":"Zd9tPSIo","properties":{"unsorted":false,"formattedCitation":"\\super [41,42]\\nosupersub{}","plainCitation":"[41,42]","noteIndex":0},"citationItems":[{"id":5765,"uris":["http://zotero.org/users/16939557/items/FPYDBSXS"],"itemData":{"id":5765,"type":"article-journal","citation-key":"liOptimizingStructuralDesign2022","container-title":"Materials &amp; Design","DOI":"10.1016/j.matdes.2022.110843","ISSN":"02641275","journalAbbreviation":"Materials &amp; Design","language":"en","page":"110843","source":"DOI.org (Crossref)","title":"Optimizing structural design on biodegradable magnesium alloy vascular stent for reducing strut thickness and raising radial strength","volume":"220","author":[{"family":"Li","given":"Yafei"},{"family":"Wang","given":"Jianfeng"},{"family":"Sheng","given":"Kun"},{"family":"Miao","given":"Fulong"},{"family":"Wang","given":"Yan"},{"family":"Zhang","given":"Yifan"},{"family":"Hou","given":"Ruiqing"},{"family":"Mei","given":"Di"},{"family":"Sun","given":"Yufeng"},{"family":"Zheng","given":"Yufeng"},{"family":"Guan","given":"Shaokang"}],"issued":{"date-parts":[["2022",8]]}}},{"id":5766,"uris":["http://zotero.org/users/16939557/items/3V2WPL8B"],"itemData":{"id":5766,"type":"article-journal","abstract":"The emergence of biodegradable stents addresses the limitations of the long-term presence of permanent bare metal stents in the human body. Following implantation, these stents can significantly reduce the occurrence of chronic complications such as inflammation and thrombosis, thus becoming a mainstream approach in the treatment of interventional cardiovascular diseases. Currently, the materials used for biodegradable stents are typically polymers. However, the inherent properties of the materials dictate that polymer stents exhibit lower mechanical performance and biocompatibility. Magnesium alloy materials, on the basis of their biodegradability, exhibit superior mechanical performance when compared to polymers, possessing the potential to address this issue. However, the presence of stress concentration in the stent structure necessitates further designs and mechanical performance analyses of magnesium alloy stents. In this work, a biodegradable stent based on WE43 alloy is designed. The stent incorporates the micro-protrusion structure to enhance the mechanical performance. Furthermore, to evaluate the clinical applicability of the stent, the mechanical performance of the biodegradable magnesium alloy stent is conducted through finite element analysis (FEA). The results show that the maximum equivalent stress in all four aspects is below the ultimate tensile strength of 370 MPa for the WE43 magnesium alloy, demonstrating excellent mechanical performance. Additionally, after crimping and expansion, the radial support strength and radial support force reached 780 mN/mm and 1.56 N, respectively. Compared to the advanced reported stent structures, the radial support strength and radial support force are enhanced by 13% and 47%, respectively. Additionally, flexibility analysis indicated that the flexibility of the stent design in this study is improved by a factor of 9.76, ensuring the stent’s capability to navigate through complex vasculature during implantation.","citation-key":"chenDesignMechanicalPerformance2024","container-title":"Metals","DOI":"10.3390/met14060704","ISSN":"2075-4701","issue":"6","journalAbbreviation":"Metals","language":"en","page":"704","source":"DOI.org (Crossref)","title":"Design and Mechanical Performance Evaluation of WE43 Magnesium Alloy Biodegradable Stents via Finite Element Analysis","volume":"14","author":[{"family":"Chen","given":"Jiaxuan"},{"family":"Dong","given":"Fang"},{"family":"Liu","given":"Sheng"}],"issued":{"date-parts":[["2024",6,14]]}}}],"schema":"https://github.com/citation-style-language/schema/raw/master/csl-citation.json"} </w:instrText>
-      </w:r>
-      <w:r>
-        <w:fldChar w:fldCharType="separate"/>
-      </w:r>
-      <w:r>
-        <w:rPr>
-          <w:rFonts w:cs="Times New Roman"/>
-          <w:vertAlign w:val="superscript"/>
-        </w:rPr>
-        <w:t>[41,42]</w:t>
-      </w:r>
-      <w:r>
-        <w:fldChar w:fldCharType="end"/>
-      </w:r>
-      <w:r>
-        <w:t>. For biodegradable implants</w:t>
-      </w:r>
-      <w:r>
-        <w:t>,</w:t>
-      </w:r>
-      <w:r>
-        <w:t xml:space="preserve"> </w:t>
-      </w:r>
-      <w:r>
-        <w:t xml:space="preserve">this approach is insufficient because geometry, mass transport, and degradation evolve in a coupled manner, continuously altering the load-bearing architecture and its mechanical response. By explicitly resolving the influence of geometry on local oxygen </w:t>
-      </w:r>
-      <w:r>
-        <w:t>availability and surface recession, the present framework provides the degradation component required to extend structural optimization from the initial design state to performance throughout the degradation process.</w:t>
-      </w:r>
+    </w:p>
+    <w:p>
+      <w:pPr>
+        <w:pStyle w:val="BodyText"/>
+        <w:ind w:firstLine="0"/>
+      </w:pPr>
     </w:p>
     <w:p>
       <w:pPr>
@@ -20414,13 +20441,7 @@
         <w:t>identify</w:t>
       </w:r>
       <w:r>
-        <w:t xml:space="preserve"> oxygen availability as the primary driver of degradation, with corrosion-product accumulation progressively restricting transport and leading to diffusion-controlled behavior. Importantly, localized degradation emerged naturally from geometry-dependent transport phenomena, without imposing spatially varying corrosion kinetics. While curvature and inter-strut spacing produced only modest changes in cumulative mass loss, they strongly altered the distribution of material recession, demonstrating that global degradation metrics can obscure the localized thinning responsible for structural failure. These findings establish geometry as a critical determinant of biodegradable implant performance and provide a predictive framework for integrating degradation into the design and optimization of Zn stents and other biodegradable metallic implants, </w:t>
-      </w:r>
-      <w:r>
-        <w:t xml:space="preserve">which could enable </w:t>
-      </w:r>
-      <w:r>
-        <w:t>structural performance to be considered throughout the implant lifetime rather than only at implantation.</w:t>
+        <w:t xml:space="preserve"> oxygen availability as the primary driver of degradation, with corrosion-product accumulation progressively restricting transport and leading to diffusion-controlled behavior. Importantly, localized degradation emerged naturally from geometry-dependent transport phenomena, without imposing spatially varying corrosion kinetics. While curvature and inter-strut spacing produced only modest changes in cumulative mass loss, they strongly altered the distribution of material recession, demonstrating that global degradation metrics can obscure the localized thinning responsible for structural failure. These findings establish geometry as a critical determinant of biodegradable implant performance and provide a predictive framework for integrating degradation into the design and optimization of Zn stents and other biodegradable metallic implants, which could enable structural performance to be considered throughout the implant lifetime rather than only at implantation.</w:t>
       </w:r>
       <w:bookmarkEnd w:id="31"/>
     </w:p>
@@ -24404,31 +24425,6 @@
 </file>
 
 <file path=customXml/item1.xml><?xml version="1.0" encoding="utf-8"?>
-<p:properties xmlns:p="http://schemas.microsoft.com/office/2006/metadata/properties" xmlns:xsi="http://www.w3.org/2001/XMLSchema-instance" xmlns:pc="http://schemas.microsoft.com/office/infopath/2007/PartnerControls">
-  <documentManagement/>
-</p:properties>
-</file>
-
-<file path=customXml/item2.xml><?xml version="1.0" encoding="utf-8"?>
-<b:Sources xmlns:b="http://schemas.openxmlformats.org/officeDocument/2006/bibliography" xmlns="http://schemas.openxmlformats.org/officeDocument/2006/bibliography" SelectedStyle="\APASixthEditionOfficeOnline.xsl" StyleName="APA" Version="6"/>
-</file>
-
-<file path=customXml/item3.xml><?xml version="1.0" encoding="utf-8"?>
-<?mso-contentType ?>
-<FormTemplates xmlns="http://schemas.microsoft.com/sharepoint/v3/contenttype/forms">
-  <Display>DocumentLibraryForm</Display>
-  <Edit>DocumentLibraryForm</Edit>
-  <New>DocumentLibraryForm</New>
-</FormTemplates>
-</file>
-
-<file path=customXml/item4.xml><?xml version="1.0" encoding="utf-8"?>
-<ControlsStorage xmlns="urn:schemas-microsoft-com.VSTO2008Demos.ControlsStorage">
-  <Controls>AAEAAAD/////AQAAAAAAAAAMAgAAAEVDaGVtNFdvcmQuQ29yZSwgVmVyc2lvbj0xLjAuMC4wLCBDdWx0dXJlPW5ldXRyYWwsIFB1YmxpY0tleVRva2VuPW51bGwHAQAAAAABAAAAAAAAAAQgQ2hlbTRXb3JkLkNvcmUuQ29udHJvbFByb3BlcnRpZXMCAAAACw==</Controls>
-</ControlsStorage>
-</file>
-
-<file path=customXml/item5.xml><?xml version="1.0" encoding="utf-8"?>
 <ct:contentTypeSchema xmlns:ct="http://schemas.microsoft.com/office/2006/metadata/contentType" xmlns:ma="http://schemas.microsoft.com/office/2006/metadata/properties/metaAttributes" ct:_="" ma:_="" ma:contentTypeName="Dokument" ma:contentTypeID="0x01010070446C3525B3CB46BD92ABA5C2617223" ma:contentTypeVersion="12" ma:contentTypeDescription="Ein neues Dokument erstellen." ma:contentTypeScope="" ma:versionID="ace6bbd061d3e3241e07436f437a906c">
   <xsd:schema xmlns:xsd="http://www.w3.org/2001/XMLSchema" xmlns:xs="http://www.w3.org/2001/XMLSchema" xmlns:p="http://schemas.microsoft.com/office/2006/metadata/properties" xmlns:ns2="981f2fdf-0e4d-4708-9882-12f25bf7d4fe" xmlns:ns3="4fe7dd48-639f-4daa-8770-f50527565b0b" targetNamespace="http://schemas.microsoft.com/office/2006/metadata/properties" ma:root="true" ma:fieldsID="645148a839964f4ba651d3ea90aa0208" ns2:_="" ns3:_="">
     <xsd:import namespace="981f2fdf-0e4d-4708-9882-12f25bf7d4fe"/>
@@ -24645,40 +24641,32 @@
 </ct:contentTypeSchema>
 </file>
 
-<file path=customXml/itemProps1.xml><?xml version="1.0" encoding="utf-8"?>
-<ds:datastoreItem xmlns:ds="http://schemas.openxmlformats.org/officeDocument/2006/customXml" ds:itemID="{96D19C85-73BE-4F5D-979F-58BFDE5BBE12}">
-  <ds:schemaRefs>
-    <ds:schemaRef ds:uri="http://schemas.microsoft.com/office/2006/metadata/properties"/>
-    <ds:schemaRef ds:uri="http://schemas.microsoft.com/office/infopath/2007/PartnerControls"/>
-  </ds:schemaRefs>
-</ds:datastoreItem>
+<file path=customXml/item2.xml><?xml version="1.0" encoding="utf-8"?>
+<ControlsStorage xmlns="urn:schemas-microsoft-com.VSTO2008Demos.ControlsStorage">
+  <Controls>AAEAAAD/////AQAAAAAAAAAMAgAAAEVDaGVtNFdvcmQuQ29yZSwgVmVyc2lvbj0xLjAuMC4wLCBDdWx0dXJlPW5ldXRyYWwsIFB1YmxpY0tleVRva2VuPW51bGwHAQAAAAABAAAAAAAAAAQgQ2hlbTRXb3JkLkNvcmUuQ29udHJvbFByb3BlcnRpZXMCAAAACw==</Controls>
+</ControlsStorage>
 </file>
 
-<file path=customXml/itemProps2.xml><?xml version="1.0" encoding="utf-8"?>
-<ds:datastoreItem xmlns:ds="http://schemas.openxmlformats.org/officeDocument/2006/customXml" ds:itemID="{DE724972-9DFC-40BC-BA35-EDB291A5A412}">
-  <ds:schemaRefs>
-    <ds:schemaRef ds:uri="http://schemas.openxmlformats.org/officeDocument/2006/bibliography"/>
-  </ds:schemaRefs>
-</ds:datastoreItem>
+<file path=customXml/item3.xml><?xml version="1.0" encoding="utf-8"?>
+<?mso-contentType ?>
+<FormTemplates xmlns="http://schemas.microsoft.com/sharepoint/v3/contenttype/forms">
+  <Display>DocumentLibraryForm</Display>
+  <Edit>DocumentLibraryForm</Edit>
+  <New>DocumentLibraryForm</New>
+</FormTemplates>
 </file>
 
-<file path=customXml/itemProps3.xml><?xml version="1.0" encoding="utf-8"?>
-<ds:datastoreItem xmlns:ds="http://schemas.openxmlformats.org/officeDocument/2006/customXml" ds:itemID="{75886F76-A765-4714-B899-7AC2DC4334A1}">
-  <ds:schemaRefs>
-    <ds:schemaRef ds:uri="http://schemas.microsoft.com/sharepoint/v3/contenttype/forms"/>
-  </ds:schemaRefs>
-</ds:datastoreItem>
+<file path=customXml/item4.xml><?xml version="1.0" encoding="utf-8"?>
+<b:Sources xmlns:b="http://schemas.openxmlformats.org/officeDocument/2006/bibliography" xmlns="http://schemas.openxmlformats.org/officeDocument/2006/bibliography" SelectedStyle="\APASixthEditionOfficeOnline.xsl" StyleName="APA" Version="6"/>
 </file>
 
-<file path=customXml/itemProps4.xml><?xml version="1.0" encoding="utf-8"?>
-<ds:datastoreItem xmlns:ds="http://schemas.openxmlformats.org/officeDocument/2006/customXml" ds:itemID="{E3F19EBF-8207-4BE7-AD18-240ED1895C11}">
-  <ds:schemaRefs>
-    <ds:schemaRef ds:uri="urn:schemas-microsoft-com.VSTO2008Demos.ControlsStorage"/>
-  </ds:schemaRefs>
-</ds:datastoreItem>
+<file path=customXml/item5.xml><?xml version="1.0" encoding="utf-8"?>
+<p:properties xmlns:p="http://schemas.microsoft.com/office/2006/metadata/properties" xmlns:xsi="http://www.w3.org/2001/XMLSchema-instance" xmlns:pc="http://schemas.microsoft.com/office/infopath/2007/PartnerControls">
+  <documentManagement/>
+</p:properties>
 </file>
 
-<file path=customXml/itemProps5.xml><?xml version="1.0" encoding="utf-8"?>
+<file path=customXml/itemProps1.xml><?xml version="1.0" encoding="utf-8"?>
 <ds:datastoreItem xmlns:ds="http://schemas.openxmlformats.org/officeDocument/2006/customXml" ds:itemID="{C86C925C-E763-4769-9959-2FEDA6D7CE8A}">
   <ds:schemaRefs>
     <ds:schemaRef ds:uri="http://schemas.microsoft.com/office/2006/metadata/contentType"/>
@@ -24695,4 +24683,37 @@
     <ds:schemaRef ds:uri="http://schemas.microsoft.com/internal/obd"/>
   </ds:schemaRefs>
 </ds:datastoreItem>
+</file>
+
+<file path=customXml/itemProps2.xml><?xml version="1.0" encoding="utf-8"?>
+<ds:datastoreItem xmlns:ds="http://schemas.openxmlformats.org/officeDocument/2006/customXml" ds:itemID="{E3F19EBF-8207-4BE7-AD18-240ED1895C11}">
+  <ds:schemaRefs>
+    <ds:schemaRef ds:uri="urn:schemas-microsoft-com.VSTO2008Demos.ControlsStorage"/>
+  </ds:schemaRefs>
+</ds:datastoreItem>
+</file>
+
+<file path=customXml/itemProps3.xml><?xml version="1.0" encoding="utf-8"?>
+<ds:datastoreItem xmlns:ds="http://schemas.openxmlformats.org/officeDocument/2006/customXml" ds:itemID="{75886F76-A765-4714-B899-7AC2DC4334A1}">
+  <ds:schemaRefs>
+    <ds:schemaRef ds:uri="http://schemas.microsoft.com/sharepoint/v3/contenttype/forms"/>
+  </ds:schemaRefs>
+</ds:datastoreItem>
+</file>
+
+<file path=customXml/itemProps4.xml><?xml version="1.0" encoding="utf-8"?>
+<ds:datastoreItem xmlns:ds="http://schemas.openxmlformats.org/officeDocument/2006/customXml" ds:itemID="{DE724972-9DFC-40BC-BA35-EDB291A5A412}">
+  <ds:schemaRefs>
+    <ds:schemaRef ds:uri="http://schemas.openxmlformats.org/officeDocument/2006/bibliography"/>
+  </ds:schemaRefs>
+</ds:datastoreItem>
+</file>
+
+<file path=customXml/itemProps5.xml><?xml version="1.0" encoding="utf-8"?>
+<ds:datastoreItem xmlns:ds="http://schemas.openxmlformats.org/officeDocument/2006/customXml" ds:itemID="{96D19C85-73BE-4F5D-979F-58BFDE5BBE12}">
+  <ds:schemaRefs>
+    <ds:schemaRef ds:uri="http://schemas.microsoft.com/office/2006/metadata/properties"/>
+    <ds:schemaRef ds:uri="http://schemas.microsoft.com/office/infopath/2007/PartnerControls"/>
+  </ds:schemaRefs>
+</ds:datastoreItem>
 </file>
</xml_diff>

<commit_message>
Final validation: cross-reference fixes, caption numbering, Excel sync, validation report
</commit_message>
<xml_diff>
--- a/deliver/Manuscript_tracked.docx
+++ b/deliver/Manuscript_tracked.docx
@@ -8403,8 +8403,13 @@
         <w:t>FreeFEM</w:t>
       </w:r>
       <w:proofErr w:type="spellEnd"/>
-      <w:r>
-        <w:t>++ MPI on a high-performance computing cluster, and degradation metrics together with concentration and interface fields were recorded at regular time intervals.</w:t>
+      <w:del w:id="9001" w:author="Claude" w:date="2026-10-09T22:54:00Z">
+        <w:r>
+          <w:delText xml:space="preserve">++</w:delText>
+        </w:r>
+      </w:del>
+      <w:r>
+        <w:t xml:space="preserve"> MPI on a high-performance computing cluster, and degradation metrics together with concentration and interface fields were recorded at regular time intervals.</w:t>
       </w:r>
       <w:r>
         <w:t xml:space="preserve"> Predicted mass loss, corrosion rate (</w:t>
@@ -12129,109 +12134,128 @@
       <w:r>
         <w:t xml:space="preserve"> </w:t>
       </w:r>
-      <w:ins w:id="9002" w:author="Claude" w:date="2026-10-09T21:46:36Z">
+      <w:r>
+        <w:t>(</w:t>
+      </w:r>
+      <w:r>
+        <w:rPr>
+          <w:b/>
+          <w:bCs/>
+        </w:rPr>
+        <w:t>Section S5</w:t>
+      </w:r>
+      <w:r>
+        <w:t>)</w:t>
+      </w:r>
+      <w:r>
+        <w:t>.</w:t>
+      </w:r>
+      <w:r>
+        <w:t xml:space="preserve"> The calibration</w:t>
+      </w:r>
+      <w:r>
+        <w:t xml:space="preserve"> used published 14-day mass-loss measurements obtained from revised simulated body fluid (r-SBF) immersion experiments reported by Liu et al. </w:t>
+      </w:r>
+      <w:r>
+        <w:rPr>
+          <w:rFonts w:cs="Times New Roman"/>
+        </w:rPr>
+        <w:fldChar w:fldCharType="begin"/>
+      </w:r>
+      <w:r>
+        <w:rPr>
+          <w:rFonts w:cs="Times New Roman"/>
+        </w:rPr>
+        <w:instrText xml:space="preserve"> ADDIN ZOTERO_ITEM CSL_CITATION {"citationID":"4C0fw3Ct","properties":{"unsorted":false,"formattedCitation":"\\super [38]\\nosupersub{}","plainCitation":"[38]","noteIndex":0},"citationItems":[{"id":3943,"uris":["http://zotero.org/users/16939557/items/QAXDRACS"],"itemData":{"id":3943,"type":"article-journal","citation-key":"liuInitialFormationCorrosion2018","container-title":"Journal of Materials Science &amp; Technology","DOI":"10.1016/j.jmst.2018.05.005","ISSN":"10050302","issue":"12","journalAbbreviation":"Journal of Materials Science &amp; Technology","language":"en","page":"2271-2282","source":"DOI.org (Crossref)","title":"Initial formation of corrosion products on pure zinc in simulated body fluid","volume":"34","author":[{"family":"Liu","given":"Lijun"},{"family":"Meng","given":"Yao"},{"family":"Dong","given":"Chaofang"},{"family":"Yan","given":"Yu"},{"family":"Volinsky","given":"Alex A."},{"family":"Wang","given":"Lu-Ning"}],"issued":{"date-parts":[["2018",12]]}}}],"schema":"https://github.com/citation-style-language/schema/raw/master/csl-citation.json"} </w:instrText>
+      </w:r>
+      <w:r>
+        <w:rPr>
+          <w:rFonts w:cs="Times New Roman"/>
+        </w:rPr>
+        <w:fldChar w:fldCharType="separate"/>
+      </w:r>
+      <w:r>
+        <w:rPr>
+          <w:rFonts w:cs="Times New Roman"/>
+          <w:vertAlign w:val="superscript"/>
+        </w:rPr>
+        <w:t>[38]</w:t>
+      </w:r>
+      <w:r>
+        <w:rPr>
+          <w:rFonts w:cs="Times New Roman"/>
+        </w:rPr>
+        <w:fldChar w:fldCharType="end"/>
+      </w:r>
+      <w:r>
+        <w:t xml:space="preserve"> (</w:t>
+      </w:r>
+      <w:r>
+        <w:rPr>
+          <w:b/>
+          <w:bCs/>
+        </w:rPr>
+        <w:t>Table S7</w:t>
+      </w:r>
+      <w:r>
+        <w:t xml:space="preserve">). </w:t>
+      </w:r>
+      <w:r>
+        <w:t xml:space="preserve">To reduce computational cost, calibration was performed on a coarser mesh and </w:t>
+      </w:r>
+      <w:r>
+        <w:t>then</w:t>
+      </w:r>
+      <w:r>
+        <w:t xml:space="preserve"> corrected to the fine-mesh result (</w:t>
+      </w:r>
+      <w:r>
+        <w:rPr>
+          <w:b/>
+          <w:bCs/>
+        </w:rPr>
+        <w:t>Section S5, Figure S5</w:t>
+      </w:r>
+      <w:r>
+        <w:t>).</w:t>
+      </w:r>
+      <w:r>
+        <w:t xml:space="preserve"> </w:t>
+      </w:r>
+      <w:r>
+        <w:t xml:space="preserve">Optimal parameter combinations were identified by minimizing the RMSE between simulated and literature mass-loss data. </w:t>
+      </w:r>
+      <w:r>
+        <w:t>The calibrated model was then validated against the HBSS immersion dataset generated in the present study</w:t>
+      </w:r>
+      <w:r>
+        <w:t xml:space="preserve"> (</w:t>
+      </w:r>
+      <w:proofErr w:type="gramStart"/>
+      <w:del w:id="9014" w:author="Claude" w:date="2026-10-09T22:52:19Z">
         <w:r>
-          <w:t xml:space="preserve">of a deterministic RMSE objective </w:t>
+          <w:delText xml:space="preserve">Both</w:delText>
+        </w:r>
+      </w:del>
+      <w:ins w:id="9013" w:author="Claude" w:date="2026-10-09T22:52:19Z">
+        <w:r>
+          <w:t xml:space="preserve">Table</w:t>
         </w:r>
       </w:ins>
       <w:r>
-        <w:t>(</w:t>
-      </w:r>
-      <w:r>
-        <w:rPr>
-          <w:b/>
-          <w:bCs/>
-        </w:rPr>
-        <w:t>Section S5</w:t>
-      </w:r>
-      <w:r>
-        <w:t xml:space="preserve">)</w:t>
-      </w:r>
-      <w:ins w:id="9001" w:author="Claude" w:date="2026-10-09T21:46:36Z">
+        <w:t xml:space="preserve"> </w:t>
+      </w:r>
+      <w:ins w:id="9012" w:author="Claude" w:date="2026-10-09T22:52:19Z">
         <w:r>
-          <w:t xml:space="preserve">, which locates the minimum-RMSE parameter set but is not Bayesian parameter inference</w:t>
+          <w:t xml:space="preserve">3, Figure 5a)</w:t>
         </w:r>
       </w:ins>
       <w:r>
         <w:t>.</w:t>
       </w:r>
-      <w:r>
-        <w:t xml:space="preserve"> The calibration</w:t>
-      </w:r>
-      <w:r>
-        <w:t xml:space="preserve"> used published 14-day mass-loss measurements obtained from revised simulated body fluid (r-SBF) immersion experiments reported by Liu et al. </w:t>
-      </w:r>
-      <w:r>
-        <w:rPr>
-          <w:rFonts w:cs="Times New Roman"/>
-        </w:rPr>
-        <w:fldChar w:fldCharType="begin"/>
-      </w:r>
-      <w:r>
-        <w:rPr>
-          <w:rFonts w:cs="Times New Roman"/>
-        </w:rPr>
-        <w:instrText xml:space="preserve"> ADDIN ZOTERO_ITEM CSL_CITATION {"citationID":"4C0fw3Ct","properties":{"unsorted":false,"formattedCitation":"\\super [38]\\nosupersub{}","plainCitation":"[38]","noteIndex":0},"citationItems":[{"id":3943,"uris":["http://zotero.org/users/16939557/items/QAXDRACS"],"itemData":{"id":3943,"type":"article-journal","citation-key":"liuInitialFormationCorrosion2018","container-title":"Journal of Materials Science &amp; Technology","DOI":"10.1016/j.jmst.2018.05.005","ISSN":"10050302","issue":"12","journalAbbreviation":"Journal of Materials Science &amp; Technology","language":"en","page":"2271-2282","source":"DOI.org (Crossref)","title":"Initial formation of corrosion products on pure zinc in simulated body fluid","volume":"34","author":[{"family":"Liu","given":"Lijun"},{"family":"Meng","given":"Yao"},{"family":"Dong","given":"Chaofang"},{"family":"Yan","given":"Yu"},{"family":"Volinsky","given":"Alex A."},{"family":"Wang","given":"Lu-Ning"}],"issued":{"date-parts":[["2018",12]]}}}],"schema":"https://github.com/citation-style-language/schema/raw/master/csl-citation.json"} </w:instrText>
-      </w:r>
-      <w:r>
-        <w:rPr>
-          <w:rFonts w:cs="Times New Roman"/>
-        </w:rPr>
-        <w:fldChar w:fldCharType="separate"/>
-      </w:r>
-      <w:r>
-        <w:rPr>
-          <w:rFonts w:cs="Times New Roman"/>
-          <w:vertAlign w:val="superscript"/>
-        </w:rPr>
-        <w:t>[38]</w:t>
-      </w:r>
-      <w:r>
-        <w:rPr>
-          <w:rFonts w:cs="Times New Roman"/>
-        </w:rPr>
-        <w:fldChar w:fldCharType="end"/>
-      </w:r>
-      <w:r>
-        <w:t xml:space="preserve"> (</w:t>
-      </w:r>
-      <w:r>
-        <w:rPr>
-          <w:b/>
-          <w:bCs/>
-        </w:rPr>
-        <w:t>Table S7</w:t>
-      </w:r>
-      <w:r>
-        <w:t xml:space="preserve">). </w:t>
-      </w:r>
-      <w:r>
-        <w:t xml:space="preserve">To reduce computational cost, calibration was performed on a coarser mesh and </w:t>
-      </w:r>
-      <w:r>
-        <w:t>then</w:t>
-      </w:r>
-      <w:r>
-        <w:t xml:space="preserve"> corrected to the fine-mesh result (</w:t>
-      </w:r>
-      <w:r>
-        <w:rPr>
-          <w:b/>
-          <w:bCs/>
-        </w:rPr>
-        <w:t>Section S5, Figure S5</w:t>
-      </w:r>
-      <w:r>
-        <w:t>).</w:t>
-      </w:r>
+      <w:proofErr w:type="gramEnd"/>
       <w:r>
         <w:t xml:space="preserve"> </w:t>
-      </w:r>
-      <w:r>
-        <w:t xml:space="preserve">Optimal parameter combinations were identified by minimizing the RMSE between simulated and literature mass-loss data. </w:t>
-      </w:r>
-      <w:r>
-        <w:t xml:space="preserve">The calibrated model was then validated against the HBSS immersion dataset generated in the present study. </w:t>
       </w:r>
     </w:p>
     <w:p>
@@ -13674,9 +13698,6 @@
       </w:r>
       <w:r>
         <w:rPr>
-          <w:rFonts w:ascii="Segoe UI" w:hAnsi="Segoe UI" w:cs="Segoe UI"/>
-          <w:sz w:val="21"/>
-          <w:szCs w:val="21"/>
           <w:lang w:eastAsia="en-US"/>
         </w:rPr>
         <w:t xml:space="preserve"> </w:t>
@@ -15726,10 +15747,7 @@
         </m:sSub>
       </m:oMath>
       <w:r>
-        <w:rPr>
-          <w:sz w:val="22"/>
-          <w:szCs w:val="22"/>
-        </w:rPr>
+        <w:rPr/>
         <w:t xml:space="preserve">, </w:t>
       </w:r>
       <w:r>

</xml_diff>

<commit_message>
Figure 4 relabelled (new parameter values), Section S6 pointer, SI diffusivity units to mm2/s, ASTM G31 CR columns for stent
</commit_message>
<xml_diff>
--- a/deliver/Manuscript_tracked.docx
+++ b/deliver/Manuscript_tracked.docx
@@ -16386,53 +16386,115 @@
       <w:pPr>
         <w:keepNext/>
         <w:jc w:val="center"/>
+        <w:rPr>
+          <w:del w:id="20002" w:author="Claude" w:date="2026-10-09T23:13:02Z"/>
+        </w:rPr>
       </w:pPr>
-      <w:r>
-        <w:rPr>
-          <w:noProof/>
-        </w:rPr>
-        <w:drawing>
-          <wp:inline distT="0" distB="0" distL="0" distR="0" wp14:anchorId="36EF7F28" wp14:editId="13A4B40B">
-            <wp:extent cx="5760720" cy="4561205"/>
-            <wp:effectExtent l="0" t="0" r="0" b="0"/>
-            <wp:docPr id="1639482467" name="Picture 1"/>
-            <wp:cNvGraphicFramePr>
-              <a:graphicFrameLocks xmlns:a="http://schemas.openxmlformats.org/drawingml/2006/main" noChangeAspect="1"/>
-            </wp:cNvGraphicFramePr>
-            <a:graphic xmlns:a="http://schemas.openxmlformats.org/drawingml/2006/main">
-              <a:graphicData uri="http://schemas.openxmlformats.org/drawingml/2006/picture">
-                <pic:pic xmlns:pic="http://schemas.openxmlformats.org/drawingml/2006/picture">
-                  <pic:nvPicPr>
-                    <pic:cNvPr id="1639482467" name="Picture 1639482467"/>
-                    <pic:cNvPicPr/>
-                  </pic:nvPicPr>
-                  <pic:blipFill>
-                    <a:blip r:embed="rId18" cstate="print">
-                      <a:extLst>
-                        <a:ext uri="{28A0092B-C50C-407E-A947-70E740481C1C}">
-                          <a14:useLocalDpi xmlns:a14="http://schemas.microsoft.com/office/drawing/2010/main" val="0"/>
-                        </a:ext>
-                      </a:extLst>
-                    </a:blip>
-                    <a:stretch>
-                      <a:fillRect/>
-                    </a:stretch>
-                  </pic:blipFill>
-                  <pic:spPr>
-                    <a:xfrm>
-                      <a:off x="0" y="0"/>
-                      <a:ext cx="5760720" cy="4561205"/>
-                    </a:xfrm>
-                    <a:prstGeom prst="rect">
-                      <a:avLst/>
-                    </a:prstGeom>
-                  </pic:spPr>
-                </pic:pic>
-              </a:graphicData>
-            </a:graphic>
-          </wp:inline>
-        </w:drawing>
-      </w:r>
+      <w:del w:id="20001" w:author="Claude" w:date="2026-10-09T23:13:02Z">
+        <w:r>
+          <w:rPr>
+            <w:noProof/>
+          </w:rPr>
+          <w:drawing>
+            <wp:inline distT="0" distB="0" distL="0" distR="0" wp14:anchorId="36EF7F28" wp14:editId="13A4B40B">
+              <wp:extent cx="5760720" cy="4561205"/>
+              <wp:effectExtent l="0" t="0" r="0" b="0"/>
+              <wp:docPr id="1639482467" name="Picture 1"/>
+              <wp:cNvGraphicFramePr>
+                <a:graphicFrameLocks xmlns:a="http://schemas.openxmlformats.org/drawingml/2006/main" noChangeAspect="1"/>
+              </wp:cNvGraphicFramePr>
+              <a:graphic xmlns:a="http://schemas.openxmlformats.org/drawingml/2006/main">
+                <a:graphicData uri="http://schemas.openxmlformats.org/drawingml/2006/picture">
+                  <pic:pic xmlns:pic="http://schemas.openxmlformats.org/drawingml/2006/picture">
+                    <pic:nvPicPr>
+                      <pic:cNvPr id="1639482467" name="Picture 1639482467"/>
+                      <pic:cNvPicPr/>
+                    </pic:nvPicPr>
+                    <pic:blipFill>
+                      <a:blip r:embed="rId18" cstate="print">
+                        <a:extLst>
+                          <a:ext uri="{28A0092B-C50C-407E-A947-70E740481C1C}">
+                            <a14:useLocalDpi xmlns:a14="http://schemas.microsoft.com/office/drawing/2010/main" val="0"/>
+                          </a:ext>
+                        </a:extLst>
+                      </a:blip>
+                      <a:stretch>
+                        <a:fillRect/>
+                      </a:stretch>
+                    </pic:blipFill>
+                    <pic:spPr>
+                      <a:xfrm>
+                        <a:off x="0" y="0"/>
+                        <a:ext cx="5760720" cy="4561205"/>
+                      </a:xfrm>
+                      <a:prstGeom prst="rect">
+                        <a:avLst/>
+                      </a:prstGeom>
+                    </pic:spPr>
+                  </pic:pic>
+                </a:graphicData>
+              </a:graphic>
+            </wp:inline>
+          </w:drawing>
+        </w:r>
+      </w:del>
+    </w:p>
+    <w:p>
+      <w:pPr>
+        <w:keepNext/>
+        <w:jc w:val="center"/>
+        <w:rPr>
+          <w:ins w:id="20004" w:author="Claude" w:date="2026-10-09T23:13:02Z"/>
+        </w:rPr>
+      </w:pPr>
+      <w:ins w:id="20003" w:author="Claude" w:date="2026-10-09T23:13:02Z">
+        <w:r>
+          <w:rPr>
+            <w:noProof/>
+          </w:rPr>
+          <w:drawing>
+            <wp:inline distT="0" distB="0" distL="0" distR="0" wp14:anchorId="36EF7F28" wp14:editId="13A4B40B">
+              <wp:extent cx="5760720" cy="4579033"/>
+              <wp:effectExtent l="0" t="0" r="0" b="0"/>
+              <wp:docPr id="931" name="Picture 1"/>
+              <wp:cNvGraphicFramePr>
+                <a:graphicFrameLocks xmlns:a="http://schemas.openxmlformats.org/drawingml/2006/main" noChangeAspect="1"/>
+              </wp:cNvGraphicFramePr>
+              <a:graphic xmlns:a="http://schemas.openxmlformats.org/drawingml/2006/main">
+                <a:graphicData uri="http://schemas.openxmlformats.org/drawingml/2006/picture">
+                  <pic:pic xmlns:pic="http://schemas.openxmlformats.org/drawingml/2006/picture">
+                    <pic:nvPicPr>
+                      <pic:cNvPr id="932" name="Picture 1639482467"/>
+                      <pic:cNvPicPr/>
+                    </pic:nvPicPr>
+                    <pic:blipFill>
+                      <a:blip r:embed="rId28" cstate="print">
+                        <a:extLst>
+                          <a:ext uri="{28A0092B-C50C-407E-A947-70E740481C1C}">
+                            <a14:useLocalDpi xmlns:a14="http://schemas.microsoft.com/office/drawing/2010/main" val="0"/>
+                          </a:ext>
+                        </a:extLst>
+                      </a:blip>
+                      <a:stretch>
+                        <a:fillRect/>
+                      </a:stretch>
+                    </pic:blipFill>
+                    <pic:spPr>
+                      <a:xfrm>
+                        <a:off x="0" y="0"/>
+                        <a:ext cx="5760720" cy="4579033"/>
+                      </a:xfrm>
+                      <a:prstGeom prst="rect">
+                        <a:avLst/>
+                      </a:prstGeom>
+                    </pic:spPr>
+                  </pic:pic>
+                </a:graphicData>
+              </a:graphic>
+            </wp:inline>
+          </w:drawing>
+        </w:r>
+      </w:ins>
     </w:p>
     <w:p>
       <w:pPr>
@@ -17769,7 +17831,21 @@
         <w:rPr>
           <w:rFonts w:cs="Times New Roman"/>
         </w:rPr>
-        <w:t xml:space="preserve"> of 0.9734. Importantly, </w:t>
+        <w:t xml:space="preserve"> of 0.9734</w:t>
+      </w:r>
+      <w:ins w:id="9001" w:author="Claude" w:date="2026-10-09T23:13:02Z">
+        <w:r>
+          <w:rPr>
+            <w:rFonts w:cs="Times New Roman"/>
+          </w:rPr>
+          <w:t xml:space="preserve">. Uncertainty in the predicted mass loss arising from the calibrated kinetic parameters is reported as parameter-propagated ensemble intervals in Section S6</w:t>
+        </w:r>
+      </w:ins>
+      <w:r>
+        <w:rPr>
+          <w:rFonts w:cs="Times New Roman"/>
+        </w:rPr>
+        <w:t xml:space="preserve">. Importantly, </w:t>
       </w:r>
       <w:r>
         <w:rPr>

</xml_diff>